<commit_message>
feat(mascotas): aislar fichas y confirmar propietarios (C3, HU-1.1, HU-1.5, RE-T.19.1)
</commit_message>
<xml_diff>
--- a/public/docs/descargas/hu.docx
+++ b/public/docs/descargas/hu.docx
@@ -93,7 +93,7 @@
           <w:noProof/>
         </w:rPr>
         <w:drawing>
-          <wp:inline distT="0" distB="0" distL="0" distR="0" wp14:anchorId="022B8BA0" wp14:editId="022B8BA1">
+          <wp:inline distT="0" distB="0" distL="0" distR="0" wp14:anchorId="0E8D0524" wp14:editId="0E8D0525">
             <wp:extent cx="395999" cy="405503"/>
             <wp:effectExtent l="0" t="0" r="0" b="0"/>
             <wp:docPr id="10" name="Picture"/>
@@ -229,7 +229,7 @@
               <w:pStyle w:val="Celda"/>
             </w:pPr>
             <w:r>
-              <w:t>06/10/2026</w:t>
+              <w:t>07/10/2026</w:t>
             </w:r>
           </w:p>
         </w:tc>
@@ -409,7 +409,7 @@
       <w:r>
         <w:fldChar w:fldCharType="separate"/>
       </w:r>
-      <w:hyperlink w:anchor="_Toc242196814" w:history="1">
+      <w:hyperlink w:anchor="_Toc242225020" w:history="1">
         <w:r>
           <w:rPr>
             <w:rStyle w:val="Hipervnculo"/>
@@ -445,7 +445,7 @@
             <w:noProof/>
             <w:webHidden/>
           </w:rPr>
-          <w:instrText xml:space="preserve"> PAGEREF _Toc242196814 \h </w:instrText>
+          <w:instrText xml:space="preserve"> PAGEREF _Toc242225020 \h </w:instrText>
         </w:r>
         <w:r>
           <w:rPr>
@@ -488,7 +488,7 @@
           <w14:ligatures w14:val="standardContextual"/>
         </w:rPr>
       </w:pPr>
-      <w:hyperlink w:anchor="_Toc242196815" w:history="1">
+      <w:hyperlink w:anchor="_Toc242225021" w:history="1">
         <w:r>
           <w:rPr>
             <w:rStyle w:val="Hipervnculo"/>
@@ -515,7 +515,7 @@
             <w:noProof/>
             <w:webHidden/>
           </w:rPr>
-          <w:instrText xml:space="preserve"> PAGEREF _Toc242196815 \h </w:instrText>
+          <w:instrText xml:space="preserve"> PAGEREF _Toc242225021 \h </w:instrText>
         </w:r>
         <w:r>
           <w:rPr>
@@ -558,7 +558,7 @@
           <w14:ligatures w14:val="standardContextual"/>
         </w:rPr>
       </w:pPr>
-      <w:hyperlink w:anchor="_Toc242196816" w:history="1">
+      <w:hyperlink w:anchor="_Toc242225022" w:history="1">
         <w:r>
           <w:rPr>
             <w:rStyle w:val="Hipervnculo"/>
@@ -585,7 +585,7 @@
             <w:noProof/>
             <w:webHidden/>
           </w:rPr>
-          <w:instrText xml:space="preserve"> PAGEREF _Toc242196816 \h </w:instrText>
+          <w:instrText xml:space="preserve"> PAGEREF _Toc242225022 \h </w:instrText>
         </w:r>
         <w:r>
           <w:rPr>
@@ -628,7 +628,7 @@
           <w14:ligatures w14:val="standardContextual"/>
         </w:rPr>
       </w:pPr>
-      <w:hyperlink w:anchor="_Toc242196817" w:history="1">
+      <w:hyperlink w:anchor="_Toc242225023" w:history="1">
         <w:r>
           <w:rPr>
             <w:rStyle w:val="Hipervnculo"/>
@@ -655,7 +655,7 @@
             <w:noProof/>
             <w:webHidden/>
           </w:rPr>
-          <w:instrText xml:space="preserve"> PAGEREF _Toc242196817 \h </w:instrText>
+          <w:instrText xml:space="preserve"> PAGEREF _Toc242225023 \h </w:instrText>
         </w:r>
         <w:r>
           <w:rPr>
@@ -698,7 +698,7 @@
           <w14:ligatures w14:val="standardContextual"/>
         </w:rPr>
       </w:pPr>
-      <w:hyperlink w:anchor="_Toc242196818" w:history="1">
+      <w:hyperlink w:anchor="_Toc242225024" w:history="1">
         <w:r>
           <w:rPr>
             <w:rStyle w:val="Hipervnculo"/>
@@ -725,7 +725,7 @@
             <w:noProof/>
             <w:webHidden/>
           </w:rPr>
-          <w:instrText xml:space="preserve"> PAGEREF _Toc242196818 \h </w:instrText>
+          <w:instrText xml:space="preserve"> PAGEREF _Toc242225024 \h </w:instrText>
         </w:r>
         <w:r>
           <w:rPr>
@@ -768,7 +768,7 @@
           <w14:ligatures w14:val="standardContextual"/>
         </w:rPr>
       </w:pPr>
-      <w:hyperlink w:anchor="_Toc242196819" w:history="1">
+      <w:hyperlink w:anchor="_Toc242225025" w:history="1">
         <w:r>
           <w:rPr>
             <w:rStyle w:val="Hipervnculo"/>
@@ -795,7 +795,7 @@
             <w:noProof/>
             <w:webHidden/>
           </w:rPr>
-          <w:instrText xml:space="preserve"> PAGEREF _Toc242196819 \h </w:instrText>
+          <w:instrText xml:space="preserve"> PAGEREF _Toc242225025 \h </w:instrText>
         </w:r>
         <w:r>
           <w:rPr>
@@ -841,7 +841,7 @@
           <w14:ligatures w14:val="standardContextual"/>
         </w:rPr>
       </w:pPr>
-      <w:hyperlink w:anchor="_Toc242196820" w:history="1">
+      <w:hyperlink w:anchor="_Toc242225026" w:history="1">
         <w:r>
           <w:rPr>
             <w:rStyle w:val="Hipervnculo"/>
@@ -868,7 +868,7 @@
             <w:noProof/>
             <w:webHidden/>
           </w:rPr>
-          <w:instrText xml:space="preserve"> PAGEREF _Toc242196820 \h </w:instrText>
+          <w:instrText xml:space="preserve"> PAGEREF _Toc242225026 \h </w:instrText>
         </w:r>
         <w:r>
           <w:rPr>
@@ -911,7 +911,7 @@
           <w14:ligatures w14:val="standardContextual"/>
         </w:rPr>
       </w:pPr>
-      <w:hyperlink w:anchor="_Toc242196821" w:history="1">
+      <w:hyperlink w:anchor="_Toc242225027" w:history="1">
         <w:r>
           <w:rPr>
             <w:rStyle w:val="Hipervnculo"/>
@@ -938,7 +938,7 @@
             <w:noProof/>
             <w:webHidden/>
           </w:rPr>
-          <w:instrText xml:space="preserve"> PAGEREF _Toc242196821 \h </w:instrText>
+          <w:instrText xml:space="preserve"> PAGEREF _Toc242225027 \h </w:instrText>
         </w:r>
         <w:r>
           <w:rPr>
@@ -981,7 +981,7 @@
           <w14:ligatures w14:val="standardContextual"/>
         </w:rPr>
       </w:pPr>
-      <w:hyperlink w:anchor="_Toc242196822" w:history="1">
+      <w:hyperlink w:anchor="_Toc242225028" w:history="1">
         <w:r>
           <w:rPr>
             <w:rStyle w:val="Hipervnculo"/>
@@ -1008,7 +1008,7 @@
             <w:noProof/>
             <w:webHidden/>
           </w:rPr>
-          <w:instrText xml:space="preserve"> PAGEREF _Toc242196822 \h </w:instrText>
+          <w:instrText xml:space="preserve"> PAGEREF _Toc242225028 \h </w:instrText>
         </w:r>
         <w:r>
           <w:rPr>
@@ -1051,7 +1051,7 @@
           <w14:ligatures w14:val="standardContextual"/>
         </w:rPr>
       </w:pPr>
-      <w:hyperlink w:anchor="_Toc242196823" w:history="1">
+      <w:hyperlink w:anchor="_Toc242225029" w:history="1">
         <w:r>
           <w:rPr>
             <w:rStyle w:val="Hipervnculo"/>
@@ -1078,7 +1078,7 @@
             <w:noProof/>
             <w:webHidden/>
           </w:rPr>
-          <w:instrText xml:space="preserve"> PAGEREF _Toc242196823 \h </w:instrText>
+          <w:instrText xml:space="preserve"> PAGEREF _Toc242225029 \h </w:instrText>
         </w:r>
         <w:r>
           <w:rPr>
@@ -1121,7 +1121,7 @@
           <w14:ligatures w14:val="standardContextual"/>
         </w:rPr>
       </w:pPr>
-      <w:hyperlink w:anchor="_Toc242196824" w:history="1">
+      <w:hyperlink w:anchor="_Toc242225030" w:history="1">
         <w:r>
           <w:rPr>
             <w:rStyle w:val="Hipervnculo"/>
@@ -1148,7 +1148,7 @@
             <w:noProof/>
             <w:webHidden/>
           </w:rPr>
-          <w:instrText xml:space="preserve"> PAGEREF _Toc242196824 \h </w:instrText>
+          <w:instrText xml:space="preserve"> PAGEREF _Toc242225030 \h </w:instrText>
         </w:r>
         <w:r>
           <w:rPr>
@@ -1191,7 +1191,7 @@
           <w14:ligatures w14:val="standardContextual"/>
         </w:rPr>
       </w:pPr>
-      <w:hyperlink w:anchor="_Toc242196825" w:history="1">
+      <w:hyperlink w:anchor="_Toc242225031" w:history="1">
         <w:r>
           <w:rPr>
             <w:rStyle w:val="Hipervnculo"/>
@@ -1218,7 +1218,7 @@
             <w:noProof/>
             <w:webHidden/>
           </w:rPr>
-          <w:instrText xml:space="preserve"> PAGEREF _Toc242196825 \h </w:instrText>
+          <w:instrText xml:space="preserve"> PAGEREF _Toc242225031 \h </w:instrText>
         </w:r>
         <w:r>
           <w:rPr>
@@ -1261,7 +1261,7 @@
           <w14:ligatures w14:val="standardContextual"/>
         </w:rPr>
       </w:pPr>
-      <w:hyperlink w:anchor="_Toc242196826" w:history="1">
+      <w:hyperlink w:anchor="_Toc242225032" w:history="1">
         <w:r>
           <w:rPr>
             <w:rStyle w:val="Hipervnculo"/>
@@ -1288,7 +1288,7 @@
             <w:noProof/>
             <w:webHidden/>
           </w:rPr>
-          <w:instrText xml:space="preserve"> PAGEREF _Toc242196826 \h </w:instrText>
+          <w:instrText xml:space="preserve"> PAGEREF _Toc242225032 \h </w:instrText>
         </w:r>
         <w:r>
           <w:rPr>
@@ -1331,7 +1331,7 @@
           <w14:ligatures w14:val="standardContextual"/>
         </w:rPr>
       </w:pPr>
-      <w:hyperlink w:anchor="_Toc242196827" w:history="1">
+      <w:hyperlink w:anchor="_Toc242225033" w:history="1">
         <w:r>
           <w:rPr>
             <w:rStyle w:val="Hipervnculo"/>
@@ -1358,7 +1358,7 @@
             <w:noProof/>
             <w:webHidden/>
           </w:rPr>
-          <w:instrText xml:space="preserve"> PAGEREF _Toc242196827 \h </w:instrText>
+          <w:instrText xml:space="preserve"> PAGEREF _Toc242225033 \h </w:instrText>
         </w:r>
         <w:r>
           <w:rPr>
@@ -1401,7 +1401,7 @@
           <w14:ligatures w14:val="standardContextual"/>
         </w:rPr>
       </w:pPr>
-      <w:hyperlink w:anchor="_Toc242196828" w:history="1">
+      <w:hyperlink w:anchor="_Toc242225034" w:history="1">
         <w:r>
           <w:rPr>
             <w:rStyle w:val="Hipervnculo"/>
@@ -1428,7 +1428,7 @@
             <w:noProof/>
             <w:webHidden/>
           </w:rPr>
-          <w:instrText xml:space="preserve"> PAGEREF _Toc242196828 \h </w:instrText>
+          <w:instrText xml:space="preserve"> PAGEREF _Toc242225034 \h </w:instrText>
         </w:r>
         <w:r>
           <w:rPr>
@@ -1471,7 +1471,7 @@
           <w14:ligatures w14:val="standardContextual"/>
         </w:rPr>
       </w:pPr>
-      <w:hyperlink w:anchor="_Toc242196829" w:history="1">
+      <w:hyperlink w:anchor="_Toc242225035" w:history="1">
         <w:r>
           <w:rPr>
             <w:rStyle w:val="Hipervnculo"/>
@@ -1498,7 +1498,7 @@
             <w:noProof/>
             <w:webHidden/>
           </w:rPr>
-          <w:instrText xml:space="preserve"> PAGEREF _Toc242196829 \h </w:instrText>
+          <w:instrText xml:space="preserve"> PAGEREF _Toc242225035 \h </w:instrText>
         </w:r>
         <w:r>
           <w:rPr>
@@ -1541,7 +1541,7 @@
           <w14:ligatures w14:val="standardContextual"/>
         </w:rPr>
       </w:pPr>
-      <w:hyperlink w:anchor="_Toc242196830" w:history="1">
+      <w:hyperlink w:anchor="_Toc242225036" w:history="1">
         <w:r>
           <w:rPr>
             <w:rStyle w:val="Hipervnculo"/>
@@ -1568,7 +1568,7 @@
             <w:noProof/>
             <w:webHidden/>
           </w:rPr>
-          <w:instrText xml:space="preserve"> PAGEREF _Toc242196830 \h </w:instrText>
+          <w:instrText xml:space="preserve"> PAGEREF _Toc242225036 \h </w:instrText>
         </w:r>
         <w:r>
           <w:rPr>
@@ -1611,7 +1611,7 @@
           <w14:ligatures w14:val="standardContextual"/>
         </w:rPr>
       </w:pPr>
-      <w:hyperlink w:anchor="_Toc242196831" w:history="1">
+      <w:hyperlink w:anchor="_Toc242225037" w:history="1">
         <w:r>
           <w:rPr>
             <w:rStyle w:val="Hipervnculo"/>
@@ -1638,7 +1638,7 @@
             <w:noProof/>
             <w:webHidden/>
           </w:rPr>
-          <w:instrText xml:space="preserve"> PAGEREF _Toc242196831 \h </w:instrText>
+          <w:instrText xml:space="preserve"> PAGEREF _Toc242225037 \h </w:instrText>
         </w:r>
         <w:r>
           <w:rPr>
@@ -1681,7 +1681,7 @@
           <w14:ligatures w14:val="standardContextual"/>
         </w:rPr>
       </w:pPr>
-      <w:hyperlink w:anchor="_Toc242196832" w:history="1">
+      <w:hyperlink w:anchor="_Toc242225038" w:history="1">
         <w:r>
           <w:rPr>
             <w:rStyle w:val="Hipervnculo"/>
@@ -1708,7 +1708,7 @@
             <w:noProof/>
             <w:webHidden/>
           </w:rPr>
-          <w:instrText xml:space="preserve"> PAGEREF _Toc242196832 \h </w:instrText>
+          <w:instrText xml:space="preserve"> PAGEREF _Toc242225038 \h </w:instrText>
         </w:r>
         <w:r>
           <w:rPr>
@@ -1751,7 +1751,7 @@
           <w14:ligatures w14:val="standardContextual"/>
         </w:rPr>
       </w:pPr>
-      <w:hyperlink w:anchor="_Toc242196833" w:history="1">
+      <w:hyperlink w:anchor="_Toc242225039" w:history="1">
         <w:r>
           <w:rPr>
             <w:rStyle w:val="Hipervnculo"/>
@@ -1778,7 +1778,7 @@
             <w:noProof/>
             <w:webHidden/>
           </w:rPr>
-          <w:instrText xml:space="preserve"> PAGEREF _Toc242196833 \h </w:instrText>
+          <w:instrText xml:space="preserve"> PAGEREF _Toc242225039 \h </w:instrText>
         </w:r>
         <w:r>
           <w:rPr>
@@ -1821,7 +1821,7 @@
           <w14:ligatures w14:val="standardContextual"/>
         </w:rPr>
       </w:pPr>
-      <w:hyperlink w:anchor="_Toc242196834" w:history="1">
+      <w:hyperlink w:anchor="_Toc242225040" w:history="1">
         <w:r>
           <w:rPr>
             <w:rStyle w:val="Hipervnculo"/>
@@ -1848,7 +1848,7 @@
             <w:noProof/>
             <w:webHidden/>
           </w:rPr>
-          <w:instrText xml:space="preserve"> PAGEREF _Toc242196834 \h </w:instrText>
+          <w:instrText xml:space="preserve"> PAGEREF _Toc242225040 \h </w:instrText>
         </w:r>
         <w:r>
           <w:rPr>
@@ -1891,7 +1891,7 @@
           <w14:ligatures w14:val="standardContextual"/>
         </w:rPr>
       </w:pPr>
-      <w:hyperlink w:anchor="_Toc242196835" w:history="1">
+      <w:hyperlink w:anchor="_Toc242225041" w:history="1">
         <w:r>
           <w:rPr>
             <w:rStyle w:val="Hipervnculo"/>
@@ -1918,7 +1918,7 @@
             <w:noProof/>
             <w:webHidden/>
           </w:rPr>
-          <w:instrText xml:space="preserve"> PAGEREF _Toc242196835 \h </w:instrText>
+          <w:instrText xml:space="preserve"> PAGEREF _Toc242225041 \h </w:instrText>
         </w:r>
         <w:r>
           <w:rPr>
@@ -1961,7 +1961,7 @@
           <w14:ligatures w14:val="standardContextual"/>
         </w:rPr>
       </w:pPr>
-      <w:hyperlink w:anchor="_Toc242196836" w:history="1">
+      <w:hyperlink w:anchor="_Toc242225042" w:history="1">
         <w:r>
           <w:rPr>
             <w:rStyle w:val="Hipervnculo"/>
@@ -1988,7 +1988,7 @@
             <w:noProof/>
             <w:webHidden/>
           </w:rPr>
-          <w:instrText xml:space="preserve"> PAGEREF _Toc242196836 \h </w:instrText>
+          <w:instrText xml:space="preserve"> PAGEREF _Toc242225042 \h </w:instrText>
         </w:r>
         <w:r>
           <w:rPr>
@@ -2031,7 +2031,7 @@
           <w14:ligatures w14:val="standardContextual"/>
         </w:rPr>
       </w:pPr>
-      <w:hyperlink w:anchor="_Toc242196837" w:history="1">
+      <w:hyperlink w:anchor="_Toc242225043" w:history="1">
         <w:r>
           <w:rPr>
             <w:rStyle w:val="Hipervnculo"/>
@@ -2058,7 +2058,7 @@
             <w:noProof/>
             <w:webHidden/>
           </w:rPr>
-          <w:instrText xml:space="preserve"> PAGEREF _Toc242196837 \h </w:instrText>
+          <w:instrText xml:space="preserve"> PAGEREF _Toc242225043 \h </w:instrText>
         </w:r>
         <w:r>
           <w:rPr>
@@ -2101,7 +2101,7 @@
           <w14:ligatures w14:val="standardContextual"/>
         </w:rPr>
       </w:pPr>
-      <w:hyperlink w:anchor="_Toc242196838" w:history="1">
+      <w:hyperlink w:anchor="_Toc242225044" w:history="1">
         <w:r>
           <w:rPr>
             <w:rStyle w:val="Hipervnculo"/>
@@ -2128,7 +2128,7 @@
             <w:noProof/>
             <w:webHidden/>
           </w:rPr>
-          <w:instrText xml:space="preserve"> PAGEREF _Toc242196838 \h </w:instrText>
+          <w:instrText xml:space="preserve"> PAGEREF _Toc242225044 \h </w:instrText>
         </w:r>
         <w:r>
           <w:rPr>
@@ -2171,7 +2171,7 @@
           <w14:ligatures w14:val="standardContextual"/>
         </w:rPr>
       </w:pPr>
-      <w:hyperlink w:anchor="_Toc242196839" w:history="1">
+      <w:hyperlink w:anchor="_Toc242225045" w:history="1">
         <w:r>
           <w:rPr>
             <w:rStyle w:val="Hipervnculo"/>
@@ -2198,7 +2198,7 @@
             <w:noProof/>
             <w:webHidden/>
           </w:rPr>
-          <w:instrText xml:space="preserve"> PAGEREF _Toc242196839 \h </w:instrText>
+          <w:instrText xml:space="preserve"> PAGEREF _Toc242225045 \h </w:instrText>
         </w:r>
         <w:r>
           <w:rPr>
@@ -2244,7 +2244,7 @@
           <w14:ligatures w14:val="standardContextual"/>
         </w:rPr>
       </w:pPr>
-      <w:hyperlink w:anchor="_Toc242196840" w:history="1">
+      <w:hyperlink w:anchor="_Toc242225046" w:history="1">
         <w:r>
           <w:rPr>
             <w:rStyle w:val="Hipervnculo"/>
@@ -2271,7 +2271,7 @@
             <w:noProof/>
             <w:webHidden/>
           </w:rPr>
-          <w:instrText xml:space="preserve"> PAGEREF _Toc242196840 \h </w:instrText>
+          <w:instrText xml:space="preserve"> PAGEREF _Toc242225046 \h </w:instrText>
         </w:r>
         <w:r>
           <w:rPr>
@@ -2314,7 +2314,7 @@
           <w14:ligatures w14:val="standardContextual"/>
         </w:rPr>
       </w:pPr>
-      <w:hyperlink w:anchor="_Toc242196841" w:history="1">
+      <w:hyperlink w:anchor="_Toc242225047" w:history="1">
         <w:r>
           <w:rPr>
             <w:rStyle w:val="Hipervnculo"/>
@@ -2341,7 +2341,7 @@
             <w:noProof/>
             <w:webHidden/>
           </w:rPr>
-          <w:instrText xml:space="preserve"> PAGEREF _Toc242196841 \h </w:instrText>
+          <w:instrText xml:space="preserve"> PAGEREF _Toc242225047 \h </w:instrText>
         </w:r>
         <w:r>
           <w:rPr>
@@ -2384,7 +2384,7 @@
           <w14:ligatures w14:val="standardContextual"/>
         </w:rPr>
       </w:pPr>
-      <w:hyperlink w:anchor="_Toc242196842" w:history="1">
+      <w:hyperlink w:anchor="_Toc242225048" w:history="1">
         <w:r>
           <w:rPr>
             <w:rStyle w:val="Hipervnculo"/>
@@ -2411,7 +2411,7 @@
             <w:noProof/>
             <w:webHidden/>
           </w:rPr>
-          <w:instrText xml:space="preserve"> PAGEREF _Toc242196842 \h </w:instrText>
+          <w:instrText xml:space="preserve"> PAGEREF _Toc242225048 \h </w:instrText>
         </w:r>
         <w:r>
           <w:rPr>
@@ -2454,7 +2454,7 @@
           <w14:ligatures w14:val="standardContextual"/>
         </w:rPr>
       </w:pPr>
-      <w:hyperlink w:anchor="_Toc242196843" w:history="1">
+      <w:hyperlink w:anchor="_Toc242225049" w:history="1">
         <w:r>
           <w:rPr>
             <w:rStyle w:val="Hipervnculo"/>
@@ -2481,7 +2481,7 @@
             <w:noProof/>
             <w:webHidden/>
           </w:rPr>
-          <w:instrText xml:space="preserve"> PAGEREF _Toc242196843 \h </w:instrText>
+          <w:instrText xml:space="preserve"> PAGEREF _Toc242225049 \h </w:instrText>
         </w:r>
         <w:r>
           <w:rPr>
@@ -2524,7 +2524,7 @@
           <w14:ligatures w14:val="standardContextual"/>
         </w:rPr>
       </w:pPr>
-      <w:hyperlink w:anchor="_Toc242196844" w:history="1">
+      <w:hyperlink w:anchor="_Toc242225050" w:history="1">
         <w:r>
           <w:rPr>
             <w:rStyle w:val="Hipervnculo"/>
@@ -2551,7 +2551,7 @@
             <w:noProof/>
             <w:webHidden/>
           </w:rPr>
-          <w:instrText xml:space="preserve"> PAGEREF _Toc242196844 \h </w:instrText>
+          <w:instrText xml:space="preserve"> PAGEREF _Toc242225050 \h </w:instrText>
         </w:r>
         <w:r>
           <w:rPr>
@@ -2594,7 +2594,7 @@
           <w14:ligatures w14:val="standardContextual"/>
         </w:rPr>
       </w:pPr>
-      <w:hyperlink w:anchor="_Toc242196845" w:history="1">
+      <w:hyperlink w:anchor="_Toc242225051" w:history="1">
         <w:r>
           <w:rPr>
             <w:rStyle w:val="Hipervnculo"/>
@@ -2621,7 +2621,7 @@
             <w:noProof/>
             <w:webHidden/>
           </w:rPr>
-          <w:instrText xml:space="preserve"> PAGEREF _Toc242196845 \h </w:instrText>
+          <w:instrText xml:space="preserve"> PAGEREF _Toc242225051 \h </w:instrText>
         </w:r>
         <w:r>
           <w:rPr>
@@ -2667,7 +2667,7 @@
           <w14:ligatures w14:val="standardContextual"/>
         </w:rPr>
       </w:pPr>
-      <w:hyperlink w:anchor="_Toc242196846" w:history="1">
+      <w:hyperlink w:anchor="_Toc242225052" w:history="1">
         <w:r>
           <w:rPr>
             <w:rStyle w:val="Hipervnculo"/>
@@ -2694,7 +2694,7 @@
             <w:noProof/>
             <w:webHidden/>
           </w:rPr>
-          <w:instrText xml:space="preserve"> PAGEREF _Toc242196846 \h </w:instrText>
+          <w:instrText xml:space="preserve"> PAGEREF _Toc242225052 \h </w:instrText>
         </w:r>
         <w:r>
           <w:rPr>
@@ -2737,7 +2737,7 @@
           <w14:ligatures w14:val="standardContextual"/>
         </w:rPr>
       </w:pPr>
-      <w:hyperlink w:anchor="_Toc242196847" w:history="1">
+      <w:hyperlink w:anchor="_Toc242225053" w:history="1">
         <w:r>
           <w:rPr>
             <w:rStyle w:val="Hipervnculo"/>
@@ -2764,7 +2764,7 @@
             <w:noProof/>
             <w:webHidden/>
           </w:rPr>
-          <w:instrText xml:space="preserve"> PAGEREF _Toc242196847 \h </w:instrText>
+          <w:instrText xml:space="preserve"> PAGEREF _Toc242225053 \h </w:instrText>
         </w:r>
         <w:r>
           <w:rPr>
@@ -2807,7 +2807,7 @@
           <w14:ligatures w14:val="standardContextual"/>
         </w:rPr>
       </w:pPr>
-      <w:hyperlink w:anchor="_Toc242196848" w:history="1">
+      <w:hyperlink w:anchor="_Toc242225054" w:history="1">
         <w:r>
           <w:rPr>
             <w:rStyle w:val="Hipervnculo"/>
@@ -2834,7 +2834,7 @@
             <w:noProof/>
             <w:webHidden/>
           </w:rPr>
-          <w:instrText xml:space="preserve"> PAGEREF _Toc242196848 \h </w:instrText>
+          <w:instrText xml:space="preserve"> PAGEREF _Toc242225054 \h </w:instrText>
         </w:r>
         <w:r>
           <w:rPr>
@@ -2877,7 +2877,7 @@
           <w14:ligatures w14:val="standardContextual"/>
         </w:rPr>
       </w:pPr>
-      <w:hyperlink w:anchor="_Toc242196849" w:history="1">
+      <w:hyperlink w:anchor="_Toc242225055" w:history="1">
         <w:r>
           <w:rPr>
             <w:rStyle w:val="Hipervnculo"/>
@@ -2904,7 +2904,7 @@
             <w:noProof/>
             <w:webHidden/>
           </w:rPr>
-          <w:instrText xml:space="preserve"> PAGEREF _Toc242196849 \h </w:instrText>
+          <w:instrText xml:space="preserve"> PAGEREF _Toc242225055 \h </w:instrText>
         </w:r>
         <w:r>
           <w:rPr>
@@ -2947,7 +2947,7 @@
           <w14:ligatures w14:val="standardContextual"/>
         </w:rPr>
       </w:pPr>
-      <w:hyperlink w:anchor="_Toc242196850" w:history="1">
+      <w:hyperlink w:anchor="_Toc242225056" w:history="1">
         <w:r>
           <w:rPr>
             <w:rStyle w:val="Hipervnculo"/>
@@ -2974,7 +2974,7 @@
             <w:noProof/>
             <w:webHidden/>
           </w:rPr>
-          <w:instrText xml:space="preserve"> PAGEREF _Toc242196850 \h </w:instrText>
+          <w:instrText xml:space="preserve"> PAGEREF _Toc242225056 \h </w:instrText>
         </w:r>
         <w:r>
           <w:rPr>
@@ -3017,7 +3017,7 @@
           <w14:ligatures w14:val="standardContextual"/>
         </w:rPr>
       </w:pPr>
-      <w:hyperlink w:anchor="_Toc242196851" w:history="1">
+      <w:hyperlink w:anchor="_Toc242225057" w:history="1">
         <w:r>
           <w:rPr>
             <w:rStyle w:val="Hipervnculo"/>
@@ -3044,7 +3044,7 @@
             <w:noProof/>
             <w:webHidden/>
           </w:rPr>
-          <w:instrText xml:space="preserve"> PAGEREF _Toc242196851 \h </w:instrText>
+          <w:instrText xml:space="preserve"> PAGEREF _Toc242225057 \h </w:instrText>
         </w:r>
         <w:r>
           <w:rPr>
@@ -3087,7 +3087,7 @@
           <w14:ligatures w14:val="standardContextual"/>
         </w:rPr>
       </w:pPr>
-      <w:hyperlink w:anchor="_Toc242196852" w:history="1">
+      <w:hyperlink w:anchor="_Toc242225058" w:history="1">
         <w:r>
           <w:rPr>
             <w:rStyle w:val="Hipervnculo"/>
@@ -3114,7 +3114,7 @@
             <w:noProof/>
             <w:webHidden/>
           </w:rPr>
-          <w:instrText xml:space="preserve"> PAGEREF _Toc242196852 \h </w:instrText>
+          <w:instrText xml:space="preserve"> PAGEREF _Toc242225058 \h </w:instrText>
         </w:r>
         <w:r>
           <w:rPr>
@@ -3157,7 +3157,7 @@
           <w14:ligatures w14:val="standardContextual"/>
         </w:rPr>
       </w:pPr>
-      <w:hyperlink w:anchor="_Toc242196853" w:history="1">
+      <w:hyperlink w:anchor="_Toc242225059" w:history="1">
         <w:r>
           <w:rPr>
             <w:rStyle w:val="Hipervnculo"/>
@@ -3184,7 +3184,7 @@
             <w:noProof/>
             <w:webHidden/>
           </w:rPr>
-          <w:instrText xml:space="preserve"> PAGEREF _Toc242196853 \h </w:instrText>
+          <w:instrText xml:space="preserve"> PAGEREF _Toc242225059 \h </w:instrText>
         </w:r>
         <w:r>
           <w:rPr>
@@ -3227,7 +3227,7 @@
           <w14:ligatures w14:val="standardContextual"/>
         </w:rPr>
       </w:pPr>
-      <w:hyperlink w:anchor="_Toc242196854" w:history="1">
+      <w:hyperlink w:anchor="_Toc242225060" w:history="1">
         <w:r>
           <w:rPr>
             <w:rStyle w:val="Hipervnculo"/>
@@ -3254,7 +3254,7 @@
             <w:noProof/>
             <w:webHidden/>
           </w:rPr>
-          <w:instrText xml:space="preserve"> PAGEREF _Toc242196854 \h </w:instrText>
+          <w:instrText xml:space="preserve"> PAGEREF _Toc242225060 \h </w:instrText>
         </w:r>
         <w:r>
           <w:rPr>
@@ -3297,7 +3297,7 @@
           <w14:ligatures w14:val="standardContextual"/>
         </w:rPr>
       </w:pPr>
-      <w:hyperlink w:anchor="_Toc242196855" w:history="1">
+      <w:hyperlink w:anchor="_Toc242225061" w:history="1">
         <w:r>
           <w:rPr>
             <w:rStyle w:val="Hipervnculo"/>
@@ -3324,7 +3324,7 @@
             <w:noProof/>
             <w:webHidden/>
           </w:rPr>
-          <w:instrText xml:space="preserve"> PAGEREF _Toc242196855 \h </w:instrText>
+          <w:instrText xml:space="preserve"> PAGEREF _Toc242225061 \h </w:instrText>
         </w:r>
         <w:r>
           <w:rPr>
@@ -3367,7 +3367,7 @@
           <w14:ligatures w14:val="standardContextual"/>
         </w:rPr>
       </w:pPr>
-      <w:hyperlink w:anchor="_Toc242196856" w:history="1">
+      <w:hyperlink w:anchor="_Toc242225062" w:history="1">
         <w:r>
           <w:rPr>
             <w:rStyle w:val="Hipervnculo"/>
@@ -3394,7 +3394,7 @@
             <w:noProof/>
             <w:webHidden/>
           </w:rPr>
-          <w:instrText xml:space="preserve"> PAGEREF _Toc242196856 \h </w:instrText>
+          <w:instrText xml:space="preserve"> PAGEREF _Toc242225062 \h </w:instrText>
         </w:r>
         <w:r>
           <w:rPr>
@@ -3437,7 +3437,7 @@
           <w14:ligatures w14:val="standardContextual"/>
         </w:rPr>
       </w:pPr>
-      <w:hyperlink w:anchor="_Toc242196857" w:history="1">
+      <w:hyperlink w:anchor="_Toc242225063" w:history="1">
         <w:r>
           <w:rPr>
             <w:rStyle w:val="Hipervnculo"/>
@@ -3464,7 +3464,7 @@
             <w:noProof/>
             <w:webHidden/>
           </w:rPr>
-          <w:instrText xml:space="preserve"> PAGEREF _Toc242196857 \h </w:instrText>
+          <w:instrText xml:space="preserve"> PAGEREF _Toc242225063 \h </w:instrText>
         </w:r>
         <w:r>
           <w:rPr>
@@ -3510,7 +3510,7 @@
           <w14:ligatures w14:val="standardContextual"/>
         </w:rPr>
       </w:pPr>
-      <w:hyperlink w:anchor="_Toc242196858" w:history="1">
+      <w:hyperlink w:anchor="_Toc242225064" w:history="1">
         <w:r>
           <w:rPr>
             <w:rStyle w:val="Hipervnculo"/>
@@ -3537,7 +3537,7 @@
             <w:noProof/>
             <w:webHidden/>
           </w:rPr>
-          <w:instrText xml:space="preserve"> PAGEREF _Toc242196858 \h </w:instrText>
+          <w:instrText xml:space="preserve"> PAGEREF _Toc242225064 \h </w:instrText>
         </w:r>
         <w:r>
           <w:rPr>
@@ -3580,7 +3580,7 @@
           <w14:ligatures w14:val="standardContextual"/>
         </w:rPr>
       </w:pPr>
-      <w:hyperlink w:anchor="_Toc242196859" w:history="1">
+      <w:hyperlink w:anchor="_Toc242225065" w:history="1">
         <w:r>
           <w:rPr>
             <w:rStyle w:val="Hipervnculo"/>
@@ -3607,7 +3607,7 @@
             <w:noProof/>
             <w:webHidden/>
           </w:rPr>
-          <w:instrText xml:space="preserve"> PAGEREF _Toc242196859 \h </w:instrText>
+          <w:instrText xml:space="preserve"> PAGEREF _Toc242225065 \h </w:instrText>
         </w:r>
         <w:r>
           <w:rPr>
@@ -3650,7 +3650,7 @@
           <w14:ligatures w14:val="standardContextual"/>
         </w:rPr>
       </w:pPr>
-      <w:hyperlink w:anchor="_Toc242196860" w:history="1">
+      <w:hyperlink w:anchor="_Toc242225066" w:history="1">
         <w:r>
           <w:rPr>
             <w:rStyle w:val="Hipervnculo"/>
@@ -3677,7 +3677,7 @@
             <w:noProof/>
             <w:webHidden/>
           </w:rPr>
-          <w:instrText xml:space="preserve"> PAGEREF _Toc242196860 \h </w:instrText>
+          <w:instrText xml:space="preserve"> PAGEREF _Toc242225066 \h </w:instrText>
         </w:r>
         <w:r>
           <w:rPr>
@@ -3720,7 +3720,7 @@
           <w14:ligatures w14:val="standardContextual"/>
         </w:rPr>
       </w:pPr>
-      <w:hyperlink w:anchor="_Toc242196861" w:history="1">
+      <w:hyperlink w:anchor="_Toc242225067" w:history="1">
         <w:r>
           <w:rPr>
             <w:rStyle w:val="Hipervnculo"/>
@@ -3747,7 +3747,7 @@
             <w:noProof/>
             <w:webHidden/>
           </w:rPr>
-          <w:instrText xml:space="preserve"> PAGEREF _Toc242196861 \h </w:instrText>
+          <w:instrText xml:space="preserve"> PAGEREF _Toc242225067 \h </w:instrText>
         </w:r>
         <w:r>
           <w:rPr>
@@ -3790,7 +3790,7 @@
           <w14:ligatures w14:val="standardContextual"/>
         </w:rPr>
       </w:pPr>
-      <w:hyperlink w:anchor="_Toc242196862" w:history="1">
+      <w:hyperlink w:anchor="_Toc242225068" w:history="1">
         <w:r>
           <w:rPr>
             <w:rStyle w:val="Hipervnculo"/>
@@ -3817,7 +3817,7 @@
             <w:noProof/>
             <w:webHidden/>
           </w:rPr>
-          <w:instrText xml:space="preserve"> PAGEREF _Toc242196862 \h </w:instrText>
+          <w:instrText xml:space="preserve"> PAGEREF _Toc242225068 \h </w:instrText>
         </w:r>
         <w:r>
           <w:rPr>
@@ -3860,7 +3860,7 @@
           <w14:ligatures w14:val="standardContextual"/>
         </w:rPr>
       </w:pPr>
-      <w:hyperlink w:anchor="_Toc242196863" w:history="1">
+      <w:hyperlink w:anchor="_Toc242225069" w:history="1">
         <w:r>
           <w:rPr>
             <w:rStyle w:val="Hipervnculo"/>
@@ -3887,7 +3887,7 @@
             <w:noProof/>
             <w:webHidden/>
           </w:rPr>
-          <w:instrText xml:space="preserve"> PAGEREF _Toc242196863 \h </w:instrText>
+          <w:instrText xml:space="preserve"> PAGEREF _Toc242225069 \h </w:instrText>
         </w:r>
         <w:r>
           <w:rPr>
@@ -3930,7 +3930,7 @@
           <w14:ligatures w14:val="standardContextual"/>
         </w:rPr>
       </w:pPr>
-      <w:hyperlink w:anchor="_Toc242196864" w:history="1">
+      <w:hyperlink w:anchor="_Toc242225070" w:history="1">
         <w:r>
           <w:rPr>
             <w:rStyle w:val="Hipervnculo"/>
@@ -3957,7 +3957,7 @@
             <w:noProof/>
             <w:webHidden/>
           </w:rPr>
-          <w:instrText xml:space="preserve"> PAGEREF _Toc242196864 \h </w:instrText>
+          <w:instrText xml:space="preserve"> PAGEREF _Toc242225070 \h </w:instrText>
         </w:r>
         <w:r>
           <w:rPr>
@@ -4003,7 +4003,7 @@
           <w14:ligatures w14:val="standardContextual"/>
         </w:rPr>
       </w:pPr>
-      <w:hyperlink w:anchor="_Toc242196865" w:history="1">
+      <w:hyperlink w:anchor="_Toc242225071" w:history="1">
         <w:r>
           <w:rPr>
             <w:rStyle w:val="Hipervnculo"/>
@@ -4030,7 +4030,7 @@
             <w:noProof/>
             <w:webHidden/>
           </w:rPr>
-          <w:instrText xml:space="preserve"> PAGEREF _Toc242196865 \h </w:instrText>
+          <w:instrText xml:space="preserve"> PAGEREF _Toc242225071 \h </w:instrText>
         </w:r>
         <w:r>
           <w:rPr>
@@ -4073,7 +4073,7 @@
           <w14:ligatures w14:val="standardContextual"/>
         </w:rPr>
       </w:pPr>
-      <w:hyperlink w:anchor="_Toc242196866" w:history="1">
+      <w:hyperlink w:anchor="_Toc242225072" w:history="1">
         <w:r>
           <w:rPr>
             <w:rStyle w:val="Hipervnculo"/>
@@ -4100,7 +4100,7 @@
             <w:noProof/>
             <w:webHidden/>
           </w:rPr>
-          <w:instrText xml:space="preserve"> PAGEREF _Toc242196866 \h </w:instrText>
+          <w:instrText xml:space="preserve"> PAGEREF _Toc242225072 \h </w:instrText>
         </w:r>
         <w:r>
           <w:rPr>
@@ -4143,7 +4143,7 @@
           <w14:ligatures w14:val="standardContextual"/>
         </w:rPr>
       </w:pPr>
-      <w:hyperlink w:anchor="_Toc242196867" w:history="1">
+      <w:hyperlink w:anchor="_Toc242225073" w:history="1">
         <w:r>
           <w:rPr>
             <w:rStyle w:val="Hipervnculo"/>
@@ -4170,7 +4170,7 @@
             <w:noProof/>
             <w:webHidden/>
           </w:rPr>
-          <w:instrText xml:space="preserve"> PAGEREF _Toc242196867 \h </w:instrText>
+          <w:instrText xml:space="preserve"> PAGEREF _Toc242225073 \h </w:instrText>
         </w:r>
         <w:r>
           <w:rPr>
@@ -4213,7 +4213,7 @@
           <w14:ligatures w14:val="standardContextual"/>
         </w:rPr>
       </w:pPr>
-      <w:hyperlink w:anchor="_Toc242196868" w:history="1">
+      <w:hyperlink w:anchor="_Toc242225074" w:history="1">
         <w:r>
           <w:rPr>
             <w:rStyle w:val="Hipervnculo"/>
@@ -4240,7 +4240,7 @@
             <w:noProof/>
             <w:webHidden/>
           </w:rPr>
-          <w:instrText xml:space="preserve"> PAGEREF _Toc242196868 \h </w:instrText>
+          <w:instrText xml:space="preserve"> PAGEREF _Toc242225074 \h </w:instrText>
         </w:r>
         <w:r>
           <w:rPr>
@@ -4283,7 +4283,7 @@
           <w14:ligatures w14:val="standardContextual"/>
         </w:rPr>
       </w:pPr>
-      <w:hyperlink w:anchor="_Toc242196869" w:history="1">
+      <w:hyperlink w:anchor="_Toc242225075" w:history="1">
         <w:r>
           <w:rPr>
             <w:rStyle w:val="Hipervnculo"/>
@@ -4310,7 +4310,7 @@
             <w:noProof/>
             <w:webHidden/>
           </w:rPr>
-          <w:instrText xml:space="preserve"> PAGEREF _Toc242196869 \h </w:instrText>
+          <w:instrText xml:space="preserve"> PAGEREF _Toc242225075 \h </w:instrText>
         </w:r>
         <w:r>
           <w:rPr>
@@ -4353,7 +4353,7 @@
           <w14:ligatures w14:val="standardContextual"/>
         </w:rPr>
       </w:pPr>
-      <w:hyperlink w:anchor="_Toc242196870" w:history="1">
+      <w:hyperlink w:anchor="_Toc242225076" w:history="1">
         <w:r>
           <w:rPr>
             <w:rStyle w:val="Hipervnculo"/>
@@ -4380,7 +4380,7 @@
             <w:noProof/>
             <w:webHidden/>
           </w:rPr>
-          <w:instrText xml:space="preserve"> PAGEREF _Toc242196870 \h </w:instrText>
+          <w:instrText xml:space="preserve"> PAGEREF _Toc242225076 \h </w:instrText>
         </w:r>
         <w:r>
           <w:rPr>
@@ -4423,7 +4423,7 @@
           <w14:ligatures w14:val="standardContextual"/>
         </w:rPr>
       </w:pPr>
-      <w:hyperlink w:anchor="_Toc242196871" w:history="1">
+      <w:hyperlink w:anchor="_Toc242225077" w:history="1">
         <w:r>
           <w:rPr>
             <w:rStyle w:val="Hipervnculo"/>
@@ -4450,7 +4450,7 @@
             <w:noProof/>
             <w:webHidden/>
           </w:rPr>
-          <w:instrText xml:space="preserve"> PAGEREF _Toc242196871 \h </w:instrText>
+          <w:instrText xml:space="preserve"> PAGEREF _Toc242225077 \h </w:instrText>
         </w:r>
         <w:r>
           <w:rPr>
@@ -4493,7 +4493,7 @@
           <w14:ligatures w14:val="standardContextual"/>
         </w:rPr>
       </w:pPr>
-      <w:hyperlink w:anchor="_Toc242196872" w:history="1">
+      <w:hyperlink w:anchor="_Toc242225078" w:history="1">
         <w:r>
           <w:rPr>
             <w:rStyle w:val="Hipervnculo"/>
@@ -4520,7 +4520,7 @@
             <w:noProof/>
             <w:webHidden/>
           </w:rPr>
-          <w:instrText xml:space="preserve"> PAGEREF _Toc242196872 \h </w:instrText>
+          <w:instrText xml:space="preserve"> PAGEREF _Toc242225078 \h </w:instrText>
         </w:r>
         <w:r>
           <w:rPr>
@@ -4563,7 +4563,7 @@
           <w14:ligatures w14:val="standardContextual"/>
         </w:rPr>
       </w:pPr>
-      <w:hyperlink w:anchor="_Toc242196873" w:history="1">
+      <w:hyperlink w:anchor="_Toc242225079" w:history="1">
         <w:r>
           <w:rPr>
             <w:rStyle w:val="Hipervnculo"/>
@@ -4590,7 +4590,7 @@
             <w:noProof/>
             <w:webHidden/>
           </w:rPr>
-          <w:instrText xml:space="preserve"> PAGEREF _Toc242196873 \h </w:instrText>
+          <w:instrText xml:space="preserve"> PAGEREF _Toc242225079 \h </w:instrText>
         </w:r>
         <w:r>
           <w:rPr>
@@ -4633,7 +4633,7 @@
           <w14:ligatures w14:val="standardContextual"/>
         </w:rPr>
       </w:pPr>
-      <w:hyperlink w:anchor="_Toc242196874" w:history="1">
+      <w:hyperlink w:anchor="_Toc242225080" w:history="1">
         <w:r>
           <w:rPr>
             <w:rStyle w:val="Hipervnculo"/>
@@ -4660,7 +4660,7 @@
             <w:noProof/>
             <w:webHidden/>
           </w:rPr>
-          <w:instrText xml:space="preserve"> PAGEREF _Toc242196874 \h </w:instrText>
+          <w:instrText xml:space="preserve"> PAGEREF _Toc242225080 \h </w:instrText>
         </w:r>
         <w:r>
           <w:rPr>
@@ -4703,7 +4703,7 @@
           <w14:ligatures w14:val="standardContextual"/>
         </w:rPr>
       </w:pPr>
-      <w:hyperlink w:anchor="_Toc242196875" w:history="1">
+      <w:hyperlink w:anchor="_Toc242225081" w:history="1">
         <w:r>
           <w:rPr>
             <w:rStyle w:val="Hipervnculo"/>
@@ -4730,7 +4730,7 @@
             <w:noProof/>
             <w:webHidden/>
           </w:rPr>
-          <w:instrText xml:space="preserve"> PAGEREF _Toc242196875 \h </w:instrText>
+          <w:instrText xml:space="preserve"> PAGEREF _Toc242225081 \h </w:instrText>
         </w:r>
         <w:r>
           <w:rPr>
@@ -4773,7 +4773,7 @@
           <w14:ligatures w14:val="standardContextual"/>
         </w:rPr>
       </w:pPr>
-      <w:hyperlink w:anchor="_Toc242196876" w:history="1">
+      <w:hyperlink w:anchor="_Toc242225082" w:history="1">
         <w:r>
           <w:rPr>
             <w:rStyle w:val="Hipervnculo"/>
@@ -4800,7 +4800,7 @@
             <w:noProof/>
             <w:webHidden/>
           </w:rPr>
-          <w:instrText xml:space="preserve"> PAGEREF _Toc242196876 \h </w:instrText>
+          <w:instrText xml:space="preserve"> PAGEREF _Toc242225082 \h </w:instrText>
         </w:r>
         <w:r>
           <w:rPr>
@@ -4843,7 +4843,7 @@
           <w14:ligatures w14:val="standardContextual"/>
         </w:rPr>
       </w:pPr>
-      <w:hyperlink w:anchor="_Toc242196877" w:history="1">
+      <w:hyperlink w:anchor="_Toc242225083" w:history="1">
         <w:r>
           <w:rPr>
             <w:rStyle w:val="Hipervnculo"/>
@@ -4870,7 +4870,7 @@
             <w:noProof/>
             <w:webHidden/>
           </w:rPr>
-          <w:instrText xml:space="preserve"> PAGEREF _Toc242196877 \h </w:instrText>
+          <w:instrText xml:space="preserve"> PAGEREF _Toc242225083 \h </w:instrText>
         </w:r>
         <w:r>
           <w:rPr>
@@ -4913,7 +4913,7 @@
           <w14:ligatures w14:val="standardContextual"/>
         </w:rPr>
       </w:pPr>
-      <w:hyperlink w:anchor="_Toc242196878" w:history="1">
+      <w:hyperlink w:anchor="_Toc242225084" w:history="1">
         <w:r>
           <w:rPr>
             <w:rStyle w:val="Hipervnculo"/>
@@ -4940,7 +4940,7 @@
             <w:noProof/>
             <w:webHidden/>
           </w:rPr>
-          <w:instrText xml:space="preserve"> PAGEREF _Toc242196878 \h </w:instrText>
+          <w:instrText xml:space="preserve"> PAGEREF _Toc242225084 \h </w:instrText>
         </w:r>
         <w:r>
           <w:rPr>
@@ -4983,7 +4983,7 @@
           <w14:ligatures w14:val="standardContextual"/>
         </w:rPr>
       </w:pPr>
-      <w:hyperlink w:anchor="_Toc242196879" w:history="1">
+      <w:hyperlink w:anchor="_Toc242225085" w:history="1">
         <w:r>
           <w:rPr>
             <w:rStyle w:val="Hipervnculo"/>
@@ -5010,7 +5010,7 @@
             <w:noProof/>
             <w:webHidden/>
           </w:rPr>
-          <w:instrText xml:space="preserve"> PAGEREF _Toc242196879 \h </w:instrText>
+          <w:instrText xml:space="preserve"> PAGEREF _Toc242225085 \h </w:instrText>
         </w:r>
         <w:r>
           <w:rPr>
@@ -5053,7 +5053,7 @@
           <w14:ligatures w14:val="standardContextual"/>
         </w:rPr>
       </w:pPr>
-      <w:hyperlink w:anchor="_Toc242196880" w:history="1">
+      <w:hyperlink w:anchor="_Toc242225086" w:history="1">
         <w:r>
           <w:rPr>
             <w:rStyle w:val="Hipervnculo"/>
@@ -5080,7 +5080,7 @@
             <w:noProof/>
             <w:webHidden/>
           </w:rPr>
-          <w:instrText xml:space="preserve"> PAGEREF _Toc242196880 \h </w:instrText>
+          <w:instrText xml:space="preserve"> PAGEREF _Toc242225086 \h </w:instrText>
         </w:r>
         <w:r>
           <w:rPr>
@@ -5123,7 +5123,7 @@
           <w14:ligatures w14:val="standardContextual"/>
         </w:rPr>
       </w:pPr>
-      <w:hyperlink w:anchor="_Toc242196881" w:history="1">
+      <w:hyperlink w:anchor="_Toc242225087" w:history="1">
         <w:r>
           <w:rPr>
             <w:rStyle w:val="Hipervnculo"/>
@@ -5150,7 +5150,7 @@
             <w:noProof/>
             <w:webHidden/>
           </w:rPr>
-          <w:instrText xml:space="preserve"> PAGEREF _Toc242196881 \h </w:instrText>
+          <w:instrText xml:space="preserve"> PAGEREF _Toc242225087 \h </w:instrText>
         </w:r>
         <w:r>
           <w:rPr>
@@ -5193,7 +5193,7 @@
           <w14:ligatures w14:val="standardContextual"/>
         </w:rPr>
       </w:pPr>
-      <w:hyperlink w:anchor="_Toc242196882" w:history="1">
+      <w:hyperlink w:anchor="_Toc242225088" w:history="1">
         <w:r>
           <w:rPr>
             <w:rStyle w:val="Hipervnculo"/>
@@ -5220,7 +5220,7 @@
             <w:noProof/>
             <w:webHidden/>
           </w:rPr>
-          <w:instrText xml:space="preserve"> PAGEREF _Toc242196882 \h </w:instrText>
+          <w:instrText xml:space="preserve"> PAGEREF _Toc242225088 \h </w:instrText>
         </w:r>
         <w:r>
           <w:rPr>
@@ -5263,7 +5263,7 @@
           <w14:ligatures w14:val="standardContextual"/>
         </w:rPr>
       </w:pPr>
-      <w:hyperlink w:anchor="_Toc242196883" w:history="1">
+      <w:hyperlink w:anchor="_Toc242225089" w:history="1">
         <w:r>
           <w:rPr>
             <w:rStyle w:val="Hipervnculo"/>
@@ -5290,7 +5290,7 @@
             <w:noProof/>
             <w:webHidden/>
           </w:rPr>
-          <w:instrText xml:space="preserve"> PAGEREF _Toc242196883 \h </w:instrText>
+          <w:instrText xml:space="preserve"> PAGEREF _Toc242225089 \h </w:instrText>
         </w:r>
         <w:r>
           <w:rPr>
@@ -5333,7 +5333,7 @@
           <w14:ligatures w14:val="standardContextual"/>
         </w:rPr>
       </w:pPr>
-      <w:hyperlink w:anchor="_Toc242196884" w:history="1">
+      <w:hyperlink w:anchor="_Toc242225090" w:history="1">
         <w:r>
           <w:rPr>
             <w:rStyle w:val="Hipervnculo"/>
@@ -5360,7 +5360,7 @@
             <w:noProof/>
             <w:webHidden/>
           </w:rPr>
-          <w:instrText xml:space="preserve"> PAGEREF _Toc242196884 \h </w:instrText>
+          <w:instrText xml:space="preserve"> PAGEREF _Toc242225090 \h </w:instrText>
         </w:r>
         <w:r>
           <w:rPr>
@@ -5406,7 +5406,7 @@
           <w14:ligatures w14:val="standardContextual"/>
         </w:rPr>
       </w:pPr>
-      <w:hyperlink w:anchor="_Toc242196885" w:history="1">
+      <w:hyperlink w:anchor="_Toc242225091" w:history="1">
         <w:r>
           <w:rPr>
             <w:rStyle w:val="Hipervnculo"/>
@@ -5433,7 +5433,7 @@
             <w:noProof/>
             <w:webHidden/>
           </w:rPr>
-          <w:instrText xml:space="preserve"> PAGEREF _Toc242196885 \h </w:instrText>
+          <w:instrText xml:space="preserve"> PAGEREF _Toc242225091 \h </w:instrText>
         </w:r>
         <w:r>
           <w:rPr>
@@ -5476,7 +5476,7 @@
           <w14:ligatures w14:val="standardContextual"/>
         </w:rPr>
       </w:pPr>
-      <w:hyperlink w:anchor="_Toc242196886" w:history="1">
+      <w:hyperlink w:anchor="_Toc242225092" w:history="1">
         <w:r>
           <w:rPr>
             <w:rStyle w:val="Hipervnculo"/>
@@ -5503,7 +5503,7 @@
             <w:noProof/>
             <w:webHidden/>
           </w:rPr>
-          <w:instrText xml:space="preserve"> PAGEREF _Toc242196886 \h </w:instrText>
+          <w:instrText xml:space="preserve"> PAGEREF _Toc242225092 \h </w:instrText>
         </w:r>
         <w:r>
           <w:rPr>
@@ -5546,7 +5546,7 @@
           <w14:ligatures w14:val="standardContextual"/>
         </w:rPr>
       </w:pPr>
-      <w:hyperlink w:anchor="_Toc242196887" w:history="1">
+      <w:hyperlink w:anchor="_Toc242225093" w:history="1">
         <w:r>
           <w:rPr>
             <w:rStyle w:val="Hipervnculo"/>
@@ -5573,7 +5573,7 @@
             <w:noProof/>
             <w:webHidden/>
           </w:rPr>
-          <w:instrText xml:space="preserve"> PAGEREF _Toc242196887 \h </w:instrText>
+          <w:instrText xml:space="preserve"> PAGEREF _Toc242225093 \h </w:instrText>
         </w:r>
         <w:r>
           <w:rPr>
@@ -5616,7 +5616,7 @@
           <w14:ligatures w14:val="standardContextual"/>
         </w:rPr>
       </w:pPr>
-      <w:hyperlink w:anchor="_Toc242196888" w:history="1">
+      <w:hyperlink w:anchor="_Toc242225094" w:history="1">
         <w:r>
           <w:rPr>
             <w:rStyle w:val="Hipervnculo"/>
@@ -5643,7 +5643,7 @@
             <w:noProof/>
             <w:webHidden/>
           </w:rPr>
-          <w:instrText xml:space="preserve"> PAGEREF _Toc242196888 \h </w:instrText>
+          <w:instrText xml:space="preserve"> PAGEREF _Toc242225094 \h </w:instrText>
         </w:r>
         <w:r>
           <w:rPr>
@@ -5686,7 +5686,7 @@
           <w14:ligatures w14:val="standardContextual"/>
         </w:rPr>
       </w:pPr>
-      <w:hyperlink w:anchor="_Toc242196889" w:history="1">
+      <w:hyperlink w:anchor="_Toc242225095" w:history="1">
         <w:r>
           <w:rPr>
             <w:rStyle w:val="Hipervnculo"/>
@@ -5713,7 +5713,7 @@
             <w:noProof/>
             <w:webHidden/>
           </w:rPr>
-          <w:instrText xml:space="preserve"> PAGEREF _Toc242196889 \h </w:instrText>
+          <w:instrText xml:space="preserve"> PAGEREF _Toc242225095 \h </w:instrText>
         </w:r>
         <w:r>
           <w:rPr>
@@ -5756,7 +5756,7 @@
           <w14:ligatures w14:val="standardContextual"/>
         </w:rPr>
       </w:pPr>
-      <w:hyperlink w:anchor="_Toc242196890" w:history="1">
+      <w:hyperlink w:anchor="_Toc242225096" w:history="1">
         <w:r>
           <w:rPr>
             <w:rStyle w:val="Hipervnculo"/>
@@ -5783,7 +5783,7 @@
             <w:noProof/>
             <w:webHidden/>
           </w:rPr>
-          <w:instrText xml:space="preserve"> PAGEREF _Toc242196890 \h </w:instrText>
+          <w:instrText xml:space="preserve"> PAGEREF _Toc242225096 \h </w:instrText>
         </w:r>
         <w:r>
           <w:rPr>
@@ -5826,7 +5826,7 @@
           <w14:ligatures w14:val="standardContextual"/>
         </w:rPr>
       </w:pPr>
-      <w:hyperlink w:anchor="_Toc242196891" w:history="1">
+      <w:hyperlink w:anchor="_Toc242225097" w:history="1">
         <w:r>
           <w:rPr>
             <w:rStyle w:val="Hipervnculo"/>
@@ -5853,7 +5853,7 @@
             <w:noProof/>
             <w:webHidden/>
           </w:rPr>
-          <w:instrText xml:space="preserve"> PAGEREF _Toc242196891 \h </w:instrText>
+          <w:instrText xml:space="preserve"> PAGEREF _Toc242225097 \h </w:instrText>
         </w:r>
         <w:r>
           <w:rPr>
@@ -5896,7 +5896,7 @@
           <w14:ligatures w14:val="standardContextual"/>
         </w:rPr>
       </w:pPr>
-      <w:hyperlink w:anchor="_Toc242196892" w:history="1">
+      <w:hyperlink w:anchor="_Toc242225098" w:history="1">
         <w:r>
           <w:rPr>
             <w:rStyle w:val="Hipervnculo"/>
@@ -5923,7 +5923,7 @@
             <w:noProof/>
             <w:webHidden/>
           </w:rPr>
-          <w:instrText xml:space="preserve"> PAGEREF _Toc242196892 \h </w:instrText>
+          <w:instrText xml:space="preserve"> PAGEREF _Toc242225098 \h </w:instrText>
         </w:r>
         <w:r>
           <w:rPr>
@@ -5966,7 +5966,7 @@
           <w14:ligatures w14:val="standardContextual"/>
         </w:rPr>
       </w:pPr>
-      <w:hyperlink w:anchor="_Toc242196893" w:history="1">
+      <w:hyperlink w:anchor="_Toc242225099" w:history="1">
         <w:r>
           <w:rPr>
             <w:rStyle w:val="Hipervnculo"/>
@@ -5993,7 +5993,7 @@
             <w:noProof/>
             <w:webHidden/>
           </w:rPr>
-          <w:instrText xml:space="preserve"> PAGEREF _Toc242196893 \h </w:instrText>
+          <w:instrText xml:space="preserve"> PAGEREF _Toc242225099 \h </w:instrText>
         </w:r>
         <w:r>
           <w:rPr>
@@ -6036,7 +6036,7 @@
           <w14:ligatures w14:val="standardContextual"/>
         </w:rPr>
       </w:pPr>
-      <w:hyperlink w:anchor="_Toc242196894" w:history="1">
+      <w:hyperlink w:anchor="_Toc242225100" w:history="1">
         <w:r>
           <w:rPr>
             <w:rStyle w:val="Hipervnculo"/>
@@ -6063,7 +6063,7 @@
             <w:noProof/>
             <w:webHidden/>
           </w:rPr>
-          <w:instrText xml:space="preserve"> PAGEREF _Toc242196894 \h </w:instrText>
+          <w:instrText xml:space="preserve"> PAGEREF _Toc242225100 \h </w:instrText>
         </w:r>
         <w:r>
           <w:rPr>
@@ -6106,7 +6106,7 @@
           <w14:ligatures w14:val="standardContextual"/>
         </w:rPr>
       </w:pPr>
-      <w:hyperlink w:anchor="_Toc242196895" w:history="1">
+      <w:hyperlink w:anchor="_Toc242225101" w:history="1">
         <w:r>
           <w:rPr>
             <w:rStyle w:val="Hipervnculo"/>
@@ -6133,7 +6133,7 @@
             <w:noProof/>
             <w:webHidden/>
           </w:rPr>
-          <w:instrText xml:space="preserve"> PAGEREF _Toc242196895 \h </w:instrText>
+          <w:instrText xml:space="preserve"> PAGEREF _Toc242225101 \h </w:instrText>
         </w:r>
         <w:r>
           <w:rPr>
@@ -6176,7 +6176,7 @@
           <w14:ligatures w14:val="standardContextual"/>
         </w:rPr>
       </w:pPr>
-      <w:hyperlink w:anchor="_Toc242196896" w:history="1">
+      <w:hyperlink w:anchor="_Toc242225102" w:history="1">
         <w:r>
           <w:rPr>
             <w:rStyle w:val="Hipervnculo"/>
@@ -6203,7 +6203,7 @@
             <w:noProof/>
             <w:webHidden/>
           </w:rPr>
-          <w:instrText xml:space="preserve"> PAGEREF _Toc242196896 \h </w:instrText>
+          <w:instrText xml:space="preserve"> PAGEREF _Toc242225102 \h </w:instrText>
         </w:r>
         <w:r>
           <w:rPr>
@@ -6246,7 +6246,7 @@
           <w14:ligatures w14:val="standardContextual"/>
         </w:rPr>
       </w:pPr>
-      <w:hyperlink w:anchor="_Toc242196897" w:history="1">
+      <w:hyperlink w:anchor="_Toc242225103" w:history="1">
         <w:r>
           <w:rPr>
             <w:rStyle w:val="Hipervnculo"/>
@@ -6273,7 +6273,7 @@
             <w:noProof/>
             <w:webHidden/>
           </w:rPr>
-          <w:instrText xml:space="preserve"> PAGEREF _Toc242196897 \h </w:instrText>
+          <w:instrText xml:space="preserve"> PAGEREF _Toc242225103 \h </w:instrText>
         </w:r>
         <w:r>
           <w:rPr>
@@ -6316,7 +6316,7 @@
           <w14:ligatures w14:val="standardContextual"/>
         </w:rPr>
       </w:pPr>
-      <w:hyperlink w:anchor="_Toc242196898" w:history="1">
+      <w:hyperlink w:anchor="_Toc242225104" w:history="1">
         <w:r>
           <w:rPr>
             <w:rStyle w:val="Hipervnculo"/>
@@ -6343,7 +6343,7 @@
             <w:noProof/>
             <w:webHidden/>
           </w:rPr>
-          <w:instrText xml:space="preserve"> PAGEREF _Toc242196898 \h </w:instrText>
+          <w:instrText xml:space="preserve"> PAGEREF _Toc242225104 \h </w:instrText>
         </w:r>
         <w:r>
           <w:rPr>
@@ -6386,7 +6386,7 @@
           <w14:ligatures w14:val="standardContextual"/>
         </w:rPr>
       </w:pPr>
-      <w:hyperlink w:anchor="_Toc242196899" w:history="1">
+      <w:hyperlink w:anchor="_Toc242225105" w:history="1">
         <w:r>
           <w:rPr>
             <w:rStyle w:val="Hipervnculo"/>
@@ -6413,7 +6413,7 @@
             <w:noProof/>
             <w:webHidden/>
           </w:rPr>
-          <w:instrText xml:space="preserve"> PAGEREF _Toc242196899 \h </w:instrText>
+          <w:instrText xml:space="preserve"> PAGEREF _Toc242225105 \h </w:instrText>
         </w:r>
         <w:r>
           <w:rPr>
@@ -6459,7 +6459,7 @@
           <w14:ligatures w14:val="standardContextual"/>
         </w:rPr>
       </w:pPr>
-      <w:hyperlink w:anchor="_Toc242196900" w:history="1">
+      <w:hyperlink w:anchor="_Toc242225106" w:history="1">
         <w:r>
           <w:rPr>
             <w:rStyle w:val="Hipervnculo"/>
@@ -6486,7 +6486,7 @@
             <w:noProof/>
             <w:webHidden/>
           </w:rPr>
-          <w:instrText xml:space="preserve"> PAGEREF _Toc242196900 \h </w:instrText>
+          <w:instrText xml:space="preserve"> PAGEREF _Toc242225106 \h </w:instrText>
         </w:r>
         <w:r>
           <w:rPr>
@@ -6529,7 +6529,7 @@
           <w14:ligatures w14:val="standardContextual"/>
         </w:rPr>
       </w:pPr>
-      <w:hyperlink w:anchor="_Toc242196901" w:history="1">
+      <w:hyperlink w:anchor="_Toc242225107" w:history="1">
         <w:r>
           <w:rPr>
             <w:rStyle w:val="Hipervnculo"/>
@@ -6556,7 +6556,7 @@
             <w:noProof/>
             <w:webHidden/>
           </w:rPr>
-          <w:instrText xml:space="preserve"> PAGEREF _Toc242196901 \h </w:instrText>
+          <w:instrText xml:space="preserve"> PAGEREF _Toc242225107 \h </w:instrText>
         </w:r>
         <w:r>
           <w:rPr>
@@ -6599,7 +6599,7 @@
           <w14:ligatures w14:val="standardContextual"/>
         </w:rPr>
       </w:pPr>
-      <w:hyperlink w:anchor="_Toc242196902" w:history="1">
+      <w:hyperlink w:anchor="_Toc242225108" w:history="1">
         <w:r>
           <w:rPr>
             <w:rStyle w:val="Hipervnculo"/>
@@ -6626,7 +6626,7 @@
             <w:noProof/>
             <w:webHidden/>
           </w:rPr>
-          <w:instrText xml:space="preserve"> PAGEREF _Toc242196902 \h </w:instrText>
+          <w:instrText xml:space="preserve"> PAGEREF _Toc242225108 \h </w:instrText>
         </w:r>
         <w:r>
           <w:rPr>
@@ -6669,7 +6669,7 @@
           <w14:ligatures w14:val="standardContextual"/>
         </w:rPr>
       </w:pPr>
-      <w:hyperlink w:anchor="_Toc242196903" w:history="1">
+      <w:hyperlink w:anchor="_Toc242225109" w:history="1">
         <w:r>
           <w:rPr>
             <w:rStyle w:val="Hipervnculo"/>
@@ -6696,7 +6696,7 @@
             <w:noProof/>
             <w:webHidden/>
           </w:rPr>
-          <w:instrText xml:space="preserve"> PAGEREF _Toc242196903 \h </w:instrText>
+          <w:instrText xml:space="preserve"> PAGEREF _Toc242225109 \h </w:instrText>
         </w:r>
         <w:r>
           <w:rPr>
@@ -6739,7 +6739,7 @@
           <w14:ligatures w14:val="standardContextual"/>
         </w:rPr>
       </w:pPr>
-      <w:hyperlink w:anchor="_Toc242196904" w:history="1">
+      <w:hyperlink w:anchor="_Toc242225110" w:history="1">
         <w:r>
           <w:rPr>
             <w:rStyle w:val="Hipervnculo"/>
@@ -6766,7 +6766,7 @@
             <w:noProof/>
             <w:webHidden/>
           </w:rPr>
-          <w:instrText xml:space="preserve"> PAGEREF _Toc242196904 \h </w:instrText>
+          <w:instrText xml:space="preserve"> PAGEREF _Toc242225110 \h </w:instrText>
         </w:r>
         <w:r>
           <w:rPr>
@@ -6809,7 +6809,7 @@
           <w14:ligatures w14:val="standardContextual"/>
         </w:rPr>
       </w:pPr>
-      <w:hyperlink w:anchor="_Toc242196905" w:history="1">
+      <w:hyperlink w:anchor="_Toc242225111" w:history="1">
         <w:r>
           <w:rPr>
             <w:rStyle w:val="Hipervnculo"/>
@@ -6836,7 +6836,7 @@
             <w:noProof/>
             <w:webHidden/>
           </w:rPr>
-          <w:instrText xml:space="preserve"> PAGEREF _Toc242196905 \h </w:instrText>
+          <w:instrText xml:space="preserve"> PAGEREF _Toc242225111 \h </w:instrText>
         </w:r>
         <w:r>
           <w:rPr>
@@ -6882,7 +6882,7 @@
           <w14:ligatures w14:val="standardContextual"/>
         </w:rPr>
       </w:pPr>
-      <w:hyperlink w:anchor="_Toc242196906" w:history="1">
+      <w:hyperlink w:anchor="_Toc242225112" w:history="1">
         <w:r>
           <w:rPr>
             <w:rStyle w:val="Hipervnculo"/>
@@ -6909,7 +6909,7 @@
             <w:noProof/>
             <w:webHidden/>
           </w:rPr>
-          <w:instrText xml:space="preserve"> PAGEREF _Toc242196906 \h </w:instrText>
+          <w:instrText xml:space="preserve"> PAGEREF _Toc242225112 \h </w:instrText>
         </w:r>
         <w:r>
           <w:rPr>
@@ -6952,7 +6952,7 @@
           <w14:ligatures w14:val="standardContextual"/>
         </w:rPr>
       </w:pPr>
-      <w:hyperlink w:anchor="_Toc242196907" w:history="1">
+      <w:hyperlink w:anchor="_Toc242225113" w:history="1">
         <w:r>
           <w:rPr>
             <w:rStyle w:val="Hipervnculo"/>
@@ -6979,7 +6979,7 @@
             <w:noProof/>
             <w:webHidden/>
           </w:rPr>
-          <w:instrText xml:space="preserve"> PAGEREF _Toc242196907 \h </w:instrText>
+          <w:instrText xml:space="preserve"> PAGEREF _Toc242225113 \h </w:instrText>
         </w:r>
         <w:r>
           <w:rPr>
@@ -7022,7 +7022,7 @@
           <w14:ligatures w14:val="standardContextual"/>
         </w:rPr>
       </w:pPr>
-      <w:hyperlink w:anchor="_Toc242196908" w:history="1">
+      <w:hyperlink w:anchor="_Toc242225114" w:history="1">
         <w:r>
           <w:rPr>
             <w:rStyle w:val="Hipervnculo"/>
@@ -7049,7 +7049,7 @@
             <w:noProof/>
             <w:webHidden/>
           </w:rPr>
-          <w:instrText xml:space="preserve"> PAGEREF _Toc242196908 \h </w:instrText>
+          <w:instrText xml:space="preserve"> PAGEREF _Toc242225114 \h </w:instrText>
         </w:r>
         <w:r>
           <w:rPr>
@@ -7092,7 +7092,7 @@
           <w14:ligatures w14:val="standardContextual"/>
         </w:rPr>
       </w:pPr>
-      <w:hyperlink w:anchor="_Toc242196909" w:history="1">
+      <w:hyperlink w:anchor="_Toc242225115" w:history="1">
         <w:r>
           <w:rPr>
             <w:rStyle w:val="Hipervnculo"/>
@@ -7119,7 +7119,7 @@
             <w:noProof/>
             <w:webHidden/>
           </w:rPr>
-          <w:instrText xml:space="preserve"> PAGEREF _Toc242196909 \h </w:instrText>
+          <w:instrText xml:space="preserve"> PAGEREF _Toc242225115 \h </w:instrText>
         </w:r>
         <w:r>
           <w:rPr>
@@ -7162,7 +7162,7 @@
           <w14:ligatures w14:val="standardContextual"/>
         </w:rPr>
       </w:pPr>
-      <w:hyperlink w:anchor="_Toc242196910" w:history="1">
+      <w:hyperlink w:anchor="_Toc242225116" w:history="1">
         <w:r>
           <w:rPr>
             <w:rStyle w:val="Hipervnculo"/>
@@ -7189,7 +7189,7 @@
             <w:noProof/>
             <w:webHidden/>
           </w:rPr>
-          <w:instrText xml:space="preserve"> PAGEREF _Toc242196910 \h </w:instrText>
+          <w:instrText xml:space="preserve"> PAGEREF _Toc242225116 \h </w:instrText>
         </w:r>
         <w:r>
           <w:rPr>
@@ -7232,7 +7232,7 @@
           <w14:ligatures w14:val="standardContextual"/>
         </w:rPr>
       </w:pPr>
-      <w:hyperlink w:anchor="_Toc242196911" w:history="1">
+      <w:hyperlink w:anchor="_Toc242225117" w:history="1">
         <w:r>
           <w:rPr>
             <w:rStyle w:val="Hipervnculo"/>
@@ -7259,7 +7259,7 @@
             <w:noProof/>
             <w:webHidden/>
           </w:rPr>
-          <w:instrText xml:space="preserve"> PAGEREF _Toc242196911 \h </w:instrText>
+          <w:instrText xml:space="preserve"> PAGEREF _Toc242225117 \h </w:instrText>
         </w:r>
         <w:r>
           <w:rPr>
@@ -7305,7 +7305,7 @@
           <w14:ligatures w14:val="standardContextual"/>
         </w:rPr>
       </w:pPr>
-      <w:hyperlink w:anchor="_Toc242196912" w:history="1">
+      <w:hyperlink w:anchor="_Toc242225118" w:history="1">
         <w:r>
           <w:rPr>
             <w:rStyle w:val="Hipervnculo"/>
@@ -7341,7 +7341,7 @@
             <w:noProof/>
             <w:webHidden/>
           </w:rPr>
-          <w:instrText xml:space="preserve"> PAGEREF _Toc242196912 \h </w:instrText>
+          <w:instrText xml:space="preserve"> PAGEREF _Toc242225118 \h </w:instrText>
         </w:r>
         <w:r>
           <w:rPr>
@@ -7384,7 +7384,7 @@
           <w14:ligatures w14:val="standardContextual"/>
         </w:rPr>
       </w:pPr>
-      <w:hyperlink w:anchor="_Toc242196913" w:history="1">
+      <w:hyperlink w:anchor="_Toc242225119" w:history="1">
         <w:r>
           <w:rPr>
             <w:rStyle w:val="Hipervnculo"/>
@@ -7411,7 +7411,7 @@
             <w:noProof/>
             <w:webHidden/>
           </w:rPr>
-          <w:instrText xml:space="preserve"> PAGEREF _Toc242196913 \h </w:instrText>
+          <w:instrText xml:space="preserve"> PAGEREF _Toc242225119 \h </w:instrText>
         </w:r>
         <w:r>
           <w:rPr>
@@ -7454,7 +7454,7 @@
           <w14:ligatures w14:val="standardContextual"/>
         </w:rPr>
       </w:pPr>
-      <w:hyperlink w:anchor="_Toc242196914" w:history="1">
+      <w:hyperlink w:anchor="_Toc242225120" w:history="1">
         <w:r>
           <w:rPr>
             <w:rStyle w:val="Hipervnculo"/>
@@ -7481,7 +7481,7 @@
             <w:noProof/>
             <w:webHidden/>
           </w:rPr>
-          <w:instrText xml:space="preserve"> PAGEREF _Toc242196914 \h </w:instrText>
+          <w:instrText xml:space="preserve"> PAGEREF _Toc242225120 \h </w:instrText>
         </w:r>
         <w:r>
           <w:rPr>
@@ -7524,7 +7524,7 @@
           <w14:ligatures w14:val="standardContextual"/>
         </w:rPr>
       </w:pPr>
-      <w:hyperlink w:anchor="_Toc242196915" w:history="1">
+      <w:hyperlink w:anchor="_Toc242225121" w:history="1">
         <w:r>
           <w:rPr>
             <w:rStyle w:val="Hipervnculo"/>
@@ -7551,7 +7551,7 @@
             <w:noProof/>
             <w:webHidden/>
           </w:rPr>
-          <w:instrText xml:space="preserve"> PAGEREF _Toc242196915 \h </w:instrText>
+          <w:instrText xml:space="preserve"> PAGEREF _Toc242225121 \h </w:instrText>
         </w:r>
         <w:r>
           <w:rPr>
@@ -7594,7 +7594,7 @@
           <w14:ligatures w14:val="standardContextual"/>
         </w:rPr>
       </w:pPr>
-      <w:hyperlink w:anchor="_Toc242196916" w:history="1">
+      <w:hyperlink w:anchor="_Toc242225122" w:history="1">
         <w:r>
           <w:rPr>
             <w:rStyle w:val="Hipervnculo"/>
@@ -7621,7 +7621,7 @@
             <w:noProof/>
             <w:webHidden/>
           </w:rPr>
-          <w:instrText xml:space="preserve"> PAGEREF _Toc242196916 \h </w:instrText>
+          <w:instrText xml:space="preserve"> PAGEREF _Toc242225122 \h </w:instrText>
         </w:r>
         <w:r>
           <w:rPr>
@@ -7664,7 +7664,7 @@
           <w14:ligatures w14:val="standardContextual"/>
         </w:rPr>
       </w:pPr>
-      <w:hyperlink w:anchor="_Toc242196917" w:history="1">
+      <w:hyperlink w:anchor="_Toc242225123" w:history="1">
         <w:r>
           <w:rPr>
             <w:rStyle w:val="Hipervnculo"/>
@@ -7691,7 +7691,7 @@
             <w:noProof/>
             <w:webHidden/>
           </w:rPr>
-          <w:instrText xml:space="preserve"> PAGEREF _Toc242196917 \h </w:instrText>
+          <w:instrText xml:space="preserve"> PAGEREF _Toc242225123 \h </w:instrText>
         </w:r>
         <w:r>
           <w:rPr>
@@ -7737,7 +7737,7 @@
           <w14:ligatures w14:val="standardContextual"/>
         </w:rPr>
       </w:pPr>
-      <w:hyperlink w:anchor="_Toc242196918" w:history="1">
+      <w:hyperlink w:anchor="_Toc242225124" w:history="1">
         <w:r>
           <w:rPr>
             <w:rStyle w:val="Hipervnculo"/>
@@ -7764,7 +7764,7 @@
             <w:noProof/>
             <w:webHidden/>
           </w:rPr>
-          <w:instrText xml:space="preserve"> PAGEREF _Toc242196918 \h </w:instrText>
+          <w:instrText xml:space="preserve"> PAGEREF _Toc242225124 \h </w:instrText>
         </w:r>
         <w:r>
           <w:rPr>
@@ -7807,7 +7807,7 @@
           <w14:ligatures w14:val="standardContextual"/>
         </w:rPr>
       </w:pPr>
-      <w:hyperlink w:anchor="_Toc242196919" w:history="1">
+      <w:hyperlink w:anchor="_Toc242225125" w:history="1">
         <w:r>
           <w:rPr>
             <w:rStyle w:val="Hipervnculo"/>
@@ -7834,7 +7834,7 @@
             <w:noProof/>
             <w:webHidden/>
           </w:rPr>
-          <w:instrText xml:space="preserve"> PAGEREF _Toc242196919 \h </w:instrText>
+          <w:instrText xml:space="preserve"> PAGEREF _Toc242225125 \h </w:instrText>
         </w:r>
         <w:r>
           <w:rPr>
@@ -7880,7 +7880,7 @@
           <w14:ligatures w14:val="standardContextual"/>
         </w:rPr>
       </w:pPr>
-      <w:hyperlink w:anchor="_Toc242196920" w:history="1">
+      <w:hyperlink w:anchor="_Toc242225126" w:history="1">
         <w:r>
           <w:rPr>
             <w:rStyle w:val="Hipervnculo"/>
@@ -7907,7 +7907,7 @@
             <w:noProof/>
             <w:webHidden/>
           </w:rPr>
-          <w:instrText xml:space="preserve"> PAGEREF _Toc242196920 \h </w:instrText>
+          <w:instrText xml:space="preserve"> PAGEREF _Toc242225126 \h </w:instrText>
         </w:r>
         <w:r>
           <w:rPr>
@@ -7950,7 +7950,7 @@
           <w14:ligatures w14:val="standardContextual"/>
         </w:rPr>
       </w:pPr>
-      <w:hyperlink w:anchor="_Toc242196921" w:history="1">
+      <w:hyperlink w:anchor="_Toc242225127" w:history="1">
         <w:r>
           <w:rPr>
             <w:rStyle w:val="Hipervnculo"/>
@@ -7977,7 +7977,7 @@
             <w:noProof/>
             <w:webHidden/>
           </w:rPr>
-          <w:instrText xml:space="preserve"> PAGEREF _Toc242196921 \h </w:instrText>
+          <w:instrText xml:space="preserve"> PAGEREF _Toc242225127 \h </w:instrText>
         </w:r>
         <w:r>
           <w:rPr>
@@ -8020,7 +8020,7 @@
           <w14:ligatures w14:val="standardContextual"/>
         </w:rPr>
       </w:pPr>
-      <w:hyperlink w:anchor="_Toc242196922" w:history="1">
+      <w:hyperlink w:anchor="_Toc242225128" w:history="1">
         <w:r>
           <w:rPr>
             <w:rStyle w:val="Hipervnculo"/>
@@ -8047,7 +8047,7 @@
             <w:noProof/>
             <w:webHidden/>
           </w:rPr>
-          <w:instrText xml:space="preserve"> PAGEREF _Toc242196922 \h </w:instrText>
+          <w:instrText xml:space="preserve"> PAGEREF _Toc242225128 \h </w:instrText>
         </w:r>
         <w:r>
           <w:rPr>
@@ -8090,7 +8090,7 @@
           <w14:ligatures w14:val="standardContextual"/>
         </w:rPr>
       </w:pPr>
-      <w:hyperlink w:anchor="_Toc242196923" w:history="1">
+      <w:hyperlink w:anchor="_Toc242225129" w:history="1">
         <w:r>
           <w:rPr>
             <w:rStyle w:val="Hipervnculo"/>
@@ -8117,7 +8117,7 @@
             <w:noProof/>
             <w:webHidden/>
           </w:rPr>
-          <w:instrText xml:space="preserve"> PAGEREF _Toc242196923 \h </w:instrText>
+          <w:instrText xml:space="preserve"> PAGEREF _Toc242225129 \h </w:instrText>
         </w:r>
         <w:r>
           <w:rPr>
@@ -8163,7 +8163,7 @@
           <w14:ligatures w14:val="standardContextual"/>
         </w:rPr>
       </w:pPr>
-      <w:hyperlink w:anchor="_Toc242196924" w:history="1">
+      <w:hyperlink w:anchor="_Toc242225130" w:history="1">
         <w:r>
           <w:rPr>
             <w:rStyle w:val="Hipervnculo"/>
@@ -8190,7 +8190,7 @@
             <w:noProof/>
             <w:webHidden/>
           </w:rPr>
-          <w:instrText xml:space="preserve"> PAGEREF _Toc242196924 \h </w:instrText>
+          <w:instrText xml:space="preserve"> PAGEREF _Toc242225130 \h </w:instrText>
         </w:r>
         <w:r>
           <w:rPr>
@@ -8236,7 +8236,7 @@
           <w14:ligatures w14:val="standardContextual"/>
         </w:rPr>
       </w:pPr>
-      <w:hyperlink w:anchor="_Toc242196925" w:history="1">
+      <w:hyperlink w:anchor="_Toc242225131" w:history="1">
         <w:r>
           <w:rPr>
             <w:rStyle w:val="Hipervnculo"/>
@@ -8263,7 +8263,7 @@
             <w:noProof/>
             <w:webHidden/>
           </w:rPr>
-          <w:instrText xml:space="preserve"> PAGEREF _Toc242196925 \h </w:instrText>
+          <w:instrText xml:space="preserve"> PAGEREF _Toc242225131 \h </w:instrText>
         </w:r>
         <w:r>
           <w:rPr>
@@ -8687,7 +8687,7 @@
         <w:pStyle w:val="Ttulo1"/>
       </w:pPr>
       <w:bookmarkStart w:id="0" w:name="_48a44b56e2cba46e0bd273959c9fa021cf0e0c0"/>
-      <w:bookmarkStart w:id="1" w:name="_Toc242196814"/>
+      <w:bookmarkStart w:id="1" w:name="_Toc242225020"/>
       <w:r>
         <w:lastRenderedPageBreak/>
         <w:t xml:space="preserve">Módulo 0 — Plataforma: clínicas, planes y suscripción </w:t>
@@ -8714,7 +8714,7 @@
         <w:pStyle w:val="Ttulo2"/>
       </w:pPr>
       <w:bookmarkStart w:id="2" w:name="_1eb36715c186f58cce98281b1b189d20510db73"/>
-      <w:bookmarkStart w:id="3" w:name="_Toc242196815"/>
+      <w:bookmarkStart w:id="3" w:name="_Toc242225021"/>
       <w:r>
         <w:t>HU-0.1 — Registrar una clínica (self-service)</w:t>
       </w:r>
@@ -8997,7 +8997,7 @@
         <w:pStyle w:val="Ttulo2"/>
       </w:pPr>
       <w:bookmarkStart w:id="4" w:name="_802afc2bac434eff8b2fd18354a2e26d7a1818b"/>
-      <w:bookmarkStart w:id="5" w:name="_Toc242196816"/>
+      <w:bookmarkStart w:id="5" w:name="_Toc242225022"/>
       <w:bookmarkEnd w:id="2"/>
       <w:r>
         <w:t>HU-0.2 — Verificar el correo y activar la clínica</w:t>
@@ -9200,7 +9200,11 @@
         </w:numPr>
       </w:pPr>
       <w:r>
-        <w:t>Si el plazo expira sin verificar, el registro pendiente se elimina (no deja una clínica fantasma).</w:t>
+        <w:t xml:space="preserve">En la misma operación, la clínica recibe su copia de los catálogos iniciales: tipos de cita, horarios de atención, vacunas base con las especies a las que aplican, laboratorios y </w:t>
+      </w:r>
+      <w:r>
+        <w:lastRenderedPageBreak/>
+        <w:t>productos de desparasitación. Así puede agendar y registrar desde el primer día; si la activación falla, no queda ninguna copia a medias.</w:t>
       </w:r>
     </w:p>
     <w:p>
@@ -9212,17 +9216,7 @@
         </w:numPr>
       </w:pPr>
       <w:r>
-        <w:lastRenderedPageBreak/>
-        <w:t xml:space="preserve">Tras activar, el administrador inicia sesión y queda acotado a su </w:t>
-      </w:r>
-      <w:r>
-        <w:rPr>
-          <w:rStyle w:val="VerbatimChar"/>
-        </w:rPr>
-        <w:t>id_clinica</w:t>
-      </w:r>
-      <w:r>
-        <w:t>.</w:t>
+        <w:t>Si el plazo expira sin verificar, el registro pendiente se elimina (no deja una clínica fantasma).</w:t>
       </w:r>
     </w:p>
     <w:p>
@@ -9234,6 +9228,27 @@
         </w:numPr>
       </w:pPr>
       <w:r>
+        <w:t xml:space="preserve">Tras activar, el administrador inicia sesión y queda acotado a su </w:t>
+      </w:r>
+      <w:r>
+        <w:rPr>
+          <w:rStyle w:val="VerbatimChar"/>
+        </w:rPr>
+        <w:t>id_clinica</w:t>
+      </w:r>
+      <w:r>
+        <w:t>.</w:t>
+      </w:r>
+    </w:p>
+    <w:p>
+      <w:pPr>
+        <w:pStyle w:val="Compact"/>
+        <w:numPr>
+          <w:ilvl w:val="0"/>
+          <w:numId w:val="3"/>
+        </w:numPr>
+      </w:pPr>
+      <w:r>
         <w:t>La activación queda registrada en auditoría.</w:t>
       </w:r>
     </w:p>
@@ -9277,7 +9292,7 @@
         <w:pStyle w:val="Ttulo2"/>
       </w:pPr>
       <w:bookmarkStart w:id="6" w:name="_bb7346f7e0c84a0526cc1b09dcf7185b4de9ba6"/>
-      <w:bookmarkStart w:id="7" w:name="_Toc242196817"/>
+      <w:bookmarkStart w:id="7" w:name="_Toc242225023"/>
       <w:bookmarkEnd w:id="4"/>
       <w:r>
         <w:t>HU-0.3 — Panel del super-administrador</w:t>
@@ -9477,10 +9492,7 @@
         <w:t>No</w:t>
       </w:r>
       <w:r>
-        <w:t xml:space="preserve"> </w:t>
-      </w:r>
-      <w:r>
-        <w:t>accede a los datos clínicos internos de una clínica (historias, consultas, pacientes); el acceso solo se justifica para soporte y queda en auditoría.</w:t>
+        <w:t xml:space="preserve"> accede a los datos clínicos internos de una clínica (historias, consultas, pacientes); el acceso solo se justifica para soporte y queda en auditoría.</w:t>
       </w:r>
     </w:p>
     <w:p>
@@ -9562,7 +9574,10 @@
         <w:t>Requisitos:</w:t>
       </w:r>
       <w:r>
-        <w:t xml:space="preserve"> RF-0.2, RF-0.4, RF-0.5 · </w:t>
+        <w:t xml:space="preserve"> </w:t>
+      </w:r>
+      <w:r>
+        <w:t xml:space="preserve">RF-0.2, RF-0.4, RF-0.5 · </w:t>
       </w:r>
       <w:r>
         <w:rPr>
@@ -9580,7 +9595,7 @@
         <w:pStyle w:val="Ttulo2"/>
       </w:pPr>
       <w:bookmarkStart w:id="8" w:name="_81995397ba8e62ea0a492c5a03eed8bb24e762a"/>
-      <w:bookmarkStart w:id="9" w:name="_Toc242196818"/>
+      <w:bookmarkStart w:id="9" w:name="_Toc242225024"/>
       <w:bookmarkEnd w:id="6"/>
       <w:r>
         <w:t>HU-0.4 — Control de límites del plan (freemium)</w:t>
@@ -9761,6 +9776,7 @@
         </w:numPr>
       </w:pPr>
       <w:r>
+        <w:lastRenderedPageBreak/>
         <w:t>Dentro del límite: la acción se ejecuta y queda en auditoría.</w:t>
       </w:r>
     </w:p>
@@ -9792,10 +9808,7 @@
         <w:t>Excepción:</w:t>
       </w:r>
       <w:r>
-        <w:t xml:space="preserve"> </w:t>
-      </w:r>
-      <w:r>
-        <w:t xml:space="preserve">una urgencia </w:t>
+        <w:t xml:space="preserve"> una urgencia </w:t>
       </w:r>
       <w:r>
         <w:t>🔴</w:t>
@@ -9813,7 +9826,6 @@
         </w:numPr>
       </w:pPr>
       <w:r>
-        <w:lastRenderedPageBreak/>
         <w:t xml:space="preserve">Cuando quien intenta la acción es el </w:t>
       </w:r>
       <w:r>
@@ -9913,7 +9925,7 @@
         <w:pStyle w:val="Ttulo2"/>
       </w:pPr>
       <w:bookmarkStart w:id="10" w:name="_917b31bc7b2ec5728d8c83baea304146cede88e"/>
-      <w:bookmarkStart w:id="11" w:name="_Toc242196819"/>
+      <w:bookmarkStart w:id="11" w:name="_Toc242225025"/>
       <w:bookmarkEnd w:id="8"/>
       <w:r>
         <w:t>HU-0.5 — Suscripción y congelación por mora</w:t>
@@ -10185,7 +10197,7 @@
         <w:pStyle w:val="Ttulo1"/>
       </w:pPr>
       <w:bookmarkStart w:id="12" w:name="_3f52c9db5995a4dc1e731f6d8cd57f262bab040"/>
-      <w:bookmarkStart w:id="13" w:name="_Toc242196820"/>
+      <w:bookmarkStart w:id="13" w:name="_Toc242225026"/>
       <w:bookmarkEnd w:id="0"/>
       <w:bookmarkEnd w:id="10"/>
       <w:r>
@@ -10207,7 +10219,7 @@
         <w:pStyle w:val="Ttulo2"/>
       </w:pPr>
       <w:bookmarkStart w:id="14" w:name="_76f4ca07816b696a7e21234a3fd245066d4202e"/>
-      <w:bookmarkStart w:id="15" w:name="_Toc242196821"/>
+      <w:bookmarkStart w:id="15" w:name="_Toc242225027"/>
       <w:r>
         <w:t>HU-T.1 — Iniciar sesión y autenticación</w:t>
       </w:r>
@@ -10462,7 +10474,7 @@
         <w:pStyle w:val="Ttulo2"/>
       </w:pPr>
       <w:bookmarkStart w:id="16" w:name="_08f5c8e95117bf9bc16117a780f642084f0c149"/>
-      <w:bookmarkStart w:id="17" w:name="_Toc242196822"/>
+      <w:bookmarkStart w:id="17" w:name="_Toc242225028"/>
       <w:bookmarkEnd w:id="14"/>
       <w:r>
         <w:t>HU-T.2 — Cambiar mi contraseña</w:t>
@@ -10650,10 +10662,7 @@
         <w:t>(v2.0)</w:t>
       </w:r>
       <w:r>
-        <w:t xml:space="preserve"> </w:t>
-      </w:r>
-      <w:r>
-        <w:t>En una cuenta creada con Google aparece «Crear contraseña» en lugar de «Cambiar contraseña», y antes de crearla se vuelve a confirmar la identidad con Google.</w:t>
+        <w:t xml:space="preserve"> En una cuenta creada con Google aparece «Crear contraseña» en lugar de «Cambiar contraseña», y antes de crearla se vuelve a confirmar la identidad con Google.</w:t>
       </w:r>
     </w:p>
     <w:p>
@@ -10741,7 +10750,7 @@
         <w:pStyle w:val="Ttulo2"/>
       </w:pPr>
       <w:bookmarkStart w:id="18" w:name="_44f513b1e95bac8cbf132f88a3649b6be2902d9"/>
-      <w:bookmarkStart w:id="19" w:name="_Toc242196823"/>
+      <w:bookmarkStart w:id="19" w:name="_Toc242225029"/>
       <w:bookmarkEnd w:id="16"/>
       <w:r>
         <w:lastRenderedPageBreak/>
@@ -10980,7 +10989,7 @@
         <w:pStyle w:val="Ttulo2"/>
       </w:pPr>
       <w:bookmarkStart w:id="20" w:name="_1eded849c0926854c498005f8a93458b9d7a2d8"/>
-      <w:bookmarkStart w:id="21" w:name="_Toc242196824"/>
+      <w:bookmarkStart w:id="21" w:name="_Toc242225030"/>
       <w:bookmarkEnd w:id="18"/>
       <w:r>
         <w:t>HU-T.4 — Cerrar sesión</w:t>
@@ -11206,7 +11215,7 @@
         <w:pStyle w:val="Ttulo2"/>
       </w:pPr>
       <w:bookmarkStart w:id="22" w:name="_def34846ffbe39a85a6bd6a22079f6d076a01a9"/>
-      <w:bookmarkStart w:id="23" w:name="_Toc242196825"/>
+      <w:bookmarkStart w:id="23" w:name="_Toc242225031"/>
       <w:bookmarkEnd w:id="20"/>
       <w:r>
         <w:t>HU-T.5 — Ver y actualizar mi perfil y datos de contacto</w:t>
@@ -11611,7 +11620,7 @@
         <w:pStyle w:val="Ttulo2"/>
       </w:pPr>
       <w:bookmarkStart w:id="24" w:name="_37603926653c908321bb7c7e9ea1991584cc3b8"/>
-      <w:bookmarkStart w:id="25" w:name="_Toc242196826"/>
+      <w:bookmarkStart w:id="25" w:name="_Toc242225032"/>
       <w:bookmarkEnd w:id="22"/>
       <w:r>
         <w:t>HU-T.6 — Gestionar mis notificaciones internas</w:t>
@@ -11889,7 +11898,7 @@
         <w:pStyle w:val="Ttulo2"/>
       </w:pPr>
       <w:bookmarkStart w:id="26" w:name="_5605fb9a7931d45a4bf5dc8e3e653d18c531f06"/>
-      <w:bookmarkStart w:id="27" w:name="_Toc242196827"/>
+      <w:bookmarkStart w:id="27" w:name="_Toc242225033"/>
       <w:bookmarkEnd w:id="24"/>
       <w:r>
         <w:t>HU-T.7 — Gestión de usuarios del sistema</w:t>
@@ -12179,7 +12188,7 @@
         <w:pStyle w:val="Ttulo2"/>
       </w:pPr>
       <w:bookmarkStart w:id="28" w:name="_cca84937acbaa5cdc69c436564f31a3800184ab"/>
-      <w:bookmarkStart w:id="29" w:name="_Toc242196828"/>
+      <w:bookmarkStart w:id="29" w:name="_Toc242225034"/>
       <w:bookmarkEnd w:id="26"/>
       <w:r>
         <w:t>HU-T.8 — Logs de auditoría y seguridad</w:t>
@@ -12423,7 +12432,7 @@
         <w:pStyle w:val="Ttulo2"/>
       </w:pPr>
       <w:bookmarkStart w:id="30" w:name="_cb462f816148050ba0d7aac8f53a2b5b0cb7780"/>
-      <w:bookmarkStart w:id="31" w:name="_Toc242196829"/>
+      <w:bookmarkStart w:id="31" w:name="_Toc242225035"/>
       <w:bookmarkEnd w:id="28"/>
       <w:r>
         <w:lastRenderedPageBreak/>
@@ -12894,7 +12903,7 @@
         <w:pStyle w:val="Ttulo2"/>
       </w:pPr>
       <w:bookmarkStart w:id="32" w:name="_276f5e9a65ab31ebb82d9356073ee60ffcf6855"/>
-      <w:bookmarkStart w:id="33" w:name="_Toc242196830"/>
+      <w:bookmarkStart w:id="33" w:name="_Toc242225036"/>
       <w:bookmarkEnd w:id="30"/>
       <w:r>
         <w:t>HU-T.10 — Autorización central por rol (RBAC real)</w:t>
@@ -13171,7 +13180,7 @@
         <w:pStyle w:val="Ttulo2"/>
       </w:pPr>
       <w:bookmarkStart w:id="34" w:name="_3b0d05aa899aefedfcf439319a22bd7df135017"/>
-      <w:bookmarkStart w:id="35" w:name="_Toc242196831"/>
+      <w:bookmarkStart w:id="35" w:name="_Toc242225037"/>
       <w:bookmarkEnd w:id="32"/>
       <w:r>
         <w:lastRenderedPageBreak/>
@@ -13422,7 +13431,7 @@
         <w:pStyle w:val="Ttulo2"/>
       </w:pPr>
       <w:bookmarkStart w:id="36" w:name="_5106da541d290f3488d79d8c1e91fe390d48e5c"/>
-      <w:bookmarkStart w:id="37" w:name="_Toc242196832"/>
+      <w:bookmarkStart w:id="37" w:name="_Toc242225038"/>
       <w:bookmarkEnd w:id="34"/>
       <w:r>
         <w:t>HU-T.12 — Política de contraseñas, verificación de correo y OAuth seguro</w:t>
@@ -13735,7 +13744,7 @@
         <w:pStyle w:val="Ttulo2"/>
       </w:pPr>
       <w:bookmarkStart w:id="38" w:name="_2303defb5da6c78860aeae9d161d0fa18f76502"/>
-      <w:bookmarkStart w:id="39" w:name="_Toc242196833"/>
+      <w:bookmarkStart w:id="39" w:name="_Toc242225039"/>
       <w:bookmarkEnd w:id="36"/>
       <w:r>
         <w:t>HU-T.13 — Endurecer rate limiting y reducir enumeración/fuga de información</w:t>
@@ -14038,7 +14047,7 @@
         <w:pStyle w:val="Ttulo2"/>
       </w:pPr>
       <w:bookmarkStart w:id="40" w:name="_37cade07514fa6d0623cee7537c5f68cab00cfd"/>
-      <w:bookmarkStart w:id="41" w:name="_Toc242196834"/>
+      <w:bookmarkStart w:id="41" w:name="_Toc242225040"/>
       <w:bookmarkEnd w:id="38"/>
       <w:r>
         <w:t>HU-T.14 — Restablecer la contraseña de un usuario (administrador)</w:t>
@@ -14340,7 +14349,7 @@
         <w:pStyle w:val="Ttulo2"/>
       </w:pPr>
       <w:bookmarkStart w:id="42" w:name="_09522c4444a8bbebdaf4a55b5444d2231a6caff"/>
-      <w:bookmarkStart w:id="43" w:name="_Toc242196835"/>
+      <w:bookmarkStart w:id="43" w:name="_Toc242225041"/>
       <w:bookmarkEnd w:id="40"/>
       <w:r>
         <w:t>HU-T.15 — Aislamiento por clínica y rol super-administrador</w:t>
@@ -14639,7 +14648,7 @@
         <w:pStyle w:val="Ttulo2"/>
       </w:pPr>
       <w:bookmarkStart w:id="44" w:name="_7d4be07c6dc7ad98ff2d7fd7f946e3e6ff8ab78"/>
-      <w:bookmarkStart w:id="45" w:name="_Toc242196836"/>
+      <w:bookmarkStart w:id="45" w:name="_Toc242225042"/>
       <w:bookmarkEnd w:id="42"/>
       <w:r>
         <w:t>HU-T.16 — Expiración de la sesión por inactividad</w:t>
@@ -14890,7 +14899,7 @@
         <w:pStyle w:val="Ttulo2"/>
       </w:pPr>
       <w:bookmarkStart w:id="46" w:name="_fde5550409ae8bd107b35d83706fe49d1ac49cf"/>
-      <w:bookmarkStart w:id="47" w:name="_Toc242196837"/>
+      <w:bookmarkStart w:id="47" w:name="_Toc242225043"/>
       <w:bookmarkEnd w:id="44"/>
       <w:r>
         <w:t>HU-T.17 — Una persona con varios roles: elegir el contexto al iniciar sesión</w:t>
@@ -15151,7 +15160,7 @@
         <w:pStyle w:val="Ttulo2"/>
       </w:pPr>
       <w:bookmarkStart w:id="48" w:name="_7d9311428cd5b72468b37f82201f1b810f77c36"/>
-      <w:bookmarkStart w:id="49" w:name="_Toc242196838"/>
+      <w:bookmarkStart w:id="49" w:name="_Toc242225044"/>
       <w:bookmarkEnd w:id="46"/>
       <w:r>
         <w:t>HU-T.18 — Registrarme e iniciar sesión con Google (propietario)</w:t>
@@ -15411,7 +15420,7 @@
         <w:pStyle w:val="Ttulo2"/>
       </w:pPr>
       <w:bookmarkStart w:id="50" w:name="_a6c52dc4bdd2cb00ae48e74db3c3b2920a9b818"/>
-      <w:bookmarkStart w:id="51" w:name="_Toc242196839"/>
+      <w:bookmarkStart w:id="51" w:name="_Toc242225045"/>
       <w:bookmarkEnd w:id="48"/>
       <w:r>
         <w:lastRenderedPageBreak/>
@@ -15660,7 +15669,7 @@
         <w:pStyle w:val="Ttulo1"/>
       </w:pPr>
       <w:bookmarkStart w:id="52" w:name="_45e5cddb15e6e85961c4bdd9f114a9e4301e667"/>
-      <w:bookmarkStart w:id="53" w:name="_Toc242196840"/>
+      <w:bookmarkStart w:id="53" w:name="_Toc242225046"/>
       <w:bookmarkEnd w:id="12"/>
       <w:bookmarkEnd w:id="50"/>
       <w:r>
@@ -15682,7 +15691,7 @@
         <w:pStyle w:val="Ttulo2"/>
       </w:pPr>
       <w:bookmarkStart w:id="54" w:name="_3442f1e103117ab35c7be2be07e5b7a86f50900"/>
-      <w:bookmarkStart w:id="55" w:name="_Toc242196841"/>
+      <w:bookmarkStart w:id="55" w:name="_Toc242225047"/>
       <w:r>
         <w:t>HU-1.1 — Registrar mascota</w:t>
       </w:r>
@@ -15947,7 +15956,7 @@
         <w:pStyle w:val="Ttulo2"/>
       </w:pPr>
       <w:bookmarkStart w:id="56" w:name="_cac8078226ab7384debc291829d99266c4c98c9"/>
-      <w:bookmarkStart w:id="57" w:name="_Toc242196842"/>
+      <w:bookmarkStart w:id="57" w:name="_Toc242225048"/>
       <w:bookmarkEnd w:id="54"/>
       <w:r>
         <w:t>HU-1.2 — Registrar propietario</w:t>
@@ -16146,6 +16155,18 @@
         </w:numPr>
       </w:pPr>
       <w:r>
+        <w:t>Si la cuenta ya existe, el personal la busca por documento o correo completo; el vínculo nuevo solo se crea al confirmar el titular desde un enlace enviado a ese correo (RN-109). La solicitud no modifica su identidad ni contraseña.</w:t>
+      </w:r>
+    </w:p>
+    <w:p>
+      <w:pPr>
+        <w:pStyle w:val="Compact"/>
+        <w:numPr>
+          <w:ilvl w:val="0"/>
+          <w:numId w:val="27"/>
+        </w:numPr>
+      </w:pPr>
+      <w:r>
         <w:t>Desde el perfil del propietario se listan todas sus mascotas.</w:t>
       </w:r>
     </w:p>
@@ -16161,7 +16182,7 @@
         <w:t>Reglas de negocio:</w:t>
       </w:r>
       <w:r>
-        <w:t xml:space="preserve"> RN-101, RN-103, RN-G06 · </w:t>
+        <w:t xml:space="preserve"> RN-101, RN-103, RN-109, RN-G06 · </w:t>
       </w:r>
       <w:r>
         <w:rPr>
@@ -16179,7 +16200,7 @@
         <w:pStyle w:val="Ttulo2"/>
       </w:pPr>
       <w:bookmarkStart w:id="58" w:name="_2775e78a99e9a6c8110a18962d2d3ffe08eb791"/>
-      <w:bookmarkStart w:id="59" w:name="_Toc242196843"/>
+      <w:bookmarkStart w:id="59" w:name="_Toc242225049"/>
       <w:bookmarkEnd w:id="56"/>
       <w:r>
         <w:t>HU-1.3 — Buscar paciente</w:t>
@@ -16342,6 +16363,7 @@
           <w:b/>
           <w:bCs/>
         </w:rPr>
+        <w:lastRenderedPageBreak/>
         <w:t>Criterios de aceptación:</w:t>
       </w:r>
     </w:p>
@@ -16366,7 +16388,6 @@
         </w:numPr>
       </w:pPr>
       <w:r>
-        <w:lastRenderedPageBreak/>
         <w:t>Resultados en menos de 2 segundos con un mínimo de 3 caracteres.</w:t>
       </w:r>
     </w:p>
@@ -16412,7 +16433,7 @@
         <w:pStyle w:val="Ttulo2"/>
       </w:pPr>
       <w:bookmarkStart w:id="60" w:name="_a48b917e447c9bb421319764b87fa8fbfffc6ce"/>
-      <w:bookmarkStart w:id="61" w:name="_Toc242196844"/>
+      <w:bookmarkStart w:id="61" w:name="_Toc242225050"/>
       <w:bookmarkEnd w:id="58"/>
       <w:r>
         <w:t>HU-1.4 — Editar y desactivar mascota</w:t>
@@ -16594,7 +16615,10 @@
         <w:t>(v2.0)</w:t>
       </w:r>
       <w:r>
-        <w:t xml:space="preserve"> La especie, la raza, el sexo y la fecha de nacimiento solo los cambian el propietario o la clínica que registró la mascota; el peso, la foto y los demás datos, cualquier clínica vinculada. Todo cambio se notifica al propietario.</w:t>
+        <w:t xml:space="preserve"> </w:t>
+      </w:r>
+      <w:r>
+        <w:t>La especie, la raza, el sexo y la fecha de nacimiento solo los cambian el propietario o la clínica que registró la mascota; el peso, la foto y los demás datos, cualquier clínica vinculada. Todo cambio se notifica al propietario.</w:t>
       </w:r>
     </w:p>
     <w:p>
@@ -16675,7 +16699,7 @@
         <w:pStyle w:val="Ttulo2"/>
       </w:pPr>
       <w:bookmarkStart w:id="62" w:name="_c56dbdf70effe4fdddd03cc982164bf6dfa15fd"/>
-      <w:bookmarkStart w:id="63" w:name="_Toc242196845"/>
+      <w:bookmarkStart w:id="63" w:name="_Toc242225051"/>
       <w:bookmarkEnd w:id="60"/>
       <w:r>
         <w:t>HU-1.5 — Vincular una mascota existente a la clínica</w:t>
@@ -16923,7 +16947,7 @@
         <w:pStyle w:val="Ttulo1"/>
       </w:pPr>
       <w:bookmarkStart w:id="64" w:name="_8ada1076fc69f75adb455b52b48149b634e12c1"/>
-      <w:bookmarkStart w:id="65" w:name="_Toc242196846"/>
+      <w:bookmarkStart w:id="65" w:name="_Toc242225052"/>
       <w:bookmarkEnd w:id="52"/>
       <w:bookmarkEnd w:id="62"/>
       <w:r>
@@ -16945,7 +16969,7 @@
         <w:pStyle w:val="Ttulo2"/>
       </w:pPr>
       <w:bookmarkStart w:id="66" w:name="_d0fbc850c25121b5bb6429938908d9d6324f20c"/>
-      <w:bookmarkStart w:id="67" w:name="_Toc242196847"/>
+      <w:bookmarkStart w:id="67" w:name="_Toc242225053"/>
       <w:r>
         <w:t>HU-2.1 — Registrar consulta clínica</w:t>
       </w:r>
@@ -17174,7 +17198,10 @@
         <w:t>(v2.0)</w:t>
       </w:r>
       <w:r>
-        <w:t xml:space="preserve"> El veterinario registra las alergias y alertas médicas de la mascota (alergia, condición crónica, medicación continua); no se borran, se desactivan, y las ven todas las clínicas vinculadas y el carnet.</w:t>
+        <w:t xml:space="preserve"> </w:t>
+      </w:r>
+      <w:r>
+        <w:t>El veterinario registra las alergias y alertas médicas de la mascota (alergia, condición crónica, medicación continua); no se borran, se desactivan, y las ven todas las clínicas vinculadas y el carnet.</w:t>
       </w:r>
     </w:p>
     <w:p>
@@ -17189,10 +17216,7 @@
         <w:t>Reglas de negocio:</w:t>
       </w:r>
       <w:r>
-        <w:t xml:space="preserve"> </w:t>
-      </w:r>
-      <w:r>
-        <w:t xml:space="preserve">RN-201, RN-202, RN-203, RN-113 · </w:t>
+        <w:t xml:space="preserve"> RN-201, RN-202, RN-203, RN-113 · </w:t>
       </w:r>
       <w:r>
         <w:rPr>
@@ -17210,7 +17234,7 @@
         <w:pStyle w:val="Ttulo2"/>
       </w:pPr>
       <w:bookmarkStart w:id="68" w:name="_7a453a6eb6ed88e1bfb6e10d4e89e02e93370e4"/>
-      <w:bookmarkStart w:id="69" w:name="_Toc242196848"/>
+      <w:bookmarkStart w:id="69" w:name="_Toc242225054"/>
       <w:bookmarkEnd w:id="66"/>
       <w:r>
         <w:t>HU-2.2 — Atención clínica sin cita (urgencias)</w:t>
@@ -17460,7 +17484,7 @@
         <w:pStyle w:val="Ttulo2"/>
       </w:pPr>
       <w:bookmarkStart w:id="70" w:name="_277d15ee6375124a0d7497cd947f0496d653294"/>
-      <w:bookmarkStart w:id="71" w:name="_Toc242196849"/>
+      <w:bookmarkStart w:id="71" w:name="_Toc242225055"/>
       <w:bookmarkEnd w:id="68"/>
       <w:r>
         <w:lastRenderedPageBreak/>
@@ -17751,14 +17775,7 @@
           <w:i/>
           <w:iCs/>
         </w:rPr>
-        <w:t xml:space="preserve"> </w:t>
-      </w:r>
-      <w:r>
-        <w:rPr>
-          <w:i/>
-          <w:iCs/>
-        </w:rPr>
-        <w:t xml:space="preserve">de la carpeta es una segunda barrera, no la principal: solo cubre Apache con AllowOverride activo. El formato se valida por el contenido del archivo, no por la extensión del nombre que envía el cliente, y al servirlo el </w:t>
+        <w:t xml:space="preserve"> de la carpeta es una segunda barrera, no la principal: solo cubre Apache con AllowOverride activo. El formato se valida por el contenido del archivo, no por la extensión del nombre que envía el cliente, y al servirlo el </w:t>
       </w:r>
       <w:r>
         <w:rPr>
@@ -17781,7 +17798,7 @@
         <w:pStyle w:val="Ttulo2"/>
       </w:pPr>
       <w:bookmarkStart w:id="72" w:name="_1b98c978e60977db39fc2418db7fe5e3ddc3001"/>
-      <w:bookmarkStart w:id="73" w:name="_Toc242196850"/>
+      <w:bookmarkStart w:id="73" w:name="_Toc242225056"/>
       <w:bookmarkEnd w:id="70"/>
       <w:r>
         <w:t>HU-2.4 — Registrar tratamiento</w:t>
@@ -18025,7 +18042,7 @@
         <w:pStyle w:val="Ttulo2"/>
       </w:pPr>
       <w:bookmarkStart w:id="74" w:name="_9717672e9e73feeffef28eb38b12c038cdd7bd2"/>
-      <w:bookmarkStart w:id="75" w:name="_Toc242196851"/>
+      <w:bookmarkStart w:id="75" w:name="_Toc242225057"/>
       <w:bookmarkEnd w:id="72"/>
       <w:r>
         <w:t>HU-2.5 — Ver historial clínico completo</w:t>
@@ -18292,7 +18309,7 @@
         <w:pStyle w:val="Ttulo2"/>
       </w:pPr>
       <w:bookmarkStart w:id="76" w:name="_fdc1478d352073634e6bd92f17796cead004715"/>
-      <w:bookmarkStart w:id="77" w:name="_Toc242196852"/>
+      <w:bookmarkStart w:id="77" w:name="_Toc242225058"/>
       <w:bookmarkEnd w:id="74"/>
       <w:r>
         <w:t>HU-2.6 — Atomicidad y feedback de adjuntos en el registro de consulta</w:t>
@@ -18573,7 +18590,7 @@
         <w:pStyle w:val="Ttulo2"/>
       </w:pPr>
       <w:bookmarkStart w:id="78" w:name="_101f0dcf34d14c70ec0f17a5f1393f5d9e5e380"/>
-      <w:bookmarkStart w:id="79" w:name="_Toc242196853"/>
+      <w:bookmarkStart w:id="79" w:name="_Toc242225059"/>
       <w:bookmarkEnd w:id="76"/>
       <w:r>
         <w:t>HU-2.7 — Validación y control de acceso en registros clínicos y de mascota</w:t>
@@ -18854,7 +18871,7 @@
         <w:pStyle w:val="Ttulo2"/>
       </w:pPr>
       <w:bookmarkStart w:id="80" w:name="_004e46896b85bf56df5905f1e03a53c4af0a844"/>
-      <w:bookmarkStart w:id="81" w:name="_Toc242196854"/>
+      <w:bookmarkStart w:id="81" w:name="_Toc242225060"/>
       <w:bookmarkEnd w:id="78"/>
       <w:r>
         <w:t>HU-2.8 — Sugerencia de diagnósticos probables por síntomas</w:t>
@@ -19114,7 +19131,7 @@
         <w:pStyle w:val="Ttulo2"/>
       </w:pPr>
       <w:bookmarkStart w:id="82" w:name="_dc4885bd67732a434e9ba082721bf6df1e25b78"/>
-      <w:bookmarkStart w:id="83" w:name="_Toc242196855"/>
+      <w:bookmarkStart w:id="83" w:name="_Toc242225061"/>
       <w:bookmarkEnd w:id="80"/>
       <w:r>
         <w:t>HU-2.9 — Alertas de toxicidad e interacción al prescribir</w:t>
@@ -19395,7 +19412,7 @@
         <w:pStyle w:val="Ttulo2"/>
       </w:pPr>
       <w:bookmarkStart w:id="84" w:name="_39e4f7d80042c39922c0142f6da447f46643fcd"/>
-      <w:bookmarkStart w:id="85" w:name="_Toc242196856"/>
+      <w:bookmarkStart w:id="85" w:name="_Toc242225062"/>
       <w:bookmarkEnd w:id="82"/>
       <w:r>
         <w:t>HU-2.10 — Ver la historia compartida de la mascota (multi-clínica)</w:t>
@@ -19643,7 +19660,7 @@
         <w:pStyle w:val="Ttulo2"/>
       </w:pPr>
       <w:bookmarkStart w:id="86" w:name="_ddbeb8d4984f7e7207ef7f02c5c92f4dcdce30d"/>
-      <w:bookmarkStart w:id="87" w:name="_Toc242196857"/>
+      <w:bookmarkStart w:id="87" w:name="_Toc242225063"/>
       <w:bookmarkEnd w:id="84"/>
       <w:r>
         <w:t>HU-2.11 — Calcular el nivel de triage a partir de los síntomas</w:t>
@@ -19955,7 +19972,7 @@
         <w:pStyle w:val="Ttulo1"/>
       </w:pPr>
       <w:bookmarkStart w:id="88" w:name="_d55aebc9deeb1682a62a02ae225cde94fe0baf3"/>
-      <w:bookmarkStart w:id="89" w:name="_Toc242196858"/>
+      <w:bookmarkStart w:id="89" w:name="_Toc242225064"/>
       <w:bookmarkEnd w:id="64"/>
       <w:bookmarkEnd w:id="86"/>
       <w:r>
@@ -19977,7 +19994,7 @@
         <w:pStyle w:val="Ttulo2"/>
       </w:pPr>
       <w:bookmarkStart w:id="90" w:name="_73783a222ff535845613407f8c2c5de0df62c29"/>
-      <w:bookmarkStart w:id="91" w:name="_Toc242196859"/>
+      <w:bookmarkStart w:id="91" w:name="_Toc242225065"/>
       <w:r>
         <w:t>HU-3.1 — Registrar vacunación</w:t>
       </w:r>
@@ -20220,7 +20237,7 @@
         <w:pStyle w:val="Ttulo2"/>
       </w:pPr>
       <w:bookmarkStart w:id="92" w:name="_6075047063f4930391208048315650ed427ae6c"/>
-      <w:bookmarkStart w:id="93" w:name="_Toc242196860"/>
+      <w:bookmarkStart w:id="93" w:name="_Toc242225066"/>
       <w:bookmarkEnd w:id="90"/>
       <w:r>
         <w:t>HU-3.2 — Enviar recordatorio por correo</w:t>
@@ -20476,7 +20493,7 @@
         <w:pStyle w:val="Ttulo2"/>
       </w:pPr>
       <w:bookmarkStart w:id="94" w:name="_781661fe2d15deb5f4d895541dced4f16e579af"/>
-      <w:bookmarkStart w:id="95" w:name="_Toc242196861"/>
+      <w:bookmarkStart w:id="95" w:name="_Toc242225067"/>
       <w:bookmarkEnd w:id="92"/>
       <w:r>
         <w:t>HU-3.3 — Enviar recordatorio por WhatsApp</w:t>
@@ -20733,7 +20750,7 @@
         <w:pStyle w:val="Ttulo2"/>
       </w:pPr>
       <w:bookmarkStart w:id="96" w:name="_8afd4fd6adaa7aec672b37965973c4a0b1b5483"/>
-      <w:bookmarkStart w:id="97" w:name="_Toc242196862"/>
+      <w:bookmarkStart w:id="97" w:name="_Toc242225068"/>
       <w:bookmarkEnd w:id="94"/>
       <w:r>
         <w:t>HU-3.4 — Registrar desparasitación</w:t>
@@ -20977,7 +20994,7 @@
         <w:pStyle w:val="Ttulo2"/>
       </w:pPr>
       <w:bookmarkStart w:id="98" w:name="_69b92288d624f1c737d99fa43d727735c1c78ac"/>
-      <w:bookmarkStart w:id="99" w:name="_Toc242196863"/>
+      <w:bookmarkStart w:id="99" w:name="_Toc242225069"/>
       <w:bookmarkEnd w:id="96"/>
       <w:r>
         <w:t>HU-3.5 — Panel de vacunaciones pendientes</w:t>
@@ -21255,7 +21272,7 @@
         <w:pStyle w:val="Ttulo2"/>
       </w:pPr>
       <w:bookmarkStart w:id="100" w:name="_83b2b6ee9ef84433e407efb3456acc0bf8c705f"/>
-      <w:bookmarkStart w:id="101" w:name="_Toc242196864"/>
+      <w:bookmarkStart w:id="101" w:name="_Toc242225070"/>
       <w:bookmarkEnd w:id="98"/>
       <w:r>
         <w:lastRenderedPageBreak/>
@@ -21600,7 +21617,7 @@
         <w:pStyle w:val="Ttulo1"/>
       </w:pPr>
       <w:bookmarkStart w:id="102" w:name="_0bc479c0be240e26431ebdd296a7a53444b2628"/>
-      <w:bookmarkStart w:id="103" w:name="_Toc242196865"/>
+      <w:bookmarkStart w:id="103" w:name="_Toc242225071"/>
       <w:bookmarkEnd w:id="88"/>
       <w:bookmarkEnd w:id="100"/>
       <w:r>
@@ -21622,7 +21639,7 @@
         <w:pStyle w:val="Ttulo2"/>
       </w:pPr>
       <w:bookmarkStart w:id="104" w:name="_83a9ef67ed8a24f8f8fb200a3c30fdc3bf36c17"/>
-      <w:bookmarkStart w:id="105" w:name="_Toc242196866"/>
+      <w:bookmarkStart w:id="105" w:name="_Toc242225072"/>
       <w:r>
         <w:t>HU-4.1 — Agendar cita</w:t>
       </w:r>
@@ -21889,7 +21906,7 @@
         <w:pStyle w:val="Ttulo2"/>
       </w:pPr>
       <w:bookmarkStart w:id="106" w:name="_102fb6dec5375a39a698cb955a51646f9817d25"/>
-      <w:bookmarkStart w:id="107" w:name="_Toc242196867"/>
+      <w:bookmarkStart w:id="107" w:name="_Toc242225073"/>
       <w:bookmarkEnd w:id="104"/>
       <w:r>
         <w:t>HU-4.2 — Cancelar o reprogramar cita</w:t>
@@ -22145,7 +22162,7 @@
         <w:pStyle w:val="Ttulo2"/>
       </w:pPr>
       <w:bookmarkStart w:id="108" w:name="_bc90a9ef9035fcbf5d83826a75a2a7caba95288"/>
-      <w:bookmarkStart w:id="109" w:name="_Toc242196868"/>
+      <w:bookmarkStart w:id="109" w:name="_Toc242225074"/>
       <w:bookmarkEnd w:id="106"/>
       <w:r>
         <w:lastRenderedPageBreak/>
@@ -22519,7 +22536,7 @@
         <w:pStyle w:val="Ttulo2"/>
       </w:pPr>
       <w:bookmarkStart w:id="110" w:name="_0ab1d1688e3b6d42f481962b5abe908ca5f185e"/>
-      <w:bookmarkStart w:id="111" w:name="_Toc242196869"/>
+      <w:bookmarkStart w:id="111" w:name="_Toc242225075"/>
       <w:bookmarkEnd w:id="108"/>
       <w:r>
         <w:t>HU-4.4 — Confirmación automática de cita por correo</w:t>
@@ -22764,7 +22781,7 @@
         <w:pStyle w:val="Ttulo2"/>
       </w:pPr>
       <w:bookmarkStart w:id="112" w:name="_391b83d5c01b20c64bec4d1baa2ded83b27b3cc"/>
-      <w:bookmarkStart w:id="113" w:name="_Toc242196870"/>
+      <w:bookmarkStart w:id="113" w:name="_Toc242225076"/>
       <w:bookmarkEnd w:id="110"/>
       <w:r>
         <w:t>HU-4.5 — Registrar hora real de atención y gestionar retrasos</w:t>
@@ -23071,7 +23088,7 @@
         <w:pStyle w:val="Ttulo2"/>
       </w:pPr>
       <w:bookmarkStart w:id="114" w:name="_fd2845ac88e46c3520f61b9b4ded26b35f37534"/>
-      <w:bookmarkStart w:id="115" w:name="_Toc242196871"/>
+      <w:bookmarkStart w:id="115" w:name="_Toc242225077"/>
       <w:bookmarkEnd w:id="112"/>
       <w:r>
         <w:t>HU-4.6 — Buffer configurable entre citas</w:t>
@@ -23346,7 +23363,7 @@
         <w:pStyle w:val="Ttulo2"/>
       </w:pPr>
       <w:bookmarkStart w:id="116" w:name="_4786f5b438d23c36e067f350ad8ed0097d027c2"/>
-      <w:bookmarkStart w:id="117" w:name="_Toc242196872"/>
+      <w:bookmarkStart w:id="117" w:name="_Toc242225078"/>
       <w:bookmarkEnd w:id="114"/>
       <w:r>
         <w:t>HU-4.7 — Estado "no asistió" y ausentismo</w:t>
@@ -23674,7 +23691,7 @@
         <w:pStyle w:val="Ttulo2"/>
       </w:pPr>
       <w:bookmarkStart w:id="118" w:name="_0d930997ffa83b9b36b150e5e50b933f66b264d"/>
-      <w:bookmarkStart w:id="119" w:name="_Toc242196873"/>
+      <w:bookmarkStart w:id="119" w:name="_Toc242225079"/>
       <w:bookmarkEnd w:id="116"/>
       <w:r>
         <w:t>HU-4.8 — Bloqueos de agenda del veterinario y días no laborables</w:t>
@@ -23949,7 +23966,7 @@
         <w:pStyle w:val="Ttulo2"/>
       </w:pPr>
       <w:bookmarkStart w:id="120" w:name="_592e3b26ee2d82de9a78960621790aca76cbe41"/>
-      <w:bookmarkStart w:id="121" w:name="_Toc242196874"/>
+      <w:bookmarkStart w:id="121" w:name="_Toc242225080"/>
       <w:bookmarkEnd w:id="118"/>
       <w:r>
         <w:t>HU-4.9 — Endurecer la validación de disponibilidad</w:t>
@@ -24263,7 +24280,7 @@
         <w:pStyle w:val="Ttulo2"/>
       </w:pPr>
       <w:bookmarkStart w:id="122" w:name="_53bf433c324c03bf220d8f1ea57572094c24d19"/>
-      <w:bookmarkStart w:id="123" w:name="_Toc242196875"/>
+      <w:bookmarkStart w:id="123" w:name="_Toc242225081"/>
       <w:bookmarkEnd w:id="120"/>
       <w:r>
         <w:t>HU-4.10 — Confirmar asistencia a la cita desde el recordatorio</w:t>
@@ -24546,7 +24563,7 @@
         <w:pStyle w:val="Ttulo2"/>
       </w:pPr>
       <w:bookmarkStart w:id="124" w:name="_bc4a4c08f4864e57db7a13372e3c901c5711bb9"/>
-      <w:bookmarkStart w:id="125" w:name="_Toc242196876"/>
+      <w:bookmarkStart w:id="125" w:name="_Toc242225082"/>
       <w:bookmarkEnd w:id="122"/>
       <w:r>
         <w:t>HU-4.11 — Configurar el horario recurrente del veterinario</w:t>
@@ -24806,7 +24823,7 @@
         <w:pStyle w:val="Ttulo2"/>
       </w:pPr>
       <w:bookmarkStart w:id="126" w:name="_3a9da54e9b682c781ba4f8ec9fb08eb1ae51469"/>
-      <w:bookmarkStart w:id="127" w:name="_Toc242196877"/>
+      <w:bookmarkStart w:id="127" w:name="_Toc242225083"/>
       <w:bookmarkEnd w:id="124"/>
       <w:r>
         <w:t>HU-4.12 — Registrar ausencia del veterinario y gestionar cobertura</w:t>
@@ -25099,7 +25116,7 @@
         <w:pStyle w:val="Ttulo2"/>
       </w:pPr>
       <w:bookmarkStart w:id="128" w:name="_d5e60343e26d4758074a6efaed07b69cd6c3551"/>
-      <w:bookmarkStart w:id="129" w:name="_Toc242196878"/>
+      <w:bookmarkStart w:id="129" w:name="_Toc242225084"/>
       <w:bookmarkEnd w:id="126"/>
       <w:r>
         <w:t>HU-4.13 — Agendar cita con triage de 4 niveles</w:t>
@@ -25509,7 +25526,7 @@
         <w:pStyle w:val="Ttulo2"/>
       </w:pPr>
       <w:bookmarkStart w:id="130" w:name="_d4adac7448e74c17e6bb33bf496ee79d1222807"/>
-      <w:bookmarkStart w:id="131" w:name="_Toc242196879"/>
+      <w:bookmarkStart w:id="131" w:name="_Toc242225085"/>
       <w:bookmarkEnd w:id="128"/>
       <w:r>
         <w:t>HU-4.14 — Reajuste de agenda en vivo (efecto cascada)</w:t>
@@ -25812,7 +25829,7 @@
         <w:pStyle w:val="Ttulo2"/>
       </w:pPr>
       <w:bookmarkStart w:id="132" w:name="_91e1c705d28c1a221b008d52046353792175d0f"/>
-      <w:bookmarkStart w:id="133" w:name="_Toc242196880"/>
+      <w:bookmarkStart w:id="133" w:name="_Toc242225086"/>
       <w:bookmarkEnd w:id="130"/>
       <w:r>
         <w:t>HU-4.15 — Atender una urgencia (triage rojo o llegada directa)</w:t>
@@ -26201,7 +26218,7 @@
         <w:pStyle w:val="Ttulo2"/>
       </w:pPr>
       <w:bookmarkStart w:id="134" w:name="_c78d8424c335bf78fd48b1955b4f1a67eda143f"/>
-      <w:bookmarkStart w:id="135" w:name="_Toc242196881"/>
+      <w:bookmarkStart w:id="135" w:name="_Toc242225087"/>
       <w:bookmarkEnd w:id="132"/>
       <w:r>
         <w:t>HU-4.16 — Sugerir veterinario al agendar</w:t>
@@ -26425,7 +26442,7 @@
         <w:pStyle w:val="Ttulo2"/>
       </w:pPr>
       <w:bookmarkStart w:id="136" w:name="_d95563cf58dd7b4419944c1578610bfcd0b1db0"/>
-      <w:bookmarkStart w:id="137" w:name="_Toc242196882"/>
+      <w:bookmarkStart w:id="137" w:name="_Toc242225088"/>
       <w:bookmarkEnd w:id="134"/>
       <w:r>
         <w:t>HU-4.17 — Recalcular el triage cuando cambian los síntomas</w:t>
@@ -26683,7 +26700,7 @@
         <w:pStyle w:val="Ttulo2"/>
       </w:pPr>
       <w:bookmarkStart w:id="138" w:name="_8b0a1409d398bf3e63485141aa804db028749ca"/>
-      <w:bookmarkStart w:id="139" w:name="_Toc242196883"/>
+      <w:bookmarkStart w:id="139" w:name="_Toc242225089"/>
       <w:bookmarkEnd w:id="136"/>
       <w:r>
         <w:t>HU-4.18 — Ajustar el nivel de triage (veterinario)</w:t>
@@ -26931,7 +26948,7 @@
         <w:pStyle w:val="Ttulo2"/>
       </w:pPr>
       <w:bookmarkStart w:id="140" w:name="_cf2722ce0434310059a1401a7a9236f9f75ab69"/>
-      <w:bookmarkStart w:id="141" w:name="_Toc242196884"/>
+      <w:bookmarkStart w:id="141" w:name="_Toc242225090"/>
       <w:bookmarkEnd w:id="138"/>
       <w:r>
         <w:t>HU-4.19 — Manejar la llegada tarde del propietario</w:t>
@@ -27206,7 +27223,7 @@
         <w:pStyle w:val="Ttulo1"/>
       </w:pPr>
       <w:bookmarkStart w:id="142" w:name="_448b6637f95054bfc4854cb12826ea84d2acba0"/>
-      <w:bookmarkStart w:id="143" w:name="_Toc242196885"/>
+      <w:bookmarkStart w:id="143" w:name="_Toc242225091"/>
       <w:bookmarkEnd w:id="102"/>
       <w:bookmarkEnd w:id="140"/>
       <w:r>
@@ -27228,7 +27245,7 @@
         <w:pStyle w:val="Ttulo2"/>
       </w:pPr>
       <w:bookmarkStart w:id="144" w:name="_af054ffcebd6910222ee7d6c1d020875947335e"/>
-      <w:bookmarkStart w:id="145" w:name="_Toc242196886"/>
+      <w:bookmarkStart w:id="145" w:name="_Toc242225092"/>
       <w:r>
         <w:t>HU-5.1 — Portal del propietario</w:t>
       </w:r>
@@ -27561,7 +27578,7 @@
         <w:pStyle w:val="Ttulo2"/>
       </w:pPr>
       <w:bookmarkStart w:id="146" w:name="_6b1c61431b8f8f0fcc4ce60077071b912ba2b45"/>
-      <w:bookmarkStart w:id="147" w:name="_Toc242196887"/>
+      <w:bookmarkStart w:id="147" w:name="_Toc242225093"/>
       <w:bookmarkEnd w:id="144"/>
       <w:r>
         <w:t>HU-5.2 — Auto-registro de propietario</w:t>
@@ -27830,7 +27847,7 @@
         <w:pStyle w:val="Ttulo2"/>
       </w:pPr>
       <w:bookmarkStart w:id="148" w:name="_f4d063018be410b507969fa4c62074124f833cf"/>
-      <w:bookmarkStart w:id="149" w:name="_Toc242196888"/>
+      <w:bookmarkStart w:id="149" w:name="_Toc242225094"/>
       <w:bookmarkEnd w:id="146"/>
       <w:r>
         <w:t>HU-5.3 — Agendar cita desde el portal</w:t>
@@ -28105,7 +28122,7 @@
         <w:pStyle w:val="Ttulo2"/>
       </w:pPr>
       <w:bookmarkStart w:id="150" w:name="_c64202596780354c08c0a149dc974449db886cf"/>
-      <w:bookmarkStart w:id="151" w:name="_Toc242196889"/>
+      <w:bookmarkStart w:id="151" w:name="_Toc242225095"/>
       <w:bookmarkEnd w:id="148"/>
       <w:r>
         <w:t>HU-5.4 — Editar mi mascota desde el portal</w:t>
@@ -28343,7 +28360,7 @@
         <w:pStyle w:val="Ttulo2"/>
       </w:pPr>
       <w:bookmarkStart w:id="152" w:name="_cf91e7705c2cc7ff174f786bca87f4ab32c164a"/>
-      <w:bookmarkStart w:id="153" w:name="_Toc242196890"/>
+      <w:bookmarkStart w:id="153" w:name="_Toc242225096"/>
       <w:bookmarkEnd w:id="150"/>
       <w:r>
         <w:lastRenderedPageBreak/>
@@ -28589,7 +28606,7 @@
         <w:pStyle w:val="Ttulo2"/>
       </w:pPr>
       <w:bookmarkStart w:id="154" w:name="_f8ebe18ba7612da84cbeb32e6cdfcf569929127"/>
-      <w:bookmarkStart w:id="155" w:name="_Toc242196891"/>
+      <w:bookmarkStart w:id="155" w:name="_Toc242225097"/>
       <w:bookmarkEnd w:id="152"/>
       <w:r>
         <w:t>HU-5.6 — Cancelar o reprogramar mi cita desde el portal</w:t>
@@ -28893,7 +28910,7 @@
         <w:pStyle w:val="Ttulo2"/>
       </w:pPr>
       <w:bookmarkStart w:id="156" w:name="_63b2ff8270a3dc0cb21378739f70e0c16a27def"/>
-      <w:bookmarkStart w:id="157" w:name="_Toc242196892"/>
+      <w:bookmarkStart w:id="157" w:name="_Toc242225098"/>
       <w:bookmarkEnd w:id="154"/>
       <w:r>
         <w:lastRenderedPageBreak/>
@@ -29154,7 +29171,7 @@
         <w:pStyle w:val="Ttulo2"/>
       </w:pPr>
       <w:bookmarkStart w:id="158" w:name="_f59be5ab49da54ec24749683e30fb79075b9c3a"/>
-      <w:bookmarkStart w:id="159" w:name="_Toc242196893"/>
+      <w:bookmarkStart w:id="159" w:name="_Toc242225099"/>
       <w:bookmarkEnd w:id="156"/>
       <w:r>
         <w:t>HU-5.8 — Registrar al propietario como identidad global</w:t>
@@ -29488,7 +29505,7 @@
         <w:pStyle w:val="Ttulo2"/>
       </w:pPr>
       <w:bookmarkStart w:id="160" w:name="_06eaf3b49483b1eeebe1b8e79573cd5c749be44"/>
-      <w:bookmarkStart w:id="161" w:name="_Toc242196894"/>
+      <w:bookmarkStart w:id="161" w:name="_Toc242225100"/>
       <w:bookmarkEnd w:id="158"/>
       <w:r>
         <w:lastRenderedPageBreak/>
@@ -29768,7 +29785,7 @@
         <w:pStyle w:val="Ttulo2"/>
       </w:pPr>
       <w:bookmarkStart w:id="162" w:name="_73bf9bf1ab817b39687e744da8c8402ea9619af"/>
-      <w:bookmarkStart w:id="163" w:name="_Toc242196895"/>
+      <w:bookmarkStart w:id="163" w:name="_Toc242225101"/>
       <w:bookmarkEnd w:id="160"/>
       <w:r>
         <w:t>HU-5.10 — Carnet digital de la mascota con QR de emergencia</w:t>
@@ -30032,7 +30049,7 @@
         <w:pStyle w:val="Ttulo2"/>
       </w:pPr>
       <w:bookmarkStart w:id="164" w:name="_809064a587886d0547b1788a26db9d9152af23a"/>
-      <w:bookmarkStart w:id="165" w:name="_Toc242196896"/>
+      <w:bookmarkStart w:id="165" w:name="_Toc242225102"/>
       <w:bookmarkEnd w:id="162"/>
       <w:r>
         <w:t>HU-5.11 — Acceder al carnet por QR en modo solo lectura</w:t>
@@ -30304,7 +30321,7 @@
         <w:pStyle w:val="Ttulo2"/>
       </w:pPr>
       <w:bookmarkStart w:id="166" w:name="_eaa2b9dcd4e772acfdb8cc2e14fe1584fe792e7"/>
-      <w:bookmarkStart w:id="167" w:name="_Toc242196897"/>
+      <w:bookmarkStart w:id="167" w:name="_Toc242225103"/>
       <w:bookmarkEnd w:id="164"/>
       <w:r>
         <w:t>HU-5.12 — Autorizar a una clínica a ver la historia de otras clínicas</w:t>
@@ -30567,7 +30584,7 @@
         <w:pStyle w:val="Ttulo2"/>
       </w:pPr>
       <w:bookmarkStart w:id="168" w:name="_9c4353686bd45e1d5b28007e4eeecf1db3be371"/>
-      <w:bookmarkStart w:id="169" w:name="_Toc242196898"/>
+      <w:bookmarkStart w:id="169" w:name="_Toc242225104"/>
       <w:bookmarkEnd w:id="166"/>
       <w:r>
         <w:lastRenderedPageBreak/>
@@ -30816,7 +30833,7 @@
         <w:pStyle w:val="Ttulo2"/>
       </w:pPr>
       <w:bookmarkStart w:id="170" w:name="_faf9cae68ace52a6134b8c807ad8be34010091b"/>
-      <w:bookmarkStart w:id="171" w:name="_Toc242196899"/>
+      <w:bookmarkStart w:id="171" w:name="_Toc242225105"/>
       <w:bookmarkEnd w:id="168"/>
       <w:r>
         <w:t>HU-5.14 — Eliminar mi cuenta (derecho de supresión)</w:t>
@@ -31076,7 +31093,7 @@
         <w:pStyle w:val="Ttulo1"/>
       </w:pPr>
       <w:bookmarkStart w:id="172" w:name="_415d3e183ea3663701acfe1e73f6e8038e4bbef"/>
-      <w:bookmarkStart w:id="173" w:name="_Toc242196900"/>
+      <w:bookmarkStart w:id="173" w:name="_Toc242225106"/>
       <w:bookmarkEnd w:id="142"/>
       <w:bookmarkEnd w:id="170"/>
       <w:r>
@@ -31098,7 +31115,7 @@
         <w:pStyle w:val="Ttulo2"/>
       </w:pPr>
       <w:bookmarkStart w:id="174" w:name="_1b876ecfd0adf71d503b9129568b658f81872f0"/>
-      <w:bookmarkStart w:id="175" w:name="_Toc242196901"/>
+      <w:bookmarkStart w:id="175" w:name="_Toc242225107"/>
       <w:r>
         <w:t>HU-6.1 — Dashboard principal y panel de pendientes</w:t>
       </w:r>
@@ -31404,7 +31421,7 @@
         <w:pStyle w:val="Ttulo2"/>
       </w:pPr>
       <w:bookmarkStart w:id="176" w:name="_97322cabf772225fd1bfe897dee158000aa0394"/>
-      <w:bookmarkStart w:id="177" w:name="_Toc242196902"/>
+      <w:bookmarkStart w:id="177" w:name="_Toc242225108"/>
       <w:bookmarkEnd w:id="174"/>
       <w:r>
         <w:t>HU-6.2 — Panel de operación del administrador</w:t>
@@ -31667,7 +31684,7 @@
         <w:pStyle w:val="Ttulo2"/>
       </w:pPr>
       <w:bookmarkStart w:id="178" w:name="_6ce76d48cd12ce7662f89ac490d75c386fc18ba"/>
-      <w:bookmarkStart w:id="179" w:name="_Toc242196903"/>
+      <w:bookmarkStart w:id="179" w:name="_Toc242225109"/>
       <w:bookmarkEnd w:id="176"/>
       <w:r>
         <w:t>HU-6.3 — Generar reportes en PDF</w:t>
@@ -31953,7 +31970,7 @@
         <w:pStyle w:val="Ttulo2"/>
       </w:pPr>
       <w:bookmarkStart w:id="180" w:name="_132f0b1bfae1ac6054dc51db54a45dff43ec797"/>
-      <w:bookmarkStart w:id="181" w:name="_Toc242196904"/>
+      <w:bookmarkStart w:id="181" w:name="_Toc242225110"/>
       <w:bookmarkEnd w:id="178"/>
       <w:r>
         <w:t>HU-6.4 — Ver estadísticas y gráficas del sistema</w:t>
@@ -32210,7 +32227,7 @@
         <w:pStyle w:val="Ttulo2"/>
       </w:pPr>
       <w:bookmarkStart w:id="182" w:name="_159c41a8740d691e56d865baa1d2a17f58680f5"/>
-      <w:bookmarkStart w:id="183" w:name="_Toc242196905"/>
+      <w:bookmarkStart w:id="183" w:name="_Toc242225111"/>
       <w:bookmarkEnd w:id="180"/>
       <w:r>
         <w:t>HU-6.5 — Exportar reportes a Excel/CSV</w:t>
@@ -32449,7 +32466,7 @@
         <w:pStyle w:val="Ttulo1"/>
       </w:pPr>
       <w:bookmarkStart w:id="184" w:name="_88abf5b53e5603b94c73c4f577271d31a73cc35"/>
-      <w:bookmarkStart w:id="185" w:name="_Toc242196906"/>
+      <w:bookmarkStart w:id="185" w:name="_Toc242225112"/>
       <w:bookmarkEnd w:id="172"/>
       <w:bookmarkEnd w:id="182"/>
       <w:r>
@@ -32471,7 +32488,7 @@
         <w:pStyle w:val="Ttulo2"/>
       </w:pPr>
       <w:bookmarkStart w:id="186" w:name="_003ad6784c61069e91989793d8255e8d4cb519d"/>
-      <w:bookmarkStart w:id="187" w:name="_Toc242196907"/>
+      <w:bookmarkStart w:id="187" w:name="_Toc242225113"/>
       <w:r>
         <w:t>HU-7.1 — Configurar los horarios de atención de la clínica</w:t>
       </w:r>
@@ -32750,7 +32767,7 @@
         <w:pStyle w:val="Ttulo2"/>
       </w:pPr>
       <w:bookmarkStart w:id="188" w:name="_42539d8b8201701c75c37499984fbffa69d6e4d"/>
-      <w:bookmarkStart w:id="189" w:name="_Toc242196908"/>
+      <w:bookmarkStart w:id="189" w:name="_Toc242225114"/>
       <w:bookmarkEnd w:id="186"/>
       <w:r>
         <w:t>HU-7.2 — Gestionar los catálogos del sistema</w:t>
@@ -33031,7 +33048,7 @@
         <w:pStyle w:val="Ttulo2"/>
       </w:pPr>
       <w:bookmarkStart w:id="190" w:name="_a0aee2f406b049ed83cfe391a77b0db14b5bfdf"/>
-      <w:bookmarkStart w:id="191" w:name="_Toc242196909"/>
+      <w:bookmarkStart w:id="191" w:name="_Toc242225115"/>
       <w:bookmarkEnd w:id="188"/>
       <w:r>
         <w:t>HU-7.3 — Gestionar los veterinarios y sus especialidades</w:t>
@@ -33300,7 +33317,7 @@
         <w:pStyle w:val="Ttulo2"/>
       </w:pPr>
       <w:bookmarkStart w:id="192" w:name="_a0688e3f345f7bf587dcedb8b562b8964a6cacc"/>
-      <w:bookmarkStart w:id="193" w:name="_Toc242196910"/>
+      <w:bookmarkStart w:id="193" w:name="_Toc242225116"/>
       <w:bookmarkEnd w:id="190"/>
       <w:r>
         <w:t>HU-7.4 — Personalizar la clínica: marca y tipos de cita</w:t>
@@ -33580,7 +33597,7 @@
         <w:pStyle w:val="Ttulo2"/>
       </w:pPr>
       <w:bookmarkStart w:id="194" w:name="_7004fcdc7c25449422304e35d609c3113b471f6"/>
-      <w:bookmarkStart w:id="195" w:name="_Toc242196911"/>
+      <w:bookmarkStart w:id="195" w:name="_Toc242225117"/>
       <w:bookmarkEnd w:id="192"/>
       <w:r>
         <w:t>HU-7.5 — Parámetros del sistema configurables</w:t>
@@ -33850,7 +33867,7 @@
         <w:pStyle w:val="Ttulo1"/>
       </w:pPr>
       <w:bookmarkStart w:id="196" w:name="_99f8c38fc90f872e869cb5a42176a81ce60716e"/>
-      <w:bookmarkStart w:id="197" w:name="_Toc242196912"/>
+      <w:bookmarkStart w:id="197" w:name="_Toc242225118"/>
       <w:bookmarkEnd w:id="184"/>
       <w:bookmarkEnd w:id="194"/>
       <w:r>
@@ -33879,7 +33896,7 @@
         <w:pStyle w:val="Ttulo2"/>
       </w:pPr>
       <w:bookmarkStart w:id="198" w:name="_6b93d7ad964c8104bb83fc9231a04e4fc4e5a57"/>
-      <w:bookmarkStart w:id="199" w:name="_Toc242196913"/>
+      <w:bookmarkStart w:id="199" w:name="_Toc242225119"/>
       <w:r>
         <w:t>HU-8.1 — Calificar al veterinario tras una consulta atendida</w:t>
       </w:r>
@@ -34184,7 +34201,7 @@
         <w:pStyle w:val="Ttulo2"/>
       </w:pPr>
       <w:bookmarkStart w:id="200" w:name="_6de705a3e3f0ae827b0b0206b40472100ec5dc2"/>
-      <w:bookmarkStart w:id="201" w:name="_Toc242196914"/>
+      <w:bookmarkStart w:id="201" w:name="_Toc242225120"/>
       <w:bookmarkEnd w:id="198"/>
       <w:r>
         <w:t>HU-8.2 — Perfil público del veterinario</w:t>
@@ -34430,7 +34447,7 @@
         <w:pStyle w:val="Ttulo2"/>
       </w:pPr>
       <w:bookmarkStart w:id="202" w:name="_8d0438a4c21826cdef43f79f40a5abd8a052054"/>
-      <w:bookmarkStart w:id="203" w:name="_Toc242196915"/>
+      <w:bookmarkStart w:id="203" w:name="_Toc242225121"/>
       <w:bookmarkEnd w:id="200"/>
       <w:r>
         <w:lastRenderedPageBreak/>
@@ -34676,7 +34693,7 @@
         <w:pStyle w:val="Ttulo2"/>
       </w:pPr>
       <w:bookmarkStart w:id="204" w:name="_9d375ff686aceee42a269dcad0f742f5e2f3757"/>
-      <w:bookmarkStart w:id="205" w:name="_Toc242196916"/>
+      <w:bookmarkStart w:id="205" w:name="_Toc242225122"/>
       <w:bookmarkEnd w:id="202"/>
       <w:r>
         <w:t>HU-8.4 — Tiempos de envío de recordatorios configurables</w:t>
@@ -34900,7 +34917,7 @@
         <w:pStyle w:val="Ttulo2"/>
       </w:pPr>
       <w:bookmarkStart w:id="206" w:name="_09d49d8f9ce2d4331632fad53df16df04e0463f"/>
-      <w:bookmarkStart w:id="207" w:name="_Toc242196917"/>
+      <w:bookmarkStart w:id="207" w:name="_Toc242225123"/>
       <w:bookmarkEnd w:id="204"/>
       <w:r>
         <w:t>HU-8.5 — Bitácora de correos y notificaciones</w:t>
@@ -35124,7 +35141,7 @@
         <w:pStyle w:val="Ttulo1"/>
       </w:pPr>
       <w:bookmarkStart w:id="208" w:name="_739f4e5454618e53e20de4c2474955375ba75c3"/>
-      <w:bookmarkStart w:id="209" w:name="_Toc242196918"/>
+      <w:bookmarkStart w:id="209" w:name="_Toc242225124"/>
       <w:bookmarkEnd w:id="196"/>
       <w:bookmarkEnd w:id="206"/>
       <w:r>
@@ -35146,7 +35163,7 @@
         <w:pStyle w:val="Ttulo2"/>
       </w:pPr>
       <w:bookmarkStart w:id="210" w:name="_062138411ab05c870ba796ff3d39feef69a18f5"/>
-      <w:bookmarkStart w:id="211" w:name="_Toc242196919"/>
+      <w:bookmarkStart w:id="211" w:name="_Toc242225125"/>
       <w:r>
         <w:t>HU-9.1 — Página pública y políticas legales</w:t>
       </w:r>
@@ -35371,7 +35388,7 @@
         <w:pStyle w:val="Ttulo1"/>
       </w:pPr>
       <w:bookmarkStart w:id="212" w:name="_6e6ded5804ca164f89e595fd787218d3285fdda"/>
-      <w:bookmarkStart w:id="213" w:name="_Toc242196920"/>
+      <w:bookmarkStart w:id="213" w:name="_Toc242225126"/>
       <w:bookmarkEnd w:id="208"/>
       <w:bookmarkEnd w:id="210"/>
       <w:r>
@@ -35421,7 +35438,7 @@
         <w:pStyle w:val="Ttulo2"/>
       </w:pPr>
       <w:bookmarkStart w:id="214" w:name="_90f84fdbbdd2d6886c9b4105f5da1ebd566ad0a"/>
-      <w:bookmarkStart w:id="215" w:name="_Toc242196921"/>
+      <w:bookmarkStart w:id="215" w:name="_Toc242225127"/>
       <w:r>
         <w:t>Entrega v2.0 — imprescindible para la presentación (28 historias, 159 puntos)</w:t>
       </w:r>
@@ -36907,7 +36924,7 @@
         <w:pStyle w:val="Ttulo2"/>
       </w:pPr>
       <w:bookmarkStart w:id="216" w:name="_167e61555e1d771b624b3ccd3d20e15ce100bb9"/>
-      <w:bookmarkStart w:id="217" w:name="_Toc242196922"/>
+      <w:bookmarkStart w:id="217" w:name="_Toc242225128"/>
       <w:bookmarkEnd w:id="214"/>
       <w:r>
         <w:t>Entrega v2.1 — completa el alcance (16 historias, 62 puntos)</w:t>
@@ -37849,7 +37866,7 @@
         <w:pStyle w:val="Ttulo2"/>
       </w:pPr>
       <w:bookmarkStart w:id="218" w:name="_18e859a36e2a2c7f781eaf2084ffc20b263712e"/>
-      <w:bookmarkStart w:id="219" w:name="_Toc242196923"/>
+      <w:bookmarkStart w:id="219" w:name="_Toc242225129"/>
       <w:bookmarkEnd w:id="216"/>
       <w:r>
         <w:lastRenderedPageBreak/>
@@ -38201,7 +38218,7 @@
         <w:pStyle w:val="Ttulo1"/>
       </w:pPr>
       <w:bookmarkStart w:id="220" w:name="_2bd3782f46f42f4ba497da64d292df25adf2039"/>
-      <w:bookmarkStart w:id="221" w:name="_Toc242196924"/>
+      <w:bookmarkStart w:id="221" w:name="_Toc242225130"/>
       <w:bookmarkEnd w:id="212"/>
       <w:bookmarkEnd w:id="218"/>
       <w:r>
@@ -40018,7 +40035,7 @@
               <w:pStyle w:val="Celda"/>
             </w:pPr>
             <w:r>
-              <w:t>HU-T.18, HU-5.3, HU-5.8, HU-5.9, HU-5.13</w:t>
+              <w:t>HU-T.18, HU-1.2, HU-5.3, HU-5.8, HU-5.9, HU-5.13</w:t>
             </w:r>
           </w:p>
         </w:tc>
@@ -42732,7 +42749,7 @@
         <w:pStyle w:val="Ttulo1"/>
       </w:pPr>
       <w:bookmarkStart w:id="222" w:name="_628434b2c6f40c9643f3958509c62867ee6f47b"/>
-      <w:bookmarkStart w:id="223" w:name="_Toc242196925"/>
+      <w:bookmarkStart w:id="223" w:name="_Toc242225131"/>
       <w:bookmarkEnd w:id="220"/>
       <w:r>
         <w:lastRenderedPageBreak/>
@@ -48297,7 +48314,7 @@
               <w:noProof/>
             </w:rPr>
             <w:drawing>
-              <wp:inline distT="0" distB="0" distL="0" distR="0" wp14:anchorId="022B8BAC" wp14:editId="022B8BAD">
+              <wp:inline distT="0" distB="0" distL="0" distR="0" wp14:anchorId="0E8D0530" wp14:editId="0E8D0531">
                 <wp:extent cx="324000" cy="324000"/>
                 <wp:effectExtent l="0" t="0" r="0" b="0"/>
                 <wp:docPr id="9001" name="Logo Zooki"/>
@@ -48464,7 +48481,7 @@
   <w:abstractNum w:abstractNumId="0" w15:restartNumberingAfterBreak="0">
     <w:nsid w:val="0000A991"/>
     <w:multiLevelType w:val="multilevel"/>
-    <w:tmpl w:val="8F16B4BE"/>
+    <w:tmpl w:val="7CBA73D2"/>
     <w:lvl w:ilvl="0">
       <w:numFmt w:val="bullet"/>
       <w:lvlText w:val=""/>
@@ -48565,292 +48582,292 @@
       </w:rPr>
     </w:lvl>
   </w:abstractNum>
-  <w:num w:numId="1" w16cid:durableId="6715892">
+  <w:num w:numId="1" w16cid:durableId="934292390">
     <w:abstractNumId w:val="0"/>
   </w:num>
-  <w:num w:numId="2" w16cid:durableId="1485581978">
+  <w:num w:numId="2" w16cid:durableId="459346981">
     <w:abstractNumId w:val="0"/>
   </w:num>
-  <w:num w:numId="3" w16cid:durableId="1636334822">
+  <w:num w:numId="3" w16cid:durableId="176775071">
     <w:abstractNumId w:val="0"/>
   </w:num>
-  <w:num w:numId="4" w16cid:durableId="105317563">
+  <w:num w:numId="4" w16cid:durableId="425854267">
     <w:abstractNumId w:val="0"/>
   </w:num>
-  <w:num w:numId="5" w16cid:durableId="1190798938">
+  <w:num w:numId="5" w16cid:durableId="1790855591">
     <w:abstractNumId w:val="0"/>
   </w:num>
-  <w:num w:numId="6" w16cid:durableId="1112094152">
+  <w:num w:numId="6" w16cid:durableId="1323120613">
     <w:abstractNumId w:val="0"/>
   </w:num>
-  <w:num w:numId="7" w16cid:durableId="2141993073">
+  <w:num w:numId="7" w16cid:durableId="1506436867">
     <w:abstractNumId w:val="0"/>
   </w:num>
-  <w:num w:numId="8" w16cid:durableId="89737905">
+  <w:num w:numId="8" w16cid:durableId="352340749">
     <w:abstractNumId w:val="0"/>
   </w:num>
-  <w:num w:numId="9" w16cid:durableId="99381101">
+  <w:num w:numId="9" w16cid:durableId="1768691838">
     <w:abstractNumId w:val="0"/>
   </w:num>
-  <w:num w:numId="10" w16cid:durableId="536819478">
+  <w:num w:numId="10" w16cid:durableId="590436373">
     <w:abstractNumId w:val="0"/>
   </w:num>
-  <w:num w:numId="11" w16cid:durableId="1653674620">
+  <w:num w:numId="11" w16cid:durableId="2038845890">
     <w:abstractNumId w:val="0"/>
   </w:num>
-  <w:num w:numId="12" w16cid:durableId="628777984">
+  <w:num w:numId="12" w16cid:durableId="958531351">
     <w:abstractNumId w:val="0"/>
   </w:num>
-  <w:num w:numId="13" w16cid:durableId="701789135">
+  <w:num w:numId="13" w16cid:durableId="1535531950">
     <w:abstractNumId w:val="0"/>
   </w:num>
-  <w:num w:numId="14" w16cid:durableId="1103721266">
+  <w:num w:numId="14" w16cid:durableId="406801549">
     <w:abstractNumId w:val="0"/>
   </w:num>
-  <w:num w:numId="15" w16cid:durableId="374886995">
+  <w:num w:numId="15" w16cid:durableId="386605838">
     <w:abstractNumId w:val="0"/>
   </w:num>
-  <w:num w:numId="16" w16cid:durableId="2146853770">
+  <w:num w:numId="16" w16cid:durableId="579221431">
     <w:abstractNumId w:val="0"/>
   </w:num>
-  <w:num w:numId="17" w16cid:durableId="439181980">
+  <w:num w:numId="17" w16cid:durableId="1546067494">
     <w:abstractNumId w:val="0"/>
   </w:num>
-  <w:num w:numId="18" w16cid:durableId="1007757497">
+  <w:num w:numId="18" w16cid:durableId="400829365">
     <w:abstractNumId w:val="0"/>
   </w:num>
-  <w:num w:numId="19" w16cid:durableId="884831183">
+  <w:num w:numId="19" w16cid:durableId="1038316172">
     <w:abstractNumId w:val="0"/>
   </w:num>
-  <w:num w:numId="20" w16cid:durableId="1899390784">
+  <w:num w:numId="20" w16cid:durableId="1230069408">
     <w:abstractNumId w:val="0"/>
   </w:num>
-  <w:num w:numId="21" w16cid:durableId="969703152">
+  <w:num w:numId="21" w16cid:durableId="685063576">
     <w:abstractNumId w:val="0"/>
   </w:num>
-  <w:num w:numId="22" w16cid:durableId="967784585">
+  <w:num w:numId="22" w16cid:durableId="625432054">
     <w:abstractNumId w:val="0"/>
   </w:num>
-  <w:num w:numId="23" w16cid:durableId="1289777754">
+  <w:num w:numId="23" w16cid:durableId="482703223">
     <w:abstractNumId w:val="0"/>
   </w:num>
-  <w:num w:numId="24" w16cid:durableId="402065152">
+  <w:num w:numId="24" w16cid:durableId="1032073637">
     <w:abstractNumId w:val="0"/>
   </w:num>
-  <w:num w:numId="25" w16cid:durableId="498470469">
+  <w:num w:numId="25" w16cid:durableId="823938819">
     <w:abstractNumId w:val="0"/>
   </w:num>
-  <w:num w:numId="26" w16cid:durableId="411200420">
+  <w:num w:numId="26" w16cid:durableId="1094745547">
     <w:abstractNumId w:val="0"/>
   </w:num>
-  <w:num w:numId="27" w16cid:durableId="853960110">
+  <w:num w:numId="27" w16cid:durableId="828207353">
     <w:abstractNumId w:val="0"/>
   </w:num>
-  <w:num w:numId="28" w16cid:durableId="1085416869">
+  <w:num w:numId="28" w16cid:durableId="1173572862">
     <w:abstractNumId w:val="0"/>
   </w:num>
-  <w:num w:numId="29" w16cid:durableId="1546601549">
+  <w:num w:numId="29" w16cid:durableId="1704936094">
     <w:abstractNumId w:val="0"/>
   </w:num>
-  <w:num w:numId="30" w16cid:durableId="1577471427">
+  <w:num w:numId="30" w16cid:durableId="359011912">
     <w:abstractNumId w:val="0"/>
   </w:num>
-  <w:num w:numId="31" w16cid:durableId="991107046">
+  <w:num w:numId="31" w16cid:durableId="578558613">
     <w:abstractNumId w:val="0"/>
   </w:num>
-  <w:num w:numId="32" w16cid:durableId="2077165220">
+  <w:num w:numId="32" w16cid:durableId="503203903">
     <w:abstractNumId w:val="0"/>
   </w:num>
-  <w:num w:numId="33" w16cid:durableId="1530870273">
+  <w:num w:numId="33" w16cid:durableId="1686981120">
     <w:abstractNumId w:val="0"/>
   </w:num>
-  <w:num w:numId="34" w16cid:durableId="1715109169">
+  <w:num w:numId="34" w16cid:durableId="1018241823">
     <w:abstractNumId w:val="0"/>
   </w:num>
-  <w:num w:numId="35" w16cid:durableId="1123235615">
+  <w:num w:numId="35" w16cid:durableId="128326550">
     <w:abstractNumId w:val="0"/>
   </w:num>
-  <w:num w:numId="36" w16cid:durableId="1365212539">
+  <w:num w:numId="36" w16cid:durableId="1755738200">
     <w:abstractNumId w:val="0"/>
   </w:num>
-  <w:num w:numId="37" w16cid:durableId="926352487">
+  <w:num w:numId="37" w16cid:durableId="60447512">
     <w:abstractNumId w:val="0"/>
   </w:num>
-  <w:num w:numId="38" w16cid:durableId="1781558904">
+  <w:num w:numId="38" w16cid:durableId="269818516">
     <w:abstractNumId w:val="0"/>
   </w:num>
-  <w:num w:numId="39" w16cid:durableId="877084713">
+  <w:num w:numId="39" w16cid:durableId="1904413382">
     <w:abstractNumId w:val="0"/>
   </w:num>
-  <w:num w:numId="40" w16cid:durableId="530799740">
+  <w:num w:numId="40" w16cid:durableId="1071344755">
     <w:abstractNumId w:val="0"/>
   </w:num>
-  <w:num w:numId="41" w16cid:durableId="162749415">
+  <w:num w:numId="41" w16cid:durableId="786654700">
     <w:abstractNumId w:val="0"/>
   </w:num>
-  <w:num w:numId="42" w16cid:durableId="1115058053">
+  <w:num w:numId="42" w16cid:durableId="1135828631">
     <w:abstractNumId w:val="0"/>
   </w:num>
-  <w:num w:numId="43" w16cid:durableId="206723436">
+  <w:num w:numId="43" w16cid:durableId="107550680">
     <w:abstractNumId w:val="0"/>
   </w:num>
-  <w:num w:numId="44" w16cid:durableId="1295871469">
+  <w:num w:numId="44" w16cid:durableId="1616063745">
     <w:abstractNumId w:val="0"/>
   </w:num>
-  <w:num w:numId="45" w16cid:durableId="1694453721">
+  <w:num w:numId="45" w16cid:durableId="2089499186">
     <w:abstractNumId w:val="0"/>
   </w:num>
-  <w:num w:numId="46" w16cid:durableId="1848907203">
+  <w:num w:numId="46" w16cid:durableId="60060469">
     <w:abstractNumId w:val="0"/>
   </w:num>
-  <w:num w:numId="47" w16cid:durableId="364066137">
+  <w:num w:numId="47" w16cid:durableId="1122915936">
     <w:abstractNumId w:val="0"/>
   </w:num>
-  <w:num w:numId="48" w16cid:durableId="1511529876">
+  <w:num w:numId="48" w16cid:durableId="605235545">
     <w:abstractNumId w:val="0"/>
   </w:num>
-  <w:num w:numId="49" w16cid:durableId="990215904">
+  <w:num w:numId="49" w16cid:durableId="897208921">
     <w:abstractNumId w:val="0"/>
   </w:num>
-  <w:num w:numId="50" w16cid:durableId="962078048">
+  <w:num w:numId="50" w16cid:durableId="2020231683">
     <w:abstractNumId w:val="0"/>
   </w:num>
-  <w:num w:numId="51" w16cid:durableId="1305040131">
+  <w:num w:numId="51" w16cid:durableId="536091841">
     <w:abstractNumId w:val="0"/>
   </w:num>
-  <w:num w:numId="52" w16cid:durableId="868108318">
+  <w:num w:numId="52" w16cid:durableId="1123841558">
     <w:abstractNumId w:val="0"/>
   </w:num>
-  <w:num w:numId="53" w16cid:durableId="628778922">
+  <w:num w:numId="53" w16cid:durableId="1383745127">
     <w:abstractNumId w:val="0"/>
   </w:num>
-  <w:num w:numId="54" w16cid:durableId="79179968">
+  <w:num w:numId="54" w16cid:durableId="986980757">
     <w:abstractNumId w:val="0"/>
   </w:num>
-  <w:num w:numId="55" w16cid:durableId="176817408">
+  <w:num w:numId="55" w16cid:durableId="513106771">
     <w:abstractNumId w:val="0"/>
   </w:num>
-  <w:num w:numId="56" w16cid:durableId="1215048894">
+  <w:num w:numId="56" w16cid:durableId="1945847635">
     <w:abstractNumId w:val="0"/>
   </w:num>
-  <w:num w:numId="57" w16cid:durableId="2108689426">
+  <w:num w:numId="57" w16cid:durableId="1077751091">
     <w:abstractNumId w:val="0"/>
   </w:num>
-  <w:num w:numId="58" w16cid:durableId="1325743820">
+  <w:num w:numId="58" w16cid:durableId="1234588688">
     <w:abstractNumId w:val="0"/>
   </w:num>
-  <w:num w:numId="59" w16cid:durableId="1113406341">
+  <w:num w:numId="59" w16cid:durableId="1949383221">
     <w:abstractNumId w:val="0"/>
   </w:num>
-  <w:num w:numId="60" w16cid:durableId="759914767">
+  <w:num w:numId="60" w16cid:durableId="1805272156">
     <w:abstractNumId w:val="0"/>
   </w:num>
-  <w:num w:numId="61" w16cid:durableId="1123233844">
+  <w:num w:numId="61" w16cid:durableId="1845321202">
     <w:abstractNumId w:val="0"/>
   </w:num>
-  <w:num w:numId="62" w16cid:durableId="1275593916">
+  <w:num w:numId="62" w16cid:durableId="795611345">
     <w:abstractNumId w:val="0"/>
   </w:num>
-  <w:num w:numId="63" w16cid:durableId="1754275914">
+  <w:num w:numId="63" w16cid:durableId="1722556671">
     <w:abstractNumId w:val="0"/>
   </w:num>
-  <w:num w:numId="64" w16cid:durableId="287047779">
+  <w:num w:numId="64" w16cid:durableId="118181950">
     <w:abstractNumId w:val="0"/>
   </w:num>
-  <w:num w:numId="65" w16cid:durableId="1136528025">
+  <w:num w:numId="65" w16cid:durableId="1430849780">
     <w:abstractNumId w:val="0"/>
   </w:num>
-  <w:num w:numId="66" w16cid:durableId="1528635370">
+  <w:num w:numId="66" w16cid:durableId="490482469">
     <w:abstractNumId w:val="0"/>
   </w:num>
-  <w:num w:numId="67" w16cid:durableId="245573538">
+  <w:num w:numId="67" w16cid:durableId="2144038426">
     <w:abstractNumId w:val="0"/>
   </w:num>
-  <w:num w:numId="68" w16cid:durableId="1972318848">
+  <w:num w:numId="68" w16cid:durableId="299113809">
     <w:abstractNumId w:val="0"/>
   </w:num>
-  <w:num w:numId="69" w16cid:durableId="1831941277">
+  <w:num w:numId="69" w16cid:durableId="724524326">
     <w:abstractNumId w:val="0"/>
   </w:num>
-  <w:num w:numId="70" w16cid:durableId="1274944330">
+  <w:num w:numId="70" w16cid:durableId="1293291808">
     <w:abstractNumId w:val="0"/>
   </w:num>
-  <w:num w:numId="71" w16cid:durableId="943027717">
+  <w:num w:numId="71" w16cid:durableId="1762486260">
     <w:abstractNumId w:val="0"/>
   </w:num>
-  <w:num w:numId="72" w16cid:durableId="71902899">
+  <w:num w:numId="72" w16cid:durableId="80374007">
     <w:abstractNumId w:val="0"/>
   </w:num>
-  <w:num w:numId="73" w16cid:durableId="1657145680">
+  <w:num w:numId="73" w16cid:durableId="171771713">
     <w:abstractNumId w:val="0"/>
   </w:num>
-  <w:num w:numId="74" w16cid:durableId="1621379212">
+  <w:num w:numId="74" w16cid:durableId="415785598">
     <w:abstractNumId w:val="0"/>
   </w:num>
-  <w:num w:numId="75" w16cid:durableId="575287684">
+  <w:num w:numId="75" w16cid:durableId="786241943">
     <w:abstractNumId w:val="0"/>
   </w:num>
-  <w:num w:numId="76" w16cid:durableId="1806701597">
+  <w:num w:numId="76" w16cid:durableId="861363928">
     <w:abstractNumId w:val="0"/>
   </w:num>
-  <w:num w:numId="77" w16cid:durableId="1275211291">
+  <w:num w:numId="77" w16cid:durableId="2102873331">
     <w:abstractNumId w:val="0"/>
   </w:num>
-  <w:num w:numId="78" w16cid:durableId="1352495084">
+  <w:num w:numId="78" w16cid:durableId="1748383551">
     <w:abstractNumId w:val="0"/>
   </w:num>
-  <w:num w:numId="79" w16cid:durableId="865286905">
+  <w:num w:numId="79" w16cid:durableId="769592234">
     <w:abstractNumId w:val="0"/>
   </w:num>
-  <w:num w:numId="80" w16cid:durableId="1881474370">
+  <w:num w:numId="80" w16cid:durableId="2050758316">
     <w:abstractNumId w:val="0"/>
   </w:num>
-  <w:num w:numId="81" w16cid:durableId="944463628">
+  <w:num w:numId="81" w16cid:durableId="1883595332">
     <w:abstractNumId w:val="0"/>
   </w:num>
-  <w:num w:numId="82" w16cid:durableId="598759338">
+  <w:num w:numId="82" w16cid:durableId="1382680000">
     <w:abstractNumId w:val="0"/>
   </w:num>
-  <w:num w:numId="83" w16cid:durableId="751901764">
+  <w:num w:numId="83" w16cid:durableId="309790792">
     <w:abstractNumId w:val="0"/>
   </w:num>
-  <w:num w:numId="84" w16cid:durableId="1345477046">
+  <w:num w:numId="84" w16cid:durableId="331420326">
     <w:abstractNumId w:val="0"/>
   </w:num>
-  <w:num w:numId="85" w16cid:durableId="262807960">
+  <w:num w:numId="85" w16cid:durableId="133135907">
     <w:abstractNumId w:val="0"/>
   </w:num>
-  <w:num w:numId="86" w16cid:durableId="222761270">
+  <w:num w:numId="86" w16cid:durableId="1718240032">
     <w:abstractNumId w:val="0"/>
   </w:num>
-  <w:num w:numId="87" w16cid:durableId="291985001">
+  <w:num w:numId="87" w16cid:durableId="1658194005">
     <w:abstractNumId w:val="0"/>
   </w:num>
-  <w:num w:numId="88" w16cid:durableId="1729455097">
+  <w:num w:numId="88" w16cid:durableId="687292965">
     <w:abstractNumId w:val="0"/>
   </w:num>
-  <w:num w:numId="89" w16cid:durableId="485166732">
+  <w:num w:numId="89" w16cid:durableId="1223639325">
     <w:abstractNumId w:val="0"/>
   </w:num>
-  <w:num w:numId="90" w16cid:durableId="997073663">
+  <w:num w:numId="90" w16cid:durableId="2119401212">
     <w:abstractNumId w:val="0"/>
   </w:num>
-  <w:num w:numId="91" w16cid:durableId="1531332085">
+  <w:num w:numId="91" w16cid:durableId="1577206492">
     <w:abstractNumId w:val="0"/>
   </w:num>
-  <w:num w:numId="92" w16cid:durableId="1536232251">
+  <w:num w:numId="92" w16cid:durableId="1580288297">
     <w:abstractNumId w:val="0"/>
   </w:num>
-  <w:num w:numId="93" w16cid:durableId="1001810835">
+  <w:num w:numId="93" w16cid:durableId="666401747">
     <w:abstractNumId w:val="0"/>
   </w:num>
-  <w:num w:numId="94" w16cid:durableId="1876042179">
+  <w:num w:numId="94" w16cid:durableId="557016821">
     <w:abstractNumId w:val="0"/>
   </w:num>
-  <w:num w:numId="95" w16cid:durableId="1613785082">
+  <w:num w:numId="95" w16cid:durableId="394007495">
     <w:abstractNumId w:val="0"/>
   </w:num>
-  <w:num w:numId="96" w16cid:durableId="219445842">
+  <w:num w:numId="96" w16cid:durableId="2134984219">
     <w:abstractNumId w:val="0"/>
   </w:num>
   <w:numIdMacAtCleanup w:val="96"/>
@@ -50242,7 +50259,7 @@
     <w:autoRedefine/>
     <w:uiPriority w:val="39"/>
     <w:unhideWhenUsed/>
-    <w:rsid w:val="00B75EEB"/>
+    <w:rsid w:val="00DC1584"/>
     <w:pPr>
       <w:spacing w:after="100" w:line="278" w:lineRule="auto"/>
       <w:ind w:left="480"/>
@@ -50261,7 +50278,7 @@
     <w:autoRedefine/>
     <w:uiPriority w:val="39"/>
     <w:unhideWhenUsed/>
-    <w:rsid w:val="00B75EEB"/>
+    <w:rsid w:val="00DC1584"/>
     <w:pPr>
       <w:spacing w:after="100" w:line="278" w:lineRule="auto"/>
       <w:ind w:left="720"/>
@@ -50280,7 +50297,7 @@
     <w:autoRedefine/>
     <w:uiPriority w:val="39"/>
     <w:unhideWhenUsed/>
-    <w:rsid w:val="00B75EEB"/>
+    <w:rsid w:val="00DC1584"/>
     <w:pPr>
       <w:spacing w:after="100" w:line="278" w:lineRule="auto"/>
       <w:ind w:left="960"/>
@@ -50299,7 +50316,7 @@
     <w:autoRedefine/>
     <w:uiPriority w:val="39"/>
     <w:unhideWhenUsed/>
-    <w:rsid w:val="00B75EEB"/>
+    <w:rsid w:val="00DC1584"/>
     <w:pPr>
       <w:spacing w:after="100" w:line="278" w:lineRule="auto"/>
       <w:ind w:left="1200"/>
@@ -50318,7 +50335,7 @@
     <w:autoRedefine/>
     <w:uiPriority w:val="39"/>
     <w:unhideWhenUsed/>
-    <w:rsid w:val="00B75EEB"/>
+    <w:rsid w:val="00DC1584"/>
     <w:pPr>
       <w:spacing w:after="100" w:line="278" w:lineRule="auto"/>
       <w:ind w:left="1440"/>
@@ -50337,7 +50354,7 @@
     <w:autoRedefine/>
     <w:uiPriority w:val="39"/>
     <w:unhideWhenUsed/>
-    <w:rsid w:val="00B75EEB"/>
+    <w:rsid w:val="00DC1584"/>
     <w:pPr>
       <w:spacing w:after="100" w:line="278" w:lineRule="auto"/>
       <w:ind w:left="1680"/>
@@ -50356,7 +50373,7 @@
     <w:autoRedefine/>
     <w:uiPriority w:val="39"/>
     <w:unhideWhenUsed/>
-    <w:rsid w:val="00B75EEB"/>
+    <w:rsid w:val="00DC1584"/>
     <w:pPr>
       <w:spacing w:after="100" w:line="278" w:lineRule="auto"/>
       <w:ind w:left="1920"/>
@@ -50374,7 +50391,7 @@
     <w:uiPriority w:val="99"/>
     <w:semiHidden/>
     <w:unhideWhenUsed/>
-    <w:rsid w:val="00B75EEB"/>
+    <w:rsid w:val="00DC1584"/>
     <w:rPr>
       <w:color w:val="605E5C"/>
       <w:shd w:val="clear" w:color="auto" w:fill="E1DFDD"/>

</xml_diff>

<commit_message>
docs(m0.2): diagramas 12.1 y 12.1.1, HU-0.3, historial 2.0.0-alpha.2 y anexo M0.2
</commit_message>
<xml_diff>
--- a/public/docs/descargas/hu.docx
+++ b/public/docs/descargas/hu.docx
@@ -93,7 +93,7 @@
           <w:noProof/>
         </w:rPr>
         <w:drawing>
-          <wp:inline distT="0" distB="0" distL="0" distR="0" wp14:anchorId="37E1B9A8" wp14:editId="37E1B9A9">
+          <wp:inline distT="0" distB="0" distL="0" distR="0" wp14:anchorId="5EA5050A" wp14:editId="5EA5050B">
             <wp:extent cx="395999" cy="405503"/>
             <wp:effectExtent l="0" t="0" r="0" b="0"/>
             <wp:docPr id="10" name="Picture"/>
@@ -229,7 +229,7 @@
               <w:pStyle w:val="Celda"/>
             </w:pPr>
             <w:r>
-              <w:t>11/10/2026</w:t>
+              <w:t>12/10/2026</w:t>
             </w:r>
           </w:p>
         </w:tc>
@@ -409,7 +409,7 @@
       <w:r>
         <w:fldChar w:fldCharType="separate"/>
       </w:r>
-      <w:hyperlink w:anchor="_Toc242641274" w:history="1">
+      <w:hyperlink w:anchor="_Toc242656756" w:history="1">
         <w:r>
           <w:rPr>
             <w:rStyle w:val="Hipervnculo"/>
@@ -445,7 +445,7 @@
             <w:noProof/>
             <w:webHidden/>
           </w:rPr>
-          <w:instrText xml:space="preserve"> PAGEREF _Toc242641274 \h </w:instrText>
+          <w:instrText xml:space="preserve"> PAGEREF _Toc242656756 \h </w:instrText>
         </w:r>
         <w:r>
           <w:rPr>
@@ -488,7 +488,7 @@
           <w14:ligatures w14:val="standardContextual"/>
         </w:rPr>
       </w:pPr>
-      <w:hyperlink w:anchor="_Toc242641275" w:history="1">
+      <w:hyperlink w:anchor="_Toc242656757" w:history="1">
         <w:r>
           <w:rPr>
             <w:rStyle w:val="Hipervnculo"/>
@@ -515,7 +515,7 @@
             <w:noProof/>
             <w:webHidden/>
           </w:rPr>
-          <w:instrText xml:space="preserve"> PAGEREF _Toc242641275 \h </w:instrText>
+          <w:instrText xml:space="preserve"> PAGEREF _Toc242656757 \h </w:instrText>
         </w:r>
         <w:r>
           <w:rPr>
@@ -558,7 +558,7 @@
           <w14:ligatures w14:val="standardContextual"/>
         </w:rPr>
       </w:pPr>
-      <w:hyperlink w:anchor="_Toc242641276" w:history="1">
+      <w:hyperlink w:anchor="_Toc242656758" w:history="1">
         <w:r>
           <w:rPr>
             <w:rStyle w:val="Hipervnculo"/>
@@ -585,7 +585,7 @@
             <w:noProof/>
             <w:webHidden/>
           </w:rPr>
-          <w:instrText xml:space="preserve"> PAGEREF _Toc242641276 \h </w:instrText>
+          <w:instrText xml:space="preserve"> PAGEREF _Toc242656758 \h </w:instrText>
         </w:r>
         <w:r>
           <w:rPr>
@@ -628,7 +628,7 @@
           <w14:ligatures w14:val="standardContextual"/>
         </w:rPr>
       </w:pPr>
-      <w:hyperlink w:anchor="_Toc242641277" w:history="1">
+      <w:hyperlink w:anchor="_Toc242656759" w:history="1">
         <w:r>
           <w:rPr>
             <w:rStyle w:val="Hipervnculo"/>
@@ -655,7 +655,7 @@
             <w:noProof/>
             <w:webHidden/>
           </w:rPr>
-          <w:instrText xml:space="preserve"> PAGEREF _Toc242641277 \h </w:instrText>
+          <w:instrText xml:space="preserve"> PAGEREF _Toc242656759 \h </w:instrText>
         </w:r>
         <w:r>
           <w:rPr>
@@ -698,7 +698,7 @@
           <w14:ligatures w14:val="standardContextual"/>
         </w:rPr>
       </w:pPr>
-      <w:hyperlink w:anchor="_Toc242641278" w:history="1">
+      <w:hyperlink w:anchor="_Toc242656760" w:history="1">
         <w:r>
           <w:rPr>
             <w:rStyle w:val="Hipervnculo"/>
@@ -725,7 +725,7 @@
             <w:noProof/>
             <w:webHidden/>
           </w:rPr>
-          <w:instrText xml:space="preserve"> PAGEREF _Toc242641278 \h </w:instrText>
+          <w:instrText xml:space="preserve"> PAGEREF _Toc242656760 \h </w:instrText>
         </w:r>
         <w:r>
           <w:rPr>
@@ -768,7 +768,7 @@
           <w14:ligatures w14:val="standardContextual"/>
         </w:rPr>
       </w:pPr>
-      <w:hyperlink w:anchor="_Toc242641279" w:history="1">
+      <w:hyperlink w:anchor="_Toc242656761" w:history="1">
         <w:r>
           <w:rPr>
             <w:rStyle w:val="Hipervnculo"/>
@@ -795,7 +795,7 @@
             <w:noProof/>
             <w:webHidden/>
           </w:rPr>
-          <w:instrText xml:space="preserve"> PAGEREF _Toc242641279 \h </w:instrText>
+          <w:instrText xml:space="preserve"> PAGEREF _Toc242656761 \h </w:instrText>
         </w:r>
         <w:r>
           <w:rPr>
@@ -841,7 +841,7 @@
           <w14:ligatures w14:val="standardContextual"/>
         </w:rPr>
       </w:pPr>
-      <w:hyperlink w:anchor="_Toc242641280" w:history="1">
+      <w:hyperlink w:anchor="_Toc242656762" w:history="1">
         <w:r>
           <w:rPr>
             <w:rStyle w:val="Hipervnculo"/>
@@ -868,7 +868,7 @@
             <w:noProof/>
             <w:webHidden/>
           </w:rPr>
-          <w:instrText xml:space="preserve"> PAGEREF _Toc242641280 \h </w:instrText>
+          <w:instrText xml:space="preserve"> PAGEREF _Toc242656762 \h </w:instrText>
         </w:r>
         <w:r>
           <w:rPr>
@@ -911,7 +911,7 @@
           <w14:ligatures w14:val="standardContextual"/>
         </w:rPr>
       </w:pPr>
-      <w:hyperlink w:anchor="_Toc242641281" w:history="1">
+      <w:hyperlink w:anchor="_Toc242656763" w:history="1">
         <w:r>
           <w:rPr>
             <w:rStyle w:val="Hipervnculo"/>
@@ -938,7 +938,7 @@
             <w:noProof/>
             <w:webHidden/>
           </w:rPr>
-          <w:instrText xml:space="preserve"> PAGEREF _Toc242641281 \h </w:instrText>
+          <w:instrText xml:space="preserve"> PAGEREF _Toc242656763 \h </w:instrText>
         </w:r>
         <w:r>
           <w:rPr>
@@ -981,7 +981,7 @@
           <w14:ligatures w14:val="standardContextual"/>
         </w:rPr>
       </w:pPr>
-      <w:hyperlink w:anchor="_Toc242641282" w:history="1">
+      <w:hyperlink w:anchor="_Toc242656764" w:history="1">
         <w:r>
           <w:rPr>
             <w:rStyle w:val="Hipervnculo"/>
@@ -1008,7 +1008,7 @@
             <w:noProof/>
             <w:webHidden/>
           </w:rPr>
-          <w:instrText xml:space="preserve"> PAGEREF _Toc242641282 \h </w:instrText>
+          <w:instrText xml:space="preserve"> PAGEREF _Toc242656764 \h </w:instrText>
         </w:r>
         <w:r>
           <w:rPr>
@@ -1051,7 +1051,7 @@
           <w14:ligatures w14:val="standardContextual"/>
         </w:rPr>
       </w:pPr>
-      <w:hyperlink w:anchor="_Toc242641283" w:history="1">
+      <w:hyperlink w:anchor="_Toc242656765" w:history="1">
         <w:r>
           <w:rPr>
             <w:rStyle w:val="Hipervnculo"/>
@@ -1078,7 +1078,7 @@
             <w:noProof/>
             <w:webHidden/>
           </w:rPr>
-          <w:instrText xml:space="preserve"> PAGEREF _Toc242641283 \h </w:instrText>
+          <w:instrText xml:space="preserve"> PAGEREF _Toc242656765 \h </w:instrText>
         </w:r>
         <w:r>
           <w:rPr>
@@ -1121,7 +1121,7 @@
           <w14:ligatures w14:val="standardContextual"/>
         </w:rPr>
       </w:pPr>
-      <w:hyperlink w:anchor="_Toc242641284" w:history="1">
+      <w:hyperlink w:anchor="_Toc242656766" w:history="1">
         <w:r>
           <w:rPr>
             <w:rStyle w:val="Hipervnculo"/>
@@ -1148,7 +1148,7 @@
             <w:noProof/>
             <w:webHidden/>
           </w:rPr>
-          <w:instrText xml:space="preserve"> PAGEREF _Toc242641284 \h </w:instrText>
+          <w:instrText xml:space="preserve"> PAGEREF _Toc242656766 \h </w:instrText>
         </w:r>
         <w:r>
           <w:rPr>
@@ -1191,7 +1191,7 @@
           <w14:ligatures w14:val="standardContextual"/>
         </w:rPr>
       </w:pPr>
-      <w:hyperlink w:anchor="_Toc242641285" w:history="1">
+      <w:hyperlink w:anchor="_Toc242656767" w:history="1">
         <w:r>
           <w:rPr>
             <w:rStyle w:val="Hipervnculo"/>
@@ -1218,7 +1218,7 @@
             <w:noProof/>
             <w:webHidden/>
           </w:rPr>
-          <w:instrText xml:space="preserve"> PAGEREF _Toc242641285 \h </w:instrText>
+          <w:instrText xml:space="preserve"> PAGEREF _Toc242656767 \h </w:instrText>
         </w:r>
         <w:r>
           <w:rPr>
@@ -1261,7 +1261,7 @@
           <w14:ligatures w14:val="standardContextual"/>
         </w:rPr>
       </w:pPr>
-      <w:hyperlink w:anchor="_Toc242641286" w:history="1">
+      <w:hyperlink w:anchor="_Toc242656768" w:history="1">
         <w:r>
           <w:rPr>
             <w:rStyle w:val="Hipervnculo"/>
@@ -1288,7 +1288,7 @@
             <w:noProof/>
             <w:webHidden/>
           </w:rPr>
-          <w:instrText xml:space="preserve"> PAGEREF _Toc242641286 \h </w:instrText>
+          <w:instrText xml:space="preserve"> PAGEREF _Toc242656768 \h </w:instrText>
         </w:r>
         <w:r>
           <w:rPr>
@@ -1331,7 +1331,7 @@
           <w14:ligatures w14:val="standardContextual"/>
         </w:rPr>
       </w:pPr>
-      <w:hyperlink w:anchor="_Toc242641287" w:history="1">
+      <w:hyperlink w:anchor="_Toc242656769" w:history="1">
         <w:r>
           <w:rPr>
             <w:rStyle w:val="Hipervnculo"/>
@@ -1358,7 +1358,7 @@
             <w:noProof/>
             <w:webHidden/>
           </w:rPr>
-          <w:instrText xml:space="preserve"> PAGEREF _Toc242641287 \h </w:instrText>
+          <w:instrText xml:space="preserve"> PAGEREF _Toc242656769 \h </w:instrText>
         </w:r>
         <w:r>
           <w:rPr>
@@ -1401,7 +1401,7 @@
           <w14:ligatures w14:val="standardContextual"/>
         </w:rPr>
       </w:pPr>
-      <w:hyperlink w:anchor="_Toc242641288" w:history="1">
+      <w:hyperlink w:anchor="_Toc242656770" w:history="1">
         <w:r>
           <w:rPr>
             <w:rStyle w:val="Hipervnculo"/>
@@ -1428,7 +1428,7 @@
             <w:noProof/>
             <w:webHidden/>
           </w:rPr>
-          <w:instrText xml:space="preserve"> PAGEREF _Toc242641288 \h </w:instrText>
+          <w:instrText xml:space="preserve"> PAGEREF _Toc242656770 \h </w:instrText>
         </w:r>
         <w:r>
           <w:rPr>
@@ -1471,7 +1471,7 @@
           <w14:ligatures w14:val="standardContextual"/>
         </w:rPr>
       </w:pPr>
-      <w:hyperlink w:anchor="_Toc242641289" w:history="1">
+      <w:hyperlink w:anchor="_Toc242656771" w:history="1">
         <w:r>
           <w:rPr>
             <w:rStyle w:val="Hipervnculo"/>
@@ -1498,7 +1498,7 @@
             <w:noProof/>
             <w:webHidden/>
           </w:rPr>
-          <w:instrText xml:space="preserve"> PAGEREF _Toc242641289 \h </w:instrText>
+          <w:instrText xml:space="preserve"> PAGEREF _Toc242656771 \h </w:instrText>
         </w:r>
         <w:r>
           <w:rPr>
@@ -1541,7 +1541,7 @@
           <w14:ligatures w14:val="standardContextual"/>
         </w:rPr>
       </w:pPr>
-      <w:hyperlink w:anchor="_Toc242641290" w:history="1">
+      <w:hyperlink w:anchor="_Toc242656772" w:history="1">
         <w:r>
           <w:rPr>
             <w:rStyle w:val="Hipervnculo"/>
@@ -1568,7 +1568,7 @@
             <w:noProof/>
             <w:webHidden/>
           </w:rPr>
-          <w:instrText xml:space="preserve"> PAGEREF _Toc242641290 \h </w:instrText>
+          <w:instrText xml:space="preserve"> PAGEREF _Toc242656772 \h </w:instrText>
         </w:r>
         <w:r>
           <w:rPr>
@@ -1611,7 +1611,7 @@
           <w14:ligatures w14:val="standardContextual"/>
         </w:rPr>
       </w:pPr>
-      <w:hyperlink w:anchor="_Toc242641291" w:history="1">
+      <w:hyperlink w:anchor="_Toc242656773" w:history="1">
         <w:r>
           <w:rPr>
             <w:rStyle w:val="Hipervnculo"/>
@@ -1638,7 +1638,7 @@
             <w:noProof/>
             <w:webHidden/>
           </w:rPr>
-          <w:instrText xml:space="preserve"> PAGEREF _Toc242641291 \h </w:instrText>
+          <w:instrText xml:space="preserve"> PAGEREF _Toc242656773 \h </w:instrText>
         </w:r>
         <w:r>
           <w:rPr>
@@ -1681,7 +1681,7 @@
           <w14:ligatures w14:val="standardContextual"/>
         </w:rPr>
       </w:pPr>
-      <w:hyperlink w:anchor="_Toc242641292" w:history="1">
+      <w:hyperlink w:anchor="_Toc242656774" w:history="1">
         <w:r>
           <w:rPr>
             <w:rStyle w:val="Hipervnculo"/>
@@ -1708,7 +1708,7 @@
             <w:noProof/>
             <w:webHidden/>
           </w:rPr>
-          <w:instrText xml:space="preserve"> PAGEREF _Toc242641292 \h </w:instrText>
+          <w:instrText xml:space="preserve"> PAGEREF _Toc242656774 \h </w:instrText>
         </w:r>
         <w:r>
           <w:rPr>
@@ -1751,7 +1751,7 @@
           <w14:ligatures w14:val="standardContextual"/>
         </w:rPr>
       </w:pPr>
-      <w:hyperlink w:anchor="_Toc242641293" w:history="1">
+      <w:hyperlink w:anchor="_Toc242656775" w:history="1">
         <w:r>
           <w:rPr>
             <w:rStyle w:val="Hipervnculo"/>
@@ -1778,7 +1778,7 @@
             <w:noProof/>
             <w:webHidden/>
           </w:rPr>
-          <w:instrText xml:space="preserve"> PAGEREF _Toc242641293 \h </w:instrText>
+          <w:instrText xml:space="preserve"> PAGEREF _Toc242656775 \h </w:instrText>
         </w:r>
         <w:r>
           <w:rPr>
@@ -1821,7 +1821,7 @@
           <w14:ligatures w14:val="standardContextual"/>
         </w:rPr>
       </w:pPr>
-      <w:hyperlink w:anchor="_Toc242641294" w:history="1">
+      <w:hyperlink w:anchor="_Toc242656776" w:history="1">
         <w:r>
           <w:rPr>
             <w:rStyle w:val="Hipervnculo"/>
@@ -1848,7 +1848,7 @@
             <w:noProof/>
             <w:webHidden/>
           </w:rPr>
-          <w:instrText xml:space="preserve"> PAGEREF _Toc242641294 \h </w:instrText>
+          <w:instrText xml:space="preserve"> PAGEREF _Toc242656776 \h </w:instrText>
         </w:r>
         <w:r>
           <w:rPr>
@@ -1891,7 +1891,7 @@
           <w14:ligatures w14:val="standardContextual"/>
         </w:rPr>
       </w:pPr>
-      <w:hyperlink w:anchor="_Toc242641295" w:history="1">
+      <w:hyperlink w:anchor="_Toc242656777" w:history="1">
         <w:r>
           <w:rPr>
             <w:rStyle w:val="Hipervnculo"/>
@@ -1918,7 +1918,7 @@
             <w:noProof/>
             <w:webHidden/>
           </w:rPr>
-          <w:instrText xml:space="preserve"> PAGEREF _Toc242641295 \h </w:instrText>
+          <w:instrText xml:space="preserve"> PAGEREF _Toc242656777 \h </w:instrText>
         </w:r>
         <w:r>
           <w:rPr>
@@ -1961,7 +1961,7 @@
           <w14:ligatures w14:val="standardContextual"/>
         </w:rPr>
       </w:pPr>
-      <w:hyperlink w:anchor="_Toc242641296" w:history="1">
+      <w:hyperlink w:anchor="_Toc242656778" w:history="1">
         <w:r>
           <w:rPr>
             <w:rStyle w:val="Hipervnculo"/>
@@ -1988,7 +1988,7 @@
             <w:noProof/>
             <w:webHidden/>
           </w:rPr>
-          <w:instrText xml:space="preserve"> PAGEREF _Toc242641296 \h </w:instrText>
+          <w:instrText xml:space="preserve"> PAGEREF _Toc242656778 \h </w:instrText>
         </w:r>
         <w:r>
           <w:rPr>
@@ -2031,7 +2031,7 @@
           <w14:ligatures w14:val="standardContextual"/>
         </w:rPr>
       </w:pPr>
-      <w:hyperlink w:anchor="_Toc242641297" w:history="1">
+      <w:hyperlink w:anchor="_Toc242656779" w:history="1">
         <w:r>
           <w:rPr>
             <w:rStyle w:val="Hipervnculo"/>
@@ -2058,7 +2058,7 @@
             <w:noProof/>
             <w:webHidden/>
           </w:rPr>
-          <w:instrText xml:space="preserve"> PAGEREF _Toc242641297 \h </w:instrText>
+          <w:instrText xml:space="preserve"> PAGEREF _Toc242656779 \h </w:instrText>
         </w:r>
         <w:r>
           <w:rPr>
@@ -2101,7 +2101,7 @@
           <w14:ligatures w14:val="standardContextual"/>
         </w:rPr>
       </w:pPr>
-      <w:hyperlink w:anchor="_Toc242641298" w:history="1">
+      <w:hyperlink w:anchor="_Toc242656780" w:history="1">
         <w:r>
           <w:rPr>
             <w:rStyle w:val="Hipervnculo"/>
@@ -2128,7 +2128,7 @@
             <w:noProof/>
             <w:webHidden/>
           </w:rPr>
-          <w:instrText xml:space="preserve"> PAGEREF _Toc242641298 \h </w:instrText>
+          <w:instrText xml:space="preserve"> PAGEREF _Toc242656780 \h </w:instrText>
         </w:r>
         <w:r>
           <w:rPr>
@@ -2171,7 +2171,7 @@
           <w14:ligatures w14:val="standardContextual"/>
         </w:rPr>
       </w:pPr>
-      <w:hyperlink w:anchor="_Toc242641299" w:history="1">
+      <w:hyperlink w:anchor="_Toc242656781" w:history="1">
         <w:r>
           <w:rPr>
             <w:rStyle w:val="Hipervnculo"/>
@@ -2198,7 +2198,7 @@
             <w:noProof/>
             <w:webHidden/>
           </w:rPr>
-          <w:instrText xml:space="preserve"> PAGEREF _Toc242641299 \h </w:instrText>
+          <w:instrText xml:space="preserve"> PAGEREF _Toc242656781 \h </w:instrText>
         </w:r>
         <w:r>
           <w:rPr>
@@ -2244,7 +2244,7 @@
           <w14:ligatures w14:val="standardContextual"/>
         </w:rPr>
       </w:pPr>
-      <w:hyperlink w:anchor="_Toc242641300" w:history="1">
+      <w:hyperlink w:anchor="_Toc242656782" w:history="1">
         <w:r>
           <w:rPr>
             <w:rStyle w:val="Hipervnculo"/>
@@ -2271,7 +2271,7 @@
             <w:noProof/>
             <w:webHidden/>
           </w:rPr>
-          <w:instrText xml:space="preserve"> PAGEREF _Toc242641300 \h </w:instrText>
+          <w:instrText xml:space="preserve"> PAGEREF _Toc242656782 \h </w:instrText>
         </w:r>
         <w:r>
           <w:rPr>
@@ -2314,7 +2314,7 @@
           <w14:ligatures w14:val="standardContextual"/>
         </w:rPr>
       </w:pPr>
-      <w:hyperlink w:anchor="_Toc242641301" w:history="1">
+      <w:hyperlink w:anchor="_Toc242656783" w:history="1">
         <w:r>
           <w:rPr>
             <w:rStyle w:val="Hipervnculo"/>
@@ -2341,7 +2341,7 @@
             <w:noProof/>
             <w:webHidden/>
           </w:rPr>
-          <w:instrText xml:space="preserve"> PAGEREF _Toc242641301 \h </w:instrText>
+          <w:instrText xml:space="preserve"> PAGEREF _Toc242656783 \h </w:instrText>
         </w:r>
         <w:r>
           <w:rPr>
@@ -2384,7 +2384,7 @@
           <w14:ligatures w14:val="standardContextual"/>
         </w:rPr>
       </w:pPr>
-      <w:hyperlink w:anchor="_Toc242641302" w:history="1">
+      <w:hyperlink w:anchor="_Toc242656784" w:history="1">
         <w:r>
           <w:rPr>
             <w:rStyle w:val="Hipervnculo"/>
@@ -2411,7 +2411,7 @@
             <w:noProof/>
             <w:webHidden/>
           </w:rPr>
-          <w:instrText xml:space="preserve"> PAGEREF _Toc242641302 \h </w:instrText>
+          <w:instrText xml:space="preserve"> PAGEREF _Toc242656784 \h </w:instrText>
         </w:r>
         <w:r>
           <w:rPr>
@@ -2454,7 +2454,7 @@
           <w14:ligatures w14:val="standardContextual"/>
         </w:rPr>
       </w:pPr>
-      <w:hyperlink w:anchor="_Toc242641303" w:history="1">
+      <w:hyperlink w:anchor="_Toc242656785" w:history="1">
         <w:r>
           <w:rPr>
             <w:rStyle w:val="Hipervnculo"/>
@@ -2481,7 +2481,7 @@
             <w:noProof/>
             <w:webHidden/>
           </w:rPr>
-          <w:instrText xml:space="preserve"> PAGEREF _Toc242641303 \h </w:instrText>
+          <w:instrText xml:space="preserve"> PAGEREF _Toc242656785 \h </w:instrText>
         </w:r>
         <w:r>
           <w:rPr>
@@ -2524,7 +2524,7 @@
           <w14:ligatures w14:val="standardContextual"/>
         </w:rPr>
       </w:pPr>
-      <w:hyperlink w:anchor="_Toc242641304" w:history="1">
+      <w:hyperlink w:anchor="_Toc242656786" w:history="1">
         <w:r>
           <w:rPr>
             <w:rStyle w:val="Hipervnculo"/>
@@ -2551,7 +2551,7 @@
             <w:noProof/>
             <w:webHidden/>
           </w:rPr>
-          <w:instrText xml:space="preserve"> PAGEREF _Toc242641304 \h </w:instrText>
+          <w:instrText xml:space="preserve"> PAGEREF _Toc242656786 \h </w:instrText>
         </w:r>
         <w:r>
           <w:rPr>
@@ -2594,7 +2594,7 @@
           <w14:ligatures w14:val="standardContextual"/>
         </w:rPr>
       </w:pPr>
-      <w:hyperlink w:anchor="_Toc242641305" w:history="1">
+      <w:hyperlink w:anchor="_Toc242656787" w:history="1">
         <w:r>
           <w:rPr>
             <w:rStyle w:val="Hipervnculo"/>
@@ -2621,7 +2621,7 @@
             <w:noProof/>
             <w:webHidden/>
           </w:rPr>
-          <w:instrText xml:space="preserve"> PAGEREF _Toc242641305 \h </w:instrText>
+          <w:instrText xml:space="preserve"> PAGEREF _Toc242656787 \h </w:instrText>
         </w:r>
         <w:r>
           <w:rPr>
@@ -2667,7 +2667,7 @@
           <w14:ligatures w14:val="standardContextual"/>
         </w:rPr>
       </w:pPr>
-      <w:hyperlink w:anchor="_Toc242641306" w:history="1">
+      <w:hyperlink w:anchor="_Toc242656788" w:history="1">
         <w:r>
           <w:rPr>
             <w:rStyle w:val="Hipervnculo"/>
@@ -2694,7 +2694,7 @@
             <w:noProof/>
             <w:webHidden/>
           </w:rPr>
-          <w:instrText xml:space="preserve"> PAGEREF _Toc242641306 \h </w:instrText>
+          <w:instrText xml:space="preserve"> PAGEREF _Toc242656788 \h </w:instrText>
         </w:r>
         <w:r>
           <w:rPr>
@@ -2737,7 +2737,7 @@
           <w14:ligatures w14:val="standardContextual"/>
         </w:rPr>
       </w:pPr>
-      <w:hyperlink w:anchor="_Toc242641307" w:history="1">
+      <w:hyperlink w:anchor="_Toc242656789" w:history="1">
         <w:r>
           <w:rPr>
             <w:rStyle w:val="Hipervnculo"/>
@@ -2764,7 +2764,7 @@
             <w:noProof/>
             <w:webHidden/>
           </w:rPr>
-          <w:instrText xml:space="preserve"> PAGEREF _Toc242641307 \h </w:instrText>
+          <w:instrText xml:space="preserve"> PAGEREF _Toc242656789 \h </w:instrText>
         </w:r>
         <w:r>
           <w:rPr>
@@ -2807,7 +2807,7 @@
           <w14:ligatures w14:val="standardContextual"/>
         </w:rPr>
       </w:pPr>
-      <w:hyperlink w:anchor="_Toc242641308" w:history="1">
+      <w:hyperlink w:anchor="_Toc242656790" w:history="1">
         <w:r>
           <w:rPr>
             <w:rStyle w:val="Hipervnculo"/>
@@ -2834,7 +2834,7 @@
             <w:noProof/>
             <w:webHidden/>
           </w:rPr>
-          <w:instrText xml:space="preserve"> PAGEREF _Toc242641308 \h </w:instrText>
+          <w:instrText xml:space="preserve"> PAGEREF _Toc242656790 \h </w:instrText>
         </w:r>
         <w:r>
           <w:rPr>
@@ -2877,7 +2877,7 @@
           <w14:ligatures w14:val="standardContextual"/>
         </w:rPr>
       </w:pPr>
-      <w:hyperlink w:anchor="_Toc242641309" w:history="1">
+      <w:hyperlink w:anchor="_Toc242656791" w:history="1">
         <w:r>
           <w:rPr>
             <w:rStyle w:val="Hipervnculo"/>
@@ -2904,7 +2904,7 @@
             <w:noProof/>
             <w:webHidden/>
           </w:rPr>
-          <w:instrText xml:space="preserve"> PAGEREF _Toc242641309 \h </w:instrText>
+          <w:instrText xml:space="preserve"> PAGEREF _Toc242656791 \h </w:instrText>
         </w:r>
         <w:r>
           <w:rPr>
@@ -2947,7 +2947,7 @@
           <w14:ligatures w14:val="standardContextual"/>
         </w:rPr>
       </w:pPr>
-      <w:hyperlink w:anchor="_Toc242641310" w:history="1">
+      <w:hyperlink w:anchor="_Toc242656792" w:history="1">
         <w:r>
           <w:rPr>
             <w:rStyle w:val="Hipervnculo"/>
@@ -2974,7 +2974,7 @@
             <w:noProof/>
             <w:webHidden/>
           </w:rPr>
-          <w:instrText xml:space="preserve"> PAGEREF _Toc242641310 \h </w:instrText>
+          <w:instrText xml:space="preserve"> PAGEREF _Toc242656792 \h </w:instrText>
         </w:r>
         <w:r>
           <w:rPr>
@@ -3017,7 +3017,7 @@
           <w14:ligatures w14:val="standardContextual"/>
         </w:rPr>
       </w:pPr>
-      <w:hyperlink w:anchor="_Toc242641311" w:history="1">
+      <w:hyperlink w:anchor="_Toc242656793" w:history="1">
         <w:r>
           <w:rPr>
             <w:rStyle w:val="Hipervnculo"/>
@@ -3044,7 +3044,7 @@
             <w:noProof/>
             <w:webHidden/>
           </w:rPr>
-          <w:instrText xml:space="preserve"> PAGEREF _Toc242641311 \h </w:instrText>
+          <w:instrText xml:space="preserve"> PAGEREF _Toc242656793 \h </w:instrText>
         </w:r>
         <w:r>
           <w:rPr>
@@ -3087,7 +3087,7 @@
           <w14:ligatures w14:val="standardContextual"/>
         </w:rPr>
       </w:pPr>
-      <w:hyperlink w:anchor="_Toc242641312" w:history="1">
+      <w:hyperlink w:anchor="_Toc242656794" w:history="1">
         <w:r>
           <w:rPr>
             <w:rStyle w:val="Hipervnculo"/>
@@ -3114,7 +3114,7 @@
             <w:noProof/>
             <w:webHidden/>
           </w:rPr>
-          <w:instrText xml:space="preserve"> PAGEREF _Toc242641312 \h </w:instrText>
+          <w:instrText xml:space="preserve"> PAGEREF _Toc242656794 \h </w:instrText>
         </w:r>
         <w:r>
           <w:rPr>
@@ -3157,7 +3157,7 @@
           <w14:ligatures w14:val="standardContextual"/>
         </w:rPr>
       </w:pPr>
-      <w:hyperlink w:anchor="_Toc242641313" w:history="1">
+      <w:hyperlink w:anchor="_Toc242656795" w:history="1">
         <w:r>
           <w:rPr>
             <w:rStyle w:val="Hipervnculo"/>
@@ -3184,7 +3184,7 @@
             <w:noProof/>
             <w:webHidden/>
           </w:rPr>
-          <w:instrText xml:space="preserve"> PAGEREF _Toc242641313 \h </w:instrText>
+          <w:instrText xml:space="preserve"> PAGEREF _Toc242656795 \h </w:instrText>
         </w:r>
         <w:r>
           <w:rPr>
@@ -3227,7 +3227,7 @@
           <w14:ligatures w14:val="standardContextual"/>
         </w:rPr>
       </w:pPr>
-      <w:hyperlink w:anchor="_Toc242641314" w:history="1">
+      <w:hyperlink w:anchor="_Toc242656796" w:history="1">
         <w:r>
           <w:rPr>
             <w:rStyle w:val="Hipervnculo"/>
@@ -3254,7 +3254,7 @@
             <w:noProof/>
             <w:webHidden/>
           </w:rPr>
-          <w:instrText xml:space="preserve"> PAGEREF _Toc242641314 \h </w:instrText>
+          <w:instrText xml:space="preserve"> PAGEREF _Toc242656796 \h </w:instrText>
         </w:r>
         <w:r>
           <w:rPr>
@@ -3297,7 +3297,7 @@
           <w14:ligatures w14:val="standardContextual"/>
         </w:rPr>
       </w:pPr>
-      <w:hyperlink w:anchor="_Toc242641315" w:history="1">
+      <w:hyperlink w:anchor="_Toc242656797" w:history="1">
         <w:r>
           <w:rPr>
             <w:rStyle w:val="Hipervnculo"/>
@@ -3324,7 +3324,7 @@
             <w:noProof/>
             <w:webHidden/>
           </w:rPr>
-          <w:instrText xml:space="preserve"> PAGEREF _Toc242641315 \h </w:instrText>
+          <w:instrText xml:space="preserve"> PAGEREF _Toc242656797 \h </w:instrText>
         </w:r>
         <w:r>
           <w:rPr>
@@ -3367,7 +3367,7 @@
           <w14:ligatures w14:val="standardContextual"/>
         </w:rPr>
       </w:pPr>
-      <w:hyperlink w:anchor="_Toc242641316" w:history="1">
+      <w:hyperlink w:anchor="_Toc242656798" w:history="1">
         <w:r>
           <w:rPr>
             <w:rStyle w:val="Hipervnculo"/>
@@ -3394,7 +3394,7 @@
             <w:noProof/>
             <w:webHidden/>
           </w:rPr>
-          <w:instrText xml:space="preserve"> PAGEREF _Toc242641316 \h </w:instrText>
+          <w:instrText xml:space="preserve"> PAGEREF _Toc242656798 \h </w:instrText>
         </w:r>
         <w:r>
           <w:rPr>
@@ -3437,7 +3437,7 @@
           <w14:ligatures w14:val="standardContextual"/>
         </w:rPr>
       </w:pPr>
-      <w:hyperlink w:anchor="_Toc242641317" w:history="1">
+      <w:hyperlink w:anchor="_Toc242656799" w:history="1">
         <w:r>
           <w:rPr>
             <w:rStyle w:val="Hipervnculo"/>
@@ -3464,7 +3464,7 @@
             <w:noProof/>
             <w:webHidden/>
           </w:rPr>
-          <w:instrText xml:space="preserve"> PAGEREF _Toc242641317 \h </w:instrText>
+          <w:instrText xml:space="preserve"> PAGEREF _Toc242656799 \h </w:instrText>
         </w:r>
         <w:r>
           <w:rPr>
@@ -3510,7 +3510,7 @@
           <w14:ligatures w14:val="standardContextual"/>
         </w:rPr>
       </w:pPr>
-      <w:hyperlink w:anchor="_Toc242641318" w:history="1">
+      <w:hyperlink w:anchor="_Toc242656800" w:history="1">
         <w:r>
           <w:rPr>
             <w:rStyle w:val="Hipervnculo"/>
@@ -3537,7 +3537,7 @@
             <w:noProof/>
             <w:webHidden/>
           </w:rPr>
-          <w:instrText xml:space="preserve"> PAGEREF _Toc242641318 \h </w:instrText>
+          <w:instrText xml:space="preserve"> PAGEREF _Toc242656800 \h </w:instrText>
         </w:r>
         <w:r>
           <w:rPr>
@@ -3580,7 +3580,7 @@
           <w14:ligatures w14:val="standardContextual"/>
         </w:rPr>
       </w:pPr>
-      <w:hyperlink w:anchor="_Toc242641319" w:history="1">
+      <w:hyperlink w:anchor="_Toc242656801" w:history="1">
         <w:r>
           <w:rPr>
             <w:rStyle w:val="Hipervnculo"/>
@@ -3607,7 +3607,7 @@
             <w:noProof/>
             <w:webHidden/>
           </w:rPr>
-          <w:instrText xml:space="preserve"> PAGEREF _Toc242641319 \h </w:instrText>
+          <w:instrText xml:space="preserve"> PAGEREF _Toc242656801 \h </w:instrText>
         </w:r>
         <w:r>
           <w:rPr>
@@ -3650,7 +3650,7 @@
           <w14:ligatures w14:val="standardContextual"/>
         </w:rPr>
       </w:pPr>
-      <w:hyperlink w:anchor="_Toc242641320" w:history="1">
+      <w:hyperlink w:anchor="_Toc242656802" w:history="1">
         <w:r>
           <w:rPr>
             <w:rStyle w:val="Hipervnculo"/>
@@ -3677,7 +3677,7 @@
             <w:noProof/>
             <w:webHidden/>
           </w:rPr>
-          <w:instrText xml:space="preserve"> PAGEREF _Toc242641320 \h </w:instrText>
+          <w:instrText xml:space="preserve"> PAGEREF _Toc242656802 \h </w:instrText>
         </w:r>
         <w:r>
           <w:rPr>
@@ -3720,7 +3720,7 @@
           <w14:ligatures w14:val="standardContextual"/>
         </w:rPr>
       </w:pPr>
-      <w:hyperlink w:anchor="_Toc242641321" w:history="1">
+      <w:hyperlink w:anchor="_Toc242656803" w:history="1">
         <w:r>
           <w:rPr>
             <w:rStyle w:val="Hipervnculo"/>
@@ -3747,7 +3747,7 @@
             <w:noProof/>
             <w:webHidden/>
           </w:rPr>
-          <w:instrText xml:space="preserve"> PAGEREF _Toc242641321 \h </w:instrText>
+          <w:instrText xml:space="preserve"> PAGEREF _Toc242656803 \h </w:instrText>
         </w:r>
         <w:r>
           <w:rPr>
@@ -3790,7 +3790,7 @@
           <w14:ligatures w14:val="standardContextual"/>
         </w:rPr>
       </w:pPr>
-      <w:hyperlink w:anchor="_Toc242641322" w:history="1">
+      <w:hyperlink w:anchor="_Toc242656804" w:history="1">
         <w:r>
           <w:rPr>
             <w:rStyle w:val="Hipervnculo"/>
@@ -3817,7 +3817,7 @@
             <w:noProof/>
             <w:webHidden/>
           </w:rPr>
-          <w:instrText xml:space="preserve"> PAGEREF _Toc242641322 \h </w:instrText>
+          <w:instrText xml:space="preserve"> PAGEREF _Toc242656804 \h </w:instrText>
         </w:r>
         <w:r>
           <w:rPr>
@@ -3860,7 +3860,7 @@
           <w14:ligatures w14:val="standardContextual"/>
         </w:rPr>
       </w:pPr>
-      <w:hyperlink w:anchor="_Toc242641323" w:history="1">
+      <w:hyperlink w:anchor="_Toc242656805" w:history="1">
         <w:r>
           <w:rPr>
             <w:rStyle w:val="Hipervnculo"/>
@@ -3887,7 +3887,7 @@
             <w:noProof/>
             <w:webHidden/>
           </w:rPr>
-          <w:instrText xml:space="preserve"> PAGEREF _Toc242641323 \h </w:instrText>
+          <w:instrText xml:space="preserve"> PAGEREF _Toc242656805 \h </w:instrText>
         </w:r>
         <w:r>
           <w:rPr>
@@ -3930,7 +3930,7 @@
           <w14:ligatures w14:val="standardContextual"/>
         </w:rPr>
       </w:pPr>
-      <w:hyperlink w:anchor="_Toc242641324" w:history="1">
+      <w:hyperlink w:anchor="_Toc242656806" w:history="1">
         <w:r>
           <w:rPr>
             <w:rStyle w:val="Hipervnculo"/>
@@ -3957,7 +3957,7 @@
             <w:noProof/>
             <w:webHidden/>
           </w:rPr>
-          <w:instrText xml:space="preserve"> PAGEREF _Toc242641324 \h </w:instrText>
+          <w:instrText xml:space="preserve"> PAGEREF _Toc242656806 \h </w:instrText>
         </w:r>
         <w:r>
           <w:rPr>
@@ -4003,7 +4003,7 @@
           <w14:ligatures w14:val="standardContextual"/>
         </w:rPr>
       </w:pPr>
-      <w:hyperlink w:anchor="_Toc242641325" w:history="1">
+      <w:hyperlink w:anchor="_Toc242656807" w:history="1">
         <w:r>
           <w:rPr>
             <w:rStyle w:val="Hipervnculo"/>
@@ -4030,7 +4030,7 @@
             <w:noProof/>
             <w:webHidden/>
           </w:rPr>
-          <w:instrText xml:space="preserve"> PAGEREF _Toc242641325 \h </w:instrText>
+          <w:instrText xml:space="preserve"> PAGEREF _Toc242656807 \h </w:instrText>
         </w:r>
         <w:r>
           <w:rPr>
@@ -4073,7 +4073,7 @@
           <w14:ligatures w14:val="standardContextual"/>
         </w:rPr>
       </w:pPr>
-      <w:hyperlink w:anchor="_Toc242641326" w:history="1">
+      <w:hyperlink w:anchor="_Toc242656808" w:history="1">
         <w:r>
           <w:rPr>
             <w:rStyle w:val="Hipervnculo"/>
@@ -4100,7 +4100,7 @@
             <w:noProof/>
             <w:webHidden/>
           </w:rPr>
-          <w:instrText xml:space="preserve"> PAGEREF _Toc242641326 \h </w:instrText>
+          <w:instrText xml:space="preserve"> PAGEREF _Toc242656808 \h </w:instrText>
         </w:r>
         <w:r>
           <w:rPr>
@@ -4143,7 +4143,7 @@
           <w14:ligatures w14:val="standardContextual"/>
         </w:rPr>
       </w:pPr>
-      <w:hyperlink w:anchor="_Toc242641327" w:history="1">
+      <w:hyperlink w:anchor="_Toc242656809" w:history="1">
         <w:r>
           <w:rPr>
             <w:rStyle w:val="Hipervnculo"/>
@@ -4170,7 +4170,7 @@
             <w:noProof/>
             <w:webHidden/>
           </w:rPr>
-          <w:instrText xml:space="preserve"> PAGEREF _Toc242641327 \h </w:instrText>
+          <w:instrText xml:space="preserve"> PAGEREF _Toc242656809 \h </w:instrText>
         </w:r>
         <w:r>
           <w:rPr>
@@ -4213,7 +4213,7 @@
           <w14:ligatures w14:val="standardContextual"/>
         </w:rPr>
       </w:pPr>
-      <w:hyperlink w:anchor="_Toc242641328" w:history="1">
+      <w:hyperlink w:anchor="_Toc242656810" w:history="1">
         <w:r>
           <w:rPr>
             <w:rStyle w:val="Hipervnculo"/>
@@ -4240,7 +4240,7 @@
             <w:noProof/>
             <w:webHidden/>
           </w:rPr>
-          <w:instrText xml:space="preserve"> PAGEREF _Toc242641328 \h </w:instrText>
+          <w:instrText xml:space="preserve"> PAGEREF _Toc242656810 \h </w:instrText>
         </w:r>
         <w:r>
           <w:rPr>
@@ -4283,7 +4283,7 @@
           <w14:ligatures w14:val="standardContextual"/>
         </w:rPr>
       </w:pPr>
-      <w:hyperlink w:anchor="_Toc242641329" w:history="1">
+      <w:hyperlink w:anchor="_Toc242656811" w:history="1">
         <w:r>
           <w:rPr>
             <w:rStyle w:val="Hipervnculo"/>
@@ -4310,7 +4310,7 @@
             <w:noProof/>
             <w:webHidden/>
           </w:rPr>
-          <w:instrText xml:space="preserve"> PAGEREF _Toc242641329 \h </w:instrText>
+          <w:instrText xml:space="preserve"> PAGEREF _Toc242656811 \h </w:instrText>
         </w:r>
         <w:r>
           <w:rPr>
@@ -4353,7 +4353,7 @@
           <w14:ligatures w14:val="standardContextual"/>
         </w:rPr>
       </w:pPr>
-      <w:hyperlink w:anchor="_Toc242641330" w:history="1">
+      <w:hyperlink w:anchor="_Toc242656812" w:history="1">
         <w:r>
           <w:rPr>
             <w:rStyle w:val="Hipervnculo"/>
@@ -4380,7 +4380,7 @@
             <w:noProof/>
             <w:webHidden/>
           </w:rPr>
-          <w:instrText xml:space="preserve"> PAGEREF _Toc242641330 \h </w:instrText>
+          <w:instrText xml:space="preserve"> PAGEREF _Toc242656812 \h </w:instrText>
         </w:r>
         <w:r>
           <w:rPr>
@@ -4423,7 +4423,7 @@
           <w14:ligatures w14:val="standardContextual"/>
         </w:rPr>
       </w:pPr>
-      <w:hyperlink w:anchor="_Toc242641331" w:history="1">
+      <w:hyperlink w:anchor="_Toc242656813" w:history="1">
         <w:r>
           <w:rPr>
             <w:rStyle w:val="Hipervnculo"/>
@@ -4450,7 +4450,7 @@
             <w:noProof/>
             <w:webHidden/>
           </w:rPr>
-          <w:instrText xml:space="preserve"> PAGEREF _Toc242641331 \h </w:instrText>
+          <w:instrText xml:space="preserve"> PAGEREF _Toc242656813 \h </w:instrText>
         </w:r>
         <w:r>
           <w:rPr>
@@ -4493,7 +4493,7 @@
           <w14:ligatures w14:val="standardContextual"/>
         </w:rPr>
       </w:pPr>
-      <w:hyperlink w:anchor="_Toc242641332" w:history="1">
+      <w:hyperlink w:anchor="_Toc242656814" w:history="1">
         <w:r>
           <w:rPr>
             <w:rStyle w:val="Hipervnculo"/>
@@ -4520,7 +4520,7 @@
             <w:noProof/>
             <w:webHidden/>
           </w:rPr>
-          <w:instrText xml:space="preserve"> PAGEREF _Toc242641332 \h </w:instrText>
+          <w:instrText xml:space="preserve"> PAGEREF _Toc242656814 \h </w:instrText>
         </w:r>
         <w:r>
           <w:rPr>
@@ -4563,7 +4563,7 @@
           <w14:ligatures w14:val="standardContextual"/>
         </w:rPr>
       </w:pPr>
-      <w:hyperlink w:anchor="_Toc242641333" w:history="1">
+      <w:hyperlink w:anchor="_Toc242656815" w:history="1">
         <w:r>
           <w:rPr>
             <w:rStyle w:val="Hipervnculo"/>
@@ -4590,7 +4590,7 @@
             <w:noProof/>
             <w:webHidden/>
           </w:rPr>
-          <w:instrText xml:space="preserve"> PAGEREF _Toc242641333 \h </w:instrText>
+          <w:instrText xml:space="preserve"> PAGEREF _Toc242656815 \h </w:instrText>
         </w:r>
         <w:r>
           <w:rPr>
@@ -4633,7 +4633,7 @@
           <w14:ligatures w14:val="standardContextual"/>
         </w:rPr>
       </w:pPr>
-      <w:hyperlink w:anchor="_Toc242641334" w:history="1">
+      <w:hyperlink w:anchor="_Toc242656816" w:history="1">
         <w:r>
           <w:rPr>
             <w:rStyle w:val="Hipervnculo"/>
@@ -4660,7 +4660,7 @@
             <w:noProof/>
             <w:webHidden/>
           </w:rPr>
-          <w:instrText xml:space="preserve"> PAGEREF _Toc242641334 \h </w:instrText>
+          <w:instrText xml:space="preserve"> PAGEREF _Toc242656816 \h </w:instrText>
         </w:r>
         <w:r>
           <w:rPr>
@@ -4703,7 +4703,7 @@
           <w14:ligatures w14:val="standardContextual"/>
         </w:rPr>
       </w:pPr>
-      <w:hyperlink w:anchor="_Toc242641335" w:history="1">
+      <w:hyperlink w:anchor="_Toc242656817" w:history="1">
         <w:r>
           <w:rPr>
             <w:rStyle w:val="Hipervnculo"/>
@@ -4730,7 +4730,7 @@
             <w:noProof/>
             <w:webHidden/>
           </w:rPr>
-          <w:instrText xml:space="preserve"> PAGEREF _Toc242641335 \h </w:instrText>
+          <w:instrText xml:space="preserve"> PAGEREF _Toc242656817 \h </w:instrText>
         </w:r>
         <w:r>
           <w:rPr>
@@ -4773,7 +4773,7 @@
           <w14:ligatures w14:val="standardContextual"/>
         </w:rPr>
       </w:pPr>
-      <w:hyperlink w:anchor="_Toc242641336" w:history="1">
+      <w:hyperlink w:anchor="_Toc242656818" w:history="1">
         <w:r>
           <w:rPr>
             <w:rStyle w:val="Hipervnculo"/>
@@ -4800,7 +4800,7 @@
             <w:noProof/>
             <w:webHidden/>
           </w:rPr>
-          <w:instrText xml:space="preserve"> PAGEREF _Toc242641336 \h </w:instrText>
+          <w:instrText xml:space="preserve"> PAGEREF _Toc242656818 \h </w:instrText>
         </w:r>
         <w:r>
           <w:rPr>
@@ -4843,7 +4843,7 @@
           <w14:ligatures w14:val="standardContextual"/>
         </w:rPr>
       </w:pPr>
-      <w:hyperlink w:anchor="_Toc242641337" w:history="1">
+      <w:hyperlink w:anchor="_Toc242656819" w:history="1">
         <w:r>
           <w:rPr>
             <w:rStyle w:val="Hipervnculo"/>
@@ -4870,7 +4870,7 @@
             <w:noProof/>
             <w:webHidden/>
           </w:rPr>
-          <w:instrText xml:space="preserve"> PAGEREF _Toc242641337 \h </w:instrText>
+          <w:instrText xml:space="preserve"> PAGEREF _Toc242656819 \h </w:instrText>
         </w:r>
         <w:r>
           <w:rPr>
@@ -4913,7 +4913,7 @@
           <w14:ligatures w14:val="standardContextual"/>
         </w:rPr>
       </w:pPr>
-      <w:hyperlink w:anchor="_Toc242641338" w:history="1">
+      <w:hyperlink w:anchor="_Toc242656820" w:history="1">
         <w:r>
           <w:rPr>
             <w:rStyle w:val="Hipervnculo"/>
@@ -4940,7 +4940,7 @@
             <w:noProof/>
             <w:webHidden/>
           </w:rPr>
-          <w:instrText xml:space="preserve"> PAGEREF _Toc242641338 \h </w:instrText>
+          <w:instrText xml:space="preserve"> PAGEREF _Toc242656820 \h </w:instrText>
         </w:r>
         <w:r>
           <w:rPr>
@@ -4983,7 +4983,7 @@
           <w14:ligatures w14:val="standardContextual"/>
         </w:rPr>
       </w:pPr>
-      <w:hyperlink w:anchor="_Toc242641339" w:history="1">
+      <w:hyperlink w:anchor="_Toc242656821" w:history="1">
         <w:r>
           <w:rPr>
             <w:rStyle w:val="Hipervnculo"/>
@@ -5010,7 +5010,7 @@
             <w:noProof/>
             <w:webHidden/>
           </w:rPr>
-          <w:instrText xml:space="preserve"> PAGEREF _Toc242641339 \h </w:instrText>
+          <w:instrText xml:space="preserve"> PAGEREF _Toc242656821 \h </w:instrText>
         </w:r>
         <w:r>
           <w:rPr>
@@ -5053,7 +5053,7 @@
           <w14:ligatures w14:val="standardContextual"/>
         </w:rPr>
       </w:pPr>
-      <w:hyperlink w:anchor="_Toc242641340" w:history="1">
+      <w:hyperlink w:anchor="_Toc242656822" w:history="1">
         <w:r>
           <w:rPr>
             <w:rStyle w:val="Hipervnculo"/>
@@ -5080,7 +5080,7 @@
             <w:noProof/>
             <w:webHidden/>
           </w:rPr>
-          <w:instrText xml:space="preserve"> PAGEREF _Toc242641340 \h </w:instrText>
+          <w:instrText xml:space="preserve"> PAGEREF _Toc242656822 \h </w:instrText>
         </w:r>
         <w:r>
           <w:rPr>
@@ -5123,7 +5123,7 @@
           <w14:ligatures w14:val="standardContextual"/>
         </w:rPr>
       </w:pPr>
-      <w:hyperlink w:anchor="_Toc242641341" w:history="1">
+      <w:hyperlink w:anchor="_Toc242656823" w:history="1">
         <w:r>
           <w:rPr>
             <w:rStyle w:val="Hipervnculo"/>
@@ -5150,7 +5150,7 @@
             <w:noProof/>
             <w:webHidden/>
           </w:rPr>
-          <w:instrText xml:space="preserve"> PAGEREF _Toc242641341 \h </w:instrText>
+          <w:instrText xml:space="preserve"> PAGEREF _Toc242656823 \h </w:instrText>
         </w:r>
         <w:r>
           <w:rPr>
@@ -5193,7 +5193,7 @@
           <w14:ligatures w14:val="standardContextual"/>
         </w:rPr>
       </w:pPr>
-      <w:hyperlink w:anchor="_Toc242641342" w:history="1">
+      <w:hyperlink w:anchor="_Toc242656824" w:history="1">
         <w:r>
           <w:rPr>
             <w:rStyle w:val="Hipervnculo"/>
@@ -5220,7 +5220,7 @@
             <w:noProof/>
             <w:webHidden/>
           </w:rPr>
-          <w:instrText xml:space="preserve"> PAGEREF _Toc242641342 \h </w:instrText>
+          <w:instrText xml:space="preserve"> PAGEREF _Toc242656824 \h </w:instrText>
         </w:r>
         <w:r>
           <w:rPr>
@@ -5263,7 +5263,7 @@
           <w14:ligatures w14:val="standardContextual"/>
         </w:rPr>
       </w:pPr>
-      <w:hyperlink w:anchor="_Toc242641343" w:history="1">
+      <w:hyperlink w:anchor="_Toc242656825" w:history="1">
         <w:r>
           <w:rPr>
             <w:rStyle w:val="Hipervnculo"/>
@@ -5290,7 +5290,7 @@
             <w:noProof/>
             <w:webHidden/>
           </w:rPr>
-          <w:instrText xml:space="preserve"> PAGEREF _Toc242641343 \h </w:instrText>
+          <w:instrText xml:space="preserve"> PAGEREF _Toc242656825 \h </w:instrText>
         </w:r>
         <w:r>
           <w:rPr>
@@ -5333,7 +5333,7 @@
           <w14:ligatures w14:val="standardContextual"/>
         </w:rPr>
       </w:pPr>
-      <w:hyperlink w:anchor="_Toc242641344" w:history="1">
+      <w:hyperlink w:anchor="_Toc242656826" w:history="1">
         <w:r>
           <w:rPr>
             <w:rStyle w:val="Hipervnculo"/>
@@ -5360,7 +5360,7 @@
             <w:noProof/>
             <w:webHidden/>
           </w:rPr>
-          <w:instrText xml:space="preserve"> PAGEREF _Toc242641344 \h </w:instrText>
+          <w:instrText xml:space="preserve"> PAGEREF _Toc242656826 \h </w:instrText>
         </w:r>
         <w:r>
           <w:rPr>
@@ -5406,7 +5406,7 @@
           <w14:ligatures w14:val="standardContextual"/>
         </w:rPr>
       </w:pPr>
-      <w:hyperlink w:anchor="_Toc242641345" w:history="1">
+      <w:hyperlink w:anchor="_Toc242656827" w:history="1">
         <w:r>
           <w:rPr>
             <w:rStyle w:val="Hipervnculo"/>
@@ -5433,7 +5433,7 @@
             <w:noProof/>
             <w:webHidden/>
           </w:rPr>
-          <w:instrText xml:space="preserve"> PAGEREF _Toc242641345 \h </w:instrText>
+          <w:instrText xml:space="preserve"> PAGEREF _Toc242656827 \h </w:instrText>
         </w:r>
         <w:r>
           <w:rPr>
@@ -5476,7 +5476,7 @@
           <w14:ligatures w14:val="standardContextual"/>
         </w:rPr>
       </w:pPr>
-      <w:hyperlink w:anchor="_Toc242641346" w:history="1">
+      <w:hyperlink w:anchor="_Toc242656828" w:history="1">
         <w:r>
           <w:rPr>
             <w:rStyle w:val="Hipervnculo"/>
@@ -5503,7 +5503,7 @@
             <w:noProof/>
             <w:webHidden/>
           </w:rPr>
-          <w:instrText xml:space="preserve"> PAGEREF _Toc242641346 \h </w:instrText>
+          <w:instrText xml:space="preserve"> PAGEREF _Toc242656828 \h </w:instrText>
         </w:r>
         <w:r>
           <w:rPr>
@@ -5546,7 +5546,7 @@
           <w14:ligatures w14:val="standardContextual"/>
         </w:rPr>
       </w:pPr>
-      <w:hyperlink w:anchor="_Toc242641347" w:history="1">
+      <w:hyperlink w:anchor="_Toc242656829" w:history="1">
         <w:r>
           <w:rPr>
             <w:rStyle w:val="Hipervnculo"/>
@@ -5573,7 +5573,7 @@
             <w:noProof/>
             <w:webHidden/>
           </w:rPr>
-          <w:instrText xml:space="preserve"> PAGEREF _Toc242641347 \h </w:instrText>
+          <w:instrText xml:space="preserve"> PAGEREF _Toc242656829 \h </w:instrText>
         </w:r>
         <w:r>
           <w:rPr>
@@ -5616,7 +5616,7 @@
           <w14:ligatures w14:val="standardContextual"/>
         </w:rPr>
       </w:pPr>
-      <w:hyperlink w:anchor="_Toc242641348" w:history="1">
+      <w:hyperlink w:anchor="_Toc242656830" w:history="1">
         <w:r>
           <w:rPr>
             <w:rStyle w:val="Hipervnculo"/>
@@ -5643,7 +5643,7 @@
             <w:noProof/>
             <w:webHidden/>
           </w:rPr>
-          <w:instrText xml:space="preserve"> PAGEREF _Toc242641348 \h </w:instrText>
+          <w:instrText xml:space="preserve"> PAGEREF _Toc242656830 \h </w:instrText>
         </w:r>
         <w:r>
           <w:rPr>
@@ -5686,7 +5686,7 @@
           <w14:ligatures w14:val="standardContextual"/>
         </w:rPr>
       </w:pPr>
-      <w:hyperlink w:anchor="_Toc242641349" w:history="1">
+      <w:hyperlink w:anchor="_Toc242656831" w:history="1">
         <w:r>
           <w:rPr>
             <w:rStyle w:val="Hipervnculo"/>
@@ -5713,7 +5713,7 @@
             <w:noProof/>
             <w:webHidden/>
           </w:rPr>
-          <w:instrText xml:space="preserve"> PAGEREF _Toc242641349 \h </w:instrText>
+          <w:instrText xml:space="preserve"> PAGEREF _Toc242656831 \h </w:instrText>
         </w:r>
         <w:r>
           <w:rPr>
@@ -5756,7 +5756,7 @@
           <w14:ligatures w14:val="standardContextual"/>
         </w:rPr>
       </w:pPr>
-      <w:hyperlink w:anchor="_Toc242641350" w:history="1">
+      <w:hyperlink w:anchor="_Toc242656832" w:history="1">
         <w:r>
           <w:rPr>
             <w:rStyle w:val="Hipervnculo"/>
@@ -5783,7 +5783,7 @@
             <w:noProof/>
             <w:webHidden/>
           </w:rPr>
-          <w:instrText xml:space="preserve"> PAGEREF _Toc242641350 \h </w:instrText>
+          <w:instrText xml:space="preserve"> PAGEREF _Toc242656832 \h </w:instrText>
         </w:r>
         <w:r>
           <w:rPr>
@@ -5826,7 +5826,7 @@
           <w14:ligatures w14:val="standardContextual"/>
         </w:rPr>
       </w:pPr>
-      <w:hyperlink w:anchor="_Toc242641351" w:history="1">
+      <w:hyperlink w:anchor="_Toc242656833" w:history="1">
         <w:r>
           <w:rPr>
             <w:rStyle w:val="Hipervnculo"/>
@@ -5853,7 +5853,7 @@
             <w:noProof/>
             <w:webHidden/>
           </w:rPr>
-          <w:instrText xml:space="preserve"> PAGEREF _Toc242641351 \h </w:instrText>
+          <w:instrText xml:space="preserve"> PAGEREF _Toc242656833 \h </w:instrText>
         </w:r>
         <w:r>
           <w:rPr>
@@ -5896,7 +5896,7 @@
           <w14:ligatures w14:val="standardContextual"/>
         </w:rPr>
       </w:pPr>
-      <w:hyperlink w:anchor="_Toc242641352" w:history="1">
+      <w:hyperlink w:anchor="_Toc242656834" w:history="1">
         <w:r>
           <w:rPr>
             <w:rStyle w:val="Hipervnculo"/>
@@ -5923,7 +5923,7 @@
             <w:noProof/>
             <w:webHidden/>
           </w:rPr>
-          <w:instrText xml:space="preserve"> PAGEREF _Toc242641352 \h </w:instrText>
+          <w:instrText xml:space="preserve"> PAGEREF _Toc242656834 \h </w:instrText>
         </w:r>
         <w:r>
           <w:rPr>
@@ -5966,7 +5966,7 @@
           <w14:ligatures w14:val="standardContextual"/>
         </w:rPr>
       </w:pPr>
-      <w:hyperlink w:anchor="_Toc242641353" w:history="1">
+      <w:hyperlink w:anchor="_Toc242656835" w:history="1">
         <w:r>
           <w:rPr>
             <w:rStyle w:val="Hipervnculo"/>
@@ -5993,7 +5993,7 @@
             <w:noProof/>
             <w:webHidden/>
           </w:rPr>
-          <w:instrText xml:space="preserve"> PAGEREF _Toc242641353 \h </w:instrText>
+          <w:instrText xml:space="preserve"> PAGEREF _Toc242656835 \h </w:instrText>
         </w:r>
         <w:r>
           <w:rPr>
@@ -6036,7 +6036,7 @@
           <w14:ligatures w14:val="standardContextual"/>
         </w:rPr>
       </w:pPr>
-      <w:hyperlink w:anchor="_Toc242641354" w:history="1">
+      <w:hyperlink w:anchor="_Toc242656836" w:history="1">
         <w:r>
           <w:rPr>
             <w:rStyle w:val="Hipervnculo"/>
@@ -6063,7 +6063,7 @@
             <w:noProof/>
             <w:webHidden/>
           </w:rPr>
-          <w:instrText xml:space="preserve"> PAGEREF _Toc242641354 \h </w:instrText>
+          <w:instrText xml:space="preserve"> PAGEREF _Toc242656836 \h </w:instrText>
         </w:r>
         <w:r>
           <w:rPr>
@@ -6106,7 +6106,7 @@
           <w14:ligatures w14:val="standardContextual"/>
         </w:rPr>
       </w:pPr>
-      <w:hyperlink w:anchor="_Toc242641355" w:history="1">
+      <w:hyperlink w:anchor="_Toc242656837" w:history="1">
         <w:r>
           <w:rPr>
             <w:rStyle w:val="Hipervnculo"/>
@@ -6133,7 +6133,7 @@
             <w:noProof/>
             <w:webHidden/>
           </w:rPr>
-          <w:instrText xml:space="preserve"> PAGEREF _Toc242641355 \h </w:instrText>
+          <w:instrText xml:space="preserve"> PAGEREF _Toc242656837 \h </w:instrText>
         </w:r>
         <w:r>
           <w:rPr>
@@ -6176,7 +6176,7 @@
           <w14:ligatures w14:val="standardContextual"/>
         </w:rPr>
       </w:pPr>
-      <w:hyperlink w:anchor="_Toc242641356" w:history="1">
+      <w:hyperlink w:anchor="_Toc242656838" w:history="1">
         <w:r>
           <w:rPr>
             <w:rStyle w:val="Hipervnculo"/>
@@ -6203,7 +6203,7 @@
             <w:noProof/>
             <w:webHidden/>
           </w:rPr>
-          <w:instrText xml:space="preserve"> PAGEREF _Toc242641356 \h </w:instrText>
+          <w:instrText xml:space="preserve"> PAGEREF _Toc242656838 \h </w:instrText>
         </w:r>
         <w:r>
           <w:rPr>
@@ -6246,7 +6246,7 @@
           <w14:ligatures w14:val="standardContextual"/>
         </w:rPr>
       </w:pPr>
-      <w:hyperlink w:anchor="_Toc242641357" w:history="1">
+      <w:hyperlink w:anchor="_Toc242656839" w:history="1">
         <w:r>
           <w:rPr>
             <w:rStyle w:val="Hipervnculo"/>
@@ -6273,7 +6273,7 @@
             <w:noProof/>
             <w:webHidden/>
           </w:rPr>
-          <w:instrText xml:space="preserve"> PAGEREF _Toc242641357 \h </w:instrText>
+          <w:instrText xml:space="preserve"> PAGEREF _Toc242656839 \h </w:instrText>
         </w:r>
         <w:r>
           <w:rPr>
@@ -6316,7 +6316,7 @@
           <w14:ligatures w14:val="standardContextual"/>
         </w:rPr>
       </w:pPr>
-      <w:hyperlink w:anchor="_Toc242641358" w:history="1">
+      <w:hyperlink w:anchor="_Toc242656840" w:history="1">
         <w:r>
           <w:rPr>
             <w:rStyle w:val="Hipervnculo"/>
@@ -6343,7 +6343,7 @@
             <w:noProof/>
             <w:webHidden/>
           </w:rPr>
-          <w:instrText xml:space="preserve"> PAGEREF _Toc242641358 \h </w:instrText>
+          <w:instrText xml:space="preserve"> PAGEREF _Toc242656840 \h </w:instrText>
         </w:r>
         <w:r>
           <w:rPr>
@@ -6386,7 +6386,7 @@
           <w14:ligatures w14:val="standardContextual"/>
         </w:rPr>
       </w:pPr>
-      <w:hyperlink w:anchor="_Toc242641359" w:history="1">
+      <w:hyperlink w:anchor="_Toc242656841" w:history="1">
         <w:r>
           <w:rPr>
             <w:rStyle w:val="Hipervnculo"/>
@@ -6413,7 +6413,7 @@
             <w:noProof/>
             <w:webHidden/>
           </w:rPr>
-          <w:instrText xml:space="preserve"> PAGEREF _Toc242641359 \h </w:instrText>
+          <w:instrText xml:space="preserve"> PAGEREF _Toc242656841 \h </w:instrText>
         </w:r>
         <w:r>
           <w:rPr>
@@ -6459,7 +6459,7 @@
           <w14:ligatures w14:val="standardContextual"/>
         </w:rPr>
       </w:pPr>
-      <w:hyperlink w:anchor="_Toc242641360" w:history="1">
+      <w:hyperlink w:anchor="_Toc242656842" w:history="1">
         <w:r>
           <w:rPr>
             <w:rStyle w:val="Hipervnculo"/>
@@ -6486,7 +6486,7 @@
             <w:noProof/>
             <w:webHidden/>
           </w:rPr>
-          <w:instrText xml:space="preserve"> PAGEREF _Toc242641360 \h </w:instrText>
+          <w:instrText xml:space="preserve"> PAGEREF _Toc242656842 \h </w:instrText>
         </w:r>
         <w:r>
           <w:rPr>
@@ -6529,7 +6529,7 @@
           <w14:ligatures w14:val="standardContextual"/>
         </w:rPr>
       </w:pPr>
-      <w:hyperlink w:anchor="_Toc242641361" w:history="1">
+      <w:hyperlink w:anchor="_Toc242656843" w:history="1">
         <w:r>
           <w:rPr>
             <w:rStyle w:val="Hipervnculo"/>
@@ -6556,7 +6556,7 @@
             <w:noProof/>
             <w:webHidden/>
           </w:rPr>
-          <w:instrText xml:space="preserve"> PAGEREF _Toc242641361 \h </w:instrText>
+          <w:instrText xml:space="preserve"> PAGEREF _Toc242656843 \h </w:instrText>
         </w:r>
         <w:r>
           <w:rPr>
@@ -6599,7 +6599,7 @@
           <w14:ligatures w14:val="standardContextual"/>
         </w:rPr>
       </w:pPr>
-      <w:hyperlink w:anchor="_Toc242641362" w:history="1">
+      <w:hyperlink w:anchor="_Toc242656844" w:history="1">
         <w:r>
           <w:rPr>
             <w:rStyle w:val="Hipervnculo"/>
@@ -6626,7 +6626,7 @@
             <w:noProof/>
             <w:webHidden/>
           </w:rPr>
-          <w:instrText xml:space="preserve"> PAGEREF _Toc242641362 \h </w:instrText>
+          <w:instrText xml:space="preserve"> PAGEREF _Toc242656844 \h </w:instrText>
         </w:r>
         <w:r>
           <w:rPr>
@@ -6669,7 +6669,7 @@
           <w14:ligatures w14:val="standardContextual"/>
         </w:rPr>
       </w:pPr>
-      <w:hyperlink w:anchor="_Toc242641363" w:history="1">
+      <w:hyperlink w:anchor="_Toc242656845" w:history="1">
         <w:r>
           <w:rPr>
             <w:rStyle w:val="Hipervnculo"/>
@@ -6696,7 +6696,7 @@
             <w:noProof/>
             <w:webHidden/>
           </w:rPr>
-          <w:instrText xml:space="preserve"> PAGEREF _Toc242641363 \h </w:instrText>
+          <w:instrText xml:space="preserve"> PAGEREF _Toc242656845 \h </w:instrText>
         </w:r>
         <w:r>
           <w:rPr>
@@ -6739,7 +6739,7 @@
           <w14:ligatures w14:val="standardContextual"/>
         </w:rPr>
       </w:pPr>
-      <w:hyperlink w:anchor="_Toc242641364" w:history="1">
+      <w:hyperlink w:anchor="_Toc242656846" w:history="1">
         <w:r>
           <w:rPr>
             <w:rStyle w:val="Hipervnculo"/>
@@ -6766,7 +6766,7 @@
             <w:noProof/>
             <w:webHidden/>
           </w:rPr>
-          <w:instrText xml:space="preserve"> PAGEREF _Toc242641364 \h </w:instrText>
+          <w:instrText xml:space="preserve"> PAGEREF _Toc242656846 \h </w:instrText>
         </w:r>
         <w:r>
           <w:rPr>
@@ -6809,7 +6809,7 @@
           <w14:ligatures w14:val="standardContextual"/>
         </w:rPr>
       </w:pPr>
-      <w:hyperlink w:anchor="_Toc242641365" w:history="1">
+      <w:hyperlink w:anchor="_Toc242656847" w:history="1">
         <w:r>
           <w:rPr>
             <w:rStyle w:val="Hipervnculo"/>
@@ -6836,7 +6836,7 @@
             <w:noProof/>
             <w:webHidden/>
           </w:rPr>
-          <w:instrText xml:space="preserve"> PAGEREF _Toc242641365 \h </w:instrText>
+          <w:instrText xml:space="preserve"> PAGEREF _Toc242656847 \h </w:instrText>
         </w:r>
         <w:r>
           <w:rPr>
@@ -6882,7 +6882,7 @@
           <w14:ligatures w14:val="standardContextual"/>
         </w:rPr>
       </w:pPr>
-      <w:hyperlink w:anchor="_Toc242641366" w:history="1">
+      <w:hyperlink w:anchor="_Toc242656848" w:history="1">
         <w:r>
           <w:rPr>
             <w:rStyle w:val="Hipervnculo"/>
@@ -6909,7 +6909,7 @@
             <w:noProof/>
             <w:webHidden/>
           </w:rPr>
-          <w:instrText xml:space="preserve"> PAGEREF _Toc242641366 \h </w:instrText>
+          <w:instrText xml:space="preserve"> PAGEREF _Toc242656848 \h </w:instrText>
         </w:r>
         <w:r>
           <w:rPr>
@@ -6952,7 +6952,7 @@
           <w14:ligatures w14:val="standardContextual"/>
         </w:rPr>
       </w:pPr>
-      <w:hyperlink w:anchor="_Toc242641367" w:history="1">
+      <w:hyperlink w:anchor="_Toc242656849" w:history="1">
         <w:r>
           <w:rPr>
             <w:rStyle w:val="Hipervnculo"/>
@@ -6979,7 +6979,7 @@
             <w:noProof/>
             <w:webHidden/>
           </w:rPr>
-          <w:instrText xml:space="preserve"> PAGEREF _Toc242641367 \h </w:instrText>
+          <w:instrText xml:space="preserve"> PAGEREF _Toc242656849 \h </w:instrText>
         </w:r>
         <w:r>
           <w:rPr>
@@ -7022,7 +7022,7 @@
           <w14:ligatures w14:val="standardContextual"/>
         </w:rPr>
       </w:pPr>
-      <w:hyperlink w:anchor="_Toc242641368" w:history="1">
+      <w:hyperlink w:anchor="_Toc242656850" w:history="1">
         <w:r>
           <w:rPr>
             <w:rStyle w:val="Hipervnculo"/>
@@ -7049,7 +7049,7 @@
             <w:noProof/>
             <w:webHidden/>
           </w:rPr>
-          <w:instrText xml:space="preserve"> PAGEREF _Toc242641368 \h </w:instrText>
+          <w:instrText xml:space="preserve"> PAGEREF _Toc242656850 \h </w:instrText>
         </w:r>
         <w:r>
           <w:rPr>
@@ -7092,7 +7092,7 @@
           <w14:ligatures w14:val="standardContextual"/>
         </w:rPr>
       </w:pPr>
-      <w:hyperlink w:anchor="_Toc242641369" w:history="1">
+      <w:hyperlink w:anchor="_Toc242656851" w:history="1">
         <w:r>
           <w:rPr>
             <w:rStyle w:val="Hipervnculo"/>
@@ -7119,7 +7119,7 @@
             <w:noProof/>
             <w:webHidden/>
           </w:rPr>
-          <w:instrText xml:space="preserve"> PAGEREF _Toc242641369 \h </w:instrText>
+          <w:instrText xml:space="preserve"> PAGEREF _Toc242656851 \h </w:instrText>
         </w:r>
         <w:r>
           <w:rPr>
@@ -7162,7 +7162,7 @@
           <w14:ligatures w14:val="standardContextual"/>
         </w:rPr>
       </w:pPr>
-      <w:hyperlink w:anchor="_Toc242641370" w:history="1">
+      <w:hyperlink w:anchor="_Toc242656852" w:history="1">
         <w:r>
           <w:rPr>
             <w:rStyle w:val="Hipervnculo"/>
@@ -7189,7 +7189,7 @@
             <w:noProof/>
             <w:webHidden/>
           </w:rPr>
-          <w:instrText xml:space="preserve"> PAGEREF _Toc242641370 \h </w:instrText>
+          <w:instrText xml:space="preserve"> PAGEREF _Toc242656852 \h </w:instrText>
         </w:r>
         <w:r>
           <w:rPr>
@@ -7232,7 +7232,7 @@
           <w14:ligatures w14:val="standardContextual"/>
         </w:rPr>
       </w:pPr>
-      <w:hyperlink w:anchor="_Toc242641371" w:history="1">
+      <w:hyperlink w:anchor="_Toc242656853" w:history="1">
         <w:r>
           <w:rPr>
             <w:rStyle w:val="Hipervnculo"/>
@@ -7259,7 +7259,7 @@
             <w:noProof/>
             <w:webHidden/>
           </w:rPr>
-          <w:instrText xml:space="preserve"> PAGEREF _Toc242641371 \h </w:instrText>
+          <w:instrText xml:space="preserve"> PAGEREF _Toc242656853 \h </w:instrText>
         </w:r>
         <w:r>
           <w:rPr>
@@ -7305,7 +7305,7 @@
           <w14:ligatures w14:val="standardContextual"/>
         </w:rPr>
       </w:pPr>
-      <w:hyperlink w:anchor="_Toc242641372" w:history="1">
+      <w:hyperlink w:anchor="_Toc242656854" w:history="1">
         <w:r>
           <w:rPr>
             <w:rStyle w:val="Hipervnculo"/>
@@ -7341,7 +7341,7 @@
             <w:noProof/>
             <w:webHidden/>
           </w:rPr>
-          <w:instrText xml:space="preserve"> PAGEREF _Toc242641372 \h </w:instrText>
+          <w:instrText xml:space="preserve"> PAGEREF _Toc242656854 \h </w:instrText>
         </w:r>
         <w:r>
           <w:rPr>
@@ -7384,7 +7384,7 @@
           <w14:ligatures w14:val="standardContextual"/>
         </w:rPr>
       </w:pPr>
-      <w:hyperlink w:anchor="_Toc242641373" w:history="1">
+      <w:hyperlink w:anchor="_Toc242656855" w:history="1">
         <w:r>
           <w:rPr>
             <w:rStyle w:val="Hipervnculo"/>
@@ -7411,7 +7411,7 @@
             <w:noProof/>
             <w:webHidden/>
           </w:rPr>
-          <w:instrText xml:space="preserve"> PAGEREF _Toc242641373 \h </w:instrText>
+          <w:instrText xml:space="preserve"> PAGEREF _Toc242656855 \h </w:instrText>
         </w:r>
         <w:r>
           <w:rPr>
@@ -7454,7 +7454,7 @@
           <w14:ligatures w14:val="standardContextual"/>
         </w:rPr>
       </w:pPr>
-      <w:hyperlink w:anchor="_Toc242641374" w:history="1">
+      <w:hyperlink w:anchor="_Toc242656856" w:history="1">
         <w:r>
           <w:rPr>
             <w:rStyle w:val="Hipervnculo"/>
@@ -7481,7 +7481,7 @@
             <w:noProof/>
             <w:webHidden/>
           </w:rPr>
-          <w:instrText xml:space="preserve"> PAGEREF _Toc242641374 \h </w:instrText>
+          <w:instrText xml:space="preserve"> PAGEREF _Toc242656856 \h </w:instrText>
         </w:r>
         <w:r>
           <w:rPr>
@@ -7524,7 +7524,7 @@
           <w14:ligatures w14:val="standardContextual"/>
         </w:rPr>
       </w:pPr>
-      <w:hyperlink w:anchor="_Toc242641375" w:history="1">
+      <w:hyperlink w:anchor="_Toc242656857" w:history="1">
         <w:r>
           <w:rPr>
             <w:rStyle w:val="Hipervnculo"/>
@@ -7551,7 +7551,7 @@
             <w:noProof/>
             <w:webHidden/>
           </w:rPr>
-          <w:instrText xml:space="preserve"> PAGEREF _Toc242641375 \h </w:instrText>
+          <w:instrText xml:space="preserve"> PAGEREF _Toc242656857 \h </w:instrText>
         </w:r>
         <w:r>
           <w:rPr>
@@ -7594,7 +7594,7 @@
           <w14:ligatures w14:val="standardContextual"/>
         </w:rPr>
       </w:pPr>
-      <w:hyperlink w:anchor="_Toc242641376" w:history="1">
+      <w:hyperlink w:anchor="_Toc242656858" w:history="1">
         <w:r>
           <w:rPr>
             <w:rStyle w:val="Hipervnculo"/>
@@ -7621,7 +7621,7 @@
             <w:noProof/>
             <w:webHidden/>
           </w:rPr>
-          <w:instrText xml:space="preserve"> PAGEREF _Toc242641376 \h </w:instrText>
+          <w:instrText xml:space="preserve"> PAGEREF _Toc242656858 \h </w:instrText>
         </w:r>
         <w:r>
           <w:rPr>
@@ -7664,7 +7664,7 @@
           <w14:ligatures w14:val="standardContextual"/>
         </w:rPr>
       </w:pPr>
-      <w:hyperlink w:anchor="_Toc242641377" w:history="1">
+      <w:hyperlink w:anchor="_Toc242656859" w:history="1">
         <w:r>
           <w:rPr>
             <w:rStyle w:val="Hipervnculo"/>
@@ -7691,7 +7691,7 @@
             <w:noProof/>
             <w:webHidden/>
           </w:rPr>
-          <w:instrText xml:space="preserve"> PAGEREF _Toc242641377 \h </w:instrText>
+          <w:instrText xml:space="preserve"> PAGEREF _Toc242656859 \h </w:instrText>
         </w:r>
         <w:r>
           <w:rPr>
@@ -7737,7 +7737,7 @@
           <w14:ligatures w14:val="standardContextual"/>
         </w:rPr>
       </w:pPr>
-      <w:hyperlink w:anchor="_Toc242641378" w:history="1">
+      <w:hyperlink w:anchor="_Toc242656860" w:history="1">
         <w:r>
           <w:rPr>
             <w:rStyle w:val="Hipervnculo"/>
@@ -7764,7 +7764,7 @@
             <w:noProof/>
             <w:webHidden/>
           </w:rPr>
-          <w:instrText xml:space="preserve"> PAGEREF _Toc242641378 \h </w:instrText>
+          <w:instrText xml:space="preserve"> PAGEREF _Toc242656860 \h </w:instrText>
         </w:r>
         <w:r>
           <w:rPr>
@@ -7807,7 +7807,7 @@
           <w14:ligatures w14:val="standardContextual"/>
         </w:rPr>
       </w:pPr>
-      <w:hyperlink w:anchor="_Toc242641379" w:history="1">
+      <w:hyperlink w:anchor="_Toc242656861" w:history="1">
         <w:r>
           <w:rPr>
             <w:rStyle w:val="Hipervnculo"/>
@@ -7834,7 +7834,7 @@
             <w:noProof/>
             <w:webHidden/>
           </w:rPr>
-          <w:instrText xml:space="preserve"> PAGEREF _Toc242641379 \h </w:instrText>
+          <w:instrText xml:space="preserve"> PAGEREF _Toc242656861 \h </w:instrText>
         </w:r>
         <w:r>
           <w:rPr>
@@ -7880,7 +7880,7 @@
           <w14:ligatures w14:val="standardContextual"/>
         </w:rPr>
       </w:pPr>
-      <w:hyperlink w:anchor="_Toc242641380" w:history="1">
+      <w:hyperlink w:anchor="_Toc242656862" w:history="1">
         <w:r>
           <w:rPr>
             <w:rStyle w:val="Hipervnculo"/>
@@ -7907,7 +7907,7 @@
             <w:noProof/>
             <w:webHidden/>
           </w:rPr>
-          <w:instrText xml:space="preserve"> PAGEREF _Toc242641380 \h </w:instrText>
+          <w:instrText xml:space="preserve"> PAGEREF _Toc242656862 \h </w:instrText>
         </w:r>
         <w:r>
           <w:rPr>
@@ -7950,7 +7950,7 @@
           <w14:ligatures w14:val="standardContextual"/>
         </w:rPr>
       </w:pPr>
-      <w:hyperlink w:anchor="_Toc242641381" w:history="1">
+      <w:hyperlink w:anchor="_Toc242656863" w:history="1">
         <w:r>
           <w:rPr>
             <w:rStyle w:val="Hipervnculo"/>
@@ -7977,7 +7977,7 @@
             <w:noProof/>
             <w:webHidden/>
           </w:rPr>
-          <w:instrText xml:space="preserve"> PAGEREF _Toc242641381 \h </w:instrText>
+          <w:instrText xml:space="preserve"> PAGEREF _Toc242656863 \h </w:instrText>
         </w:r>
         <w:r>
           <w:rPr>
@@ -8020,7 +8020,7 @@
           <w14:ligatures w14:val="standardContextual"/>
         </w:rPr>
       </w:pPr>
-      <w:hyperlink w:anchor="_Toc242641382" w:history="1">
+      <w:hyperlink w:anchor="_Toc242656864" w:history="1">
         <w:r>
           <w:rPr>
             <w:rStyle w:val="Hipervnculo"/>
@@ -8047,7 +8047,7 @@
             <w:noProof/>
             <w:webHidden/>
           </w:rPr>
-          <w:instrText xml:space="preserve"> PAGEREF _Toc242641382 \h </w:instrText>
+          <w:instrText xml:space="preserve"> PAGEREF _Toc242656864 \h </w:instrText>
         </w:r>
         <w:r>
           <w:rPr>
@@ -8090,7 +8090,7 @@
           <w14:ligatures w14:val="standardContextual"/>
         </w:rPr>
       </w:pPr>
-      <w:hyperlink w:anchor="_Toc242641383" w:history="1">
+      <w:hyperlink w:anchor="_Toc242656865" w:history="1">
         <w:r>
           <w:rPr>
             <w:rStyle w:val="Hipervnculo"/>
@@ -8117,7 +8117,7 @@
             <w:noProof/>
             <w:webHidden/>
           </w:rPr>
-          <w:instrText xml:space="preserve"> PAGEREF _Toc242641383 \h </w:instrText>
+          <w:instrText xml:space="preserve"> PAGEREF _Toc242656865 \h </w:instrText>
         </w:r>
         <w:r>
           <w:rPr>
@@ -8163,7 +8163,7 @@
           <w14:ligatures w14:val="standardContextual"/>
         </w:rPr>
       </w:pPr>
-      <w:hyperlink w:anchor="_Toc242641384" w:history="1">
+      <w:hyperlink w:anchor="_Toc242656866" w:history="1">
         <w:r>
           <w:rPr>
             <w:rStyle w:val="Hipervnculo"/>
@@ -8190,7 +8190,7 @@
             <w:noProof/>
             <w:webHidden/>
           </w:rPr>
-          <w:instrText xml:space="preserve"> PAGEREF _Toc242641384 \h </w:instrText>
+          <w:instrText xml:space="preserve"> PAGEREF _Toc242656866 \h </w:instrText>
         </w:r>
         <w:r>
           <w:rPr>
@@ -8236,7 +8236,7 @@
           <w14:ligatures w14:val="standardContextual"/>
         </w:rPr>
       </w:pPr>
-      <w:hyperlink w:anchor="_Toc242641385" w:history="1">
+      <w:hyperlink w:anchor="_Toc242656867" w:history="1">
         <w:r>
           <w:rPr>
             <w:rStyle w:val="Hipervnculo"/>
@@ -8263,7 +8263,7 @@
             <w:noProof/>
             <w:webHidden/>
           </w:rPr>
-          <w:instrText xml:space="preserve"> PAGEREF _Toc242641385 \h </w:instrText>
+          <w:instrText xml:space="preserve"> PAGEREF _Toc242656867 \h </w:instrText>
         </w:r>
         <w:r>
           <w:rPr>
@@ -8739,7 +8739,7 @@
         <w:pStyle w:val="Ttulo1"/>
       </w:pPr>
       <w:bookmarkStart w:id="0" w:name="_48a44b56e2cba46e0bd273959c9fa021cf0e0c0"/>
-      <w:bookmarkStart w:id="1" w:name="_Toc242641274"/>
+      <w:bookmarkStart w:id="1" w:name="_Toc242656756"/>
       <w:r>
         <w:lastRenderedPageBreak/>
         <w:t xml:space="preserve">Módulo 0 — Plataforma: clínicas, planes y suscripción </w:t>
@@ -8766,7 +8766,7 @@
         <w:pStyle w:val="Ttulo2"/>
       </w:pPr>
       <w:bookmarkStart w:id="2" w:name="_1eb36715c186f58cce98281b1b189d20510db73"/>
-      <w:bookmarkStart w:id="3" w:name="_Toc242641275"/>
+      <w:bookmarkStart w:id="3" w:name="_Toc242656757"/>
       <w:r>
         <w:t>HU-0.1 — Registrar una clínica (self-service)</w:t>
       </w:r>
@@ -9049,7 +9049,7 @@
         <w:pStyle w:val="Ttulo2"/>
       </w:pPr>
       <w:bookmarkStart w:id="4" w:name="_802afc2bac434eff8b2fd18354a2e26d7a1818b"/>
-      <w:bookmarkStart w:id="5" w:name="_Toc242641276"/>
+      <w:bookmarkStart w:id="5" w:name="_Toc242656758"/>
       <w:bookmarkEnd w:id="2"/>
       <w:r>
         <w:t>HU-0.2 — Verificar el correo y activar la clínica</w:t>
@@ -9341,7 +9341,7 @@
         <w:pStyle w:val="Ttulo2"/>
       </w:pPr>
       <w:bookmarkStart w:id="6" w:name="_bb7346f7e0c84a0526cc1b09dcf7185b4de9ba6"/>
-      <w:bookmarkStart w:id="7" w:name="_Toc242641277"/>
+      <w:bookmarkStart w:id="7" w:name="_Toc242656759"/>
       <w:bookmarkEnd w:id="4"/>
       <w:r>
         <w:t>HU-0.3 — Panel del super-administrador</w:t>
@@ -9510,7 +9510,7 @@
         </w:numPr>
       </w:pPr>
       <w:r>
-        <w:t>Lista de clínicas registradas con su estado, plan y estado de suscripción.</w:t>
+        <w:t>Lista de clínicas registradas con su estado, plan y estado de suscripción; se busca por nombre o NIT y se filtra por estado y plan.</w:t>
       </w:r>
     </w:p>
     <w:p>
@@ -9541,7 +9541,10 @@
         <w:t>No</w:t>
       </w:r>
       <w:r>
-        <w:t xml:space="preserve"> accede a mascotas, historias, consultas ni citas de ninguna clínica, tampoco para soporte.</w:t>
+        <w:t xml:space="preserve"> </w:t>
+      </w:r>
+      <w:r>
+        <w:t>accede a mascotas, historias, consultas ni citas de ninguna clínica, tampoco para soporte.</w:t>
       </w:r>
     </w:p>
     <w:p>
@@ -9680,7 +9683,7 @@
         <w:pStyle w:val="Ttulo2"/>
       </w:pPr>
       <w:bookmarkStart w:id="8" w:name="_81995397ba8e62ea0a492c5a03eed8bb24e762a"/>
-      <w:bookmarkStart w:id="9" w:name="_Toc242641278"/>
+      <w:bookmarkStart w:id="9" w:name="_Toc242656760"/>
       <w:bookmarkEnd w:id="6"/>
       <w:r>
         <w:t>HU-0.4 — Control de límites del plan (freemium)</w:t>
@@ -10024,7 +10027,7 @@
         <w:pStyle w:val="Ttulo2"/>
       </w:pPr>
       <w:bookmarkStart w:id="10" w:name="_917b31bc7b2ec5728d8c83baea304146cede88e"/>
-      <w:bookmarkStart w:id="11" w:name="_Toc242641279"/>
+      <w:bookmarkStart w:id="11" w:name="_Toc242656761"/>
       <w:bookmarkEnd w:id="8"/>
       <w:r>
         <w:t>HU-0.5 — Suscripción y congelación por mora</w:t>
@@ -10297,7 +10300,7 @@
         <w:pStyle w:val="Ttulo1"/>
       </w:pPr>
       <w:bookmarkStart w:id="12" w:name="_3f52c9db5995a4dc1e731f6d8cd57f262bab040"/>
-      <w:bookmarkStart w:id="13" w:name="_Toc242641280"/>
+      <w:bookmarkStart w:id="13" w:name="_Toc242656762"/>
       <w:bookmarkEnd w:id="0"/>
       <w:bookmarkEnd w:id="10"/>
       <w:r>
@@ -10319,7 +10322,7 @@
         <w:pStyle w:val="Ttulo2"/>
       </w:pPr>
       <w:bookmarkStart w:id="14" w:name="_76f4ca07816b696a7e21234a3fd245066d4202e"/>
-      <w:bookmarkStart w:id="15" w:name="_Toc242641281"/>
+      <w:bookmarkStart w:id="15" w:name="_Toc242656763"/>
       <w:r>
         <w:t>HU-T.1 — Iniciar sesión y autenticación</w:t>
       </w:r>
@@ -10574,7 +10577,7 @@
         <w:pStyle w:val="Ttulo2"/>
       </w:pPr>
       <w:bookmarkStart w:id="16" w:name="_08f5c8e95117bf9bc16117a780f642084f0c149"/>
-      <w:bookmarkStart w:id="17" w:name="_Toc242641282"/>
+      <w:bookmarkStart w:id="17" w:name="_Toc242656764"/>
       <w:bookmarkEnd w:id="14"/>
       <w:r>
         <w:t>HU-T.2 — Cambiar mi contraseña</w:t>
@@ -10850,7 +10853,7 @@
         <w:pStyle w:val="Ttulo2"/>
       </w:pPr>
       <w:bookmarkStart w:id="18" w:name="_44f513b1e95bac8cbf132f88a3649b6be2902d9"/>
-      <w:bookmarkStart w:id="19" w:name="_Toc242641283"/>
+      <w:bookmarkStart w:id="19" w:name="_Toc242656765"/>
       <w:bookmarkEnd w:id="16"/>
       <w:r>
         <w:lastRenderedPageBreak/>
@@ -11089,7 +11092,7 @@
         <w:pStyle w:val="Ttulo2"/>
       </w:pPr>
       <w:bookmarkStart w:id="20" w:name="_1eded849c0926854c498005f8a93458b9d7a2d8"/>
-      <w:bookmarkStart w:id="21" w:name="_Toc242641284"/>
+      <w:bookmarkStart w:id="21" w:name="_Toc242656766"/>
       <w:bookmarkEnd w:id="18"/>
       <w:r>
         <w:t>HU-T.4 — Cerrar sesión</w:t>
@@ -11315,7 +11318,7 @@
         <w:pStyle w:val="Ttulo2"/>
       </w:pPr>
       <w:bookmarkStart w:id="22" w:name="_def34846ffbe39a85a6bd6a22079f6d076a01a9"/>
-      <w:bookmarkStart w:id="23" w:name="_Toc242641285"/>
+      <w:bookmarkStart w:id="23" w:name="_Toc242656767"/>
       <w:bookmarkEnd w:id="20"/>
       <w:r>
         <w:t>HU-T.5 — Ver y actualizar mi perfil y datos de contacto</w:t>
@@ -11720,7 +11723,7 @@
         <w:pStyle w:val="Ttulo2"/>
       </w:pPr>
       <w:bookmarkStart w:id="24" w:name="_37603926653c908321bb7c7e9ea1991584cc3b8"/>
-      <w:bookmarkStart w:id="25" w:name="_Toc242641286"/>
+      <w:bookmarkStart w:id="25" w:name="_Toc242656768"/>
       <w:bookmarkEnd w:id="22"/>
       <w:r>
         <w:t>HU-T.6 — Gestionar mis notificaciones internas</w:t>
@@ -11998,7 +12001,7 @@
         <w:pStyle w:val="Ttulo2"/>
       </w:pPr>
       <w:bookmarkStart w:id="26" w:name="_5605fb9a7931d45a4bf5dc8e3e653d18c531f06"/>
-      <w:bookmarkStart w:id="27" w:name="_Toc242641287"/>
+      <w:bookmarkStart w:id="27" w:name="_Toc242656769"/>
       <w:bookmarkEnd w:id="24"/>
       <w:r>
         <w:t>HU-T.7 — Gestión de usuarios del sistema</w:t>
@@ -12285,7 +12288,7 @@
         <w:pStyle w:val="Ttulo2"/>
       </w:pPr>
       <w:bookmarkStart w:id="28" w:name="_cca84937acbaa5cdc69c436564f31a3800184ab"/>
-      <w:bookmarkStart w:id="29" w:name="_Toc242641288"/>
+      <w:bookmarkStart w:id="29" w:name="_Toc242656770"/>
       <w:bookmarkEnd w:id="26"/>
       <w:r>
         <w:t>HU-T.8 — Logs de auditoría y seguridad</w:t>
@@ -12530,7 +12533,7 @@
         <w:pStyle w:val="Ttulo2"/>
       </w:pPr>
       <w:bookmarkStart w:id="30" w:name="_cb462f816148050ba0d7aac8f53a2b5b0cb7780"/>
-      <w:bookmarkStart w:id="31" w:name="_Toc242641289"/>
+      <w:bookmarkStart w:id="31" w:name="_Toc242656771"/>
       <w:bookmarkEnd w:id="28"/>
       <w:r>
         <w:t>HU-T.9 — Backup automático de la base de datos</w:t>
@@ -13000,7 +13003,7 @@
         <w:pStyle w:val="Ttulo2"/>
       </w:pPr>
       <w:bookmarkStart w:id="32" w:name="_276f5e9a65ab31ebb82d9356073ee60ffcf6855"/>
-      <w:bookmarkStart w:id="33" w:name="_Toc242641290"/>
+      <w:bookmarkStart w:id="33" w:name="_Toc242656772"/>
       <w:bookmarkEnd w:id="30"/>
       <w:r>
         <w:t>HU-T.10 — Autorización central por rol (RBAC real)</w:t>
@@ -13278,7 +13281,7 @@
         <w:pStyle w:val="Ttulo2"/>
       </w:pPr>
       <w:bookmarkStart w:id="34" w:name="_3b0d05aa899aefedfcf439319a22bd7df135017"/>
-      <w:bookmarkStart w:id="35" w:name="_Toc242641291"/>
+      <w:bookmarkStart w:id="35" w:name="_Toc242656773"/>
       <w:bookmarkEnd w:id="32"/>
       <w:r>
         <w:t>HU-T.11 — Corregir escalada de privilegios y proteger al último administrador</w:t>
@@ -13528,7 +13531,7 @@
         <w:pStyle w:val="Ttulo2"/>
       </w:pPr>
       <w:bookmarkStart w:id="36" w:name="_5106da541d290f3488d79d8c1e91fe390d48e5c"/>
-      <w:bookmarkStart w:id="37" w:name="_Toc242641292"/>
+      <w:bookmarkStart w:id="37" w:name="_Toc242656774"/>
       <w:bookmarkEnd w:id="34"/>
       <w:r>
         <w:t>HU-T.12 — Política de contraseñas, verificación de correo y OAuth seguro</w:t>
@@ -13841,7 +13844,7 @@
         <w:pStyle w:val="Ttulo2"/>
       </w:pPr>
       <w:bookmarkStart w:id="38" w:name="_2303defb5da6c78860aeae9d161d0fa18f76502"/>
-      <w:bookmarkStart w:id="39" w:name="_Toc242641293"/>
+      <w:bookmarkStart w:id="39" w:name="_Toc242656775"/>
       <w:bookmarkEnd w:id="36"/>
       <w:r>
         <w:lastRenderedPageBreak/>
@@ -14144,7 +14147,7 @@
         <w:pStyle w:val="Ttulo2"/>
       </w:pPr>
       <w:bookmarkStart w:id="40" w:name="_37cade07514fa6d0623cee7537c5f68cab00cfd"/>
-      <w:bookmarkStart w:id="41" w:name="_Toc242641294"/>
+      <w:bookmarkStart w:id="41" w:name="_Toc242656776"/>
       <w:bookmarkEnd w:id="38"/>
       <w:r>
         <w:t>HU-T.14 — Restablecer la contraseña de un usuario (administrador)</w:t>
@@ -14440,7 +14443,7 @@
         <w:pStyle w:val="Ttulo2"/>
       </w:pPr>
       <w:bookmarkStart w:id="42" w:name="_09522c4444a8bbebdaf4a55b5444d2231a6caff"/>
-      <w:bookmarkStart w:id="43" w:name="_Toc242641295"/>
+      <w:bookmarkStart w:id="43" w:name="_Toc242656777"/>
       <w:bookmarkEnd w:id="40"/>
       <w:r>
         <w:t>HU-T.15 — Aislamiento por clínica y rol super-administrador</w:t>
@@ -15032,7 +15035,7 @@
         <w:pStyle w:val="Ttulo2"/>
       </w:pPr>
       <w:bookmarkStart w:id="44" w:name="_7d4be07c6dc7ad98ff2d7fd7f946e3e6ff8ab78"/>
-      <w:bookmarkStart w:id="45" w:name="_Toc242641296"/>
+      <w:bookmarkStart w:id="45" w:name="_Toc242656778"/>
       <w:bookmarkEnd w:id="42"/>
       <w:r>
         <w:lastRenderedPageBreak/>
@@ -15281,7 +15284,7 @@
         <w:pStyle w:val="Ttulo2"/>
       </w:pPr>
       <w:bookmarkStart w:id="46" w:name="_fde5550409ae8bd107b35d83706fe49d1ac49cf"/>
-      <w:bookmarkStart w:id="47" w:name="_Toc242641297"/>
+      <w:bookmarkStart w:id="47" w:name="_Toc242656779"/>
       <w:bookmarkEnd w:id="44"/>
       <w:r>
         <w:t>HU-T.17 — Una persona con varios roles: elegir el contexto al iniciar sesión</w:t>
@@ -15541,7 +15544,7 @@
         <w:pStyle w:val="Ttulo2"/>
       </w:pPr>
       <w:bookmarkStart w:id="48" w:name="_7d9311428cd5b72468b37f82201f1b810f77c36"/>
-      <w:bookmarkStart w:id="49" w:name="_Toc242641298"/>
+      <w:bookmarkStart w:id="49" w:name="_Toc242656780"/>
       <w:bookmarkEnd w:id="46"/>
       <w:r>
         <w:t>HU-T.18 — Registrarme e iniciar sesión con Google (propietario)</w:t>
@@ -15802,7 +15805,7 @@
         <w:pStyle w:val="Ttulo2"/>
       </w:pPr>
       <w:bookmarkStart w:id="50" w:name="_a6c52dc4bdd2cb00ae48e74db3c3b2920a9b818"/>
-      <w:bookmarkStart w:id="51" w:name="_Toc242641299"/>
+      <w:bookmarkStart w:id="51" w:name="_Toc242656781"/>
       <w:bookmarkEnd w:id="48"/>
       <w:r>
         <w:t>HU-T.19 — Aceptar la política de tratamiento de datos</w:t>
@@ -16053,7 +16056,7 @@
         <w:pStyle w:val="Ttulo1"/>
       </w:pPr>
       <w:bookmarkStart w:id="52" w:name="_45e5cddb15e6e85961c4bdd9f114a9e4301e667"/>
-      <w:bookmarkStart w:id="53" w:name="_Toc242641300"/>
+      <w:bookmarkStart w:id="53" w:name="_Toc242656782"/>
       <w:bookmarkEnd w:id="12"/>
       <w:bookmarkEnd w:id="50"/>
       <w:r>
@@ -16075,7 +16078,7 @@
         <w:pStyle w:val="Ttulo2"/>
       </w:pPr>
       <w:bookmarkStart w:id="54" w:name="_3442f1e103117ab35c7be2be07e5b7a86f50900"/>
-      <w:bookmarkStart w:id="55" w:name="_Toc242641301"/>
+      <w:bookmarkStart w:id="55" w:name="_Toc242656783"/>
       <w:r>
         <w:t>HU-1.1 — Registrar mascota</w:t>
       </w:r>
@@ -16340,7 +16343,7 @@
         <w:pStyle w:val="Ttulo2"/>
       </w:pPr>
       <w:bookmarkStart w:id="56" w:name="_cac8078226ab7384debc291829d99266c4c98c9"/>
-      <w:bookmarkStart w:id="57" w:name="_Toc242641302"/>
+      <w:bookmarkStart w:id="57" w:name="_Toc242656784"/>
       <w:bookmarkEnd w:id="54"/>
       <w:r>
         <w:t>HU-1.2 — Registrar propietario</w:t>
@@ -16584,7 +16587,7 @@
         <w:pStyle w:val="Ttulo2"/>
       </w:pPr>
       <w:bookmarkStart w:id="58" w:name="_2775e78a99e9a6c8110a18962d2d3ffe08eb791"/>
-      <w:bookmarkStart w:id="59" w:name="_Toc242641303"/>
+      <w:bookmarkStart w:id="59" w:name="_Toc242656785"/>
       <w:bookmarkEnd w:id="56"/>
       <w:r>
         <w:t>HU-1.3 — Buscar paciente</w:t>
@@ -16817,7 +16820,7 @@
         <w:pStyle w:val="Ttulo2"/>
       </w:pPr>
       <w:bookmarkStart w:id="60" w:name="_a48b917e447c9bb421319764b87fa8fbfffc6ce"/>
-      <w:bookmarkStart w:id="61" w:name="_Toc242641304"/>
+      <w:bookmarkStart w:id="61" w:name="_Toc242656786"/>
       <w:bookmarkEnd w:id="58"/>
       <w:r>
         <w:t>HU-1.4 — Editar y desactivar mascota</w:t>
@@ -17083,7 +17086,7 @@
         <w:pStyle w:val="Ttulo2"/>
       </w:pPr>
       <w:bookmarkStart w:id="62" w:name="_c56dbdf70effe4fdddd03cc982164bf6dfa15fd"/>
-      <w:bookmarkStart w:id="63" w:name="_Toc242641305"/>
+      <w:bookmarkStart w:id="63" w:name="_Toc242656787"/>
       <w:bookmarkEnd w:id="60"/>
       <w:r>
         <w:t>HU-1.5 — Vincular una mascota existente a la clínica</w:t>
@@ -17331,7 +17334,7 @@
         <w:pStyle w:val="Ttulo1"/>
       </w:pPr>
       <w:bookmarkStart w:id="64" w:name="_8ada1076fc69f75adb455b52b48149b634e12c1"/>
-      <w:bookmarkStart w:id="65" w:name="_Toc242641306"/>
+      <w:bookmarkStart w:id="65" w:name="_Toc242656788"/>
       <w:bookmarkEnd w:id="52"/>
       <w:bookmarkEnd w:id="62"/>
       <w:r>
@@ -17353,7 +17356,7 @@
         <w:pStyle w:val="Ttulo2"/>
       </w:pPr>
       <w:bookmarkStart w:id="66" w:name="_d0fbc850c25121b5bb6429938908d9d6324f20c"/>
-      <w:bookmarkStart w:id="67" w:name="_Toc242641307"/>
+      <w:bookmarkStart w:id="67" w:name="_Toc242656789"/>
       <w:r>
         <w:t>HU-2.1 — Registrar consulta clínica</w:t>
       </w:r>
@@ -17618,7 +17621,7 @@
         <w:pStyle w:val="Ttulo2"/>
       </w:pPr>
       <w:bookmarkStart w:id="68" w:name="_7a453a6eb6ed88e1bfb6e10d4e89e02e93370e4"/>
-      <w:bookmarkStart w:id="69" w:name="_Toc242641308"/>
+      <w:bookmarkStart w:id="69" w:name="_Toc242656790"/>
       <w:bookmarkEnd w:id="66"/>
       <w:r>
         <w:t>HU-2.2 — Atención clínica sin cita (urgencias)</w:t>
@@ -17868,7 +17871,7 @@
         <w:pStyle w:val="Ttulo2"/>
       </w:pPr>
       <w:bookmarkStart w:id="70" w:name="_277d15ee6375124a0d7497cd947f0496d653294"/>
-      <w:bookmarkStart w:id="71" w:name="_Toc242641309"/>
+      <w:bookmarkStart w:id="71" w:name="_Toc242656791"/>
       <w:bookmarkEnd w:id="68"/>
       <w:r>
         <w:lastRenderedPageBreak/>
@@ -18204,7 +18207,7 @@
         <w:pStyle w:val="Ttulo2"/>
       </w:pPr>
       <w:bookmarkStart w:id="72" w:name="_1b98c978e60977db39fc2418db7fe5e3ddc3001"/>
-      <w:bookmarkStart w:id="73" w:name="_Toc242641310"/>
+      <w:bookmarkStart w:id="73" w:name="_Toc242656792"/>
       <w:bookmarkEnd w:id="70"/>
       <w:r>
         <w:t>HU-2.4 — Registrar tratamiento</w:t>
@@ -18448,7 +18451,7 @@
         <w:pStyle w:val="Ttulo2"/>
       </w:pPr>
       <w:bookmarkStart w:id="74" w:name="_9717672e9e73feeffef28eb38b12c038cdd7bd2"/>
-      <w:bookmarkStart w:id="75" w:name="_Toc242641311"/>
+      <w:bookmarkStart w:id="75" w:name="_Toc242656793"/>
       <w:bookmarkEnd w:id="72"/>
       <w:r>
         <w:t>HU-2.5 — Ver historial clínico completo</w:t>
@@ -18712,7 +18715,7 @@
         <w:pStyle w:val="Ttulo2"/>
       </w:pPr>
       <w:bookmarkStart w:id="76" w:name="_fdc1478d352073634e6bd92f17796cead004715"/>
-      <w:bookmarkStart w:id="77" w:name="_Toc242641312"/>
+      <w:bookmarkStart w:id="77" w:name="_Toc242656794"/>
       <w:bookmarkEnd w:id="74"/>
       <w:r>
         <w:t>HU-2.6 — Atomicidad y feedback de adjuntos en el registro de consulta</w:t>
@@ -18993,7 +18996,7 @@
         <w:pStyle w:val="Ttulo2"/>
       </w:pPr>
       <w:bookmarkStart w:id="78" w:name="_101f0dcf34d14c70ec0f17a5f1393f5d9e5e380"/>
-      <w:bookmarkStart w:id="79" w:name="_Toc242641313"/>
+      <w:bookmarkStart w:id="79" w:name="_Toc242656795"/>
       <w:bookmarkEnd w:id="76"/>
       <w:r>
         <w:t>HU-2.7 — Validación y control de acceso en registros clínicos y de mascota</w:t>
@@ -19274,7 +19277,7 @@
         <w:pStyle w:val="Ttulo2"/>
       </w:pPr>
       <w:bookmarkStart w:id="80" w:name="_004e46896b85bf56df5905f1e03a53c4af0a844"/>
-      <w:bookmarkStart w:id="81" w:name="_Toc242641314"/>
+      <w:bookmarkStart w:id="81" w:name="_Toc242656796"/>
       <w:bookmarkEnd w:id="78"/>
       <w:r>
         <w:t>HU-2.8 — Sugerencia de diagnósticos probables por síntomas</w:t>
@@ -19534,7 +19537,7 @@
         <w:pStyle w:val="Ttulo2"/>
       </w:pPr>
       <w:bookmarkStart w:id="82" w:name="_dc4885bd67732a434e9ba082721bf6df1e25b78"/>
-      <w:bookmarkStart w:id="83" w:name="_Toc242641315"/>
+      <w:bookmarkStart w:id="83" w:name="_Toc242656797"/>
       <w:bookmarkEnd w:id="80"/>
       <w:r>
         <w:t>HU-2.9 — Alertas de toxicidad e interacción al prescribir</w:t>
@@ -19815,7 +19818,7 @@
         <w:pStyle w:val="Ttulo2"/>
       </w:pPr>
       <w:bookmarkStart w:id="84" w:name="_39e4f7d80042c39922c0142f6da447f46643fcd"/>
-      <w:bookmarkStart w:id="85" w:name="_Toc242641316"/>
+      <w:bookmarkStart w:id="85" w:name="_Toc242656798"/>
       <w:bookmarkEnd w:id="82"/>
       <w:r>
         <w:t>HU-2.10 — Ver la historia compartida de la mascota (multi-clínica)</w:t>
@@ -20063,7 +20066,7 @@
         <w:pStyle w:val="Ttulo2"/>
       </w:pPr>
       <w:bookmarkStart w:id="86" w:name="_ddbeb8d4984f7e7207ef7f02c5c92f4dcdce30d"/>
-      <w:bookmarkStart w:id="87" w:name="_Toc242641317"/>
+      <w:bookmarkStart w:id="87" w:name="_Toc242656799"/>
       <w:bookmarkEnd w:id="84"/>
       <w:r>
         <w:t>HU-2.11 — Calcular el nivel de triage a partir de los síntomas</w:t>
@@ -20375,7 +20378,7 @@
         <w:pStyle w:val="Ttulo1"/>
       </w:pPr>
       <w:bookmarkStart w:id="88" w:name="_d55aebc9deeb1682a62a02ae225cde94fe0baf3"/>
-      <w:bookmarkStart w:id="89" w:name="_Toc242641318"/>
+      <w:bookmarkStart w:id="89" w:name="_Toc242656800"/>
       <w:bookmarkEnd w:id="64"/>
       <w:bookmarkEnd w:id="86"/>
       <w:r>
@@ -20397,7 +20400,7 @@
         <w:pStyle w:val="Ttulo2"/>
       </w:pPr>
       <w:bookmarkStart w:id="90" w:name="_73783a222ff535845613407f8c2c5de0df62c29"/>
-      <w:bookmarkStart w:id="91" w:name="_Toc242641319"/>
+      <w:bookmarkStart w:id="91" w:name="_Toc242656801"/>
       <w:r>
         <w:t>HU-3.1 — Registrar vacunación</w:t>
       </w:r>
@@ -20640,7 +20643,7 @@
         <w:pStyle w:val="Ttulo2"/>
       </w:pPr>
       <w:bookmarkStart w:id="92" w:name="_6075047063f4930391208048315650ed427ae6c"/>
-      <w:bookmarkStart w:id="93" w:name="_Toc242641320"/>
+      <w:bookmarkStart w:id="93" w:name="_Toc242656802"/>
       <w:bookmarkEnd w:id="90"/>
       <w:r>
         <w:t>HU-3.2 — Enviar recordatorio por correo</w:t>
@@ -20896,7 +20899,7 @@
         <w:pStyle w:val="Ttulo2"/>
       </w:pPr>
       <w:bookmarkStart w:id="94" w:name="_781661fe2d15deb5f4d895541dced4f16e579af"/>
-      <w:bookmarkStart w:id="95" w:name="_Toc242641321"/>
+      <w:bookmarkStart w:id="95" w:name="_Toc242656803"/>
       <w:bookmarkEnd w:id="92"/>
       <w:r>
         <w:t>HU-3.3 — Enviar recordatorio por WhatsApp</w:t>
@@ -21153,7 +21156,7 @@
         <w:pStyle w:val="Ttulo2"/>
       </w:pPr>
       <w:bookmarkStart w:id="96" w:name="_8afd4fd6adaa7aec672b37965973c4a0b1b5483"/>
-      <w:bookmarkStart w:id="97" w:name="_Toc242641322"/>
+      <w:bookmarkStart w:id="97" w:name="_Toc242656804"/>
       <w:bookmarkEnd w:id="94"/>
       <w:r>
         <w:t>HU-3.4 — Registrar desparasitación</w:t>
@@ -21397,7 +21400,7 @@
         <w:pStyle w:val="Ttulo2"/>
       </w:pPr>
       <w:bookmarkStart w:id="98" w:name="_69b92288d624f1c737d99fa43d727735c1c78ac"/>
-      <w:bookmarkStart w:id="99" w:name="_Toc242641323"/>
+      <w:bookmarkStart w:id="99" w:name="_Toc242656805"/>
       <w:bookmarkEnd w:id="96"/>
       <w:r>
         <w:t>HU-3.5 — Panel de vacunaciones pendientes</w:t>
@@ -21675,7 +21678,7 @@
         <w:pStyle w:val="Ttulo2"/>
       </w:pPr>
       <w:bookmarkStart w:id="100" w:name="_83b2b6ee9ef84433e407efb3456acc0bf8c705f"/>
-      <w:bookmarkStart w:id="101" w:name="_Toc242641324"/>
+      <w:bookmarkStart w:id="101" w:name="_Toc242656806"/>
       <w:bookmarkEnd w:id="98"/>
       <w:r>
         <w:lastRenderedPageBreak/>
@@ -22020,7 +22023,7 @@
         <w:pStyle w:val="Ttulo1"/>
       </w:pPr>
       <w:bookmarkStart w:id="102" w:name="_0bc479c0be240e26431ebdd296a7a53444b2628"/>
-      <w:bookmarkStart w:id="103" w:name="_Toc242641325"/>
+      <w:bookmarkStart w:id="103" w:name="_Toc242656807"/>
       <w:bookmarkEnd w:id="88"/>
       <w:bookmarkEnd w:id="100"/>
       <w:r>
@@ -22042,7 +22045,7 @@
         <w:pStyle w:val="Ttulo2"/>
       </w:pPr>
       <w:bookmarkStart w:id="104" w:name="_83a9ef67ed8a24f8f8fb200a3c30fdc3bf36c17"/>
-      <w:bookmarkStart w:id="105" w:name="_Toc242641326"/>
+      <w:bookmarkStart w:id="105" w:name="_Toc242656808"/>
       <w:r>
         <w:t>HU-4.1 — Agendar cita</w:t>
       </w:r>
@@ -22309,7 +22312,7 @@
         <w:pStyle w:val="Ttulo2"/>
       </w:pPr>
       <w:bookmarkStart w:id="106" w:name="_102fb6dec5375a39a698cb955a51646f9817d25"/>
-      <w:bookmarkStart w:id="107" w:name="_Toc242641327"/>
+      <w:bookmarkStart w:id="107" w:name="_Toc242656809"/>
       <w:bookmarkEnd w:id="104"/>
       <w:r>
         <w:t>HU-4.2 — Cancelar o reprogramar cita</w:t>
@@ -22565,7 +22568,7 @@
         <w:pStyle w:val="Ttulo2"/>
       </w:pPr>
       <w:bookmarkStart w:id="108" w:name="_bc90a9ef9035fcbf5d83826a75a2a7caba95288"/>
-      <w:bookmarkStart w:id="109" w:name="_Toc242641328"/>
+      <w:bookmarkStart w:id="109" w:name="_Toc242656810"/>
       <w:bookmarkEnd w:id="106"/>
       <w:r>
         <w:lastRenderedPageBreak/>
@@ -22939,7 +22942,7 @@
         <w:pStyle w:val="Ttulo2"/>
       </w:pPr>
       <w:bookmarkStart w:id="110" w:name="_0ab1d1688e3b6d42f481962b5abe908ca5f185e"/>
-      <w:bookmarkStart w:id="111" w:name="_Toc242641329"/>
+      <w:bookmarkStart w:id="111" w:name="_Toc242656811"/>
       <w:bookmarkEnd w:id="108"/>
       <w:r>
         <w:t>HU-4.4 — Confirmación automática de cita por correo</w:t>
@@ -23184,7 +23187,7 @@
         <w:pStyle w:val="Ttulo2"/>
       </w:pPr>
       <w:bookmarkStart w:id="112" w:name="_391b83d5c01b20c64bec4d1baa2ded83b27b3cc"/>
-      <w:bookmarkStart w:id="113" w:name="_Toc242641330"/>
+      <w:bookmarkStart w:id="113" w:name="_Toc242656812"/>
       <w:bookmarkEnd w:id="110"/>
       <w:r>
         <w:t>HU-4.5 — Registrar hora real de atención y gestionar retrasos</w:t>
@@ -23491,7 +23494,7 @@
         <w:pStyle w:val="Ttulo2"/>
       </w:pPr>
       <w:bookmarkStart w:id="114" w:name="_fd2845ac88e46c3520f61b9b4ded26b35f37534"/>
-      <w:bookmarkStart w:id="115" w:name="_Toc242641331"/>
+      <w:bookmarkStart w:id="115" w:name="_Toc242656813"/>
       <w:bookmarkEnd w:id="112"/>
       <w:r>
         <w:t>HU-4.6 — Buffer configurable entre citas</w:t>
@@ -23766,7 +23769,7 @@
         <w:pStyle w:val="Ttulo2"/>
       </w:pPr>
       <w:bookmarkStart w:id="116" w:name="_4786f5b438d23c36e067f350ad8ed0097d027c2"/>
-      <w:bookmarkStart w:id="117" w:name="_Toc242641332"/>
+      <w:bookmarkStart w:id="117" w:name="_Toc242656814"/>
       <w:bookmarkEnd w:id="114"/>
       <w:r>
         <w:t>HU-4.7 — Estado "no asistió" y ausentismo</w:t>
@@ -24094,7 +24097,7 @@
         <w:pStyle w:val="Ttulo2"/>
       </w:pPr>
       <w:bookmarkStart w:id="118" w:name="_0d930997ffa83b9b36b150e5e50b933f66b264d"/>
-      <w:bookmarkStart w:id="119" w:name="_Toc242641333"/>
+      <w:bookmarkStart w:id="119" w:name="_Toc242656815"/>
       <w:bookmarkEnd w:id="116"/>
       <w:r>
         <w:t>HU-4.8 — Bloqueos de agenda del veterinario y días no laborables</w:t>
@@ -24369,7 +24372,7 @@
         <w:pStyle w:val="Ttulo2"/>
       </w:pPr>
       <w:bookmarkStart w:id="120" w:name="_592e3b26ee2d82de9a78960621790aca76cbe41"/>
-      <w:bookmarkStart w:id="121" w:name="_Toc242641334"/>
+      <w:bookmarkStart w:id="121" w:name="_Toc242656816"/>
       <w:bookmarkEnd w:id="118"/>
       <w:r>
         <w:t>HU-4.9 — Endurecer la validación de disponibilidad</w:t>
@@ -24683,7 +24686,7 @@
         <w:pStyle w:val="Ttulo2"/>
       </w:pPr>
       <w:bookmarkStart w:id="122" w:name="_53bf433c324c03bf220d8f1ea57572094c24d19"/>
-      <w:bookmarkStart w:id="123" w:name="_Toc242641335"/>
+      <w:bookmarkStart w:id="123" w:name="_Toc242656817"/>
       <w:bookmarkEnd w:id="120"/>
       <w:r>
         <w:t>HU-4.10 — Confirmar asistencia a la cita desde el recordatorio</w:t>
@@ -24966,7 +24969,7 @@
         <w:pStyle w:val="Ttulo2"/>
       </w:pPr>
       <w:bookmarkStart w:id="124" w:name="_bc4a4c08f4864e57db7a13372e3c901c5711bb9"/>
-      <w:bookmarkStart w:id="125" w:name="_Toc242641336"/>
+      <w:bookmarkStart w:id="125" w:name="_Toc242656818"/>
       <w:bookmarkEnd w:id="122"/>
       <w:r>
         <w:t>HU-4.11 — Configurar el horario recurrente del veterinario</w:t>
@@ -25226,7 +25229,7 @@
         <w:pStyle w:val="Ttulo2"/>
       </w:pPr>
       <w:bookmarkStart w:id="126" w:name="_3a9da54e9b682c781ba4f8ec9fb08eb1ae51469"/>
-      <w:bookmarkStart w:id="127" w:name="_Toc242641337"/>
+      <w:bookmarkStart w:id="127" w:name="_Toc242656819"/>
       <w:bookmarkEnd w:id="124"/>
       <w:r>
         <w:t>HU-4.12 — Registrar ausencia del veterinario y gestionar cobertura</w:t>
@@ -25519,7 +25522,7 @@
         <w:pStyle w:val="Ttulo2"/>
       </w:pPr>
       <w:bookmarkStart w:id="128" w:name="_d5e60343e26d4758074a6efaed07b69cd6c3551"/>
-      <w:bookmarkStart w:id="129" w:name="_Toc242641338"/>
+      <w:bookmarkStart w:id="129" w:name="_Toc242656820"/>
       <w:bookmarkEnd w:id="126"/>
       <w:r>
         <w:t>HU-4.13 — Agendar cita con triage de 4 niveles</w:t>
@@ -25929,7 +25932,7 @@
         <w:pStyle w:val="Ttulo2"/>
       </w:pPr>
       <w:bookmarkStart w:id="130" w:name="_d4adac7448e74c17e6bb33bf496ee79d1222807"/>
-      <w:bookmarkStart w:id="131" w:name="_Toc242641339"/>
+      <w:bookmarkStart w:id="131" w:name="_Toc242656821"/>
       <w:bookmarkEnd w:id="128"/>
       <w:r>
         <w:t>HU-4.14 — Reajuste de agenda en vivo (efecto cascada)</w:t>
@@ -26232,7 +26235,7 @@
         <w:pStyle w:val="Ttulo2"/>
       </w:pPr>
       <w:bookmarkStart w:id="132" w:name="_91e1c705d28c1a221b008d52046353792175d0f"/>
-      <w:bookmarkStart w:id="133" w:name="_Toc242641340"/>
+      <w:bookmarkStart w:id="133" w:name="_Toc242656822"/>
       <w:bookmarkEnd w:id="130"/>
       <w:r>
         <w:t>HU-4.15 — Atender una urgencia (triage rojo o llegada directa)</w:t>
@@ -26621,7 +26624,7 @@
         <w:pStyle w:val="Ttulo2"/>
       </w:pPr>
       <w:bookmarkStart w:id="134" w:name="_c78d8424c335bf78fd48b1955b4f1a67eda143f"/>
-      <w:bookmarkStart w:id="135" w:name="_Toc242641341"/>
+      <w:bookmarkStart w:id="135" w:name="_Toc242656823"/>
       <w:bookmarkEnd w:id="132"/>
       <w:r>
         <w:t>HU-4.16 — Sugerir veterinario al agendar</w:t>
@@ -26845,7 +26848,7 @@
         <w:pStyle w:val="Ttulo2"/>
       </w:pPr>
       <w:bookmarkStart w:id="136" w:name="_d95563cf58dd7b4419944c1578610bfcd0b1db0"/>
-      <w:bookmarkStart w:id="137" w:name="_Toc242641342"/>
+      <w:bookmarkStart w:id="137" w:name="_Toc242656824"/>
       <w:bookmarkEnd w:id="134"/>
       <w:r>
         <w:t>HU-4.17 — Recalcular el triage cuando cambian los síntomas</w:t>
@@ -27103,7 +27106,7 @@
         <w:pStyle w:val="Ttulo2"/>
       </w:pPr>
       <w:bookmarkStart w:id="138" w:name="_8b0a1409d398bf3e63485141aa804db028749ca"/>
-      <w:bookmarkStart w:id="139" w:name="_Toc242641343"/>
+      <w:bookmarkStart w:id="139" w:name="_Toc242656825"/>
       <w:bookmarkEnd w:id="136"/>
       <w:r>
         <w:t>HU-4.18 — Ajustar el nivel de triage (veterinario)</w:t>
@@ -27351,7 +27354,7 @@
         <w:pStyle w:val="Ttulo2"/>
       </w:pPr>
       <w:bookmarkStart w:id="140" w:name="_cf2722ce0434310059a1401a7a9236f9f75ab69"/>
-      <w:bookmarkStart w:id="141" w:name="_Toc242641344"/>
+      <w:bookmarkStart w:id="141" w:name="_Toc242656826"/>
       <w:bookmarkEnd w:id="138"/>
       <w:r>
         <w:t>HU-4.19 — Manejar la llegada tarde del propietario</w:t>
@@ -27627,7 +27630,7 @@
         <w:pStyle w:val="Ttulo1"/>
       </w:pPr>
       <w:bookmarkStart w:id="142" w:name="_448b6637f95054bfc4854cb12826ea84d2acba0"/>
-      <w:bookmarkStart w:id="143" w:name="_Toc242641345"/>
+      <w:bookmarkStart w:id="143" w:name="_Toc242656827"/>
       <w:bookmarkEnd w:id="102"/>
       <w:bookmarkEnd w:id="140"/>
       <w:r>
@@ -27649,7 +27652,7 @@
         <w:pStyle w:val="Ttulo2"/>
       </w:pPr>
       <w:bookmarkStart w:id="144" w:name="_af054ffcebd6910222ee7d6c1d020875947335e"/>
-      <w:bookmarkStart w:id="145" w:name="_Toc242641346"/>
+      <w:bookmarkStart w:id="145" w:name="_Toc242656828"/>
       <w:r>
         <w:t>HU-5.1 — Portal del propietario</w:t>
       </w:r>
@@ -27992,7 +27995,7 @@
         <w:pStyle w:val="Ttulo2"/>
       </w:pPr>
       <w:bookmarkStart w:id="146" w:name="_6b1c61431b8f8f0fcc4ce60077071b912ba2b45"/>
-      <w:bookmarkStart w:id="147" w:name="_Toc242641347"/>
+      <w:bookmarkStart w:id="147" w:name="_Toc242656829"/>
       <w:bookmarkEnd w:id="144"/>
       <w:r>
         <w:t>HU-5.2 — Auto-registro de propietario</w:t>
@@ -28261,7 +28264,7 @@
         <w:pStyle w:val="Ttulo2"/>
       </w:pPr>
       <w:bookmarkStart w:id="148" w:name="_f4d063018be410b507969fa4c62074124f833cf"/>
-      <w:bookmarkStart w:id="149" w:name="_Toc242641348"/>
+      <w:bookmarkStart w:id="149" w:name="_Toc242656830"/>
       <w:bookmarkEnd w:id="146"/>
       <w:r>
         <w:t>HU-5.3 — Agendar cita desde el portal</w:t>
@@ -28536,7 +28539,7 @@
         <w:pStyle w:val="Ttulo2"/>
       </w:pPr>
       <w:bookmarkStart w:id="150" w:name="_c64202596780354c08c0a149dc974449db886cf"/>
-      <w:bookmarkStart w:id="151" w:name="_Toc242641349"/>
+      <w:bookmarkStart w:id="151" w:name="_Toc242656831"/>
       <w:bookmarkEnd w:id="148"/>
       <w:r>
         <w:t>HU-5.4 — Editar mi mascota desde el portal</w:t>
@@ -28774,7 +28777,7 @@
         <w:pStyle w:val="Ttulo2"/>
       </w:pPr>
       <w:bookmarkStart w:id="152" w:name="_cf91e7705c2cc7ff174f786bca87f4ab32c164a"/>
-      <w:bookmarkStart w:id="153" w:name="_Toc242641350"/>
+      <w:bookmarkStart w:id="153" w:name="_Toc242656832"/>
       <w:bookmarkEnd w:id="150"/>
       <w:r>
         <w:lastRenderedPageBreak/>
@@ -29020,7 +29023,7 @@
         <w:pStyle w:val="Ttulo2"/>
       </w:pPr>
       <w:bookmarkStart w:id="154" w:name="_f8ebe18ba7612da84cbeb32e6cdfcf569929127"/>
-      <w:bookmarkStart w:id="155" w:name="_Toc242641351"/>
+      <w:bookmarkStart w:id="155" w:name="_Toc242656833"/>
       <w:bookmarkEnd w:id="152"/>
       <w:r>
         <w:t>HU-5.6 — Cancelar o reprogramar mi cita desde el portal</w:t>
@@ -29324,7 +29327,7 @@
         <w:pStyle w:val="Ttulo2"/>
       </w:pPr>
       <w:bookmarkStart w:id="156" w:name="_63b2ff8270a3dc0cb21378739f70e0c16a27def"/>
-      <w:bookmarkStart w:id="157" w:name="_Toc242641352"/>
+      <w:bookmarkStart w:id="157" w:name="_Toc242656834"/>
       <w:bookmarkEnd w:id="154"/>
       <w:r>
         <w:lastRenderedPageBreak/>
@@ -29585,7 +29588,7 @@
         <w:pStyle w:val="Ttulo2"/>
       </w:pPr>
       <w:bookmarkStart w:id="158" w:name="_f59be5ab49da54ec24749683e30fb79075b9c3a"/>
-      <w:bookmarkStart w:id="159" w:name="_Toc242641353"/>
+      <w:bookmarkStart w:id="159" w:name="_Toc242656835"/>
       <w:bookmarkEnd w:id="156"/>
       <w:r>
         <w:t>HU-5.8 — Registrar al propietario como identidad global</w:t>
@@ -29932,7 +29935,7 @@
         <w:pStyle w:val="Ttulo2"/>
       </w:pPr>
       <w:bookmarkStart w:id="160" w:name="_06eaf3b49483b1eeebe1b8e79573cd5c749be44"/>
-      <w:bookmarkStart w:id="161" w:name="_Toc242641354"/>
+      <w:bookmarkStart w:id="161" w:name="_Toc242656836"/>
       <w:bookmarkEnd w:id="158"/>
       <w:r>
         <w:t>HU-5.9 — Iniciar sesión en el portal multi-clínica</w:t>
@@ -30211,7 +30214,7 @@
         <w:pStyle w:val="Ttulo2"/>
       </w:pPr>
       <w:bookmarkStart w:id="162" w:name="_73bf9bf1ab817b39687e744da8c8402ea9619af"/>
-      <w:bookmarkStart w:id="163" w:name="_Toc242641355"/>
+      <w:bookmarkStart w:id="163" w:name="_Toc242656837"/>
       <w:bookmarkEnd w:id="160"/>
       <w:r>
         <w:t>HU-5.10 — Carnet digital de la mascota con QR de emergencia</w:t>
@@ -30475,7 +30478,7 @@
         <w:pStyle w:val="Ttulo2"/>
       </w:pPr>
       <w:bookmarkStart w:id="164" w:name="_809064a587886d0547b1788a26db9d9152af23a"/>
-      <w:bookmarkStart w:id="165" w:name="_Toc242641356"/>
+      <w:bookmarkStart w:id="165" w:name="_Toc242656838"/>
       <w:bookmarkEnd w:id="162"/>
       <w:r>
         <w:t>HU-5.11 — Acceder al carnet por QR en modo solo lectura</w:t>
@@ -30747,7 +30750,7 @@
         <w:pStyle w:val="Ttulo2"/>
       </w:pPr>
       <w:bookmarkStart w:id="166" w:name="_eaa2b9dcd4e772acfdb8cc2e14fe1584fe792e7"/>
-      <w:bookmarkStart w:id="167" w:name="_Toc242641357"/>
+      <w:bookmarkStart w:id="167" w:name="_Toc242656839"/>
       <w:bookmarkEnd w:id="164"/>
       <w:r>
         <w:t>HU-5.12 — Autorizar a una clínica a ver la historia de otras clínicas</w:t>
@@ -31011,7 +31014,7 @@
         <w:pStyle w:val="Ttulo2"/>
       </w:pPr>
       <w:bookmarkStart w:id="168" w:name="_9c4353686bd45e1d5b28007e4eeecf1db3be371"/>
-      <w:bookmarkStart w:id="169" w:name="_Toc242641358"/>
+      <w:bookmarkStart w:id="169" w:name="_Toc242656840"/>
       <w:bookmarkEnd w:id="166"/>
       <w:r>
         <w:t>HU-5.13 — Vincularme o desvincularme de una clínica</w:t>
@@ -31259,7 +31262,7 @@
         <w:pStyle w:val="Ttulo2"/>
       </w:pPr>
       <w:bookmarkStart w:id="170" w:name="_faf9cae68ace52a6134b8c807ad8be34010091b"/>
-      <w:bookmarkStart w:id="171" w:name="_Toc242641359"/>
+      <w:bookmarkStart w:id="171" w:name="_Toc242656841"/>
       <w:bookmarkEnd w:id="168"/>
       <w:r>
         <w:t>HU-5.14 — Eliminar mi cuenta (derecho de supresión)</w:t>
@@ -31519,7 +31522,7 @@
         <w:pStyle w:val="Ttulo1"/>
       </w:pPr>
       <w:bookmarkStart w:id="172" w:name="_415d3e183ea3663701acfe1e73f6e8038e4bbef"/>
-      <w:bookmarkStart w:id="173" w:name="_Toc242641360"/>
+      <w:bookmarkStart w:id="173" w:name="_Toc242656842"/>
       <w:bookmarkEnd w:id="142"/>
       <w:bookmarkEnd w:id="170"/>
       <w:r>
@@ -31541,7 +31544,7 @@
         <w:pStyle w:val="Ttulo2"/>
       </w:pPr>
       <w:bookmarkStart w:id="174" w:name="_1b876ecfd0adf71d503b9129568b658f81872f0"/>
-      <w:bookmarkStart w:id="175" w:name="_Toc242641361"/>
+      <w:bookmarkStart w:id="175" w:name="_Toc242656843"/>
       <w:r>
         <w:t>HU-6.1 — Dashboard principal y panel de pendientes</w:t>
       </w:r>
@@ -31847,7 +31850,7 @@
         <w:pStyle w:val="Ttulo2"/>
       </w:pPr>
       <w:bookmarkStart w:id="176" w:name="_97322cabf772225fd1bfe897dee158000aa0394"/>
-      <w:bookmarkStart w:id="177" w:name="_Toc242641362"/>
+      <w:bookmarkStart w:id="177" w:name="_Toc242656844"/>
       <w:bookmarkEnd w:id="174"/>
       <w:r>
         <w:t>HU-6.2 — Panel de operación del administrador</w:t>
@@ -32110,7 +32113,7 @@
         <w:pStyle w:val="Ttulo2"/>
       </w:pPr>
       <w:bookmarkStart w:id="178" w:name="_6ce76d48cd12ce7662f89ac490d75c386fc18ba"/>
-      <w:bookmarkStart w:id="179" w:name="_Toc242641363"/>
+      <w:bookmarkStart w:id="179" w:name="_Toc242656845"/>
       <w:bookmarkEnd w:id="176"/>
       <w:r>
         <w:t>HU-6.3 — Generar reportes en PDF</w:t>
@@ -32396,7 +32399,7 @@
         <w:pStyle w:val="Ttulo2"/>
       </w:pPr>
       <w:bookmarkStart w:id="180" w:name="_132f0b1bfae1ac6054dc51db54a45dff43ec797"/>
-      <w:bookmarkStart w:id="181" w:name="_Toc242641364"/>
+      <w:bookmarkStart w:id="181" w:name="_Toc242656846"/>
       <w:bookmarkEnd w:id="178"/>
       <w:r>
         <w:t>HU-6.4 — Ver estadísticas y gráficas del sistema</w:t>
@@ -32653,7 +32656,7 @@
         <w:pStyle w:val="Ttulo2"/>
       </w:pPr>
       <w:bookmarkStart w:id="182" w:name="_159c41a8740d691e56d865baa1d2a17f58680f5"/>
-      <w:bookmarkStart w:id="183" w:name="_Toc242641365"/>
+      <w:bookmarkStart w:id="183" w:name="_Toc242656847"/>
       <w:bookmarkEnd w:id="180"/>
       <w:r>
         <w:t>HU-6.5 — Exportar reportes a Excel/CSV</w:t>
@@ -32892,7 +32895,7 @@
         <w:pStyle w:val="Ttulo1"/>
       </w:pPr>
       <w:bookmarkStart w:id="184" w:name="_88abf5b53e5603b94c73c4f577271d31a73cc35"/>
-      <w:bookmarkStart w:id="185" w:name="_Toc242641366"/>
+      <w:bookmarkStart w:id="185" w:name="_Toc242656848"/>
       <w:bookmarkEnd w:id="172"/>
       <w:bookmarkEnd w:id="182"/>
       <w:r>
@@ -32914,7 +32917,7 @@
         <w:pStyle w:val="Ttulo2"/>
       </w:pPr>
       <w:bookmarkStart w:id="186" w:name="_003ad6784c61069e91989793d8255e8d4cb519d"/>
-      <w:bookmarkStart w:id="187" w:name="_Toc242641367"/>
+      <w:bookmarkStart w:id="187" w:name="_Toc242656849"/>
       <w:r>
         <w:t>HU-7.1 — Configurar los horarios de atención de la clínica</w:t>
       </w:r>
@@ -33193,7 +33196,7 @@
         <w:pStyle w:val="Ttulo2"/>
       </w:pPr>
       <w:bookmarkStart w:id="188" w:name="_42539d8b8201701c75c37499984fbffa69d6e4d"/>
-      <w:bookmarkStart w:id="189" w:name="_Toc242641368"/>
+      <w:bookmarkStart w:id="189" w:name="_Toc242656850"/>
       <w:bookmarkEnd w:id="186"/>
       <w:r>
         <w:t>HU-7.2 — Gestionar los catálogos del sistema</w:t>
@@ -33474,7 +33477,7 @@
         <w:pStyle w:val="Ttulo2"/>
       </w:pPr>
       <w:bookmarkStart w:id="190" w:name="_a0aee2f406b049ed83cfe391a77b0db14b5bfdf"/>
-      <w:bookmarkStart w:id="191" w:name="_Toc242641369"/>
+      <w:bookmarkStart w:id="191" w:name="_Toc242656851"/>
       <w:bookmarkEnd w:id="188"/>
       <w:r>
         <w:t>HU-7.3 — Gestionar los veterinarios y sus especialidades</w:t>
@@ -33743,7 +33746,7 @@
         <w:pStyle w:val="Ttulo2"/>
       </w:pPr>
       <w:bookmarkStart w:id="192" w:name="_a0688e3f345f7bf587dcedb8b562b8964a6cacc"/>
-      <w:bookmarkStart w:id="193" w:name="_Toc242641370"/>
+      <w:bookmarkStart w:id="193" w:name="_Toc242656852"/>
       <w:bookmarkEnd w:id="190"/>
       <w:r>
         <w:t>HU-7.4 — Personalizar la clínica: marca y tipos de cita</w:t>
@@ -34023,7 +34026,7 @@
         <w:pStyle w:val="Ttulo2"/>
       </w:pPr>
       <w:bookmarkStart w:id="194" w:name="_7004fcdc7c25449422304e35d609c3113b471f6"/>
-      <w:bookmarkStart w:id="195" w:name="_Toc242641371"/>
+      <w:bookmarkStart w:id="195" w:name="_Toc242656853"/>
       <w:bookmarkEnd w:id="192"/>
       <w:r>
         <w:t>HU-7.5 — Parámetros del sistema configurables</w:t>
@@ -34293,7 +34296,7 @@
         <w:pStyle w:val="Ttulo1"/>
       </w:pPr>
       <w:bookmarkStart w:id="196" w:name="_99f8c38fc90f872e869cb5a42176a81ce60716e"/>
-      <w:bookmarkStart w:id="197" w:name="_Toc242641372"/>
+      <w:bookmarkStart w:id="197" w:name="_Toc242656854"/>
       <w:bookmarkEnd w:id="184"/>
       <w:bookmarkEnd w:id="194"/>
       <w:r>
@@ -34322,7 +34325,7 @@
         <w:pStyle w:val="Ttulo2"/>
       </w:pPr>
       <w:bookmarkStart w:id="198" w:name="_6b93d7ad964c8104bb83fc9231a04e4fc4e5a57"/>
-      <w:bookmarkStart w:id="199" w:name="_Toc242641373"/>
+      <w:bookmarkStart w:id="199" w:name="_Toc242656855"/>
       <w:r>
         <w:t>HU-8.1 — Calificar al veterinario tras una consulta atendida</w:t>
       </w:r>
@@ -34627,7 +34630,7 @@
         <w:pStyle w:val="Ttulo2"/>
       </w:pPr>
       <w:bookmarkStart w:id="200" w:name="_6de705a3e3f0ae827b0b0206b40472100ec5dc2"/>
-      <w:bookmarkStart w:id="201" w:name="_Toc242641374"/>
+      <w:bookmarkStart w:id="201" w:name="_Toc242656856"/>
       <w:bookmarkEnd w:id="198"/>
       <w:r>
         <w:t>HU-8.2 — Perfil público del veterinario</w:t>
@@ -34873,7 +34876,7 @@
         <w:pStyle w:val="Ttulo2"/>
       </w:pPr>
       <w:bookmarkStart w:id="202" w:name="_8d0438a4c21826cdef43f79f40a5abd8a052054"/>
-      <w:bookmarkStart w:id="203" w:name="_Toc242641375"/>
+      <w:bookmarkStart w:id="203" w:name="_Toc242656857"/>
       <w:bookmarkEnd w:id="200"/>
       <w:r>
         <w:lastRenderedPageBreak/>
@@ -35119,7 +35122,7 @@
         <w:pStyle w:val="Ttulo2"/>
       </w:pPr>
       <w:bookmarkStart w:id="204" w:name="_9d375ff686aceee42a269dcad0f742f5e2f3757"/>
-      <w:bookmarkStart w:id="205" w:name="_Toc242641376"/>
+      <w:bookmarkStart w:id="205" w:name="_Toc242656858"/>
       <w:bookmarkEnd w:id="202"/>
       <w:r>
         <w:t>HU-8.4 — Tiempos de envío de recordatorios configurables</w:t>
@@ -35343,7 +35346,7 @@
         <w:pStyle w:val="Ttulo2"/>
       </w:pPr>
       <w:bookmarkStart w:id="206" w:name="_09d49d8f9ce2d4331632fad53df16df04e0463f"/>
-      <w:bookmarkStart w:id="207" w:name="_Toc242641377"/>
+      <w:bookmarkStart w:id="207" w:name="_Toc242656859"/>
       <w:bookmarkEnd w:id="204"/>
       <w:r>
         <w:t>HU-8.5 — Bitácora de correos y notificaciones</w:t>
@@ -35567,7 +35570,7 @@
         <w:pStyle w:val="Ttulo1"/>
       </w:pPr>
       <w:bookmarkStart w:id="208" w:name="_739f4e5454618e53e20de4c2474955375ba75c3"/>
-      <w:bookmarkStart w:id="209" w:name="_Toc242641378"/>
+      <w:bookmarkStart w:id="209" w:name="_Toc242656860"/>
       <w:bookmarkEnd w:id="196"/>
       <w:bookmarkEnd w:id="206"/>
       <w:r>
@@ -35589,7 +35592,7 @@
         <w:pStyle w:val="Ttulo2"/>
       </w:pPr>
       <w:bookmarkStart w:id="210" w:name="_062138411ab05c870ba796ff3d39feef69a18f5"/>
-      <w:bookmarkStart w:id="211" w:name="_Toc242641379"/>
+      <w:bookmarkStart w:id="211" w:name="_Toc242656861"/>
       <w:r>
         <w:t>HU-9.1 — Página pública y políticas legales</w:t>
       </w:r>
@@ -35814,7 +35817,7 @@
         <w:pStyle w:val="Ttulo1"/>
       </w:pPr>
       <w:bookmarkStart w:id="212" w:name="_6e6ded5804ca164f89e595fd787218d3285fdda"/>
-      <w:bookmarkStart w:id="213" w:name="_Toc242641380"/>
+      <w:bookmarkStart w:id="213" w:name="_Toc242656862"/>
       <w:bookmarkEnd w:id="208"/>
       <w:bookmarkEnd w:id="210"/>
       <w:r>
@@ -35864,7 +35867,7 @@
         <w:pStyle w:val="Ttulo2"/>
       </w:pPr>
       <w:bookmarkStart w:id="214" w:name="_90f84fdbbdd2d6886c9b4105f5da1ebd566ad0a"/>
-      <w:bookmarkStart w:id="215" w:name="_Toc242641381"/>
+      <w:bookmarkStart w:id="215" w:name="_Toc242656863"/>
       <w:r>
         <w:t>Entrega v2.0 — imprescindible para la presentación (28 historias, 159 puntos)</w:t>
       </w:r>
@@ -37362,7 +37365,7 @@
         <w:pStyle w:val="Ttulo2"/>
       </w:pPr>
       <w:bookmarkStart w:id="216" w:name="_167e61555e1d771b624b3ccd3d20e15ce100bb9"/>
-      <w:bookmarkStart w:id="217" w:name="_Toc242641382"/>
+      <w:bookmarkStart w:id="217" w:name="_Toc242656864"/>
       <w:bookmarkEnd w:id="214"/>
       <w:r>
         <w:t>Entrega v2.1 — completa el alcance (16 historias, 62 puntos)</w:t>
@@ -38304,7 +38307,7 @@
         <w:pStyle w:val="Ttulo2"/>
       </w:pPr>
       <w:bookmarkStart w:id="218" w:name="_18e859a36e2a2c7f781eaf2084ffc20b263712e"/>
-      <w:bookmarkStart w:id="219" w:name="_Toc242641383"/>
+      <w:bookmarkStart w:id="219" w:name="_Toc242656865"/>
       <w:bookmarkEnd w:id="216"/>
       <w:r>
         <w:lastRenderedPageBreak/>
@@ -38656,7 +38659,7 @@
         <w:pStyle w:val="Ttulo1"/>
       </w:pPr>
       <w:bookmarkStart w:id="220" w:name="_2bd3782f46f42f4ba497da64d292df25adf2039"/>
-      <w:bookmarkStart w:id="221" w:name="_Toc242641384"/>
+      <w:bookmarkStart w:id="221" w:name="_Toc242656866"/>
       <w:bookmarkEnd w:id="212"/>
       <w:bookmarkEnd w:id="218"/>
       <w:r>
@@ -43187,7 +43190,7 @@
         <w:pStyle w:val="Ttulo1"/>
       </w:pPr>
       <w:bookmarkStart w:id="222" w:name="_628434b2c6f40c9643f3958509c62867ee6f47b"/>
-      <w:bookmarkStart w:id="223" w:name="_Toc242641385"/>
+      <w:bookmarkStart w:id="223" w:name="_Toc242656867"/>
       <w:bookmarkEnd w:id="220"/>
       <w:r>
         <w:lastRenderedPageBreak/>
@@ -48752,7 +48755,7 @@
               <w:noProof/>
             </w:rPr>
             <w:drawing>
-              <wp:inline distT="0" distB="0" distL="0" distR="0" wp14:anchorId="37E1B9B4" wp14:editId="37E1B9B5">
+              <wp:inline distT="0" distB="0" distL="0" distR="0" wp14:anchorId="5EA50516" wp14:editId="5EA50517">
                 <wp:extent cx="324000" cy="324000"/>
                 <wp:effectExtent l="0" t="0" r="0" b="0"/>
                 <wp:docPr id="9001" name="Logo Zooki"/>
@@ -48919,7 +48922,7 @@
   <w:abstractNum w:abstractNumId="0" w15:restartNumberingAfterBreak="0">
     <w:nsid w:val="0000A991"/>
     <w:multiLevelType w:val="multilevel"/>
-    <w:tmpl w:val="01BA8F98"/>
+    <w:tmpl w:val="B09E50D8"/>
     <w:lvl w:ilvl="0">
       <w:numFmt w:val="bullet"/>
       <w:lvlText w:val=""/>
@@ -49020,292 +49023,292 @@
       </w:rPr>
     </w:lvl>
   </w:abstractNum>
-  <w:num w:numId="1" w16cid:durableId="1559780604">
+  <w:num w:numId="1" w16cid:durableId="988830744">
     <w:abstractNumId w:val="0"/>
   </w:num>
-  <w:num w:numId="2" w16cid:durableId="1284270827">
+  <w:num w:numId="2" w16cid:durableId="1254780025">
     <w:abstractNumId w:val="0"/>
   </w:num>
-  <w:num w:numId="3" w16cid:durableId="659583378">
+  <w:num w:numId="3" w16cid:durableId="1507095110">
     <w:abstractNumId w:val="0"/>
   </w:num>
-  <w:num w:numId="4" w16cid:durableId="1206714671">
+  <w:num w:numId="4" w16cid:durableId="1271086174">
     <w:abstractNumId w:val="0"/>
   </w:num>
-  <w:num w:numId="5" w16cid:durableId="1441996208">
+  <w:num w:numId="5" w16cid:durableId="1579514800">
     <w:abstractNumId w:val="0"/>
   </w:num>
-  <w:num w:numId="6" w16cid:durableId="1166245772">
+  <w:num w:numId="6" w16cid:durableId="1793867414">
     <w:abstractNumId w:val="0"/>
   </w:num>
-  <w:num w:numId="7" w16cid:durableId="1526670572">
+  <w:num w:numId="7" w16cid:durableId="832334268">
     <w:abstractNumId w:val="0"/>
   </w:num>
-  <w:num w:numId="8" w16cid:durableId="1682119830">
+  <w:num w:numId="8" w16cid:durableId="607271824">
     <w:abstractNumId w:val="0"/>
   </w:num>
-  <w:num w:numId="9" w16cid:durableId="1888878896">
+  <w:num w:numId="9" w16cid:durableId="186522901">
     <w:abstractNumId w:val="0"/>
   </w:num>
-  <w:num w:numId="10" w16cid:durableId="1435051964">
+  <w:num w:numId="10" w16cid:durableId="95903980">
     <w:abstractNumId w:val="0"/>
   </w:num>
-  <w:num w:numId="11" w16cid:durableId="1372921034">
+  <w:num w:numId="11" w16cid:durableId="806557155">
     <w:abstractNumId w:val="0"/>
   </w:num>
-  <w:num w:numId="12" w16cid:durableId="2125078020">
+  <w:num w:numId="12" w16cid:durableId="1337928371">
     <w:abstractNumId w:val="0"/>
   </w:num>
-  <w:num w:numId="13" w16cid:durableId="1253469116">
+  <w:num w:numId="13" w16cid:durableId="2048529398">
     <w:abstractNumId w:val="0"/>
   </w:num>
-  <w:num w:numId="14" w16cid:durableId="620382399">
+  <w:num w:numId="14" w16cid:durableId="2068532150">
     <w:abstractNumId w:val="0"/>
   </w:num>
-  <w:num w:numId="15" w16cid:durableId="694379467">
+  <w:num w:numId="15" w16cid:durableId="485516725">
     <w:abstractNumId w:val="0"/>
   </w:num>
-  <w:num w:numId="16" w16cid:durableId="195969266">
+  <w:num w:numId="16" w16cid:durableId="427508919">
     <w:abstractNumId w:val="0"/>
   </w:num>
-  <w:num w:numId="17" w16cid:durableId="214970000">
+  <w:num w:numId="17" w16cid:durableId="1531525781">
     <w:abstractNumId w:val="0"/>
   </w:num>
-  <w:num w:numId="18" w16cid:durableId="219444241">
+  <w:num w:numId="18" w16cid:durableId="669984608">
     <w:abstractNumId w:val="0"/>
   </w:num>
-  <w:num w:numId="19" w16cid:durableId="442304685">
+  <w:num w:numId="19" w16cid:durableId="1759015592">
     <w:abstractNumId w:val="0"/>
   </w:num>
-  <w:num w:numId="20" w16cid:durableId="1586380780">
+  <w:num w:numId="20" w16cid:durableId="74907693">
     <w:abstractNumId w:val="0"/>
   </w:num>
-  <w:num w:numId="21" w16cid:durableId="1816215878">
+  <w:num w:numId="21" w16cid:durableId="1808013208">
     <w:abstractNumId w:val="0"/>
   </w:num>
-  <w:num w:numId="22" w16cid:durableId="1242566708">
+  <w:num w:numId="22" w16cid:durableId="1967806503">
     <w:abstractNumId w:val="0"/>
   </w:num>
-  <w:num w:numId="23" w16cid:durableId="783422545">
+  <w:num w:numId="23" w16cid:durableId="879827079">
     <w:abstractNumId w:val="0"/>
   </w:num>
-  <w:num w:numId="24" w16cid:durableId="297228111">
+  <w:num w:numId="24" w16cid:durableId="482816358">
     <w:abstractNumId w:val="0"/>
   </w:num>
-  <w:num w:numId="25" w16cid:durableId="1656832973">
+  <w:num w:numId="25" w16cid:durableId="2107338268">
     <w:abstractNumId w:val="0"/>
   </w:num>
-  <w:num w:numId="26" w16cid:durableId="1635601777">
+  <w:num w:numId="26" w16cid:durableId="2063479882">
     <w:abstractNumId w:val="0"/>
   </w:num>
-  <w:num w:numId="27" w16cid:durableId="1213034688">
+  <w:num w:numId="27" w16cid:durableId="332492013">
     <w:abstractNumId w:val="0"/>
   </w:num>
-  <w:num w:numId="28" w16cid:durableId="1250232153">
+  <w:num w:numId="28" w16cid:durableId="1185022422">
     <w:abstractNumId w:val="0"/>
   </w:num>
-  <w:num w:numId="29" w16cid:durableId="109974449">
+  <w:num w:numId="29" w16cid:durableId="1220020382">
     <w:abstractNumId w:val="0"/>
   </w:num>
-  <w:num w:numId="30" w16cid:durableId="19862895">
+  <w:num w:numId="30" w16cid:durableId="1676834524">
     <w:abstractNumId w:val="0"/>
   </w:num>
-  <w:num w:numId="31" w16cid:durableId="1524858420">
+  <w:num w:numId="31" w16cid:durableId="411972847">
     <w:abstractNumId w:val="0"/>
   </w:num>
-  <w:num w:numId="32" w16cid:durableId="1510218620">
+  <w:num w:numId="32" w16cid:durableId="1863089278">
     <w:abstractNumId w:val="0"/>
   </w:num>
-  <w:num w:numId="33" w16cid:durableId="1119109595">
+  <w:num w:numId="33" w16cid:durableId="759258555">
     <w:abstractNumId w:val="0"/>
   </w:num>
-  <w:num w:numId="34" w16cid:durableId="1082021825">
+  <w:num w:numId="34" w16cid:durableId="1550679745">
     <w:abstractNumId w:val="0"/>
   </w:num>
-  <w:num w:numId="35" w16cid:durableId="435367608">
+  <w:num w:numId="35" w16cid:durableId="1545870650">
     <w:abstractNumId w:val="0"/>
   </w:num>
-  <w:num w:numId="36" w16cid:durableId="189226435">
+  <w:num w:numId="36" w16cid:durableId="1082408665">
     <w:abstractNumId w:val="0"/>
   </w:num>
-  <w:num w:numId="37" w16cid:durableId="360785127">
+  <w:num w:numId="37" w16cid:durableId="1084033522">
     <w:abstractNumId w:val="0"/>
   </w:num>
-  <w:num w:numId="38" w16cid:durableId="1366367854">
+  <w:num w:numId="38" w16cid:durableId="1245651455">
     <w:abstractNumId w:val="0"/>
   </w:num>
-  <w:num w:numId="39" w16cid:durableId="1331174966">
+  <w:num w:numId="39" w16cid:durableId="62142539">
     <w:abstractNumId w:val="0"/>
   </w:num>
-  <w:num w:numId="40" w16cid:durableId="1483737949">
+  <w:num w:numId="40" w16cid:durableId="603928774">
     <w:abstractNumId w:val="0"/>
   </w:num>
-  <w:num w:numId="41" w16cid:durableId="593709097">
+  <w:num w:numId="41" w16cid:durableId="1818641987">
     <w:abstractNumId w:val="0"/>
   </w:num>
-  <w:num w:numId="42" w16cid:durableId="1098528974">
+  <w:num w:numId="42" w16cid:durableId="204760891">
     <w:abstractNumId w:val="0"/>
   </w:num>
-  <w:num w:numId="43" w16cid:durableId="1826235132">
+  <w:num w:numId="43" w16cid:durableId="1039429724">
     <w:abstractNumId w:val="0"/>
   </w:num>
-  <w:num w:numId="44" w16cid:durableId="782722751">
+  <w:num w:numId="44" w16cid:durableId="207765375">
     <w:abstractNumId w:val="0"/>
   </w:num>
-  <w:num w:numId="45" w16cid:durableId="653486250">
+  <w:num w:numId="45" w16cid:durableId="1426149154">
     <w:abstractNumId w:val="0"/>
   </w:num>
-  <w:num w:numId="46" w16cid:durableId="2099785335">
+  <w:num w:numId="46" w16cid:durableId="263463397">
     <w:abstractNumId w:val="0"/>
   </w:num>
-  <w:num w:numId="47" w16cid:durableId="288440147">
+  <w:num w:numId="47" w16cid:durableId="933512528">
     <w:abstractNumId w:val="0"/>
   </w:num>
-  <w:num w:numId="48" w16cid:durableId="979917891">
+  <w:num w:numId="48" w16cid:durableId="1650868003">
     <w:abstractNumId w:val="0"/>
   </w:num>
-  <w:num w:numId="49" w16cid:durableId="841817085">
+  <w:num w:numId="49" w16cid:durableId="1558977247">
     <w:abstractNumId w:val="0"/>
   </w:num>
-  <w:num w:numId="50" w16cid:durableId="1271160643">
+  <w:num w:numId="50" w16cid:durableId="905804381">
     <w:abstractNumId w:val="0"/>
   </w:num>
-  <w:num w:numId="51" w16cid:durableId="732776573">
+  <w:num w:numId="51" w16cid:durableId="554781271">
     <w:abstractNumId w:val="0"/>
   </w:num>
-  <w:num w:numId="52" w16cid:durableId="810026291">
+  <w:num w:numId="52" w16cid:durableId="404766951">
     <w:abstractNumId w:val="0"/>
   </w:num>
-  <w:num w:numId="53" w16cid:durableId="565994257">
+  <w:num w:numId="53" w16cid:durableId="481773685">
     <w:abstractNumId w:val="0"/>
   </w:num>
-  <w:num w:numId="54" w16cid:durableId="1584028898">
+  <w:num w:numId="54" w16cid:durableId="610474153">
     <w:abstractNumId w:val="0"/>
   </w:num>
-  <w:num w:numId="55" w16cid:durableId="36778157">
+  <w:num w:numId="55" w16cid:durableId="457838214">
     <w:abstractNumId w:val="0"/>
   </w:num>
-  <w:num w:numId="56" w16cid:durableId="1515073222">
+  <w:num w:numId="56" w16cid:durableId="1201355820">
     <w:abstractNumId w:val="0"/>
   </w:num>
-  <w:num w:numId="57" w16cid:durableId="359362205">
+  <w:num w:numId="57" w16cid:durableId="417100455">
     <w:abstractNumId w:val="0"/>
   </w:num>
-  <w:num w:numId="58" w16cid:durableId="199050787">
+  <w:num w:numId="58" w16cid:durableId="259460245">
     <w:abstractNumId w:val="0"/>
   </w:num>
-  <w:num w:numId="59" w16cid:durableId="676543608">
+  <w:num w:numId="59" w16cid:durableId="1079327765">
     <w:abstractNumId w:val="0"/>
   </w:num>
-  <w:num w:numId="60" w16cid:durableId="1698846317">
+  <w:num w:numId="60" w16cid:durableId="697049387">
     <w:abstractNumId w:val="0"/>
   </w:num>
-  <w:num w:numId="61" w16cid:durableId="1050419814">
+  <w:num w:numId="61" w16cid:durableId="568921336">
     <w:abstractNumId w:val="0"/>
   </w:num>
-  <w:num w:numId="62" w16cid:durableId="1793747471">
+  <w:num w:numId="62" w16cid:durableId="239095404">
     <w:abstractNumId w:val="0"/>
   </w:num>
-  <w:num w:numId="63" w16cid:durableId="544369597">
+  <w:num w:numId="63" w16cid:durableId="987133184">
     <w:abstractNumId w:val="0"/>
   </w:num>
-  <w:num w:numId="64" w16cid:durableId="11036274">
+  <w:num w:numId="64" w16cid:durableId="488449228">
     <w:abstractNumId w:val="0"/>
   </w:num>
-  <w:num w:numId="65" w16cid:durableId="154296679">
+  <w:num w:numId="65" w16cid:durableId="621231224">
     <w:abstractNumId w:val="0"/>
   </w:num>
-  <w:num w:numId="66" w16cid:durableId="1705907833">
+  <w:num w:numId="66" w16cid:durableId="1082991165">
     <w:abstractNumId w:val="0"/>
   </w:num>
-  <w:num w:numId="67" w16cid:durableId="413169801">
+  <w:num w:numId="67" w16cid:durableId="302854023">
     <w:abstractNumId w:val="0"/>
   </w:num>
-  <w:num w:numId="68" w16cid:durableId="554046056">
+  <w:num w:numId="68" w16cid:durableId="624695481">
     <w:abstractNumId w:val="0"/>
   </w:num>
-  <w:num w:numId="69" w16cid:durableId="1215042992">
+  <w:num w:numId="69" w16cid:durableId="1266033908">
     <w:abstractNumId w:val="0"/>
   </w:num>
-  <w:num w:numId="70" w16cid:durableId="379599727">
+  <w:num w:numId="70" w16cid:durableId="223834103">
     <w:abstractNumId w:val="0"/>
   </w:num>
-  <w:num w:numId="71" w16cid:durableId="330304487">
+  <w:num w:numId="71" w16cid:durableId="199978360">
     <w:abstractNumId w:val="0"/>
   </w:num>
-  <w:num w:numId="72" w16cid:durableId="508297947">
+  <w:num w:numId="72" w16cid:durableId="934872374">
     <w:abstractNumId w:val="0"/>
   </w:num>
-  <w:num w:numId="73" w16cid:durableId="650523613">
+  <w:num w:numId="73" w16cid:durableId="671222541">
     <w:abstractNumId w:val="0"/>
   </w:num>
-  <w:num w:numId="74" w16cid:durableId="1755737443">
+  <w:num w:numId="74" w16cid:durableId="1809129716">
     <w:abstractNumId w:val="0"/>
   </w:num>
-  <w:num w:numId="75" w16cid:durableId="363481302">
+  <w:num w:numId="75" w16cid:durableId="345446568">
     <w:abstractNumId w:val="0"/>
   </w:num>
-  <w:num w:numId="76" w16cid:durableId="1691100446">
+  <w:num w:numId="76" w16cid:durableId="533228880">
     <w:abstractNumId w:val="0"/>
   </w:num>
-  <w:num w:numId="77" w16cid:durableId="2097970643">
+  <w:num w:numId="77" w16cid:durableId="813449379">
     <w:abstractNumId w:val="0"/>
   </w:num>
-  <w:num w:numId="78" w16cid:durableId="1037008070">
+  <w:num w:numId="78" w16cid:durableId="1040082966">
     <w:abstractNumId w:val="0"/>
   </w:num>
-  <w:num w:numId="79" w16cid:durableId="1514025667">
+  <w:num w:numId="79" w16cid:durableId="297881832">
     <w:abstractNumId w:val="0"/>
   </w:num>
-  <w:num w:numId="80" w16cid:durableId="776290716">
+  <w:num w:numId="80" w16cid:durableId="987170116">
     <w:abstractNumId w:val="0"/>
   </w:num>
-  <w:num w:numId="81" w16cid:durableId="257063903">
+  <w:num w:numId="81" w16cid:durableId="136604841">
     <w:abstractNumId w:val="0"/>
   </w:num>
-  <w:num w:numId="82" w16cid:durableId="591745913">
+  <w:num w:numId="82" w16cid:durableId="1786849492">
     <w:abstractNumId w:val="0"/>
   </w:num>
-  <w:num w:numId="83" w16cid:durableId="1431389486">
+  <w:num w:numId="83" w16cid:durableId="1309092611">
     <w:abstractNumId w:val="0"/>
   </w:num>
-  <w:num w:numId="84" w16cid:durableId="178932628">
+  <w:num w:numId="84" w16cid:durableId="1648973621">
     <w:abstractNumId w:val="0"/>
   </w:num>
-  <w:num w:numId="85" w16cid:durableId="517501396">
+  <w:num w:numId="85" w16cid:durableId="559823291">
     <w:abstractNumId w:val="0"/>
   </w:num>
-  <w:num w:numId="86" w16cid:durableId="1384983213">
+  <w:num w:numId="86" w16cid:durableId="908884560">
     <w:abstractNumId w:val="0"/>
   </w:num>
-  <w:num w:numId="87" w16cid:durableId="499077005">
+  <w:num w:numId="87" w16cid:durableId="332270449">
     <w:abstractNumId w:val="0"/>
   </w:num>
-  <w:num w:numId="88" w16cid:durableId="935527111">
+  <w:num w:numId="88" w16cid:durableId="521212711">
     <w:abstractNumId w:val="0"/>
   </w:num>
-  <w:num w:numId="89" w16cid:durableId="1545288284">
+  <w:num w:numId="89" w16cid:durableId="1202281416">
     <w:abstractNumId w:val="0"/>
   </w:num>
-  <w:num w:numId="90" w16cid:durableId="875703834">
+  <w:num w:numId="90" w16cid:durableId="754936023">
     <w:abstractNumId w:val="0"/>
   </w:num>
-  <w:num w:numId="91" w16cid:durableId="1237058015">
+  <w:num w:numId="91" w16cid:durableId="784425211">
     <w:abstractNumId w:val="0"/>
   </w:num>
-  <w:num w:numId="92" w16cid:durableId="1210414032">
+  <w:num w:numId="92" w16cid:durableId="282349837">
     <w:abstractNumId w:val="0"/>
   </w:num>
-  <w:num w:numId="93" w16cid:durableId="1243833935">
+  <w:num w:numId="93" w16cid:durableId="963542968">
     <w:abstractNumId w:val="0"/>
   </w:num>
-  <w:num w:numId="94" w16cid:durableId="655913996">
+  <w:num w:numId="94" w16cid:durableId="794757186">
     <w:abstractNumId w:val="0"/>
   </w:num>
-  <w:num w:numId="95" w16cid:durableId="957027765">
+  <w:num w:numId="95" w16cid:durableId="1359355408">
     <w:abstractNumId w:val="0"/>
   </w:num>
-  <w:num w:numId="96" w16cid:durableId="1467774097">
+  <w:num w:numId="96" w16cid:durableId="1077020616">
     <w:abstractNumId w:val="0"/>
   </w:num>
   <w:numIdMacAtCleanup w:val="96"/>
@@ -50697,7 +50700,7 @@
     <w:autoRedefine/>
     <w:uiPriority w:val="39"/>
     <w:unhideWhenUsed/>
-    <w:rsid w:val="0036150E"/>
+    <w:rsid w:val="004458A4"/>
     <w:pPr>
       <w:spacing w:after="100" w:line="278" w:lineRule="auto"/>
       <w:ind w:left="480"/>
@@ -50716,7 +50719,7 @@
     <w:autoRedefine/>
     <w:uiPriority w:val="39"/>
     <w:unhideWhenUsed/>
-    <w:rsid w:val="0036150E"/>
+    <w:rsid w:val="004458A4"/>
     <w:pPr>
       <w:spacing w:after="100" w:line="278" w:lineRule="auto"/>
       <w:ind w:left="720"/>
@@ -50735,7 +50738,7 @@
     <w:autoRedefine/>
     <w:uiPriority w:val="39"/>
     <w:unhideWhenUsed/>
-    <w:rsid w:val="0036150E"/>
+    <w:rsid w:val="004458A4"/>
     <w:pPr>
       <w:spacing w:after="100" w:line="278" w:lineRule="auto"/>
       <w:ind w:left="960"/>
@@ -50754,7 +50757,7 @@
     <w:autoRedefine/>
     <w:uiPriority w:val="39"/>
     <w:unhideWhenUsed/>
-    <w:rsid w:val="0036150E"/>
+    <w:rsid w:val="004458A4"/>
     <w:pPr>
       <w:spacing w:after="100" w:line="278" w:lineRule="auto"/>
       <w:ind w:left="1200"/>
@@ -50773,7 +50776,7 @@
     <w:autoRedefine/>
     <w:uiPriority w:val="39"/>
     <w:unhideWhenUsed/>
-    <w:rsid w:val="0036150E"/>
+    <w:rsid w:val="004458A4"/>
     <w:pPr>
       <w:spacing w:after="100" w:line="278" w:lineRule="auto"/>
       <w:ind w:left="1440"/>
@@ -50792,7 +50795,7 @@
     <w:autoRedefine/>
     <w:uiPriority w:val="39"/>
     <w:unhideWhenUsed/>
-    <w:rsid w:val="0036150E"/>
+    <w:rsid w:val="004458A4"/>
     <w:pPr>
       <w:spacing w:after="100" w:line="278" w:lineRule="auto"/>
       <w:ind w:left="1680"/>
@@ -50811,7 +50814,7 @@
     <w:autoRedefine/>
     <w:uiPriority w:val="39"/>
     <w:unhideWhenUsed/>
-    <w:rsid w:val="0036150E"/>
+    <w:rsid w:val="004458A4"/>
     <w:pPr>
       <w:spacing w:after="100" w:line="278" w:lineRule="auto"/>
       <w:ind w:left="1920"/>
@@ -50829,7 +50832,7 @@
     <w:uiPriority w:val="99"/>
     <w:semiHidden/>
     <w:unhideWhenUsed/>
-    <w:rsid w:val="0036150E"/>
+    <w:rsid w:val="004458A4"/>
     <w:rPr>
       <w:color w:val="605E5C"/>
       <w:shd w:val="clear" w:color="auto" w:fill="E1DFDD"/>

</xml_diff>

<commit_message>
fix(suscripcion): recuperar checkout abandonado automaticamente (RE-0.5.15)
</commit_message>
<xml_diff>
--- a/public/docs/descargas/hu.docx
+++ b/public/docs/descargas/hu.docx
@@ -93,7 +93,7 @@
           <w:noProof/>
         </w:rPr>
         <w:drawing>
-          <wp:inline distT="0" distB="0" distL="0" distR="0" wp14:anchorId="16F4287D" wp14:editId="2FC1FCBB">
+          <wp:inline distT="0" distB="0" distL="0" distR="0" wp14:anchorId="2D2418D9" wp14:editId="2D2418DA">
             <wp:extent cx="395999" cy="405503"/>
             <wp:effectExtent l="0" t="0" r="0" b="0"/>
             <wp:docPr id="10" name="Picture"/>
@@ -409,7 +409,7 @@
       <w:r>
         <w:fldChar w:fldCharType="separate"/>
       </w:r>
-      <w:hyperlink w:anchor="_Toc243901980" w:history="1">
+      <w:hyperlink w:anchor="_Toc243924372" w:history="1">
         <w:r>
           <w:rPr>
             <w:rStyle w:val="Hipervnculo"/>
@@ -445,7 +445,7 @@
             <w:noProof/>
             <w:webHidden/>
           </w:rPr>
-          <w:instrText xml:space="preserve"> PAGEREF _Toc243901980 \h </w:instrText>
+          <w:instrText xml:space="preserve"> PAGEREF _Toc243924372 \h </w:instrText>
         </w:r>
         <w:r>
           <w:rPr>
@@ -488,7 +488,7 @@
           <w14:ligatures w14:val="standardContextual"/>
         </w:rPr>
       </w:pPr>
-      <w:hyperlink w:anchor="_Toc243901981" w:history="1">
+      <w:hyperlink w:anchor="_Toc243924373" w:history="1">
         <w:r>
           <w:rPr>
             <w:rStyle w:val="Hipervnculo"/>
@@ -515,7 +515,7 @@
             <w:noProof/>
             <w:webHidden/>
           </w:rPr>
-          <w:instrText xml:space="preserve"> PAGEREF _Toc243901981 \h </w:instrText>
+          <w:instrText xml:space="preserve"> PAGEREF _Toc243924373 \h </w:instrText>
         </w:r>
         <w:r>
           <w:rPr>
@@ -558,7 +558,7 @@
           <w14:ligatures w14:val="standardContextual"/>
         </w:rPr>
       </w:pPr>
-      <w:hyperlink w:anchor="_Toc243901982" w:history="1">
+      <w:hyperlink w:anchor="_Toc243924374" w:history="1">
         <w:r>
           <w:rPr>
             <w:rStyle w:val="Hipervnculo"/>
@@ -585,7 +585,7 @@
             <w:noProof/>
             <w:webHidden/>
           </w:rPr>
-          <w:instrText xml:space="preserve"> PAGEREF _Toc243901982 \h </w:instrText>
+          <w:instrText xml:space="preserve"> PAGEREF _Toc243924374 \h </w:instrText>
         </w:r>
         <w:r>
           <w:rPr>
@@ -605,7 +605,7 @@
             <w:noProof/>
             <w:webHidden/>
           </w:rPr>
-          <w:t>8</w:t>
+          <w:t>9</w:t>
         </w:r>
         <w:r>
           <w:rPr>
@@ -628,7 +628,7 @@
           <w14:ligatures w14:val="standardContextual"/>
         </w:rPr>
       </w:pPr>
-      <w:hyperlink w:anchor="_Toc243901983" w:history="1">
+      <w:hyperlink w:anchor="_Toc243924375" w:history="1">
         <w:r>
           <w:rPr>
             <w:rStyle w:val="Hipervnculo"/>
@@ -655,7 +655,7 @@
             <w:noProof/>
             <w:webHidden/>
           </w:rPr>
-          <w:instrText xml:space="preserve"> PAGEREF _Toc243901983 \h </w:instrText>
+          <w:instrText xml:space="preserve"> PAGEREF _Toc243924375 \h </w:instrText>
         </w:r>
         <w:r>
           <w:rPr>
@@ -698,7 +698,7 @@
           <w14:ligatures w14:val="standardContextual"/>
         </w:rPr>
       </w:pPr>
-      <w:hyperlink w:anchor="_Toc243901984" w:history="1">
+      <w:hyperlink w:anchor="_Toc243924376" w:history="1">
         <w:r>
           <w:rPr>
             <w:rStyle w:val="Hipervnculo"/>
@@ -725,7 +725,7 @@
             <w:noProof/>
             <w:webHidden/>
           </w:rPr>
-          <w:instrText xml:space="preserve"> PAGEREF _Toc243901984 \h </w:instrText>
+          <w:instrText xml:space="preserve"> PAGEREF _Toc243924376 \h </w:instrText>
         </w:r>
         <w:r>
           <w:rPr>
@@ -768,7 +768,7 @@
           <w14:ligatures w14:val="standardContextual"/>
         </w:rPr>
       </w:pPr>
-      <w:hyperlink w:anchor="_Toc243901985" w:history="1">
+      <w:hyperlink w:anchor="_Toc243924377" w:history="1">
         <w:r>
           <w:rPr>
             <w:rStyle w:val="Hipervnculo"/>
@@ -795,7 +795,7 @@
             <w:noProof/>
             <w:webHidden/>
           </w:rPr>
-          <w:instrText xml:space="preserve"> PAGEREF _Toc243901985 \h </w:instrText>
+          <w:instrText xml:space="preserve"> PAGEREF _Toc243924377 \h </w:instrText>
         </w:r>
         <w:r>
           <w:rPr>
@@ -841,7 +841,7 @@
           <w14:ligatures w14:val="standardContextual"/>
         </w:rPr>
       </w:pPr>
-      <w:hyperlink w:anchor="_Toc243901986" w:history="1">
+      <w:hyperlink w:anchor="_Toc243924378" w:history="1">
         <w:r>
           <w:rPr>
             <w:rStyle w:val="Hipervnculo"/>
@@ -868,7 +868,7 @@
             <w:noProof/>
             <w:webHidden/>
           </w:rPr>
-          <w:instrText xml:space="preserve"> PAGEREF _Toc243901986 \h </w:instrText>
+          <w:instrText xml:space="preserve"> PAGEREF _Toc243924378 \h </w:instrText>
         </w:r>
         <w:r>
           <w:rPr>
@@ -911,7 +911,7 @@
           <w14:ligatures w14:val="standardContextual"/>
         </w:rPr>
       </w:pPr>
-      <w:hyperlink w:anchor="_Toc243901987" w:history="1">
+      <w:hyperlink w:anchor="_Toc243924379" w:history="1">
         <w:r>
           <w:rPr>
             <w:rStyle w:val="Hipervnculo"/>
@@ -938,7 +938,7 @@
             <w:noProof/>
             <w:webHidden/>
           </w:rPr>
-          <w:instrText xml:space="preserve"> PAGEREF _Toc243901987 \h </w:instrText>
+          <w:instrText xml:space="preserve"> PAGEREF _Toc243924379 \h </w:instrText>
         </w:r>
         <w:r>
           <w:rPr>
@@ -981,7 +981,7 @@
           <w14:ligatures w14:val="standardContextual"/>
         </w:rPr>
       </w:pPr>
-      <w:hyperlink w:anchor="_Toc243901988" w:history="1">
+      <w:hyperlink w:anchor="_Toc243924380" w:history="1">
         <w:r>
           <w:rPr>
             <w:rStyle w:val="Hipervnculo"/>
@@ -1008,7 +1008,7 @@
             <w:noProof/>
             <w:webHidden/>
           </w:rPr>
-          <w:instrText xml:space="preserve"> PAGEREF _Toc243901988 \h </w:instrText>
+          <w:instrText xml:space="preserve"> PAGEREF _Toc243924380 \h </w:instrText>
         </w:r>
         <w:r>
           <w:rPr>
@@ -1051,7 +1051,7 @@
           <w14:ligatures w14:val="standardContextual"/>
         </w:rPr>
       </w:pPr>
-      <w:hyperlink w:anchor="_Toc243901989" w:history="1">
+      <w:hyperlink w:anchor="_Toc243924381" w:history="1">
         <w:r>
           <w:rPr>
             <w:rStyle w:val="Hipervnculo"/>
@@ -1078,7 +1078,7 @@
             <w:noProof/>
             <w:webHidden/>
           </w:rPr>
-          <w:instrText xml:space="preserve"> PAGEREF _Toc243901989 \h </w:instrText>
+          <w:instrText xml:space="preserve"> PAGEREF _Toc243924381 \h </w:instrText>
         </w:r>
         <w:r>
           <w:rPr>
@@ -1121,7 +1121,7 @@
           <w14:ligatures w14:val="standardContextual"/>
         </w:rPr>
       </w:pPr>
-      <w:hyperlink w:anchor="_Toc243901990" w:history="1">
+      <w:hyperlink w:anchor="_Toc243924382" w:history="1">
         <w:r>
           <w:rPr>
             <w:rStyle w:val="Hipervnculo"/>
@@ -1148,7 +1148,7 @@
             <w:noProof/>
             <w:webHidden/>
           </w:rPr>
-          <w:instrText xml:space="preserve"> PAGEREF _Toc243901990 \h </w:instrText>
+          <w:instrText xml:space="preserve"> PAGEREF _Toc243924382 \h </w:instrText>
         </w:r>
         <w:r>
           <w:rPr>
@@ -1191,7 +1191,7 @@
           <w14:ligatures w14:val="standardContextual"/>
         </w:rPr>
       </w:pPr>
-      <w:hyperlink w:anchor="_Toc243901991" w:history="1">
+      <w:hyperlink w:anchor="_Toc243924383" w:history="1">
         <w:r>
           <w:rPr>
             <w:rStyle w:val="Hipervnculo"/>
@@ -1218,7 +1218,7 @@
             <w:noProof/>
             <w:webHidden/>
           </w:rPr>
-          <w:instrText xml:space="preserve"> PAGEREF _Toc243901991 \h </w:instrText>
+          <w:instrText xml:space="preserve"> PAGEREF _Toc243924383 \h </w:instrText>
         </w:r>
         <w:r>
           <w:rPr>
@@ -1261,7 +1261,7 @@
           <w14:ligatures w14:val="standardContextual"/>
         </w:rPr>
       </w:pPr>
-      <w:hyperlink w:anchor="_Toc243901992" w:history="1">
+      <w:hyperlink w:anchor="_Toc243924384" w:history="1">
         <w:r>
           <w:rPr>
             <w:rStyle w:val="Hipervnculo"/>
@@ -1288,7 +1288,7 @@
             <w:noProof/>
             <w:webHidden/>
           </w:rPr>
-          <w:instrText xml:space="preserve"> PAGEREF _Toc243901992 \h </w:instrText>
+          <w:instrText xml:space="preserve"> PAGEREF _Toc243924384 \h </w:instrText>
         </w:r>
         <w:r>
           <w:rPr>
@@ -1331,7 +1331,7 @@
           <w14:ligatures w14:val="standardContextual"/>
         </w:rPr>
       </w:pPr>
-      <w:hyperlink w:anchor="_Toc243901993" w:history="1">
+      <w:hyperlink w:anchor="_Toc243924385" w:history="1">
         <w:r>
           <w:rPr>
             <w:rStyle w:val="Hipervnculo"/>
@@ -1358,7 +1358,7 @@
             <w:noProof/>
             <w:webHidden/>
           </w:rPr>
-          <w:instrText xml:space="preserve"> PAGEREF _Toc243901993 \h </w:instrText>
+          <w:instrText xml:space="preserve"> PAGEREF _Toc243924385 \h </w:instrText>
         </w:r>
         <w:r>
           <w:rPr>
@@ -1401,7 +1401,7 @@
           <w14:ligatures w14:val="standardContextual"/>
         </w:rPr>
       </w:pPr>
-      <w:hyperlink w:anchor="_Toc243901994" w:history="1">
+      <w:hyperlink w:anchor="_Toc243924386" w:history="1">
         <w:r>
           <w:rPr>
             <w:rStyle w:val="Hipervnculo"/>
@@ -1428,7 +1428,7 @@
             <w:noProof/>
             <w:webHidden/>
           </w:rPr>
-          <w:instrText xml:space="preserve"> PAGEREF _Toc243901994 \h </w:instrText>
+          <w:instrText xml:space="preserve"> PAGEREF _Toc243924386 \h </w:instrText>
         </w:r>
         <w:r>
           <w:rPr>
@@ -1471,7 +1471,7 @@
           <w14:ligatures w14:val="standardContextual"/>
         </w:rPr>
       </w:pPr>
-      <w:hyperlink w:anchor="_Toc243901995" w:history="1">
+      <w:hyperlink w:anchor="_Toc243924387" w:history="1">
         <w:r>
           <w:rPr>
             <w:rStyle w:val="Hipervnculo"/>
@@ -1498,7 +1498,7 @@
             <w:noProof/>
             <w:webHidden/>
           </w:rPr>
-          <w:instrText xml:space="preserve"> PAGEREF _Toc243901995 \h </w:instrText>
+          <w:instrText xml:space="preserve"> PAGEREF _Toc243924387 \h </w:instrText>
         </w:r>
         <w:r>
           <w:rPr>
@@ -1541,7 +1541,7 @@
           <w14:ligatures w14:val="standardContextual"/>
         </w:rPr>
       </w:pPr>
-      <w:hyperlink w:anchor="_Toc243901996" w:history="1">
+      <w:hyperlink w:anchor="_Toc243924388" w:history="1">
         <w:r>
           <w:rPr>
             <w:rStyle w:val="Hipervnculo"/>
@@ -1568,7 +1568,7 @@
             <w:noProof/>
             <w:webHidden/>
           </w:rPr>
-          <w:instrText xml:space="preserve"> PAGEREF _Toc243901996 \h </w:instrText>
+          <w:instrText xml:space="preserve"> PAGEREF _Toc243924388 \h </w:instrText>
         </w:r>
         <w:r>
           <w:rPr>
@@ -1611,7 +1611,7 @@
           <w14:ligatures w14:val="standardContextual"/>
         </w:rPr>
       </w:pPr>
-      <w:hyperlink w:anchor="_Toc243901997" w:history="1">
+      <w:hyperlink w:anchor="_Toc243924389" w:history="1">
         <w:r>
           <w:rPr>
             <w:rStyle w:val="Hipervnculo"/>
@@ -1638,7 +1638,7 @@
             <w:noProof/>
             <w:webHidden/>
           </w:rPr>
-          <w:instrText xml:space="preserve"> PAGEREF _Toc243901997 \h </w:instrText>
+          <w:instrText xml:space="preserve"> PAGEREF _Toc243924389 \h </w:instrText>
         </w:r>
         <w:r>
           <w:rPr>
@@ -1681,7 +1681,7 @@
           <w14:ligatures w14:val="standardContextual"/>
         </w:rPr>
       </w:pPr>
-      <w:hyperlink w:anchor="_Toc243901998" w:history="1">
+      <w:hyperlink w:anchor="_Toc243924390" w:history="1">
         <w:r>
           <w:rPr>
             <w:rStyle w:val="Hipervnculo"/>
@@ -1708,7 +1708,7 @@
             <w:noProof/>
             <w:webHidden/>
           </w:rPr>
-          <w:instrText xml:space="preserve"> PAGEREF _Toc243901998 \h </w:instrText>
+          <w:instrText xml:space="preserve"> PAGEREF _Toc243924390 \h </w:instrText>
         </w:r>
         <w:r>
           <w:rPr>
@@ -1751,7 +1751,7 @@
           <w14:ligatures w14:val="standardContextual"/>
         </w:rPr>
       </w:pPr>
-      <w:hyperlink w:anchor="_Toc243901999" w:history="1">
+      <w:hyperlink w:anchor="_Toc243924391" w:history="1">
         <w:r>
           <w:rPr>
             <w:rStyle w:val="Hipervnculo"/>
@@ -1778,7 +1778,7 @@
             <w:noProof/>
             <w:webHidden/>
           </w:rPr>
-          <w:instrText xml:space="preserve"> PAGEREF _Toc243901999 \h </w:instrText>
+          <w:instrText xml:space="preserve"> PAGEREF _Toc243924391 \h </w:instrText>
         </w:r>
         <w:r>
           <w:rPr>
@@ -1821,7 +1821,7 @@
           <w14:ligatures w14:val="standardContextual"/>
         </w:rPr>
       </w:pPr>
-      <w:hyperlink w:anchor="_Toc243902000" w:history="1">
+      <w:hyperlink w:anchor="_Toc243924392" w:history="1">
         <w:r>
           <w:rPr>
             <w:rStyle w:val="Hipervnculo"/>
@@ -1848,7 +1848,7 @@
             <w:noProof/>
             <w:webHidden/>
           </w:rPr>
-          <w:instrText xml:space="preserve"> PAGEREF _Toc243902000 \h </w:instrText>
+          <w:instrText xml:space="preserve"> PAGEREF _Toc243924392 \h </w:instrText>
         </w:r>
         <w:r>
           <w:rPr>
@@ -1891,7 +1891,7 @@
           <w14:ligatures w14:val="standardContextual"/>
         </w:rPr>
       </w:pPr>
-      <w:hyperlink w:anchor="_Toc243902001" w:history="1">
+      <w:hyperlink w:anchor="_Toc243924393" w:history="1">
         <w:r>
           <w:rPr>
             <w:rStyle w:val="Hipervnculo"/>
@@ -1918,7 +1918,7 @@
             <w:noProof/>
             <w:webHidden/>
           </w:rPr>
-          <w:instrText xml:space="preserve"> PAGEREF _Toc243902001 \h </w:instrText>
+          <w:instrText xml:space="preserve"> PAGEREF _Toc243924393 \h </w:instrText>
         </w:r>
         <w:r>
           <w:rPr>
@@ -1961,7 +1961,7 @@
           <w14:ligatures w14:val="standardContextual"/>
         </w:rPr>
       </w:pPr>
-      <w:hyperlink w:anchor="_Toc243902002" w:history="1">
+      <w:hyperlink w:anchor="_Toc243924394" w:history="1">
         <w:r>
           <w:rPr>
             <w:rStyle w:val="Hipervnculo"/>
@@ -1988,7 +1988,7 @@
             <w:noProof/>
             <w:webHidden/>
           </w:rPr>
-          <w:instrText xml:space="preserve"> PAGEREF _Toc243902002 \h </w:instrText>
+          <w:instrText xml:space="preserve"> PAGEREF _Toc243924394 \h </w:instrText>
         </w:r>
         <w:r>
           <w:rPr>
@@ -2031,7 +2031,7 @@
           <w14:ligatures w14:val="standardContextual"/>
         </w:rPr>
       </w:pPr>
-      <w:hyperlink w:anchor="_Toc243902003" w:history="1">
+      <w:hyperlink w:anchor="_Toc243924395" w:history="1">
         <w:r>
           <w:rPr>
             <w:rStyle w:val="Hipervnculo"/>
@@ -2058,7 +2058,7 @@
             <w:noProof/>
             <w:webHidden/>
           </w:rPr>
-          <w:instrText xml:space="preserve"> PAGEREF _Toc243902003 \h </w:instrText>
+          <w:instrText xml:space="preserve"> PAGEREF _Toc243924395 \h </w:instrText>
         </w:r>
         <w:r>
           <w:rPr>
@@ -2101,7 +2101,7 @@
           <w14:ligatures w14:val="standardContextual"/>
         </w:rPr>
       </w:pPr>
-      <w:hyperlink w:anchor="_Toc243902004" w:history="1">
+      <w:hyperlink w:anchor="_Toc243924396" w:history="1">
         <w:r>
           <w:rPr>
             <w:rStyle w:val="Hipervnculo"/>
@@ -2128,7 +2128,7 @@
             <w:noProof/>
             <w:webHidden/>
           </w:rPr>
-          <w:instrText xml:space="preserve"> PAGEREF _Toc243902004 \h </w:instrText>
+          <w:instrText xml:space="preserve"> PAGEREF _Toc243924396 \h </w:instrText>
         </w:r>
         <w:r>
           <w:rPr>
@@ -2171,7 +2171,7 @@
           <w14:ligatures w14:val="standardContextual"/>
         </w:rPr>
       </w:pPr>
-      <w:hyperlink w:anchor="_Toc243902005" w:history="1">
+      <w:hyperlink w:anchor="_Toc243924397" w:history="1">
         <w:r>
           <w:rPr>
             <w:rStyle w:val="Hipervnculo"/>
@@ -2198,7 +2198,7 @@
             <w:noProof/>
             <w:webHidden/>
           </w:rPr>
-          <w:instrText xml:space="preserve"> PAGEREF _Toc243902005 \h </w:instrText>
+          <w:instrText xml:space="preserve"> PAGEREF _Toc243924397 \h </w:instrText>
         </w:r>
         <w:r>
           <w:rPr>
@@ -2244,7 +2244,7 @@
           <w14:ligatures w14:val="standardContextual"/>
         </w:rPr>
       </w:pPr>
-      <w:hyperlink w:anchor="_Toc243902006" w:history="1">
+      <w:hyperlink w:anchor="_Toc243924398" w:history="1">
         <w:r>
           <w:rPr>
             <w:rStyle w:val="Hipervnculo"/>
@@ -2271,7 +2271,7 @@
             <w:noProof/>
             <w:webHidden/>
           </w:rPr>
-          <w:instrText xml:space="preserve"> PAGEREF _Toc243902006 \h </w:instrText>
+          <w:instrText xml:space="preserve"> PAGEREF _Toc243924398 \h </w:instrText>
         </w:r>
         <w:r>
           <w:rPr>
@@ -2314,7 +2314,7 @@
           <w14:ligatures w14:val="standardContextual"/>
         </w:rPr>
       </w:pPr>
-      <w:hyperlink w:anchor="_Toc243902007" w:history="1">
+      <w:hyperlink w:anchor="_Toc243924399" w:history="1">
         <w:r>
           <w:rPr>
             <w:rStyle w:val="Hipervnculo"/>
@@ -2341,7 +2341,7 @@
             <w:noProof/>
             <w:webHidden/>
           </w:rPr>
-          <w:instrText xml:space="preserve"> PAGEREF _Toc243902007 \h </w:instrText>
+          <w:instrText xml:space="preserve"> PAGEREF _Toc243924399 \h </w:instrText>
         </w:r>
         <w:r>
           <w:rPr>
@@ -2384,7 +2384,7 @@
           <w14:ligatures w14:val="standardContextual"/>
         </w:rPr>
       </w:pPr>
-      <w:hyperlink w:anchor="_Toc243902008" w:history="1">
+      <w:hyperlink w:anchor="_Toc243924400" w:history="1">
         <w:r>
           <w:rPr>
             <w:rStyle w:val="Hipervnculo"/>
@@ -2411,7 +2411,7 @@
             <w:noProof/>
             <w:webHidden/>
           </w:rPr>
-          <w:instrText xml:space="preserve"> PAGEREF _Toc243902008 \h </w:instrText>
+          <w:instrText xml:space="preserve"> PAGEREF _Toc243924400 \h </w:instrText>
         </w:r>
         <w:r>
           <w:rPr>
@@ -2454,7 +2454,7 @@
           <w14:ligatures w14:val="standardContextual"/>
         </w:rPr>
       </w:pPr>
-      <w:hyperlink w:anchor="_Toc243902009" w:history="1">
+      <w:hyperlink w:anchor="_Toc243924401" w:history="1">
         <w:r>
           <w:rPr>
             <w:rStyle w:val="Hipervnculo"/>
@@ -2481,7 +2481,7 @@
             <w:noProof/>
             <w:webHidden/>
           </w:rPr>
-          <w:instrText xml:space="preserve"> PAGEREF _Toc243902009 \h </w:instrText>
+          <w:instrText xml:space="preserve"> PAGEREF _Toc243924401 \h </w:instrText>
         </w:r>
         <w:r>
           <w:rPr>
@@ -2524,7 +2524,7 @@
           <w14:ligatures w14:val="standardContextual"/>
         </w:rPr>
       </w:pPr>
-      <w:hyperlink w:anchor="_Toc243902010" w:history="1">
+      <w:hyperlink w:anchor="_Toc243924402" w:history="1">
         <w:r>
           <w:rPr>
             <w:rStyle w:val="Hipervnculo"/>
@@ -2551,7 +2551,7 @@
             <w:noProof/>
             <w:webHidden/>
           </w:rPr>
-          <w:instrText xml:space="preserve"> PAGEREF _Toc243902010 \h </w:instrText>
+          <w:instrText xml:space="preserve"> PAGEREF _Toc243924402 \h </w:instrText>
         </w:r>
         <w:r>
           <w:rPr>
@@ -2594,7 +2594,7 @@
           <w14:ligatures w14:val="standardContextual"/>
         </w:rPr>
       </w:pPr>
-      <w:hyperlink w:anchor="_Toc243902011" w:history="1">
+      <w:hyperlink w:anchor="_Toc243924403" w:history="1">
         <w:r>
           <w:rPr>
             <w:rStyle w:val="Hipervnculo"/>
@@ -2621,7 +2621,7 @@
             <w:noProof/>
             <w:webHidden/>
           </w:rPr>
-          <w:instrText xml:space="preserve"> PAGEREF _Toc243902011 \h </w:instrText>
+          <w:instrText xml:space="preserve"> PAGEREF _Toc243924403 \h </w:instrText>
         </w:r>
         <w:r>
           <w:rPr>
@@ -2667,7 +2667,7 @@
           <w14:ligatures w14:val="standardContextual"/>
         </w:rPr>
       </w:pPr>
-      <w:hyperlink w:anchor="_Toc243902012" w:history="1">
+      <w:hyperlink w:anchor="_Toc243924404" w:history="1">
         <w:r>
           <w:rPr>
             <w:rStyle w:val="Hipervnculo"/>
@@ -2694,7 +2694,7 @@
             <w:noProof/>
             <w:webHidden/>
           </w:rPr>
-          <w:instrText xml:space="preserve"> PAGEREF _Toc243902012 \h </w:instrText>
+          <w:instrText xml:space="preserve"> PAGEREF _Toc243924404 \h </w:instrText>
         </w:r>
         <w:r>
           <w:rPr>
@@ -2737,7 +2737,7 @@
           <w14:ligatures w14:val="standardContextual"/>
         </w:rPr>
       </w:pPr>
-      <w:hyperlink w:anchor="_Toc243902013" w:history="1">
+      <w:hyperlink w:anchor="_Toc243924405" w:history="1">
         <w:r>
           <w:rPr>
             <w:rStyle w:val="Hipervnculo"/>
@@ -2764,7 +2764,7 @@
             <w:noProof/>
             <w:webHidden/>
           </w:rPr>
-          <w:instrText xml:space="preserve"> PAGEREF _Toc243902013 \h </w:instrText>
+          <w:instrText xml:space="preserve"> PAGEREF _Toc243924405 \h </w:instrText>
         </w:r>
         <w:r>
           <w:rPr>
@@ -2807,7 +2807,7 @@
           <w14:ligatures w14:val="standardContextual"/>
         </w:rPr>
       </w:pPr>
-      <w:hyperlink w:anchor="_Toc243902014" w:history="1">
+      <w:hyperlink w:anchor="_Toc243924406" w:history="1">
         <w:r>
           <w:rPr>
             <w:rStyle w:val="Hipervnculo"/>
@@ -2834,7 +2834,7 @@
             <w:noProof/>
             <w:webHidden/>
           </w:rPr>
-          <w:instrText xml:space="preserve"> PAGEREF _Toc243902014 \h </w:instrText>
+          <w:instrText xml:space="preserve"> PAGEREF _Toc243924406 \h </w:instrText>
         </w:r>
         <w:r>
           <w:rPr>
@@ -2877,7 +2877,7 @@
           <w14:ligatures w14:val="standardContextual"/>
         </w:rPr>
       </w:pPr>
-      <w:hyperlink w:anchor="_Toc243902015" w:history="1">
+      <w:hyperlink w:anchor="_Toc243924407" w:history="1">
         <w:r>
           <w:rPr>
             <w:rStyle w:val="Hipervnculo"/>
@@ -2904,7 +2904,7 @@
             <w:noProof/>
             <w:webHidden/>
           </w:rPr>
-          <w:instrText xml:space="preserve"> PAGEREF _Toc243902015 \h </w:instrText>
+          <w:instrText xml:space="preserve"> PAGEREF _Toc243924407 \h </w:instrText>
         </w:r>
         <w:r>
           <w:rPr>
@@ -2947,7 +2947,7 @@
           <w14:ligatures w14:val="standardContextual"/>
         </w:rPr>
       </w:pPr>
-      <w:hyperlink w:anchor="_Toc243902016" w:history="1">
+      <w:hyperlink w:anchor="_Toc243924408" w:history="1">
         <w:r>
           <w:rPr>
             <w:rStyle w:val="Hipervnculo"/>
@@ -2974,7 +2974,7 @@
             <w:noProof/>
             <w:webHidden/>
           </w:rPr>
-          <w:instrText xml:space="preserve"> PAGEREF _Toc243902016 \h </w:instrText>
+          <w:instrText xml:space="preserve"> PAGEREF _Toc243924408 \h </w:instrText>
         </w:r>
         <w:r>
           <w:rPr>
@@ -3017,7 +3017,7 @@
           <w14:ligatures w14:val="standardContextual"/>
         </w:rPr>
       </w:pPr>
-      <w:hyperlink w:anchor="_Toc243902017" w:history="1">
+      <w:hyperlink w:anchor="_Toc243924409" w:history="1">
         <w:r>
           <w:rPr>
             <w:rStyle w:val="Hipervnculo"/>
@@ -3044,7 +3044,7 @@
             <w:noProof/>
             <w:webHidden/>
           </w:rPr>
-          <w:instrText xml:space="preserve"> PAGEREF _Toc243902017 \h </w:instrText>
+          <w:instrText xml:space="preserve"> PAGEREF _Toc243924409 \h </w:instrText>
         </w:r>
         <w:r>
           <w:rPr>
@@ -3087,7 +3087,7 @@
           <w14:ligatures w14:val="standardContextual"/>
         </w:rPr>
       </w:pPr>
-      <w:hyperlink w:anchor="_Toc243902018" w:history="1">
+      <w:hyperlink w:anchor="_Toc243924410" w:history="1">
         <w:r>
           <w:rPr>
             <w:rStyle w:val="Hipervnculo"/>
@@ -3114,7 +3114,7 @@
             <w:noProof/>
             <w:webHidden/>
           </w:rPr>
-          <w:instrText xml:space="preserve"> PAGEREF _Toc243902018 \h </w:instrText>
+          <w:instrText xml:space="preserve"> PAGEREF _Toc243924410 \h </w:instrText>
         </w:r>
         <w:r>
           <w:rPr>
@@ -3157,7 +3157,7 @@
           <w14:ligatures w14:val="standardContextual"/>
         </w:rPr>
       </w:pPr>
-      <w:hyperlink w:anchor="_Toc243902019" w:history="1">
+      <w:hyperlink w:anchor="_Toc243924411" w:history="1">
         <w:r>
           <w:rPr>
             <w:rStyle w:val="Hipervnculo"/>
@@ -3184,7 +3184,7 @@
             <w:noProof/>
             <w:webHidden/>
           </w:rPr>
-          <w:instrText xml:space="preserve"> PAGEREF _Toc243902019 \h </w:instrText>
+          <w:instrText xml:space="preserve"> PAGEREF _Toc243924411 \h </w:instrText>
         </w:r>
         <w:r>
           <w:rPr>
@@ -3227,7 +3227,7 @@
           <w14:ligatures w14:val="standardContextual"/>
         </w:rPr>
       </w:pPr>
-      <w:hyperlink w:anchor="_Toc243902020" w:history="1">
+      <w:hyperlink w:anchor="_Toc243924412" w:history="1">
         <w:r>
           <w:rPr>
             <w:rStyle w:val="Hipervnculo"/>
@@ -3254,7 +3254,7 @@
             <w:noProof/>
             <w:webHidden/>
           </w:rPr>
-          <w:instrText xml:space="preserve"> PAGEREF _Toc243902020 \h </w:instrText>
+          <w:instrText xml:space="preserve"> PAGEREF _Toc243924412 \h </w:instrText>
         </w:r>
         <w:r>
           <w:rPr>
@@ -3297,7 +3297,7 @@
           <w14:ligatures w14:val="standardContextual"/>
         </w:rPr>
       </w:pPr>
-      <w:hyperlink w:anchor="_Toc243902021" w:history="1">
+      <w:hyperlink w:anchor="_Toc243924413" w:history="1">
         <w:r>
           <w:rPr>
             <w:rStyle w:val="Hipervnculo"/>
@@ -3324,7 +3324,7 @@
             <w:noProof/>
             <w:webHidden/>
           </w:rPr>
-          <w:instrText xml:space="preserve"> PAGEREF _Toc243902021 \h </w:instrText>
+          <w:instrText xml:space="preserve"> PAGEREF _Toc243924413 \h </w:instrText>
         </w:r>
         <w:r>
           <w:rPr>
@@ -3367,7 +3367,7 @@
           <w14:ligatures w14:val="standardContextual"/>
         </w:rPr>
       </w:pPr>
-      <w:hyperlink w:anchor="_Toc243902022" w:history="1">
+      <w:hyperlink w:anchor="_Toc243924414" w:history="1">
         <w:r>
           <w:rPr>
             <w:rStyle w:val="Hipervnculo"/>
@@ -3394,7 +3394,7 @@
             <w:noProof/>
             <w:webHidden/>
           </w:rPr>
-          <w:instrText xml:space="preserve"> PAGEREF _Toc243902022 \h </w:instrText>
+          <w:instrText xml:space="preserve"> PAGEREF _Toc243924414 \h </w:instrText>
         </w:r>
         <w:r>
           <w:rPr>
@@ -3437,7 +3437,7 @@
           <w14:ligatures w14:val="standardContextual"/>
         </w:rPr>
       </w:pPr>
-      <w:hyperlink w:anchor="_Toc243902023" w:history="1">
+      <w:hyperlink w:anchor="_Toc243924415" w:history="1">
         <w:r>
           <w:rPr>
             <w:rStyle w:val="Hipervnculo"/>
@@ -3464,7 +3464,7 @@
             <w:noProof/>
             <w:webHidden/>
           </w:rPr>
-          <w:instrText xml:space="preserve"> PAGEREF _Toc243902023 \h </w:instrText>
+          <w:instrText xml:space="preserve"> PAGEREF _Toc243924415 \h </w:instrText>
         </w:r>
         <w:r>
           <w:rPr>
@@ -3507,7 +3507,7 @@
           <w14:ligatures w14:val="standardContextual"/>
         </w:rPr>
       </w:pPr>
-      <w:hyperlink w:anchor="_Toc243902024" w:history="1">
+      <w:hyperlink w:anchor="_Toc243924416" w:history="1">
         <w:r>
           <w:rPr>
             <w:rStyle w:val="Hipervnculo"/>
@@ -3534,7 +3534,7 @@
             <w:noProof/>
             <w:webHidden/>
           </w:rPr>
-          <w:instrText xml:space="preserve"> PAGEREF _Toc243902024 \h </w:instrText>
+          <w:instrText xml:space="preserve"> PAGEREF _Toc243924416 \h </w:instrText>
         </w:r>
         <w:r>
           <w:rPr>
@@ -3580,7 +3580,7 @@
           <w14:ligatures w14:val="standardContextual"/>
         </w:rPr>
       </w:pPr>
-      <w:hyperlink w:anchor="_Toc243902025" w:history="1">
+      <w:hyperlink w:anchor="_Toc243924417" w:history="1">
         <w:r>
           <w:rPr>
             <w:rStyle w:val="Hipervnculo"/>
@@ -3607,7 +3607,7 @@
             <w:noProof/>
             <w:webHidden/>
           </w:rPr>
-          <w:instrText xml:space="preserve"> PAGEREF _Toc243902025 \h </w:instrText>
+          <w:instrText xml:space="preserve"> PAGEREF _Toc243924417 \h </w:instrText>
         </w:r>
         <w:r>
           <w:rPr>
@@ -3650,7 +3650,7 @@
           <w14:ligatures w14:val="standardContextual"/>
         </w:rPr>
       </w:pPr>
-      <w:hyperlink w:anchor="_Toc243902026" w:history="1">
+      <w:hyperlink w:anchor="_Toc243924418" w:history="1">
         <w:r>
           <w:rPr>
             <w:rStyle w:val="Hipervnculo"/>
@@ -3677,7 +3677,7 @@
             <w:noProof/>
             <w:webHidden/>
           </w:rPr>
-          <w:instrText xml:space="preserve"> PAGEREF _Toc243902026 \h </w:instrText>
+          <w:instrText xml:space="preserve"> PAGEREF _Toc243924418 \h </w:instrText>
         </w:r>
         <w:r>
           <w:rPr>
@@ -3720,7 +3720,7 @@
           <w14:ligatures w14:val="standardContextual"/>
         </w:rPr>
       </w:pPr>
-      <w:hyperlink w:anchor="_Toc243902027" w:history="1">
+      <w:hyperlink w:anchor="_Toc243924419" w:history="1">
         <w:r>
           <w:rPr>
             <w:rStyle w:val="Hipervnculo"/>
@@ -3747,7 +3747,7 @@
             <w:noProof/>
             <w:webHidden/>
           </w:rPr>
-          <w:instrText xml:space="preserve"> PAGEREF _Toc243902027 \h </w:instrText>
+          <w:instrText xml:space="preserve"> PAGEREF _Toc243924419 \h </w:instrText>
         </w:r>
         <w:r>
           <w:rPr>
@@ -3790,7 +3790,7 @@
           <w14:ligatures w14:val="standardContextual"/>
         </w:rPr>
       </w:pPr>
-      <w:hyperlink w:anchor="_Toc243902028" w:history="1">
+      <w:hyperlink w:anchor="_Toc243924420" w:history="1">
         <w:r>
           <w:rPr>
             <w:rStyle w:val="Hipervnculo"/>
@@ -3817,7 +3817,7 @@
             <w:noProof/>
             <w:webHidden/>
           </w:rPr>
-          <w:instrText xml:space="preserve"> PAGEREF _Toc243902028 \h </w:instrText>
+          <w:instrText xml:space="preserve"> PAGEREF _Toc243924420 \h </w:instrText>
         </w:r>
         <w:r>
           <w:rPr>
@@ -3860,7 +3860,7 @@
           <w14:ligatures w14:val="standardContextual"/>
         </w:rPr>
       </w:pPr>
-      <w:hyperlink w:anchor="_Toc243902029" w:history="1">
+      <w:hyperlink w:anchor="_Toc243924421" w:history="1">
         <w:r>
           <w:rPr>
             <w:rStyle w:val="Hipervnculo"/>
@@ -3887,7 +3887,7 @@
             <w:noProof/>
             <w:webHidden/>
           </w:rPr>
-          <w:instrText xml:space="preserve"> PAGEREF _Toc243902029 \h </w:instrText>
+          <w:instrText xml:space="preserve"> PAGEREF _Toc243924421 \h </w:instrText>
         </w:r>
         <w:r>
           <w:rPr>
@@ -3930,7 +3930,7 @@
           <w14:ligatures w14:val="standardContextual"/>
         </w:rPr>
       </w:pPr>
-      <w:hyperlink w:anchor="_Toc243902030" w:history="1">
+      <w:hyperlink w:anchor="_Toc243924422" w:history="1">
         <w:r>
           <w:rPr>
             <w:rStyle w:val="Hipervnculo"/>
@@ -3957,7 +3957,7 @@
             <w:noProof/>
             <w:webHidden/>
           </w:rPr>
-          <w:instrText xml:space="preserve"> PAGEREF _Toc243902030 \h </w:instrText>
+          <w:instrText xml:space="preserve"> PAGEREF _Toc243924422 \h </w:instrText>
         </w:r>
         <w:r>
           <w:rPr>
@@ -4000,7 +4000,7 @@
           <w14:ligatures w14:val="standardContextual"/>
         </w:rPr>
       </w:pPr>
-      <w:hyperlink w:anchor="_Toc243902031" w:history="1">
+      <w:hyperlink w:anchor="_Toc243924423" w:history="1">
         <w:r>
           <w:rPr>
             <w:rStyle w:val="Hipervnculo"/>
@@ -4027,7 +4027,7 @@
             <w:noProof/>
             <w:webHidden/>
           </w:rPr>
-          <w:instrText xml:space="preserve"> PAGEREF _Toc243902031 \h </w:instrText>
+          <w:instrText xml:space="preserve"> PAGEREF _Toc243924423 \h </w:instrText>
         </w:r>
         <w:r>
           <w:rPr>
@@ -4073,7 +4073,7 @@
           <w14:ligatures w14:val="standardContextual"/>
         </w:rPr>
       </w:pPr>
-      <w:hyperlink w:anchor="_Toc243902032" w:history="1">
+      <w:hyperlink w:anchor="_Toc243924424" w:history="1">
         <w:r>
           <w:rPr>
             <w:rStyle w:val="Hipervnculo"/>
@@ -4100,7 +4100,7 @@
             <w:noProof/>
             <w:webHidden/>
           </w:rPr>
-          <w:instrText xml:space="preserve"> PAGEREF _Toc243902032 \h </w:instrText>
+          <w:instrText xml:space="preserve"> PAGEREF _Toc243924424 \h </w:instrText>
         </w:r>
         <w:r>
           <w:rPr>
@@ -4143,7 +4143,7 @@
           <w14:ligatures w14:val="standardContextual"/>
         </w:rPr>
       </w:pPr>
-      <w:hyperlink w:anchor="_Toc243902033" w:history="1">
+      <w:hyperlink w:anchor="_Toc243924425" w:history="1">
         <w:r>
           <w:rPr>
             <w:rStyle w:val="Hipervnculo"/>
@@ -4170,7 +4170,7 @@
             <w:noProof/>
             <w:webHidden/>
           </w:rPr>
-          <w:instrText xml:space="preserve"> PAGEREF _Toc243902033 \h </w:instrText>
+          <w:instrText xml:space="preserve"> PAGEREF _Toc243924425 \h </w:instrText>
         </w:r>
         <w:r>
           <w:rPr>
@@ -4213,7 +4213,7 @@
           <w14:ligatures w14:val="standardContextual"/>
         </w:rPr>
       </w:pPr>
-      <w:hyperlink w:anchor="_Toc243902034" w:history="1">
+      <w:hyperlink w:anchor="_Toc243924426" w:history="1">
         <w:r>
           <w:rPr>
             <w:rStyle w:val="Hipervnculo"/>
@@ -4240,7 +4240,7 @@
             <w:noProof/>
             <w:webHidden/>
           </w:rPr>
-          <w:instrText xml:space="preserve"> PAGEREF _Toc243902034 \h </w:instrText>
+          <w:instrText xml:space="preserve"> PAGEREF _Toc243924426 \h </w:instrText>
         </w:r>
         <w:r>
           <w:rPr>
@@ -4283,7 +4283,7 @@
           <w14:ligatures w14:val="standardContextual"/>
         </w:rPr>
       </w:pPr>
-      <w:hyperlink w:anchor="_Toc243902035" w:history="1">
+      <w:hyperlink w:anchor="_Toc243924427" w:history="1">
         <w:r>
           <w:rPr>
             <w:rStyle w:val="Hipervnculo"/>
@@ -4310,7 +4310,7 @@
             <w:noProof/>
             <w:webHidden/>
           </w:rPr>
-          <w:instrText xml:space="preserve"> PAGEREF _Toc243902035 \h </w:instrText>
+          <w:instrText xml:space="preserve"> PAGEREF _Toc243924427 \h </w:instrText>
         </w:r>
         <w:r>
           <w:rPr>
@@ -4353,7 +4353,7 @@
           <w14:ligatures w14:val="standardContextual"/>
         </w:rPr>
       </w:pPr>
-      <w:hyperlink w:anchor="_Toc243902036" w:history="1">
+      <w:hyperlink w:anchor="_Toc243924428" w:history="1">
         <w:r>
           <w:rPr>
             <w:rStyle w:val="Hipervnculo"/>
@@ -4380,7 +4380,7 @@
             <w:noProof/>
             <w:webHidden/>
           </w:rPr>
-          <w:instrText xml:space="preserve"> PAGEREF _Toc243902036 \h </w:instrText>
+          <w:instrText xml:space="preserve"> PAGEREF _Toc243924428 \h </w:instrText>
         </w:r>
         <w:r>
           <w:rPr>
@@ -4423,7 +4423,7 @@
           <w14:ligatures w14:val="standardContextual"/>
         </w:rPr>
       </w:pPr>
-      <w:hyperlink w:anchor="_Toc243902037" w:history="1">
+      <w:hyperlink w:anchor="_Toc243924429" w:history="1">
         <w:r>
           <w:rPr>
             <w:rStyle w:val="Hipervnculo"/>
@@ -4450,7 +4450,7 @@
             <w:noProof/>
             <w:webHidden/>
           </w:rPr>
-          <w:instrText xml:space="preserve"> PAGEREF _Toc243902037 \h </w:instrText>
+          <w:instrText xml:space="preserve"> PAGEREF _Toc243924429 \h </w:instrText>
         </w:r>
         <w:r>
           <w:rPr>
@@ -4493,7 +4493,7 @@
           <w14:ligatures w14:val="standardContextual"/>
         </w:rPr>
       </w:pPr>
-      <w:hyperlink w:anchor="_Toc243902038" w:history="1">
+      <w:hyperlink w:anchor="_Toc243924430" w:history="1">
         <w:r>
           <w:rPr>
             <w:rStyle w:val="Hipervnculo"/>
@@ -4520,7 +4520,7 @@
             <w:noProof/>
             <w:webHidden/>
           </w:rPr>
-          <w:instrText xml:space="preserve"> PAGEREF _Toc243902038 \h </w:instrText>
+          <w:instrText xml:space="preserve"> PAGEREF _Toc243924430 \h </w:instrText>
         </w:r>
         <w:r>
           <w:rPr>
@@ -4563,7 +4563,7 @@
           <w14:ligatures w14:val="standardContextual"/>
         </w:rPr>
       </w:pPr>
-      <w:hyperlink w:anchor="_Toc243902039" w:history="1">
+      <w:hyperlink w:anchor="_Toc243924431" w:history="1">
         <w:r>
           <w:rPr>
             <w:rStyle w:val="Hipervnculo"/>
@@ -4590,7 +4590,7 @@
             <w:noProof/>
             <w:webHidden/>
           </w:rPr>
-          <w:instrText xml:space="preserve"> PAGEREF _Toc243902039 \h </w:instrText>
+          <w:instrText xml:space="preserve"> PAGEREF _Toc243924431 \h </w:instrText>
         </w:r>
         <w:r>
           <w:rPr>
@@ -4633,7 +4633,7 @@
           <w14:ligatures w14:val="standardContextual"/>
         </w:rPr>
       </w:pPr>
-      <w:hyperlink w:anchor="_Toc243902040" w:history="1">
+      <w:hyperlink w:anchor="_Toc243924432" w:history="1">
         <w:r>
           <w:rPr>
             <w:rStyle w:val="Hipervnculo"/>
@@ -4660,7 +4660,7 @@
             <w:noProof/>
             <w:webHidden/>
           </w:rPr>
-          <w:instrText xml:space="preserve"> PAGEREF _Toc243902040 \h </w:instrText>
+          <w:instrText xml:space="preserve"> PAGEREF _Toc243924432 \h </w:instrText>
         </w:r>
         <w:r>
           <w:rPr>
@@ -4703,7 +4703,7 @@
           <w14:ligatures w14:val="standardContextual"/>
         </w:rPr>
       </w:pPr>
-      <w:hyperlink w:anchor="_Toc243902041" w:history="1">
+      <w:hyperlink w:anchor="_Toc243924433" w:history="1">
         <w:r>
           <w:rPr>
             <w:rStyle w:val="Hipervnculo"/>
@@ -4730,7 +4730,7 @@
             <w:noProof/>
             <w:webHidden/>
           </w:rPr>
-          <w:instrText xml:space="preserve"> PAGEREF _Toc243902041 \h </w:instrText>
+          <w:instrText xml:space="preserve"> PAGEREF _Toc243924433 \h </w:instrText>
         </w:r>
         <w:r>
           <w:rPr>
@@ -4773,7 +4773,7 @@
           <w14:ligatures w14:val="standardContextual"/>
         </w:rPr>
       </w:pPr>
-      <w:hyperlink w:anchor="_Toc243902042" w:history="1">
+      <w:hyperlink w:anchor="_Toc243924434" w:history="1">
         <w:r>
           <w:rPr>
             <w:rStyle w:val="Hipervnculo"/>
@@ -4800,7 +4800,7 @@
             <w:noProof/>
             <w:webHidden/>
           </w:rPr>
-          <w:instrText xml:space="preserve"> PAGEREF _Toc243902042 \h </w:instrText>
+          <w:instrText xml:space="preserve"> PAGEREF _Toc243924434 \h </w:instrText>
         </w:r>
         <w:r>
           <w:rPr>
@@ -4843,7 +4843,7 @@
           <w14:ligatures w14:val="standardContextual"/>
         </w:rPr>
       </w:pPr>
-      <w:hyperlink w:anchor="_Toc243902043" w:history="1">
+      <w:hyperlink w:anchor="_Toc243924435" w:history="1">
         <w:r>
           <w:rPr>
             <w:rStyle w:val="Hipervnculo"/>
@@ -4870,7 +4870,7 @@
             <w:noProof/>
             <w:webHidden/>
           </w:rPr>
-          <w:instrText xml:space="preserve"> PAGEREF _Toc243902043 \h </w:instrText>
+          <w:instrText xml:space="preserve"> PAGEREF _Toc243924435 \h </w:instrText>
         </w:r>
         <w:r>
           <w:rPr>
@@ -4913,7 +4913,7 @@
           <w14:ligatures w14:val="standardContextual"/>
         </w:rPr>
       </w:pPr>
-      <w:hyperlink w:anchor="_Toc243902044" w:history="1">
+      <w:hyperlink w:anchor="_Toc243924436" w:history="1">
         <w:r>
           <w:rPr>
             <w:rStyle w:val="Hipervnculo"/>
@@ -4940,7 +4940,7 @@
             <w:noProof/>
             <w:webHidden/>
           </w:rPr>
-          <w:instrText xml:space="preserve"> PAGEREF _Toc243902044 \h </w:instrText>
+          <w:instrText xml:space="preserve"> PAGEREF _Toc243924436 \h </w:instrText>
         </w:r>
         <w:r>
           <w:rPr>
@@ -4983,7 +4983,7 @@
           <w14:ligatures w14:val="standardContextual"/>
         </w:rPr>
       </w:pPr>
-      <w:hyperlink w:anchor="_Toc243902045" w:history="1">
+      <w:hyperlink w:anchor="_Toc243924437" w:history="1">
         <w:r>
           <w:rPr>
             <w:rStyle w:val="Hipervnculo"/>
@@ -5010,7 +5010,7 @@
             <w:noProof/>
             <w:webHidden/>
           </w:rPr>
-          <w:instrText xml:space="preserve"> PAGEREF _Toc243902045 \h </w:instrText>
+          <w:instrText xml:space="preserve"> PAGEREF _Toc243924437 \h </w:instrText>
         </w:r>
         <w:r>
           <w:rPr>
@@ -5053,7 +5053,7 @@
           <w14:ligatures w14:val="standardContextual"/>
         </w:rPr>
       </w:pPr>
-      <w:hyperlink w:anchor="_Toc243902046" w:history="1">
+      <w:hyperlink w:anchor="_Toc243924438" w:history="1">
         <w:r>
           <w:rPr>
             <w:rStyle w:val="Hipervnculo"/>
@@ -5080,7 +5080,7 @@
             <w:noProof/>
             <w:webHidden/>
           </w:rPr>
-          <w:instrText xml:space="preserve"> PAGEREF _Toc243902046 \h </w:instrText>
+          <w:instrText xml:space="preserve"> PAGEREF _Toc243924438 \h </w:instrText>
         </w:r>
         <w:r>
           <w:rPr>
@@ -5123,7 +5123,7 @@
           <w14:ligatures w14:val="standardContextual"/>
         </w:rPr>
       </w:pPr>
-      <w:hyperlink w:anchor="_Toc243902047" w:history="1">
+      <w:hyperlink w:anchor="_Toc243924439" w:history="1">
         <w:r>
           <w:rPr>
             <w:rStyle w:val="Hipervnculo"/>
@@ -5150,7 +5150,7 @@
             <w:noProof/>
             <w:webHidden/>
           </w:rPr>
-          <w:instrText xml:space="preserve"> PAGEREF _Toc243902047 \h </w:instrText>
+          <w:instrText xml:space="preserve"> PAGEREF _Toc243924439 \h </w:instrText>
         </w:r>
         <w:r>
           <w:rPr>
@@ -5193,7 +5193,7 @@
           <w14:ligatures w14:val="standardContextual"/>
         </w:rPr>
       </w:pPr>
-      <w:hyperlink w:anchor="_Toc243902048" w:history="1">
+      <w:hyperlink w:anchor="_Toc243924440" w:history="1">
         <w:r>
           <w:rPr>
             <w:rStyle w:val="Hipervnculo"/>
@@ -5220,7 +5220,7 @@
             <w:noProof/>
             <w:webHidden/>
           </w:rPr>
-          <w:instrText xml:space="preserve"> PAGEREF _Toc243902048 \h </w:instrText>
+          <w:instrText xml:space="preserve"> PAGEREF _Toc243924440 \h </w:instrText>
         </w:r>
         <w:r>
           <w:rPr>
@@ -5263,7 +5263,7 @@
           <w14:ligatures w14:val="standardContextual"/>
         </w:rPr>
       </w:pPr>
-      <w:hyperlink w:anchor="_Toc243902049" w:history="1">
+      <w:hyperlink w:anchor="_Toc243924441" w:history="1">
         <w:r>
           <w:rPr>
             <w:rStyle w:val="Hipervnculo"/>
@@ -5290,7 +5290,7 @@
             <w:noProof/>
             <w:webHidden/>
           </w:rPr>
-          <w:instrText xml:space="preserve"> PAGEREF _Toc243902049 \h </w:instrText>
+          <w:instrText xml:space="preserve"> PAGEREF _Toc243924441 \h </w:instrText>
         </w:r>
         <w:r>
           <w:rPr>
@@ -5333,7 +5333,7 @@
           <w14:ligatures w14:val="standardContextual"/>
         </w:rPr>
       </w:pPr>
-      <w:hyperlink w:anchor="_Toc243902050" w:history="1">
+      <w:hyperlink w:anchor="_Toc243924442" w:history="1">
         <w:r>
           <w:rPr>
             <w:rStyle w:val="Hipervnculo"/>
@@ -5360,7 +5360,7 @@
             <w:noProof/>
             <w:webHidden/>
           </w:rPr>
-          <w:instrText xml:space="preserve"> PAGEREF _Toc243902050 \h </w:instrText>
+          <w:instrText xml:space="preserve"> PAGEREF _Toc243924442 \h </w:instrText>
         </w:r>
         <w:r>
           <w:rPr>
@@ -5403,7 +5403,7 @@
           <w14:ligatures w14:val="standardContextual"/>
         </w:rPr>
       </w:pPr>
-      <w:hyperlink w:anchor="_Toc243902051" w:history="1">
+      <w:hyperlink w:anchor="_Toc243924443" w:history="1">
         <w:r>
           <w:rPr>
             <w:rStyle w:val="Hipervnculo"/>
@@ -5430,7 +5430,7 @@
             <w:noProof/>
             <w:webHidden/>
           </w:rPr>
-          <w:instrText xml:space="preserve"> PAGEREF _Toc243902051 \h </w:instrText>
+          <w:instrText xml:space="preserve"> PAGEREF _Toc243924443 \h </w:instrText>
         </w:r>
         <w:r>
           <w:rPr>
@@ -5476,7 +5476,7 @@
           <w14:ligatures w14:val="standardContextual"/>
         </w:rPr>
       </w:pPr>
-      <w:hyperlink w:anchor="_Toc243902052" w:history="1">
+      <w:hyperlink w:anchor="_Toc243924444" w:history="1">
         <w:r>
           <w:rPr>
             <w:rStyle w:val="Hipervnculo"/>
@@ -5503,7 +5503,7 @@
             <w:noProof/>
             <w:webHidden/>
           </w:rPr>
-          <w:instrText xml:space="preserve"> PAGEREF _Toc243902052 \h </w:instrText>
+          <w:instrText xml:space="preserve"> PAGEREF _Toc243924444 \h </w:instrText>
         </w:r>
         <w:r>
           <w:rPr>
@@ -5546,7 +5546,7 @@
           <w14:ligatures w14:val="standardContextual"/>
         </w:rPr>
       </w:pPr>
-      <w:hyperlink w:anchor="_Toc243902053" w:history="1">
+      <w:hyperlink w:anchor="_Toc243924445" w:history="1">
         <w:r>
           <w:rPr>
             <w:rStyle w:val="Hipervnculo"/>
@@ -5573,7 +5573,7 @@
             <w:noProof/>
             <w:webHidden/>
           </w:rPr>
-          <w:instrText xml:space="preserve"> PAGEREF _Toc243902053 \h </w:instrText>
+          <w:instrText xml:space="preserve"> PAGEREF _Toc243924445 \h </w:instrText>
         </w:r>
         <w:r>
           <w:rPr>
@@ -5616,7 +5616,7 @@
           <w14:ligatures w14:val="standardContextual"/>
         </w:rPr>
       </w:pPr>
-      <w:hyperlink w:anchor="_Toc243902054" w:history="1">
+      <w:hyperlink w:anchor="_Toc243924446" w:history="1">
         <w:r>
           <w:rPr>
             <w:rStyle w:val="Hipervnculo"/>
@@ -5643,7 +5643,7 @@
             <w:noProof/>
             <w:webHidden/>
           </w:rPr>
-          <w:instrText xml:space="preserve"> PAGEREF _Toc243902054 \h </w:instrText>
+          <w:instrText xml:space="preserve"> PAGEREF _Toc243924446 \h </w:instrText>
         </w:r>
         <w:r>
           <w:rPr>
@@ -5686,7 +5686,7 @@
           <w14:ligatures w14:val="standardContextual"/>
         </w:rPr>
       </w:pPr>
-      <w:hyperlink w:anchor="_Toc243902055" w:history="1">
+      <w:hyperlink w:anchor="_Toc243924447" w:history="1">
         <w:r>
           <w:rPr>
             <w:rStyle w:val="Hipervnculo"/>
@@ -5713,7 +5713,7 @@
             <w:noProof/>
             <w:webHidden/>
           </w:rPr>
-          <w:instrText xml:space="preserve"> PAGEREF _Toc243902055 \h </w:instrText>
+          <w:instrText xml:space="preserve"> PAGEREF _Toc243924447 \h </w:instrText>
         </w:r>
         <w:r>
           <w:rPr>
@@ -5756,7 +5756,7 @@
           <w14:ligatures w14:val="standardContextual"/>
         </w:rPr>
       </w:pPr>
-      <w:hyperlink w:anchor="_Toc243902056" w:history="1">
+      <w:hyperlink w:anchor="_Toc243924448" w:history="1">
         <w:r>
           <w:rPr>
             <w:rStyle w:val="Hipervnculo"/>
@@ -5783,7 +5783,7 @@
             <w:noProof/>
             <w:webHidden/>
           </w:rPr>
-          <w:instrText xml:space="preserve"> PAGEREF _Toc243902056 \h </w:instrText>
+          <w:instrText xml:space="preserve"> PAGEREF _Toc243924448 \h </w:instrText>
         </w:r>
         <w:r>
           <w:rPr>
@@ -5826,7 +5826,7 @@
           <w14:ligatures w14:val="standardContextual"/>
         </w:rPr>
       </w:pPr>
-      <w:hyperlink w:anchor="_Toc243902057" w:history="1">
+      <w:hyperlink w:anchor="_Toc243924449" w:history="1">
         <w:r>
           <w:rPr>
             <w:rStyle w:val="Hipervnculo"/>
@@ -5853,7 +5853,7 @@
             <w:noProof/>
             <w:webHidden/>
           </w:rPr>
-          <w:instrText xml:space="preserve"> PAGEREF _Toc243902057 \h </w:instrText>
+          <w:instrText xml:space="preserve"> PAGEREF _Toc243924449 \h </w:instrText>
         </w:r>
         <w:r>
           <w:rPr>
@@ -5896,7 +5896,7 @@
           <w14:ligatures w14:val="standardContextual"/>
         </w:rPr>
       </w:pPr>
-      <w:hyperlink w:anchor="_Toc243902058" w:history="1">
+      <w:hyperlink w:anchor="_Toc243924450" w:history="1">
         <w:r>
           <w:rPr>
             <w:rStyle w:val="Hipervnculo"/>
@@ -5923,7 +5923,7 @@
             <w:noProof/>
             <w:webHidden/>
           </w:rPr>
-          <w:instrText xml:space="preserve"> PAGEREF _Toc243902058 \h </w:instrText>
+          <w:instrText xml:space="preserve"> PAGEREF _Toc243924450 \h </w:instrText>
         </w:r>
         <w:r>
           <w:rPr>
@@ -5966,7 +5966,7 @@
           <w14:ligatures w14:val="standardContextual"/>
         </w:rPr>
       </w:pPr>
-      <w:hyperlink w:anchor="_Toc243902059" w:history="1">
+      <w:hyperlink w:anchor="_Toc243924451" w:history="1">
         <w:r>
           <w:rPr>
             <w:rStyle w:val="Hipervnculo"/>
@@ -5993,7 +5993,7 @@
             <w:noProof/>
             <w:webHidden/>
           </w:rPr>
-          <w:instrText xml:space="preserve"> PAGEREF _Toc243902059 \h </w:instrText>
+          <w:instrText xml:space="preserve"> PAGEREF _Toc243924451 \h </w:instrText>
         </w:r>
         <w:r>
           <w:rPr>
@@ -6036,7 +6036,7 @@
           <w14:ligatures w14:val="standardContextual"/>
         </w:rPr>
       </w:pPr>
-      <w:hyperlink w:anchor="_Toc243902060" w:history="1">
+      <w:hyperlink w:anchor="_Toc243924452" w:history="1">
         <w:r>
           <w:rPr>
             <w:rStyle w:val="Hipervnculo"/>
@@ -6063,7 +6063,7 @@
             <w:noProof/>
             <w:webHidden/>
           </w:rPr>
-          <w:instrText xml:space="preserve"> PAGEREF _Toc243902060 \h </w:instrText>
+          <w:instrText xml:space="preserve"> PAGEREF _Toc243924452 \h </w:instrText>
         </w:r>
         <w:r>
           <w:rPr>
@@ -6106,7 +6106,7 @@
           <w14:ligatures w14:val="standardContextual"/>
         </w:rPr>
       </w:pPr>
-      <w:hyperlink w:anchor="_Toc243902061" w:history="1">
+      <w:hyperlink w:anchor="_Toc243924453" w:history="1">
         <w:r>
           <w:rPr>
             <w:rStyle w:val="Hipervnculo"/>
@@ -6133,7 +6133,7 @@
             <w:noProof/>
             <w:webHidden/>
           </w:rPr>
-          <w:instrText xml:space="preserve"> PAGEREF _Toc243902061 \h </w:instrText>
+          <w:instrText xml:space="preserve"> PAGEREF _Toc243924453 \h </w:instrText>
         </w:r>
         <w:r>
           <w:rPr>
@@ -6176,7 +6176,7 @@
           <w14:ligatures w14:val="standardContextual"/>
         </w:rPr>
       </w:pPr>
-      <w:hyperlink w:anchor="_Toc243902062" w:history="1">
+      <w:hyperlink w:anchor="_Toc243924454" w:history="1">
         <w:r>
           <w:rPr>
             <w:rStyle w:val="Hipervnculo"/>
@@ -6203,7 +6203,7 @@
             <w:noProof/>
             <w:webHidden/>
           </w:rPr>
-          <w:instrText xml:space="preserve"> PAGEREF _Toc243902062 \h </w:instrText>
+          <w:instrText xml:space="preserve"> PAGEREF _Toc243924454 \h </w:instrText>
         </w:r>
         <w:r>
           <w:rPr>
@@ -6246,7 +6246,7 @@
           <w14:ligatures w14:val="standardContextual"/>
         </w:rPr>
       </w:pPr>
-      <w:hyperlink w:anchor="_Toc243902063" w:history="1">
+      <w:hyperlink w:anchor="_Toc243924455" w:history="1">
         <w:r>
           <w:rPr>
             <w:rStyle w:val="Hipervnculo"/>
@@ -6273,7 +6273,7 @@
             <w:noProof/>
             <w:webHidden/>
           </w:rPr>
-          <w:instrText xml:space="preserve"> PAGEREF _Toc243902063 \h </w:instrText>
+          <w:instrText xml:space="preserve"> PAGEREF _Toc243924455 \h </w:instrText>
         </w:r>
         <w:r>
           <w:rPr>
@@ -6316,7 +6316,7 @@
           <w14:ligatures w14:val="standardContextual"/>
         </w:rPr>
       </w:pPr>
-      <w:hyperlink w:anchor="_Toc243902064" w:history="1">
+      <w:hyperlink w:anchor="_Toc243924456" w:history="1">
         <w:r>
           <w:rPr>
             <w:rStyle w:val="Hipervnculo"/>
@@ -6343,7 +6343,7 @@
             <w:noProof/>
             <w:webHidden/>
           </w:rPr>
-          <w:instrText xml:space="preserve"> PAGEREF _Toc243902064 \h </w:instrText>
+          <w:instrText xml:space="preserve"> PAGEREF _Toc243924456 \h </w:instrText>
         </w:r>
         <w:r>
           <w:rPr>
@@ -6386,7 +6386,7 @@
           <w14:ligatures w14:val="standardContextual"/>
         </w:rPr>
       </w:pPr>
-      <w:hyperlink w:anchor="_Toc243902065" w:history="1">
+      <w:hyperlink w:anchor="_Toc243924457" w:history="1">
         <w:r>
           <w:rPr>
             <w:rStyle w:val="Hipervnculo"/>
@@ -6413,7 +6413,7 @@
             <w:noProof/>
             <w:webHidden/>
           </w:rPr>
-          <w:instrText xml:space="preserve"> PAGEREF _Toc243902065 \h </w:instrText>
+          <w:instrText xml:space="preserve"> PAGEREF _Toc243924457 \h </w:instrText>
         </w:r>
         <w:r>
           <w:rPr>
@@ -6456,7 +6456,7 @@
           <w14:ligatures w14:val="standardContextual"/>
         </w:rPr>
       </w:pPr>
-      <w:hyperlink w:anchor="_Toc243902066" w:history="1">
+      <w:hyperlink w:anchor="_Toc243924458" w:history="1">
         <w:r>
           <w:rPr>
             <w:rStyle w:val="Hipervnculo"/>
@@ -6483,7 +6483,7 @@
             <w:noProof/>
             <w:webHidden/>
           </w:rPr>
-          <w:instrText xml:space="preserve"> PAGEREF _Toc243902066 \h </w:instrText>
+          <w:instrText xml:space="preserve"> PAGEREF _Toc243924458 \h </w:instrText>
         </w:r>
         <w:r>
           <w:rPr>
@@ -6529,7 +6529,7 @@
           <w14:ligatures w14:val="standardContextual"/>
         </w:rPr>
       </w:pPr>
-      <w:hyperlink w:anchor="_Toc243902067" w:history="1">
+      <w:hyperlink w:anchor="_Toc243924459" w:history="1">
         <w:r>
           <w:rPr>
             <w:rStyle w:val="Hipervnculo"/>
@@ -6556,7 +6556,7 @@
             <w:noProof/>
             <w:webHidden/>
           </w:rPr>
-          <w:instrText xml:space="preserve"> PAGEREF _Toc243902067 \h </w:instrText>
+          <w:instrText xml:space="preserve"> PAGEREF _Toc243924459 \h </w:instrText>
         </w:r>
         <w:r>
           <w:rPr>
@@ -6599,7 +6599,7 @@
           <w14:ligatures w14:val="standardContextual"/>
         </w:rPr>
       </w:pPr>
-      <w:hyperlink w:anchor="_Toc243902068" w:history="1">
+      <w:hyperlink w:anchor="_Toc243924460" w:history="1">
         <w:r>
           <w:rPr>
             <w:rStyle w:val="Hipervnculo"/>
@@ -6626,7 +6626,7 @@
             <w:noProof/>
             <w:webHidden/>
           </w:rPr>
-          <w:instrText xml:space="preserve"> PAGEREF _Toc243902068 \h </w:instrText>
+          <w:instrText xml:space="preserve"> PAGEREF _Toc243924460 \h </w:instrText>
         </w:r>
         <w:r>
           <w:rPr>
@@ -6669,7 +6669,7 @@
           <w14:ligatures w14:val="standardContextual"/>
         </w:rPr>
       </w:pPr>
-      <w:hyperlink w:anchor="_Toc243902069" w:history="1">
+      <w:hyperlink w:anchor="_Toc243924461" w:history="1">
         <w:r>
           <w:rPr>
             <w:rStyle w:val="Hipervnculo"/>
@@ -6696,7 +6696,7 @@
             <w:noProof/>
             <w:webHidden/>
           </w:rPr>
-          <w:instrText xml:space="preserve"> PAGEREF _Toc243902069 \h </w:instrText>
+          <w:instrText xml:space="preserve"> PAGEREF _Toc243924461 \h </w:instrText>
         </w:r>
         <w:r>
           <w:rPr>
@@ -6739,7 +6739,7 @@
           <w14:ligatures w14:val="standardContextual"/>
         </w:rPr>
       </w:pPr>
-      <w:hyperlink w:anchor="_Toc243902070" w:history="1">
+      <w:hyperlink w:anchor="_Toc243924462" w:history="1">
         <w:r>
           <w:rPr>
             <w:rStyle w:val="Hipervnculo"/>
@@ -6766,7 +6766,7 @@
             <w:noProof/>
             <w:webHidden/>
           </w:rPr>
-          <w:instrText xml:space="preserve"> PAGEREF _Toc243902070 \h </w:instrText>
+          <w:instrText xml:space="preserve"> PAGEREF _Toc243924462 \h </w:instrText>
         </w:r>
         <w:r>
           <w:rPr>
@@ -6809,7 +6809,7 @@
           <w14:ligatures w14:val="standardContextual"/>
         </w:rPr>
       </w:pPr>
-      <w:hyperlink w:anchor="_Toc243902071" w:history="1">
+      <w:hyperlink w:anchor="_Toc243924463" w:history="1">
         <w:r>
           <w:rPr>
             <w:rStyle w:val="Hipervnculo"/>
@@ -6836,7 +6836,7 @@
             <w:noProof/>
             <w:webHidden/>
           </w:rPr>
-          <w:instrText xml:space="preserve"> PAGEREF _Toc243902071 \h </w:instrText>
+          <w:instrText xml:space="preserve"> PAGEREF _Toc243924463 \h </w:instrText>
         </w:r>
         <w:r>
           <w:rPr>
@@ -6879,7 +6879,7 @@
           <w14:ligatures w14:val="standardContextual"/>
         </w:rPr>
       </w:pPr>
-      <w:hyperlink w:anchor="_Toc243902072" w:history="1">
+      <w:hyperlink w:anchor="_Toc243924464" w:history="1">
         <w:r>
           <w:rPr>
             <w:rStyle w:val="Hipervnculo"/>
@@ -6906,7 +6906,7 @@
             <w:noProof/>
             <w:webHidden/>
           </w:rPr>
-          <w:instrText xml:space="preserve"> PAGEREF _Toc243902072 \h </w:instrText>
+          <w:instrText xml:space="preserve"> PAGEREF _Toc243924464 \h </w:instrText>
         </w:r>
         <w:r>
           <w:rPr>
@@ -6952,7 +6952,7 @@
           <w14:ligatures w14:val="standardContextual"/>
         </w:rPr>
       </w:pPr>
-      <w:hyperlink w:anchor="_Toc243902073" w:history="1">
+      <w:hyperlink w:anchor="_Toc243924465" w:history="1">
         <w:r>
           <w:rPr>
             <w:rStyle w:val="Hipervnculo"/>
@@ -6979,7 +6979,7 @@
             <w:noProof/>
             <w:webHidden/>
           </w:rPr>
-          <w:instrText xml:space="preserve"> PAGEREF _Toc243902073 \h </w:instrText>
+          <w:instrText xml:space="preserve"> PAGEREF _Toc243924465 \h </w:instrText>
         </w:r>
         <w:r>
           <w:rPr>
@@ -7022,7 +7022,7 @@
           <w14:ligatures w14:val="standardContextual"/>
         </w:rPr>
       </w:pPr>
-      <w:hyperlink w:anchor="_Toc243902074" w:history="1">
+      <w:hyperlink w:anchor="_Toc243924466" w:history="1">
         <w:r>
           <w:rPr>
             <w:rStyle w:val="Hipervnculo"/>
@@ -7049,7 +7049,7 @@
             <w:noProof/>
             <w:webHidden/>
           </w:rPr>
-          <w:instrText xml:space="preserve"> PAGEREF _Toc243902074 \h </w:instrText>
+          <w:instrText xml:space="preserve"> PAGEREF _Toc243924466 \h </w:instrText>
         </w:r>
         <w:r>
           <w:rPr>
@@ -7092,7 +7092,7 @@
           <w14:ligatures w14:val="standardContextual"/>
         </w:rPr>
       </w:pPr>
-      <w:hyperlink w:anchor="_Toc243902075" w:history="1">
+      <w:hyperlink w:anchor="_Toc243924467" w:history="1">
         <w:r>
           <w:rPr>
             <w:rStyle w:val="Hipervnculo"/>
@@ -7119,7 +7119,7 @@
             <w:noProof/>
             <w:webHidden/>
           </w:rPr>
-          <w:instrText xml:space="preserve"> PAGEREF _Toc243902075 \h </w:instrText>
+          <w:instrText xml:space="preserve"> PAGEREF _Toc243924467 \h </w:instrText>
         </w:r>
         <w:r>
           <w:rPr>
@@ -7162,7 +7162,7 @@
           <w14:ligatures w14:val="standardContextual"/>
         </w:rPr>
       </w:pPr>
-      <w:hyperlink w:anchor="_Toc243902076" w:history="1">
+      <w:hyperlink w:anchor="_Toc243924468" w:history="1">
         <w:r>
           <w:rPr>
             <w:rStyle w:val="Hipervnculo"/>
@@ -7189,7 +7189,7 @@
             <w:noProof/>
             <w:webHidden/>
           </w:rPr>
-          <w:instrText xml:space="preserve"> PAGEREF _Toc243902076 \h </w:instrText>
+          <w:instrText xml:space="preserve"> PAGEREF _Toc243924468 \h </w:instrText>
         </w:r>
         <w:r>
           <w:rPr>
@@ -7232,7 +7232,7 @@
           <w14:ligatures w14:val="standardContextual"/>
         </w:rPr>
       </w:pPr>
-      <w:hyperlink w:anchor="_Toc243902077" w:history="1">
+      <w:hyperlink w:anchor="_Toc243924469" w:history="1">
         <w:r>
           <w:rPr>
             <w:rStyle w:val="Hipervnculo"/>
@@ -7259,7 +7259,7 @@
             <w:noProof/>
             <w:webHidden/>
           </w:rPr>
-          <w:instrText xml:space="preserve"> PAGEREF _Toc243902077 \h </w:instrText>
+          <w:instrText xml:space="preserve"> PAGEREF _Toc243924469 \h </w:instrText>
         </w:r>
         <w:r>
           <w:rPr>
@@ -7302,7 +7302,7 @@
           <w14:ligatures w14:val="standardContextual"/>
         </w:rPr>
       </w:pPr>
-      <w:hyperlink w:anchor="_Toc243902078" w:history="1">
+      <w:hyperlink w:anchor="_Toc243924470" w:history="1">
         <w:r>
           <w:rPr>
             <w:rStyle w:val="Hipervnculo"/>
@@ -7329,7 +7329,7 @@
             <w:noProof/>
             <w:webHidden/>
           </w:rPr>
-          <w:instrText xml:space="preserve"> PAGEREF _Toc243902078 \h </w:instrText>
+          <w:instrText xml:space="preserve"> PAGEREF _Toc243924470 \h </w:instrText>
         </w:r>
         <w:r>
           <w:rPr>
@@ -7375,7 +7375,7 @@
           <w14:ligatures w14:val="standardContextual"/>
         </w:rPr>
       </w:pPr>
-      <w:hyperlink w:anchor="_Toc243902079" w:history="1">
+      <w:hyperlink w:anchor="_Toc243924471" w:history="1">
         <w:r>
           <w:rPr>
             <w:rStyle w:val="Hipervnculo"/>
@@ -7411,7 +7411,7 @@
             <w:noProof/>
             <w:webHidden/>
           </w:rPr>
-          <w:instrText xml:space="preserve"> PAGEREF _Toc243902079 \h </w:instrText>
+          <w:instrText xml:space="preserve"> PAGEREF _Toc243924471 \h </w:instrText>
         </w:r>
         <w:r>
           <w:rPr>
@@ -7454,7 +7454,7 @@
           <w14:ligatures w14:val="standardContextual"/>
         </w:rPr>
       </w:pPr>
-      <w:hyperlink w:anchor="_Toc243902080" w:history="1">
+      <w:hyperlink w:anchor="_Toc243924472" w:history="1">
         <w:r>
           <w:rPr>
             <w:rStyle w:val="Hipervnculo"/>
@@ -7481,7 +7481,7 @@
             <w:noProof/>
             <w:webHidden/>
           </w:rPr>
-          <w:instrText xml:space="preserve"> PAGEREF _Toc243902080 \h </w:instrText>
+          <w:instrText xml:space="preserve"> PAGEREF _Toc243924472 \h </w:instrText>
         </w:r>
         <w:r>
           <w:rPr>
@@ -7524,7 +7524,7 @@
           <w14:ligatures w14:val="standardContextual"/>
         </w:rPr>
       </w:pPr>
-      <w:hyperlink w:anchor="_Toc243902081" w:history="1">
+      <w:hyperlink w:anchor="_Toc243924473" w:history="1">
         <w:r>
           <w:rPr>
             <w:rStyle w:val="Hipervnculo"/>
@@ -7551,7 +7551,7 @@
             <w:noProof/>
             <w:webHidden/>
           </w:rPr>
-          <w:instrText xml:space="preserve"> PAGEREF _Toc243902081 \h </w:instrText>
+          <w:instrText xml:space="preserve"> PAGEREF _Toc243924473 \h </w:instrText>
         </w:r>
         <w:r>
           <w:rPr>
@@ -7594,7 +7594,7 @@
           <w14:ligatures w14:val="standardContextual"/>
         </w:rPr>
       </w:pPr>
-      <w:hyperlink w:anchor="_Toc243902082" w:history="1">
+      <w:hyperlink w:anchor="_Toc243924474" w:history="1">
         <w:r>
           <w:rPr>
             <w:rStyle w:val="Hipervnculo"/>
@@ -7621,7 +7621,7 @@
             <w:noProof/>
             <w:webHidden/>
           </w:rPr>
-          <w:instrText xml:space="preserve"> PAGEREF _Toc243902082 \h </w:instrText>
+          <w:instrText xml:space="preserve"> PAGEREF _Toc243924474 \h </w:instrText>
         </w:r>
         <w:r>
           <w:rPr>
@@ -7664,7 +7664,7 @@
           <w14:ligatures w14:val="standardContextual"/>
         </w:rPr>
       </w:pPr>
-      <w:hyperlink w:anchor="_Toc243902083" w:history="1">
+      <w:hyperlink w:anchor="_Toc243924475" w:history="1">
         <w:r>
           <w:rPr>
             <w:rStyle w:val="Hipervnculo"/>
@@ -7691,7 +7691,7 @@
             <w:noProof/>
             <w:webHidden/>
           </w:rPr>
-          <w:instrText xml:space="preserve"> PAGEREF _Toc243902083 \h </w:instrText>
+          <w:instrText xml:space="preserve"> PAGEREF _Toc243924475 \h </w:instrText>
         </w:r>
         <w:r>
           <w:rPr>
@@ -7734,7 +7734,7 @@
           <w14:ligatures w14:val="standardContextual"/>
         </w:rPr>
       </w:pPr>
-      <w:hyperlink w:anchor="_Toc243902084" w:history="1">
+      <w:hyperlink w:anchor="_Toc243924476" w:history="1">
         <w:r>
           <w:rPr>
             <w:rStyle w:val="Hipervnculo"/>
@@ -7761,7 +7761,7 @@
             <w:noProof/>
             <w:webHidden/>
           </w:rPr>
-          <w:instrText xml:space="preserve"> PAGEREF _Toc243902084 \h </w:instrText>
+          <w:instrText xml:space="preserve"> PAGEREF _Toc243924476 \h </w:instrText>
         </w:r>
         <w:r>
           <w:rPr>
@@ -7807,7 +7807,7 @@
           <w14:ligatures w14:val="standardContextual"/>
         </w:rPr>
       </w:pPr>
-      <w:hyperlink w:anchor="_Toc243902085" w:history="1">
+      <w:hyperlink w:anchor="_Toc243924477" w:history="1">
         <w:r>
           <w:rPr>
             <w:rStyle w:val="Hipervnculo"/>
@@ -7834,7 +7834,7 @@
             <w:noProof/>
             <w:webHidden/>
           </w:rPr>
-          <w:instrText xml:space="preserve"> PAGEREF _Toc243902085 \h </w:instrText>
+          <w:instrText xml:space="preserve"> PAGEREF _Toc243924477 \h </w:instrText>
         </w:r>
         <w:r>
           <w:rPr>
@@ -7877,7 +7877,7 @@
           <w14:ligatures w14:val="standardContextual"/>
         </w:rPr>
       </w:pPr>
-      <w:hyperlink w:anchor="_Toc243902086" w:history="1">
+      <w:hyperlink w:anchor="_Toc243924478" w:history="1">
         <w:r>
           <w:rPr>
             <w:rStyle w:val="Hipervnculo"/>
@@ -7904,7 +7904,7 @@
             <w:noProof/>
             <w:webHidden/>
           </w:rPr>
-          <w:instrText xml:space="preserve"> PAGEREF _Toc243902086 \h </w:instrText>
+          <w:instrText xml:space="preserve"> PAGEREF _Toc243924478 \h </w:instrText>
         </w:r>
         <w:r>
           <w:rPr>
@@ -7950,7 +7950,7 @@
           <w14:ligatures w14:val="standardContextual"/>
         </w:rPr>
       </w:pPr>
-      <w:hyperlink w:anchor="_Toc243902087" w:history="1">
+      <w:hyperlink w:anchor="_Toc243924479" w:history="1">
         <w:r>
           <w:rPr>
             <w:rStyle w:val="Hipervnculo"/>
@@ -7977,7 +7977,7 @@
             <w:noProof/>
             <w:webHidden/>
           </w:rPr>
-          <w:instrText xml:space="preserve"> PAGEREF _Toc243902087 \h </w:instrText>
+          <w:instrText xml:space="preserve"> PAGEREF _Toc243924479 \h </w:instrText>
         </w:r>
         <w:r>
           <w:rPr>
@@ -8020,7 +8020,7 @@
           <w14:ligatures w14:val="standardContextual"/>
         </w:rPr>
       </w:pPr>
-      <w:hyperlink w:anchor="_Toc243902088" w:history="1">
+      <w:hyperlink w:anchor="_Toc243924480" w:history="1">
         <w:r>
           <w:rPr>
             <w:rStyle w:val="Hipervnculo"/>
@@ -8047,7 +8047,7 @@
             <w:noProof/>
             <w:webHidden/>
           </w:rPr>
-          <w:instrText xml:space="preserve"> PAGEREF _Toc243902088 \h </w:instrText>
+          <w:instrText xml:space="preserve"> PAGEREF _Toc243924480 \h </w:instrText>
         </w:r>
         <w:r>
           <w:rPr>
@@ -8090,7 +8090,7 @@
           <w14:ligatures w14:val="standardContextual"/>
         </w:rPr>
       </w:pPr>
-      <w:hyperlink w:anchor="_Toc243902089" w:history="1">
+      <w:hyperlink w:anchor="_Toc243924481" w:history="1">
         <w:r>
           <w:rPr>
             <w:rStyle w:val="Hipervnculo"/>
@@ -8117,7 +8117,7 @@
             <w:noProof/>
             <w:webHidden/>
           </w:rPr>
-          <w:instrText xml:space="preserve"> PAGEREF _Toc243902089 \h </w:instrText>
+          <w:instrText xml:space="preserve"> PAGEREF _Toc243924481 \h </w:instrText>
         </w:r>
         <w:r>
           <w:rPr>
@@ -8160,7 +8160,7 @@
           <w14:ligatures w14:val="standardContextual"/>
         </w:rPr>
       </w:pPr>
-      <w:hyperlink w:anchor="_Toc243902090" w:history="1">
+      <w:hyperlink w:anchor="_Toc243924482" w:history="1">
         <w:r>
           <w:rPr>
             <w:rStyle w:val="Hipervnculo"/>
@@ -8187,7 +8187,7 @@
             <w:noProof/>
             <w:webHidden/>
           </w:rPr>
-          <w:instrText xml:space="preserve"> PAGEREF _Toc243902090 \h </w:instrText>
+          <w:instrText xml:space="preserve"> PAGEREF _Toc243924482 \h </w:instrText>
         </w:r>
         <w:r>
           <w:rPr>
@@ -8233,7 +8233,7 @@
           <w14:ligatures w14:val="standardContextual"/>
         </w:rPr>
       </w:pPr>
-      <w:hyperlink w:anchor="_Toc243902091" w:history="1">
+      <w:hyperlink w:anchor="_Toc243924483" w:history="1">
         <w:r>
           <w:rPr>
             <w:rStyle w:val="Hipervnculo"/>
@@ -8260,7 +8260,7 @@
             <w:noProof/>
             <w:webHidden/>
           </w:rPr>
-          <w:instrText xml:space="preserve"> PAGEREF _Toc243902091 \h </w:instrText>
+          <w:instrText xml:space="preserve"> PAGEREF _Toc243924483 \h </w:instrText>
         </w:r>
         <w:r>
           <w:rPr>
@@ -8306,7 +8306,7 @@
           <w14:ligatures w14:val="standardContextual"/>
         </w:rPr>
       </w:pPr>
-      <w:hyperlink w:anchor="_Toc243902092" w:history="1">
+      <w:hyperlink w:anchor="_Toc243924484" w:history="1">
         <w:r>
           <w:rPr>
             <w:rStyle w:val="Hipervnculo"/>
@@ -8333,7 +8333,7 @@
             <w:noProof/>
             <w:webHidden/>
           </w:rPr>
-          <w:instrText xml:space="preserve"> PAGEREF _Toc243902092 \h </w:instrText>
+          <w:instrText xml:space="preserve"> PAGEREF _Toc243924484 \h </w:instrText>
         </w:r>
         <w:r>
           <w:rPr>
@@ -9003,7 +9003,7 @@
         <w:pStyle w:val="Ttulo1"/>
       </w:pPr>
       <w:bookmarkStart w:id="0" w:name="_ad9e25c8626cd57ecdce5548ccf29c0d11fa207"/>
-      <w:bookmarkStart w:id="1" w:name="_Toc243901980"/>
+      <w:bookmarkStart w:id="1" w:name="_Toc243924372"/>
       <w:r>
         <w:lastRenderedPageBreak/>
         <w:t xml:space="preserve">Módulo 0 — Plataforma: clínicas, planes y suscripción </w:t>
@@ -9030,7 +9030,7 @@
         <w:pStyle w:val="Ttulo2"/>
       </w:pPr>
       <w:bookmarkStart w:id="2" w:name="_1eb36715c186f58cce98281b1b189d20510db73"/>
-      <w:bookmarkStart w:id="3" w:name="_Toc243901981"/>
+      <w:bookmarkStart w:id="3" w:name="_Toc243924373"/>
       <w:r>
         <w:t>HU-0.1 — Registrar una clínica (self-service)</w:t>
       </w:r>
@@ -9210,7 +9210,10 @@
         </w:numPr>
       </w:pPr>
       <w:r>
-        <w:t>Valida el formato y el dígito de verificación DIAN del NIT. El NIT duplicado se rechaza y puede reportarse a soporte. La respuesta pública no revela identidades: «Revisa tu correo para activar la clínica». Una cuenta existente confirma por correo sin cambiar sus datos, contraseña ni otros roles; la contraseña del formulario se ignora. Si el correo es nuevo y el documento existe, se confirma al titular del documento; si identifican personas distintas, prevalece el correo.</w:t>
+        <w:t>Pide un único NIT o cédula: sin guion conserva todo el número y calcula el DV; con guion comprueba el DV escrito mediante el algoritmo DIAN. No añade guion ni recorta cifras al escribir o salir; limpia puntos/espacios al pegar. Se guarda número más DV en el formato normalizado existente (rectificación del dueño, 2026-10-26, que permite cédula sola y sustituye la obligación de escribir siempre el DV). El NIT duplicado se rechaza y puede reportarse a soporte. La respuesta pública no revela identidades: «Revis</w:t>
+      </w:r>
+      <w:r>
+        <w:t>a tu correo para activar la clínica». Una cuenta existente confirma por correo sin cambiar sus datos, contraseña ni otros roles; la contraseña del formulario se ignora. Si el correo es nuevo y el documento existe, se confirma al titular del documento; si identifican personas distintas, prevalece el correo.</w:t>
       </w:r>
     </w:p>
     <w:p>
@@ -9313,9 +9316,10 @@
         <w:pStyle w:val="Ttulo2"/>
       </w:pPr>
       <w:bookmarkStart w:id="4" w:name="_802afc2bac434eff8b2fd18354a2e26d7a1818b"/>
-      <w:bookmarkStart w:id="5" w:name="_Toc243901982"/>
+      <w:bookmarkStart w:id="5" w:name="_Toc243924374"/>
       <w:bookmarkEnd w:id="2"/>
       <w:r>
+        <w:lastRenderedPageBreak/>
         <w:t>HU-0.2 — Verificar el correo y activar la clínica</w:t>
       </w:r>
       <w:bookmarkEnd w:id="5"/>
@@ -9470,7 +9474,6 @@
           <w:b/>
           <w:bCs/>
         </w:rPr>
-        <w:lastRenderedPageBreak/>
         <w:t>Criterios de aceptación:</w:t>
       </w:r>
     </w:p>
@@ -9605,7 +9608,7 @@
         <w:pStyle w:val="Ttulo2"/>
       </w:pPr>
       <w:bookmarkStart w:id="6" w:name="_bb7346f7e0c84a0526cc1b09dcf7185b4de9ba6"/>
-      <w:bookmarkStart w:id="7" w:name="_Toc243901983"/>
+      <w:bookmarkStart w:id="7" w:name="_Toc243924375"/>
       <w:bookmarkEnd w:id="4"/>
       <w:r>
         <w:t>HU-0.3 — Panel del super-administrador</w:t>
@@ -9836,6 +9839,7 @@
           <w:b/>
           <w:bCs/>
         </w:rPr>
+        <w:lastRenderedPageBreak/>
         <w:t>No</w:t>
       </w:r>
       <w:r>
@@ -9872,11 +9876,7 @@
         </w:numPr>
       </w:pPr>
       <w:r>
-        <w:t xml:space="preserve">Puede suspender o dar de baja una clínica sospechosa de duplicidad o abuso del plan gratuito, indicando el motivo; solo dar de baja pide confirmación, y puede reactivar una </w:t>
-      </w:r>
-      <w:r>
-        <w:lastRenderedPageBreak/>
-        <w:t>suspendida con motivo. El personal pierde el contexto suspendido o dado de baja en la siguiente petición.</w:t>
+        <w:t>Puede suspender o dar de baja una clínica sospechosa de duplicidad o abuso del plan gratuito, indicando el motivo; solo dar de baja pide confirmación, y puede reactivar una suspendida con motivo. El personal pierde el contexto suspendido o dado de baja en la siguiente petición.</w:t>
       </w:r>
     </w:p>
     <w:p>
@@ -9983,7 +9983,7 @@
         <w:pStyle w:val="Ttulo2"/>
       </w:pPr>
       <w:bookmarkStart w:id="8" w:name="_81995397ba8e62ea0a492c5a03eed8bb24e762a"/>
-      <w:bookmarkStart w:id="9" w:name="_Toc243901984"/>
+      <w:bookmarkStart w:id="9" w:name="_Toc243924376"/>
       <w:bookmarkEnd w:id="6"/>
       <w:r>
         <w:t>HU-0.4 — Control de límites del plan (freemium)</w:t>
@@ -10164,7 +10164,11 @@
         </w:numPr>
       </w:pPr>
       <w:r>
-        <w:t>Antes de una acción que consume cupo (crear o vincular una mascota, crear una cita, invitar o reactivar personal) se lee el plan y el estado de suscripción de la clínica. Reactivar consume cupo si la persona no lo tenía reservado por una invitación vigente; cambiar datos de alguien ya activo no consume otro cupo.</w:t>
+        <w:t xml:space="preserve">Antes de una acción que consume cupo (crear o vincular una mascota, crear una cita, invitar o reactivar personal) se lee el plan y el estado de suscripción de la clínica. Reactivar </w:t>
+      </w:r>
+      <w:r>
+        <w:lastRenderedPageBreak/>
+        <w:t>consume cupo si la persona no lo tenía reservado por una invitación vigente; cambiar datos de alguien ya activo no consume otro cupo.</w:t>
       </w:r>
     </w:p>
     <w:p>
@@ -10228,7 +10232,6 @@
         </w:numPr>
       </w:pPr>
       <w:r>
-        <w:lastRenderedPageBreak/>
         <w:t xml:space="preserve">Cuando quien intenta la acción es el </w:t>
       </w:r>
       <w:r>
@@ -10340,7 +10343,7 @@
         <w:pStyle w:val="Ttulo2"/>
       </w:pPr>
       <w:bookmarkStart w:id="10" w:name="_7e8f3608e8fc52636cb9cbad9cf55731ae6c539"/>
-      <w:bookmarkStart w:id="11" w:name="_Toc243901985"/>
+      <w:bookmarkStart w:id="11" w:name="_Toc243924377"/>
       <w:bookmarkEnd w:id="8"/>
       <w:r>
         <w:t>HU-0.5 — Suscripción, pagos y congelación por mora</w:t>
@@ -10545,6 +10548,7 @@
         </w:numPr>
       </w:pPr>
       <w:r>
+        <w:lastRenderedPageBreak/>
         <w:t>La tarea programada actualiza estados y avisa por correo a todos los administradores activos verificados, a 7 y 1 días del fin y al congelar. Repetir no duplica transición ni aviso.</w:t>
       </w:r>
     </w:p>
@@ -10579,14 +10583,10 @@
         <w:t xml:space="preserve"> </w:t>
       </w:r>
       <w:r>
-        <w:t xml:space="preserve">Pagar/Renovar abre Wompi por importe del servidor y referencia única. La consulta API privada concordante concede periodo una vez, por evento verificado o recuperación del ID del retorno limitada a la clínica propia; los datos del navegador nunca acreditan por sí solos. </w:t>
-      </w:r>
-      <w:r>
-        <w:lastRenderedPageBreak/>
-        <w:t>Doble clic, dos pestañas o peticiones simultáneas devuelven la misma orden y nunca originan dos cobros desde Zooki. Historial propio sin datos completos del medio. Una cotización vencida solo se libera tras fallo terminal confirmado; la sigu</w:t>
-      </w:r>
-      <w:r>
-        <w:t>iente usa tarifa vigente y conserva la evidencia anterior.</w:t>
+        <w:t xml:space="preserve">Pagar/Renovar abre Wompi por importe del servidor y referencia única. La consulta API privada concordante concede periodo una vez, por evento verificado o recuperación del ID del retorno limitada a la clínica propia; los datos del navegador nunca acreditan por sí solos. Doble clic, dos pestañas o peticiones simultáneas devuelven la misma orden y nunca originan dos cobros desde Zooki. Historial propio sin datos completos del medio. Una cotización vencida se libera tras fallo terminal confirmado o, si fue un </w:t>
+      </w:r>
+      <w:r>
+        <w:t>checkout manual abandonado sin ID, tras búsqueda privada completa y vacía por referencia y revalidación bajo candado con auditoría. La comprobación ocurre al volver a pagar y en la tarea programada existente; errores o resultados dudosos no liberan la reserva. La siguiente cotización usa tarifa vigente y conserva la evidencia anterior; una aprobación tardía de la orden cerrada genera incidencia sin conceder otro periodo (decisión del dueño, 2026-10-26).</w:t>
       </w:r>
     </w:p>
     <w:p>
@@ -10693,7 +10693,7 @@
         <w:pStyle w:val="Ttulo1"/>
       </w:pPr>
       <w:bookmarkStart w:id="12" w:name="_3f52c9db5995a4dc1e731f6d8cd57f262bab040"/>
-      <w:bookmarkStart w:id="13" w:name="_Toc243901986"/>
+      <w:bookmarkStart w:id="13" w:name="_Toc243924378"/>
       <w:bookmarkEnd w:id="0"/>
       <w:bookmarkEnd w:id="10"/>
       <w:r>
@@ -10715,7 +10715,7 @@
         <w:pStyle w:val="Ttulo2"/>
       </w:pPr>
       <w:bookmarkStart w:id="14" w:name="_76f4ca07816b696a7e21234a3fd245066d4202e"/>
-      <w:bookmarkStart w:id="15" w:name="_Toc243901987"/>
+      <w:bookmarkStart w:id="15" w:name="_Toc243924379"/>
       <w:r>
         <w:t>HU-T.1 — Iniciar sesión y autenticación</w:t>
       </w:r>
@@ -10970,7 +10970,7 @@
         <w:pStyle w:val="Ttulo2"/>
       </w:pPr>
       <w:bookmarkStart w:id="16" w:name="_08f5c8e95117bf9bc16117a780f642084f0c149"/>
-      <w:bookmarkStart w:id="17" w:name="_Toc243901988"/>
+      <w:bookmarkStart w:id="17" w:name="_Toc243924380"/>
       <w:bookmarkEnd w:id="14"/>
       <w:r>
         <w:t>HU-T.2 — Cambiar mi contraseña</w:t>
@@ -11246,7 +11246,7 @@
         <w:pStyle w:val="Ttulo2"/>
       </w:pPr>
       <w:bookmarkStart w:id="18" w:name="_44f513b1e95bac8cbf132f88a3649b6be2902d9"/>
-      <w:bookmarkStart w:id="19" w:name="_Toc243901989"/>
+      <w:bookmarkStart w:id="19" w:name="_Toc243924381"/>
       <w:bookmarkEnd w:id="16"/>
       <w:r>
         <w:lastRenderedPageBreak/>
@@ -11485,7 +11485,7 @@
         <w:pStyle w:val="Ttulo2"/>
       </w:pPr>
       <w:bookmarkStart w:id="20" w:name="_1eded849c0926854c498005f8a93458b9d7a2d8"/>
-      <w:bookmarkStart w:id="21" w:name="_Toc243901990"/>
+      <w:bookmarkStart w:id="21" w:name="_Toc243924382"/>
       <w:bookmarkEnd w:id="18"/>
       <w:r>
         <w:t>HU-T.4 — Cerrar sesión</w:t>
@@ -11711,7 +11711,7 @@
         <w:pStyle w:val="Ttulo2"/>
       </w:pPr>
       <w:bookmarkStart w:id="22" w:name="_def34846ffbe39a85a6bd6a22079f6d076a01a9"/>
-      <w:bookmarkStart w:id="23" w:name="_Toc243901991"/>
+      <w:bookmarkStart w:id="23" w:name="_Toc243924383"/>
       <w:bookmarkEnd w:id="20"/>
       <w:r>
         <w:t>HU-T.5 — Ver y actualizar mi perfil y datos de contacto</w:t>
@@ -12135,7 +12135,7 @@
         <w:pStyle w:val="Ttulo2"/>
       </w:pPr>
       <w:bookmarkStart w:id="24" w:name="_37603926653c908321bb7c7e9ea1991584cc3b8"/>
-      <w:bookmarkStart w:id="25" w:name="_Toc243901992"/>
+      <w:bookmarkStart w:id="25" w:name="_Toc243924384"/>
       <w:bookmarkEnd w:id="22"/>
       <w:r>
         <w:t>HU-T.6 — Gestionar mis notificaciones internas</w:t>
@@ -12413,7 +12413,7 @@
         <w:pStyle w:val="Ttulo2"/>
       </w:pPr>
       <w:bookmarkStart w:id="26" w:name="_5605fb9a7931d45a4bf5dc8e3e653d18c531f06"/>
-      <w:bookmarkStart w:id="27" w:name="_Toc243901993"/>
+      <w:bookmarkStart w:id="27" w:name="_Toc243924385"/>
       <w:bookmarkEnd w:id="24"/>
       <w:r>
         <w:t>HU-T.7 — Gestión de usuarios del sistema</w:t>
@@ -12700,7 +12700,7 @@
         <w:pStyle w:val="Ttulo2"/>
       </w:pPr>
       <w:bookmarkStart w:id="28" w:name="_cca84937acbaa5cdc69c436564f31a3800184ab"/>
-      <w:bookmarkStart w:id="29" w:name="_Toc243901994"/>
+      <w:bookmarkStart w:id="29" w:name="_Toc243924386"/>
       <w:bookmarkEnd w:id="26"/>
       <w:r>
         <w:t>HU-T.8 — Logs de auditoría y seguridad</w:t>
@@ -12945,7 +12945,7 @@
         <w:pStyle w:val="Ttulo2"/>
       </w:pPr>
       <w:bookmarkStart w:id="30" w:name="_cb462f816148050ba0d7aac8f53a2b5b0cb7780"/>
-      <w:bookmarkStart w:id="31" w:name="_Toc243901995"/>
+      <w:bookmarkStart w:id="31" w:name="_Toc243924387"/>
       <w:bookmarkEnd w:id="28"/>
       <w:r>
         <w:t>HU-T.9 — Backup automático de la base de datos</w:t>
@@ -13415,7 +13415,7 @@
         <w:pStyle w:val="Ttulo2"/>
       </w:pPr>
       <w:bookmarkStart w:id="32" w:name="_276f5e9a65ab31ebb82d9356073ee60ffcf6855"/>
-      <w:bookmarkStart w:id="33" w:name="_Toc243901996"/>
+      <w:bookmarkStart w:id="33" w:name="_Toc243924388"/>
       <w:bookmarkEnd w:id="30"/>
       <w:r>
         <w:t>HU-T.10 — Autorización central por rol (RBAC real)</w:t>
@@ -13693,7 +13693,7 @@
         <w:pStyle w:val="Ttulo2"/>
       </w:pPr>
       <w:bookmarkStart w:id="34" w:name="_3b0d05aa899aefedfcf439319a22bd7df135017"/>
-      <w:bookmarkStart w:id="35" w:name="_Toc243901997"/>
+      <w:bookmarkStart w:id="35" w:name="_Toc243924389"/>
       <w:bookmarkEnd w:id="32"/>
       <w:r>
         <w:t>HU-T.11 — Corregir escalada de privilegios y proteger al último administrador</w:t>
@@ -13943,7 +13943,7 @@
         <w:pStyle w:val="Ttulo2"/>
       </w:pPr>
       <w:bookmarkStart w:id="36" w:name="_5106da541d290f3488d79d8c1e91fe390d48e5c"/>
-      <w:bookmarkStart w:id="37" w:name="_Toc243901998"/>
+      <w:bookmarkStart w:id="37" w:name="_Toc243924390"/>
       <w:bookmarkEnd w:id="34"/>
       <w:r>
         <w:t>HU-T.12 — Política de contraseñas, verificación de correo y OAuth seguro</w:t>
@@ -14264,7 +14264,7 @@
         <w:pStyle w:val="Ttulo2"/>
       </w:pPr>
       <w:bookmarkStart w:id="38" w:name="_2303defb5da6c78860aeae9d161d0fa18f76502"/>
-      <w:bookmarkStart w:id="39" w:name="_Toc243901999"/>
+      <w:bookmarkStart w:id="39" w:name="_Toc243924391"/>
       <w:bookmarkEnd w:id="36"/>
       <w:r>
         <w:t>HU-T.13 — Endurecer rate limiting y reducir enumeración/fuga de información</w:t>
@@ -14566,7 +14566,7 @@
         <w:pStyle w:val="Ttulo2"/>
       </w:pPr>
       <w:bookmarkStart w:id="40" w:name="_37cade07514fa6d0623cee7537c5f68cab00cfd"/>
-      <w:bookmarkStart w:id="41" w:name="_Toc243902000"/>
+      <w:bookmarkStart w:id="41" w:name="_Toc243924392"/>
       <w:bookmarkEnd w:id="38"/>
       <w:r>
         <w:t>HU-T.14 — Restablecer la contraseña de un usuario (administrador)</w:t>
@@ -14862,7 +14862,7 @@
         <w:pStyle w:val="Ttulo2"/>
       </w:pPr>
       <w:bookmarkStart w:id="42" w:name="_09522c4444a8bbebdaf4a55b5444d2231a6caff"/>
-      <w:bookmarkStart w:id="43" w:name="_Toc243902001"/>
+      <w:bookmarkStart w:id="43" w:name="_Toc243924393"/>
       <w:bookmarkEnd w:id="40"/>
       <w:r>
         <w:t>HU-T.15 — Aislamiento por clínica y rol super-administrador</w:t>
@@ -15454,7 +15454,7 @@
         <w:pStyle w:val="Ttulo2"/>
       </w:pPr>
       <w:bookmarkStart w:id="44" w:name="_7d4be07c6dc7ad98ff2d7fd7f946e3e6ff8ab78"/>
-      <w:bookmarkStart w:id="45" w:name="_Toc243902002"/>
+      <w:bookmarkStart w:id="45" w:name="_Toc243924394"/>
       <w:bookmarkEnd w:id="42"/>
       <w:r>
         <w:lastRenderedPageBreak/>
@@ -15703,7 +15703,7 @@
         <w:pStyle w:val="Ttulo2"/>
       </w:pPr>
       <w:bookmarkStart w:id="46" w:name="_fde5550409ae8bd107b35d83706fe49d1ac49cf"/>
-      <w:bookmarkStart w:id="47" w:name="_Toc243902003"/>
+      <w:bookmarkStart w:id="47" w:name="_Toc243924395"/>
       <w:bookmarkEnd w:id="44"/>
       <w:r>
         <w:t>HU-T.17 — Una persona con varios roles: elegir el contexto al iniciar sesión</w:t>
@@ -15963,7 +15963,7 @@
         <w:pStyle w:val="Ttulo2"/>
       </w:pPr>
       <w:bookmarkStart w:id="48" w:name="_7d9311428cd5b72468b37f82201f1b810f77c36"/>
-      <w:bookmarkStart w:id="49" w:name="_Toc243902004"/>
+      <w:bookmarkStart w:id="49" w:name="_Toc243924396"/>
       <w:bookmarkEnd w:id="46"/>
       <w:r>
         <w:t>HU-T.18 — Registrarme e iniciar sesión con Google (propietario)</w:t>
@@ -16265,7 +16265,7 @@
         <w:pStyle w:val="Ttulo2"/>
       </w:pPr>
       <w:bookmarkStart w:id="50" w:name="_a6c52dc4bdd2cb00ae48e74db3c3b2920a9b818"/>
-      <w:bookmarkStart w:id="51" w:name="_Toc243902005"/>
+      <w:bookmarkStart w:id="51" w:name="_Toc243924397"/>
       <w:bookmarkEnd w:id="48"/>
       <w:r>
         <w:t>HU-T.19 — Aceptar la política de tratamiento de datos</w:t>
@@ -16558,7 +16558,7 @@
         <w:pStyle w:val="Ttulo1"/>
       </w:pPr>
       <w:bookmarkStart w:id="52" w:name="_45e5cddb15e6e85961c4bdd9f114a9e4301e667"/>
-      <w:bookmarkStart w:id="53" w:name="_Toc243902006"/>
+      <w:bookmarkStart w:id="53" w:name="_Toc243924398"/>
       <w:bookmarkEnd w:id="12"/>
       <w:bookmarkEnd w:id="50"/>
       <w:r>
@@ -16580,7 +16580,7 @@
         <w:pStyle w:val="Ttulo2"/>
       </w:pPr>
       <w:bookmarkStart w:id="54" w:name="_3442f1e103117ab35c7be2be07e5b7a86f50900"/>
-      <w:bookmarkStart w:id="55" w:name="_Toc243902007"/>
+      <w:bookmarkStart w:id="55" w:name="_Toc243924399"/>
       <w:r>
         <w:t>HU-1.1 — Registrar mascota</w:t>
       </w:r>
@@ -16852,7 +16852,7 @@
         <w:pStyle w:val="Ttulo2"/>
       </w:pPr>
       <w:bookmarkStart w:id="56" w:name="_cac8078226ab7384debc291829d99266c4c98c9"/>
-      <w:bookmarkStart w:id="57" w:name="_Toc243902008"/>
+      <w:bookmarkStart w:id="57" w:name="_Toc243924400"/>
       <w:bookmarkEnd w:id="54"/>
       <w:r>
         <w:t>HU-1.2 — Registrar propietario</w:t>
@@ -17118,7 +17118,7 @@
         <w:pStyle w:val="Ttulo2"/>
       </w:pPr>
       <w:bookmarkStart w:id="58" w:name="_2775e78a99e9a6c8110a18962d2d3ffe08eb791"/>
-      <w:bookmarkStart w:id="59" w:name="_Toc243902009"/>
+      <w:bookmarkStart w:id="59" w:name="_Toc243924401"/>
       <w:bookmarkEnd w:id="56"/>
       <w:r>
         <w:lastRenderedPageBreak/>
@@ -17351,7 +17351,7 @@
         <w:pStyle w:val="Ttulo2"/>
       </w:pPr>
       <w:bookmarkStart w:id="60" w:name="_a48b917e447c9bb421319764b87fa8fbfffc6ce"/>
-      <w:bookmarkStart w:id="61" w:name="_Toc243902010"/>
+      <w:bookmarkStart w:id="61" w:name="_Toc243924402"/>
       <w:bookmarkEnd w:id="58"/>
       <w:r>
         <w:t>HU-1.4 — Editar y desactivar mascota</w:t>
@@ -17614,7 +17614,7 @@
         <w:pStyle w:val="Ttulo2"/>
       </w:pPr>
       <w:bookmarkStart w:id="62" w:name="_c56dbdf70effe4fdddd03cc982164bf6dfa15fd"/>
-      <w:bookmarkStart w:id="63" w:name="_Toc243902011"/>
+      <w:bookmarkStart w:id="63" w:name="_Toc243924403"/>
       <w:bookmarkEnd w:id="60"/>
       <w:r>
         <w:t>HU-1.5 — Vincular una mascota existente a la clínica</w:t>
@@ -17885,7 +17885,7 @@
         <w:pStyle w:val="Ttulo1"/>
       </w:pPr>
       <w:bookmarkStart w:id="64" w:name="_8ada1076fc69f75adb455b52b48149b634e12c1"/>
-      <w:bookmarkStart w:id="65" w:name="_Toc243902012"/>
+      <w:bookmarkStart w:id="65" w:name="_Toc243924404"/>
       <w:bookmarkEnd w:id="52"/>
       <w:bookmarkEnd w:id="62"/>
       <w:r>
@@ -17907,7 +17907,7 @@
         <w:pStyle w:val="Ttulo2"/>
       </w:pPr>
       <w:bookmarkStart w:id="66" w:name="_d0fbc850c25121b5bb6429938908d9d6324f20c"/>
-      <w:bookmarkStart w:id="67" w:name="_Toc243902013"/>
+      <w:bookmarkStart w:id="67" w:name="_Toc243924405"/>
       <w:r>
         <w:t>HU-2.1 — Registrar consulta clínica</w:t>
       </w:r>
@@ -18191,7 +18191,7 @@
         <w:pStyle w:val="Ttulo2"/>
       </w:pPr>
       <w:bookmarkStart w:id="68" w:name="_7a453a6eb6ed88e1bfb6e10d4e89e02e93370e4"/>
-      <w:bookmarkStart w:id="69" w:name="_Toc243902014"/>
+      <w:bookmarkStart w:id="69" w:name="_Toc243924406"/>
       <w:bookmarkEnd w:id="66"/>
       <w:r>
         <w:t>HU-2.2 — Atención clínica sin cita (urgencias)</w:t>
@@ -18490,7 +18490,7 @@
         <w:pStyle w:val="Ttulo2"/>
       </w:pPr>
       <w:bookmarkStart w:id="70" w:name="_277d15ee6375124a0d7497cd947f0496d653294"/>
-      <w:bookmarkStart w:id="71" w:name="_Toc243902015"/>
+      <w:bookmarkStart w:id="71" w:name="_Toc243924407"/>
       <w:bookmarkEnd w:id="68"/>
       <w:r>
         <w:t>HU-2.3 — Adjuntar archivos clínicos</w:t>
@@ -18826,7 +18826,7 @@
         <w:pStyle w:val="Ttulo2"/>
       </w:pPr>
       <w:bookmarkStart w:id="72" w:name="_1b98c978e60977db39fc2418db7fe5e3ddc3001"/>
-      <w:bookmarkStart w:id="73" w:name="_Toc243902016"/>
+      <w:bookmarkStart w:id="73" w:name="_Toc243924408"/>
       <w:bookmarkEnd w:id="70"/>
       <w:r>
         <w:t>HU-2.4 — Registrar tratamiento</w:t>
@@ -19073,7 +19073,7 @@
         <w:pStyle w:val="Ttulo2"/>
       </w:pPr>
       <w:bookmarkStart w:id="74" w:name="_9717672e9e73feeffef28eb38b12c038cdd7bd2"/>
-      <w:bookmarkStart w:id="75" w:name="_Toc243902017"/>
+      <w:bookmarkStart w:id="75" w:name="_Toc243924409"/>
       <w:bookmarkEnd w:id="72"/>
       <w:r>
         <w:t>HU-2.5 — Ver historial clínico completo</w:t>
@@ -19336,7 +19336,7 @@
         <w:pStyle w:val="Ttulo2"/>
       </w:pPr>
       <w:bookmarkStart w:id="76" w:name="_fdc1478d352073634e6bd92f17796cead004715"/>
-      <w:bookmarkStart w:id="77" w:name="_Toc243902018"/>
+      <w:bookmarkStart w:id="77" w:name="_Toc243924410"/>
       <w:bookmarkEnd w:id="74"/>
       <w:r>
         <w:t>HU-2.6 — Atomicidad y feedback de adjuntos en el registro de consulta</w:t>
@@ -19618,7 +19618,7 @@
         <w:pStyle w:val="Ttulo2"/>
       </w:pPr>
       <w:bookmarkStart w:id="78" w:name="_101f0dcf34d14c70ec0f17a5f1393f5d9e5e380"/>
-      <w:bookmarkStart w:id="79" w:name="_Toc243902019"/>
+      <w:bookmarkStart w:id="79" w:name="_Toc243924411"/>
       <w:bookmarkEnd w:id="76"/>
       <w:r>
         <w:t>HU-2.7 — Validación y control de acceso en registros clínicos y de mascota</w:t>
@@ -19898,7 +19898,7 @@
         <w:pStyle w:val="Ttulo2"/>
       </w:pPr>
       <w:bookmarkStart w:id="80" w:name="_004e46896b85bf56df5905f1e03a53c4af0a844"/>
-      <w:bookmarkStart w:id="81" w:name="_Toc243902020"/>
+      <w:bookmarkStart w:id="81" w:name="_Toc243924412"/>
       <w:bookmarkEnd w:id="78"/>
       <w:r>
         <w:t>HU-2.8 — Sugerencia de diagnósticos probables por síntomas</w:t>
@@ -20159,7 +20159,7 @@
         <w:pStyle w:val="Ttulo2"/>
       </w:pPr>
       <w:bookmarkStart w:id="82" w:name="_dc4885bd67732a434e9ba082721bf6df1e25b78"/>
-      <w:bookmarkStart w:id="83" w:name="_Toc243902021"/>
+      <w:bookmarkStart w:id="83" w:name="_Toc243924413"/>
       <w:bookmarkEnd w:id="80"/>
       <w:r>
         <w:t>HU-2.9 — Alertas de toxicidad e interacción al prescribir</w:t>
@@ -20439,7 +20439,7 @@
         <w:pStyle w:val="Ttulo2"/>
       </w:pPr>
       <w:bookmarkStart w:id="84" w:name="_39e4f7d80042c39922c0142f6da447f46643fcd"/>
-      <w:bookmarkStart w:id="85" w:name="_Toc243902022"/>
+      <w:bookmarkStart w:id="85" w:name="_Toc243924414"/>
       <w:bookmarkEnd w:id="82"/>
       <w:r>
         <w:t>HU-2.10 — Ver la historia compartida de la mascota (multi-clínica)</w:t>
@@ -20702,7 +20702,7 @@
         <w:pStyle w:val="Ttulo2"/>
       </w:pPr>
       <w:bookmarkStart w:id="86" w:name="_ddbeb8d4984f7e7207ef7f02c5c92f4dcdce30d"/>
-      <w:bookmarkStart w:id="87" w:name="_Toc243902023"/>
+      <w:bookmarkStart w:id="87" w:name="_Toc243924415"/>
       <w:bookmarkEnd w:id="84"/>
       <w:r>
         <w:t>HU-2.11 — Calcular el nivel de triage a partir de los síntomas</w:t>
@@ -21065,7 +21065,7 @@
         <w:pStyle w:val="Ttulo2"/>
       </w:pPr>
       <w:bookmarkStart w:id="88" w:name="_492240b15c6ebc6fbe3f7fd23583d697b838ee5"/>
-      <w:bookmarkStart w:id="89" w:name="_Toc243902024"/>
+      <w:bookmarkStart w:id="89" w:name="_Toc243924416"/>
       <w:bookmarkEnd w:id="86"/>
       <w:r>
         <w:t>HU-2.12 — Explorar el mapa del conocimiento clínico</w:t>
@@ -21337,7 +21337,7 @@
         <w:pStyle w:val="Ttulo1"/>
       </w:pPr>
       <w:bookmarkStart w:id="90" w:name="_d55aebc9deeb1682a62a02ae225cde94fe0baf3"/>
-      <w:bookmarkStart w:id="91" w:name="_Toc243902025"/>
+      <w:bookmarkStart w:id="91" w:name="_Toc243924417"/>
       <w:bookmarkEnd w:id="64"/>
       <w:bookmarkEnd w:id="88"/>
       <w:r>
@@ -21359,7 +21359,7 @@
         <w:pStyle w:val="Ttulo2"/>
       </w:pPr>
       <w:bookmarkStart w:id="92" w:name="_73783a222ff535845613407f8c2c5de0df62c29"/>
-      <w:bookmarkStart w:id="93" w:name="_Toc243902026"/>
+      <w:bookmarkStart w:id="93" w:name="_Toc243924418"/>
       <w:r>
         <w:t>HU-3.1 — Registrar vacunación</w:t>
       </w:r>
@@ -21602,7 +21602,7 @@
         <w:pStyle w:val="Ttulo2"/>
       </w:pPr>
       <w:bookmarkStart w:id="94" w:name="_6075047063f4930391208048315650ed427ae6c"/>
-      <w:bookmarkStart w:id="95" w:name="_Toc243902027"/>
+      <w:bookmarkStart w:id="95" w:name="_Toc243924419"/>
       <w:bookmarkEnd w:id="92"/>
       <w:r>
         <w:t>HU-3.2 — Enviar recordatorio por correo</w:t>
@@ -21858,7 +21858,7 @@
         <w:pStyle w:val="Ttulo2"/>
       </w:pPr>
       <w:bookmarkStart w:id="96" w:name="_781661fe2d15deb5f4d895541dced4f16e579af"/>
-      <w:bookmarkStart w:id="97" w:name="_Toc243902028"/>
+      <w:bookmarkStart w:id="97" w:name="_Toc243924420"/>
       <w:bookmarkEnd w:id="94"/>
       <w:r>
         <w:t>HU-3.3 — Enviar recordatorio por WhatsApp</w:t>
@@ -22115,7 +22115,7 @@
         <w:pStyle w:val="Ttulo2"/>
       </w:pPr>
       <w:bookmarkStart w:id="98" w:name="_8afd4fd6adaa7aec672b37965973c4a0b1b5483"/>
-      <w:bookmarkStart w:id="99" w:name="_Toc243902029"/>
+      <w:bookmarkStart w:id="99" w:name="_Toc243924421"/>
       <w:bookmarkEnd w:id="96"/>
       <w:r>
         <w:t>HU-3.4 — Registrar desparasitación</w:t>
@@ -22359,7 +22359,7 @@
         <w:pStyle w:val="Ttulo2"/>
       </w:pPr>
       <w:bookmarkStart w:id="100" w:name="_69b92288d624f1c737d99fa43d727735c1c78ac"/>
-      <w:bookmarkStart w:id="101" w:name="_Toc243902030"/>
+      <w:bookmarkStart w:id="101" w:name="_Toc243924422"/>
       <w:bookmarkEnd w:id="98"/>
       <w:r>
         <w:t>HU-3.5 — Panel de vacunaciones pendientes</w:t>
@@ -22637,7 +22637,7 @@
         <w:pStyle w:val="Ttulo2"/>
       </w:pPr>
       <w:bookmarkStart w:id="102" w:name="_83b2b6ee9ef84433e407efb3456acc0bf8c705f"/>
-      <w:bookmarkStart w:id="103" w:name="_Toc243902031"/>
+      <w:bookmarkStart w:id="103" w:name="_Toc243924423"/>
       <w:bookmarkEnd w:id="100"/>
       <w:r>
         <w:lastRenderedPageBreak/>
@@ -22982,7 +22982,7 @@
         <w:pStyle w:val="Ttulo1"/>
       </w:pPr>
       <w:bookmarkStart w:id="104" w:name="_0bc479c0be240e26431ebdd296a7a53444b2628"/>
-      <w:bookmarkStart w:id="105" w:name="_Toc243902032"/>
+      <w:bookmarkStart w:id="105" w:name="_Toc243924424"/>
       <w:bookmarkEnd w:id="90"/>
       <w:bookmarkEnd w:id="102"/>
       <w:r>
@@ -23004,7 +23004,7 @@
         <w:pStyle w:val="Ttulo2"/>
       </w:pPr>
       <w:bookmarkStart w:id="106" w:name="_83a9ef67ed8a24f8f8fb200a3c30fdc3bf36c17"/>
-      <w:bookmarkStart w:id="107" w:name="_Toc243902033"/>
+      <w:bookmarkStart w:id="107" w:name="_Toc243924425"/>
       <w:r>
         <w:t>HU-4.1 — Agendar cita</w:t>
       </w:r>
@@ -23295,7 +23295,7 @@
         <w:pStyle w:val="Ttulo2"/>
       </w:pPr>
       <w:bookmarkStart w:id="108" w:name="_102fb6dec5375a39a698cb955a51646f9817d25"/>
-      <w:bookmarkStart w:id="109" w:name="_Toc243902034"/>
+      <w:bookmarkStart w:id="109" w:name="_Toc243924426"/>
       <w:bookmarkEnd w:id="106"/>
       <w:r>
         <w:t>HU-4.2 — Cancelar o reprogramar cita</w:t>
@@ -23552,7 +23552,7 @@
         <w:pStyle w:val="Ttulo2"/>
       </w:pPr>
       <w:bookmarkStart w:id="110" w:name="_bc90a9ef9035fcbf5d83826a75a2a7caba95288"/>
-      <w:bookmarkStart w:id="111" w:name="_Toc243902035"/>
+      <w:bookmarkStart w:id="111" w:name="_Toc243924427"/>
       <w:bookmarkEnd w:id="108"/>
       <w:r>
         <w:t>HU-4.3 — Marcar cita como completada</w:t>
@@ -23933,7 +23933,7 @@
         <w:pStyle w:val="Ttulo2"/>
       </w:pPr>
       <w:bookmarkStart w:id="112" w:name="_0ab1d1688e3b6d42f481962b5abe908ca5f185e"/>
-      <w:bookmarkStart w:id="113" w:name="_Toc243902036"/>
+      <w:bookmarkStart w:id="113" w:name="_Toc243924428"/>
       <w:bookmarkEnd w:id="110"/>
       <w:r>
         <w:t>HU-4.4 — Confirmación automática de cita por correo</w:t>
@@ -24177,7 +24177,7 @@
         <w:pStyle w:val="Ttulo2"/>
       </w:pPr>
       <w:bookmarkStart w:id="114" w:name="_391b83d5c01b20c64bec4d1baa2ded83b27b3cc"/>
-      <w:bookmarkStart w:id="115" w:name="_Toc243902037"/>
+      <w:bookmarkStart w:id="115" w:name="_Toc243924429"/>
       <w:bookmarkEnd w:id="112"/>
       <w:r>
         <w:t>HU-4.5 — Registrar hora real de atención y gestionar retrasos</w:t>
@@ -24484,7 +24484,7 @@
         <w:pStyle w:val="Ttulo2"/>
       </w:pPr>
       <w:bookmarkStart w:id="116" w:name="_fd2845ac88e46c3520f61b9b4ded26b35f37534"/>
-      <w:bookmarkStart w:id="117" w:name="_Toc243902038"/>
+      <w:bookmarkStart w:id="117" w:name="_Toc243924430"/>
       <w:bookmarkEnd w:id="114"/>
       <w:r>
         <w:lastRenderedPageBreak/>
@@ -24759,7 +24759,7 @@
         <w:pStyle w:val="Ttulo2"/>
       </w:pPr>
       <w:bookmarkStart w:id="118" w:name="_4786f5b438d23c36e067f350ad8ed0097d027c2"/>
-      <w:bookmarkStart w:id="119" w:name="_Toc243902039"/>
+      <w:bookmarkStart w:id="119" w:name="_Toc243924431"/>
       <w:bookmarkEnd w:id="116"/>
       <w:r>
         <w:t>HU-4.7 — Estado "no asistió" y ausentismo</w:t>
@@ -25120,7 +25120,7 @@
         <w:pStyle w:val="Ttulo2"/>
       </w:pPr>
       <w:bookmarkStart w:id="120" w:name="_0d930997ffa83b9b36b150e5e50b933f66b264d"/>
-      <w:bookmarkStart w:id="121" w:name="_Toc243902040"/>
+      <w:bookmarkStart w:id="121" w:name="_Toc243924432"/>
       <w:bookmarkEnd w:id="118"/>
       <w:r>
         <w:t>HU-4.8 — Bloqueos de agenda del veterinario y días no laborables</w:t>
@@ -25394,7 +25394,7 @@
         <w:pStyle w:val="Ttulo2"/>
       </w:pPr>
       <w:bookmarkStart w:id="122" w:name="_592e3b26ee2d82de9a78960621790aca76cbe41"/>
-      <w:bookmarkStart w:id="123" w:name="_Toc243902041"/>
+      <w:bookmarkStart w:id="123" w:name="_Toc243924433"/>
       <w:bookmarkEnd w:id="120"/>
       <w:r>
         <w:t>HU-4.9 — Endurecer la validación de disponibilidad</w:t>
@@ -25717,7 +25717,7 @@
         <w:pStyle w:val="Ttulo2"/>
       </w:pPr>
       <w:bookmarkStart w:id="124" w:name="_53bf433c324c03bf220d8f1ea57572094c24d19"/>
-      <w:bookmarkStart w:id="125" w:name="_Toc243902042"/>
+      <w:bookmarkStart w:id="125" w:name="_Toc243924434"/>
       <w:bookmarkEnd w:id="122"/>
       <w:r>
         <w:t>HU-4.10 — Confirmar asistencia a la cita desde el recordatorio</w:t>
@@ -25999,7 +25999,7 @@
         <w:pStyle w:val="Ttulo2"/>
       </w:pPr>
       <w:bookmarkStart w:id="126" w:name="_bc4a4c08f4864e57db7a13372e3c901c5711bb9"/>
-      <w:bookmarkStart w:id="127" w:name="_Toc243902043"/>
+      <w:bookmarkStart w:id="127" w:name="_Toc243924435"/>
       <w:bookmarkEnd w:id="124"/>
       <w:r>
         <w:t>HU-4.11 — Configurar el horario recurrente del veterinario</w:t>
@@ -26260,7 +26260,7 @@
         <w:pStyle w:val="Ttulo2"/>
       </w:pPr>
       <w:bookmarkStart w:id="128" w:name="_3a9da54e9b682c781ba4f8ec9fb08eb1ae51469"/>
-      <w:bookmarkStart w:id="129" w:name="_Toc243902044"/>
+      <w:bookmarkStart w:id="129" w:name="_Toc243924436"/>
       <w:bookmarkEnd w:id="126"/>
       <w:r>
         <w:t>HU-4.12 — Registrar ausencia del veterinario y gestionar cobertura</w:t>
@@ -26582,7 +26582,7 @@
         <w:pStyle w:val="Ttulo2"/>
       </w:pPr>
       <w:bookmarkStart w:id="130" w:name="_d5e60343e26d4758074a6efaed07b69cd6c3551"/>
-      <w:bookmarkStart w:id="131" w:name="_Toc243902045"/>
+      <w:bookmarkStart w:id="131" w:name="_Toc243924437"/>
       <w:bookmarkEnd w:id="128"/>
       <w:r>
         <w:lastRenderedPageBreak/>
@@ -27023,7 +27023,7 @@
         <w:pStyle w:val="Ttulo2"/>
       </w:pPr>
       <w:bookmarkStart w:id="132" w:name="_d4adac7448e74c17e6bb33bf496ee79d1222807"/>
-      <w:bookmarkStart w:id="133" w:name="_Toc243902046"/>
+      <w:bookmarkStart w:id="133" w:name="_Toc243924438"/>
       <w:bookmarkEnd w:id="130"/>
       <w:r>
         <w:t>HU-4.14 — Reajuste de agenda en vivo (efecto cascada)</w:t>
@@ -27365,7 +27365,7 @@
         <w:pStyle w:val="Ttulo2"/>
       </w:pPr>
       <w:bookmarkStart w:id="134" w:name="_91e1c705d28c1a221b008d52046353792175d0f"/>
-      <w:bookmarkStart w:id="135" w:name="_Toc243902047"/>
+      <w:bookmarkStart w:id="135" w:name="_Toc243924439"/>
       <w:bookmarkEnd w:id="132"/>
       <w:r>
         <w:t>HU-4.15 — Atender una urgencia (triage rojo o llegada directa)</w:t>
@@ -27818,7 +27818,7 @@
         <w:pStyle w:val="Ttulo2"/>
       </w:pPr>
       <w:bookmarkStart w:id="136" w:name="_c78d8424c335bf78fd48b1955b4f1a67eda143f"/>
-      <w:bookmarkStart w:id="137" w:name="_Toc243902048"/>
+      <w:bookmarkStart w:id="137" w:name="_Toc243924440"/>
       <w:bookmarkEnd w:id="134"/>
       <w:r>
         <w:t>HU-4.16 — Sugerir veterinario al agendar</w:t>
@@ -28042,7 +28042,7 @@
         <w:pStyle w:val="Ttulo2"/>
       </w:pPr>
       <w:bookmarkStart w:id="138" w:name="_d95563cf58dd7b4419944c1578610bfcd0b1db0"/>
-      <w:bookmarkStart w:id="139" w:name="_Toc243902049"/>
+      <w:bookmarkStart w:id="139" w:name="_Toc243924441"/>
       <w:bookmarkEnd w:id="136"/>
       <w:r>
         <w:t>HU-4.17 — Recalcular el triage cuando cambian los síntomas</w:t>
@@ -28299,7 +28299,7 @@
         <w:pStyle w:val="Ttulo2"/>
       </w:pPr>
       <w:bookmarkStart w:id="140" w:name="_8b0a1409d398bf3e63485141aa804db028749ca"/>
-      <w:bookmarkStart w:id="141" w:name="_Toc243902050"/>
+      <w:bookmarkStart w:id="141" w:name="_Toc243924442"/>
       <w:bookmarkEnd w:id="138"/>
       <w:r>
         <w:t>HU-4.18 — Ajustar el nivel de triage (veterinario)</w:t>
@@ -28560,7 +28560,7 @@
         <w:pStyle w:val="Ttulo2"/>
       </w:pPr>
       <w:bookmarkStart w:id="142" w:name="_cf2722ce0434310059a1401a7a9236f9f75ab69"/>
-      <w:bookmarkStart w:id="143" w:name="_Toc243902051"/>
+      <w:bookmarkStart w:id="143" w:name="_Toc243924443"/>
       <w:bookmarkEnd w:id="140"/>
       <w:r>
         <w:t>HU-4.19 — Manejar la llegada tarde del propietario</w:t>
@@ -28835,7 +28835,7 @@
         <w:pStyle w:val="Ttulo1"/>
       </w:pPr>
       <w:bookmarkStart w:id="144" w:name="_448b6637f95054bfc4854cb12826ea84d2acba0"/>
-      <w:bookmarkStart w:id="145" w:name="_Toc243902052"/>
+      <w:bookmarkStart w:id="145" w:name="_Toc243924444"/>
       <w:bookmarkEnd w:id="104"/>
       <w:bookmarkEnd w:id="142"/>
       <w:r>
@@ -28857,7 +28857,7 @@
         <w:pStyle w:val="Ttulo2"/>
       </w:pPr>
       <w:bookmarkStart w:id="146" w:name="_af054ffcebd6910222ee7d6c1d020875947335e"/>
-      <w:bookmarkStart w:id="147" w:name="_Toc243902053"/>
+      <w:bookmarkStart w:id="147" w:name="_Toc243924445"/>
       <w:r>
         <w:t>HU-5.1 — Portal del propietario</w:t>
       </w:r>
@@ -29200,7 +29200,7 @@
         <w:pStyle w:val="Ttulo2"/>
       </w:pPr>
       <w:bookmarkStart w:id="148" w:name="_6b1c61431b8f8f0fcc4ce60077071b912ba2b45"/>
-      <w:bookmarkStart w:id="149" w:name="_Toc243902054"/>
+      <w:bookmarkStart w:id="149" w:name="_Toc243924446"/>
       <w:bookmarkEnd w:id="146"/>
       <w:r>
         <w:t>HU-5.2 — Auto-registro de propietario</w:t>
@@ -29469,7 +29469,7 @@
         <w:pStyle w:val="Ttulo2"/>
       </w:pPr>
       <w:bookmarkStart w:id="150" w:name="_f4d063018be410b507969fa4c62074124f833cf"/>
-      <w:bookmarkStart w:id="151" w:name="_Toc243902055"/>
+      <w:bookmarkStart w:id="151" w:name="_Toc243924447"/>
       <w:bookmarkEnd w:id="148"/>
       <w:r>
         <w:t>HU-5.3 — Agendar cita desde el portal</w:t>
@@ -29744,7 +29744,7 @@
         <w:pStyle w:val="Ttulo2"/>
       </w:pPr>
       <w:bookmarkStart w:id="152" w:name="_c64202596780354c08c0a149dc974449db886cf"/>
-      <w:bookmarkStart w:id="153" w:name="_Toc243902056"/>
+      <w:bookmarkStart w:id="153" w:name="_Toc243924448"/>
       <w:bookmarkEnd w:id="150"/>
       <w:r>
         <w:t>HU-5.4 — Editar mi mascota desde el portal</w:t>
@@ -29982,7 +29982,7 @@
         <w:pStyle w:val="Ttulo2"/>
       </w:pPr>
       <w:bookmarkStart w:id="154" w:name="_cf91e7705c2cc7ff174f786bca87f4ab32c164a"/>
-      <w:bookmarkStart w:id="155" w:name="_Toc243902057"/>
+      <w:bookmarkStart w:id="155" w:name="_Toc243924449"/>
       <w:bookmarkEnd w:id="152"/>
       <w:r>
         <w:lastRenderedPageBreak/>
@@ -30228,7 +30228,7 @@
         <w:pStyle w:val="Ttulo2"/>
       </w:pPr>
       <w:bookmarkStart w:id="156" w:name="_f8ebe18ba7612da84cbeb32e6cdfcf569929127"/>
-      <w:bookmarkStart w:id="157" w:name="_Toc243902058"/>
+      <w:bookmarkStart w:id="157" w:name="_Toc243924450"/>
       <w:bookmarkEnd w:id="154"/>
       <w:r>
         <w:t>HU-5.6 — Cancelar o reprogramar mi cita desde el portal</w:t>
@@ -30529,7 +30529,7 @@
         <w:pStyle w:val="Ttulo2"/>
       </w:pPr>
       <w:bookmarkStart w:id="158" w:name="_63b2ff8270a3dc0cb21378739f70e0c16a27def"/>
-      <w:bookmarkStart w:id="159" w:name="_Toc243902059"/>
+      <w:bookmarkStart w:id="159" w:name="_Toc243924451"/>
       <w:bookmarkEnd w:id="156"/>
       <w:r>
         <w:lastRenderedPageBreak/>
@@ -30790,7 +30790,7 @@
         <w:pStyle w:val="Ttulo2"/>
       </w:pPr>
       <w:bookmarkStart w:id="160" w:name="_f59be5ab49da54ec24749683e30fb79075b9c3a"/>
-      <w:bookmarkStart w:id="161" w:name="_Toc243902060"/>
+      <w:bookmarkStart w:id="161" w:name="_Toc243924452"/>
       <w:bookmarkEnd w:id="158"/>
       <w:r>
         <w:t>HU-5.8 — Registrar al propietario como identidad global</w:t>
@@ -31178,7 +31178,7 @@
         <w:pStyle w:val="Ttulo2"/>
       </w:pPr>
       <w:bookmarkStart w:id="162" w:name="_06eaf3b49483b1eeebe1b8e79573cd5c749be44"/>
-      <w:bookmarkStart w:id="163" w:name="_Toc243902061"/>
+      <w:bookmarkStart w:id="163" w:name="_Toc243924453"/>
       <w:bookmarkEnd w:id="160"/>
       <w:r>
         <w:t>HU-5.9 — Iniciar sesión en el portal multi-clínica</w:t>
@@ -31457,7 +31457,7 @@
         <w:pStyle w:val="Ttulo2"/>
       </w:pPr>
       <w:bookmarkStart w:id="164" w:name="_73bf9bf1ab817b39687e744da8c8402ea9619af"/>
-      <w:bookmarkStart w:id="165" w:name="_Toc243902062"/>
+      <w:bookmarkStart w:id="165" w:name="_Toc243924454"/>
       <w:bookmarkEnd w:id="162"/>
       <w:r>
         <w:t>HU-5.10 — Carnet digital de la mascota con QR de emergencia</w:t>
@@ -31721,7 +31721,7 @@
         <w:pStyle w:val="Ttulo2"/>
       </w:pPr>
       <w:bookmarkStart w:id="166" w:name="_809064a587886d0547b1788a26db9d9152af23a"/>
-      <w:bookmarkStart w:id="167" w:name="_Toc243902063"/>
+      <w:bookmarkStart w:id="167" w:name="_Toc243924455"/>
       <w:bookmarkEnd w:id="164"/>
       <w:r>
         <w:t>HU-5.11 — Acceder al carnet por QR en modo solo lectura</w:t>
@@ -31993,7 +31993,7 @@
         <w:pStyle w:val="Ttulo2"/>
       </w:pPr>
       <w:bookmarkStart w:id="168" w:name="_eaa2b9dcd4e772acfdb8cc2e14fe1584fe792e7"/>
-      <w:bookmarkStart w:id="169" w:name="_Toc243902064"/>
+      <w:bookmarkStart w:id="169" w:name="_Toc243924456"/>
       <w:bookmarkEnd w:id="166"/>
       <w:r>
         <w:t>HU-5.12 — Autorizar a una clínica a ver la historia de otras clínicas</w:t>
@@ -32257,7 +32257,7 @@
         <w:pStyle w:val="Ttulo2"/>
       </w:pPr>
       <w:bookmarkStart w:id="170" w:name="_9c4353686bd45e1d5b28007e4eeecf1db3be371"/>
-      <w:bookmarkStart w:id="171" w:name="_Toc243902065"/>
+      <w:bookmarkStart w:id="171" w:name="_Toc243924457"/>
       <w:bookmarkEnd w:id="168"/>
       <w:r>
         <w:t>HU-5.13 — Vincularme o desvincularme de una clínica</w:t>
@@ -32517,7 +32517,7 @@
         <w:pStyle w:val="Ttulo2"/>
       </w:pPr>
       <w:bookmarkStart w:id="172" w:name="_faf9cae68ace52a6134b8c807ad8be34010091b"/>
-      <w:bookmarkStart w:id="173" w:name="_Toc243902066"/>
+      <w:bookmarkStart w:id="173" w:name="_Toc243924458"/>
       <w:bookmarkEnd w:id="170"/>
       <w:r>
         <w:t>HU-5.14 — Eliminar mi cuenta (derecho de supresión)</w:t>
@@ -32778,7 +32778,7 @@
         <w:pStyle w:val="Ttulo1"/>
       </w:pPr>
       <w:bookmarkStart w:id="174" w:name="_415d3e183ea3663701acfe1e73f6e8038e4bbef"/>
-      <w:bookmarkStart w:id="175" w:name="_Toc243902067"/>
+      <w:bookmarkStart w:id="175" w:name="_Toc243924459"/>
       <w:bookmarkEnd w:id="144"/>
       <w:bookmarkEnd w:id="172"/>
       <w:r>
@@ -32800,7 +32800,7 @@
         <w:pStyle w:val="Ttulo2"/>
       </w:pPr>
       <w:bookmarkStart w:id="176" w:name="_1b876ecfd0adf71d503b9129568b658f81872f0"/>
-      <w:bookmarkStart w:id="177" w:name="_Toc243902068"/>
+      <w:bookmarkStart w:id="177" w:name="_Toc243924460"/>
       <w:r>
         <w:t>HU-6.1 — Dashboard principal y panel de pendientes</w:t>
       </w:r>
@@ -33196,7 +33196,7 @@
         <w:pStyle w:val="Ttulo2"/>
       </w:pPr>
       <w:bookmarkStart w:id="178" w:name="_97322cabf772225fd1bfe897dee158000aa0394"/>
-      <w:bookmarkStart w:id="179" w:name="_Toc243902069"/>
+      <w:bookmarkStart w:id="179" w:name="_Toc243924461"/>
       <w:bookmarkEnd w:id="176"/>
       <w:r>
         <w:t>HU-6.2 — Panel de operación del administrador</w:t>
@@ -33577,7 +33577,7 @@
         <w:pStyle w:val="Ttulo2"/>
       </w:pPr>
       <w:bookmarkStart w:id="180" w:name="_6ce76d48cd12ce7662f89ac490d75c386fc18ba"/>
-      <w:bookmarkStart w:id="181" w:name="_Toc243902070"/>
+      <w:bookmarkStart w:id="181" w:name="_Toc243924462"/>
       <w:bookmarkEnd w:id="178"/>
       <w:r>
         <w:t>HU-6.3 — Generar reportes en PDF</w:t>
@@ -33863,7 +33863,7 @@
         <w:pStyle w:val="Ttulo2"/>
       </w:pPr>
       <w:bookmarkStart w:id="182" w:name="_132f0b1bfae1ac6054dc51db54a45dff43ec797"/>
-      <w:bookmarkStart w:id="183" w:name="_Toc243902071"/>
+      <w:bookmarkStart w:id="183" w:name="_Toc243924463"/>
       <w:bookmarkEnd w:id="180"/>
       <w:r>
         <w:t>HU-6.4 — Ver estadísticas y gráficas del sistema</w:t>
@@ -34120,7 +34120,7 @@
         <w:pStyle w:val="Ttulo2"/>
       </w:pPr>
       <w:bookmarkStart w:id="184" w:name="_159c41a8740d691e56d865baa1d2a17f58680f5"/>
-      <w:bookmarkStart w:id="185" w:name="_Toc243902072"/>
+      <w:bookmarkStart w:id="185" w:name="_Toc243924464"/>
       <w:bookmarkEnd w:id="182"/>
       <w:r>
         <w:t>HU-6.5 — Exportar reportes a Excel/CSV</w:t>
@@ -34359,7 +34359,7 @@
         <w:pStyle w:val="Ttulo1"/>
       </w:pPr>
       <w:bookmarkStart w:id="186" w:name="_88abf5b53e5603b94c73c4f577271d31a73cc35"/>
-      <w:bookmarkStart w:id="187" w:name="_Toc243902073"/>
+      <w:bookmarkStart w:id="187" w:name="_Toc243924465"/>
       <w:bookmarkEnd w:id="174"/>
       <w:bookmarkEnd w:id="184"/>
       <w:r>
@@ -34381,7 +34381,7 @@
         <w:pStyle w:val="Ttulo2"/>
       </w:pPr>
       <w:bookmarkStart w:id="188" w:name="_003ad6784c61069e91989793d8255e8d4cb519d"/>
-      <w:bookmarkStart w:id="189" w:name="_Toc243902074"/>
+      <w:bookmarkStart w:id="189" w:name="_Toc243924466"/>
       <w:r>
         <w:t>HU-7.1 — Configurar los horarios de atención de la clínica</w:t>
       </w:r>
@@ -34660,7 +34660,7 @@
         <w:pStyle w:val="Ttulo2"/>
       </w:pPr>
       <w:bookmarkStart w:id="190" w:name="_42539d8b8201701c75c37499984fbffa69d6e4d"/>
-      <w:bookmarkStart w:id="191" w:name="_Toc243902075"/>
+      <w:bookmarkStart w:id="191" w:name="_Toc243924467"/>
       <w:bookmarkEnd w:id="188"/>
       <w:r>
         <w:t>HU-7.2 — Gestionar los catálogos del sistema</w:t>
@@ -34941,7 +34941,7 @@
         <w:pStyle w:val="Ttulo2"/>
       </w:pPr>
       <w:bookmarkStart w:id="192" w:name="_a0aee2f406b049ed83cfe391a77b0db14b5bfdf"/>
-      <w:bookmarkStart w:id="193" w:name="_Toc243902076"/>
+      <w:bookmarkStart w:id="193" w:name="_Toc243924468"/>
       <w:bookmarkEnd w:id="190"/>
       <w:r>
         <w:t>HU-7.3 — Gestionar los veterinarios y sus especialidades</w:t>
@@ -35210,7 +35210,7 @@
         <w:pStyle w:val="Ttulo2"/>
       </w:pPr>
       <w:bookmarkStart w:id="194" w:name="_a0688e3f345f7bf587dcedb8b562b8964a6cacc"/>
-      <w:bookmarkStart w:id="195" w:name="_Toc243902077"/>
+      <w:bookmarkStart w:id="195" w:name="_Toc243924469"/>
       <w:bookmarkEnd w:id="192"/>
       <w:r>
         <w:t>HU-7.4 — Personalizar la clínica: marca y tipos de cita</w:t>
@@ -35502,7 +35502,7 @@
         <w:pStyle w:val="Ttulo2"/>
       </w:pPr>
       <w:bookmarkStart w:id="196" w:name="_7004fcdc7c25449422304e35d609c3113b471f6"/>
-      <w:bookmarkStart w:id="197" w:name="_Toc243902078"/>
+      <w:bookmarkStart w:id="197" w:name="_Toc243924470"/>
       <w:bookmarkEnd w:id="194"/>
       <w:r>
         <w:t>HU-7.5 — Parámetros del sistema configurables</w:t>
@@ -35772,7 +35772,7 @@
         <w:pStyle w:val="Ttulo1"/>
       </w:pPr>
       <w:bookmarkStart w:id="198" w:name="_99f8c38fc90f872e869cb5a42176a81ce60716e"/>
-      <w:bookmarkStart w:id="199" w:name="_Toc243902079"/>
+      <w:bookmarkStart w:id="199" w:name="_Toc243924471"/>
       <w:bookmarkEnd w:id="186"/>
       <w:bookmarkEnd w:id="196"/>
       <w:r>
@@ -35801,7 +35801,7 @@
         <w:pStyle w:val="Ttulo2"/>
       </w:pPr>
       <w:bookmarkStart w:id="200" w:name="_6b93d7ad964c8104bb83fc9231a04e4fc4e5a57"/>
-      <w:bookmarkStart w:id="201" w:name="_Toc243902080"/>
+      <w:bookmarkStart w:id="201" w:name="_Toc243924472"/>
       <w:r>
         <w:t>HU-8.1 — Calificar al veterinario tras una consulta atendida</w:t>
       </w:r>
@@ -36106,7 +36106,7 @@
         <w:pStyle w:val="Ttulo2"/>
       </w:pPr>
       <w:bookmarkStart w:id="202" w:name="_6de705a3e3f0ae827b0b0206b40472100ec5dc2"/>
-      <w:bookmarkStart w:id="203" w:name="_Toc243902081"/>
+      <w:bookmarkStart w:id="203" w:name="_Toc243924473"/>
       <w:bookmarkEnd w:id="200"/>
       <w:r>
         <w:t>HU-8.2 — Perfil público del veterinario</w:t>
@@ -36352,7 +36352,7 @@
         <w:pStyle w:val="Ttulo2"/>
       </w:pPr>
       <w:bookmarkStart w:id="204" w:name="_8d0438a4c21826cdef43f79f40a5abd8a052054"/>
-      <w:bookmarkStart w:id="205" w:name="_Toc243902082"/>
+      <w:bookmarkStart w:id="205" w:name="_Toc243924474"/>
       <w:bookmarkEnd w:id="202"/>
       <w:r>
         <w:lastRenderedPageBreak/>
@@ -36598,7 +36598,7 @@
         <w:pStyle w:val="Ttulo2"/>
       </w:pPr>
       <w:bookmarkStart w:id="206" w:name="_9d375ff686aceee42a269dcad0f742f5e2f3757"/>
-      <w:bookmarkStart w:id="207" w:name="_Toc243902083"/>
+      <w:bookmarkStart w:id="207" w:name="_Toc243924475"/>
       <w:bookmarkEnd w:id="204"/>
       <w:r>
         <w:t>HU-8.4 — Tiempos de envío de recordatorios configurables</w:t>
@@ -36822,7 +36822,7 @@
         <w:pStyle w:val="Ttulo2"/>
       </w:pPr>
       <w:bookmarkStart w:id="208" w:name="_09d49d8f9ce2d4331632fad53df16df04e0463f"/>
-      <w:bookmarkStart w:id="209" w:name="_Toc243902084"/>
+      <w:bookmarkStart w:id="209" w:name="_Toc243924476"/>
       <w:bookmarkEnd w:id="206"/>
       <w:r>
         <w:t>HU-8.5 — Bitácora de correos y notificaciones</w:t>
@@ -37046,7 +37046,7 @@
         <w:pStyle w:val="Ttulo1"/>
       </w:pPr>
       <w:bookmarkStart w:id="210" w:name="_739f4e5454618e53e20de4c2474955375ba75c3"/>
-      <w:bookmarkStart w:id="211" w:name="_Toc243902085"/>
+      <w:bookmarkStart w:id="211" w:name="_Toc243924477"/>
       <w:bookmarkEnd w:id="198"/>
       <w:bookmarkEnd w:id="208"/>
       <w:r>
@@ -37068,7 +37068,7 @@
         <w:pStyle w:val="Ttulo2"/>
       </w:pPr>
       <w:bookmarkStart w:id="212" w:name="_062138411ab05c870ba796ff3d39feef69a18f5"/>
-      <w:bookmarkStart w:id="213" w:name="_Toc243902086"/>
+      <w:bookmarkStart w:id="213" w:name="_Toc243924478"/>
       <w:r>
         <w:t>HU-9.1 — Página pública y políticas legales</w:t>
       </w:r>
@@ -37293,7 +37293,7 @@
         <w:pStyle w:val="Ttulo1"/>
       </w:pPr>
       <w:bookmarkStart w:id="214" w:name="_6e6ded5804ca164f89e595fd787218d3285fdda"/>
-      <w:bookmarkStart w:id="215" w:name="_Toc243902087"/>
+      <w:bookmarkStart w:id="215" w:name="_Toc243924479"/>
       <w:bookmarkEnd w:id="210"/>
       <w:bookmarkEnd w:id="212"/>
       <w:r>
@@ -37343,7 +37343,7 @@
         <w:pStyle w:val="Ttulo2"/>
       </w:pPr>
       <w:bookmarkStart w:id="216" w:name="_84c91a7718df0375d71f3af5025108c0495eae8"/>
-      <w:bookmarkStart w:id="217" w:name="_Toc243902088"/>
+      <w:bookmarkStart w:id="217" w:name="_Toc243924480"/>
       <w:r>
         <w:t>Entrega v2.0 — imprescindible para la presentación (29 historias; 159 puntos estimados y HU-2.12 por estimar)</w:t>
       </w:r>
@@ -38891,7 +38891,7 @@
         <w:pStyle w:val="Ttulo2"/>
       </w:pPr>
       <w:bookmarkStart w:id="218" w:name="_4726c838c4287a7aa8f67a2e091a84cc61b2bb0"/>
-      <w:bookmarkStart w:id="219" w:name="_Toc243902089"/>
+      <w:bookmarkStart w:id="219" w:name="_Toc243924481"/>
       <w:bookmarkEnd w:id="216"/>
       <w:r>
         <w:t>Entrega v2.1 — completa el alcance (16 historias; estimación de HU-0.5 pendiente)</w:t>
@@ -39842,7 +39842,7 @@
         <w:pStyle w:val="Ttulo2"/>
       </w:pPr>
       <w:bookmarkStart w:id="220" w:name="_18e859a36e2a2c7f781eaf2084ffc20b263712e"/>
-      <w:bookmarkStart w:id="221" w:name="_Toc243902090"/>
+      <w:bookmarkStart w:id="221" w:name="_Toc243924482"/>
       <w:bookmarkEnd w:id="218"/>
       <w:r>
         <w:t>Historias diferidas que absorbe la v2</w:t>
@@ -40193,7 +40193,7 @@
         <w:pStyle w:val="Ttulo1"/>
       </w:pPr>
       <w:bookmarkStart w:id="222" w:name="_2bd3782f46f42f4ba497da64d292df25adf2039"/>
-      <w:bookmarkStart w:id="223" w:name="_Toc243902091"/>
+      <w:bookmarkStart w:id="223" w:name="_Toc243924483"/>
       <w:bookmarkEnd w:id="214"/>
       <w:bookmarkEnd w:id="220"/>
       <w:r>
@@ -44983,7 +44983,7 @@
         <w:pStyle w:val="Ttulo1"/>
       </w:pPr>
       <w:bookmarkStart w:id="224" w:name="_628434b2c6f40c9643f3958509c62867ee6f47b"/>
-      <w:bookmarkStart w:id="225" w:name="_Toc243902092"/>
+      <w:bookmarkStart w:id="225" w:name="_Toc243924484"/>
       <w:bookmarkEnd w:id="222"/>
       <w:r>
         <w:lastRenderedPageBreak/>
@@ -50548,7 +50548,7 @@
               <w:noProof/>
             </w:rPr>
             <w:drawing>
-              <wp:inline distT="0" distB="0" distL="0" distR="0" wp14:anchorId="1923B79F" wp14:editId="0A47FF78">
+              <wp:inline distT="0" distB="0" distL="0" distR="0" wp14:anchorId="2D2418E5" wp14:editId="2D2418E6">
                 <wp:extent cx="324000" cy="324000"/>
                 <wp:effectExtent l="0" t="0" r="0" b="0"/>
                 <wp:docPr id="9001" name="Logo Zooki"/>
@@ -50715,7 +50715,7 @@
   <w:abstractNum w:abstractNumId="0" w15:restartNumberingAfterBreak="0">
     <w:nsid w:val="0000A991"/>
     <w:multiLevelType w:val="multilevel"/>
-    <w:tmpl w:val="35AA1DB8"/>
+    <w:tmpl w:val="7F28AE8C"/>
     <w:lvl w:ilvl="0">
       <w:numFmt w:val="bullet"/>
       <w:lvlText w:val=""/>
@@ -50816,295 +50816,295 @@
       </w:rPr>
     </w:lvl>
   </w:abstractNum>
-  <w:num w:numId="1" w16cid:durableId="89667271">
+  <w:num w:numId="1" w16cid:durableId="778911759">
     <w:abstractNumId w:val="0"/>
   </w:num>
-  <w:num w:numId="2" w16cid:durableId="2030446394">
+  <w:num w:numId="2" w16cid:durableId="762804677">
     <w:abstractNumId w:val="0"/>
   </w:num>
-  <w:num w:numId="3" w16cid:durableId="1937397240">
+  <w:num w:numId="3" w16cid:durableId="645205233">
     <w:abstractNumId w:val="0"/>
   </w:num>
-  <w:num w:numId="4" w16cid:durableId="738133612">
+  <w:num w:numId="4" w16cid:durableId="2059238834">
     <w:abstractNumId w:val="0"/>
   </w:num>
-  <w:num w:numId="5" w16cid:durableId="219709280">
+  <w:num w:numId="5" w16cid:durableId="1072695976">
     <w:abstractNumId w:val="0"/>
   </w:num>
-  <w:num w:numId="6" w16cid:durableId="978996035">
+  <w:num w:numId="6" w16cid:durableId="1209100981">
     <w:abstractNumId w:val="0"/>
   </w:num>
-  <w:num w:numId="7" w16cid:durableId="1834685736">
+  <w:num w:numId="7" w16cid:durableId="1533879319">
     <w:abstractNumId w:val="0"/>
   </w:num>
-  <w:num w:numId="8" w16cid:durableId="1511140327">
+  <w:num w:numId="8" w16cid:durableId="1220244867">
     <w:abstractNumId w:val="0"/>
   </w:num>
-  <w:num w:numId="9" w16cid:durableId="1099057880">
+  <w:num w:numId="9" w16cid:durableId="746150710">
     <w:abstractNumId w:val="0"/>
   </w:num>
-  <w:num w:numId="10" w16cid:durableId="641008888">
+  <w:num w:numId="10" w16cid:durableId="576785829">
     <w:abstractNumId w:val="0"/>
   </w:num>
-  <w:num w:numId="11" w16cid:durableId="367143708">
+  <w:num w:numId="11" w16cid:durableId="393893191">
     <w:abstractNumId w:val="0"/>
   </w:num>
-  <w:num w:numId="12" w16cid:durableId="1763603299">
+  <w:num w:numId="12" w16cid:durableId="1591622178">
     <w:abstractNumId w:val="0"/>
   </w:num>
-  <w:num w:numId="13" w16cid:durableId="14311274">
+  <w:num w:numId="13" w16cid:durableId="104273928">
     <w:abstractNumId w:val="0"/>
   </w:num>
-  <w:num w:numId="14" w16cid:durableId="2034108792">
+  <w:num w:numId="14" w16cid:durableId="1239680073">
     <w:abstractNumId w:val="0"/>
   </w:num>
-  <w:num w:numId="15" w16cid:durableId="129330668">
+  <w:num w:numId="15" w16cid:durableId="89931143">
     <w:abstractNumId w:val="0"/>
   </w:num>
-  <w:num w:numId="16" w16cid:durableId="1624923507">
+  <w:num w:numId="16" w16cid:durableId="658464643">
     <w:abstractNumId w:val="0"/>
   </w:num>
-  <w:num w:numId="17" w16cid:durableId="1072772074">
+  <w:num w:numId="17" w16cid:durableId="1692221689">
     <w:abstractNumId w:val="0"/>
   </w:num>
-  <w:num w:numId="18" w16cid:durableId="112287507">
+  <w:num w:numId="18" w16cid:durableId="1437020813">
     <w:abstractNumId w:val="0"/>
   </w:num>
-  <w:num w:numId="19" w16cid:durableId="381904040">
+  <w:num w:numId="19" w16cid:durableId="650208960">
     <w:abstractNumId w:val="0"/>
   </w:num>
-  <w:num w:numId="20" w16cid:durableId="833643018">
+  <w:num w:numId="20" w16cid:durableId="1443458106">
     <w:abstractNumId w:val="0"/>
   </w:num>
-  <w:num w:numId="21" w16cid:durableId="342055418">
+  <w:num w:numId="21" w16cid:durableId="1706249578">
     <w:abstractNumId w:val="0"/>
   </w:num>
-  <w:num w:numId="22" w16cid:durableId="760443782">
+  <w:num w:numId="22" w16cid:durableId="877820012">
     <w:abstractNumId w:val="0"/>
   </w:num>
-  <w:num w:numId="23" w16cid:durableId="355929936">
+  <w:num w:numId="23" w16cid:durableId="1766726577">
     <w:abstractNumId w:val="0"/>
   </w:num>
-  <w:num w:numId="24" w16cid:durableId="852652198">
+  <w:num w:numId="24" w16cid:durableId="2015524981">
     <w:abstractNumId w:val="0"/>
   </w:num>
-  <w:num w:numId="25" w16cid:durableId="1885100748">
+  <w:num w:numId="25" w16cid:durableId="217207011">
     <w:abstractNumId w:val="0"/>
   </w:num>
-  <w:num w:numId="26" w16cid:durableId="1701586540">
+  <w:num w:numId="26" w16cid:durableId="1948925846">
     <w:abstractNumId w:val="0"/>
   </w:num>
-  <w:num w:numId="27" w16cid:durableId="1071348529">
+  <w:num w:numId="27" w16cid:durableId="1521626798">
     <w:abstractNumId w:val="0"/>
   </w:num>
-  <w:num w:numId="28" w16cid:durableId="1458455357">
+  <w:num w:numId="28" w16cid:durableId="1517765455">
     <w:abstractNumId w:val="0"/>
   </w:num>
-  <w:num w:numId="29" w16cid:durableId="342048451">
+  <w:num w:numId="29" w16cid:durableId="1704743992">
     <w:abstractNumId w:val="0"/>
   </w:num>
-  <w:num w:numId="30" w16cid:durableId="382096564">
+  <w:num w:numId="30" w16cid:durableId="783421173">
     <w:abstractNumId w:val="0"/>
   </w:num>
-  <w:num w:numId="31" w16cid:durableId="783690001">
+  <w:num w:numId="31" w16cid:durableId="248084934">
     <w:abstractNumId w:val="0"/>
   </w:num>
-  <w:num w:numId="32" w16cid:durableId="743532917">
+  <w:num w:numId="32" w16cid:durableId="275646742">
     <w:abstractNumId w:val="0"/>
   </w:num>
-  <w:num w:numId="33" w16cid:durableId="885875732">
+  <w:num w:numId="33" w16cid:durableId="894393539">
     <w:abstractNumId w:val="0"/>
   </w:num>
-  <w:num w:numId="34" w16cid:durableId="65878439">
+  <w:num w:numId="34" w16cid:durableId="188884527">
     <w:abstractNumId w:val="0"/>
   </w:num>
-  <w:num w:numId="35" w16cid:durableId="2073843046">
+  <w:num w:numId="35" w16cid:durableId="671105152">
     <w:abstractNumId w:val="0"/>
   </w:num>
-  <w:num w:numId="36" w16cid:durableId="703561241">
+  <w:num w:numId="36" w16cid:durableId="1291745392">
     <w:abstractNumId w:val="0"/>
   </w:num>
-  <w:num w:numId="37" w16cid:durableId="1283615260">
+  <w:num w:numId="37" w16cid:durableId="1099330386">
     <w:abstractNumId w:val="0"/>
   </w:num>
-  <w:num w:numId="38" w16cid:durableId="50931066">
+  <w:num w:numId="38" w16cid:durableId="1699548545">
     <w:abstractNumId w:val="0"/>
   </w:num>
-  <w:num w:numId="39" w16cid:durableId="866067481">
+  <w:num w:numId="39" w16cid:durableId="2053117527">
     <w:abstractNumId w:val="0"/>
   </w:num>
-  <w:num w:numId="40" w16cid:durableId="648480205">
+  <w:num w:numId="40" w16cid:durableId="208148334">
     <w:abstractNumId w:val="0"/>
   </w:num>
-  <w:num w:numId="41" w16cid:durableId="1337462638">
+  <w:num w:numId="41" w16cid:durableId="2006980058">
     <w:abstractNumId w:val="0"/>
   </w:num>
-  <w:num w:numId="42" w16cid:durableId="1631744297">
+  <w:num w:numId="42" w16cid:durableId="857112098">
     <w:abstractNumId w:val="0"/>
   </w:num>
-  <w:num w:numId="43" w16cid:durableId="1460807898">
+  <w:num w:numId="43" w16cid:durableId="885095259">
     <w:abstractNumId w:val="0"/>
   </w:num>
-  <w:num w:numId="44" w16cid:durableId="690180489">
+  <w:num w:numId="44" w16cid:durableId="1088114024">
     <w:abstractNumId w:val="0"/>
   </w:num>
-  <w:num w:numId="45" w16cid:durableId="778987207">
+  <w:num w:numId="45" w16cid:durableId="962419715">
     <w:abstractNumId w:val="0"/>
   </w:num>
-  <w:num w:numId="46" w16cid:durableId="1531917788">
+  <w:num w:numId="46" w16cid:durableId="1318993200">
     <w:abstractNumId w:val="0"/>
   </w:num>
-  <w:num w:numId="47" w16cid:durableId="1110126459">
+  <w:num w:numId="47" w16cid:durableId="744648033">
     <w:abstractNumId w:val="0"/>
   </w:num>
-  <w:num w:numId="48" w16cid:durableId="576548670">
+  <w:num w:numId="48" w16cid:durableId="1042947899">
     <w:abstractNumId w:val="0"/>
   </w:num>
-  <w:num w:numId="49" w16cid:durableId="1578058492">
+  <w:num w:numId="49" w16cid:durableId="1228762312">
     <w:abstractNumId w:val="0"/>
   </w:num>
-  <w:num w:numId="50" w16cid:durableId="1414355958">
+  <w:num w:numId="50" w16cid:durableId="1292710711">
     <w:abstractNumId w:val="0"/>
   </w:num>
-  <w:num w:numId="51" w16cid:durableId="793256654">
+  <w:num w:numId="51" w16cid:durableId="1870222700">
     <w:abstractNumId w:val="0"/>
   </w:num>
-  <w:num w:numId="52" w16cid:durableId="607398429">
+  <w:num w:numId="52" w16cid:durableId="51541346">
     <w:abstractNumId w:val="0"/>
   </w:num>
-  <w:num w:numId="53" w16cid:durableId="1047602381">
+  <w:num w:numId="53" w16cid:durableId="2089500552">
     <w:abstractNumId w:val="0"/>
   </w:num>
-  <w:num w:numId="54" w16cid:durableId="759371394">
+  <w:num w:numId="54" w16cid:durableId="1915890252">
     <w:abstractNumId w:val="0"/>
   </w:num>
-  <w:num w:numId="55" w16cid:durableId="1026175611">
+  <w:num w:numId="55" w16cid:durableId="757557898">
     <w:abstractNumId w:val="0"/>
   </w:num>
-  <w:num w:numId="56" w16cid:durableId="196509136">
+  <w:num w:numId="56" w16cid:durableId="1865746256">
     <w:abstractNumId w:val="0"/>
   </w:num>
-  <w:num w:numId="57" w16cid:durableId="895626935">
+  <w:num w:numId="57" w16cid:durableId="1610502154">
     <w:abstractNumId w:val="0"/>
   </w:num>
-  <w:num w:numId="58" w16cid:durableId="399518719">
+  <w:num w:numId="58" w16cid:durableId="733822916">
     <w:abstractNumId w:val="0"/>
   </w:num>
-  <w:num w:numId="59" w16cid:durableId="1378318383">
+  <w:num w:numId="59" w16cid:durableId="1875578152">
     <w:abstractNumId w:val="0"/>
   </w:num>
-  <w:num w:numId="60" w16cid:durableId="825438980">
+  <w:num w:numId="60" w16cid:durableId="604073312">
     <w:abstractNumId w:val="0"/>
   </w:num>
-  <w:num w:numId="61" w16cid:durableId="1315255852">
+  <w:num w:numId="61" w16cid:durableId="344596902">
     <w:abstractNumId w:val="0"/>
   </w:num>
-  <w:num w:numId="62" w16cid:durableId="1636369853">
+  <w:num w:numId="62" w16cid:durableId="244807316">
     <w:abstractNumId w:val="0"/>
   </w:num>
-  <w:num w:numId="63" w16cid:durableId="363795447">
+  <w:num w:numId="63" w16cid:durableId="1352801420">
     <w:abstractNumId w:val="0"/>
   </w:num>
-  <w:num w:numId="64" w16cid:durableId="1143079356">
+  <w:num w:numId="64" w16cid:durableId="1719089177">
     <w:abstractNumId w:val="0"/>
   </w:num>
-  <w:num w:numId="65" w16cid:durableId="1698700373">
+  <w:num w:numId="65" w16cid:durableId="169567735">
     <w:abstractNumId w:val="0"/>
   </w:num>
-  <w:num w:numId="66" w16cid:durableId="894006732">
+  <w:num w:numId="66" w16cid:durableId="1366062554">
     <w:abstractNumId w:val="0"/>
   </w:num>
-  <w:num w:numId="67" w16cid:durableId="1249532866">
+  <w:num w:numId="67" w16cid:durableId="1489009260">
     <w:abstractNumId w:val="0"/>
   </w:num>
-  <w:num w:numId="68" w16cid:durableId="610091756">
+  <w:num w:numId="68" w16cid:durableId="351494479">
     <w:abstractNumId w:val="0"/>
   </w:num>
-  <w:num w:numId="69" w16cid:durableId="903446298">
+  <w:num w:numId="69" w16cid:durableId="1335644946">
     <w:abstractNumId w:val="0"/>
   </w:num>
-  <w:num w:numId="70" w16cid:durableId="1791312887">
+  <w:num w:numId="70" w16cid:durableId="1989507503">
     <w:abstractNumId w:val="0"/>
   </w:num>
-  <w:num w:numId="71" w16cid:durableId="1113943601">
+  <w:num w:numId="71" w16cid:durableId="389882398">
     <w:abstractNumId w:val="0"/>
   </w:num>
-  <w:num w:numId="72" w16cid:durableId="596255737">
+  <w:num w:numId="72" w16cid:durableId="914631906">
     <w:abstractNumId w:val="0"/>
   </w:num>
-  <w:num w:numId="73" w16cid:durableId="1509098656">
+  <w:num w:numId="73" w16cid:durableId="1047995707">
     <w:abstractNumId w:val="0"/>
   </w:num>
-  <w:num w:numId="74" w16cid:durableId="1427992442">
+  <w:num w:numId="74" w16cid:durableId="1490321177">
     <w:abstractNumId w:val="0"/>
   </w:num>
-  <w:num w:numId="75" w16cid:durableId="932785101">
+  <w:num w:numId="75" w16cid:durableId="1447575503">
     <w:abstractNumId w:val="0"/>
   </w:num>
-  <w:num w:numId="76" w16cid:durableId="459690642">
+  <w:num w:numId="76" w16cid:durableId="891576417">
     <w:abstractNumId w:val="0"/>
   </w:num>
-  <w:num w:numId="77" w16cid:durableId="614018906">
+  <w:num w:numId="77" w16cid:durableId="17974376">
     <w:abstractNumId w:val="0"/>
   </w:num>
-  <w:num w:numId="78" w16cid:durableId="756024687">
+  <w:num w:numId="78" w16cid:durableId="489639339">
     <w:abstractNumId w:val="0"/>
   </w:num>
-  <w:num w:numId="79" w16cid:durableId="2068525596">
+  <w:num w:numId="79" w16cid:durableId="1468275259">
     <w:abstractNumId w:val="0"/>
   </w:num>
-  <w:num w:numId="80" w16cid:durableId="1927155369">
+  <w:num w:numId="80" w16cid:durableId="1875187602">
     <w:abstractNumId w:val="0"/>
   </w:num>
-  <w:num w:numId="81" w16cid:durableId="2013953132">
+  <w:num w:numId="81" w16cid:durableId="346298501">
     <w:abstractNumId w:val="0"/>
   </w:num>
-  <w:num w:numId="82" w16cid:durableId="525606595">
+  <w:num w:numId="82" w16cid:durableId="120417818">
     <w:abstractNumId w:val="0"/>
   </w:num>
-  <w:num w:numId="83" w16cid:durableId="349642422">
+  <w:num w:numId="83" w16cid:durableId="1311669924">
     <w:abstractNumId w:val="0"/>
   </w:num>
-  <w:num w:numId="84" w16cid:durableId="391659532">
+  <w:num w:numId="84" w16cid:durableId="1204974674">
     <w:abstractNumId w:val="0"/>
   </w:num>
-  <w:num w:numId="85" w16cid:durableId="1902981259">
+  <w:num w:numId="85" w16cid:durableId="2145148197">
     <w:abstractNumId w:val="0"/>
   </w:num>
-  <w:num w:numId="86" w16cid:durableId="160126602">
+  <w:num w:numId="86" w16cid:durableId="117535889">
     <w:abstractNumId w:val="0"/>
   </w:num>
-  <w:num w:numId="87" w16cid:durableId="990019562">
+  <w:num w:numId="87" w16cid:durableId="2146268729">
     <w:abstractNumId w:val="0"/>
   </w:num>
-  <w:num w:numId="88" w16cid:durableId="525289717">
+  <w:num w:numId="88" w16cid:durableId="1808208570">
     <w:abstractNumId w:val="0"/>
   </w:num>
-  <w:num w:numId="89" w16cid:durableId="1409115055">
+  <w:num w:numId="89" w16cid:durableId="1864006769">
     <w:abstractNumId w:val="0"/>
   </w:num>
-  <w:num w:numId="90" w16cid:durableId="690767913">
+  <w:num w:numId="90" w16cid:durableId="2080976595">
     <w:abstractNumId w:val="0"/>
   </w:num>
-  <w:num w:numId="91" w16cid:durableId="1692417883">
+  <w:num w:numId="91" w16cid:durableId="2135053116">
     <w:abstractNumId w:val="0"/>
   </w:num>
-  <w:num w:numId="92" w16cid:durableId="914903113">
+  <w:num w:numId="92" w16cid:durableId="626859757">
     <w:abstractNumId w:val="0"/>
   </w:num>
-  <w:num w:numId="93" w16cid:durableId="1531189610">
+  <w:num w:numId="93" w16cid:durableId="2108112828">
     <w:abstractNumId w:val="0"/>
   </w:num>
-  <w:num w:numId="94" w16cid:durableId="2142307036">
+  <w:num w:numId="94" w16cid:durableId="934022473">
     <w:abstractNumId w:val="0"/>
   </w:num>
-  <w:num w:numId="95" w16cid:durableId="200633837">
+  <w:num w:numId="95" w16cid:durableId="1088690773">
     <w:abstractNumId w:val="0"/>
   </w:num>
-  <w:num w:numId="96" w16cid:durableId="1147016089">
+  <w:num w:numId="96" w16cid:durableId="1764255607">
     <w:abstractNumId w:val="0"/>
   </w:num>
-  <w:num w:numId="97" w16cid:durableId="267348939">
+  <w:num w:numId="97" w16cid:durableId="1939559652">
     <w:abstractNumId w:val="0"/>
   </w:num>
   <w:numIdMacAtCleanup w:val="97"/>
@@ -52496,7 +52496,7 @@
     <w:autoRedefine/>
     <w:uiPriority w:val="39"/>
     <w:unhideWhenUsed/>
-    <w:rsid w:val="00595D8A"/>
+    <w:rsid w:val="00291BC7"/>
     <w:pPr>
       <w:spacing w:after="100" w:line="278" w:lineRule="auto"/>
       <w:ind w:left="480"/>
@@ -52515,7 +52515,7 @@
     <w:autoRedefine/>
     <w:uiPriority w:val="39"/>
     <w:unhideWhenUsed/>
-    <w:rsid w:val="00595D8A"/>
+    <w:rsid w:val="00291BC7"/>
     <w:pPr>
       <w:spacing w:after="100" w:line="278" w:lineRule="auto"/>
       <w:ind w:left="720"/>
@@ -52534,7 +52534,7 @@
     <w:autoRedefine/>
     <w:uiPriority w:val="39"/>
     <w:unhideWhenUsed/>
-    <w:rsid w:val="00595D8A"/>
+    <w:rsid w:val="00291BC7"/>
     <w:pPr>
       <w:spacing w:after="100" w:line="278" w:lineRule="auto"/>
       <w:ind w:left="960"/>
@@ -52553,7 +52553,7 @@
     <w:autoRedefine/>
     <w:uiPriority w:val="39"/>
     <w:unhideWhenUsed/>
-    <w:rsid w:val="00595D8A"/>
+    <w:rsid w:val="00291BC7"/>
     <w:pPr>
       <w:spacing w:after="100" w:line="278" w:lineRule="auto"/>
       <w:ind w:left="1200"/>
@@ -52572,7 +52572,7 @@
     <w:autoRedefine/>
     <w:uiPriority w:val="39"/>
     <w:unhideWhenUsed/>
-    <w:rsid w:val="00595D8A"/>
+    <w:rsid w:val="00291BC7"/>
     <w:pPr>
       <w:spacing w:after="100" w:line="278" w:lineRule="auto"/>
       <w:ind w:left="1440"/>
@@ -52591,7 +52591,7 @@
     <w:autoRedefine/>
     <w:uiPriority w:val="39"/>
     <w:unhideWhenUsed/>
-    <w:rsid w:val="00595D8A"/>
+    <w:rsid w:val="00291BC7"/>
     <w:pPr>
       <w:spacing w:after="100" w:line="278" w:lineRule="auto"/>
       <w:ind w:left="1680"/>
@@ -52610,7 +52610,7 @@
     <w:autoRedefine/>
     <w:uiPriority w:val="39"/>
     <w:unhideWhenUsed/>
-    <w:rsid w:val="00595D8A"/>
+    <w:rsid w:val="00291BC7"/>
     <w:pPr>
       <w:spacing w:after="100" w:line="278" w:lineRule="auto"/>
       <w:ind w:left="1920"/>
@@ -52628,7 +52628,7 @@
     <w:uiPriority w:val="99"/>
     <w:semiHidden/>
     <w:unhideWhenUsed/>
-    <w:rsid w:val="00595D8A"/>
+    <w:rsid w:val="00291BC7"/>
     <w:rPr>
       <w:color w:val="605E5C"/>
       <w:shd w:val="clear" w:color="auto" w:fill="E1DFDD"/>

</xml_diff>

<commit_message>
feat(interfaz): etapa R - datos de la clinica con logo, horarios, ausencias, auditoria, usuarios y cabecera comun (HU-7.4, RE-7.4.1, RNF-16)
</commit_message>
<xml_diff>
--- a/public/docs/descargas/hu.docx
+++ b/public/docs/descargas/hu.docx
@@ -93,7 +93,7 @@
           <w:noProof/>
         </w:rPr>
         <w:drawing>
-          <wp:inline distT="0" distB="0" distL="0" distR="0" wp14:anchorId="2FEB2B01" wp14:editId="2FEB2B02">
+          <wp:inline distT="0" distB="0" distL="0" distR="0" wp14:anchorId="400BCDCE" wp14:editId="400BCDCF">
             <wp:extent cx="395999" cy="405503"/>
             <wp:effectExtent l="0" t="0" r="0" b="0"/>
             <wp:docPr id="10" name="Picture"/>
@@ -409,7 +409,7 @@
       <w:r>
         <w:fldChar w:fldCharType="separate"/>
       </w:r>
-      <w:hyperlink w:anchor="_Toc243945690" w:history="1">
+      <w:hyperlink w:anchor="_Toc243948385" w:history="1">
         <w:r>
           <w:rPr>
             <w:rStyle w:val="Hipervnculo"/>
@@ -445,7 +445,7 @@
             <w:noProof/>
             <w:webHidden/>
           </w:rPr>
-          <w:instrText xml:space="preserve"> PAGEREF _Toc243945690 \h </w:instrText>
+          <w:instrText xml:space="preserve"> PAGEREF _Toc243948385 \h </w:instrText>
         </w:r>
         <w:r>
           <w:rPr>
@@ -488,7 +488,7 @@
           <w14:ligatures w14:val="standardContextual"/>
         </w:rPr>
       </w:pPr>
-      <w:hyperlink w:anchor="_Toc243945691" w:history="1">
+      <w:hyperlink w:anchor="_Toc243948386" w:history="1">
         <w:r>
           <w:rPr>
             <w:rStyle w:val="Hipervnculo"/>
@@ -515,7 +515,7 @@
             <w:noProof/>
             <w:webHidden/>
           </w:rPr>
-          <w:instrText xml:space="preserve"> PAGEREF _Toc243945691 \h </w:instrText>
+          <w:instrText xml:space="preserve"> PAGEREF _Toc243948386 \h </w:instrText>
         </w:r>
         <w:r>
           <w:rPr>
@@ -558,7 +558,7 @@
           <w14:ligatures w14:val="standardContextual"/>
         </w:rPr>
       </w:pPr>
-      <w:hyperlink w:anchor="_Toc243945692" w:history="1">
+      <w:hyperlink w:anchor="_Toc243948387" w:history="1">
         <w:r>
           <w:rPr>
             <w:rStyle w:val="Hipervnculo"/>
@@ -585,7 +585,7 @@
             <w:noProof/>
             <w:webHidden/>
           </w:rPr>
-          <w:instrText xml:space="preserve"> PAGEREF _Toc243945692 \h </w:instrText>
+          <w:instrText xml:space="preserve"> PAGEREF _Toc243948387 \h </w:instrText>
         </w:r>
         <w:r>
           <w:rPr>
@@ -628,7 +628,7 @@
           <w14:ligatures w14:val="standardContextual"/>
         </w:rPr>
       </w:pPr>
-      <w:hyperlink w:anchor="_Toc243945693" w:history="1">
+      <w:hyperlink w:anchor="_Toc243948388" w:history="1">
         <w:r>
           <w:rPr>
             <w:rStyle w:val="Hipervnculo"/>
@@ -655,7 +655,7 @@
             <w:noProof/>
             <w:webHidden/>
           </w:rPr>
-          <w:instrText xml:space="preserve"> PAGEREF _Toc243945693 \h </w:instrText>
+          <w:instrText xml:space="preserve"> PAGEREF _Toc243948388 \h </w:instrText>
         </w:r>
         <w:r>
           <w:rPr>
@@ -698,7 +698,7 @@
           <w14:ligatures w14:val="standardContextual"/>
         </w:rPr>
       </w:pPr>
-      <w:hyperlink w:anchor="_Toc243945694" w:history="1">
+      <w:hyperlink w:anchor="_Toc243948389" w:history="1">
         <w:r>
           <w:rPr>
             <w:rStyle w:val="Hipervnculo"/>
@@ -725,7 +725,7 @@
             <w:noProof/>
             <w:webHidden/>
           </w:rPr>
-          <w:instrText xml:space="preserve"> PAGEREF _Toc243945694 \h </w:instrText>
+          <w:instrText xml:space="preserve"> PAGEREF _Toc243948389 \h </w:instrText>
         </w:r>
         <w:r>
           <w:rPr>
@@ -768,7 +768,7 @@
           <w14:ligatures w14:val="standardContextual"/>
         </w:rPr>
       </w:pPr>
-      <w:hyperlink w:anchor="_Toc243945695" w:history="1">
+      <w:hyperlink w:anchor="_Toc243948390" w:history="1">
         <w:r>
           <w:rPr>
             <w:rStyle w:val="Hipervnculo"/>
@@ -795,7 +795,7 @@
             <w:noProof/>
             <w:webHidden/>
           </w:rPr>
-          <w:instrText xml:space="preserve"> PAGEREF _Toc243945695 \h </w:instrText>
+          <w:instrText xml:space="preserve"> PAGEREF _Toc243948390 \h </w:instrText>
         </w:r>
         <w:r>
           <w:rPr>
@@ -841,7 +841,7 @@
           <w14:ligatures w14:val="standardContextual"/>
         </w:rPr>
       </w:pPr>
-      <w:hyperlink w:anchor="_Toc243945696" w:history="1">
+      <w:hyperlink w:anchor="_Toc243948391" w:history="1">
         <w:r>
           <w:rPr>
             <w:rStyle w:val="Hipervnculo"/>
@@ -868,7 +868,7 @@
             <w:noProof/>
             <w:webHidden/>
           </w:rPr>
-          <w:instrText xml:space="preserve"> PAGEREF _Toc243945696 \h </w:instrText>
+          <w:instrText xml:space="preserve"> PAGEREF _Toc243948391 \h </w:instrText>
         </w:r>
         <w:r>
           <w:rPr>
@@ -911,7 +911,7 @@
           <w14:ligatures w14:val="standardContextual"/>
         </w:rPr>
       </w:pPr>
-      <w:hyperlink w:anchor="_Toc243945697" w:history="1">
+      <w:hyperlink w:anchor="_Toc243948392" w:history="1">
         <w:r>
           <w:rPr>
             <w:rStyle w:val="Hipervnculo"/>
@@ -938,7 +938,7 @@
             <w:noProof/>
             <w:webHidden/>
           </w:rPr>
-          <w:instrText xml:space="preserve"> PAGEREF _Toc243945697 \h </w:instrText>
+          <w:instrText xml:space="preserve"> PAGEREF _Toc243948392 \h </w:instrText>
         </w:r>
         <w:r>
           <w:rPr>
@@ -981,7 +981,7 @@
           <w14:ligatures w14:val="standardContextual"/>
         </w:rPr>
       </w:pPr>
-      <w:hyperlink w:anchor="_Toc243945698" w:history="1">
+      <w:hyperlink w:anchor="_Toc243948393" w:history="1">
         <w:r>
           <w:rPr>
             <w:rStyle w:val="Hipervnculo"/>
@@ -1008,7 +1008,7 @@
             <w:noProof/>
             <w:webHidden/>
           </w:rPr>
-          <w:instrText xml:space="preserve"> PAGEREF _Toc243945698 \h </w:instrText>
+          <w:instrText xml:space="preserve"> PAGEREF _Toc243948393 \h </w:instrText>
         </w:r>
         <w:r>
           <w:rPr>
@@ -1051,7 +1051,7 @@
           <w14:ligatures w14:val="standardContextual"/>
         </w:rPr>
       </w:pPr>
-      <w:hyperlink w:anchor="_Toc243945699" w:history="1">
+      <w:hyperlink w:anchor="_Toc243948394" w:history="1">
         <w:r>
           <w:rPr>
             <w:rStyle w:val="Hipervnculo"/>
@@ -1078,7 +1078,7 @@
             <w:noProof/>
             <w:webHidden/>
           </w:rPr>
-          <w:instrText xml:space="preserve"> PAGEREF _Toc243945699 \h </w:instrText>
+          <w:instrText xml:space="preserve"> PAGEREF _Toc243948394 \h </w:instrText>
         </w:r>
         <w:r>
           <w:rPr>
@@ -1121,7 +1121,7 @@
           <w14:ligatures w14:val="standardContextual"/>
         </w:rPr>
       </w:pPr>
-      <w:hyperlink w:anchor="_Toc243945700" w:history="1">
+      <w:hyperlink w:anchor="_Toc243948395" w:history="1">
         <w:r>
           <w:rPr>
             <w:rStyle w:val="Hipervnculo"/>
@@ -1148,7 +1148,7 @@
             <w:noProof/>
             <w:webHidden/>
           </w:rPr>
-          <w:instrText xml:space="preserve"> PAGEREF _Toc243945700 \h </w:instrText>
+          <w:instrText xml:space="preserve"> PAGEREF _Toc243948395 \h </w:instrText>
         </w:r>
         <w:r>
           <w:rPr>
@@ -1191,7 +1191,7 @@
           <w14:ligatures w14:val="standardContextual"/>
         </w:rPr>
       </w:pPr>
-      <w:hyperlink w:anchor="_Toc243945701" w:history="1">
+      <w:hyperlink w:anchor="_Toc243948396" w:history="1">
         <w:r>
           <w:rPr>
             <w:rStyle w:val="Hipervnculo"/>
@@ -1218,7 +1218,7 @@
             <w:noProof/>
             <w:webHidden/>
           </w:rPr>
-          <w:instrText xml:space="preserve"> PAGEREF _Toc243945701 \h </w:instrText>
+          <w:instrText xml:space="preserve"> PAGEREF _Toc243948396 \h </w:instrText>
         </w:r>
         <w:r>
           <w:rPr>
@@ -1261,7 +1261,7 @@
           <w14:ligatures w14:val="standardContextual"/>
         </w:rPr>
       </w:pPr>
-      <w:hyperlink w:anchor="_Toc243945702" w:history="1">
+      <w:hyperlink w:anchor="_Toc243948397" w:history="1">
         <w:r>
           <w:rPr>
             <w:rStyle w:val="Hipervnculo"/>
@@ -1288,7 +1288,7 @@
             <w:noProof/>
             <w:webHidden/>
           </w:rPr>
-          <w:instrText xml:space="preserve"> PAGEREF _Toc243945702 \h </w:instrText>
+          <w:instrText xml:space="preserve"> PAGEREF _Toc243948397 \h </w:instrText>
         </w:r>
         <w:r>
           <w:rPr>
@@ -1331,7 +1331,7 @@
           <w14:ligatures w14:val="standardContextual"/>
         </w:rPr>
       </w:pPr>
-      <w:hyperlink w:anchor="_Toc243945703" w:history="1">
+      <w:hyperlink w:anchor="_Toc243948398" w:history="1">
         <w:r>
           <w:rPr>
             <w:rStyle w:val="Hipervnculo"/>
@@ -1358,7 +1358,7 @@
             <w:noProof/>
             <w:webHidden/>
           </w:rPr>
-          <w:instrText xml:space="preserve"> PAGEREF _Toc243945703 \h </w:instrText>
+          <w:instrText xml:space="preserve"> PAGEREF _Toc243948398 \h </w:instrText>
         </w:r>
         <w:r>
           <w:rPr>
@@ -1401,7 +1401,7 @@
           <w14:ligatures w14:val="standardContextual"/>
         </w:rPr>
       </w:pPr>
-      <w:hyperlink w:anchor="_Toc243945704" w:history="1">
+      <w:hyperlink w:anchor="_Toc243948399" w:history="1">
         <w:r>
           <w:rPr>
             <w:rStyle w:val="Hipervnculo"/>
@@ -1428,7 +1428,7 @@
             <w:noProof/>
             <w:webHidden/>
           </w:rPr>
-          <w:instrText xml:space="preserve"> PAGEREF _Toc243945704 \h </w:instrText>
+          <w:instrText xml:space="preserve"> PAGEREF _Toc243948399 \h </w:instrText>
         </w:r>
         <w:r>
           <w:rPr>
@@ -1471,7 +1471,7 @@
           <w14:ligatures w14:val="standardContextual"/>
         </w:rPr>
       </w:pPr>
-      <w:hyperlink w:anchor="_Toc243945705" w:history="1">
+      <w:hyperlink w:anchor="_Toc243948400" w:history="1">
         <w:r>
           <w:rPr>
             <w:rStyle w:val="Hipervnculo"/>
@@ -1498,7 +1498,7 @@
             <w:noProof/>
             <w:webHidden/>
           </w:rPr>
-          <w:instrText xml:space="preserve"> PAGEREF _Toc243945705 \h </w:instrText>
+          <w:instrText xml:space="preserve"> PAGEREF _Toc243948400 \h </w:instrText>
         </w:r>
         <w:r>
           <w:rPr>
@@ -1541,7 +1541,7 @@
           <w14:ligatures w14:val="standardContextual"/>
         </w:rPr>
       </w:pPr>
-      <w:hyperlink w:anchor="_Toc243945706" w:history="1">
+      <w:hyperlink w:anchor="_Toc243948401" w:history="1">
         <w:r>
           <w:rPr>
             <w:rStyle w:val="Hipervnculo"/>
@@ -1568,7 +1568,7 @@
             <w:noProof/>
             <w:webHidden/>
           </w:rPr>
-          <w:instrText xml:space="preserve"> PAGEREF _Toc243945706 \h </w:instrText>
+          <w:instrText xml:space="preserve"> PAGEREF _Toc243948401 \h </w:instrText>
         </w:r>
         <w:r>
           <w:rPr>
@@ -1611,7 +1611,7 @@
           <w14:ligatures w14:val="standardContextual"/>
         </w:rPr>
       </w:pPr>
-      <w:hyperlink w:anchor="_Toc243945707" w:history="1">
+      <w:hyperlink w:anchor="_Toc243948402" w:history="1">
         <w:r>
           <w:rPr>
             <w:rStyle w:val="Hipervnculo"/>
@@ -1638,7 +1638,7 @@
             <w:noProof/>
             <w:webHidden/>
           </w:rPr>
-          <w:instrText xml:space="preserve"> PAGEREF _Toc243945707 \h </w:instrText>
+          <w:instrText xml:space="preserve"> PAGEREF _Toc243948402 \h </w:instrText>
         </w:r>
         <w:r>
           <w:rPr>
@@ -1681,7 +1681,7 @@
           <w14:ligatures w14:val="standardContextual"/>
         </w:rPr>
       </w:pPr>
-      <w:hyperlink w:anchor="_Toc243945708" w:history="1">
+      <w:hyperlink w:anchor="_Toc243948403" w:history="1">
         <w:r>
           <w:rPr>
             <w:rStyle w:val="Hipervnculo"/>
@@ -1708,7 +1708,7 @@
             <w:noProof/>
             <w:webHidden/>
           </w:rPr>
-          <w:instrText xml:space="preserve"> PAGEREF _Toc243945708 \h </w:instrText>
+          <w:instrText xml:space="preserve"> PAGEREF _Toc243948403 \h </w:instrText>
         </w:r>
         <w:r>
           <w:rPr>
@@ -1751,7 +1751,7 @@
           <w14:ligatures w14:val="standardContextual"/>
         </w:rPr>
       </w:pPr>
-      <w:hyperlink w:anchor="_Toc243945709" w:history="1">
+      <w:hyperlink w:anchor="_Toc243948404" w:history="1">
         <w:r>
           <w:rPr>
             <w:rStyle w:val="Hipervnculo"/>
@@ -1778,7 +1778,7 @@
             <w:noProof/>
             <w:webHidden/>
           </w:rPr>
-          <w:instrText xml:space="preserve"> PAGEREF _Toc243945709 \h </w:instrText>
+          <w:instrText xml:space="preserve"> PAGEREF _Toc243948404 \h </w:instrText>
         </w:r>
         <w:r>
           <w:rPr>
@@ -1821,7 +1821,7 @@
           <w14:ligatures w14:val="standardContextual"/>
         </w:rPr>
       </w:pPr>
-      <w:hyperlink w:anchor="_Toc243945710" w:history="1">
+      <w:hyperlink w:anchor="_Toc243948405" w:history="1">
         <w:r>
           <w:rPr>
             <w:rStyle w:val="Hipervnculo"/>
@@ -1848,7 +1848,7 @@
             <w:noProof/>
             <w:webHidden/>
           </w:rPr>
-          <w:instrText xml:space="preserve"> PAGEREF _Toc243945710 \h </w:instrText>
+          <w:instrText xml:space="preserve"> PAGEREF _Toc243948405 \h </w:instrText>
         </w:r>
         <w:r>
           <w:rPr>
@@ -1891,7 +1891,7 @@
           <w14:ligatures w14:val="standardContextual"/>
         </w:rPr>
       </w:pPr>
-      <w:hyperlink w:anchor="_Toc243945711" w:history="1">
+      <w:hyperlink w:anchor="_Toc243948406" w:history="1">
         <w:r>
           <w:rPr>
             <w:rStyle w:val="Hipervnculo"/>
@@ -1918,7 +1918,7 @@
             <w:noProof/>
             <w:webHidden/>
           </w:rPr>
-          <w:instrText xml:space="preserve"> PAGEREF _Toc243945711 \h </w:instrText>
+          <w:instrText xml:space="preserve"> PAGEREF _Toc243948406 \h </w:instrText>
         </w:r>
         <w:r>
           <w:rPr>
@@ -1961,7 +1961,7 @@
           <w14:ligatures w14:val="standardContextual"/>
         </w:rPr>
       </w:pPr>
-      <w:hyperlink w:anchor="_Toc243945712" w:history="1">
+      <w:hyperlink w:anchor="_Toc243948407" w:history="1">
         <w:r>
           <w:rPr>
             <w:rStyle w:val="Hipervnculo"/>
@@ -1988,7 +1988,7 @@
             <w:noProof/>
             <w:webHidden/>
           </w:rPr>
-          <w:instrText xml:space="preserve"> PAGEREF _Toc243945712 \h </w:instrText>
+          <w:instrText xml:space="preserve"> PAGEREF _Toc243948407 \h </w:instrText>
         </w:r>
         <w:r>
           <w:rPr>
@@ -2031,7 +2031,7 @@
           <w14:ligatures w14:val="standardContextual"/>
         </w:rPr>
       </w:pPr>
-      <w:hyperlink w:anchor="_Toc243945713" w:history="1">
+      <w:hyperlink w:anchor="_Toc243948408" w:history="1">
         <w:r>
           <w:rPr>
             <w:rStyle w:val="Hipervnculo"/>
@@ -2058,7 +2058,7 @@
             <w:noProof/>
             <w:webHidden/>
           </w:rPr>
-          <w:instrText xml:space="preserve"> PAGEREF _Toc243945713 \h </w:instrText>
+          <w:instrText xml:space="preserve"> PAGEREF _Toc243948408 \h </w:instrText>
         </w:r>
         <w:r>
           <w:rPr>
@@ -2101,7 +2101,7 @@
           <w14:ligatures w14:val="standardContextual"/>
         </w:rPr>
       </w:pPr>
-      <w:hyperlink w:anchor="_Toc243945714" w:history="1">
+      <w:hyperlink w:anchor="_Toc243948409" w:history="1">
         <w:r>
           <w:rPr>
             <w:rStyle w:val="Hipervnculo"/>
@@ -2128,7 +2128,7 @@
             <w:noProof/>
             <w:webHidden/>
           </w:rPr>
-          <w:instrText xml:space="preserve"> PAGEREF _Toc243945714 \h </w:instrText>
+          <w:instrText xml:space="preserve"> PAGEREF _Toc243948409 \h </w:instrText>
         </w:r>
         <w:r>
           <w:rPr>
@@ -2171,7 +2171,7 @@
           <w14:ligatures w14:val="standardContextual"/>
         </w:rPr>
       </w:pPr>
-      <w:hyperlink w:anchor="_Toc243945715" w:history="1">
+      <w:hyperlink w:anchor="_Toc243948410" w:history="1">
         <w:r>
           <w:rPr>
             <w:rStyle w:val="Hipervnculo"/>
@@ -2198,7 +2198,7 @@
             <w:noProof/>
             <w:webHidden/>
           </w:rPr>
-          <w:instrText xml:space="preserve"> PAGEREF _Toc243945715 \h </w:instrText>
+          <w:instrText xml:space="preserve"> PAGEREF _Toc243948410 \h </w:instrText>
         </w:r>
         <w:r>
           <w:rPr>
@@ -2244,7 +2244,7 @@
           <w14:ligatures w14:val="standardContextual"/>
         </w:rPr>
       </w:pPr>
-      <w:hyperlink w:anchor="_Toc243945716" w:history="1">
+      <w:hyperlink w:anchor="_Toc243948411" w:history="1">
         <w:r>
           <w:rPr>
             <w:rStyle w:val="Hipervnculo"/>
@@ -2271,7 +2271,7 @@
             <w:noProof/>
             <w:webHidden/>
           </w:rPr>
-          <w:instrText xml:space="preserve"> PAGEREF _Toc243945716 \h </w:instrText>
+          <w:instrText xml:space="preserve"> PAGEREF _Toc243948411 \h </w:instrText>
         </w:r>
         <w:r>
           <w:rPr>
@@ -2314,7 +2314,7 @@
           <w14:ligatures w14:val="standardContextual"/>
         </w:rPr>
       </w:pPr>
-      <w:hyperlink w:anchor="_Toc243945717" w:history="1">
+      <w:hyperlink w:anchor="_Toc243948412" w:history="1">
         <w:r>
           <w:rPr>
             <w:rStyle w:val="Hipervnculo"/>
@@ -2341,7 +2341,7 @@
             <w:noProof/>
             <w:webHidden/>
           </w:rPr>
-          <w:instrText xml:space="preserve"> PAGEREF _Toc243945717 \h </w:instrText>
+          <w:instrText xml:space="preserve"> PAGEREF _Toc243948412 \h </w:instrText>
         </w:r>
         <w:r>
           <w:rPr>
@@ -2384,7 +2384,7 @@
           <w14:ligatures w14:val="standardContextual"/>
         </w:rPr>
       </w:pPr>
-      <w:hyperlink w:anchor="_Toc243945718" w:history="1">
+      <w:hyperlink w:anchor="_Toc243948413" w:history="1">
         <w:r>
           <w:rPr>
             <w:rStyle w:val="Hipervnculo"/>
@@ -2411,7 +2411,7 @@
             <w:noProof/>
             <w:webHidden/>
           </w:rPr>
-          <w:instrText xml:space="preserve"> PAGEREF _Toc243945718 \h </w:instrText>
+          <w:instrText xml:space="preserve"> PAGEREF _Toc243948413 \h </w:instrText>
         </w:r>
         <w:r>
           <w:rPr>
@@ -2454,7 +2454,7 @@
           <w14:ligatures w14:val="standardContextual"/>
         </w:rPr>
       </w:pPr>
-      <w:hyperlink w:anchor="_Toc243945719" w:history="1">
+      <w:hyperlink w:anchor="_Toc243948414" w:history="1">
         <w:r>
           <w:rPr>
             <w:rStyle w:val="Hipervnculo"/>
@@ -2481,7 +2481,7 @@
             <w:noProof/>
             <w:webHidden/>
           </w:rPr>
-          <w:instrText xml:space="preserve"> PAGEREF _Toc243945719 \h </w:instrText>
+          <w:instrText xml:space="preserve"> PAGEREF _Toc243948414 \h </w:instrText>
         </w:r>
         <w:r>
           <w:rPr>
@@ -2524,7 +2524,7 @@
           <w14:ligatures w14:val="standardContextual"/>
         </w:rPr>
       </w:pPr>
-      <w:hyperlink w:anchor="_Toc243945720" w:history="1">
+      <w:hyperlink w:anchor="_Toc243948415" w:history="1">
         <w:r>
           <w:rPr>
             <w:rStyle w:val="Hipervnculo"/>
@@ -2551,7 +2551,7 @@
             <w:noProof/>
             <w:webHidden/>
           </w:rPr>
-          <w:instrText xml:space="preserve"> PAGEREF _Toc243945720 \h </w:instrText>
+          <w:instrText xml:space="preserve"> PAGEREF _Toc243948415 \h </w:instrText>
         </w:r>
         <w:r>
           <w:rPr>
@@ -2594,7 +2594,7 @@
           <w14:ligatures w14:val="standardContextual"/>
         </w:rPr>
       </w:pPr>
-      <w:hyperlink w:anchor="_Toc243945721" w:history="1">
+      <w:hyperlink w:anchor="_Toc243948416" w:history="1">
         <w:r>
           <w:rPr>
             <w:rStyle w:val="Hipervnculo"/>
@@ -2621,7 +2621,7 @@
             <w:noProof/>
             <w:webHidden/>
           </w:rPr>
-          <w:instrText xml:space="preserve"> PAGEREF _Toc243945721 \h </w:instrText>
+          <w:instrText xml:space="preserve"> PAGEREF _Toc243948416 \h </w:instrText>
         </w:r>
         <w:r>
           <w:rPr>
@@ -2667,7 +2667,7 @@
           <w14:ligatures w14:val="standardContextual"/>
         </w:rPr>
       </w:pPr>
-      <w:hyperlink w:anchor="_Toc243945722" w:history="1">
+      <w:hyperlink w:anchor="_Toc243948417" w:history="1">
         <w:r>
           <w:rPr>
             <w:rStyle w:val="Hipervnculo"/>
@@ -2694,7 +2694,7 @@
             <w:noProof/>
             <w:webHidden/>
           </w:rPr>
-          <w:instrText xml:space="preserve"> PAGEREF _Toc243945722 \h </w:instrText>
+          <w:instrText xml:space="preserve"> PAGEREF _Toc243948417 \h </w:instrText>
         </w:r>
         <w:r>
           <w:rPr>
@@ -2737,7 +2737,7 @@
           <w14:ligatures w14:val="standardContextual"/>
         </w:rPr>
       </w:pPr>
-      <w:hyperlink w:anchor="_Toc243945723" w:history="1">
+      <w:hyperlink w:anchor="_Toc243948418" w:history="1">
         <w:r>
           <w:rPr>
             <w:rStyle w:val="Hipervnculo"/>
@@ -2764,7 +2764,7 @@
             <w:noProof/>
             <w:webHidden/>
           </w:rPr>
-          <w:instrText xml:space="preserve"> PAGEREF _Toc243945723 \h </w:instrText>
+          <w:instrText xml:space="preserve"> PAGEREF _Toc243948418 \h </w:instrText>
         </w:r>
         <w:r>
           <w:rPr>
@@ -2807,7 +2807,7 @@
           <w14:ligatures w14:val="standardContextual"/>
         </w:rPr>
       </w:pPr>
-      <w:hyperlink w:anchor="_Toc243945724" w:history="1">
+      <w:hyperlink w:anchor="_Toc243948419" w:history="1">
         <w:r>
           <w:rPr>
             <w:rStyle w:val="Hipervnculo"/>
@@ -2834,7 +2834,7 @@
             <w:noProof/>
             <w:webHidden/>
           </w:rPr>
-          <w:instrText xml:space="preserve"> PAGEREF _Toc243945724 \h </w:instrText>
+          <w:instrText xml:space="preserve"> PAGEREF _Toc243948419 \h </w:instrText>
         </w:r>
         <w:r>
           <w:rPr>
@@ -2877,7 +2877,7 @@
           <w14:ligatures w14:val="standardContextual"/>
         </w:rPr>
       </w:pPr>
-      <w:hyperlink w:anchor="_Toc243945725" w:history="1">
+      <w:hyperlink w:anchor="_Toc243948420" w:history="1">
         <w:r>
           <w:rPr>
             <w:rStyle w:val="Hipervnculo"/>
@@ -2904,7 +2904,7 @@
             <w:noProof/>
             <w:webHidden/>
           </w:rPr>
-          <w:instrText xml:space="preserve"> PAGEREF _Toc243945725 \h </w:instrText>
+          <w:instrText xml:space="preserve"> PAGEREF _Toc243948420 \h </w:instrText>
         </w:r>
         <w:r>
           <w:rPr>
@@ -2947,7 +2947,7 @@
           <w14:ligatures w14:val="standardContextual"/>
         </w:rPr>
       </w:pPr>
-      <w:hyperlink w:anchor="_Toc243945726" w:history="1">
+      <w:hyperlink w:anchor="_Toc243948421" w:history="1">
         <w:r>
           <w:rPr>
             <w:rStyle w:val="Hipervnculo"/>
@@ -2974,7 +2974,7 @@
             <w:noProof/>
             <w:webHidden/>
           </w:rPr>
-          <w:instrText xml:space="preserve"> PAGEREF _Toc243945726 \h </w:instrText>
+          <w:instrText xml:space="preserve"> PAGEREF _Toc243948421 \h </w:instrText>
         </w:r>
         <w:r>
           <w:rPr>
@@ -3017,7 +3017,7 @@
           <w14:ligatures w14:val="standardContextual"/>
         </w:rPr>
       </w:pPr>
-      <w:hyperlink w:anchor="_Toc243945727" w:history="1">
+      <w:hyperlink w:anchor="_Toc243948422" w:history="1">
         <w:r>
           <w:rPr>
             <w:rStyle w:val="Hipervnculo"/>
@@ -3044,7 +3044,7 @@
             <w:noProof/>
             <w:webHidden/>
           </w:rPr>
-          <w:instrText xml:space="preserve"> PAGEREF _Toc243945727 \h </w:instrText>
+          <w:instrText xml:space="preserve"> PAGEREF _Toc243948422 \h </w:instrText>
         </w:r>
         <w:r>
           <w:rPr>
@@ -3087,7 +3087,7 @@
           <w14:ligatures w14:val="standardContextual"/>
         </w:rPr>
       </w:pPr>
-      <w:hyperlink w:anchor="_Toc243945728" w:history="1">
+      <w:hyperlink w:anchor="_Toc243948423" w:history="1">
         <w:r>
           <w:rPr>
             <w:rStyle w:val="Hipervnculo"/>
@@ -3114,7 +3114,7 @@
             <w:noProof/>
             <w:webHidden/>
           </w:rPr>
-          <w:instrText xml:space="preserve"> PAGEREF _Toc243945728 \h </w:instrText>
+          <w:instrText xml:space="preserve"> PAGEREF _Toc243948423 \h </w:instrText>
         </w:r>
         <w:r>
           <w:rPr>
@@ -3157,7 +3157,7 @@
           <w14:ligatures w14:val="standardContextual"/>
         </w:rPr>
       </w:pPr>
-      <w:hyperlink w:anchor="_Toc243945729" w:history="1">
+      <w:hyperlink w:anchor="_Toc243948424" w:history="1">
         <w:r>
           <w:rPr>
             <w:rStyle w:val="Hipervnculo"/>
@@ -3184,7 +3184,7 @@
             <w:noProof/>
             <w:webHidden/>
           </w:rPr>
-          <w:instrText xml:space="preserve"> PAGEREF _Toc243945729 \h </w:instrText>
+          <w:instrText xml:space="preserve"> PAGEREF _Toc243948424 \h </w:instrText>
         </w:r>
         <w:r>
           <w:rPr>
@@ -3227,7 +3227,7 @@
           <w14:ligatures w14:val="standardContextual"/>
         </w:rPr>
       </w:pPr>
-      <w:hyperlink w:anchor="_Toc243945730" w:history="1">
+      <w:hyperlink w:anchor="_Toc243948425" w:history="1">
         <w:r>
           <w:rPr>
             <w:rStyle w:val="Hipervnculo"/>
@@ -3254,7 +3254,7 @@
             <w:noProof/>
             <w:webHidden/>
           </w:rPr>
-          <w:instrText xml:space="preserve"> PAGEREF _Toc243945730 \h </w:instrText>
+          <w:instrText xml:space="preserve"> PAGEREF _Toc243948425 \h </w:instrText>
         </w:r>
         <w:r>
           <w:rPr>
@@ -3297,7 +3297,7 @@
           <w14:ligatures w14:val="standardContextual"/>
         </w:rPr>
       </w:pPr>
-      <w:hyperlink w:anchor="_Toc243945731" w:history="1">
+      <w:hyperlink w:anchor="_Toc243948426" w:history="1">
         <w:r>
           <w:rPr>
             <w:rStyle w:val="Hipervnculo"/>
@@ -3324,7 +3324,7 @@
             <w:noProof/>
             <w:webHidden/>
           </w:rPr>
-          <w:instrText xml:space="preserve"> PAGEREF _Toc243945731 \h </w:instrText>
+          <w:instrText xml:space="preserve"> PAGEREF _Toc243948426 \h </w:instrText>
         </w:r>
         <w:r>
           <w:rPr>
@@ -3367,7 +3367,7 @@
           <w14:ligatures w14:val="standardContextual"/>
         </w:rPr>
       </w:pPr>
-      <w:hyperlink w:anchor="_Toc243945732" w:history="1">
+      <w:hyperlink w:anchor="_Toc243948427" w:history="1">
         <w:r>
           <w:rPr>
             <w:rStyle w:val="Hipervnculo"/>
@@ -3394,7 +3394,7 @@
             <w:noProof/>
             <w:webHidden/>
           </w:rPr>
-          <w:instrText xml:space="preserve"> PAGEREF _Toc243945732 \h </w:instrText>
+          <w:instrText xml:space="preserve"> PAGEREF _Toc243948427 \h </w:instrText>
         </w:r>
         <w:r>
           <w:rPr>
@@ -3437,7 +3437,7 @@
           <w14:ligatures w14:val="standardContextual"/>
         </w:rPr>
       </w:pPr>
-      <w:hyperlink w:anchor="_Toc243945733" w:history="1">
+      <w:hyperlink w:anchor="_Toc243948428" w:history="1">
         <w:r>
           <w:rPr>
             <w:rStyle w:val="Hipervnculo"/>
@@ -3464,7 +3464,7 @@
             <w:noProof/>
             <w:webHidden/>
           </w:rPr>
-          <w:instrText xml:space="preserve"> PAGEREF _Toc243945733 \h </w:instrText>
+          <w:instrText xml:space="preserve"> PAGEREF _Toc243948428 \h </w:instrText>
         </w:r>
         <w:r>
           <w:rPr>
@@ -3507,7 +3507,7 @@
           <w14:ligatures w14:val="standardContextual"/>
         </w:rPr>
       </w:pPr>
-      <w:hyperlink w:anchor="_Toc243945734" w:history="1">
+      <w:hyperlink w:anchor="_Toc243948429" w:history="1">
         <w:r>
           <w:rPr>
             <w:rStyle w:val="Hipervnculo"/>
@@ -3534,7 +3534,7 @@
             <w:noProof/>
             <w:webHidden/>
           </w:rPr>
-          <w:instrText xml:space="preserve"> PAGEREF _Toc243945734 \h </w:instrText>
+          <w:instrText xml:space="preserve"> PAGEREF _Toc243948429 \h </w:instrText>
         </w:r>
         <w:r>
           <w:rPr>
@@ -3580,7 +3580,7 @@
           <w14:ligatures w14:val="standardContextual"/>
         </w:rPr>
       </w:pPr>
-      <w:hyperlink w:anchor="_Toc243945735" w:history="1">
+      <w:hyperlink w:anchor="_Toc243948430" w:history="1">
         <w:r>
           <w:rPr>
             <w:rStyle w:val="Hipervnculo"/>
@@ -3607,7 +3607,7 @@
             <w:noProof/>
             <w:webHidden/>
           </w:rPr>
-          <w:instrText xml:space="preserve"> PAGEREF _Toc243945735 \h </w:instrText>
+          <w:instrText xml:space="preserve"> PAGEREF _Toc243948430 \h </w:instrText>
         </w:r>
         <w:r>
           <w:rPr>
@@ -3650,7 +3650,7 @@
           <w14:ligatures w14:val="standardContextual"/>
         </w:rPr>
       </w:pPr>
-      <w:hyperlink w:anchor="_Toc243945736" w:history="1">
+      <w:hyperlink w:anchor="_Toc243948431" w:history="1">
         <w:r>
           <w:rPr>
             <w:rStyle w:val="Hipervnculo"/>
@@ -3677,7 +3677,7 @@
             <w:noProof/>
             <w:webHidden/>
           </w:rPr>
-          <w:instrText xml:space="preserve"> PAGEREF _Toc243945736 \h </w:instrText>
+          <w:instrText xml:space="preserve"> PAGEREF _Toc243948431 \h </w:instrText>
         </w:r>
         <w:r>
           <w:rPr>
@@ -3720,7 +3720,7 @@
           <w14:ligatures w14:val="standardContextual"/>
         </w:rPr>
       </w:pPr>
-      <w:hyperlink w:anchor="_Toc243945737" w:history="1">
+      <w:hyperlink w:anchor="_Toc243948432" w:history="1">
         <w:r>
           <w:rPr>
             <w:rStyle w:val="Hipervnculo"/>
@@ -3747,7 +3747,7 @@
             <w:noProof/>
             <w:webHidden/>
           </w:rPr>
-          <w:instrText xml:space="preserve"> PAGEREF _Toc243945737 \h </w:instrText>
+          <w:instrText xml:space="preserve"> PAGEREF _Toc243948432 \h </w:instrText>
         </w:r>
         <w:r>
           <w:rPr>
@@ -3790,7 +3790,7 @@
           <w14:ligatures w14:val="standardContextual"/>
         </w:rPr>
       </w:pPr>
-      <w:hyperlink w:anchor="_Toc243945738" w:history="1">
+      <w:hyperlink w:anchor="_Toc243948433" w:history="1">
         <w:r>
           <w:rPr>
             <w:rStyle w:val="Hipervnculo"/>
@@ -3817,7 +3817,7 @@
             <w:noProof/>
             <w:webHidden/>
           </w:rPr>
-          <w:instrText xml:space="preserve"> PAGEREF _Toc243945738 \h </w:instrText>
+          <w:instrText xml:space="preserve"> PAGEREF _Toc243948433 \h </w:instrText>
         </w:r>
         <w:r>
           <w:rPr>
@@ -3860,7 +3860,7 @@
           <w14:ligatures w14:val="standardContextual"/>
         </w:rPr>
       </w:pPr>
-      <w:hyperlink w:anchor="_Toc243945739" w:history="1">
+      <w:hyperlink w:anchor="_Toc243948434" w:history="1">
         <w:r>
           <w:rPr>
             <w:rStyle w:val="Hipervnculo"/>
@@ -3887,7 +3887,7 @@
             <w:noProof/>
             <w:webHidden/>
           </w:rPr>
-          <w:instrText xml:space="preserve"> PAGEREF _Toc243945739 \h </w:instrText>
+          <w:instrText xml:space="preserve"> PAGEREF _Toc243948434 \h </w:instrText>
         </w:r>
         <w:r>
           <w:rPr>
@@ -3930,7 +3930,7 @@
           <w14:ligatures w14:val="standardContextual"/>
         </w:rPr>
       </w:pPr>
-      <w:hyperlink w:anchor="_Toc243945740" w:history="1">
+      <w:hyperlink w:anchor="_Toc243948435" w:history="1">
         <w:r>
           <w:rPr>
             <w:rStyle w:val="Hipervnculo"/>
@@ -3957,7 +3957,7 @@
             <w:noProof/>
             <w:webHidden/>
           </w:rPr>
-          <w:instrText xml:space="preserve"> PAGEREF _Toc243945740 \h </w:instrText>
+          <w:instrText xml:space="preserve"> PAGEREF _Toc243948435 \h </w:instrText>
         </w:r>
         <w:r>
           <w:rPr>
@@ -4000,7 +4000,7 @@
           <w14:ligatures w14:val="standardContextual"/>
         </w:rPr>
       </w:pPr>
-      <w:hyperlink w:anchor="_Toc243945741" w:history="1">
+      <w:hyperlink w:anchor="_Toc243948436" w:history="1">
         <w:r>
           <w:rPr>
             <w:rStyle w:val="Hipervnculo"/>
@@ -4027,7 +4027,7 @@
             <w:noProof/>
             <w:webHidden/>
           </w:rPr>
-          <w:instrText xml:space="preserve"> PAGEREF _Toc243945741 \h </w:instrText>
+          <w:instrText xml:space="preserve"> PAGEREF _Toc243948436 \h </w:instrText>
         </w:r>
         <w:r>
           <w:rPr>
@@ -4073,7 +4073,7 @@
           <w14:ligatures w14:val="standardContextual"/>
         </w:rPr>
       </w:pPr>
-      <w:hyperlink w:anchor="_Toc243945742" w:history="1">
+      <w:hyperlink w:anchor="_Toc243948437" w:history="1">
         <w:r>
           <w:rPr>
             <w:rStyle w:val="Hipervnculo"/>
@@ -4100,7 +4100,7 @@
             <w:noProof/>
             <w:webHidden/>
           </w:rPr>
-          <w:instrText xml:space="preserve"> PAGEREF _Toc243945742 \h </w:instrText>
+          <w:instrText xml:space="preserve"> PAGEREF _Toc243948437 \h </w:instrText>
         </w:r>
         <w:r>
           <w:rPr>
@@ -4143,7 +4143,7 @@
           <w14:ligatures w14:val="standardContextual"/>
         </w:rPr>
       </w:pPr>
-      <w:hyperlink w:anchor="_Toc243945743" w:history="1">
+      <w:hyperlink w:anchor="_Toc243948438" w:history="1">
         <w:r>
           <w:rPr>
             <w:rStyle w:val="Hipervnculo"/>
@@ -4170,7 +4170,7 @@
             <w:noProof/>
             <w:webHidden/>
           </w:rPr>
-          <w:instrText xml:space="preserve"> PAGEREF _Toc243945743 \h </w:instrText>
+          <w:instrText xml:space="preserve"> PAGEREF _Toc243948438 \h </w:instrText>
         </w:r>
         <w:r>
           <w:rPr>
@@ -4213,7 +4213,7 @@
           <w14:ligatures w14:val="standardContextual"/>
         </w:rPr>
       </w:pPr>
-      <w:hyperlink w:anchor="_Toc243945744" w:history="1">
+      <w:hyperlink w:anchor="_Toc243948439" w:history="1">
         <w:r>
           <w:rPr>
             <w:rStyle w:val="Hipervnculo"/>
@@ -4240,7 +4240,7 @@
             <w:noProof/>
             <w:webHidden/>
           </w:rPr>
-          <w:instrText xml:space="preserve"> PAGEREF _Toc243945744 \h </w:instrText>
+          <w:instrText xml:space="preserve"> PAGEREF _Toc243948439 \h </w:instrText>
         </w:r>
         <w:r>
           <w:rPr>
@@ -4283,7 +4283,7 @@
           <w14:ligatures w14:val="standardContextual"/>
         </w:rPr>
       </w:pPr>
-      <w:hyperlink w:anchor="_Toc243945745" w:history="1">
+      <w:hyperlink w:anchor="_Toc243948440" w:history="1">
         <w:r>
           <w:rPr>
             <w:rStyle w:val="Hipervnculo"/>
@@ -4310,7 +4310,7 @@
             <w:noProof/>
             <w:webHidden/>
           </w:rPr>
-          <w:instrText xml:space="preserve"> PAGEREF _Toc243945745 \h </w:instrText>
+          <w:instrText xml:space="preserve"> PAGEREF _Toc243948440 \h </w:instrText>
         </w:r>
         <w:r>
           <w:rPr>
@@ -4353,7 +4353,7 @@
           <w14:ligatures w14:val="standardContextual"/>
         </w:rPr>
       </w:pPr>
-      <w:hyperlink w:anchor="_Toc243945746" w:history="1">
+      <w:hyperlink w:anchor="_Toc243948441" w:history="1">
         <w:r>
           <w:rPr>
             <w:rStyle w:val="Hipervnculo"/>
@@ -4380,7 +4380,7 @@
             <w:noProof/>
             <w:webHidden/>
           </w:rPr>
-          <w:instrText xml:space="preserve"> PAGEREF _Toc243945746 \h </w:instrText>
+          <w:instrText xml:space="preserve"> PAGEREF _Toc243948441 \h </w:instrText>
         </w:r>
         <w:r>
           <w:rPr>
@@ -4423,7 +4423,7 @@
           <w14:ligatures w14:val="standardContextual"/>
         </w:rPr>
       </w:pPr>
-      <w:hyperlink w:anchor="_Toc243945747" w:history="1">
+      <w:hyperlink w:anchor="_Toc243948442" w:history="1">
         <w:r>
           <w:rPr>
             <w:rStyle w:val="Hipervnculo"/>
@@ -4450,7 +4450,7 @@
             <w:noProof/>
             <w:webHidden/>
           </w:rPr>
-          <w:instrText xml:space="preserve"> PAGEREF _Toc243945747 \h </w:instrText>
+          <w:instrText xml:space="preserve"> PAGEREF _Toc243948442 \h </w:instrText>
         </w:r>
         <w:r>
           <w:rPr>
@@ -4493,7 +4493,7 @@
           <w14:ligatures w14:val="standardContextual"/>
         </w:rPr>
       </w:pPr>
-      <w:hyperlink w:anchor="_Toc243945748" w:history="1">
+      <w:hyperlink w:anchor="_Toc243948443" w:history="1">
         <w:r>
           <w:rPr>
             <w:rStyle w:val="Hipervnculo"/>
@@ -4520,7 +4520,7 @@
             <w:noProof/>
             <w:webHidden/>
           </w:rPr>
-          <w:instrText xml:space="preserve"> PAGEREF _Toc243945748 \h </w:instrText>
+          <w:instrText xml:space="preserve"> PAGEREF _Toc243948443 \h </w:instrText>
         </w:r>
         <w:r>
           <w:rPr>
@@ -4563,7 +4563,7 @@
           <w14:ligatures w14:val="standardContextual"/>
         </w:rPr>
       </w:pPr>
-      <w:hyperlink w:anchor="_Toc243945749" w:history="1">
+      <w:hyperlink w:anchor="_Toc243948444" w:history="1">
         <w:r>
           <w:rPr>
             <w:rStyle w:val="Hipervnculo"/>
@@ -4590,7 +4590,7 @@
             <w:noProof/>
             <w:webHidden/>
           </w:rPr>
-          <w:instrText xml:space="preserve"> PAGEREF _Toc243945749 \h </w:instrText>
+          <w:instrText xml:space="preserve"> PAGEREF _Toc243948444 \h </w:instrText>
         </w:r>
         <w:r>
           <w:rPr>
@@ -4633,7 +4633,7 @@
           <w14:ligatures w14:val="standardContextual"/>
         </w:rPr>
       </w:pPr>
-      <w:hyperlink w:anchor="_Toc243945750" w:history="1">
+      <w:hyperlink w:anchor="_Toc243948445" w:history="1">
         <w:r>
           <w:rPr>
             <w:rStyle w:val="Hipervnculo"/>
@@ -4660,7 +4660,7 @@
             <w:noProof/>
             <w:webHidden/>
           </w:rPr>
-          <w:instrText xml:space="preserve"> PAGEREF _Toc243945750 \h </w:instrText>
+          <w:instrText xml:space="preserve"> PAGEREF _Toc243948445 \h </w:instrText>
         </w:r>
         <w:r>
           <w:rPr>
@@ -4703,7 +4703,7 @@
           <w14:ligatures w14:val="standardContextual"/>
         </w:rPr>
       </w:pPr>
-      <w:hyperlink w:anchor="_Toc243945751" w:history="1">
+      <w:hyperlink w:anchor="_Toc243948446" w:history="1">
         <w:r>
           <w:rPr>
             <w:rStyle w:val="Hipervnculo"/>
@@ -4730,7 +4730,7 @@
             <w:noProof/>
             <w:webHidden/>
           </w:rPr>
-          <w:instrText xml:space="preserve"> PAGEREF _Toc243945751 \h </w:instrText>
+          <w:instrText xml:space="preserve"> PAGEREF _Toc243948446 \h </w:instrText>
         </w:r>
         <w:r>
           <w:rPr>
@@ -4773,7 +4773,7 @@
           <w14:ligatures w14:val="standardContextual"/>
         </w:rPr>
       </w:pPr>
-      <w:hyperlink w:anchor="_Toc243945752" w:history="1">
+      <w:hyperlink w:anchor="_Toc243948447" w:history="1">
         <w:r>
           <w:rPr>
             <w:rStyle w:val="Hipervnculo"/>
@@ -4800,7 +4800,7 @@
             <w:noProof/>
             <w:webHidden/>
           </w:rPr>
-          <w:instrText xml:space="preserve"> PAGEREF _Toc243945752 \h </w:instrText>
+          <w:instrText xml:space="preserve"> PAGEREF _Toc243948447 \h </w:instrText>
         </w:r>
         <w:r>
           <w:rPr>
@@ -4843,7 +4843,7 @@
           <w14:ligatures w14:val="standardContextual"/>
         </w:rPr>
       </w:pPr>
-      <w:hyperlink w:anchor="_Toc243945753" w:history="1">
+      <w:hyperlink w:anchor="_Toc243948448" w:history="1">
         <w:r>
           <w:rPr>
             <w:rStyle w:val="Hipervnculo"/>
@@ -4870,7 +4870,7 @@
             <w:noProof/>
             <w:webHidden/>
           </w:rPr>
-          <w:instrText xml:space="preserve"> PAGEREF _Toc243945753 \h </w:instrText>
+          <w:instrText xml:space="preserve"> PAGEREF _Toc243948448 \h </w:instrText>
         </w:r>
         <w:r>
           <w:rPr>
@@ -4913,7 +4913,7 @@
           <w14:ligatures w14:val="standardContextual"/>
         </w:rPr>
       </w:pPr>
-      <w:hyperlink w:anchor="_Toc243945754" w:history="1">
+      <w:hyperlink w:anchor="_Toc243948449" w:history="1">
         <w:r>
           <w:rPr>
             <w:rStyle w:val="Hipervnculo"/>
@@ -4940,7 +4940,7 @@
             <w:noProof/>
             <w:webHidden/>
           </w:rPr>
-          <w:instrText xml:space="preserve"> PAGEREF _Toc243945754 \h </w:instrText>
+          <w:instrText xml:space="preserve"> PAGEREF _Toc243948449 \h </w:instrText>
         </w:r>
         <w:r>
           <w:rPr>
@@ -4983,7 +4983,7 @@
           <w14:ligatures w14:val="standardContextual"/>
         </w:rPr>
       </w:pPr>
-      <w:hyperlink w:anchor="_Toc243945755" w:history="1">
+      <w:hyperlink w:anchor="_Toc243948450" w:history="1">
         <w:r>
           <w:rPr>
             <w:rStyle w:val="Hipervnculo"/>
@@ -5010,7 +5010,7 @@
             <w:noProof/>
             <w:webHidden/>
           </w:rPr>
-          <w:instrText xml:space="preserve"> PAGEREF _Toc243945755 \h </w:instrText>
+          <w:instrText xml:space="preserve"> PAGEREF _Toc243948450 \h </w:instrText>
         </w:r>
         <w:r>
           <w:rPr>
@@ -5053,7 +5053,7 @@
           <w14:ligatures w14:val="standardContextual"/>
         </w:rPr>
       </w:pPr>
-      <w:hyperlink w:anchor="_Toc243945756" w:history="1">
+      <w:hyperlink w:anchor="_Toc243948451" w:history="1">
         <w:r>
           <w:rPr>
             <w:rStyle w:val="Hipervnculo"/>
@@ -5080,7 +5080,7 @@
             <w:noProof/>
             <w:webHidden/>
           </w:rPr>
-          <w:instrText xml:space="preserve"> PAGEREF _Toc243945756 \h </w:instrText>
+          <w:instrText xml:space="preserve"> PAGEREF _Toc243948451 \h </w:instrText>
         </w:r>
         <w:r>
           <w:rPr>
@@ -5123,7 +5123,7 @@
           <w14:ligatures w14:val="standardContextual"/>
         </w:rPr>
       </w:pPr>
-      <w:hyperlink w:anchor="_Toc243945757" w:history="1">
+      <w:hyperlink w:anchor="_Toc243948452" w:history="1">
         <w:r>
           <w:rPr>
             <w:rStyle w:val="Hipervnculo"/>
@@ -5150,7 +5150,7 @@
             <w:noProof/>
             <w:webHidden/>
           </w:rPr>
-          <w:instrText xml:space="preserve"> PAGEREF _Toc243945757 \h </w:instrText>
+          <w:instrText xml:space="preserve"> PAGEREF _Toc243948452 \h </w:instrText>
         </w:r>
         <w:r>
           <w:rPr>
@@ -5193,7 +5193,7 @@
           <w14:ligatures w14:val="standardContextual"/>
         </w:rPr>
       </w:pPr>
-      <w:hyperlink w:anchor="_Toc243945758" w:history="1">
+      <w:hyperlink w:anchor="_Toc243948453" w:history="1">
         <w:r>
           <w:rPr>
             <w:rStyle w:val="Hipervnculo"/>
@@ -5220,7 +5220,7 @@
             <w:noProof/>
             <w:webHidden/>
           </w:rPr>
-          <w:instrText xml:space="preserve"> PAGEREF _Toc243945758 \h </w:instrText>
+          <w:instrText xml:space="preserve"> PAGEREF _Toc243948453 \h </w:instrText>
         </w:r>
         <w:r>
           <w:rPr>
@@ -5263,7 +5263,7 @@
           <w14:ligatures w14:val="standardContextual"/>
         </w:rPr>
       </w:pPr>
-      <w:hyperlink w:anchor="_Toc243945759" w:history="1">
+      <w:hyperlink w:anchor="_Toc243948454" w:history="1">
         <w:r>
           <w:rPr>
             <w:rStyle w:val="Hipervnculo"/>
@@ -5290,7 +5290,7 @@
             <w:noProof/>
             <w:webHidden/>
           </w:rPr>
-          <w:instrText xml:space="preserve"> PAGEREF _Toc243945759 \h </w:instrText>
+          <w:instrText xml:space="preserve"> PAGEREF _Toc243948454 \h </w:instrText>
         </w:r>
         <w:r>
           <w:rPr>
@@ -5333,7 +5333,7 @@
           <w14:ligatures w14:val="standardContextual"/>
         </w:rPr>
       </w:pPr>
-      <w:hyperlink w:anchor="_Toc243945760" w:history="1">
+      <w:hyperlink w:anchor="_Toc243948455" w:history="1">
         <w:r>
           <w:rPr>
             <w:rStyle w:val="Hipervnculo"/>
@@ -5360,7 +5360,7 @@
             <w:noProof/>
             <w:webHidden/>
           </w:rPr>
-          <w:instrText xml:space="preserve"> PAGEREF _Toc243945760 \h </w:instrText>
+          <w:instrText xml:space="preserve"> PAGEREF _Toc243948455 \h </w:instrText>
         </w:r>
         <w:r>
           <w:rPr>
@@ -5403,7 +5403,7 @@
           <w14:ligatures w14:val="standardContextual"/>
         </w:rPr>
       </w:pPr>
-      <w:hyperlink w:anchor="_Toc243945761" w:history="1">
+      <w:hyperlink w:anchor="_Toc243948456" w:history="1">
         <w:r>
           <w:rPr>
             <w:rStyle w:val="Hipervnculo"/>
@@ -5430,7 +5430,7 @@
             <w:noProof/>
             <w:webHidden/>
           </w:rPr>
-          <w:instrText xml:space="preserve"> PAGEREF _Toc243945761 \h </w:instrText>
+          <w:instrText xml:space="preserve"> PAGEREF _Toc243948456 \h </w:instrText>
         </w:r>
         <w:r>
           <w:rPr>
@@ -5476,7 +5476,7 @@
           <w14:ligatures w14:val="standardContextual"/>
         </w:rPr>
       </w:pPr>
-      <w:hyperlink w:anchor="_Toc243945762" w:history="1">
+      <w:hyperlink w:anchor="_Toc243948457" w:history="1">
         <w:r>
           <w:rPr>
             <w:rStyle w:val="Hipervnculo"/>
@@ -5503,7 +5503,7 @@
             <w:noProof/>
             <w:webHidden/>
           </w:rPr>
-          <w:instrText xml:space="preserve"> PAGEREF _Toc243945762 \h </w:instrText>
+          <w:instrText xml:space="preserve"> PAGEREF _Toc243948457 \h </w:instrText>
         </w:r>
         <w:r>
           <w:rPr>
@@ -5546,7 +5546,7 @@
           <w14:ligatures w14:val="standardContextual"/>
         </w:rPr>
       </w:pPr>
-      <w:hyperlink w:anchor="_Toc243945763" w:history="1">
+      <w:hyperlink w:anchor="_Toc243948458" w:history="1">
         <w:r>
           <w:rPr>
             <w:rStyle w:val="Hipervnculo"/>
@@ -5573,7 +5573,7 @@
             <w:noProof/>
             <w:webHidden/>
           </w:rPr>
-          <w:instrText xml:space="preserve"> PAGEREF _Toc243945763 \h </w:instrText>
+          <w:instrText xml:space="preserve"> PAGEREF _Toc243948458 \h </w:instrText>
         </w:r>
         <w:r>
           <w:rPr>
@@ -5616,7 +5616,7 @@
           <w14:ligatures w14:val="standardContextual"/>
         </w:rPr>
       </w:pPr>
-      <w:hyperlink w:anchor="_Toc243945764" w:history="1">
+      <w:hyperlink w:anchor="_Toc243948459" w:history="1">
         <w:r>
           <w:rPr>
             <w:rStyle w:val="Hipervnculo"/>
@@ -5643,7 +5643,7 @@
             <w:noProof/>
             <w:webHidden/>
           </w:rPr>
-          <w:instrText xml:space="preserve"> PAGEREF _Toc243945764 \h </w:instrText>
+          <w:instrText xml:space="preserve"> PAGEREF _Toc243948459 \h </w:instrText>
         </w:r>
         <w:r>
           <w:rPr>
@@ -5686,7 +5686,7 @@
           <w14:ligatures w14:val="standardContextual"/>
         </w:rPr>
       </w:pPr>
-      <w:hyperlink w:anchor="_Toc243945765" w:history="1">
+      <w:hyperlink w:anchor="_Toc243948460" w:history="1">
         <w:r>
           <w:rPr>
             <w:rStyle w:val="Hipervnculo"/>
@@ -5713,7 +5713,7 @@
             <w:noProof/>
             <w:webHidden/>
           </w:rPr>
-          <w:instrText xml:space="preserve"> PAGEREF _Toc243945765 \h </w:instrText>
+          <w:instrText xml:space="preserve"> PAGEREF _Toc243948460 \h </w:instrText>
         </w:r>
         <w:r>
           <w:rPr>
@@ -5756,7 +5756,7 @@
           <w14:ligatures w14:val="standardContextual"/>
         </w:rPr>
       </w:pPr>
-      <w:hyperlink w:anchor="_Toc243945766" w:history="1">
+      <w:hyperlink w:anchor="_Toc243948461" w:history="1">
         <w:r>
           <w:rPr>
             <w:rStyle w:val="Hipervnculo"/>
@@ -5783,7 +5783,7 @@
             <w:noProof/>
             <w:webHidden/>
           </w:rPr>
-          <w:instrText xml:space="preserve"> PAGEREF _Toc243945766 \h </w:instrText>
+          <w:instrText xml:space="preserve"> PAGEREF _Toc243948461 \h </w:instrText>
         </w:r>
         <w:r>
           <w:rPr>
@@ -5826,7 +5826,7 @@
           <w14:ligatures w14:val="standardContextual"/>
         </w:rPr>
       </w:pPr>
-      <w:hyperlink w:anchor="_Toc243945767" w:history="1">
+      <w:hyperlink w:anchor="_Toc243948462" w:history="1">
         <w:r>
           <w:rPr>
             <w:rStyle w:val="Hipervnculo"/>
@@ -5853,7 +5853,7 @@
             <w:noProof/>
             <w:webHidden/>
           </w:rPr>
-          <w:instrText xml:space="preserve"> PAGEREF _Toc243945767 \h </w:instrText>
+          <w:instrText xml:space="preserve"> PAGEREF _Toc243948462 \h </w:instrText>
         </w:r>
         <w:r>
           <w:rPr>
@@ -5896,7 +5896,7 @@
           <w14:ligatures w14:val="standardContextual"/>
         </w:rPr>
       </w:pPr>
-      <w:hyperlink w:anchor="_Toc243945768" w:history="1">
+      <w:hyperlink w:anchor="_Toc243948463" w:history="1">
         <w:r>
           <w:rPr>
             <w:rStyle w:val="Hipervnculo"/>
@@ -5923,7 +5923,7 @@
             <w:noProof/>
             <w:webHidden/>
           </w:rPr>
-          <w:instrText xml:space="preserve"> PAGEREF _Toc243945768 \h </w:instrText>
+          <w:instrText xml:space="preserve"> PAGEREF _Toc243948463 \h </w:instrText>
         </w:r>
         <w:r>
           <w:rPr>
@@ -5966,7 +5966,7 @@
           <w14:ligatures w14:val="standardContextual"/>
         </w:rPr>
       </w:pPr>
-      <w:hyperlink w:anchor="_Toc243945769" w:history="1">
+      <w:hyperlink w:anchor="_Toc243948464" w:history="1">
         <w:r>
           <w:rPr>
             <w:rStyle w:val="Hipervnculo"/>
@@ -5993,7 +5993,7 @@
             <w:noProof/>
             <w:webHidden/>
           </w:rPr>
-          <w:instrText xml:space="preserve"> PAGEREF _Toc243945769 \h </w:instrText>
+          <w:instrText xml:space="preserve"> PAGEREF _Toc243948464 \h </w:instrText>
         </w:r>
         <w:r>
           <w:rPr>
@@ -6036,7 +6036,7 @@
           <w14:ligatures w14:val="standardContextual"/>
         </w:rPr>
       </w:pPr>
-      <w:hyperlink w:anchor="_Toc243945770" w:history="1">
+      <w:hyperlink w:anchor="_Toc243948465" w:history="1">
         <w:r>
           <w:rPr>
             <w:rStyle w:val="Hipervnculo"/>
@@ -6063,7 +6063,7 @@
             <w:noProof/>
             <w:webHidden/>
           </w:rPr>
-          <w:instrText xml:space="preserve"> PAGEREF _Toc243945770 \h </w:instrText>
+          <w:instrText xml:space="preserve"> PAGEREF _Toc243948465 \h </w:instrText>
         </w:r>
         <w:r>
           <w:rPr>
@@ -6106,7 +6106,7 @@
           <w14:ligatures w14:val="standardContextual"/>
         </w:rPr>
       </w:pPr>
-      <w:hyperlink w:anchor="_Toc243945771" w:history="1">
+      <w:hyperlink w:anchor="_Toc243948466" w:history="1">
         <w:r>
           <w:rPr>
             <w:rStyle w:val="Hipervnculo"/>
@@ -6133,7 +6133,7 @@
             <w:noProof/>
             <w:webHidden/>
           </w:rPr>
-          <w:instrText xml:space="preserve"> PAGEREF _Toc243945771 \h </w:instrText>
+          <w:instrText xml:space="preserve"> PAGEREF _Toc243948466 \h </w:instrText>
         </w:r>
         <w:r>
           <w:rPr>
@@ -6176,7 +6176,7 @@
           <w14:ligatures w14:val="standardContextual"/>
         </w:rPr>
       </w:pPr>
-      <w:hyperlink w:anchor="_Toc243945772" w:history="1">
+      <w:hyperlink w:anchor="_Toc243948467" w:history="1">
         <w:r>
           <w:rPr>
             <w:rStyle w:val="Hipervnculo"/>
@@ -6203,7 +6203,7 @@
             <w:noProof/>
             <w:webHidden/>
           </w:rPr>
-          <w:instrText xml:space="preserve"> PAGEREF _Toc243945772 \h </w:instrText>
+          <w:instrText xml:space="preserve"> PAGEREF _Toc243948467 \h </w:instrText>
         </w:r>
         <w:r>
           <w:rPr>
@@ -6246,7 +6246,7 @@
           <w14:ligatures w14:val="standardContextual"/>
         </w:rPr>
       </w:pPr>
-      <w:hyperlink w:anchor="_Toc243945773" w:history="1">
+      <w:hyperlink w:anchor="_Toc243948468" w:history="1">
         <w:r>
           <w:rPr>
             <w:rStyle w:val="Hipervnculo"/>
@@ -6273,7 +6273,7 @@
             <w:noProof/>
             <w:webHidden/>
           </w:rPr>
-          <w:instrText xml:space="preserve"> PAGEREF _Toc243945773 \h </w:instrText>
+          <w:instrText xml:space="preserve"> PAGEREF _Toc243948468 \h </w:instrText>
         </w:r>
         <w:r>
           <w:rPr>
@@ -6316,7 +6316,7 @@
           <w14:ligatures w14:val="standardContextual"/>
         </w:rPr>
       </w:pPr>
-      <w:hyperlink w:anchor="_Toc243945774" w:history="1">
+      <w:hyperlink w:anchor="_Toc243948469" w:history="1">
         <w:r>
           <w:rPr>
             <w:rStyle w:val="Hipervnculo"/>
@@ -6343,7 +6343,7 @@
             <w:noProof/>
             <w:webHidden/>
           </w:rPr>
-          <w:instrText xml:space="preserve"> PAGEREF _Toc243945774 \h </w:instrText>
+          <w:instrText xml:space="preserve"> PAGEREF _Toc243948469 \h </w:instrText>
         </w:r>
         <w:r>
           <w:rPr>
@@ -6386,7 +6386,7 @@
           <w14:ligatures w14:val="standardContextual"/>
         </w:rPr>
       </w:pPr>
-      <w:hyperlink w:anchor="_Toc243945775" w:history="1">
+      <w:hyperlink w:anchor="_Toc243948470" w:history="1">
         <w:r>
           <w:rPr>
             <w:rStyle w:val="Hipervnculo"/>
@@ -6413,7 +6413,7 @@
             <w:noProof/>
             <w:webHidden/>
           </w:rPr>
-          <w:instrText xml:space="preserve"> PAGEREF _Toc243945775 \h </w:instrText>
+          <w:instrText xml:space="preserve"> PAGEREF _Toc243948470 \h </w:instrText>
         </w:r>
         <w:r>
           <w:rPr>
@@ -6456,7 +6456,7 @@
           <w14:ligatures w14:val="standardContextual"/>
         </w:rPr>
       </w:pPr>
-      <w:hyperlink w:anchor="_Toc243945776" w:history="1">
+      <w:hyperlink w:anchor="_Toc243948471" w:history="1">
         <w:r>
           <w:rPr>
             <w:rStyle w:val="Hipervnculo"/>
@@ -6483,7 +6483,7 @@
             <w:noProof/>
             <w:webHidden/>
           </w:rPr>
-          <w:instrText xml:space="preserve"> PAGEREF _Toc243945776 \h </w:instrText>
+          <w:instrText xml:space="preserve"> PAGEREF _Toc243948471 \h </w:instrText>
         </w:r>
         <w:r>
           <w:rPr>
@@ -6529,7 +6529,7 @@
           <w14:ligatures w14:val="standardContextual"/>
         </w:rPr>
       </w:pPr>
-      <w:hyperlink w:anchor="_Toc243945777" w:history="1">
+      <w:hyperlink w:anchor="_Toc243948472" w:history="1">
         <w:r>
           <w:rPr>
             <w:rStyle w:val="Hipervnculo"/>
@@ -6556,7 +6556,7 @@
             <w:noProof/>
             <w:webHidden/>
           </w:rPr>
-          <w:instrText xml:space="preserve"> PAGEREF _Toc243945777 \h </w:instrText>
+          <w:instrText xml:space="preserve"> PAGEREF _Toc243948472 \h </w:instrText>
         </w:r>
         <w:r>
           <w:rPr>
@@ -6599,7 +6599,7 @@
           <w14:ligatures w14:val="standardContextual"/>
         </w:rPr>
       </w:pPr>
-      <w:hyperlink w:anchor="_Toc243945778" w:history="1">
+      <w:hyperlink w:anchor="_Toc243948473" w:history="1">
         <w:r>
           <w:rPr>
             <w:rStyle w:val="Hipervnculo"/>
@@ -6626,7 +6626,7 @@
             <w:noProof/>
             <w:webHidden/>
           </w:rPr>
-          <w:instrText xml:space="preserve"> PAGEREF _Toc243945778 \h </w:instrText>
+          <w:instrText xml:space="preserve"> PAGEREF _Toc243948473 \h </w:instrText>
         </w:r>
         <w:r>
           <w:rPr>
@@ -6669,7 +6669,7 @@
           <w14:ligatures w14:val="standardContextual"/>
         </w:rPr>
       </w:pPr>
-      <w:hyperlink w:anchor="_Toc243945779" w:history="1">
+      <w:hyperlink w:anchor="_Toc243948474" w:history="1">
         <w:r>
           <w:rPr>
             <w:rStyle w:val="Hipervnculo"/>
@@ -6696,7 +6696,7 @@
             <w:noProof/>
             <w:webHidden/>
           </w:rPr>
-          <w:instrText xml:space="preserve"> PAGEREF _Toc243945779 \h </w:instrText>
+          <w:instrText xml:space="preserve"> PAGEREF _Toc243948474 \h </w:instrText>
         </w:r>
         <w:r>
           <w:rPr>
@@ -6739,7 +6739,7 @@
           <w14:ligatures w14:val="standardContextual"/>
         </w:rPr>
       </w:pPr>
-      <w:hyperlink w:anchor="_Toc243945780" w:history="1">
+      <w:hyperlink w:anchor="_Toc243948475" w:history="1">
         <w:r>
           <w:rPr>
             <w:rStyle w:val="Hipervnculo"/>
@@ -6766,7 +6766,7 @@
             <w:noProof/>
             <w:webHidden/>
           </w:rPr>
-          <w:instrText xml:space="preserve"> PAGEREF _Toc243945780 \h </w:instrText>
+          <w:instrText xml:space="preserve"> PAGEREF _Toc243948475 \h </w:instrText>
         </w:r>
         <w:r>
           <w:rPr>
@@ -6809,7 +6809,7 @@
           <w14:ligatures w14:val="standardContextual"/>
         </w:rPr>
       </w:pPr>
-      <w:hyperlink w:anchor="_Toc243945781" w:history="1">
+      <w:hyperlink w:anchor="_Toc243948476" w:history="1">
         <w:r>
           <w:rPr>
             <w:rStyle w:val="Hipervnculo"/>
@@ -6836,7 +6836,7 @@
             <w:noProof/>
             <w:webHidden/>
           </w:rPr>
-          <w:instrText xml:space="preserve"> PAGEREF _Toc243945781 \h </w:instrText>
+          <w:instrText xml:space="preserve"> PAGEREF _Toc243948476 \h </w:instrText>
         </w:r>
         <w:r>
           <w:rPr>
@@ -6879,7 +6879,7 @@
           <w14:ligatures w14:val="standardContextual"/>
         </w:rPr>
       </w:pPr>
-      <w:hyperlink w:anchor="_Toc243945782" w:history="1">
+      <w:hyperlink w:anchor="_Toc243948477" w:history="1">
         <w:r>
           <w:rPr>
             <w:rStyle w:val="Hipervnculo"/>
@@ -6906,7 +6906,7 @@
             <w:noProof/>
             <w:webHidden/>
           </w:rPr>
-          <w:instrText xml:space="preserve"> PAGEREF _Toc243945782 \h </w:instrText>
+          <w:instrText xml:space="preserve"> PAGEREF _Toc243948477 \h </w:instrText>
         </w:r>
         <w:r>
           <w:rPr>
@@ -6952,7 +6952,7 @@
           <w14:ligatures w14:val="standardContextual"/>
         </w:rPr>
       </w:pPr>
-      <w:hyperlink w:anchor="_Toc243945783" w:history="1">
+      <w:hyperlink w:anchor="_Toc243948478" w:history="1">
         <w:r>
           <w:rPr>
             <w:rStyle w:val="Hipervnculo"/>
@@ -6979,7 +6979,7 @@
             <w:noProof/>
             <w:webHidden/>
           </w:rPr>
-          <w:instrText xml:space="preserve"> PAGEREF _Toc243945783 \h </w:instrText>
+          <w:instrText xml:space="preserve"> PAGEREF _Toc243948478 \h </w:instrText>
         </w:r>
         <w:r>
           <w:rPr>
@@ -7022,7 +7022,7 @@
           <w14:ligatures w14:val="standardContextual"/>
         </w:rPr>
       </w:pPr>
-      <w:hyperlink w:anchor="_Toc243945784" w:history="1">
+      <w:hyperlink w:anchor="_Toc243948479" w:history="1">
         <w:r>
           <w:rPr>
             <w:rStyle w:val="Hipervnculo"/>
@@ -7049,7 +7049,7 @@
             <w:noProof/>
             <w:webHidden/>
           </w:rPr>
-          <w:instrText xml:space="preserve"> PAGEREF _Toc243945784 \h </w:instrText>
+          <w:instrText xml:space="preserve"> PAGEREF _Toc243948479 \h </w:instrText>
         </w:r>
         <w:r>
           <w:rPr>
@@ -7092,7 +7092,7 @@
           <w14:ligatures w14:val="standardContextual"/>
         </w:rPr>
       </w:pPr>
-      <w:hyperlink w:anchor="_Toc243945785" w:history="1">
+      <w:hyperlink w:anchor="_Toc243948480" w:history="1">
         <w:r>
           <w:rPr>
             <w:rStyle w:val="Hipervnculo"/>
@@ -7119,7 +7119,7 @@
             <w:noProof/>
             <w:webHidden/>
           </w:rPr>
-          <w:instrText xml:space="preserve"> PAGEREF _Toc243945785 \h </w:instrText>
+          <w:instrText xml:space="preserve"> PAGEREF _Toc243948480 \h </w:instrText>
         </w:r>
         <w:r>
           <w:rPr>
@@ -7162,7 +7162,7 @@
           <w14:ligatures w14:val="standardContextual"/>
         </w:rPr>
       </w:pPr>
-      <w:hyperlink w:anchor="_Toc243945786" w:history="1">
+      <w:hyperlink w:anchor="_Toc243948481" w:history="1">
         <w:r>
           <w:rPr>
             <w:rStyle w:val="Hipervnculo"/>
@@ -7189,7 +7189,7 @@
             <w:noProof/>
             <w:webHidden/>
           </w:rPr>
-          <w:instrText xml:space="preserve"> PAGEREF _Toc243945786 \h </w:instrText>
+          <w:instrText xml:space="preserve"> PAGEREF _Toc243948481 \h </w:instrText>
         </w:r>
         <w:r>
           <w:rPr>
@@ -7232,7 +7232,7 @@
           <w14:ligatures w14:val="standardContextual"/>
         </w:rPr>
       </w:pPr>
-      <w:hyperlink w:anchor="_Toc243945787" w:history="1">
+      <w:hyperlink w:anchor="_Toc243948482" w:history="1">
         <w:r>
           <w:rPr>
             <w:rStyle w:val="Hipervnculo"/>
@@ -7259,7 +7259,7 @@
             <w:noProof/>
             <w:webHidden/>
           </w:rPr>
-          <w:instrText xml:space="preserve"> PAGEREF _Toc243945787 \h </w:instrText>
+          <w:instrText xml:space="preserve"> PAGEREF _Toc243948482 \h </w:instrText>
         </w:r>
         <w:r>
           <w:rPr>
@@ -7302,7 +7302,7 @@
           <w14:ligatures w14:val="standardContextual"/>
         </w:rPr>
       </w:pPr>
-      <w:hyperlink w:anchor="_Toc243945788" w:history="1">
+      <w:hyperlink w:anchor="_Toc243948483" w:history="1">
         <w:r>
           <w:rPr>
             <w:rStyle w:val="Hipervnculo"/>
@@ -7329,7 +7329,7 @@
             <w:noProof/>
             <w:webHidden/>
           </w:rPr>
-          <w:instrText xml:space="preserve"> PAGEREF _Toc243945788 \h </w:instrText>
+          <w:instrText xml:space="preserve"> PAGEREF _Toc243948483 \h </w:instrText>
         </w:r>
         <w:r>
           <w:rPr>
@@ -7375,7 +7375,7 @@
           <w14:ligatures w14:val="standardContextual"/>
         </w:rPr>
       </w:pPr>
-      <w:hyperlink w:anchor="_Toc243945789" w:history="1">
+      <w:hyperlink w:anchor="_Toc243948484" w:history="1">
         <w:r>
           <w:rPr>
             <w:rStyle w:val="Hipervnculo"/>
@@ -7411,7 +7411,7 @@
             <w:noProof/>
             <w:webHidden/>
           </w:rPr>
-          <w:instrText xml:space="preserve"> PAGEREF _Toc243945789 \h </w:instrText>
+          <w:instrText xml:space="preserve"> PAGEREF _Toc243948484 \h </w:instrText>
         </w:r>
         <w:r>
           <w:rPr>
@@ -7454,7 +7454,7 @@
           <w14:ligatures w14:val="standardContextual"/>
         </w:rPr>
       </w:pPr>
-      <w:hyperlink w:anchor="_Toc243945790" w:history="1">
+      <w:hyperlink w:anchor="_Toc243948485" w:history="1">
         <w:r>
           <w:rPr>
             <w:rStyle w:val="Hipervnculo"/>
@@ -7481,7 +7481,7 @@
             <w:noProof/>
             <w:webHidden/>
           </w:rPr>
-          <w:instrText xml:space="preserve"> PAGEREF _Toc243945790 \h </w:instrText>
+          <w:instrText xml:space="preserve"> PAGEREF _Toc243948485 \h </w:instrText>
         </w:r>
         <w:r>
           <w:rPr>
@@ -7524,7 +7524,7 @@
           <w14:ligatures w14:val="standardContextual"/>
         </w:rPr>
       </w:pPr>
-      <w:hyperlink w:anchor="_Toc243945791" w:history="1">
+      <w:hyperlink w:anchor="_Toc243948486" w:history="1">
         <w:r>
           <w:rPr>
             <w:rStyle w:val="Hipervnculo"/>
@@ -7551,7 +7551,7 @@
             <w:noProof/>
             <w:webHidden/>
           </w:rPr>
-          <w:instrText xml:space="preserve"> PAGEREF _Toc243945791 \h </w:instrText>
+          <w:instrText xml:space="preserve"> PAGEREF _Toc243948486 \h </w:instrText>
         </w:r>
         <w:r>
           <w:rPr>
@@ -7594,7 +7594,7 @@
           <w14:ligatures w14:val="standardContextual"/>
         </w:rPr>
       </w:pPr>
-      <w:hyperlink w:anchor="_Toc243945792" w:history="1">
+      <w:hyperlink w:anchor="_Toc243948487" w:history="1">
         <w:r>
           <w:rPr>
             <w:rStyle w:val="Hipervnculo"/>
@@ -7621,7 +7621,7 @@
             <w:noProof/>
             <w:webHidden/>
           </w:rPr>
-          <w:instrText xml:space="preserve"> PAGEREF _Toc243945792 \h </w:instrText>
+          <w:instrText xml:space="preserve"> PAGEREF _Toc243948487 \h </w:instrText>
         </w:r>
         <w:r>
           <w:rPr>
@@ -7664,7 +7664,7 @@
           <w14:ligatures w14:val="standardContextual"/>
         </w:rPr>
       </w:pPr>
-      <w:hyperlink w:anchor="_Toc243945793" w:history="1">
+      <w:hyperlink w:anchor="_Toc243948488" w:history="1">
         <w:r>
           <w:rPr>
             <w:rStyle w:val="Hipervnculo"/>
@@ -7691,7 +7691,7 @@
             <w:noProof/>
             <w:webHidden/>
           </w:rPr>
-          <w:instrText xml:space="preserve"> PAGEREF _Toc243945793 \h </w:instrText>
+          <w:instrText xml:space="preserve"> PAGEREF _Toc243948488 \h </w:instrText>
         </w:r>
         <w:r>
           <w:rPr>
@@ -7734,7 +7734,7 @@
           <w14:ligatures w14:val="standardContextual"/>
         </w:rPr>
       </w:pPr>
-      <w:hyperlink w:anchor="_Toc243945794" w:history="1">
+      <w:hyperlink w:anchor="_Toc243948489" w:history="1">
         <w:r>
           <w:rPr>
             <w:rStyle w:val="Hipervnculo"/>
@@ -7761,7 +7761,7 @@
             <w:noProof/>
             <w:webHidden/>
           </w:rPr>
-          <w:instrText xml:space="preserve"> PAGEREF _Toc243945794 \h </w:instrText>
+          <w:instrText xml:space="preserve"> PAGEREF _Toc243948489 \h </w:instrText>
         </w:r>
         <w:r>
           <w:rPr>
@@ -7807,7 +7807,7 @@
           <w14:ligatures w14:val="standardContextual"/>
         </w:rPr>
       </w:pPr>
-      <w:hyperlink w:anchor="_Toc243945795" w:history="1">
+      <w:hyperlink w:anchor="_Toc243948490" w:history="1">
         <w:r>
           <w:rPr>
             <w:rStyle w:val="Hipervnculo"/>
@@ -7834,7 +7834,7 @@
             <w:noProof/>
             <w:webHidden/>
           </w:rPr>
-          <w:instrText xml:space="preserve"> PAGEREF _Toc243945795 \h </w:instrText>
+          <w:instrText xml:space="preserve"> PAGEREF _Toc243948490 \h </w:instrText>
         </w:r>
         <w:r>
           <w:rPr>
@@ -7877,7 +7877,7 @@
           <w14:ligatures w14:val="standardContextual"/>
         </w:rPr>
       </w:pPr>
-      <w:hyperlink w:anchor="_Toc243945796" w:history="1">
+      <w:hyperlink w:anchor="_Toc243948491" w:history="1">
         <w:r>
           <w:rPr>
             <w:rStyle w:val="Hipervnculo"/>
@@ -7904,7 +7904,7 @@
             <w:noProof/>
             <w:webHidden/>
           </w:rPr>
-          <w:instrText xml:space="preserve"> PAGEREF _Toc243945796 \h </w:instrText>
+          <w:instrText xml:space="preserve"> PAGEREF _Toc243948491 \h </w:instrText>
         </w:r>
         <w:r>
           <w:rPr>
@@ -7950,7 +7950,7 @@
           <w14:ligatures w14:val="standardContextual"/>
         </w:rPr>
       </w:pPr>
-      <w:hyperlink w:anchor="_Toc243945797" w:history="1">
+      <w:hyperlink w:anchor="_Toc243948492" w:history="1">
         <w:r>
           <w:rPr>
             <w:rStyle w:val="Hipervnculo"/>
@@ -7977,7 +7977,7 @@
             <w:noProof/>
             <w:webHidden/>
           </w:rPr>
-          <w:instrText xml:space="preserve"> PAGEREF _Toc243945797 \h </w:instrText>
+          <w:instrText xml:space="preserve"> PAGEREF _Toc243948492 \h </w:instrText>
         </w:r>
         <w:r>
           <w:rPr>
@@ -8020,7 +8020,7 @@
           <w14:ligatures w14:val="standardContextual"/>
         </w:rPr>
       </w:pPr>
-      <w:hyperlink w:anchor="_Toc243945798" w:history="1">
+      <w:hyperlink w:anchor="_Toc243948493" w:history="1">
         <w:r>
           <w:rPr>
             <w:rStyle w:val="Hipervnculo"/>
@@ -8047,7 +8047,7 @@
             <w:noProof/>
             <w:webHidden/>
           </w:rPr>
-          <w:instrText xml:space="preserve"> PAGEREF _Toc243945798 \h </w:instrText>
+          <w:instrText xml:space="preserve"> PAGEREF _Toc243948493 \h </w:instrText>
         </w:r>
         <w:r>
           <w:rPr>
@@ -8090,7 +8090,7 @@
           <w14:ligatures w14:val="standardContextual"/>
         </w:rPr>
       </w:pPr>
-      <w:hyperlink w:anchor="_Toc243945799" w:history="1">
+      <w:hyperlink w:anchor="_Toc243948494" w:history="1">
         <w:r>
           <w:rPr>
             <w:rStyle w:val="Hipervnculo"/>
@@ -8117,7 +8117,7 @@
             <w:noProof/>
             <w:webHidden/>
           </w:rPr>
-          <w:instrText xml:space="preserve"> PAGEREF _Toc243945799 \h </w:instrText>
+          <w:instrText xml:space="preserve"> PAGEREF _Toc243948494 \h </w:instrText>
         </w:r>
         <w:r>
           <w:rPr>
@@ -8160,7 +8160,7 @@
           <w14:ligatures w14:val="standardContextual"/>
         </w:rPr>
       </w:pPr>
-      <w:hyperlink w:anchor="_Toc243945800" w:history="1">
+      <w:hyperlink w:anchor="_Toc243948495" w:history="1">
         <w:r>
           <w:rPr>
             <w:rStyle w:val="Hipervnculo"/>
@@ -8187,7 +8187,7 @@
             <w:noProof/>
             <w:webHidden/>
           </w:rPr>
-          <w:instrText xml:space="preserve"> PAGEREF _Toc243945800 \h </w:instrText>
+          <w:instrText xml:space="preserve"> PAGEREF _Toc243948495 \h </w:instrText>
         </w:r>
         <w:r>
           <w:rPr>
@@ -8233,7 +8233,7 @@
           <w14:ligatures w14:val="standardContextual"/>
         </w:rPr>
       </w:pPr>
-      <w:hyperlink w:anchor="_Toc243945801" w:history="1">
+      <w:hyperlink w:anchor="_Toc243948496" w:history="1">
         <w:r>
           <w:rPr>
             <w:rStyle w:val="Hipervnculo"/>
@@ -8260,7 +8260,7 @@
             <w:noProof/>
             <w:webHidden/>
           </w:rPr>
-          <w:instrText xml:space="preserve"> PAGEREF _Toc243945801 \h </w:instrText>
+          <w:instrText xml:space="preserve"> PAGEREF _Toc243948496 \h </w:instrText>
         </w:r>
         <w:r>
           <w:rPr>
@@ -8306,7 +8306,7 @@
           <w14:ligatures w14:val="standardContextual"/>
         </w:rPr>
       </w:pPr>
-      <w:hyperlink w:anchor="_Toc243945802" w:history="1">
+      <w:hyperlink w:anchor="_Toc243948497" w:history="1">
         <w:r>
           <w:rPr>
             <w:rStyle w:val="Hipervnculo"/>
@@ -8333,7 +8333,7 @@
             <w:noProof/>
             <w:webHidden/>
           </w:rPr>
-          <w:instrText xml:space="preserve"> PAGEREF _Toc243945802 \h </w:instrText>
+          <w:instrText xml:space="preserve"> PAGEREF _Toc243948497 \h </w:instrText>
         </w:r>
         <w:r>
           <w:rPr>
@@ -9003,7 +9003,7 @@
         <w:pStyle w:val="Ttulo1"/>
       </w:pPr>
       <w:bookmarkStart w:id="0" w:name="_ad9e25c8626cd57ecdce5548ccf29c0d11fa207"/>
-      <w:bookmarkStart w:id="1" w:name="_Toc243945690"/>
+      <w:bookmarkStart w:id="1" w:name="_Toc243948385"/>
       <w:r>
         <w:lastRenderedPageBreak/>
         <w:t xml:space="preserve">Módulo 0 — Plataforma: clínicas, planes y suscripción </w:t>
@@ -9030,7 +9030,7 @@
         <w:pStyle w:val="Ttulo2"/>
       </w:pPr>
       <w:bookmarkStart w:id="2" w:name="_1eb36715c186f58cce98281b1b189d20510db73"/>
-      <w:bookmarkStart w:id="3" w:name="_Toc243945691"/>
+      <w:bookmarkStart w:id="3" w:name="_Toc243948386"/>
       <w:r>
         <w:t>HU-0.1 — Registrar una clínica (self-service)</w:t>
       </w:r>
@@ -9316,7 +9316,7 @@
         <w:pStyle w:val="Ttulo2"/>
       </w:pPr>
       <w:bookmarkStart w:id="4" w:name="_802afc2bac434eff8b2fd18354a2e26d7a1818b"/>
-      <w:bookmarkStart w:id="5" w:name="_Toc243945692"/>
+      <w:bookmarkStart w:id="5" w:name="_Toc243948387"/>
       <w:bookmarkEnd w:id="2"/>
       <w:r>
         <w:lastRenderedPageBreak/>
@@ -9608,7 +9608,7 @@
         <w:pStyle w:val="Ttulo2"/>
       </w:pPr>
       <w:bookmarkStart w:id="6" w:name="_bb7346f7e0c84a0526cc1b09dcf7185b4de9ba6"/>
-      <w:bookmarkStart w:id="7" w:name="_Toc243945693"/>
+      <w:bookmarkStart w:id="7" w:name="_Toc243948388"/>
       <w:bookmarkEnd w:id="4"/>
       <w:r>
         <w:t>HU-0.3 — Panel del super-administrador</w:t>
@@ -9983,7 +9983,7 @@
         <w:pStyle w:val="Ttulo2"/>
       </w:pPr>
       <w:bookmarkStart w:id="8" w:name="_81995397ba8e62ea0a492c5a03eed8bb24e762a"/>
-      <w:bookmarkStart w:id="9" w:name="_Toc243945694"/>
+      <w:bookmarkStart w:id="9" w:name="_Toc243948389"/>
       <w:bookmarkEnd w:id="6"/>
       <w:r>
         <w:t>HU-0.4 — Control de límites del plan (freemium)</w:t>
@@ -10343,7 +10343,7 @@
         <w:pStyle w:val="Ttulo2"/>
       </w:pPr>
       <w:bookmarkStart w:id="10" w:name="_7e8f3608e8fc52636cb9cbad9cf55731ae6c539"/>
-      <w:bookmarkStart w:id="11" w:name="_Toc243945695"/>
+      <w:bookmarkStart w:id="11" w:name="_Toc243948390"/>
       <w:bookmarkEnd w:id="8"/>
       <w:r>
         <w:t>HU-0.5 — Suscripción, pagos y congelación por mora</w:t>
@@ -10690,7 +10690,7 @@
         <w:pStyle w:val="Ttulo1"/>
       </w:pPr>
       <w:bookmarkStart w:id="12" w:name="_3f52c9db5995a4dc1e731f6d8cd57f262bab040"/>
-      <w:bookmarkStart w:id="13" w:name="_Toc243945696"/>
+      <w:bookmarkStart w:id="13" w:name="_Toc243948391"/>
       <w:bookmarkEnd w:id="0"/>
       <w:bookmarkEnd w:id="10"/>
       <w:r>
@@ -10712,7 +10712,7 @@
         <w:pStyle w:val="Ttulo2"/>
       </w:pPr>
       <w:bookmarkStart w:id="14" w:name="_76f4ca07816b696a7e21234a3fd245066d4202e"/>
-      <w:bookmarkStart w:id="15" w:name="_Toc243945697"/>
+      <w:bookmarkStart w:id="15" w:name="_Toc243948392"/>
       <w:r>
         <w:t>HU-T.1 — Iniciar sesión y autenticación</w:t>
       </w:r>
@@ -10967,7 +10967,7 @@
         <w:pStyle w:val="Ttulo2"/>
       </w:pPr>
       <w:bookmarkStart w:id="16" w:name="_08f5c8e95117bf9bc16117a780f642084f0c149"/>
-      <w:bookmarkStart w:id="17" w:name="_Toc243945698"/>
+      <w:bookmarkStart w:id="17" w:name="_Toc243948393"/>
       <w:bookmarkEnd w:id="14"/>
       <w:r>
         <w:t>HU-T.2 — Cambiar mi contraseña</w:t>
@@ -11243,7 +11243,7 @@
         <w:pStyle w:val="Ttulo2"/>
       </w:pPr>
       <w:bookmarkStart w:id="18" w:name="_44f513b1e95bac8cbf132f88a3649b6be2902d9"/>
-      <w:bookmarkStart w:id="19" w:name="_Toc243945699"/>
+      <w:bookmarkStart w:id="19" w:name="_Toc243948394"/>
       <w:bookmarkEnd w:id="16"/>
       <w:r>
         <w:lastRenderedPageBreak/>
@@ -11482,7 +11482,7 @@
         <w:pStyle w:val="Ttulo2"/>
       </w:pPr>
       <w:bookmarkStart w:id="20" w:name="_1eded849c0926854c498005f8a93458b9d7a2d8"/>
-      <w:bookmarkStart w:id="21" w:name="_Toc243945700"/>
+      <w:bookmarkStart w:id="21" w:name="_Toc243948395"/>
       <w:bookmarkEnd w:id="18"/>
       <w:r>
         <w:t>HU-T.4 — Cerrar sesión</w:t>
@@ -11708,7 +11708,7 @@
         <w:pStyle w:val="Ttulo2"/>
       </w:pPr>
       <w:bookmarkStart w:id="22" w:name="_def34846ffbe39a85a6bd6a22079f6d076a01a9"/>
-      <w:bookmarkStart w:id="23" w:name="_Toc243945701"/>
+      <w:bookmarkStart w:id="23" w:name="_Toc243948396"/>
       <w:bookmarkEnd w:id="20"/>
       <w:r>
         <w:t>HU-T.5 — Ver y actualizar mi perfil y datos de contacto</w:t>
@@ -12132,7 +12132,7 @@
         <w:pStyle w:val="Ttulo2"/>
       </w:pPr>
       <w:bookmarkStart w:id="24" w:name="_37603926653c908321bb7c7e9ea1991584cc3b8"/>
-      <w:bookmarkStart w:id="25" w:name="_Toc243945702"/>
+      <w:bookmarkStart w:id="25" w:name="_Toc243948397"/>
       <w:bookmarkEnd w:id="22"/>
       <w:r>
         <w:t>HU-T.6 — Gestionar mis notificaciones internas</w:t>
@@ -12410,7 +12410,7 @@
         <w:pStyle w:val="Ttulo2"/>
       </w:pPr>
       <w:bookmarkStart w:id="26" w:name="_5605fb9a7931d45a4bf5dc8e3e653d18c531f06"/>
-      <w:bookmarkStart w:id="27" w:name="_Toc243945703"/>
+      <w:bookmarkStart w:id="27" w:name="_Toc243948398"/>
       <w:bookmarkEnd w:id="24"/>
       <w:r>
         <w:t>HU-T.7 — Gestión de usuarios del sistema</w:t>
@@ -12697,7 +12697,7 @@
         <w:pStyle w:val="Ttulo2"/>
       </w:pPr>
       <w:bookmarkStart w:id="28" w:name="_cca84937acbaa5cdc69c436564f31a3800184ab"/>
-      <w:bookmarkStart w:id="29" w:name="_Toc243945704"/>
+      <w:bookmarkStart w:id="29" w:name="_Toc243948399"/>
       <w:bookmarkEnd w:id="26"/>
       <w:r>
         <w:t>HU-T.8 — Logs de auditoría y seguridad</w:t>
@@ -12942,7 +12942,7 @@
         <w:pStyle w:val="Ttulo2"/>
       </w:pPr>
       <w:bookmarkStart w:id="30" w:name="_cb462f816148050ba0d7aac8f53a2b5b0cb7780"/>
-      <w:bookmarkStart w:id="31" w:name="_Toc243945705"/>
+      <w:bookmarkStart w:id="31" w:name="_Toc243948400"/>
       <w:bookmarkEnd w:id="28"/>
       <w:r>
         <w:t>HU-T.9 — Backup automático de la base de datos</w:t>
@@ -13412,7 +13412,7 @@
         <w:pStyle w:val="Ttulo2"/>
       </w:pPr>
       <w:bookmarkStart w:id="32" w:name="_276f5e9a65ab31ebb82d9356073ee60ffcf6855"/>
-      <w:bookmarkStart w:id="33" w:name="_Toc243945706"/>
+      <w:bookmarkStart w:id="33" w:name="_Toc243948401"/>
       <w:bookmarkEnd w:id="30"/>
       <w:r>
         <w:t>HU-T.10 — Autorización central por rol (RBAC real)</w:t>
@@ -13690,7 +13690,7 @@
         <w:pStyle w:val="Ttulo2"/>
       </w:pPr>
       <w:bookmarkStart w:id="34" w:name="_3b0d05aa899aefedfcf439319a22bd7df135017"/>
-      <w:bookmarkStart w:id="35" w:name="_Toc243945707"/>
+      <w:bookmarkStart w:id="35" w:name="_Toc243948402"/>
       <w:bookmarkEnd w:id="32"/>
       <w:r>
         <w:t>HU-T.11 — Corregir escalada de privilegios y proteger al último administrador</w:t>
@@ -13940,7 +13940,7 @@
         <w:pStyle w:val="Ttulo2"/>
       </w:pPr>
       <w:bookmarkStart w:id="36" w:name="_5106da541d290f3488d79d8c1e91fe390d48e5c"/>
-      <w:bookmarkStart w:id="37" w:name="_Toc243945708"/>
+      <w:bookmarkStart w:id="37" w:name="_Toc243948403"/>
       <w:bookmarkEnd w:id="34"/>
       <w:r>
         <w:t>HU-T.12 — Política de contraseñas, verificación de correo y OAuth seguro</w:t>
@@ -14261,7 +14261,7 @@
         <w:pStyle w:val="Ttulo2"/>
       </w:pPr>
       <w:bookmarkStart w:id="38" w:name="_2303defb5da6c78860aeae9d161d0fa18f76502"/>
-      <w:bookmarkStart w:id="39" w:name="_Toc243945709"/>
+      <w:bookmarkStart w:id="39" w:name="_Toc243948404"/>
       <w:bookmarkEnd w:id="36"/>
       <w:r>
         <w:t>HU-T.13 — Endurecer rate limiting y reducir enumeración/fuga de información</w:t>
@@ -14563,7 +14563,7 @@
         <w:pStyle w:val="Ttulo2"/>
       </w:pPr>
       <w:bookmarkStart w:id="40" w:name="_37cade07514fa6d0623cee7537c5f68cab00cfd"/>
-      <w:bookmarkStart w:id="41" w:name="_Toc243945710"/>
+      <w:bookmarkStart w:id="41" w:name="_Toc243948405"/>
       <w:bookmarkEnd w:id="38"/>
       <w:r>
         <w:t>HU-T.14 — Restablecer la contraseña de un usuario (administrador)</w:t>
@@ -14859,7 +14859,7 @@
         <w:pStyle w:val="Ttulo2"/>
       </w:pPr>
       <w:bookmarkStart w:id="42" w:name="_09522c4444a8bbebdaf4a55b5444d2231a6caff"/>
-      <w:bookmarkStart w:id="43" w:name="_Toc243945711"/>
+      <w:bookmarkStart w:id="43" w:name="_Toc243948406"/>
       <w:bookmarkEnd w:id="40"/>
       <w:r>
         <w:t>HU-T.15 — Aislamiento por clínica y rol super-administrador</w:t>
@@ -15451,7 +15451,7 @@
         <w:pStyle w:val="Ttulo2"/>
       </w:pPr>
       <w:bookmarkStart w:id="44" w:name="_7d4be07c6dc7ad98ff2d7fd7f946e3e6ff8ab78"/>
-      <w:bookmarkStart w:id="45" w:name="_Toc243945712"/>
+      <w:bookmarkStart w:id="45" w:name="_Toc243948407"/>
       <w:bookmarkEnd w:id="42"/>
       <w:r>
         <w:lastRenderedPageBreak/>
@@ -15700,7 +15700,7 @@
         <w:pStyle w:val="Ttulo2"/>
       </w:pPr>
       <w:bookmarkStart w:id="46" w:name="_fde5550409ae8bd107b35d83706fe49d1ac49cf"/>
-      <w:bookmarkStart w:id="47" w:name="_Toc243945713"/>
+      <w:bookmarkStart w:id="47" w:name="_Toc243948408"/>
       <w:bookmarkEnd w:id="44"/>
       <w:r>
         <w:t>HU-T.17 — Una persona con varios roles: elegir el contexto al iniciar sesión</w:t>
@@ -15960,7 +15960,7 @@
         <w:pStyle w:val="Ttulo2"/>
       </w:pPr>
       <w:bookmarkStart w:id="48" w:name="_7d9311428cd5b72468b37f82201f1b810f77c36"/>
-      <w:bookmarkStart w:id="49" w:name="_Toc243945714"/>
+      <w:bookmarkStart w:id="49" w:name="_Toc243948409"/>
       <w:bookmarkEnd w:id="46"/>
       <w:r>
         <w:t>HU-T.18 — Registrarme e iniciar sesión con Google (propietario)</w:t>
@@ -16262,7 +16262,7 @@
         <w:pStyle w:val="Ttulo2"/>
       </w:pPr>
       <w:bookmarkStart w:id="50" w:name="_a6c52dc4bdd2cb00ae48e74db3c3b2920a9b818"/>
-      <w:bookmarkStart w:id="51" w:name="_Toc243945715"/>
+      <w:bookmarkStart w:id="51" w:name="_Toc243948410"/>
       <w:bookmarkEnd w:id="48"/>
       <w:r>
         <w:t>HU-T.19 — Aceptar la política de tratamiento de datos</w:t>
@@ -16555,7 +16555,7 @@
         <w:pStyle w:val="Ttulo1"/>
       </w:pPr>
       <w:bookmarkStart w:id="52" w:name="_45e5cddb15e6e85961c4bdd9f114a9e4301e667"/>
-      <w:bookmarkStart w:id="53" w:name="_Toc243945716"/>
+      <w:bookmarkStart w:id="53" w:name="_Toc243948411"/>
       <w:bookmarkEnd w:id="12"/>
       <w:bookmarkEnd w:id="50"/>
       <w:r>
@@ -16577,7 +16577,7 @@
         <w:pStyle w:val="Ttulo2"/>
       </w:pPr>
       <w:bookmarkStart w:id="54" w:name="_3442f1e103117ab35c7be2be07e5b7a86f50900"/>
-      <w:bookmarkStart w:id="55" w:name="_Toc243945717"/>
+      <w:bookmarkStart w:id="55" w:name="_Toc243948412"/>
       <w:r>
         <w:t>HU-1.1 — Registrar mascota</w:t>
       </w:r>
@@ -16849,7 +16849,7 @@
         <w:pStyle w:val="Ttulo2"/>
       </w:pPr>
       <w:bookmarkStart w:id="56" w:name="_cac8078226ab7384debc291829d99266c4c98c9"/>
-      <w:bookmarkStart w:id="57" w:name="_Toc243945718"/>
+      <w:bookmarkStart w:id="57" w:name="_Toc243948413"/>
       <w:bookmarkEnd w:id="54"/>
       <w:r>
         <w:t>HU-1.2 — Registrar propietario</w:t>
@@ -17115,7 +17115,7 @@
         <w:pStyle w:val="Ttulo2"/>
       </w:pPr>
       <w:bookmarkStart w:id="58" w:name="_2775e78a99e9a6c8110a18962d2d3ffe08eb791"/>
-      <w:bookmarkStart w:id="59" w:name="_Toc243945719"/>
+      <w:bookmarkStart w:id="59" w:name="_Toc243948414"/>
       <w:bookmarkEnd w:id="56"/>
       <w:r>
         <w:lastRenderedPageBreak/>
@@ -17348,7 +17348,7 @@
         <w:pStyle w:val="Ttulo2"/>
       </w:pPr>
       <w:bookmarkStart w:id="60" w:name="_a48b917e447c9bb421319764b87fa8fbfffc6ce"/>
-      <w:bookmarkStart w:id="61" w:name="_Toc243945720"/>
+      <w:bookmarkStart w:id="61" w:name="_Toc243948415"/>
       <w:bookmarkEnd w:id="58"/>
       <w:r>
         <w:t>HU-1.4 — Editar y desactivar mascota</w:t>
@@ -17611,7 +17611,7 @@
         <w:pStyle w:val="Ttulo2"/>
       </w:pPr>
       <w:bookmarkStart w:id="62" w:name="_c56dbdf70effe4fdddd03cc982164bf6dfa15fd"/>
-      <w:bookmarkStart w:id="63" w:name="_Toc243945721"/>
+      <w:bookmarkStart w:id="63" w:name="_Toc243948416"/>
       <w:bookmarkEnd w:id="60"/>
       <w:r>
         <w:t>HU-1.5 — Vincular una mascota existente a la clínica</w:t>
@@ -17882,7 +17882,7 @@
         <w:pStyle w:val="Ttulo1"/>
       </w:pPr>
       <w:bookmarkStart w:id="64" w:name="_8ada1076fc69f75adb455b52b48149b634e12c1"/>
-      <w:bookmarkStart w:id="65" w:name="_Toc243945722"/>
+      <w:bookmarkStart w:id="65" w:name="_Toc243948417"/>
       <w:bookmarkEnd w:id="52"/>
       <w:bookmarkEnd w:id="62"/>
       <w:r>
@@ -17904,7 +17904,7 @@
         <w:pStyle w:val="Ttulo2"/>
       </w:pPr>
       <w:bookmarkStart w:id="66" w:name="_d0fbc850c25121b5bb6429938908d9d6324f20c"/>
-      <w:bookmarkStart w:id="67" w:name="_Toc243945723"/>
+      <w:bookmarkStart w:id="67" w:name="_Toc243948418"/>
       <w:r>
         <w:t>HU-2.1 — Registrar consulta clínica</w:t>
       </w:r>
@@ -18188,7 +18188,7 @@
         <w:pStyle w:val="Ttulo2"/>
       </w:pPr>
       <w:bookmarkStart w:id="68" w:name="_7a453a6eb6ed88e1bfb6e10d4e89e02e93370e4"/>
-      <w:bookmarkStart w:id="69" w:name="_Toc243945724"/>
+      <w:bookmarkStart w:id="69" w:name="_Toc243948419"/>
       <w:bookmarkEnd w:id="66"/>
       <w:r>
         <w:t>HU-2.2 — Atención clínica sin cita (urgencias)</w:t>
@@ -18487,7 +18487,7 @@
         <w:pStyle w:val="Ttulo2"/>
       </w:pPr>
       <w:bookmarkStart w:id="70" w:name="_277d15ee6375124a0d7497cd947f0496d653294"/>
-      <w:bookmarkStart w:id="71" w:name="_Toc243945725"/>
+      <w:bookmarkStart w:id="71" w:name="_Toc243948420"/>
       <w:bookmarkEnd w:id="68"/>
       <w:r>
         <w:t>HU-2.3 — Adjuntar archivos clínicos</w:t>
@@ -18823,7 +18823,7 @@
         <w:pStyle w:val="Ttulo2"/>
       </w:pPr>
       <w:bookmarkStart w:id="72" w:name="_1b98c978e60977db39fc2418db7fe5e3ddc3001"/>
-      <w:bookmarkStart w:id="73" w:name="_Toc243945726"/>
+      <w:bookmarkStart w:id="73" w:name="_Toc243948421"/>
       <w:bookmarkEnd w:id="70"/>
       <w:r>
         <w:t>HU-2.4 — Registrar tratamiento</w:t>
@@ -19070,7 +19070,7 @@
         <w:pStyle w:val="Ttulo2"/>
       </w:pPr>
       <w:bookmarkStart w:id="74" w:name="_9717672e9e73feeffef28eb38b12c038cdd7bd2"/>
-      <w:bookmarkStart w:id="75" w:name="_Toc243945727"/>
+      <w:bookmarkStart w:id="75" w:name="_Toc243948422"/>
       <w:bookmarkEnd w:id="72"/>
       <w:r>
         <w:t>HU-2.5 — Ver historial clínico completo</w:t>
@@ -19333,7 +19333,7 @@
         <w:pStyle w:val="Ttulo2"/>
       </w:pPr>
       <w:bookmarkStart w:id="76" w:name="_fdc1478d352073634e6bd92f17796cead004715"/>
-      <w:bookmarkStart w:id="77" w:name="_Toc243945728"/>
+      <w:bookmarkStart w:id="77" w:name="_Toc243948423"/>
       <w:bookmarkEnd w:id="74"/>
       <w:r>
         <w:t>HU-2.6 — Atomicidad y feedback de adjuntos en el registro de consulta</w:t>
@@ -19615,7 +19615,7 @@
         <w:pStyle w:val="Ttulo2"/>
       </w:pPr>
       <w:bookmarkStart w:id="78" w:name="_101f0dcf34d14c70ec0f17a5f1393f5d9e5e380"/>
-      <w:bookmarkStart w:id="79" w:name="_Toc243945729"/>
+      <w:bookmarkStart w:id="79" w:name="_Toc243948424"/>
       <w:bookmarkEnd w:id="76"/>
       <w:r>
         <w:t>HU-2.7 — Validación y control de acceso en registros clínicos y de mascota</w:t>
@@ -19895,7 +19895,7 @@
         <w:pStyle w:val="Ttulo2"/>
       </w:pPr>
       <w:bookmarkStart w:id="80" w:name="_004e46896b85bf56df5905f1e03a53c4af0a844"/>
-      <w:bookmarkStart w:id="81" w:name="_Toc243945730"/>
+      <w:bookmarkStart w:id="81" w:name="_Toc243948425"/>
       <w:bookmarkEnd w:id="78"/>
       <w:r>
         <w:t>HU-2.8 — Sugerencia de diagnósticos probables por síntomas</w:t>
@@ -20156,7 +20156,7 @@
         <w:pStyle w:val="Ttulo2"/>
       </w:pPr>
       <w:bookmarkStart w:id="82" w:name="_dc4885bd67732a434e9ba082721bf6df1e25b78"/>
-      <w:bookmarkStart w:id="83" w:name="_Toc243945731"/>
+      <w:bookmarkStart w:id="83" w:name="_Toc243948426"/>
       <w:bookmarkEnd w:id="80"/>
       <w:r>
         <w:t>HU-2.9 — Alertas de toxicidad e interacción al prescribir</w:t>
@@ -20436,7 +20436,7 @@
         <w:pStyle w:val="Ttulo2"/>
       </w:pPr>
       <w:bookmarkStart w:id="84" w:name="_39e4f7d80042c39922c0142f6da447f46643fcd"/>
-      <w:bookmarkStart w:id="85" w:name="_Toc243945732"/>
+      <w:bookmarkStart w:id="85" w:name="_Toc243948427"/>
       <w:bookmarkEnd w:id="82"/>
       <w:r>
         <w:t>HU-2.10 — Ver la historia compartida de la mascota (multi-clínica)</w:t>
@@ -20699,7 +20699,7 @@
         <w:pStyle w:val="Ttulo2"/>
       </w:pPr>
       <w:bookmarkStart w:id="86" w:name="_ddbeb8d4984f7e7207ef7f02c5c92f4dcdce30d"/>
-      <w:bookmarkStart w:id="87" w:name="_Toc243945733"/>
+      <w:bookmarkStart w:id="87" w:name="_Toc243948428"/>
       <w:bookmarkEnd w:id="84"/>
       <w:r>
         <w:t>HU-2.11 — Calcular el nivel de triage a partir de los síntomas</w:t>
@@ -21062,7 +21062,7 @@
         <w:pStyle w:val="Ttulo2"/>
       </w:pPr>
       <w:bookmarkStart w:id="88" w:name="_492240b15c6ebc6fbe3f7fd23583d697b838ee5"/>
-      <w:bookmarkStart w:id="89" w:name="_Toc243945734"/>
+      <w:bookmarkStart w:id="89" w:name="_Toc243948429"/>
       <w:bookmarkEnd w:id="86"/>
       <w:r>
         <w:t>HU-2.12 — Explorar el mapa del conocimiento clínico</w:t>
@@ -21334,7 +21334,7 @@
         <w:pStyle w:val="Ttulo1"/>
       </w:pPr>
       <w:bookmarkStart w:id="90" w:name="_d55aebc9deeb1682a62a02ae225cde94fe0baf3"/>
-      <w:bookmarkStart w:id="91" w:name="_Toc243945735"/>
+      <w:bookmarkStart w:id="91" w:name="_Toc243948430"/>
       <w:bookmarkEnd w:id="64"/>
       <w:bookmarkEnd w:id="88"/>
       <w:r>
@@ -21356,7 +21356,7 @@
         <w:pStyle w:val="Ttulo2"/>
       </w:pPr>
       <w:bookmarkStart w:id="92" w:name="_73783a222ff535845613407f8c2c5de0df62c29"/>
-      <w:bookmarkStart w:id="93" w:name="_Toc243945736"/>
+      <w:bookmarkStart w:id="93" w:name="_Toc243948431"/>
       <w:r>
         <w:t>HU-3.1 — Registrar vacunación</w:t>
       </w:r>
@@ -21599,7 +21599,7 @@
         <w:pStyle w:val="Ttulo2"/>
       </w:pPr>
       <w:bookmarkStart w:id="94" w:name="_6075047063f4930391208048315650ed427ae6c"/>
-      <w:bookmarkStart w:id="95" w:name="_Toc243945737"/>
+      <w:bookmarkStart w:id="95" w:name="_Toc243948432"/>
       <w:bookmarkEnd w:id="92"/>
       <w:r>
         <w:t>HU-3.2 — Enviar recordatorio por correo</w:t>
@@ -21855,7 +21855,7 @@
         <w:pStyle w:val="Ttulo2"/>
       </w:pPr>
       <w:bookmarkStart w:id="96" w:name="_781661fe2d15deb5f4d895541dced4f16e579af"/>
-      <w:bookmarkStart w:id="97" w:name="_Toc243945738"/>
+      <w:bookmarkStart w:id="97" w:name="_Toc243948433"/>
       <w:bookmarkEnd w:id="94"/>
       <w:r>
         <w:t>HU-3.3 — Enviar recordatorio por WhatsApp</w:t>
@@ -22112,7 +22112,7 @@
         <w:pStyle w:val="Ttulo2"/>
       </w:pPr>
       <w:bookmarkStart w:id="98" w:name="_8afd4fd6adaa7aec672b37965973c4a0b1b5483"/>
-      <w:bookmarkStart w:id="99" w:name="_Toc243945739"/>
+      <w:bookmarkStart w:id="99" w:name="_Toc243948434"/>
       <w:bookmarkEnd w:id="96"/>
       <w:r>
         <w:t>HU-3.4 — Registrar desparasitación</w:t>
@@ -22356,7 +22356,7 @@
         <w:pStyle w:val="Ttulo2"/>
       </w:pPr>
       <w:bookmarkStart w:id="100" w:name="_69b92288d624f1c737d99fa43d727735c1c78ac"/>
-      <w:bookmarkStart w:id="101" w:name="_Toc243945740"/>
+      <w:bookmarkStart w:id="101" w:name="_Toc243948435"/>
       <w:bookmarkEnd w:id="98"/>
       <w:r>
         <w:t>HU-3.5 — Panel de vacunaciones pendientes</w:t>
@@ -22634,7 +22634,7 @@
         <w:pStyle w:val="Ttulo2"/>
       </w:pPr>
       <w:bookmarkStart w:id="102" w:name="_83b2b6ee9ef84433e407efb3456acc0bf8c705f"/>
-      <w:bookmarkStart w:id="103" w:name="_Toc243945741"/>
+      <w:bookmarkStart w:id="103" w:name="_Toc243948436"/>
       <w:bookmarkEnd w:id="100"/>
       <w:r>
         <w:lastRenderedPageBreak/>
@@ -22979,7 +22979,7 @@
         <w:pStyle w:val="Ttulo1"/>
       </w:pPr>
       <w:bookmarkStart w:id="104" w:name="_0bc479c0be240e26431ebdd296a7a53444b2628"/>
-      <w:bookmarkStart w:id="105" w:name="_Toc243945742"/>
+      <w:bookmarkStart w:id="105" w:name="_Toc243948437"/>
       <w:bookmarkEnd w:id="90"/>
       <w:bookmarkEnd w:id="102"/>
       <w:r>
@@ -23001,7 +23001,7 @@
         <w:pStyle w:val="Ttulo2"/>
       </w:pPr>
       <w:bookmarkStart w:id="106" w:name="_83a9ef67ed8a24f8f8fb200a3c30fdc3bf36c17"/>
-      <w:bookmarkStart w:id="107" w:name="_Toc243945743"/>
+      <w:bookmarkStart w:id="107" w:name="_Toc243948438"/>
       <w:r>
         <w:t>HU-4.1 — Agendar cita</w:t>
       </w:r>
@@ -23292,7 +23292,7 @@
         <w:pStyle w:val="Ttulo2"/>
       </w:pPr>
       <w:bookmarkStart w:id="108" w:name="_102fb6dec5375a39a698cb955a51646f9817d25"/>
-      <w:bookmarkStart w:id="109" w:name="_Toc243945744"/>
+      <w:bookmarkStart w:id="109" w:name="_Toc243948439"/>
       <w:bookmarkEnd w:id="106"/>
       <w:r>
         <w:t>HU-4.2 — Cancelar o reprogramar cita</w:t>
@@ -23549,7 +23549,7 @@
         <w:pStyle w:val="Ttulo2"/>
       </w:pPr>
       <w:bookmarkStart w:id="110" w:name="_bc90a9ef9035fcbf5d83826a75a2a7caba95288"/>
-      <w:bookmarkStart w:id="111" w:name="_Toc243945745"/>
+      <w:bookmarkStart w:id="111" w:name="_Toc243948440"/>
       <w:bookmarkEnd w:id="108"/>
       <w:r>
         <w:t>HU-4.3 — Marcar cita como completada</w:t>
@@ -23930,7 +23930,7 @@
         <w:pStyle w:val="Ttulo2"/>
       </w:pPr>
       <w:bookmarkStart w:id="112" w:name="_0ab1d1688e3b6d42f481962b5abe908ca5f185e"/>
-      <w:bookmarkStart w:id="113" w:name="_Toc243945746"/>
+      <w:bookmarkStart w:id="113" w:name="_Toc243948441"/>
       <w:bookmarkEnd w:id="110"/>
       <w:r>
         <w:t>HU-4.4 — Confirmación automática de cita por correo</w:t>
@@ -24174,7 +24174,7 @@
         <w:pStyle w:val="Ttulo2"/>
       </w:pPr>
       <w:bookmarkStart w:id="114" w:name="_391b83d5c01b20c64bec4d1baa2ded83b27b3cc"/>
-      <w:bookmarkStart w:id="115" w:name="_Toc243945747"/>
+      <w:bookmarkStart w:id="115" w:name="_Toc243948442"/>
       <w:bookmarkEnd w:id="112"/>
       <w:r>
         <w:t>HU-4.5 — Registrar hora real de atención y gestionar retrasos</w:t>
@@ -24481,7 +24481,7 @@
         <w:pStyle w:val="Ttulo2"/>
       </w:pPr>
       <w:bookmarkStart w:id="116" w:name="_fd2845ac88e46c3520f61b9b4ded26b35f37534"/>
-      <w:bookmarkStart w:id="117" w:name="_Toc243945748"/>
+      <w:bookmarkStart w:id="117" w:name="_Toc243948443"/>
       <w:bookmarkEnd w:id="114"/>
       <w:r>
         <w:lastRenderedPageBreak/>
@@ -24756,7 +24756,7 @@
         <w:pStyle w:val="Ttulo2"/>
       </w:pPr>
       <w:bookmarkStart w:id="118" w:name="_4786f5b438d23c36e067f350ad8ed0097d027c2"/>
-      <w:bookmarkStart w:id="119" w:name="_Toc243945749"/>
+      <w:bookmarkStart w:id="119" w:name="_Toc243948444"/>
       <w:bookmarkEnd w:id="116"/>
       <w:r>
         <w:t>HU-4.7 — Estado "no asistió" y ausentismo</w:t>
@@ -25117,7 +25117,7 @@
         <w:pStyle w:val="Ttulo2"/>
       </w:pPr>
       <w:bookmarkStart w:id="120" w:name="_0d930997ffa83b9b36b150e5e50b933f66b264d"/>
-      <w:bookmarkStart w:id="121" w:name="_Toc243945750"/>
+      <w:bookmarkStart w:id="121" w:name="_Toc243948445"/>
       <w:bookmarkEnd w:id="118"/>
       <w:r>
         <w:t>HU-4.8 — Bloqueos de agenda del veterinario y días no laborables</w:t>
@@ -25391,7 +25391,7 @@
         <w:pStyle w:val="Ttulo2"/>
       </w:pPr>
       <w:bookmarkStart w:id="122" w:name="_592e3b26ee2d82de9a78960621790aca76cbe41"/>
-      <w:bookmarkStart w:id="123" w:name="_Toc243945751"/>
+      <w:bookmarkStart w:id="123" w:name="_Toc243948446"/>
       <w:bookmarkEnd w:id="120"/>
       <w:r>
         <w:t>HU-4.9 — Endurecer la validación de disponibilidad</w:t>
@@ -25714,7 +25714,7 @@
         <w:pStyle w:val="Ttulo2"/>
       </w:pPr>
       <w:bookmarkStart w:id="124" w:name="_53bf433c324c03bf220d8f1ea57572094c24d19"/>
-      <w:bookmarkStart w:id="125" w:name="_Toc243945752"/>
+      <w:bookmarkStart w:id="125" w:name="_Toc243948447"/>
       <w:bookmarkEnd w:id="122"/>
       <w:r>
         <w:t>HU-4.10 — Confirmar asistencia a la cita desde el recordatorio</w:t>
@@ -25996,7 +25996,7 @@
         <w:pStyle w:val="Ttulo2"/>
       </w:pPr>
       <w:bookmarkStart w:id="126" w:name="_bc4a4c08f4864e57db7a13372e3c901c5711bb9"/>
-      <w:bookmarkStart w:id="127" w:name="_Toc243945753"/>
+      <w:bookmarkStart w:id="127" w:name="_Toc243948448"/>
       <w:bookmarkEnd w:id="124"/>
       <w:r>
         <w:t>HU-4.11 — Configurar el horario recurrente del veterinario</w:t>
@@ -26257,7 +26257,7 @@
         <w:pStyle w:val="Ttulo2"/>
       </w:pPr>
       <w:bookmarkStart w:id="128" w:name="_3a9da54e9b682c781ba4f8ec9fb08eb1ae51469"/>
-      <w:bookmarkStart w:id="129" w:name="_Toc243945754"/>
+      <w:bookmarkStart w:id="129" w:name="_Toc243948449"/>
       <w:bookmarkEnd w:id="126"/>
       <w:r>
         <w:t>HU-4.12 — Registrar ausencia del veterinario y gestionar cobertura</w:t>
@@ -26579,7 +26579,7 @@
         <w:pStyle w:val="Ttulo2"/>
       </w:pPr>
       <w:bookmarkStart w:id="130" w:name="_d5e60343e26d4758074a6efaed07b69cd6c3551"/>
-      <w:bookmarkStart w:id="131" w:name="_Toc243945755"/>
+      <w:bookmarkStart w:id="131" w:name="_Toc243948450"/>
       <w:bookmarkEnd w:id="128"/>
       <w:r>
         <w:lastRenderedPageBreak/>
@@ -27020,7 +27020,7 @@
         <w:pStyle w:val="Ttulo2"/>
       </w:pPr>
       <w:bookmarkStart w:id="132" w:name="_d4adac7448e74c17e6bb33bf496ee79d1222807"/>
-      <w:bookmarkStart w:id="133" w:name="_Toc243945756"/>
+      <w:bookmarkStart w:id="133" w:name="_Toc243948451"/>
       <w:bookmarkEnd w:id="130"/>
       <w:r>
         <w:t>HU-4.14 — Reajuste de agenda en vivo (efecto cascada)</w:t>
@@ -27362,7 +27362,7 @@
         <w:pStyle w:val="Ttulo2"/>
       </w:pPr>
       <w:bookmarkStart w:id="134" w:name="_91e1c705d28c1a221b008d52046353792175d0f"/>
-      <w:bookmarkStart w:id="135" w:name="_Toc243945757"/>
+      <w:bookmarkStart w:id="135" w:name="_Toc243948452"/>
       <w:bookmarkEnd w:id="132"/>
       <w:r>
         <w:t>HU-4.15 — Atender una urgencia (triage rojo o llegada directa)</w:t>
@@ -27815,7 +27815,7 @@
         <w:pStyle w:val="Ttulo2"/>
       </w:pPr>
       <w:bookmarkStart w:id="136" w:name="_c78d8424c335bf78fd48b1955b4f1a67eda143f"/>
-      <w:bookmarkStart w:id="137" w:name="_Toc243945758"/>
+      <w:bookmarkStart w:id="137" w:name="_Toc243948453"/>
       <w:bookmarkEnd w:id="134"/>
       <w:r>
         <w:t>HU-4.16 — Sugerir veterinario al agendar</w:t>
@@ -28039,7 +28039,7 @@
         <w:pStyle w:val="Ttulo2"/>
       </w:pPr>
       <w:bookmarkStart w:id="138" w:name="_d95563cf58dd7b4419944c1578610bfcd0b1db0"/>
-      <w:bookmarkStart w:id="139" w:name="_Toc243945759"/>
+      <w:bookmarkStart w:id="139" w:name="_Toc243948454"/>
       <w:bookmarkEnd w:id="136"/>
       <w:r>
         <w:t>HU-4.17 — Recalcular el triage cuando cambian los síntomas</w:t>
@@ -28296,7 +28296,7 @@
         <w:pStyle w:val="Ttulo2"/>
       </w:pPr>
       <w:bookmarkStart w:id="140" w:name="_8b0a1409d398bf3e63485141aa804db028749ca"/>
-      <w:bookmarkStart w:id="141" w:name="_Toc243945760"/>
+      <w:bookmarkStart w:id="141" w:name="_Toc243948455"/>
       <w:bookmarkEnd w:id="138"/>
       <w:r>
         <w:t>HU-4.18 — Ajustar el nivel de triage (veterinario)</w:t>
@@ -28557,7 +28557,7 @@
         <w:pStyle w:val="Ttulo2"/>
       </w:pPr>
       <w:bookmarkStart w:id="142" w:name="_cf2722ce0434310059a1401a7a9236f9f75ab69"/>
-      <w:bookmarkStart w:id="143" w:name="_Toc243945761"/>
+      <w:bookmarkStart w:id="143" w:name="_Toc243948456"/>
       <w:bookmarkEnd w:id="140"/>
       <w:r>
         <w:t>HU-4.19 — Manejar la llegada tarde del propietario</w:t>
@@ -28832,7 +28832,7 @@
         <w:pStyle w:val="Ttulo1"/>
       </w:pPr>
       <w:bookmarkStart w:id="144" w:name="_448b6637f95054bfc4854cb12826ea84d2acba0"/>
-      <w:bookmarkStart w:id="145" w:name="_Toc243945762"/>
+      <w:bookmarkStart w:id="145" w:name="_Toc243948457"/>
       <w:bookmarkEnd w:id="104"/>
       <w:bookmarkEnd w:id="142"/>
       <w:r>
@@ -28854,7 +28854,7 @@
         <w:pStyle w:val="Ttulo2"/>
       </w:pPr>
       <w:bookmarkStart w:id="146" w:name="_af054ffcebd6910222ee7d6c1d020875947335e"/>
-      <w:bookmarkStart w:id="147" w:name="_Toc243945763"/>
+      <w:bookmarkStart w:id="147" w:name="_Toc243948458"/>
       <w:r>
         <w:t>HU-5.1 — Portal del propietario</w:t>
       </w:r>
@@ -29197,7 +29197,7 @@
         <w:pStyle w:val="Ttulo2"/>
       </w:pPr>
       <w:bookmarkStart w:id="148" w:name="_6b1c61431b8f8f0fcc4ce60077071b912ba2b45"/>
-      <w:bookmarkStart w:id="149" w:name="_Toc243945764"/>
+      <w:bookmarkStart w:id="149" w:name="_Toc243948459"/>
       <w:bookmarkEnd w:id="146"/>
       <w:r>
         <w:t>HU-5.2 — Auto-registro de propietario</w:t>
@@ -29466,7 +29466,7 @@
         <w:pStyle w:val="Ttulo2"/>
       </w:pPr>
       <w:bookmarkStart w:id="150" w:name="_f4d063018be410b507969fa4c62074124f833cf"/>
-      <w:bookmarkStart w:id="151" w:name="_Toc243945765"/>
+      <w:bookmarkStart w:id="151" w:name="_Toc243948460"/>
       <w:bookmarkEnd w:id="148"/>
       <w:r>
         <w:t>HU-5.3 — Agendar cita desde el portal</w:t>
@@ -29741,7 +29741,7 @@
         <w:pStyle w:val="Ttulo2"/>
       </w:pPr>
       <w:bookmarkStart w:id="152" w:name="_c64202596780354c08c0a149dc974449db886cf"/>
-      <w:bookmarkStart w:id="153" w:name="_Toc243945766"/>
+      <w:bookmarkStart w:id="153" w:name="_Toc243948461"/>
       <w:bookmarkEnd w:id="150"/>
       <w:r>
         <w:t>HU-5.4 — Editar mi mascota desde el portal</w:t>
@@ -29979,7 +29979,7 @@
         <w:pStyle w:val="Ttulo2"/>
       </w:pPr>
       <w:bookmarkStart w:id="154" w:name="_cf91e7705c2cc7ff174f786bca87f4ab32c164a"/>
-      <w:bookmarkStart w:id="155" w:name="_Toc243945767"/>
+      <w:bookmarkStart w:id="155" w:name="_Toc243948462"/>
       <w:bookmarkEnd w:id="152"/>
       <w:r>
         <w:lastRenderedPageBreak/>
@@ -30225,7 +30225,7 @@
         <w:pStyle w:val="Ttulo2"/>
       </w:pPr>
       <w:bookmarkStart w:id="156" w:name="_f8ebe18ba7612da84cbeb32e6cdfcf569929127"/>
-      <w:bookmarkStart w:id="157" w:name="_Toc243945768"/>
+      <w:bookmarkStart w:id="157" w:name="_Toc243948463"/>
       <w:bookmarkEnd w:id="154"/>
       <w:r>
         <w:t>HU-5.6 — Cancelar o reprogramar mi cita desde el portal</w:t>
@@ -30526,7 +30526,7 @@
         <w:pStyle w:val="Ttulo2"/>
       </w:pPr>
       <w:bookmarkStart w:id="158" w:name="_63b2ff8270a3dc0cb21378739f70e0c16a27def"/>
-      <w:bookmarkStart w:id="159" w:name="_Toc243945769"/>
+      <w:bookmarkStart w:id="159" w:name="_Toc243948464"/>
       <w:bookmarkEnd w:id="156"/>
       <w:r>
         <w:lastRenderedPageBreak/>
@@ -30787,7 +30787,7 @@
         <w:pStyle w:val="Ttulo2"/>
       </w:pPr>
       <w:bookmarkStart w:id="160" w:name="_f59be5ab49da54ec24749683e30fb79075b9c3a"/>
-      <w:bookmarkStart w:id="161" w:name="_Toc243945770"/>
+      <w:bookmarkStart w:id="161" w:name="_Toc243948465"/>
       <w:bookmarkEnd w:id="158"/>
       <w:r>
         <w:t>HU-5.8 — Registrar al propietario como identidad global</w:t>
@@ -31175,7 +31175,7 @@
         <w:pStyle w:val="Ttulo2"/>
       </w:pPr>
       <w:bookmarkStart w:id="162" w:name="_06eaf3b49483b1eeebe1b8e79573cd5c749be44"/>
-      <w:bookmarkStart w:id="163" w:name="_Toc243945771"/>
+      <w:bookmarkStart w:id="163" w:name="_Toc243948466"/>
       <w:bookmarkEnd w:id="160"/>
       <w:r>
         <w:t>HU-5.9 — Iniciar sesión en el portal multi-clínica</w:t>
@@ -31454,7 +31454,7 @@
         <w:pStyle w:val="Ttulo2"/>
       </w:pPr>
       <w:bookmarkStart w:id="164" w:name="_73bf9bf1ab817b39687e744da8c8402ea9619af"/>
-      <w:bookmarkStart w:id="165" w:name="_Toc243945772"/>
+      <w:bookmarkStart w:id="165" w:name="_Toc243948467"/>
       <w:bookmarkEnd w:id="162"/>
       <w:r>
         <w:t>HU-5.10 — Carnet digital de la mascota con QR de emergencia</w:t>
@@ -31718,7 +31718,7 @@
         <w:pStyle w:val="Ttulo2"/>
       </w:pPr>
       <w:bookmarkStart w:id="166" w:name="_809064a587886d0547b1788a26db9d9152af23a"/>
-      <w:bookmarkStart w:id="167" w:name="_Toc243945773"/>
+      <w:bookmarkStart w:id="167" w:name="_Toc243948468"/>
       <w:bookmarkEnd w:id="164"/>
       <w:r>
         <w:t>HU-5.11 — Acceder al carnet por QR en modo solo lectura</w:t>
@@ -31990,7 +31990,7 @@
         <w:pStyle w:val="Ttulo2"/>
       </w:pPr>
       <w:bookmarkStart w:id="168" w:name="_eaa2b9dcd4e772acfdb8cc2e14fe1584fe792e7"/>
-      <w:bookmarkStart w:id="169" w:name="_Toc243945774"/>
+      <w:bookmarkStart w:id="169" w:name="_Toc243948469"/>
       <w:bookmarkEnd w:id="166"/>
       <w:r>
         <w:t>HU-5.12 — Autorizar a una clínica a ver la historia de otras clínicas</w:t>
@@ -32254,7 +32254,7 @@
         <w:pStyle w:val="Ttulo2"/>
       </w:pPr>
       <w:bookmarkStart w:id="170" w:name="_9c4353686bd45e1d5b28007e4eeecf1db3be371"/>
-      <w:bookmarkStart w:id="171" w:name="_Toc243945775"/>
+      <w:bookmarkStart w:id="171" w:name="_Toc243948470"/>
       <w:bookmarkEnd w:id="168"/>
       <w:r>
         <w:t>HU-5.13 — Vincularme o desvincularme de una clínica</w:t>
@@ -32514,7 +32514,7 @@
         <w:pStyle w:val="Ttulo2"/>
       </w:pPr>
       <w:bookmarkStart w:id="172" w:name="_faf9cae68ace52a6134b8c807ad8be34010091b"/>
-      <w:bookmarkStart w:id="173" w:name="_Toc243945776"/>
+      <w:bookmarkStart w:id="173" w:name="_Toc243948471"/>
       <w:bookmarkEnd w:id="170"/>
       <w:r>
         <w:t>HU-5.14 — Eliminar mi cuenta (derecho de supresión)</w:t>
@@ -32775,7 +32775,7 @@
         <w:pStyle w:val="Ttulo1"/>
       </w:pPr>
       <w:bookmarkStart w:id="174" w:name="_415d3e183ea3663701acfe1e73f6e8038e4bbef"/>
-      <w:bookmarkStart w:id="175" w:name="_Toc243945777"/>
+      <w:bookmarkStart w:id="175" w:name="_Toc243948472"/>
       <w:bookmarkEnd w:id="144"/>
       <w:bookmarkEnd w:id="172"/>
       <w:r>
@@ -32797,7 +32797,7 @@
         <w:pStyle w:val="Ttulo2"/>
       </w:pPr>
       <w:bookmarkStart w:id="176" w:name="_1b876ecfd0adf71d503b9129568b658f81872f0"/>
-      <w:bookmarkStart w:id="177" w:name="_Toc243945778"/>
+      <w:bookmarkStart w:id="177" w:name="_Toc243948473"/>
       <w:r>
         <w:t>HU-6.1 — Dashboard principal y panel de pendientes</w:t>
       </w:r>
@@ -33193,7 +33193,7 @@
         <w:pStyle w:val="Ttulo2"/>
       </w:pPr>
       <w:bookmarkStart w:id="178" w:name="_97322cabf772225fd1bfe897dee158000aa0394"/>
-      <w:bookmarkStart w:id="179" w:name="_Toc243945779"/>
+      <w:bookmarkStart w:id="179" w:name="_Toc243948474"/>
       <w:bookmarkEnd w:id="176"/>
       <w:r>
         <w:t>HU-6.2 — Panel de operación del administrador</w:t>
@@ -33574,7 +33574,7 @@
         <w:pStyle w:val="Ttulo2"/>
       </w:pPr>
       <w:bookmarkStart w:id="180" w:name="_6ce76d48cd12ce7662f89ac490d75c386fc18ba"/>
-      <w:bookmarkStart w:id="181" w:name="_Toc243945780"/>
+      <w:bookmarkStart w:id="181" w:name="_Toc243948475"/>
       <w:bookmarkEnd w:id="178"/>
       <w:r>
         <w:t>HU-6.3 — Generar reportes en PDF</w:t>
@@ -33860,7 +33860,7 @@
         <w:pStyle w:val="Ttulo2"/>
       </w:pPr>
       <w:bookmarkStart w:id="182" w:name="_132f0b1bfae1ac6054dc51db54a45dff43ec797"/>
-      <w:bookmarkStart w:id="183" w:name="_Toc243945781"/>
+      <w:bookmarkStart w:id="183" w:name="_Toc243948476"/>
       <w:bookmarkEnd w:id="180"/>
       <w:r>
         <w:t>HU-6.4 — Ver estadísticas y gráficas del sistema</w:t>
@@ -34117,7 +34117,7 @@
         <w:pStyle w:val="Ttulo2"/>
       </w:pPr>
       <w:bookmarkStart w:id="184" w:name="_159c41a8740d691e56d865baa1d2a17f58680f5"/>
-      <w:bookmarkStart w:id="185" w:name="_Toc243945782"/>
+      <w:bookmarkStart w:id="185" w:name="_Toc243948477"/>
       <w:bookmarkEnd w:id="182"/>
       <w:r>
         <w:t>HU-6.5 — Exportar reportes a Excel/CSV</w:t>
@@ -34356,7 +34356,7 @@
         <w:pStyle w:val="Ttulo1"/>
       </w:pPr>
       <w:bookmarkStart w:id="186" w:name="_88abf5b53e5603b94c73c4f577271d31a73cc35"/>
-      <w:bookmarkStart w:id="187" w:name="_Toc243945783"/>
+      <w:bookmarkStart w:id="187" w:name="_Toc243948478"/>
       <w:bookmarkEnd w:id="174"/>
       <w:bookmarkEnd w:id="184"/>
       <w:r>
@@ -34378,7 +34378,7 @@
         <w:pStyle w:val="Ttulo2"/>
       </w:pPr>
       <w:bookmarkStart w:id="188" w:name="_003ad6784c61069e91989793d8255e8d4cb519d"/>
-      <w:bookmarkStart w:id="189" w:name="_Toc243945784"/>
+      <w:bookmarkStart w:id="189" w:name="_Toc243948479"/>
       <w:r>
         <w:t>HU-7.1 — Configurar los horarios de atención de la clínica</w:t>
       </w:r>
@@ -34657,7 +34657,7 @@
         <w:pStyle w:val="Ttulo2"/>
       </w:pPr>
       <w:bookmarkStart w:id="190" w:name="_42539d8b8201701c75c37499984fbffa69d6e4d"/>
-      <w:bookmarkStart w:id="191" w:name="_Toc243945785"/>
+      <w:bookmarkStart w:id="191" w:name="_Toc243948480"/>
       <w:bookmarkEnd w:id="188"/>
       <w:r>
         <w:t>HU-7.2 — Gestionar los catálogos del sistema</w:t>
@@ -34938,7 +34938,7 @@
         <w:pStyle w:val="Ttulo2"/>
       </w:pPr>
       <w:bookmarkStart w:id="192" w:name="_a0aee2f406b049ed83cfe391a77b0db14b5bfdf"/>
-      <w:bookmarkStart w:id="193" w:name="_Toc243945786"/>
+      <w:bookmarkStart w:id="193" w:name="_Toc243948481"/>
       <w:bookmarkEnd w:id="190"/>
       <w:r>
         <w:t>HU-7.3 — Gestionar los veterinarios y sus especialidades</w:t>
@@ -35207,7 +35207,7 @@
         <w:pStyle w:val="Ttulo2"/>
       </w:pPr>
       <w:bookmarkStart w:id="194" w:name="_a0688e3f345f7bf587dcedb8b562b8964a6cacc"/>
-      <w:bookmarkStart w:id="195" w:name="_Toc243945787"/>
+      <w:bookmarkStart w:id="195" w:name="_Toc243948482"/>
       <w:bookmarkEnd w:id="192"/>
       <w:r>
         <w:t>HU-7.4 — Personalizar la clínica: marca y tipos de cita</w:t>
@@ -35388,7 +35388,7 @@
         </w:numPr>
       </w:pPr>
       <w:r>
-        <w:t>Configuro los datos de marca de la clínica: nombre, logo y datos de contacto, incluido el teléfono de urgencias que se muestra cuando la clínica está cerrada.</w:t>
+        <w:t>Configuro los datos de marca de la clínica: nombre, logo y datos de contacto, incluido el teléfono de urgencias que se muestra cuando la clínica está cerrada. Elijo o arrastro el logo con vista previa (JPG, PNG o WebP de hasta 5 MB); teléfonos con selector de país, correo de contacto válido sin unicidad de cuenta y errores junto al inicio de cada campo.</w:t>
       </w:r>
     </w:p>
     <w:p>
@@ -35401,7 +35401,7 @@
       </w:pPr>
       <w:r>
         <w:lastRenderedPageBreak/>
-        <w:t xml:space="preserve">Gestiono los tipos de cita de la clínica, cada uno con su duración, su margen (buffer), insumo del cálculo de disponibilidad (RN-415), y si es </w:t>
+        <w:t xml:space="preserve">Gestiono los tipos de cita de la clínica, cada uno con su duración de 1 a 720 minutos y su margen (buffer) de 0 a 120 minutos (decisión del dueño, 2026-10-26), insumo del cálculo de disponibilidad (RN-415), y si es </w:t>
       </w:r>
       <w:r>
         <w:rPr>
@@ -35471,7 +35471,10 @@
         <w:t>Reglas de negocio:</w:t>
       </w:r>
       <w:r>
-        <w:t xml:space="preserve"> RN-009, RN-415, RN-421, RN-701, RN-427 · </w:t>
+        <w:t xml:space="preserve"> </w:t>
+      </w:r>
+      <w:r>
+        <w:t xml:space="preserve">RN-009, RN-415, RN-421, RN-701, RN-427 · </w:t>
       </w:r>
       <w:r>
         <w:rPr>
@@ -35499,7 +35502,7 @@
         <w:pStyle w:val="Ttulo2"/>
       </w:pPr>
       <w:bookmarkStart w:id="196" w:name="_7004fcdc7c25449422304e35d609c3113b471f6"/>
-      <w:bookmarkStart w:id="197" w:name="_Toc243945788"/>
+      <w:bookmarkStart w:id="197" w:name="_Toc243948483"/>
       <w:bookmarkEnd w:id="194"/>
       <w:r>
         <w:t>HU-7.5 — Parámetros del sistema configurables</w:t>
@@ -35687,10 +35690,7 @@
         <w:t>(v2.0)</w:t>
       </w:r>
       <w:r>
-        <w:t xml:space="preserve"> </w:t>
-      </w:r>
-      <w:r>
-        <w:t>La agenda usa valores por defecto para tolerancia de llegada tarde, plazo de confirmación de reasignación, umbral de aviso y tope de sobrecupos. El teléfono de urgencias se captura en los datos de la clínica (HU-7.4). En v2.1 el administrador puede configurar estos parámetros.</w:t>
+        <w:t xml:space="preserve"> La agenda usa valores por defecto para tolerancia de llegada tarde, plazo de confirmación de reasignación, umbral de aviso y tope de sobrecupos. El teléfono de urgencias se captura en los datos de la clínica (HU-7.4). En v2.1 el administrador puede configurar estos parámetros.</w:t>
       </w:r>
     </w:p>
     <w:p>
@@ -35769,7 +35769,7 @@
         <w:pStyle w:val="Ttulo1"/>
       </w:pPr>
       <w:bookmarkStart w:id="198" w:name="_99f8c38fc90f872e869cb5a42176a81ce60716e"/>
-      <w:bookmarkStart w:id="199" w:name="_Toc243945789"/>
+      <w:bookmarkStart w:id="199" w:name="_Toc243948484"/>
       <w:bookmarkEnd w:id="186"/>
       <w:bookmarkEnd w:id="196"/>
       <w:r>
@@ -35798,7 +35798,7 @@
         <w:pStyle w:val="Ttulo2"/>
       </w:pPr>
       <w:bookmarkStart w:id="200" w:name="_6b93d7ad964c8104bb83fc9231a04e4fc4e5a57"/>
-      <w:bookmarkStart w:id="201" w:name="_Toc243945790"/>
+      <w:bookmarkStart w:id="201" w:name="_Toc243948485"/>
       <w:r>
         <w:t>HU-8.1 — Calificar al veterinario tras una consulta atendida</w:t>
       </w:r>
@@ -36103,7 +36103,7 @@
         <w:pStyle w:val="Ttulo2"/>
       </w:pPr>
       <w:bookmarkStart w:id="202" w:name="_6de705a3e3f0ae827b0b0206b40472100ec5dc2"/>
-      <w:bookmarkStart w:id="203" w:name="_Toc243945791"/>
+      <w:bookmarkStart w:id="203" w:name="_Toc243948486"/>
       <w:bookmarkEnd w:id="200"/>
       <w:r>
         <w:t>HU-8.2 — Perfil público del veterinario</w:t>
@@ -36349,7 +36349,7 @@
         <w:pStyle w:val="Ttulo2"/>
       </w:pPr>
       <w:bookmarkStart w:id="204" w:name="_8d0438a4c21826cdef43f79f40a5abd8a052054"/>
-      <w:bookmarkStart w:id="205" w:name="_Toc243945792"/>
+      <w:bookmarkStart w:id="205" w:name="_Toc243948487"/>
       <w:bookmarkEnd w:id="202"/>
       <w:r>
         <w:lastRenderedPageBreak/>
@@ -36595,7 +36595,7 @@
         <w:pStyle w:val="Ttulo2"/>
       </w:pPr>
       <w:bookmarkStart w:id="206" w:name="_9d375ff686aceee42a269dcad0f742f5e2f3757"/>
-      <w:bookmarkStart w:id="207" w:name="_Toc243945793"/>
+      <w:bookmarkStart w:id="207" w:name="_Toc243948488"/>
       <w:bookmarkEnd w:id="204"/>
       <w:r>
         <w:t>HU-8.4 — Tiempos de envío de recordatorios configurables</w:t>
@@ -36819,7 +36819,7 @@
         <w:pStyle w:val="Ttulo2"/>
       </w:pPr>
       <w:bookmarkStart w:id="208" w:name="_09d49d8f9ce2d4331632fad53df16df04e0463f"/>
-      <w:bookmarkStart w:id="209" w:name="_Toc243945794"/>
+      <w:bookmarkStart w:id="209" w:name="_Toc243948489"/>
       <w:bookmarkEnd w:id="206"/>
       <w:r>
         <w:t>HU-8.5 — Bitácora de correos y notificaciones</w:t>
@@ -37043,7 +37043,7 @@
         <w:pStyle w:val="Ttulo1"/>
       </w:pPr>
       <w:bookmarkStart w:id="210" w:name="_739f4e5454618e53e20de4c2474955375ba75c3"/>
-      <w:bookmarkStart w:id="211" w:name="_Toc243945795"/>
+      <w:bookmarkStart w:id="211" w:name="_Toc243948490"/>
       <w:bookmarkEnd w:id="198"/>
       <w:bookmarkEnd w:id="208"/>
       <w:r>
@@ -37065,7 +37065,7 @@
         <w:pStyle w:val="Ttulo2"/>
       </w:pPr>
       <w:bookmarkStart w:id="212" w:name="_062138411ab05c870ba796ff3d39feef69a18f5"/>
-      <w:bookmarkStart w:id="213" w:name="_Toc243945796"/>
+      <w:bookmarkStart w:id="213" w:name="_Toc243948491"/>
       <w:r>
         <w:t>HU-9.1 — Página pública y políticas legales</w:t>
       </w:r>
@@ -37290,7 +37290,7 @@
         <w:pStyle w:val="Ttulo1"/>
       </w:pPr>
       <w:bookmarkStart w:id="214" w:name="_6e6ded5804ca164f89e595fd787218d3285fdda"/>
-      <w:bookmarkStart w:id="215" w:name="_Toc243945797"/>
+      <w:bookmarkStart w:id="215" w:name="_Toc243948492"/>
       <w:bookmarkEnd w:id="210"/>
       <w:bookmarkEnd w:id="212"/>
       <w:r>
@@ -37340,7 +37340,7 @@
         <w:pStyle w:val="Ttulo2"/>
       </w:pPr>
       <w:bookmarkStart w:id="216" w:name="_84c91a7718df0375d71f3af5025108c0495eae8"/>
-      <w:bookmarkStart w:id="217" w:name="_Toc243945798"/>
+      <w:bookmarkStart w:id="217" w:name="_Toc243948493"/>
       <w:r>
         <w:t>Entrega v2.0 — imprescindible para la presentación (29 historias; 159 puntos estimados y HU-2.12 por estimar)</w:t>
       </w:r>
@@ -38888,7 +38888,7 @@
         <w:pStyle w:val="Ttulo2"/>
       </w:pPr>
       <w:bookmarkStart w:id="218" w:name="_4726c838c4287a7aa8f67a2e091a84cc61b2bb0"/>
-      <w:bookmarkStart w:id="219" w:name="_Toc243945799"/>
+      <w:bookmarkStart w:id="219" w:name="_Toc243948494"/>
       <w:bookmarkEnd w:id="216"/>
       <w:r>
         <w:t>Entrega v2.1 — completa el alcance (16 historias; estimación de HU-0.5 pendiente)</w:t>
@@ -39839,7 +39839,7 @@
         <w:pStyle w:val="Ttulo2"/>
       </w:pPr>
       <w:bookmarkStart w:id="220" w:name="_18e859a36e2a2c7f781eaf2084ffc20b263712e"/>
-      <w:bookmarkStart w:id="221" w:name="_Toc243945800"/>
+      <w:bookmarkStart w:id="221" w:name="_Toc243948495"/>
       <w:bookmarkEnd w:id="218"/>
       <w:r>
         <w:t>Historias diferidas que absorbe la v2</w:t>
@@ -40190,7 +40190,7 @@
         <w:pStyle w:val="Ttulo1"/>
       </w:pPr>
       <w:bookmarkStart w:id="222" w:name="_2bd3782f46f42f4ba497da64d292df25adf2039"/>
-      <w:bookmarkStart w:id="223" w:name="_Toc243945801"/>
+      <w:bookmarkStart w:id="223" w:name="_Toc243948496"/>
       <w:bookmarkEnd w:id="214"/>
       <w:bookmarkEnd w:id="220"/>
       <w:r>
@@ -44980,7 +44980,7 @@
         <w:pStyle w:val="Ttulo1"/>
       </w:pPr>
       <w:bookmarkStart w:id="224" w:name="_628434b2c6f40c9643f3958509c62867ee6f47b"/>
-      <w:bookmarkStart w:id="225" w:name="_Toc243945802"/>
+      <w:bookmarkStart w:id="225" w:name="_Toc243948497"/>
       <w:bookmarkEnd w:id="222"/>
       <w:r>
         <w:lastRenderedPageBreak/>
@@ -50545,7 +50545,7 @@
               <w:noProof/>
             </w:rPr>
             <w:drawing>
-              <wp:inline distT="0" distB="0" distL="0" distR="0" wp14:anchorId="2FEB2B0D" wp14:editId="2FEB2B0E">
+              <wp:inline distT="0" distB="0" distL="0" distR="0" wp14:anchorId="400BCDDA" wp14:editId="400BCDDB">
                 <wp:extent cx="324000" cy="324000"/>
                 <wp:effectExtent l="0" t="0" r="0" b="0"/>
                 <wp:docPr id="9001" name="Logo Zooki"/>
@@ -50712,7 +50712,7 @@
   <w:abstractNum w:abstractNumId="0" w15:restartNumberingAfterBreak="0">
     <w:nsid w:val="0000A991"/>
     <w:multiLevelType w:val="multilevel"/>
-    <w:tmpl w:val="1DD26EFE"/>
+    <w:tmpl w:val="2C0C2DA6"/>
     <w:lvl w:ilvl="0">
       <w:numFmt w:val="bullet"/>
       <w:lvlText w:val=""/>
@@ -50813,295 +50813,295 @@
       </w:rPr>
     </w:lvl>
   </w:abstractNum>
-  <w:num w:numId="1" w16cid:durableId="433980934">
+  <w:num w:numId="1" w16cid:durableId="167260593">
     <w:abstractNumId w:val="0"/>
   </w:num>
-  <w:num w:numId="2" w16cid:durableId="842011914">
+  <w:num w:numId="2" w16cid:durableId="363872788">
     <w:abstractNumId w:val="0"/>
   </w:num>
-  <w:num w:numId="3" w16cid:durableId="1970280038">
+  <w:num w:numId="3" w16cid:durableId="299725678">
     <w:abstractNumId w:val="0"/>
   </w:num>
-  <w:num w:numId="4" w16cid:durableId="1324361161">
+  <w:num w:numId="4" w16cid:durableId="1027104736">
     <w:abstractNumId w:val="0"/>
   </w:num>
-  <w:num w:numId="5" w16cid:durableId="1674458034">
+  <w:num w:numId="5" w16cid:durableId="669598813">
     <w:abstractNumId w:val="0"/>
   </w:num>
-  <w:num w:numId="6" w16cid:durableId="1298609795">
+  <w:num w:numId="6" w16cid:durableId="294608661">
     <w:abstractNumId w:val="0"/>
   </w:num>
-  <w:num w:numId="7" w16cid:durableId="1551189236">
+  <w:num w:numId="7" w16cid:durableId="143014283">
     <w:abstractNumId w:val="0"/>
   </w:num>
-  <w:num w:numId="8" w16cid:durableId="2052414714">
+  <w:num w:numId="8" w16cid:durableId="421267331">
     <w:abstractNumId w:val="0"/>
   </w:num>
-  <w:num w:numId="9" w16cid:durableId="893855870">
+  <w:num w:numId="9" w16cid:durableId="718819394">
     <w:abstractNumId w:val="0"/>
   </w:num>
-  <w:num w:numId="10" w16cid:durableId="69691640">
+  <w:num w:numId="10" w16cid:durableId="1843470143">
     <w:abstractNumId w:val="0"/>
   </w:num>
-  <w:num w:numId="11" w16cid:durableId="198858013">
+  <w:num w:numId="11" w16cid:durableId="194781104">
     <w:abstractNumId w:val="0"/>
   </w:num>
-  <w:num w:numId="12" w16cid:durableId="434987019">
+  <w:num w:numId="12" w16cid:durableId="497423935">
     <w:abstractNumId w:val="0"/>
   </w:num>
-  <w:num w:numId="13" w16cid:durableId="1625767434">
+  <w:num w:numId="13" w16cid:durableId="2066367121">
     <w:abstractNumId w:val="0"/>
   </w:num>
-  <w:num w:numId="14" w16cid:durableId="1129014802">
+  <w:num w:numId="14" w16cid:durableId="214317487">
     <w:abstractNumId w:val="0"/>
   </w:num>
-  <w:num w:numId="15" w16cid:durableId="1560246969">
+  <w:num w:numId="15" w16cid:durableId="1905866941">
     <w:abstractNumId w:val="0"/>
   </w:num>
-  <w:num w:numId="16" w16cid:durableId="1095592696">
+  <w:num w:numId="16" w16cid:durableId="101270309">
     <w:abstractNumId w:val="0"/>
   </w:num>
-  <w:num w:numId="17" w16cid:durableId="1897470158">
+  <w:num w:numId="17" w16cid:durableId="1978677599">
     <w:abstractNumId w:val="0"/>
   </w:num>
-  <w:num w:numId="18" w16cid:durableId="498663679">
+  <w:num w:numId="18" w16cid:durableId="2016374375">
     <w:abstractNumId w:val="0"/>
   </w:num>
-  <w:num w:numId="19" w16cid:durableId="1402680516">
+  <w:num w:numId="19" w16cid:durableId="1693650807">
     <w:abstractNumId w:val="0"/>
   </w:num>
-  <w:num w:numId="20" w16cid:durableId="763571351">
+  <w:num w:numId="20" w16cid:durableId="924190974">
     <w:abstractNumId w:val="0"/>
   </w:num>
-  <w:num w:numId="21" w16cid:durableId="351418074">
+  <w:num w:numId="21" w16cid:durableId="867570102">
     <w:abstractNumId w:val="0"/>
   </w:num>
-  <w:num w:numId="22" w16cid:durableId="1363017899">
+  <w:num w:numId="22" w16cid:durableId="281691376">
     <w:abstractNumId w:val="0"/>
   </w:num>
-  <w:num w:numId="23" w16cid:durableId="711538105">
+  <w:num w:numId="23" w16cid:durableId="320277751">
     <w:abstractNumId w:val="0"/>
   </w:num>
-  <w:num w:numId="24" w16cid:durableId="969017560">
+  <w:num w:numId="24" w16cid:durableId="2092965008">
     <w:abstractNumId w:val="0"/>
   </w:num>
-  <w:num w:numId="25" w16cid:durableId="242107625">
+  <w:num w:numId="25" w16cid:durableId="145098770">
     <w:abstractNumId w:val="0"/>
   </w:num>
-  <w:num w:numId="26" w16cid:durableId="575019006">
+  <w:num w:numId="26" w16cid:durableId="1905405491">
     <w:abstractNumId w:val="0"/>
   </w:num>
-  <w:num w:numId="27" w16cid:durableId="2067758312">
+  <w:num w:numId="27" w16cid:durableId="1548450428">
     <w:abstractNumId w:val="0"/>
   </w:num>
-  <w:num w:numId="28" w16cid:durableId="226888888">
+  <w:num w:numId="28" w16cid:durableId="135613117">
     <w:abstractNumId w:val="0"/>
   </w:num>
-  <w:num w:numId="29" w16cid:durableId="1574505633">
+  <w:num w:numId="29" w16cid:durableId="1623337650">
     <w:abstractNumId w:val="0"/>
   </w:num>
-  <w:num w:numId="30" w16cid:durableId="1587228677">
+  <w:num w:numId="30" w16cid:durableId="2012096571">
     <w:abstractNumId w:val="0"/>
   </w:num>
-  <w:num w:numId="31" w16cid:durableId="1148015349">
+  <w:num w:numId="31" w16cid:durableId="2059359055">
     <w:abstractNumId w:val="0"/>
   </w:num>
-  <w:num w:numId="32" w16cid:durableId="1983265723">
+  <w:num w:numId="32" w16cid:durableId="1083070483">
     <w:abstractNumId w:val="0"/>
   </w:num>
-  <w:num w:numId="33" w16cid:durableId="1187253910">
+  <w:num w:numId="33" w16cid:durableId="851648032">
     <w:abstractNumId w:val="0"/>
   </w:num>
-  <w:num w:numId="34" w16cid:durableId="1131707629">
+  <w:num w:numId="34" w16cid:durableId="1536963675">
     <w:abstractNumId w:val="0"/>
   </w:num>
-  <w:num w:numId="35" w16cid:durableId="1204947799">
+  <w:num w:numId="35" w16cid:durableId="272979991">
     <w:abstractNumId w:val="0"/>
   </w:num>
-  <w:num w:numId="36" w16cid:durableId="1604454980">
+  <w:num w:numId="36" w16cid:durableId="1794709778">
     <w:abstractNumId w:val="0"/>
   </w:num>
-  <w:num w:numId="37" w16cid:durableId="1662852769">
+  <w:num w:numId="37" w16cid:durableId="1241060643">
     <w:abstractNumId w:val="0"/>
   </w:num>
-  <w:num w:numId="38" w16cid:durableId="417291174">
+  <w:num w:numId="38" w16cid:durableId="1779182610">
     <w:abstractNumId w:val="0"/>
   </w:num>
-  <w:num w:numId="39" w16cid:durableId="1290673362">
+  <w:num w:numId="39" w16cid:durableId="247885451">
     <w:abstractNumId w:val="0"/>
   </w:num>
-  <w:num w:numId="40" w16cid:durableId="398098229">
+  <w:num w:numId="40" w16cid:durableId="378094478">
     <w:abstractNumId w:val="0"/>
   </w:num>
-  <w:num w:numId="41" w16cid:durableId="814688605">
+  <w:num w:numId="41" w16cid:durableId="1926497163">
     <w:abstractNumId w:val="0"/>
   </w:num>
-  <w:num w:numId="42" w16cid:durableId="1670064301">
+  <w:num w:numId="42" w16cid:durableId="695616596">
     <w:abstractNumId w:val="0"/>
   </w:num>
-  <w:num w:numId="43" w16cid:durableId="577330045">
+  <w:num w:numId="43" w16cid:durableId="247230606">
     <w:abstractNumId w:val="0"/>
   </w:num>
-  <w:num w:numId="44" w16cid:durableId="2045137098">
+  <w:num w:numId="44" w16cid:durableId="210651058">
     <w:abstractNumId w:val="0"/>
   </w:num>
-  <w:num w:numId="45" w16cid:durableId="1791700943">
+  <w:num w:numId="45" w16cid:durableId="775952325">
     <w:abstractNumId w:val="0"/>
   </w:num>
-  <w:num w:numId="46" w16cid:durableId="1587419708">
+  <w:num w:numId="46" w16cid:durableId="1327320848">
     <w:abstractNumId w:val="0"/>
   </w:num>
-  <w:num w:numId="47" w16cid:durableId="353501772">
+  <w:num w:numId="47" w16cid:durableId="606424356">
     <w:abstractNumId w:val="0"/>
   </w:num>
-  <w:num w:numId="48" w16cid:durableId="917834540">
+  <w:num w:numId="48" w16cid:durableId="1153254067">
     <w:abstractNumId w:val="0"/>
   </w:num>
-  <w:num w:numId="49" w16cid:durableId="92290435">
+  <w:num w:numId="49" w16cid:durableId="1262179118">
     <w:abstractNumId w:val="0"/>
   </w:num>
-  <w:num w:numId="50" w16cid:durableId="1306734881">
+  <w:num w:numId="50" w16cid:durableId="1496726131">
     <w:abstractNumId w:val="0"/>
   </w:num>
-  <w:num w:numId="51" w16cid:durableId="307441148">
+  <w:num w:numId="51" w16cid:durableId="1898125672">
     <w:abstractNumId w:val="0"/>
   </w:num>
-  <w:num w:numId="52" w16cid:durableId="1609583435">
+  <w:num w:numId="52" w16cid:durableId="1649213959">
     <w:abstractNumId w:val="0"/>
   </w:num>
-  <w:num w:numId="53" w16cid:durableId="738796427">
+  <w:num w:numId="53" w16cid:durableId="1956791427">
     <w:abstractNumId w:val="0"/>
   </w:num>
-  <w:num w:numId="54" w16cid:durableId="1359890548">
+  <w:num w:numId="54" w16cid:durableId="1104231472">
     <w:abstractNumId w:val="0"/>
   </w:num>
-  <w:num w:numId="55" w16cid:durableId="1996839830">
+  <w:num w:numId="55" w16cid:durableId="111285034">
     <w:abstractNumId w:val="0"/>
   </w:num>
-  <w:num w:numId="56" w16cid:durableId="2015375792">
+  <w:num w:numId="56" w16cid:durableId="831020714">
     <w:abstractNumId w:val="0"/>
   </w:num>
-  <w:num w:numId="57" w16cid:durableId="1242372812">
+  <w:num w:numId="57" w16cid:durableId="1891918222">
     <w:abstractNumId w:val="0"/>
   </w:num>
-  <w:num w:numId="58" w16cid:durableId="344091793">
+  <w:num w:numId="58" w16cid:durableId="1321229924">
     <w:abstractNumId w:val="0"/>
   </w:num>
-  <w:num w:numId="59" w16cid:durableId="735319226">
+  <w:num w:numId="59" w16cid:durableId="454181706">
     <w:abstractNumId w:val="0"/>
   </w:num>
-  <w:num w:numId="60" w16cid:durableId="109781506">
+  <w:num w:numId="60" w16cid:durableId="109469832">
     <w:abstractNumId w:val="0"/>
   </w:num>
-  <w:num w:numId="61" w16cid:durableId="1347829765">
+  <w:num w:numId="61" w16cid:durableId="2040162078">
     <w:abstractNumId w:val="0"/>
   </w:num>
-  <w:num w:numId="62" w16cid:durableId="866453422">
+  <w:num w:numId="62" w16cid:durableId="1933778591">
     <w:abstractNumId w:val="0"/>
   </w:num>
-  <w:num w:numId="63" w16cid:durableId="1530988597">
+  <w:num w:numId="63" w16cid:durableId="1102259850">
     <w:abstractNumId w:val="0"/>
   </w:num>
-  <w:num w:numId="64" w16cid:durableId="2123454947">
+  <w:num w:numId="64" w16cid:durableId="310603442">
     <w:abstractNumId w:val="0"/>
   </w:num>
-  <w:num w:numId="65" w16cid:durableId="625889167">
+  <w:num w:numId="65" w16cid:durableId="393546773">
     <w:abstractNumId w:val="0"/>
   </w:num>
-  <w:num w:numId="66" w16cid:durableId="1663119245">
+  <w:num w:numId="66" w16cid:durableId="1467352205">
     <w:abstractNumId w:val="0"/>
   </w:num>
-  <w:num w:numId="67" w16cid:durableId="533883133">
+  <w:num w:numId="67" w16cid:durableId="691151797">
     <w:abstractNumId w:val="0"/>
   </w:num>
-  <w:num w:numId="68" w16cid:durableId="457843545">
+  <w:num w:numId="68" w16cid:durableId="1173253039">
     <w:abstractNumId w:val="0"/>
   </w:num>
-  <w:num w:numId="69" w16cid:durableId="1719284613">
+  <w:num w:numId="69" w16cid:durableId="17393281">
     <w:abstractNumId w:val="0"/>
   </w:num>
-  <w:num w:numId="70" w16cid:durableId="1758940476">
+  <w:num w:numId="70" w16cid:durableId="1373073600">
     <w:abstractNumId w:val="0"/>
   </w:num>
-  <w:num w:numId="71" w16cid:durableId="474493973">
+  <w:num w:numId="71" w16cid:durableId="427967597">
     <w:abstractNumId w:val="0"/>
   </w:num>
-  <w:num w:numId="72" w16cid:durableId="1767530984">
+  <w:num w:numId="72" w16cid:durableId="968703532">
     <w:abstractNumId w:val="0"/>
   </w:num>
-  <w:num w:numId="73" w16cid:durableId="1432701990">
+  <w:num w:numId="73" w16cid:durableId="1744765222">
     <w:abstractNumId w:val="0"/>
   </w:num>
-  <w:num w:numId="74" w16cid:durableId="1548486470">
+  <w:num w:numId="74" w16cid:durableId="870915507">
     <w:abstractNumId w:val="0"/>
   </w:num>
-  <w:num w:numId="75" w16cid:durableId="1304458325">
+  <w:num w:numId="75" w16cid:durableId="1039086276">
     <w:abstractNumId w:val="0"/>
   </w:num>
-  <w:num w:numId="76" w16cid:durableId="437985933">
+  <w:num w:numId="76" w16cid:durableId="1321157264">
     <w:abstractNumId w:val="0"/>
   </w:num>
-  <w:num w:numId="77" w16cid:durableId="289552718">
+  <w:num w:numId="77" w16cid:durableId="2087721780">
     <w:abstractNumId w:val="0"/>
   </w:num>
-  <w:num w:numId="78" w16cid:durableId="523399391">
+  <w:num w:numId="78" w16cid:durableId="1348211264">
     <w:abstractNumId w:val="0"/>
   </w:num>
-  <w:num w:numId="79" w16cid:durableId="2139908183">
+  <w:num w:numId="79" w16cid:durableId="688063629">
     <w:abstractNumId w:val="0"/>
   </w:num>
-  <w:num w:numId="80" w16cid:durableId="1077629383">
+  <w:num w:numId="80" w16cid:durableId="653683817">
     <w:abstractNumId w:val="0"/>
   </w:num>
-  <w:num w:numId="81" w16cid:durableId="902759503">
+  <w:num w:numId="81" w16cid:durableId="964696310">
     <w:abstractNumId w:val="0"/>
   </w:num>
-  <w:num w:numId="82" w16cid:durableId="1474953712">
+  <w:num w:numId="82" w16cid:durableId="1964114597">
     <w:abstractNumId w:val="0"/>
   </w:num>
-  <w:num w:numId="83" w16cid:durableId="73019024">
+  <w:num w:numId="83" w16cid:durableId="546839552">
     <w:abstractNumId w:val="0"/>
   </w:num>
-  <w:num w:numId="84" w16cid:durableId="1757240332">
+  <w:num w:numId="84" w16cid:durableId="116069540">
     <w:abstractNumId w:val="0"/>
   </w:num>
-  <w:num w:numId="85" w16cid:durableId="21056249">
+  <w:num w:numId="85" w16cid:durableId="354506256">
     <w:abstractNumId w:val="0"/>
   </w:num>
-  <w:num w:numId="86" w16cid:durableId="1449930731">
+  <w:num w:numId="86" w16cid:durableId="2108885484">
     <w:abstractNumId w:val="0"/>
   </w:num>
-  <w:num w:numId="87" w16cid:durableId="364254734">
+  <w:num w:numId="87" w16cid:durableId="1432823816">
     <w:abstractNumId w:val="0"/>
   </w:num>
-  <w:num w:numId="88" w16cid:durableId="1569610280">
+  <w:num w:numId="88" w16cid:durableId="1629433762">
     <w:abstractNumId w:val="0"/>
   </w:num>
-  <w:num w:numId="89" w16cid:durableId="274677557">
+  <w:num w:numId="89" w16cid:durableId="770398942">
     <w:abstractNumId w:val="0"/>
   </w:num>
-  <w:num w:numId="90" w16cid:durableId="1193769429">
+  <w:num w:numId="90" w16cid:durableId="135222091">
     <w:abstractNumId w:val="0"/>
   </w:num>
-  <w:num w:numId="91" w16cid:durableId="565381709">
+  <w:num w:numId="91" w16cid:durableId="259919958">
     <w:abstractNumId w:val="0"/>
   </w:num>
-  <w:num w:numId="92" w16cid:durableId="1501387006">
+  <w:num w:numId="92" w16cid:durableId="1394432444">
     <w:abstractNumId w:val="0"/>
   </w:num>
-  <w:num w:numId="93" w16cid:durableId="111823319">
+  <w:num w:numId="93" w16cid:durableId="1955138902">
     <w:abstractNumId w:val="0"/>
   </w:num>
-  <w:num w:numId="94" w16cid:durableId="939800241">
+  <w:num w:numId="94" w16cid:durableId="1879276669">
     <w:abstractNumId w:val="0"/>
   </w:num>
-  <w:num w:numId="95" w16cid:durableId="970473731">
+  <w:num w:numId="95" w16cid:durableId="1575966680">
     <w:abstractNumId w:val="0"/>
   </w:num>
-  <w:num w:numId="96" w16cid:durableId="585185475">
+  <w:num w:numId="96" w16cid:durableId="1172723574">
     <w:abstractNumId w:val="0"/>
   </w:num>
-  <w:num w:numId="97" w16cid:durableId="1309360514">
+  <w:num w:numId="97" w16cid:durableId="322469162">
     <w:abstractNumId w:val="0"/>
   </w:num>
   <w:numIdMacAtCleanup w:val="97"/>
@@ -52493,7 +52493,7 @@
     <w:autoRedefine/>
     <w:uiPriority w:val="39"/>
     <w:unhideWhenUsed/>
-    <w:rsid w:val="00392360"/>
+    <w:rsid w:val="006D75C8"/>
     <w:pPr>
       <w:spacing w:after="100" w:line="278" w:lineRule="auto"/>
       <w:ind w:left="480"/>
@@ -52512,7 +52512,7 @@
     <w:autoRedefine/>
     <w:uiPriority w:val="39"/>
     <w:unhideWhenUsed/>
-    <w:rsid w:val="00392360"/>
+    <w:rsid w:val="006D75C8"/>
     <w:pPr>
       <w:spacing w:after="100" w:line="278" w:lineRule="auto"/>
       <w:ind w:left="720"/>
@@ -52531,7 +52531,7 @@
     <w:autoRedefine/>
     <w:uiPriority w:val="39"/>
     <w:unhideWhenUsed/>
-    <w:rsid w:val="00392360"/>
+    <w:rsid w:val="006D75C8"/>
     <w:pPr>
       <w:spacing w:after="100" w:line="278" w:lineRule="auto"/>
       <w:ind w:left="960"/>
@@ -52550,7 +52550,7 @@
     <w:autoRedefine/>
     <w:uiPriority w:val="39"/>
     <w:unhideWhenUsed/>
-    <w:rsid w:val="00392360"/>
+    <w:rsid w:val="006D75C8"/>
     <w:pPr>
       <w:spacing w:after="100" w:line="278" w:lineRule="auto"/>
       <w:ind w:left="1200"/>
@@ -52569,7 +52569,7 @@
     <w:autoRedefine/>
     <w:uiPriority w:val="39"/>
     <w:unhideWhenUsed/>
-    <w:rsid w:val="00392360"/>
+    <w:rsid w:val="006D75C8"/>
     <w:pPr>
       <w:spacing w:after="100" w:line="278" w:lineRule="auto"/>
       <w:ind w:left="1440"/>
@@ -52588,7 +52588,7 @@
     <w:autoRedefine/>
     <w:uiPriority w:val="39"/>
     <w:unhideWhenUsed/>
-    <w:rsid w:val="00392360"/>
+    <w:rsid w:val="006D75C8"/>
     <w:pPr>
       <w:spacing w:after="100" w:line="278" w:lineRule="auto"/>
       <w:ind w:left="1680"/>
@@ -52607,7 +52607,7 @@
     <w:autoRedefine/>
     <w:uiPriority w:val="39"/>
     <w:unhideWhenUsed/>
-    <w:rsid w:val="00392360"/>
+    <w:rsid w:val="006D75C8"/>
     <w:pPr>
       <w:spacing w:after="100" w:line="278" w:lineRule="auto"/>
       <w:ind w:left="1920"/>
@@ -52625,7 +52625,7 @@
     <w:uiPriority w:val="99"/>
     <w:semiHidden/>
     <w:unhideWhenUsed/>
-    <w:rsid w:val="00392360"/>
+    <w:rsid w:val="006D75C8"/>
     <w:rPr>
       <w:color w:val="605E5C"/>
       <w:shd w:val="clear" w:color="auto" w:fill="E1DFDD"/>

</xml_diff>

<commit_message>
feat(plataforma): panel de plataforma redisenado y mapa del conocimiento en 3D con pantalla completa (HU-0.3, HU-2.12, RE-2.12.6, RNF-16)
</commit_message>
<xml_diff>
--- a/public/docs/descargas/hu.docx
+++ b/public/docs/descargas/hu.docx
@@ -93,7 +93,7 @@
           <w:noProof/>
         </w:rPr>
         <w:drawing>
-          <wp:inline distT="0" distB="0" distL="0" distR="0" wp14:anchorId="400BCDCE" wp14:editId="400BCDCF">
+          <wp:inline distT="0" distB="0" distL="0" distR="0" wp14:anchorId="5A49B955" wp14:editId="5A49B956">
             <wp:extent cx="395999" cy="405503"/>
             <wp:effectExtent l="0" t="0" r="0" b="0"/>
             <wp:docPr id="10" name="Picture"/>
@@ -229,7 +229,7 @@
               <w:pStyle w:val="Celda"/>
             </w:pPr>
             <w:r>
-              <w:t>26/10/2026</w:t>
+              <w:t>28/10/2026</w:t>
             </w:r>
           </w:p>
         </w:tc>
@@ -409,7 +409,7 @@
       <w:r>
         <w:fldChar w:fldCharType="separate"/>
       </w:r>
-      <w:hyperlink w:anchor="_Toc243948385" w:history="1">
+      <w:hyperlink w:anchor="_Toc244091175" w:history="1">
         <w:r>
           <w:rPr>
             <w:rStyle w:val="Hipervnculo"/>
@@ -445,7 +445,7 @@
             <w:noProof/>
             <w:webHidden/>
           </w:rPr>
-          <w:instrText xml:space="preserve"> PAGEREF _Toc243948385 \h </w:instrText>
+          <w:instrText xml:space="preserve"> PAGEREF _Toc244091175 \h </w:instrText>
         </w:r>
         <w:r>
           <w:rPr>
@@ -488,7 +488,7 @@
           <w14:ligatures w14:val="standardContextual"/>
         </w:rPr>
       </w:pPr>
-      <w:hyperlink w:anchor="_Toc243948386" w:history="1">
+      <w:hyperlink w:anchor="_Toc244091176" w:history="1">
         <w:r>
           <w:rPr>
             <w:rStyle w:val="Hipervnculo"/>
@@ -515,7 +515,7 @@
             <w:noProof/>
             <w:webHidden/>
           </w:rPr>
-          <w:instrText xml:space="preserve"> PAGEREF _Toc243948386 \h </w:instrText>
+          <w:instrText xml:space="preserve"> PAGEREF _Toc244091176 \h </w:instrText>
         </w:r>
         <w:r>
           <w:rPr>
@@ -558,7 +558,7 @@
           <w14:ligatures w14:val="standardContextual"/>
         </w:rPr>
       </w:pPr>
-      <w:hyperlink w:anchor="_Toc243948387" w:history="1">
+      <w:hyperlink w:anchor="_Toc244091177" w:history="1">
         <w:r>
           <w:rPr>
             <w:rStyle w:val="Hipervnculo"/>
@@ -585,7 +585,7 @@
             <w:noProof/>
             <w:webHidden/>
           </w:rPr>
-          <w:instrText xml:space="preserve"> PAGEREF _Toc243948387 \h </w:instrText>
+          <w:instrText xml:space="preserve"> PAGEREF _Toc244091177 \h </w:instrText>
         </w:r>
         <w:r>
           <w:rPr>
@@ -628,7 +628,7 @@
           <w14:ligatures w14:val="standardContextual"/>
         </w:rPr>
       </w:pPr>
-      <w:hyperlink w:anchor="_Toc243948388" w:history="1">
+      <w:hyperlink w:anchor="_Toc244091178" w:history="1">
         <w:r>
           <w:rPr>
             <w:rStyle w:val="Hipervnculo"/>
@@ -655,7 +655,7 @@
             <w:noProof/>
             <w:webHidden/>
           </w:rPr>
-          <w:instrText xml:space="preserve"> PAGEREF _Toc243948388 \h </w:instrText>
+          <w:instrText xml:space="preserve"> PAGEREF _Toc244091178 \h </w:instrText>
         </w:r>
         <w:r>
           <w:rPr>
@@ -698,7 +698,7 @@
           <w14:ligatures w14:val="standardContextual"/>
         </w:rPr>
       </w:pPr>
-      <w:hyperlink w:anchor="_Toc243948389" w:history="1">
+      <w:hyperlink w:anchor="_Toc244091179" w:history="1">
         <w:r>
           <w:rPr>
             <w:rStyle w:val="Hipervnculo"/>
@@ -725,7 +725,7 @@
             <w:noProof/>
             <w:webHidden/>
           </w:rPr>
-          <w:instrText xml:space="preserve"> PAGEREF _Toc243948389 \h </w:instrText>
+          <w:instrText xml:space="preserve"> PAGEREF _Toc244091179 \h </w:instrText>
         </w:r>
         <w:r>
           <w:rPr>
@@ -768,7 +768,7 @@
           <w14:ligatures w14:val="standardContextual"/>
         </w:rPr>
       </w:pPr>
-      <w:hyperlink w:anchor="_Toc243948390" w:history="1">
+      <w:hyperlink w:anchor="_Toc244091180" w:history="1">
         <w:r>
           <w:rPr>
             <w:rStyle w:val="Hipervnculo"/>
@@ -795,7 +795,7 @@
             <w:noProof/>
             <w:webHidden/>
           </w:rPr>
-          <w:instrText xml:space="preserve"> PAGEREF _Toc243948390 \h </w:instrText>
+          <w:instrText xml:space="preserve"> PAGEREF _Toc244091180 \h </w:instrText>
         </w:r>
         <w:r>
           <w:rPr>
@@ -841,7 +841,7 @@
           <w14:ligatures w14:val="standardContextual"/>
         </w:rPr>
       </w:pPr>
-      <w:hyperlink w:anchor="_Toc243948391" w:history="1">
+      <w:hyperlink w:anchor="_Toc244091181" w:history="1">
         <w:r>
           <w:rPr>
             <w:rStyle w:val="Hipervnculo"/>
@@ -868,7 +868,7 @@
             <w:noProof/>
             <w:webHidden/>
           </w:rPr>
-          <w:instrText xml:space="preserve"> PAGEREF _Toc243948391 \h </w:instrText>
+          <w:instrText xml:space="preserve"> PAGEREF _Toc244091181 \h </w:instrText>
         </w:r>
         <w:r>
           <w:rPr>
@@ -911,7 +911,7 @@
           <w14:ligatures w14:val="standardContextual"/>
         </w:rPr>
       </w:pPr>
-      <w:hyperlink w:anchor="_Toc243948392" w:history="1">
+      <w:hyperlink w:anchor="_Toc244091182" w:history="1">
         <w:r>
           <w:rPr>
             <w:rStyle w:val="Hipervnculo"/>
@@ -938,7 +938,7 @@
             <w:noProof/>
             <w:webHidden/>
           </w:rPr>
-          <w:instrText xml:space="preserve"> PAGEREF _Toc243948392 \h </w:instrText>
+          <w:instrText xml:space="preserve"> PAGEREF _Toc244091182 \h </w:instrText>
         </w:r>
         <w:r>
           <w:rPr>
@@ -981,7 +981,7 @@
           <w14:ligatures w14:val="standardContextual"/>
         </w:rPr>
       </w:pPr>
-      <w:hyperlink w:anchor="_Toc243948393" w:history="1">
+      <w:hyperlink w:anchor="_Toc244091183" w:history="1">
         <w:r>
           <w:rPr>
             <w:rStyle w:val="Hipervnculo"/>
@@ -1008,7 +1008,7 @@
             <w:noProof/>
             <w:webHidden/>
           </w:rPr>
-          <w:instrText xml:space="preserve"> PAGEREF _Toc243948393 \h </w:instrText>
+          <w:instrText xml:space="preserve"> PAGEREF _Toc244091183 \h </w:instrText>
         </w:r>
         <w:r>
           <w:rPr>
@@ -1051,7 +1051,7 @@
           <w14:ligatures w14:val="standardContextual"/>
         </w:rPr>
       </w:pPr>
-      <w:hyperlink w:anchor="_Toc243948394" w:history="1">
+      <w:hyperlink w:anchor="_Toc244091184" w:history="1">
         <w:r>
           <w:rPr>
             <w:rStyle w:val="Hipervnculo"/>
@@ -1078,7 +1078,7 @@
             <w:noProof/>
             <w:webHidden/>
           </w:rPr>
-          <w:instrText xml:space="preserve"> PAGEREF _Toc243948394 \h </w:instrText>
+          <w:instrText xml:space="preserve"> PAGEREF _Toc244091184 \h </w:instrText>
         </w:r>
         <w:r>
           <w:rPr>
@@ -1121,7 +1121,7 @@
           <w14:ligatures w14:val="standardContextual"/>
         </w:rPr>
       </w:pPr>
-      <w:hyperlink w:anchor="_Toc243948395" w:history="1">
+      <w:hyperlink w:anchor="_Toc244091185" w:history="1">
         <w:r>
           <w:rPr>
             <w:rStyle w:val="Hipervnculo"/>
@@ -1148,7 +1148,7 @@
             <w:noProof/>
             <w:webHidden/>
           </w:rPr>
-          <w:instrText xml:space="preserve"> PAGEREF _Toc243948395 \h </w:instrText>
+          <w:instrText xml:space="preserve"> PAGEREF _Toc244091185 \h </w:instrText>
         </w:r>
         <w:r>
           <w:rPr>
@@ -1191,7 +1191,7 @@
           <w14:ligatures w14:val="standardContextual"/>
         </w:rPr>
       </w:pPr>
-      <w:hyperlink w:anchor="_Toc243948396" w:history="1">
+      <w:hyperlink w:anchor="_Toc244091186" w:history="1">
         <w:r>
           <w:rPr>
             <w:rStyle w:val="Hipervnculo"/>
@@ -1218,7 +1218,7 @@
             <w:noProof/>
             <w:webHidden/>
           </w:rPr>
-          <w:instrText xml:space="preserve"> PAGEREF _Toc243948396 \h </w:instrText>
+          <w:instrText xml:space="preserve"> PAGEREF _Toc244091186 \h </w:instrText>
         </w:r>
         <w:r>
           <w:rPr>
@@ -1261,7 +1261,7 @@
           <w14:ligatures w14:val="standardContextual"/>
         </w:rPr>
       </w:pPr>
-      <w:hyperlink w:anchor="_Toc243948397" w:history="1">
+      <w:hyperlink w:anchor="_Toc244091187" w:history="1">
         <w:r>
           <w:rPr>
             <w:rStyle w:val="Hipervnculo"/>
@@ -1288,7 +1288,7 @@
             <w:noProof/>
             <w:webHidden/>
           </w:rPr>
-          <w:instrText xml:space="preserve"> PAGEREF _Toc243948397 \h </w:instrText>
+          <w:instrText xml:space="preserve"> PAGEREF _Toc244091187 \h </w:instrText>
         </w:r>
         <w:r>
           <w:rPr>
@@ -1331,7 +1331,7 @@
           <w14:ligatures w14:val="standardContextual"/>
         </w:rPr>
       </w:pPr>
-      <w:hyperlink w:anchor="_Toc243948398" w:history="1">
+      <w:hyperlink w:anchor="_Toc244091188" w:history="1">
         <w:r>
           <w:rPr>
             <w:rStyle w:val="Hipervnculo"/>
@@ -1358,7 +1358,7 @@
             <w:noProof/>
             <w:webHidden/>
           </w:rPr>
-          <w:instrText xml:space="preserve"> PAGEREF _Toc243948398 \h </w:instrText>
+          <w:instrText xml:space="preserve"> PAGEREF _Toc244091188 \h </w:instrText>
         </w:r>
         <w:r>
           <w:rPr>
@@ -1401,7 +1401,7 @@
           <w14:ligatures w14:val="standardContextual"/>
         </w:rPr>
       </w:pPr>
-      <w:hyperlink w:anchor="_Toc243948399" w:history="1">
+      <w:hyperlink w:anchor="_Toc244091189" w:history="1">
         <w:r>
           <w:rPr>
             <w:rStyle w:val="Hipervnculo"/>
@@ -1428,7 +1428,7 @@
             <w:noProof/>
             <w:webHidden/>
           </w:rPr>
-          <w:instrText xml:space="preserve"> PAGEREF _Toc243948399 \h </w:instrText>
+          <w:instrText xml:space="preserve"> PAGEREF _Toc244091189 \h </w:instrText>
         </w:r>
         <w:r>
           <w:rPr>
@@ -1471,7 +1471,7 @@
           <w14:ligatures w14:val="standardContextual"/>
         </w:rPr>
       </w:pPr>
-      <w:hyperlink w:anchor="_Toc243948400" w:history="1">
+      <w:hyperlink w:anchor="_Toc244091190" w:history="1">
         <w:r>
           <w:rPr>
             <w:rStyle w:val="Hipervnculo"/>
@@ -1498,7 +1498,7 @@
             <w:noProof/>
             <w:webHidden/>
           </w:rPr>
-          <w:instrText xml:space="preserve"> PAGEREF _Toc243948400 \h </w:instrText>
+          <w:instrText xml:space="preserve"> PAGEREF _Toc244091190 \h </w:instrText>
         </w:r>
         <w:r>
           <w:rPr>
@@ -1541,7 +1541,7 @@
           <w14:ligatures w14:val="standardContextual"/>
         </w:rPr>
       </w:pPr>
-      <w:hyperlink w:anchor="_Toc243948401" w:history="1">
+      <w:hyperlink w:anchor="_Toc244091191" w:history="1">
         <w:r>
           <w:rPr>
             <w:rStyle w:val="Hipervnculo"/>
@@ -1568,7 +1568,7 @@
             <w:noProof/>
             <w:webHidden/>
           </w:rPr>
-          <w:instrText xml:space="preserve"> PAGEREF _Toc243948401 \h </w:instrText>
+          <w:instrText xml:space="preserve"> PAGEREF _Toc244091191 \h </w:instrText>
         </w:r>
         <w:r>
           <w:rPr>
@@ -1611,7 +1611,7 @@
           <w14:ligatures w14:val="standardContextual"/>
         </w:rPr>
       </w:pPr>
-      <w:hyperlink w:anchor="_Toc243948402" w:history="1">
+      <w:hyperlink w:anchor="_Toc244091192" w:history="1">
         <w:r>
           <w:rPr>
             <w:rStyle w:val="Hipervnculo"/>
@@ -1638,7 +1638,7 @@
             <w:noProof/>
             <w:webHidden/>
           </w:rPr>
-          <w:instrText xml:space="preserve"> PAGEREF _Toc243948402 \h </w:instrText>
+          <w:instrText xml:space="preserve"> PAGEREF _Toc244091192 \h </w:instrText>
         </w:r>
         <w:r>
           <w:rPr>
@@ -1681,7 +1681,7 @@
           <w14:ligatures w14:val="standardContextual"/>
         </w:rPr>
       </w:pPr>
-      <w:hyperlink w:anchor="_Toc243948403" w:history="1">
+      <w:hyperlink w:anchor="_Toc244091193" w:history="1">
         <w:r>
           <w:rPr>
             <w:rStyle w:val="Hipervnculo"/>
@@ -1708,7 +1708,7 @@
             <w:noProof/>
             <w:webHidden/>
           </w:rPr>
-          <w:instrText xml:space="preserve"> PAGEREF _Toc243948403 \h </w:instrText>
+          <w:instrText xml:space="preserve"> PAGEREF _Toc244091193 \h </w:instrText>
         </w:r>
         <w:r>
           <w:rPr>
@@ -1751,7 +1751,7 @@
           <w14:ligatures w14:val="standardContextual"/>
         </w:rPr>
       </w:pPr>
-      <w:hyperlink w:anchor="_Toc243948404" w:history="1">
+      <w:hyperlink w:anchor="_Toc244091194" w:history="1">
         <w:r>
           <w:rPr>
             <w:rStyle w:val="Hipervnculo"/>
@@ -1778,7 +1778,7 @@
             <w:noProof/>
             <w:webHidden/>
           </w:rPr>
-          <w:instrText xml:space="preserve"> PAGEREF _Toc243948404 \h </w:instrText>
+          <w:instrText xml:space="preserve"> PAGEREF _Toc244091194 \h </w:instrText>
         </w:r>
         <w:r>
           <w:rPr>
@@ -1821,7 +1821,7 @@
           <w14:ligatures w14:val="standardContextual"/>
         </w:rPr>
       </w:pPr>
-      <w:hyperlink w:anchor="_Toc243948405" w:history="1">
+      <w:hyperlink w:anchor="_Toc244091195" w:history="1">
         <w:r>
           <w:rPr>
             <w:rStyle w:val="Hipervnculo"/>
@@ -1848,7 +1848,7 @@
             <w:noProof/>
             <w:webHidden/>
           </w:rPr>
-          <w:instrText xml:space="preserve"> PAGEREF _Toc243948405 \h </w:instrText>
+          <w:instrText xml:space="preserve"> PAGEREF _Toc244091195 \h </w:instrText>
         </w:r>
         <w:r>
           <w:rPr>
@@ -1891,7 +1891,7 @@
           <w14:ligatures w14:val="standardContextual"/>
         </w:rPr>
       </w:pPr>
-      <w:hyperlink w:anchor="_Toc243948406" w:history="1">
+      <w:hyperlink w:anchor="_Toc244091196" w:history="1">
         <w:r>
           <w:rPr>
             <w:rStyle w:val="Hipervnculo"/>
@@ -1918,7 +1918,7 @@
             <w:noProof/>
             <w:webHidden/>
           </w:rPr>
-          <w:instrText xml:space="preserve"> PAGEREF _Toc243948406 \h </w:instrText>
+          <w:instrText xml:space="preserve"> PAGEREF _Toc244091196 \h </w:instrText>
         </w:r>
         <w:r>
           <w:rPr>
@@ -1961,7 +1961,7 @@
           <w14:ligatures w14:val="standardContextual"/>
         </w:rPr>
       </w:pPr>
-      <w:hyperlink w:anchor="_Toc243948407" w:history="1">
+      <w:hyperlink w:anchor="_Toc244091197" w:history="1">
         <w:r>
           <w:rPr>
             <w:rStyle w:val="Hipervnculo"/>
@@ -1988,7 +1988,7 @@
             <w:noProof/>
             <w:webHidden/>
           </w:rPr>
-          <w:instrText xml:space="preserve"> PAGEREF _Toc243948407 \h </w:instrText>
+          <w:instrText xml:space="preserve"> PAGEREF _Toc244091197 \h </w:instrText>
         </w:r>
         <w:r>
           <w:rPr>
@@ -2031,7 +2031,7 @@
           <w14:ligatures w14:val="standardContextual"/>
         </w:rPr>
       </w:pPr>
-      <w:hyperlink w:anchor="_Toc243948408" w:history="1">
+      <w:hyperlink w:anchor="_Toc244091198" w:history="1">
         <w:r>
           <w:rPr>
             <w:rStyle w:val="Hipervnculo"/>
@@ -2058,7 +2058,7 @@
             <w:noProof/>
             <w:webHidden/>
           </w:rPr>
-          <w:instrText xml:space="preserve"> PAGEREF _Toc243948408 \h </w:instrText>
+          <w:instrText xml:space="preserve"> PAGEREF _Toc244091198 \h </w:instrText>
         </w:r>
         <w:r>
           <w:rPr>
@@ -2101,7 +2101,7 @@
           <w14:ligatures w14:val="standardContextual"/>
         </w:rPr>
       </w:pPr>
-      <w:hyperlink w:anchor="_Toc243948409" w:history="1">
+      <w:hyperlink w:anchor="_Toc244091199" w:history="1">
         <w:r>
           <w:rPr>
             <w:rStyle w:val="Hipervnculo"/>
@@ -2128,7 +2128,7 @@
             <w:noProof/>
             <w:webHidden/>
           </w:rPr>
-          <w:instrText xml:space="preserve"> PAGEREF _Toc243948409 \h </w:instrText>
+          <w:instrText xml:space="preserve"> PAGEREF _Toc244091199 \h </w:instrText>
         </w:r>
         <w:r>
           <w:rPr>
@@ -2171,7 +2171,7 @@
           <w14:ligatures w14:val="standardContextual"/>
         </w:rPr>
       </w:pPr>
-      <w:hyperlink w:anchor="_Toc243948410" w:history="1">
+      <w:hyperlink w:anchor="_Toc244091200" w:history="1">
         <w:r>
           <w:rPr>
             <w:rStyle w:val="Hipervnculo"/>
@@ -2198,7 +2198,7 @@
             <w:noProof/>
             <w:webHidden/>
           </w:rPr>
-          <w:instrText xml:space="preserve"> PAGEREF _Toc243948410 \h </w:instrText>
+          <w:instrText xml:space="preserve"> PAGEREF _Toc244091200 \h </w:instrText>
         </w:r>
         <w:r>
           <w:rPr>
@@ -2244,7 +2244,7 @@
           <w14:ligatures w14:val="standardContextual"/>
         </w:rPr>
       </w:pPr>
-      <w:hyperlink w:anchor="_Toc243948411" w:history="1">
+      <w:hyperlink w:anchor="_Toc244091201" w:history="1">
         <w:r>
           <w:rPr>
             <w:rStyle w:val="Hipervnculo"/>
@@ -2271,7 +2271,7 @@
             <w:noProof/>
             <w:webHidden/>
           </w:rPr>
-          <w:instrText xml:space="preserve"> PAGEREF _Toc243948411 \h </w:instrText>
+          <w:instrText xml:space="preserve"> PAGEREF _Toc244091201 \h </w:instrText>
         </w:r>
         <w:r>
           <w:rPr>
@@ -2314,7 +2314,7 @@
           <w14:ligatures w14:val="standardContextual"/>
         </w:rPr>
       </w:pPr>
-      <w:hyperlink w:anchor="_Toc243948412" w:history="1">
+      <w:hyperlink w:anchor="_Toc244091202" w:history="1">
         <w:r>
           <w:rPr>
             <w:rStyle w:val="Hipervnculo"/>
@@ -2341,7 +2341,7 @@
             <w:noProof/>
             <w:webHidden/>
           </w:rPr>
-          <w:instrText xml:space="preserve"> PAGEREF _Toc243948412 \h </w:instrText>
+          <w:instrText xml:space="preserve"> PAGEREF _Toc244091202 \h </w:instrText>
         </w:r>
         <w:r>
           <w:rPr>
@@ -2384,7 +2384,7 @@
           <w14:ligatures w14:val="standardContextual"/>
         </w:rPr>
       </w:pPr>
-      <w:hyperlink w:anchor="_Toc243948413" w:history="1">
+      <w:hyperlink w:anchor="_Toc244091203" w:history="1">
         <w:r>
           <w:rPr>
             <w:rStyle w:val="Hipervnculo"/>
@@ -2411,7 +2411,7 @@
             <w:noProof/>
             <w:webHidden/>
           </w:rPr>
-          <w:instrText xml:space="preserve"> PAGEREF _Toc243948413 \h </w:instrText>
+          <w:instrText xml:space="preserve"> PAGEREF _Toc244091203 \h </w:instrText>
         </w:r>
         <w:r>
           <w:rPr>
@@ -2454,7 +2454,7 @@
           <w14:ligatures w14:val="standardContextual"/>
         </w:rPr>
       </w:pPr>
-      <w:hyperlink w:anchor="_Toc243948414" w:history="1">
+      <w:hyperlink w:anchor="_Toc244091204" w:history="1">
         <w:r>
           <w:rPr>
             <w:rStyle w:val="Hipervnculo"/>
@@ -2481,7 +2481,7 @@
             <w:noProof/>
             <w:webHidden/>
           </w:rPr>
-          <w:instrText xml:space="preserve"> PAGEREF _Toc243948414 \h </w:instrText>
+          <w:instrText xml:space="preserve"> PAGEREF _Toc244091204 \h </w:instrText>
         </w:r>
         <w:r>
           <w:rPr>
@@ -2524,7 +2524,7 @@
           <w14:ligatures w14:val="standardContextual"/>
         </w:rPr>
       </w:pPr>
-      <w:hyperlink w:anchor="_Toc243948415" w:history="1">
+      <w:hyperlink w:anchor="_Toc244091205" w:history="1">
         <w:r>
           <w:rPr>
             <w:rStyle w:val="Hipervnculo"/>
@@ -2551,7 +2551,7 @@
             <w:noProof/>
             <w:webHidden/>
           </w:rPr>
-          <w:instrText xml:space="preserve"> PAGEREF _Toc243948415 \h </w:instrText>
+          <w:instrText xml:space="preserve"> PAGEREF _Toc244091205 \h </w:instrText>
         </w:r>
         <w:r>
           <w:rPr>
@@ -2594,7 +2594,7 @@
           <w14:ligatures w14:val="standardContextual"/>
         </w:rPr>
       </w:pPr>
-      <w:hyperlink w:anchor="_Toc243948416" w:history="1">
+      <w:hyperlink w:anchor="_Toc244091206" w:history="1">
         <w:r>
           <w:rPr>
             <w:rStyle w:val="Hipervnculo"/>
@@ -2621,7 +2621,7 @@
             <w:noProof/>
             <w:webHidden/>
           </w:rPr>
-          <w:instrText xml:space="preserve"> PAGEREF _Toc243948416 \h </w:instrText>
+          <w:instrText xml:space="preserve"> PAGEREF _Toc244091206 \h </w:instrText>
         </w:r>
         <w:r>
           <w:rPr>
@@ -2667,7 +2667,7 @@
           <w14:ligatures w14:val="standardContextual"/>
         </w:rPr>
       </w:pPr>
-      <w:hyperlink w:anchor="_Toc243948417" w:history="1">
+      <w:hyperlink w:anchor="_Toc244091207" w:history="1">
         <w:r>
           <w:rPr>
             <w:rStyle w:val="Hipervnculo"/>
@@ -2694,7 +2694,7 @@
             <w:noProof/>
             <w:webHidden/>
           </w:rPr>
-          <w:instrText xml:space="preserve"> PAGEREF _Toc243948417 \h </w:instrText>
+          <w:instrText xml:space="preserve"> PAGEREF _Toc244091207 \h </w:instrText>
         </w:r>
         <w:r>
           <w:rPr>
@@ -2737,7 +2737,7 @@
           <w14:ligatures w14:val="standardContextual"/>
         </w:rPr>
       </w:pPr>
-      <w:hyperlink w:anchor="_Toc243948418" w:history="1">
+      <w:hyperlink w:anchor="_Toc244091208" w:history="1">
         <w:r>
           <w:rPr>
             <w:rStyle w:val="Hipervnculo"/>
@@ -2764,7 +2764,7 @@
             <w:noProof/>
             <w:webHidden/>
           </w:rPr>
-          <w:instrText xml:space="preserve"> PAGEREF _Toc243948418 \h </w:instrText>
+          <w:instrText xml:space="preserve"> PAGEREF _Toc244091208 \h </w:instrText>
         </w:r>
         <w:r>
           <w:rPr>
@@ -2807,7 +2807,7 @@
           <w14:ligatures w14:val="standardContextual"/>
         </w:rPr>
       </w:pPr>
-      <w:hyperlink w:anchor="_Toc243948419" w:history="1">
+      <w:hyperlink w:anchor="_Toc244091209" w:history="1">
         <w:r>
           <w:rPr>
             <w:rStyle w:val="Hipervnculo"/>
@@ -2834,7 +2834,7 @@
             <w:noProof/>
             <w:webHidden/>
           </w:rPr>
-          <w:instrText xml:space="preserve"> PAGEREF _Toc243948419 \h </w:instrText>
+          <w:instrText xml:space="preserve"> PAGEREF _Toc244091209 \h </w:instrText>
         </w:r>
         <w:r>
           <w:rPr>
@@ -2877,7 +2877,7 @@
           <w14:ligatures w14:val="standardContextual"/>
         </w:rPr>
       </w:pPr>
-      <w:hyperlink w:anchor="_Toc243948420" w:history="1">
+      <w:hyperlink w:anchor="_Toc244091210" w:history="1">
         <w:r>
           <w:rPr>
             <w:rStyle w:val="Hipervnculo"/>
@@ -2904,7 +2904,7 @@
             <w:noProof/>
             <w:webHidden/>
           </w:rPr>
-          <w:instrText xml:space="preserve"> PAGEREF _Toc243948420 \h </w:instrText>
+          <w:instrText xml:space="preserve"> PAGEREF _Toc244091210 \h </w:instrText>
         </w:r>
         <w:r>
           <w:rPr>
@@ -2947,7 +2947,7 @@
           <w14:ligatures w14:val="standardContextual"/>
         </w:rPr>
       </w:pPr>
-      <w:hyperlink w:anchor="_Toc243948421" w:history="1">
+      <w:hyperlink w:anchor="_Toc244091211" w:history="1">
         <w:r>
           <w:rPr>
             <w:rStyle w:val="Hipervnculo"/>
@@ -2974,7 +2974,7 @@
             <w:noProof/>
             <w:webHidden/>
           </w:rPr>
-          <w:instrText xml:space="preserve"> PAGEREF _Toc243948421 \h </w:instrText>
+          <w:instrText xml:space="preserve"> PAGEREF _Toc244091211 \h </w:instrText>
         </w:r>
         <w:r>
           <w:rPr>
@@ -3017,7 +3017,7 @@
           <w14:ligatures w14:val="standardContextual"/>
         </w:rPr>
       </w:pPr>
-      <w:hyperlink w:anchor="_Toc243948422" w:history="1">
+      <w:hyperlink w:anchor="_Toc244091212" w:history="1">
         <w:r>
           <w:rPr>
             <w:rStyle w:val="Hipervnculo"/>
@@ -3044,7 +3044,7 @@
             <w:noProof/>
             <w:webHidden/>
           </w:rPr>
-          <w:instrText xml:space="preserve"> PAGEREF _Toc243948422 \h </w:instrText>
+          <w:instrText xml:space="preserve"> PAGEREF _Toc244091212 \h </w:instrText>
         </w:r>
         <w:r>
           <w:rPr>
@@ -3087,7 +3087,7 @@
           <w14:ligatures w14:val="standardContextual"/>
         </w:rPr>
       </w:pPr>
-      <w:hyperlink w:anchor="_Toc243948423" w:history="1">
+      <w:hyperlink w:anchor="_Toc244091213" w:history="1">
         <w:r>
           <w:rPr>
             <w:rStyle w:val="Hipervnculo"/>
@@ -3114,7 +3114,7 @@
             <w:noProof/>
             <w:webHidden/>
           </w:rPr>
-          <w:instrText xml:space="preserve"> PAGEREF _Toc243948423 \h </w:instrText>
+          <w:instrText xml:space="preserve"> PAGEREF _Toc244091213 \h </w:instrText>
         </w:r>
         <w:r>
           <w:rPr>
@@ -3157,7 +3157,7 @@
           <w14:ligatures w14:val="standardContextual"/>
         </w:rPr>
       </w:pPr>
-      <w:hyperlink w:anchor="_Toc243948424" w:history="1">
+      <w:hyperlink w:anchor="_Toc244091214" w:history="1">
         <w:r>
           <w:rPr>
             <w:rStyle w:val="Hipervnculo"/>
@@ -3184,7 +3184,7 @@
             <w:noProof/>
             <w:webHidden/>
           </w:rPr>
-          <w:instrText xml:space="preserve"> PAGEREF _Toc243948424 \h </w:instrText>
+          <w:instrText xml:space="preserve"> PAGEREF _Toc244091214 \h </w:instrText>
         </w:r>
         <w:r>
           <w:rPr>
@@ -3227,7 +3227,7 @@
           <w14:ligatures w14:val="standardContextual"/>
         </w:rPr>
       </w:pPr>
-      <w:hyperlink w:anchor="_Toc243948425" w:history="1">
+      <w:hyperlink w:anchor="_Toc244091215" w:history="1">
         <w:r>
           <w:rPr>
             <w:rStyle w:val="Hipervnculo"/>
@@ -3254,7 +3254,7 @@
             <w:noProof/>
             <w:webHidden/>
           </w:rPr>
-          <w:instrText xml:space="preserve"> PAGEREF _Toc243948425 \h </w:instrText>
+          <w:instrText xml:space="preserve"> PAGEREF _Toc244091215 \h </w:instrText>
         </w:r>
         <w:r>
           <w:rPr>
@@ -3297,7 +3297,7 @@
           <w14:ligatures w14:val="standardContextual"/>
         </w:rPr>
       </w:pPr>
-      <w:hyperlink w:anchor="_Toc243948426" w:history="1">
+      <w:hyperlink w:anchor="_Toc244091216" w:history="1">
         <w:r>
           <w:rPr>
             <w:rStyle w:val="Hipervnculo"/>
@@ -3324,7 +3324,7 @@
             <w:noProof/>
             <w:webHidden/>
           </w:rPr>
-          <w:instrText xml:space="preserve"> PAGEREF _Toc243948426 \h </w:instrText>
+          <w:instrText xml:space="preserve"> PAGEREF _Toc244091216 \h </w:instrText>
         </w:r>
         <w:r>
           <w:rPr>
@@ -3367,7 +3367,7 @@
           <w14:ligatures w14:val="standardContextual"/>
         </w:rPr>
       </w:pPr>
-      <w:hyperlink w:anchor="_Toc243948427" w:history="1">
+      <w:hyperlink w:anchor="_Toc244091217" w:history="1">
         <w:r>
           <w:rPr>
             <w:rStyle w:val="Hipervnculo"/>
@@ -3394,7 +3394,7 @@
             <w:noProof/>
             <w:webHidden/>
           </w:rPr>
-          <w:instrText xml:space="preserve"> PAGEREF _Toc243948427 \h </w:instrText>
+          <w:instrText xml:space="preserve"> PAGEREF _Toc244091217 \h </w:instrText>
         </w:r>
         <w:r>
           <w:rPr>
@@ -3437,7 +3437,7 @@
           <w14:ligatures w14:val="standardContextual"/>
         </w:rPr>
       </w:pPr>
-      <w:hyperlink w:anchor="_Toc243948428" w:history="1">
+      <w:hyperlink w:anchor="_Toc244091218" w:history="1">
         <w:r>
           <w:rPr>
             <w:rStyle w:val="Hipervnculo"/>
@@ -3464,7 +3464,7 @@
             <w:noProof/>
             <w:webHidden/>
           </w:rPr>
-          <w:instrText xml:space="preserve"> PAGEREF _Toc243948428 \h </w:instrText>
+          <w:instrText xml:space="preserve"> PAGEREF _Toc244091218 \h </w:instrText>
         </w:r>
         <w:r>
           <w:rPr>
@@ -3507,7 +3507,7 @@
           <w14:ligatures w14:val="standardContextual"/>
         </w:rPr>
       </w:pPr>
-      <w:hyperlink w:anchor="_Toc243948429" w:history="1">
+      <w:hyperlink w:anchor="_Toc244091219" w:history="1">
         <w:r>
           <w:rPr>
             <w:rStyle w:val="Hipervnculo"/>
@@ -3534,7 +3534,7 @@
             <w:noProof/>
             <w:webHidden/>
           </w:rPr>
-          <w:instrText xml:space="preserve"> PAGEREF _Toc243948429 \h </w:instrText>
+          <w:instrText xml:space="preserve"> PAGEREF _Toc244091219 \h </w:instrText>
         </w:r>
         <w:r>
           <w:rPr>
@@ -3580,7 +3580,7 @@
           <w14:ligatures w14:val="standardContextual"/>
         </w:rPr>
       </w:pPr>
-      <w:hyperlink w:anchor="_Toc243948430" w:history="1">
+      <w:hyperlink w:anchor="_Toc244091220" w:history="1">
         <w:r>
           <w:rPr>
             <w:rStyle w:val="Hipervnculo"/>
@@ -3607,7 +3607,7 @@
             <w:noProof/>
             <w:webHidden/>
           </w:rPr>
-          <w:instrText xml:space="preserve"> PAGEREF _Toc243948430 \h </w:instrText>
+          <w:instrText xml:space="preserve"> PAGEREF _Toc244091220 \h </w:instrText>
         </w:r>
         <w:r>
           <w:rPr>
@@ -3650,7 +3650,7 @@
           <w14:ligatures w14:val="standardContextual"/>
         </w:rPr>
       </w:pPr>
-      <w:hyperlink w:anchor="_Toc243948431" w:history="1">
+      <w:hyperlink w:anchor="_Toc244091221" w:history="1">
         <w:r>
           <w:rPr>
             <w:rStyle w:val="Hipervnculo"/>
@@ -3677,7 +3677,7 @@
             <w:noProof/>
             <w:webHidden/>
           </w:rPr>
-          <w:instrText xml:space="preserve"> PAGEREF _Toc243948431 \h </w:instrText>
+          <w:instrText xml:space="preserve"> PAGEREF _Toc244091221 \h </w:instrText>
         </w:r>
         <w:r>
           <w:rPr>
@@ -3720,7 +3720,7 @@
           <w14:ligatures w14:val="standardContextual"/>
         </w:rPr>
       </w:pPr>
-      <w:hyperlink w:anchor="_Toc243948432" w:history="1">
+      <w:hyperlink w:anchor="_Toc244091222" w:history="1">
         <w:r>
           <w:rPr>
             <w:rStyle w:val="Hipervnculo"/>
@@ -3747,7 +3747,7 @@
             <w:noProof/>
             <w:webHidden/>
           </w:rPr>
-          <w:instrText xml:space="preserve"> PAGEREF _Toc243948432 \h </w:instrText>
+          <w:instrText xml:space="preserve"> PAGEREF _Toc244091222 \h </w:instrText>
         </w:r>
         <w:r>
           <w:rPr>
@@ -3790,7 +3790,7 @@
           <w14:ligatures w14:val="standardContextual"/>
         </w:rPr>
       </w:pPr>
-      <w:hyperlink w:anchor="_Toc243948433" w:history="1">
+      <w:hyperlink w:anchor="_Toc244091223" w:history="1">
         <w:r>
           <w:rPr>
             <w:rStyle w:val="Hipervnculo"/>
@@ -3817,7 +3817,7 @@
             <w:noProof/>
             <w:webHidden/>
           </w:rPr>
-          <w:instrText xml:space="preserve"> PAGEREF _Toc243948433 \h </w:instrText>
+          <w:instrText xml:space="preserve"> PAGEREF _Toc244091223 \h </w:instrText>
         </w:r>
         <w:r>
           <w:rPr>
@@ -3860,7 +3860,7 @@
           <w14:ligatures w14:val="standardContextual"/>
         </w:rPr>
       </w:pPr>
-      <w:hyperlink w:anchor="_Toc243948434" w:history="1">
+      <w:hyperlink w:anchor="_Toc244091224" w:history="1">
         <w:r>
           <w:rPr>
             <w:rStyle w:val="Hipervnculo"/>
@@ -3887,7 +3887,7 @@
             <w:noProof/>
             <w:webHidden/>
           </w:rPr>
-          <w:instrText xml:space="preserve"> PAGEREF _Toc243948434 \h </w:instrText>
+          <w:instrText xml:space="preserve"> PAGEREF _Toc244091224 \h </w:instrText>
         </w:r>
         <w:r>
           <w:rPr>
@@ -3930,7 +3930,7 @@
           <w14:ligatures w14:val="standardContextual"/>
         </w:rPr>
       </w:pPr>
-      <w:hyperlink w:anchor="_Toc243948435" w:history="1">
+      <w:hyperlink w:anchor="_Toc244091225" w:history="1">
         <w:r>
           <w:rPr>
             <w:rStyle w:val="Hipervnculo"/>
@@ -3957,7 +3957,7 @@
             <w:noProof/>
             <w:webHidden/>
           </w:rPr>
-          <w:instrText xml:space="preserve"> PAGEREF _Toc243948435 \h </w:instrText>
+          <w:instrText xml:space="preserve"> PAGEREF _Toc244091225 \h </w:instrText>
         </w:r>
         <w:r>
           <w:rPr>
@@ -4000,7 +4000,7 @@
           <w14:ligatures w14:val="standardContextual"/>
         </w:rPr>
       </w:pPr>
-      <w:hyperlink w:anchor="_Toc243948436" w:history="1">
+      <w:hyperlink w:anchor="_Toc244091226" w:history="1">
         <w:r>
           <w:rPr>
             <w:rStyle w:val="Hipervnculo"/>
@@ -4027,7 +4027,7 @@
             <w:noProof/>
             <w:webHidden/>
           </w:rPr>
-          <w:instrText xml:space="preserve"> PAGEREF _Toc243948436 \h </w:instrText>
+          <w:instrText xml:space="preserve"> PAGEREF _Toc244091226 \h </w:instrText>
         </w:r>
         <w:r>
           <w:rPr>
@@ -4073,7 +4073,7 @@
           <w14:ligatures w14:val="standardContextual"/>
         </w:rPr>
       </w:pPr>
-      <w:hyperlink w:anchor="_Toc243948437" w:history="1">
+      <w:hyperlink w:anchor="_Toc244091227" w:history="1">
         <w:r>
           <w:rPr>
             <w:rStyle w:val="Hipervnculo"/>
@@ -4100,7 +4100,7 @@
             <w:noProof/>
             <w:webHidden/>
           </w:rPr>
-          <w:instrText xml:space="preserve"> PAGEREF _Toc243948437 \h </w:instrText>
+          <w:instrText xml:space="preserve"> PAGEREF _Toc244091227 \h </w:instrText>
         </w:r>
         <w:r>
           <w:rPr>
@@ -4143,7 +4143,7 @@
           <w14:ligatures w14:val="standardContextual"/>
         </w:rPr>
       </w:pPr>
-      <w:hyperlink w:anchor="_Toc243948438" w:history="1">
+      <w:hyperlink w:anchor="_Toc244091228" w:history="1">
         <w:r>
           <w:rPr>
             <w:rStyle w:val="Hipervnculo"/>
@@ -4170,7 +4170,7 @@
             <w:noProof/>
             <w:webHidden/>
           </w:rPr>
-          <w:instrText xml:space="preserve"> PAGEREF _Toc243948438 \h </w:instrText>
+          <w:instrText xml:space="preserve"> PAGEREF _Toc244091228 \h </w:instrText>
         </w:r>
         <w:r>
           <w:rPr>
@@ -4213,7 +4213,7 @@
           <w14:ligatures w14:val="standardContextual"/>
         </w:rPr>
       </w:pPr>
-      <w:hyperlink w:anchor="_Toc243948439" w:history="1">
+      <w:hyperlink w:anchor="_Toc244091229" w:history="1">
         <w:r>
           <w:rPr>
             <w:rStyle w:val="Hipervnculo"/>
@@ -4240,7 +4240,7 @@
             <w:noProof/>
             <w:webHidden/>
           </w:rPr>
-          <w:instrText xml:space="preserve"> PAGEREF _Toc243948439 \h </w:instrText>
+          <w:instrText xml:space="preserve"> PAGEREF _Toc244091229 \h </w:instrText>
         </w:r>
         <w:r>
           <w:rPr>
@@ -4283,7 +4283,7 @@
           <w14:ligatures w14:val="standardContextual"/>
         </w:rPr>
       </w:pPr>
-      <w:hyperlink w:anchor="_Toc243948440" w:history="1">
+      <w:hyperlink w:anchor="_Toc244091230" w:history="1">
         <w:r>
           <w:rPr>
             <w:rStyle w:val="Hipervnculo"/>
@@ -4310,7 +4310,7 @@
             <w:noProof/>
             <w:webHidden/>
           </w:rPr>
-          <w:instrText xml:space="preserve"> PAGEREF _Toc243948440 \h </w:instrText>
+          <w:instrText xml:space="preserve"> PAGEREF _Toc244091230 \h </w:instrText>
         </w:r>
         <w:r>
           <w:rPr>
@@ -4353,7 +4353,7 @@
           <w14:ligatures w14:val="standardContextual"/>
         </w:rPr>
       </w:pPr>
-      <w:hyperlink w:anchor="_Toc243948441" w:history="1">
+      <w:hyperlink w:anchor="_Toc244091231" w:history="1">
         <w:r>
           <w:rPr>
             <w:rStyle w:val="Hipervnculo"/>
@@ -4380,7 +4380,7 @@
             <w:noProof/>
             <w:webHidden/>
           </w:rPr>
-          <w:instrText xml:space="preserve"> PAGEREF _Toc243948441 \h </w:instrText>
+          <w:instrText xml:space="preserve"> PAGEREF _Toc244091231 \h </w:instrText>
         </w:r>
         <w:r>
           <w:rPr>
@@ -4423,7 +4423,7 @@
           <w14:ligatures w14:val="standardContextual"/>
         </w:rPr>
       </w:pPr>
-      <w:hyperlink w:anchor="_Toc243948442" w:history="1">
+      <w:hyperlink w:anchor="_Toc244091232" w:history="1">
         <w:r>
           <w:rPr>
             <w:rStyle w:val="Hipervnculo"/>
@@ -4450,7 +4450,7 @@
             <w:noProof/>
             <w:webHidden/>
           </w:rPr>
-          <w:instrText xml:space="preserve"> PAGEREF _Toc243948442 \h </w:instrText>
+          <w:instrText xml:space="preserve"> PAGEREF _Toc244091232 \h </w:instrText>
         </w:r>
         <w:r>
           <w:rPr>
@@ -4493,7 +4493,7 @@
           <w14:ligatures w14:val="standardContextual"/>
         </w:rPr>
       </w:pPr>
-      <w:hyperlink w:anchor="_Toc243948443" w:history="1">
+      <w:hyperlink w:anchor="_Toc244091233" w:history="1">
         <w:r>
           <w:rPr>
             <w:rStyle w:val="Hipervnculo"/>
@@ -4520,7 +4520,7 @@
             <w:noProof/>
             <w:webHidden/>
           </w:rPr>
-          <w:instrText xml:space="preserve"> PAGEREF _Toc243948443 \h </w:instrText>
+          <w:instrText xml:space="preserve"> PAGEREF _Toc244091233 \h </w:instrText>
         </w:r>
         <w:r>
           <w:rPr>
@@ -4563,7 +4563,7 @@
           <w14:ligatures w14:val="standardContextual"/>
         </w:rPr>
       </w:pPr>
-      <w:hyperlink w:anchor="_Toc243948444" w:history="1">
+      <w:hyperlink w:anchor="_Toc244091234" w:history="1">
         <w:r>
           <w:rPr>
             <w:rStyle w:val="Hipervnculo"/>
@@ -4590,7 +4590,7 @@
             <w:noProof/>
             <w:webHidden/>
           </w:rPr>
-          <w:instrText xml:space="preserve"> PAGEREF _Toc243948444 \h </w:instrText>
+          <w:instrText xml:space="preserve"> PAGEREF _Toc244091234 \h </w:instrText>
         </w:r>
         <w:r>
           <w:rPr>
@@ -4633,7 +4633,7 @@
           <w14:ligatures w14:val="standardContextual"/>
         </w:rPr>
       </w:pPr>
-      <w:hyperlink w:anchor="_Toc243948445" w:history="1">
+      <w:hyperlink w:anchor="_Toc244091235" w:history="1">
         <w:r>
           <w:rPr>
             <w:rStyle w:val="Hipervnculo"/>
@@ -4660,7 +4660,7 @@
             <w:noProof/>
             <w:webHidden/>
           </w:rPr>
-          <w:instrText xml:space="preserve"> PAGEREF _Toc243948445 \h </w:instrText>
+          <w:instrText xml:space="preserve"> PAGEREF _Toc244091235 \h </w:instrText>
         </w:r>
         <w:r>
           <w:rPr>
@@ -4703,7 +4703,7 @@
           <w14:ligatures w14:val="standardContextual"/>
         </w:rPr>
       </w:pPr>
-      <w:hyperlink w:anchor="_Toc243948446" w:history="1">
+      <w:hyperlink w:anchor="_Toc244091236" w:history="1">
         <w:r>
           <w:rPr>
             <w:rStyle w:val="Hipervnculo"/>
@@ -4730,7 +4730,7 @@
             <w:noProof/>
             <w:webHidden/>
           </w:rPr>
-          <w:instrText xml:space="preserve"> PAGEREF _Toc243948446 \h </w:instrText>
+          <w:instrText xml:space="preserve"> PAGEREF _Toc244091236 \h </w:instrText>
         </w:r>
         <w:r>
           <w:rPr>
@@ -4773,7 +4773,7 @@
           <w14:ligatures w14:val="standardContextual"/>
         </w:rPr>
       </w:pPr>
-      <w:hyperlink w:anchor="_Toc243948447" w:history="1">
+      <w:hyperlink w:anchor="_Toc244091237" w:history="1">
         <w:r>
           <w:rPr>
             <w:rStyle w:val="Hipervnculo"/>
@@ -4800,7 +4800,7 @@
             <w:noProof/>
             <w:webHidden/>
           </w:rPr>
-          <w:instrText xml:space="preserve"> PAGEREF _Toc243948447 \h </w:instrText>
+          <w:instrText xml:space="preserve"> PAGEREF _Toc244091237 \h </w:instrText>
         </w:r>
         <w:r>
           <w:rPr>
@@ -4843,7 +4843,7 @@
           <w14:ligatures w14:val="standardContextual"/>
         </w:rPr>
       </w:pPr>
-      <w:hyperlink w:anchor="_Toc243948448" w:history="1">
+      <w:hyperlink w:anchor="_Toc244091238" w:history="1">
         <w:r>
           <w:rPr>
             <w:rStyle w:val="Hipervnculo"/>
@@ -4870,7 +4870,7 @@
             <w:noProof/>
             <w:webHidden/>
           </w:rPr>
-          <w:instrText xml:space="preserve"> PAGEREF _Toc243948448 \h </w:instrText>
+          <w:instrText xml:space="preserve"> PAGEREF _Toc244091238 \h </w:instrText>
         </w:r>
         <w:r>
           <w:rPr>
@@ -4913,7 +4913,7 @@
           <w14:ligatures w14:val="standardContextual"/>
         </w:rPr>
       </w:pPr>
-      <w:hyperlink w:anchor="_Toc243948449" w:history="1">
+      <w:hyperlink w:anchor="_Toc244091239" w:history="1">
         <w:r>
           <w:rPr>
             <w:rStyle w:val="Hipervnculo"/>
@@ -4940,7 +4940,7 @@
             <w:noProof/>
             <w:webHidden/>
           </w:rPr>
-          <w:instrText xml:space="preserve"> PAGEREF _Toc243948449 \h </w:instrText>
+          <w:instrText xml:space="preserve"> PAGEREF _Toc244091239 \h </w:instrText>
         </w:r>
         <w:r>
           <w:rPr>
@@ -4983,7 +4983,7 @@
           <w14:ligatures w14:val="standardContextual"/>
         </w:rPr>
       </w:pPr>
-      <w:hyperlink w:anchor="_Toc243948450" w:history="1">
+      <w:hyperlink w:anchor="_Toc244091240" w:history="1">
         <w:r>
           <w:rPr>
             <w:rStyle w:val="Hipervnculo"/>
@@ -5010,7 +5010,7 @@
             <w:noProof/>
             <w:webHidden/>
           </w:rPr>
-          <w:instrText xml:space="preserve"> PAGEREF _Toc243948450 \h </w:instrText>
+          <w:instrText xml:space="preserve"> PAGEREF _Toc244091240 \h </w:instrText>
         </w:r>
         <w:r>
           <w:rPr>
@@ -5053,7 +5053,7 @@
           <w14:ligatures w14:val="standardContextual"/>
         </w:rPr>
       </w:pPr>
-      <w:hyperlink w:anchor="_Toc243948451" w:history="1">
+      <w:hyperlink w:anchor="_Toc244091241" w:history="1">
         <w:r>
           <w:rPr>
             <w:rStyle w:val="Hipervnculo"/>
@@ -5080,7 +5080,7 @@
             <w:noProof/>
             <w:webHidden/>
           </w:rPr>
-          <w:instrText xml:space="preserve"> PAGEREF _Toc243948451 \h </w:instrText>
+          <w:instrText xml:space="preserve"> PAGEREF _Toc244091241 \h </w:instrText>
         </w:r>
         <w:r>
           <w:rPr>
@@ -5123,7 +5123,7 @@
           <w14:ligatures w14:val="standardContextual"/>
         </w:rPr>
       </w:pPr>
-      <w:hyperlink w:anchor="_Toc243948452" w:history="1">
+      <w:hyperlink w:anchor="_Toc244091242" w:history="1">
         <w:r>
           <w:rPr>
             <w:rStyle w:val="Hipervnculo"/>
@@ -5150,7 +5150,7 @@
             <w:noProof/>
             <w:webHidden/>
           </w:rPr>
-          <w:instrText xml:space="preserve"> PAGEREF _Toc243948452 \h </w:instrText>
+          <w:instrText xml:space="preserve"> PAGEREF _Toc244091242 \h </w:instrText>
         </w:r>
         <w:r>
           <w:rPr>
@@ -5193,7 +5193,7 @@
           <w14:ligatures w14:val="standardContextual"/>
         </w:rPr>
       </w:pPr>
-      <w:hyperlink w:anchor="_Toc243948453" w:history="1">
+      <w:hyperlink w:anchor="_Toc244091243" w:history="1">
         <w:r>
           <w:rPr>
             <w:rStyle w:val="Hipervnculo"/>
@@ -5220,7 +5220,7 @@
             <w:noProof/>
             <w:webHidden/>
           </w:rPr>
-          <w:instrText xml:space="preserve"> PAGEREF _Toc243948453 \h </w:instrText>
+          <w:instrText xml:space="preserve"> PAGEREF _Toc244091243 \h </w:instrText>
         </w:r>
         <w:r>
           <w:rPr>
@@ -5263,7 +5263,7 @@
           <w14:ligatures w14:val="standardContextual"/>
         </w:rPr>
       </w:pPr>
-      <w:hyperlink w:anchor="_Toc243948454" w:history="1">
+      <w:hyperlink w:anchor="_Toc244091244" w:history="1">
         <w:r>
           <w:rPr>
             <w:rStyle w:val="Hipervnculo"/>
@@ -5290,7 +5290,7 @@
             <w:noProof/>
             <w:webHidden/>
           </w:rPr>
-          <w:instrText xml:space="preserve"> PAGEREF _Toc243948454 \h </w:instrText>
+          <w:instrText xml:space="preserve"> PAGEREF _Toc244091244 \h </w:instrText>
         </w:r>
         <w:r>
           <w:rPr>
@@ -5333,7 +5333,7 @@
           <w14:ligatures w14:val="standardContextual"/>
         </w:rPr>
       </w:pPr>
-      <w:hyperlink w:anchor="_Toc243948455" w:history="1">
+      <w:hyperlink w:anchor="_Toc244091245" w:history="1">
         <w:r>
           <w:rPr>
             <w:rStyle w:val="Hipervnculo"/>
@@ -5360,7 +5360,7 @@
             <w:noProof/>
             <w:webHidden/>
           </w:rPr>
-          <w:instrText xml:space="preserve"> PAGEREF _Toc243948455 \h </w:instrText>
+          <w:instrText xml:space="preserve"> PAGEREF _Toc244091245 \h </w:instrText>
         </w:r>
         <w:r>
           <w:rPr>
@@ -5403,7 +5403,7 @@
           <w14:ligatures w14:val="standardContextual"/>
         </w:rPr>
       </w:pPr>
-      <w:hyperlink w:anchor="_Toc243948456" w:history="1">
+      <w:hyperlink w:anchor="_Toc244091246" w:history="1">
         <w:r>
           <w:rPr>
             <w:rStyle w:val="Hipervnculo"/>
@@ -5430,7 +5430,7 @@
             <w:noProof/>
             <w:webHidden/>
           </w:rPr>
-          <w:instrText xml:space="preserve"> PAGEREF _Toc243948456 \h </w:instrText>
+          <w:instrText xml:space="preserve"> PAGEREF _Toc244091246 \h </w:instrText>
         </w:r>
         <w:r>
           <w:rPr>
@@ -5476,7 +5476,7 @@
           <w14:ligatures w14:val="standardContextual"/>
         </w:rPr>
       </w:pPr>
-      <w:hyperlink w:anchor="_Toc243948457" w:history="1">
+      <w:hyperlink w:anchor="_Toc244091247" w:history="1">
         <w:r>
           <w:rPr>
             <w:rStyle w:val="Hipervnculo"/>
@@ -5503,7 +5503,7 @@
             <w:noProof/>
             <w:webHidden/>
           </w:rPr>
-          <w:instrText xml:space="preserve"> PAGEREF _Toc243948457 \h </w:instrText>
+          <w:instrText xml:space="preserve"> PAGEREF _Toc244091247 \h </w:instrText>
         </w:r>
         <w:r>
           <w:rPr>
@@ -5546,7 +5546,7 @@
           <w14:ligatures w14:val="standardContextual"/>
         </w:rPr>
       </w:pPr>
-      <w:hyperlink w:anchor="_Toc243948458" w:history="1">
+      <w:hyperlink w:anchor="_Toc244091248" w:history="1">
         <w:r>
           <w:rPr>
             <w:rStyle w:val="Hipervnculo"/>
@@ -5573,7 +5573,7 @@
             <w:noProof/>
             <w:webHidden/>
           </w:rPr>
-          <w:instrText xml:space="preserve"> PAGEREF _Toc243948458 \h </w:instrText>
+          <w:instrText xml:space="preserve"> PAGEREF _Toc244091248 \h </w:instrText>
         </w:r>
         <w:r>
           <w:rPr>
@@ -5616,7 +5616,7 @@
           <w14:ligatures w14:val="standardContextual"/>
         </w:rPr>
       </w:pPr>
-      <w:hyperlink w:anchor="_Toc243948459" w:history="1">
+      <w:hyperlink w:anchor="_Toc244091249" w:history="1">
         <w:r>
           <w:rPr>
             <w:rStyle w:val="Hipervnculo"/>
@@ -5643,7 +5643,7 @@
             <w:noProof/>
             <w:webHidden/>
           </w:rPr>
-          <w:instrText xml:space="preserve"> PAGEREF _Toc243948459 \h </w:instrText>
+          <w:instrText xml:space="preserve"> PAGEREF _Toc244091249 \h </w:instrText>
         </w:r>
         <w:r>
           <w:rPr>
@@ -5686,7 +5686,7 @@
           <w14:ligatures w14:val="standardContextual"/>
         </w:rPr>
       </w:pPr>
-      <w:hyperlink w:anchor="_Toc243948460" w:history="1">
+      <w:hyperlink w:anchor="_Toc244091250" w:history="1">
         <w:r>
           <w:rPr>
             <w:rStyle w:val="Hipervnculo"/>
@@ -5713,7 +5713,7 @@
             <w:noProof/>
             <w:webHidden/>
           </w:rPr>
-          <w:instrText xml:space="preserve"> PAGEREF _Toc243948460 \h </w:instrText>
+          <w:instrText xml:space="preserve"> PAGEREF _Toc244091250 \h </w:instrText>
         </w:r>
         <w:r>
           <w:rPr>
@@ -5756,7 +5756,7 @@
           <w14:ligatures w14:val="standardContextual"/>
         </w:rPr>
       </w:pPr>
-      <w:hyperlink w:anchor="_Toc243948461" w:history="1">
+      <w:hyperlink w:anchor="_Toc244091251" w:history="1">
         <w:r>
           <w:rPr>
             <w:rStyle w:val="Hipervnculo"/>
@@ -5783,7 +5783,7 @@
             <w:noProof/>
             <w:webHidden/>
           </w:rPr>
-          <w:instrText xml:space="preserve"> PAGEREF _Toc243948461 \h </w:instrText>
+          <w:instrText xml:space="preserve"> PAGEREF _Toc244091251 \h </w:instrText>
         </w:r>
         <w:r>
           <w:rPr>
@@ -5826,7 +5826,7 @@
           <w14:ligatures w14:val="standardContextual"/>
         </w:rPr>
       </w:pPr>
-      <w:hyperlink w:anchor="_Toc243948462" w:history="1">
+      <w:hyperlink w:anchor="_Toc244091252" w:history="1">
         <w:r>
           <w:rPr>
             <w:rStyle w:val="Hipervnculo"/>
@@ -5853,7 +5853,7 @@
             <w:noProof/>
             <w:webHidden/>
           </w:rPr>
-          <w:instrText xml:space="preserve"> PAGEREF _Toc243948462 \h </w:instrText>
+          <w:instrText xml:space="preserve"> PAGEREF _Toc244091252 \h </w:instrText>
         </w:r>
         <w:r>
           <w:rPr>
@@ -5896,7 +5896,7 @@
           <w14:ligatures w14:val="standardContextual"/>
         </w:rPr>
       </w:pPr>
-      <w:hyperlink w:anchor="_Toc243948463" w:history="1">
+      <w:hyperlink w:anchor="_Toc244091253" w:history="1">
         <w:r>
           <w:rPr>
             <w:rStyle w:val="Hipervnculo"/>
@@ -5923,7 +5923,7 @@
             <w:noProof/>
             <w:webHidden/>
           </w:rPr>
-          <w:instrText xml:space="preserve"> PAGEREF _Toc243948463 \h </w:instrText>
+          <w:instrText xml:space="preserve"> PAGEREF _Toc244091253 \h </w:instrText>
         </w:r>
         <w:r>
           <w:rPr>
@@ -5966,7 +5966,7 @@
           <w14:ligatures w14:val="standardContextual"/>
         </w:rPr>
       </w:pPr>
-      <w:hyperlink w:anchor="_Toc243948464" w:history="1">
+      <w:hyperlink w:anchor="_Toc244091254" w:history="1">
         <w:r>
           <w:rPr>
             <w:rStyle w:val="Hipervnculo"/>
@@ -5993,7 +5993,7 @@
             <w:noProof/>
             <w:webHidden/>
           </w:rPr>
-          <w:instrText xml:space="preserve"> PAGEREF _Toc243948464 \h </w:instrText>
+          <w:instrText xml:space="preserve"> PAGEREF _Toc244091254 \h </w:instrText>
         </w:r>
         <w:r>
           <w:rPr>
@@ -6036,7 +6036,7 @@
           <w14:ligatures w14:val="standardContextual"/>
         </w:rPr>
       </w:pPr>
-      <w:hyperlink w:anchor="_Toc243948465" w:history="1">
+      <w:hyperlink w:anchor="_Toc244091255" w:history="1">
         <w:r>
           <w:rPr>
             <w:rStyle w:val="Hipervnculo"/>
@@ -6063,7 +6063,7 @@
             <w:noProof/>
             <w:webHidden/>
           </w:rPr>
-          <w:instrText xml:space="preserve"> PAGEREF _Toc243948465 \h </w:instrText>
+          <w:instrText xml:space="preserve"> PAGEREF _Toc244091255 \h </w:instrText>
         </w:r>
         <w:r>
           <w:rPr>
@@ -6106,7 +6106,7 @@
           <w14:ligatures w14:val="standardContextual"/>
         </w:rPr>
       </w:pPr>
-      <w:hyperlink w:anchor="_Toc243948466" w:history="1">
+      <w:hyperlink w:anchor="_Toc244091256" w:history="1">
         <w:r>
           <w:rPr>
             <w:rStyle w:val="Hipervnculo"/>
@@ -6133,7 +6133,7 @@
             <w:noProof/>
             <w:webHidden/>
           </w:rPr>
-          <w:instrText xml:space="preserve"> PAGEREF _Toc243948466 \h </w:instrText>
+          <w:instrText xml:space="preserve"> PAGEREF _Toc244091256 \h </w:instrText>
         </w:r>
         <w:r>
           <w:rPr>
@@ -6176,7 +6176,7 @@
           <w14:ligatures w14:val="standardContextual"/>
         </w:rPr>
       </w:pPr>
-      <w:hyperlink w:anchor="_Toc243948467" w:history="1">
+      <w:hyperlink w:anchor="_Toc244091257" w:history="1">
         <w:r>
           <w:rPr>
             <w:rStyle w:val="Hipervnculo"/>
@@ -6203,7 +6203,7 @@
             <w:noProof/>
             <w:webHidden/>
           </w:rPr>
-          <w:instrText xml:space="preserve"> PAGEREF _Toc243948467 \h </w:instrText>
+          <w:instrText xml:space="preserve"> PAGEREF _Toc244091257 \h </w:instrText>
         </w:r>
         <w:r>
           <w:rPr>
@@ -6246,7 +6246,7 @@
           <w14:ligatures w14:val="standardContextual"/>
         </w:rPr>
       </w:pPr>
-      <w:hyperlink w:anchor="_Toc243948468" w:history="1">
+      <w:hyperlink w:anchor="_Toc244091258" w:history="1">
         <w:r>
           <w:rPr>
             <w:rStyle w:val="Hipervnculo"/>
@@ -6273,7 +6273,7 @@
             <w:noProof/>
             <w:webHidden/>
           </w:rPr>
-          <w:instrText xml:space="preserve"> PAGEREF _Toc243948468 \h </w:instrText>
+          <w:instrText xml:space="preserve"> PAGEREF _Toc244091258 \h </w:instrText>
         </w:r>
         <w:r>
           <w:rPr>
@@ -6316,7 +6316,7 @@
           <w14:ligatures w14:val="standardContextual"/>
         </w:rPr>
       </w:pPr>
-      <w:hyperlink w:anchor="_Toc243948469" w:history="1">
+      <w:hyperlink w:anchor="_Toc244091259" w:history="1">
         <w:r>
           <w:rPr>
             <w:rStyle w:val="Hipervnculo"/>
@@ -6343,7 +6343,7 @@
             <w:noProof/>
             <w:webHidden/>
           </w:rPr>
-          <w:instrText xml:space="preserve"> PAGEREF _Toc243948469 \h </w:instrText>
+          <w:instrText xml:space="preserve"> PAGEREF _Toc244091259 \h </w:instrText>
         </w:r>
         <w:r>
           <w:rPr>
@@ -6386,7 +6386,7 @@
           <w14:ligatures w14:val="standardContextual"/>
         </w:rPr>
       </w:pPr>
-      <w:hyperlink w:anchor="_Toc243948470" w:history="1">
+      <w:hyperlink w:anchor="_Toc244091260" w:history="1">
         <w:r>
           <w:rPr>
             <w:rStyle w:val="Hipervnculo"/>
@@ -6413,7 +6413,7 @@
             <w:noProof/>
             <w:webHidden/>
           </w:rPr>
-          <w:instrText xml:space="preserve"> PAGEREF _Toc243948470 \h </w:instrText>
+          <w:instrText xml:space="preserve"> PAGEREF _Toc244091260 \h </w:instrText>
         </w:r>
         <w:r>
           <w:rPr>
@@ -6456,7 +6456,7 @@
           <w14:ligatures w14:val="standardContextual"/>
         </w:rPr>
       </w:pPr>
-      <w:hyperlink w:anchor="_Toc243948471" w:history="1">
+      <w:hyperlink w:anchor="_Toc244091261" w:history="1">
         <w:r>
           <w:rPr>
             <w:rStyle w:val="Hipervnculo"/>
@@ -6483,7 +6483,7 @@
             <w:noProof/>
             <w:webHidden/>
           </w:rPr>
-          <w:instrText xml:space="preserve"> PAGEREF _Toc243948471 \h </w:instrText>
+          <w:instrText xml:space="preserve"> PAGEREF _Toc244091261 \h </w:instrText>
         </w:r>
         <w:r>
           <w:rPr>
@@ -6529,7 +6529,7 @@
           <w14:ligatures w14:val="standardContextual"/>
         </w:rPr>
       </w:pPr>
-      <w:hyperlink w:anchor="_Toc243948472" w:history="1">
+      <w:hyperlink w:anchor="_Toc244091262" w:history="1">
         <w:r>
           <w:rPr>
             <w:rStyle w:val="Hipervnculo"/>
@@ -6556,7 +6556,7 @@
             <w:noProof/>
             <w:webHidden/>
           </w:rPr>
-          <w:instrText xml:space="preserve"> PAGEREF _Toc243948472 \h </w:instrText>
+          <w:instrText xml:space="preserve"> PAGEREF _Toc244091262 \h </w:instrText>
         </w:r>
         <w:r>
           <w:rPr>
@@ -6599,7 +6599,7 @@
           <w14:ligatures w14:val="standardContextual"/>
         </w:rPr>
       </w:pPr>
-      <w:hyperlink w:anchor="_Toc243948473" w:history="1">
+      <w:hyperlink w:anchor="_Toc244091263" w:history="1">
         <w:r>
           <w:rPr>
             <w:rStyle w:val="Hipervnculo"/>
@@ -6626,7 +6626,7 @@
             <w:noProof/>
             <w:webHidden/>
           </w:rPr>
-          <w:instrText xml:space="preserve"> PAGEREF _Toc243948473 \h </w:instrText>
+          <w:instrText xml:space="preserve"> PAGEREF _Toc244091263 \h </w:instrText>
         </w:r>
         <w:r>
           <w:rPr>
@@ -6669,7 +6669,7 @@
           <w14:ligatures w14:val="standardContextual"/>
         </w:rPr>
       </w:pPr>
-      <w:hyperlink w:anchor="_Toc243948474" w:history="1">
+      <w:hyperlink w:anchor="_Toc244091264" w:history="1">
         <w:r>
           <w:rPr>
             <w:rStyle w:val="Hipervnculo"/>
@@ -6696,7 +6696,7 @@
             <w:noProof/>
             <w:webHidden/>
           </w:rPr>
-          <w:instrText xml:space="preserve"> PAGEREF _Toc243948474 \h </w:instrText>
+          <w:instrText xml:space="preserve"> PAGEREF _Toc244091264 \h </w:instrText>
         </w:r>
         <w:r>
           <w:rPr>
@@ -6739,7 +6739,7 @@
           <w14:ligatures w14:val="standardContextual"/>
         </w:rPr>
       </w:pPr>
-      <w:hyperlink w:anchor="_Toc243948475" w:history="1">
+      <w:hyperlink w:anchor="_Toc244091265" w:history="1">
         <w:r>
           <w:rPr>
             <w:rStyle w:val="Hipervnculo"/>
@@ -6766,7 +6766,7 @@
             <w:noProof/>
             <w:webHidden/>
           </w:rPr>
-          <w:instrText xml:space="preserve"> PAGEREF _Toc243948475 \h </w:instrText>
+          <w:instrText xml:space="preserve"> PAGEREF _Toc244091265 \h </w:instrText>
         </w:r>
         <w:r>
           <w:rPr>
@@ -6809,7 +6809,7 @@
           <w14:ligatures w14:val="standardContextual"/>
         </w:rPr>
       </w:pPr>
-      <w:hyperlink w:anchor="_Toc243948476" w:history="1">
+      <w:hyperlink w:anchor="_Toc244091266" w:history="1">
         <w:r>
           <w:rPr>
             <w:rStyle w:val="Hipervnculo"/>
@@ -6836,7 +6836,7 @@
             <w:noProof/>
             <w:webHidden/>
           </w:rPr>
-          <w:instrText xml:space="preserve"> PAGEREF _Toc243948476 \h </w:instrText>
+          <w:instrText xml:space="preserve"> PAGEREF _Toc244091266 \h </w:instrText>
         </w:r>
         <w:r>
           <w:rPr>
@@ -6879,7 +6879,7 @@
           <w14:ligatures w14:val="standardContextual"/>
         </w:rPr>
       </w:pPr>
-      <w:hyperlink w:anchor="_Toc243948477" w:history="1">
+      <w:hyperlink w:anchor="_Toc244091267" w:history="1">
         <w:r>
           <w:rPr>
             <w:rStyle w:val="Hipervnculo"/>
@@ -6906,7 +6906,7 @@
             <w:noProof/>
             <w:webHidden/>
           </w:rPr>
-          <w:instrText xml:space="preserve"> PAGEREF _Toc243948477 \h </w:instrText>
+          <w:instrText xml:space="preserve"> PAGEREF _Toc244091267 \h </w:instrText>
         </w:r>
         <w:r>
           <w:rPr>
@@ -6926,7 +6926,7 @@
             <w:noProof/>
             <w:webHidden/>
           </w:rPr>
-          <w:t>59</w:t>
+          <w:t>60</w:t>
         </w:r>
         <w:r>
           <w:rPr>
@@ -6952,7 +6952,7 @@
           <w14:ligatures w14:val="standardContextual"/>
         </w:rPr>
       </w:pPr>
-      <w:hyperlink w:anchor="_Toc243948478" w:history="1">
+      <w:hyperlink w:anchor="_Toc244091268" w:history="1">
         <w:r>
           <w:rPr>
             <w:rStyle w:val="Hipervnculo"/>
@@ -6979,7 +6979,7 @@
             <w:noProof/>
             <w:webHidden/>
           </w:rPr>
-          <w:instrText xml:space="preserve"> PAGEREF _Toc243948478 \h </w:instrText>
+          <w:instrText xml:space="preserve"> PAGEREF _Toc244091268 \h </w:instrText>
         </w:r>
         <w:r>
           <w:rPr>
@@ -7022,7 +7022,7 @@
           <w14:ligatures w14:val="standardContextual"/>
         </w:rPr>
       </w:pPr>
-      <w:hyperlink w:anchor="_Toc243948479" w:history="1">
+      <w:hyperlink w:anchor="_Toc244091269" w:history="1">
         <w:r>
           <w:rPr>
             <w:rStyle w:val="Hipervnculo"/>
@@ -7049,7 +7049,7 @@
             <w:noProof/>
             <w:webHidden/>
           </w:rPr>
-          <w:instrText xml:space="preserve"> PAGEREF _Toc243948479 \h </w:instrText>
+          <w:instrText xml:space="preserve"> PAGEREF _Toc244091269 \h </w:instrText>
         </w:r>
         <w:r>
           <w:rPr>
@@ -7092,7 +7092,7 @@
           <w14:ligatures w14:val="standardContextual"/>
         </w:rPr>
       </w:pPr>
-      <w:hyperlink w:anchor="_Toc243948480" w:history="1">
+      <w:hyperlink w:anchor="_Toc244091270" w:history="1">
         <w:r>
           <w:rPr>
             <w:rStyle w:val="Hipervnculo"/>
@@ -7119,7 +7119,7 @@
             <w:noProof/>
             <w:webHidden/>
           </w:rPr>
-          <w:instrText xml:space="preserve"> PAGEREF _Toc243948480 \h </w:instrText>
+          <w:instrText xml:space="preserve"> PAGEREF _Toc244091270 \h </w:instrText>
         </w:r>
         <w:r>
           <w:rPr>
@@ -7162,7 +7162,7 @@
           <w14:ligatures w14:val="standardContextual"/>
         </w:rPr>
       </w:pPr>
-      <w:hyperlink w:anchor="_Toc243948481" w:history="1">
+      <w:hyperlink w:anchor="_Toc244091271" w:history="1">
         <w:r>
           <w:rPr>
             <w:rStyle w:val="Hipervnculo"/>
@@ -7189,7 +7189,7 @@
             <w:noProof/>
             <w:webHidden/>
           </w:rPr>
-          <w:instrText xml:space="preserve"> PAGEREF _Toc243948481 \h </w:instrText>
+          <w:instrText xml:space="preserve"> PAGEREF _Toc244091271 \h </w:instrText>
         </w:r>
         <w:r>
           <w:rPr>
@@ -7232,7 +7232,7 @@
           <w14:ligatures w14:val="standardContextual"/>
         </w:rPr>
       </w:pPr>
-      <w:hyperlink w:anchor="_Toc243948482" w:history="1">
+      <w:hyperlink w:anchor="_Toc244091272" w:history="1">
         <w:r>
           <w:rPr>
             <w:rStyle w:val="Hipervnculo"/>
@@ -7259,7 +7259,7 @@
             <w:noProof/>
             <w:webHidden/>
           </w:rPr>
-          <w:instrText xml:space="preserve"> PAGEREF _Toc243948482 \h </w:instrText>
+          <w:instrText xml:space="preserve"> PAGEREF _Toc244091272 \h </w:instrText>
         </w:r>
         <w:r>
           <w:rPr>
@@ -7302,7 +7302,7 @@
           <w14:ligatures w14:val="standardContextual"/>
         </w:rPr>
       </w:pPr>
-      <w:hyperlink w:anchor="_Toc243948483" w:history="1">
+      <w:hyperlink w:anchor="_Toc244091273" w:history="1">
         <w:r>
           <w:rPr>
             <w:rStyle w:val="Hipervnculo"/>
@@ -7329,7 +7329,7 @@
             <w:noProof/>
             <w:webHidden/>
           </w:rPr>
-          <w:instrText xml:space="preserve"> PAGEREF _Toc243948483 \h </w:instrText>
+          <w:instrText xml:space="preserve"> PAGEREF _Toc244091273 \h </w:instrText>
         </w:r>
         <w:r>
           <w:rPr>
@@ -7375,7 +7375,7 @@
           <w14:ligatures w14:val="standardContextual"/>
         </w:rPr>
       </w:pPr>
-      <w:hyperlink w:anchor="_Toc243948484" w:history="1">
+      <w:hyperlink w:anchor="_Toc244091274" w:history="1">
         <w:r>
           <w:rPr>
             <w:rStyle w:val="Hipervnculo"/>
@@ -7411,7 +7411,7 @@
             <w:noProof/>
             <w:webHidden/>
           </w:rPr>
-          <w:instrText xml:space="preserve"> PAGEREF _Toc243948484 \h </w:instrText>
+          <w:instrText xml:space="preserve"> PAGEREF _Toc244091274 \h </w:instrText>
         </w:r>
         <w:r>
           <w:rPr>
@@ -7454,7 +7454,7 @@
           <w14:ligatures w14:val="standardContextual"/>
         </w:rPr>
       </w:pPr>
-      <w:hyperlink w:anchor="_Toc243948485" w:history="1">
+      <w:hyperlink w:anchor="_Toc244091275" w:history="1">
         <w:r>
           <w:rPr>
             <w:rStyle w:val="Hipervnculo"/>
@@ -7481,7 +7481,7 @@
             <w:noProof/>
             <w:webHidden/>
           </w:rPr>
-          <w:instrText xml:space="preserve"> PAGEREF _Toc243948485 \h </w:instrText>
+          <w:instrText xml:space="preserve"> PAGEREF _Toc244091275 \h </w:instrText>
         </w:r>
         <w:r>
           <w:rPr>
@@ -7524,7 +7524,7 @@
           <w14:ligatures w14:val="standardContextual"/>
         </w:rPr>
       </w:pPr>
-      <w:hyperlink w:anchor="_Toc243948486" w:history="1">
+      <w:hyperlink w:anchor="_Toc244091276" w:history="1">
         <w:r>
           <w:rPr>
             <w:rStyle w:val="Hipervnculo"/>
@@ -7551,7 +7551,7 @@
             <w:noProof/>
             <w:webHidden/>
           </w:rPr>
-          <w:instrText xml:space="preserve"> PAGEREF _Toc243948486 \h </w:instrText>
+          <w:instrText xml:space="preserve"> PAGEREF _Toc244091276 \h </w:instrText>
         </w:r>
         <w:r>
           <w:rPr>
@@ -7594,7 +7594,7 @@
           <w14:ligatures w14:val="standardContextual"/>
         </w:rPr>
       </w:pPr>
-      <w:hyperlink w:anchor="_Toc243948487" w:history="1">
+      <w:hyperlink w:anchor="_Toc244091277" w:history="1">
         <w:r>
           <w:rPr>
             <w:rStyle w:val="Hipervnculo"/>
@@ -7621,7 +7621,7 @@
             <w:noProof/>
             <w:webHidden/>
           </w:rPr>
-          <w:instrText xml:space="preserve"> PAGEREF _Toc243948487 \h </w:instrText>
+          <w:instrText xml:space="preserve"> PAGEREF _Toc244091277 \h </w:instrText>
         </w:r>
         <w:r>
           <w:rPr>
@@ -7664,7 +7664,7 @@
           <w14:ligatures w14:val="standardContextual"/>
         </w:rPr>
       </w:pPr>
-      <w:hyperlink w:anchor="_Toc243948488" w:history="1">
+      <w:hyperlink w:anchor="_Toc244091278" w:history="1">
         <w:r>
           <w:rPr>
             <w:rStyle w:val="Hipervnculo"/>
@@ -7691,7 +7691,7 @@
             <w:noProof/>
             <w:webHidden/>
           </w:rPr>
-          <w:instrText xml:space="preserve"> PAGEREF _Toc243948488 \h </w:instrText>
+          <w:instrText xml:space="preserve"> PAGEREF _Toc244091278 \h </w:instrText>
         </w:r>
         <w:r>
           <w:rPr>
@@ -7734,7 +7734,7 @@
           <w14:ligatures w14:val="standardContextual"/>
         </w:rPr>
       </w:pPr>
-      <w:hyperlink w:anchor="_Toc243948489" w:history="1">
+      <w:hyperlink w:anchor="_Toc244091279" w:history="1">
         <w:r>
           <w:rPr>
             <w:rStyle w:val="Hipervnculo"/>
@@ -7761,7 +7761,7 @@
             <w:noProof/>
             <w:webHidden/>
           </w:rPr>
-          <w:instrText xml:space="preserve"> PAGEREF _Toc243948489 \h </w:instrText>
+          <w:instrText xml:space="preserve"> PAGEREF _Toc244091279 \h </w:instrText>
         </w:r>
         <w:r>
           <w:rPr>
@@ -7807,7 +7807,7 @@
           <w14:ligatures w14:val="standardContextual"/>
         </w:rPr>
       </w:pPr>
-      <w:hyperlink w:anchor="_Toc243948490" w:history="1">
+      <w:hyperlink w:anchor="_Toc244091280" w:history="1">
         <w:r>
           <w:rPr>
             <w:rStyle w:val="Hipervnculo"/>
@@ -7834,7 +7834,7 @@
             <w:noProof/>
             <w:webHidden/>
           </w:rPr>
-          <w:instrText xml:space="preserve"> PAGEREF _Toc243948490 \h </w:instrText>
+          <w:instrText xml:space="preserve"> PAGEREF _Toc244091280 \h </w:instrText>
         </w:r>
         <w:r>
           <w:rPr>
@@ -7877,7 +7877,7 @@
           <w14:ligatures w14:val="standardContextual"/>
         </w:rPr>
       </w:pPr>
-      <w:hyperlink w:anchor="_Toc243948491" w:history="1">
+      <w:hyperlink w:anchor="_Toc244091281" w:history="1">
         <w:r>
           <w:rPr>
             <w:rStyle w:val="Hipervnculo"/>
@@ -7904,7 +7904,7 @@
             <w:noProof/>
             <w:webHidden/>
           </w:rPr>
-          <w:instrText xml:space="preserve"> PAGEREF _Toc243948491 \h </w:instrText>
+          <w:instrText xml:space="preserve"> PAGEREF _Toc244091281 \h </w:instrText>
         </w:r>
         <w:r>
           <w:rPr>
@@ -7950,7 +7950,7 @@
           <w14:ligatures w14:val="standardContextual"/>
         </w:rPr>
       </w:pPr>
-      <w:hyperlink w:anchor="_Toc243948492" w:history="1">
+      <w:hyperlink w:anchor="_Toc244091282" w:history="1">
         <w:r>
           <w:rPr>
             <w:rStyle w:val="Hipervnculo"/>
@@ -7977,7 +7977,7 @@
             <w:noProof/>
             <w:webHidden/>
           </w:rPr>
-          <w:instrText xml:space="preserve"> PAGEREF _Toc243948492 \h </w:instrText>
+          <w:instrText xml:space="preserve"> PAGEREF _Toc244091282 \h </w:instrText>
         </w:r>
         <w:r>
           <w:rPr>
@@ -8020,7 +8020,7 @@
           <w14:ligatures w14:val="standardContextual"/>
         </w:rPr>
       </w:pPr>
-      <w:hyperlink w:anchor="_Toc243948493" w:history="1">
+      <w:hyperlink w:anchor="_Toc244091283" w:history="1">
         <w:r>
           <w:rPr>
             <w:rStyle w:val="Hipervnculo"/>
@@ -8047,7 +8047,7 @@
             <w:noProof/>
             <w:webHidden/>
           </w:rPr>
-          <w:instrText xml:space="preserve"> PAGEREF _Toc243948493 \h </w:instrText>
+          <w:instrText xml:space="preserve"> PAGEREF _Toc244091283 \h </w:instrText>
         </w:r>
         <w:r>
           <w:rPr>
@@ -8090,7 +8090,7 @@
           <w14:ligatures w14:val="standardContextual"/>
         </w:rPr>
       </w:pPr>
-      <w:hyperlink w:anchor="_Toc243948494" w:history="1">
+      <w:hyperlink w:anchor="_Toc244091284" w:history="1">
         <w:r>
           <w:rPr>
             <w:rStyle w:val="Hipervnculo"/>
@@ -8117,7 +8117,7 @@
             <w:noProof/>
             <w:webHidden/>
           </w:rPr>
-          <w:instrText xml:space="preserve"> PAGEREF _Toc243948494 \h </w:instrText>
+          <w:instrText xml:space="preserve"> PAGEREF _Toc244091284 \h </w:instrText>
         </w:r>
         <w:r>
           <w:rPr>
@@ -8160,7 +8160,7 @@
           <w14:ligatures w14:val="standardContextual"/>
         </w:rPr>
       </w:pPr>
-      <w:hyperlink w:anchor="_Toc243948495" w:history="1">
+      <w:hyperlink w:anchor="_Toc244091285" w:history="1">
         <w:r>
           <w:rPr>
             <w:rStyle w:val="Hipervnculo"/>
@@ -8187,7 +8187,7 @@
             <w:noProof/>
             <w:webHidden/>
           </w:rPr>
-          <w:instrText xml:space="preserve"> PAGEREF _Toc243948495 \h </w:instrText>
+          <w:instrText xml:space="preserve"> PAGEREF _Toc244091285 \h </w:instrText>
         </w:r>
         <w:r>
           <w:rPr>
@@ -8233,7 +8233,7 @@
           <w14:ligatures w14:val="standardContextual"/>
         </w:rPr>
       </w:pPr>
-      <w:hyperlink w:anchor="_Toc243948496" w:history="1">
+      <w:hyperlink w:anchor="_Toc244091286" w:history="1">
         <w:r>
           <w:rPr>
             <w:rStyle w:val="Hipervnculo"/>
@@ -8260,7 +8260,7 @@
             <w:noProof/>
             <w:webHidden/>
           </w:rPr>
-          <w:instrText xml:space="preserve"> PAGEREF _Toc243948496 \h </w:instrText>
+          <w:instrText xml:space="preserve"> PAGEREF _Toc244091286 \h </w:instrText>
         </w:r>
         <w:r>
           <w:rPr>
@@ -8306,7 +8306,7 @@
           <w14:ligatures w14:val="standardContextual"/>
         </w:rPr>
       </w:pPr>
-      <w:hyperlink w:anchor="_Toc243948497" w:history="1">
+      <w:hyperlink w:anchor="_Toc244091287" w:history="1">
         <w:r>
           <w:rPr>
             <w:rStyle w:val="Hipervnculo"/>
@@ -8333,7 +8333,7 @@
             <w:noProof/>
             <w:webHidden/>
           </w:rPr>
-          <w:instrText xml:space="preserve"> PAGEREF _Toc243948497 \h </w:instrText>
+          <w:instrText xml:space="preserve"> PAGEREF _Toc244091287 \h </w:instrText>
         </w:r>
         <w:r>
           <w:rPr>
@@ -8468,10 +8468,7 @@
         <w:t>VD-xxx</w:t>
       </w:r>
       <w:r>
-        <w:t xml:space="preserve"> </w:t>
-      </w:r>
-      <w:r>
-        <w:t xml:space="preserve">(derivada del análisis de vacíos), </w:t>
+        <w:t xml:space="preserve"> (derivada del análisis de vacíos), </w:t>
       </w:r>
       <w:r>
         <w:rPr>
@@ -8555,21 +8552,7 @@
           <w:i/>
           <w:iCs/>
         </w:rPr>
-        <w:t xml:space="preserve"> </w:t>
-      </w:r>
-      <w:r>
-        <w:rPr>
-          <w:i/>
-          <w:iCs/>
-        </w:rPr>
-        <w:t>(11 de octubre de 2026) acompaña la versión 2.0.0-alpha.1, que cierra el módulo 0 (plataforma, identidad y aislamiento): HU-T.15, HU-T.16, HU-T.17, HU-T.19, HU-5.8, HU-0.1, HU-0.2, HU-0.3 y HU-0.4 pasan a «Implementada (2.0.0-alpha.1)»; el alta de personal invita a la persona y solo la vincula si acepta (HU-T.7); los topes del plan gratuito quedan en 2 cuentas de personal, 50 mascotas vinculadas y 100 citas al mes (HU-0.4); la moderación de reseñas de HU-0.3 y la regla de no calificarse a sí mismo de HU-T.1</w:t>
-      </w:r>
-      <w:r>
-        <w:rPr>
-          <w:i/>
-          <w:iCs/>
-        </w:rPr>
-        <w:t>7 se entregan en la v2.1 con HU-8.1, la revocación de HU-T.19 con HU-5.14, el QR del portal de HU-5.8 con el carnet QR del módulo 5 y la clasificación de la urgencia de HU-0.4 con el triage. Las historias de otros módulos que M0 dejó construidas en parte (HU-T.18, HU-5.9, HU-1.5, HU-5.12, HU-5.13 y HU-2.10) se cierran con su módulo.</w:t>
+        <w:t xml:space="preserve"> (11 de octubre de 2026) acompaña la versión 2.0.0-alpha.1, que cierra el módulo 0 (plataforma, identidad y aislamiento): HU-T.15, HU-T.16, HU-T.17, HU-T.19, HU-5.8, HU-0.1, HU-0.2, HU-0.3 y HU-0.4 pasan a «Implementada (2.0.0-alpha.1)»; el alta de personal invita a la persona y solo la vincula si acepta (HU-T.7); los topes del plan gratuito quedan en 2 cuentas de personal, 50 mascotas vinculadas y 100 citas al mes (HU-0.4); la moderación de reseñas de HU-0.3 y la regla de no calificarse a sí mismo de HU-T.17 se entregan en la v2.1 con HU-8.1, la revocación de HU-T.19 con HU-5.14, el QR del portal de HU-5.8 con el carnet QR del módulo 5 y la clasificación de la urgencia de HU-0.4 con el triage. Las historias de otros módulos que M0 dejó construidas en parte (HU-T.18, HU-5.9, HU-1.5, HU-5.12, HU-5.13 y HU-2.10) se cierran con su módulo.</w:t>
       </w:r>
     </w:p>
     <w:p>
@@ -8597,21 +8580,7 @@
           <w:i/>
           <w:iCs/>
         </w:rPr>
-        <w:t xml:space="preserve"> </w:t>
-      </w:r>
-      <w:r>
-        <w:rPr>
-          <w:i/>
-          <w:iCs/>
-        </w:rPr>
-        <w:t>(14 de octubre de 2026) acompaña la versión 2.0.0-alpha.3, que cierra el módulo 5 (portal multi-clínica y vínculos): HU-T.18, HU-5.9, HU-1.5, HU-5.12, HU-5.13 y HU-2.10 pasan a «Implementada (2.0.0-alpha.3)», con las alergias y alertas de HU-2.10 en el módulo 2. La clínica registra al propietario sin aceptación presencial: el titular activa su cuenta desde un enlace de 72 horas y, si vence, lo pide él mismo o activa con Google (HU-T.19, HU-1.2, HU-T.18, HU-5.8). El propietario puede tener hasta 3 clínicas c</w:t>
-      </w:r>
-      <w:r>
-        <w:rPr>
-          <w:i/>
-          <w:iCs/>
-        </w:rPr>
-        <w:t>uando se vincula él (HU-5.13); el personal lo busca también por nombre entre sus clientes (HU-1.5); el color de la mascota ya no se pide (HU-1.1); y los correos temporales se rechazan en los registros y al cambiar el correo (HU-T.5, HU-T.18, HU-5.8).</w:t>
+        <w:t xml:space="preserve"> (14 de octubre de 2026) acompaña la versión 2.0.0-alpha.3, que cierra el módulo 5 (portal multi-clínica y vínculos): HU-T.18, HU-5.9, HU-1.5, HU-5.12, HU-5.13 y HU-2.10 pasan a «Implementada (2.0.0-alpha.3)», con las alergias y alertas de HU-2.10 en el módulo 2. La clínica registra al propietario sin aceptación presencial: el titular activa su cuenta desde un enlace de 72 horas y, si vence, lo pide él mismo o activa con Google (HU-T.19, HU-1.2, HU-T.18, HU-5.8). El propietario puede tener hasta 3 clínicas cuando se vincula él (HU-5.13); el personal lo busca también por nombre entre sus clientes (HU-1.5); el color de la mascota ya no se pide (HU-1.1); y los correos temporales se rechazan en los registros y al cambiar el correo (HU-T.5, HU-T.18, HU-5.8).</w:t>
       </w:r>
     </w:p>
     <w:p>
@@ -8668,21 +8637,7 @@
           <w:i/>
           <w:iCs/>
         </w:rPr>
-        <w:t xml:space="preserve"> </w:t>
-      </w:r>
-      <w:r>
-        <w:rPr>
-          <w:i/>
-          <w:iCs/>
-        </w:rPr>
-        <w:t>(21 de octubre de 2026) acompaña la versión 2.0.0-alpha.5, que cierra el módulo 4 (agenda inteligente y Grafo II): HU-2.2, HU-2.11, HU-4.5, HU-4.6, HU-4.8, HU-4.9, HU-4.11, HU-4.12, HU-4.13, HU-4.14, HU-4.15, HU-4.18, HU-4.19, HU-5.6 y HU-7.4 pasan a «Implementada (2.0.0-alpha.5)»; HU-4.7 queda parcial (el reporte de ausentismo RE-4.7.3 sigue en v2.1). Solo veterinario y propietario crean citas; una cita reclasificada a rojo entra sola a la cola de Urgencias; la llegada tarde ofrece servicio completo, reduc</w:t>
-      </w:r>
-      <w:r>
-        <w:rPr>
-          <w:i/>
-          <w:iCs/>
-        </w:rPr>
-        <w:t>ido explícito, reprogramar u otro veterinario (RN-426). HU-4.10, HU-4.16 y HU-4.17 siguen en v2.1.</w:t>
+        <w:t xml:space="preserve"> (21 de octubre de 2026) acompaña la versión 2.0.0-alpha.5, que cierra el módulo 4 (agenda inteligente y Grafo II): HU-2.2, HU-2.11, HU-4.5, HU-4.6, HU-4.8, HU-4.9, HU-4.11, HU-4.12, HU-4.13, HU-4.14, HU-4.15, HU-4.18, HU-4.19, HU-5.6 y HU-7.4 pasan a «Implementada (2.0.0-alpha.5)»; HU-4.7 queda parcial (el reporte de ausentismo RE-4.7.3 sigue en v2.1). Solo veterinario y propietario crean citas; una cita reclasificada a rojo entra sola a la cola de Urgencias; la llegada tarde ofrece servicio completo, reducido explícito, reprogramar u otro veterinario (RN-426). HU-4.10, HU-4.16 y HU-4.17 siguen en v2.1.</w:t>
       </w:r>
     </w:p>
     <w:p>
@@ -8712,10 +8667,7 @@
         <w:t>Salvedad acordada por el dueño (23/10/2026):</w:t>
       </w:r>
       <w:r>
-        <w:t xml:space="preserve"> </w:t>
-      </w:r>
-      <w:r>
-        <w:t>RE-5.8.4 conserva pendiente el QR del portal en el correo de alta, para una entrega aparte. El correo sí lleva el enlace de acceso. El carnet de emergencia de la mascota de HU-5.10/HU-5.11 queda implementado; no se amplía Carnet B con ese otro QR.</w:t>
+        <w:t xml:space="preserve"> RE-5.8.4 conserva pendiente el QR del portal en el correo de alta, para una entrega aparte. El correo sí lleva el enlace de acceso. El carnet de emergencia de la mascota de HU-5.10/HU-5.11 queda implementado; no se amplía Carnet B con ese otro QR.</w:t>
       </w:r>
     </w:p>
     <w:p>
@@ -8742,10 +8694,7 @@
         <w:t>Cierre de HU-4.7 (2.1.0, 26/10/2026):</w:t>
       </w:r>
       <w:r>
-        <w:t xml:space="preserve"> HU-4.7 pasa a implementada. El reporte de ausentismo (RE-4.7.3) es el porcentaje de no asistencia del mes que muestra el Inicio del administrador (RE-6.2.12); no hizo falta código nuevo. </w:t>
-      </w:r>
-      <w:r>
-        <w:t>HU-5.10 y HU-5.11 cierran el carnet QR en 2.0.0; los estados describen la entrega preparada y no afirman que ya esté desplegada.</w:t>
+        <w:t xml:space="preserve"> HU-4.7 pasa a implementada. El reporte de ausentismo (RE-4.7.3) es el porcentaje de no asistencia del mes que muestra el Inicio del administrador (RE-6.2.12); no hizo falta código nuevo. HU-5.10 y HU-5.11 cierran el carnet QR en 2.0.0; los estados describen la entrega preparada y no afirman que ya esté desplegada.</w:t>
       </w:r>
     </w:p>
     <w:p>
@@ -8869,10 +8818,7 @@
         <w:t>Módulo 4</w:t>
       </w:r>
       <w:r>
-        <w:t xml:space="preserve"> </w:t>
-      </w:r>
-      <w:r>
-        <w:t>— Agenda de citas inteligente (Grafo II) · 19 historias</w:t>
+        <w:t xml:space="preserve"> — Agenda de citas inteligente (Grafo II) · 19 historias</w:t>
       </w:r>
     </w:p>
     <w:p>
@@ -8992,10 +8938,7 @@
         <w:t>Preparación M4/B1 — 2026-10-17:</w:t>
       </w:r>
       <w:r>
-        <w:t xml:space="preserve"> </w:t>
-      </w:r>
-      <w:r>
-        <w:t>criterios confirmados de destino pendientes de implementación funcional; no se cambia revisión. El ejecutable sigue en alpha.4 y los estados históricos no acreditan los nuevos flujos.</w:t>
+        <w:t xml:space="preserve"> criterios confirmados de destino pendientes de implementación funcional; no se cambia revisión. El ejecutable sigue en alpha.4 y los estados históricos no acreditan los nuevos flujos.</w:t>
       </w:r>
     </w:p>
     <w:p>
@@ -9003,7 +8946,7 @@
         <w:pStyle w:val="Ttulo1"/>
       </w:pPr>
       <w:bookmarkStart w:id="0" w:name="_ad9e25c8626cd57ecdce5548ccf29c0d11fa207"/>
-      <w:bookmarkStart w:id="1" w:name="_Toc243948385"/>
+      <w:bookmarkStart w:id="1" w:name="_Toc244091175"/>
       <w:r>
         <w:lastRenderedPageBreak/>
         <w:t xml:space="preserve">Módulo 0 — Plataforma: clínicas, planes y suscripción </w:t>
@@ -9030,7 +8973,7 @@
         <w:pStyle w:val="Ttulo2"/>
       </w:pPr>
       <w:bookmarkStart w:id="2" w:name="_1eb36715c186f58cce98281b1b189d20510db73"/>
-      <w:bookmarkStart w:id="3" w:name="_Toc243948386"/>
+      <w:bookmarkStart w:id="3" w:name="_Toc244091176"/>
       <w:r>
         <w:t>HU-0.1 — Registrar una clínica (self-service)</w:t>
       </w:r>
@@ -9210,10 +9153,7 @@
         </w:numPr>
       </w:pPr>
       <w:r>
-        <w:t>Pide un único NIT o cédula: sin guion conserva todo el número y calcula el DV; con guion comprueba el DV escrito mediante el algoritmo DIAN. No añade guion ni recorta cifras al escribir o salir; limpia puntos/espacios al pegar. Se guarda número más DV en el formato normalizado existente (rectificación del dueño, 2026-10-26, que permite cédula sola y sustituye la obligación de escribir siempre el DV). El NIT duplicado se rechaza y puede reportarse a soporte. La respuesta pública no revela identidades: «Revis</w:t>
-      </w:r>
-      <w:r>
-        <w:t>a tu correo para activar la clínica». Una cuenta existente confirma por correo sin cambiar sus datos, contraseña ni otros roles; la contraseña del formulario se ignora. Si el correo es nuevo y el documento existe, se confirma al titular del documento; si identifican personas distintas, prevalece el correo.</w:t>
+        <w:t>Pide un único NIT o cédula: sin guion conserva todo el número y calcula el DV; con guion comprueba el DV escrito mediante el algoritmo DIAN. No añade guion ni recorta cifras al escribir o salir; limpia puntos/espacios al pegar. Se guarda número más DV en el formato normalizado existente (rectificación del dueño, 2026-10-26, que permite cédula sola y sustituye la obligación de escribir siempre el DV). El NIT duplicado se rechaza y puede reportarse a soporte. La respuesta pública no revela identidades: «Revisa tu correo para activar la clínica». Una cuenta existente confirma por correo sin cambiar sus datos, contraseña ni otros roles; la contraseña del formulario se ignora. Si el correo es nuevo y el documento existe, se confirma al titular del documento; si identifican personas distintas, prevalece el correo.</w:t>
       </w:r>
     </w:p>
     <w:p>
@@ -9316,7 +9256,7 @@
         <w:pStyle w:val="Ttulo2"/>
       </w:pPr>
       <w:bookmarkStart w:id="4" w:name="_802afc2bac434eff8b2fd18354a2e26d7a1818b"/>
-      <w:bookmarkStart w:id="5" w:name="_Toc243948387"/>
+      <w:bookmarkStart w:id="5" w:name="_Toc244091177"/>
       <w:bookmarkEnd w:id="2"/>
       <w:r>
         <w:lastRenderedPageBreak/>
@@ -9608,7 +9548,7 @@
         <w:pStyle w:val="Ttulo2"/>
       </w:pPr>
       <w:bookmarkStart w:id="6" w:name="_bb7346f7e0c84a0526cc1b09dcf7185b4de9ba6"/>
-      <w:bookmarkStart w:id="7" w:name="_Toc243948388"/>
+      <w:bookmarkStart w:id="7" w:name="_Toc244091178"/>
       <w:bookmarkEnd w:id="4"/>
       <w:r>
         <w:t>HU-0.3 — Panel del super-administrador</w:t>
@@ -9796,10 +9736,7 @@
         <w:t>Implementada (2.1.0):</w:t>
       </w:r>
       <w:r>
-        <w:t xml:space="preserve"> </w:t>
-      </w:r>
-      <w:r>
-        <w:t>consulta historial de pagos e incidencias por clínica como metadatos, sin entrar en datos clínicos ni cobrar una fuente; revisa con nota auditada sin alterar pagos o periodos.</w:t>
+        <w:t xml:space="preserve"> consulta historial de pagos e incidencias por clínica como metadatos, sin entrar en datos clínicos ni cobrar una fuente; revisa con nota auditada sin alterar pagos o periodos.</w:t>
       </w:r>
     </w:p>
     <w:p>
@@ -9983,7 +9920,7 @@
         <w:pStyle w:val="Ttulo2"/>
       </w:pPr>
       <w:bookmarkStart w:id="8" w:name="_81995397ba8e62ea0a492c5a03eed8bb24e762a"/>
-      <w:bookmarkStart w:id="9" w:name="_Toc243948389"/>
+      <w:bookmarkStart w:id="9" w:name="_Toc244091179"/>
       <w:bookmarkEnd w:id="6"/>
       <w:r>
         <w:t>HU-0.4 — Control de límites del plan (freemium)</w:t>
@@ -10211,16 +10148,7 @@
         <w:t>Excepción:</w:t>
       </w:r>
       <w:r>
-        <w:t xml:space="preserve"> </w:t>
-      </w:r>
-      <w:r>
-        <w:t xml:space="preserve">una urgencia </w:t>
-      </w:r>
-      <w:r>
-        <w:t>🔴</w:t>
-      </w:r>
-      <w:r>
-        <w:t xml:space="preserve"> nunca se bloquea por el límite ni por la mora; se atiende y se registra (RN-420).</w:t>
+        <w:t xml:space="preserve"> una urgencia 🔴 nunca se bloquea por el límite ni por la mora; se atiende y se registra (RN-420).</w:t>
       </w:r>
     </w:p>
     <w:p>
@@ -10343,7 +10271,7 @@
         <w:pStyle w:val="Ttulo2"/>
       </w:pPr>
       <w:bookmarkStart w:id="10" w:name="_7e8f3608e8fc52636cb9cbad9cf55731ae6c539"/>
-      <w:bookmarkStart w:id="11" w:name="_Toc243948390"/>
+      <w:bookmarkStart w:id="11" w:name="_Toc244091180"/>
       <w:bookmarkEnd w:id="8"/>
       <w:r>
         <w:t>HU-0.5 — Suscripción, pagos y congelación por mora</w:t>
@@ -10580,13 +10508,7 @@
         <w:t>S2:</w:t>
       </w:r>
       <w:r>
-        <w:t xml:space="preserve"> </w:t>
-      </w:r>
-      <w:r>
-        <w:t xml:space="preserve">Pagar/Renovar abre Wompi por importe del servidor y referencia única. La consulta API privada concordante concede periodo una vez, por evento verificado o recuperación del ID del retorno limitada a la clínica propia; los datos del navegador nunca acreditan por sí solos. Doble clic, dos pestañas o peticiones simultáneas devuelven la misma orden y nunca originan dos cobros desde Zooki. Historial propio sin datos completos del medio. Una cotización vencida se libera tras fallo terminal confirmado o, si fue un </w:t>
-      </w:r>
-      <w:r>
-        <w:t>checkout manual abandonado sin ID, tras búsqueda privada completa y vacía por referencia y revalidación bajo candado con auditoría. La comprobación ocurre al volver a pagar y en la tarea programada existente; errores o resultados dudosos no liberan la reserva. La siguiente cotización usa tarifa vigente y conserva la evidencia anterior; una aprobación tardía de la orden cerrada genera incidencia sin conceder otro periodo (decisión del dueño, 2026-10-26).</w:t>
+        <w:t xml:space="preserve"> Pagar/Renovar abre Wompi por importe del servidor y referencia única. La consulta API privada concordante concede periodo una vez, por evento verificado o recuperación del ID del retorno limitada a la clínica propia; los datos del navegador nunca acreditan por sí solos. Doble clic, dos pestañas o peticiones simultáneas devuelven la misma orden y nunca originan dos cobros desde Zooki. Historial propio sin datos completos del medio. Una cotización vencida se libera tras fallo terminal confirmado o, si fue un checkout manual abandonado sin ID, tras búsqueda privada completa y vacía por referencia y revalidación bajo candado con auditoría. La comprobación ocurre al volver a pagar y en la tarea programada existente; errores o resultados dudosos no liberan la reserva. La siguiente cotización usa tarifa vigente y conserva la evidencia anterior; una aprobación tardía de la orden cerrada genera incidencia sin conceder otro periodo (decisión del dueño, 2026-10-26).</w:t>
       </w:r>
     </w:p>
     <w:p>
@@ -10690,7 +10612,7 @@
         <w:pStyle w:val="Ttulo1"/>
       </w:pPr>
       <w:bookmarkStart w:id="12" w:name="_3f52c9db5995a4dc1e731f6d8cd57f262bab040"/>
-      <w:bookmarkStart w:id="13" w:name="_Toc243948391"/>
+      <w:bookmarkStart w:id="13" w:name="_Toc244091181"/>
       <w:bookmarkEnd w:id="0"/>
       <w:bookmarkEnd w:id="10"/>
       <w:r>
@@ -10712,7 +10634,7 @@
         <w:pStyle w:val="Ttulo2"/>
       </w:pPr>
       <w:bookmarkStart w:id="14" w:name="_76f4ca07816b696a7e21234a3fd245066d4202e"/>
-      <w:bookmarkStart w:id="15" w:name="_Toc243948392"/>
+      <w:bookmarkStart w:id="15" w:name="_Toc244091182"/>
       <w:r>
         <w:t>HU-T.1 — Iniciar sesión y autenticación</w:t>
       </w:r>
@@ -10967,7 +10889,7 @@
         <w:pStyle w:val="Ttulo2"/>
       </w:pPr>
       <w:bookmarkStart w:id="16" w:name="_08f5c8e95117bf9bc16117a780f642084f0c149"/>
-      <w:bookmarkStart w:id="17" w:name="_Toc243948393"/>
+      <w:bookmarkStart w:id="17" w:name="_Toc244091183"/>
       <w:bookmarkEnd w:id="14"/>
       <w:r>
         <w:t>HU-T.2 — Cambiar mi contraseña</w:t>
@@ -11243,7 +11165,7 @@
         <w:pStyle w:val="Ttulo2"/>
       </w:pPr>
       <w:bookmarkStart w:id="18" w:name="_44f513b1e95bac8cbf132f88a3649b6be2902d9"/>
-      <w:bookmarkStart w:id="19" w:name="_Toc243948394"/>
+      <w:bookmarkStart w:id="19" w:name="_Toc244091184"/>
       <w:bookmarkEnd w:id="16"/>
       <w:r>
         <w:lastRenderedPageBreak/>
@@ -11482,7 +11404,7 @@
         <w:pStyle w:val="Ttulo2"/>
       </w:pPr>
       <w:bookmarkStart w:id="20" w:name="_1eded849c0926854c498005f8a93458b9d7a2d8"/>
-      <w:bookmarkStart w:id="21" w:name="_Toc243948395"/>
+      <w:bookmarkStart w:id="21" w:name="_Toc244091185"/>
       <w:bookmarkEnd w:id="18"/>
       <w:r>
         <w:t>HU-T.4 — Cerrar sesión</w:t>
@@ -11708,7 +11630,7 @@
         <w:pStyle w:val="Ttulo2"/>
       </w:pPr>
       <w:bookmarkStart w:id="22" w:name="_def34846ffbe39a85a6bd6a22079f6d076a01a9"/>
-      <w:bookmarkStart w:id="23" w:name="_Toc243948396"/>
+      <w:bookmarkStart w:id="23" w:name="_Toc244091186"/>
       <w:bookmarkEnd w:id="20"/>
       <w:r>
         <w:t>HU-T.5 — Ver y actualizar mi perfil y datos de contacto</w:t>
@@ -11920,10 +11842,7 @@
         <w:t>(v2.0)</w:t>
       </w:r>
       <w:r>
-        <w:t xml:space="preserve"> </w:t>
-      </w:r>
-      <w:r>
-        <w:t xml:space="preserve">Cambiar el correo pide confirmar la identidad, y una cuenta sin contraseña debe crearla antes. El correo nuevo solo se aplica después de verificarlo; el correo anterior recibe </w:t>
+        <w:t xml:space="preserve"> Cambiar el correo pide confirmar la identidad, y una cuenta sin contraseña debe crearla antes. El correo nuevo solo se aplica después de verificarlo; el correo anterior recibe </w:t>
       </w:r>
       <w:r>
         <w:lastRenderedPageBreak/>
@@ -11965,10 +11884,7 @@
         <w:t>(v2.0)</w:t>
       </w:r>
       <w:r>
-        <w:t xml:space="preserve"> </w:t>
-      </w:r>
-      <w:r>
-        <w:t>Puedo corregir mi tipo y número de documento confirmando mi identidad (contraseña o Google); si el documento ya pertenece a otra cuenta, el cambio pasa a soporte.</w:t>
+        <w:t xml:space="preserve"> Puedo corregir mi tipo y número de documento confirmando mi identidad (contraseña o Google); si el documento ya pertenece a otra cuenta, el cambio pasa a soporte.</w:t>
       </w:r>
     </w:p>
     <w:p>
@@ -12075,14 +11991,7 @@
           <w:i/>
           <w:iCs/>
         </w:rPr>
-        <w:t xml:space="preserve"> </w:t>
-      </w:r>
-      <w:r>
-        <w:rPr>
-          <w:i/>
-          <w:iCs/>
-        </w:rPr>
-        <w:t>sirve a los cuatro roles; el sujeto sale siempre de la sesión, nunca del POST (RN-G02). Hasta v1.8.0 solo el propietario podía editar sus datos, desde su portal: administrador, veterinario y recepcionista no tenían ninguna vista de perfil. El documento, el nombre y el rol son de solo lectura; dejar el rol editable sería la escalada de privilegios que corrigió HU-T.11. Desde v1.8.0 el personal entra por «Mi perfil» en el menú del avatar a un panel propio (</w:t>
+        <w:t xml:space="preserve"> sirve a los cuatro roles; el sujeto sale siempre de la sesión, nunca del POST (RN-G02). Hasta v1.8.0 solo el propietario podía editar sus datos, desde su portal: administrador, veterinario y recepcionista no tenían ninguna vista de perfil. El documento, el nombre y el rol son de solo lectura; dejar el rol editable sería la escalada de privilegios que corrigió HU-T.11. Desde v1.8.0 el personal entra por «Mi perfil» en el menú del avatar a un panel propio (</w:t>
       </w:r>
       <w:r>
         <w:rPr>
@@ -12132,7 +12041,7 @@
         <w:pStyle w:val="Ttulo2"/>
       </w:pPr>
       <w:bookmarkStart w:id="24" w:name="_37603926653c908321bb7c7e9ea1991584cc3b8"/>
-      <w:bookmarkStart w:id="25" w:name="_Toc243948397"/>
+      <w:bookmarkStart w:id="25" w:name="_Toc244091187"/>
       <w:bookmarkEnd w:id="22"/>
       <w:r>
         <w:t>HU-T.6 — Gestionar mis notificaciones internas</w:t>
@@ -12410,7 +12319,7 @@
         <w:pStyle w:val="Ttulo2"/>
       </w:pPr>
       <w:bookmarkStart w:id="26" w:name="_5605fb9a7931d45a4bf5dc8e3e653d18c531f06"/>
-      <w:bookmarkStart w:id="27" w:name="_Toc243948398"/>
+      <w:bookmarkStart w:id="27" w:name="_Toc244091188"/>
       <w:bookmarkEnd w:id="24"/>
       <w:r>
         <w:t>HU-T.7 — Gestión de usuarios del sistema</w:t>
@@ -12697,7 +12606,7 @@
         <w:pStyle w:val="Ttulo2"/>
       </w:pPr>
       <w:bookmarkStart w:id="28" w:name="_cca84937acbaa5cdc69c436564f31a3800184ab"/>
-      <w:bookmarkStart w:id="29" w:name="_Toc243948399"/>
+      <w:bookmarkStart w:id="29" w:name="_Toc244091189"/>
       <w:bookmarkEnd w:id="26"/>
       <w:r>
         <w:t>HU-T.8 — Logs de auditoría y seguridad</w:t>
@@ -12942,7 +12851,7 @@
         <w:pStyle w:val="Ttulo2"/>
       </w:pPr>
       <w:bookmarkStart w:id="30" w:name="_cb462f816148050ba0d7aac8f53a2b5b0cb7780"/>
-      <w:bookmarkStart w:id="31" w:name="_Toc243948400"/>
+      <w:bookmarkStart w:id="31" w:name="_Toc244091190"/>
       <w:bookmarkEnd w:id="28"/>
       <w:r>
         <w:t>HU-T.9 — Backup automático de la base de datos</w:t>
@@ -13295,14 +13204,7 @@
           <w:i/>
           <w:iCs/>
         </w:rPr>
-        <w:t xml:space="preserve"> </w:t>
-      </w:r>
-      <w:r>
-        <w:rPr>
-          <w:i/>
-          <w:iCs/>
-        </w:rPr>
-        <w:t xml:space="preserve">para poder apuntar a un volumen externo, como pide el criterio. La programación cada 24 h está versionada en </w:t>
+        <w:t xml:space="preserve"> para poder apuntar a un volumen externo, como pide el criterio. La programación cada 24 h está versionada en </w:t>
       </w:r>
       <w:r>
         <w:rPr>
@@ -13412,7 +13314,7 @@
         <w:pStyle w:val="Ttulo2"/>
       </w:pPr>
       <w:bookmarkStart w:id="32" w:name="_276f5e9a65ab31ebb82d9356073ee60ffcf6855"/>
-      <w:bookmarkStart w:id="33" w:name="_Toc243948401"/>
+      <w:bookmarkStart w:id="33" w:name="_Toc244091191"/>
       <w:bookmarkEnd w:id="30"/>
       <w:r>
         <w:t>HU-T.10 — Autorización central por rol (RBAC real)</w:t>
@@ -13690,7 +13592,7 @@
         <w:pStyle w:val="Ttulo2"/>
       </w:pPr>
       <w:bookmarkStart w:id="34" w:name="_3b0d05aa899aefedfcf439319a22bd7df135017"/>
-      <w:bookmarkStart w:id="35" w:name="_Toc243948402"/>
+      <w:bookmarkStart w:id="35" w:name="_Toc244091192"/>
       <w:bookmarkEnd w:id="32"/>
       <w:r>
         <w:t>HU-T.11 — Corregir escalada de privilegios y proteger al último administrador</w:t>
@@ -13940,7 +13842,7 @@
         <w:pStyle w:val="Ttulo2"/>
       </w:pPr>
       <w:bookmarkStart w:id="36" w:name="_5106da541d290f3488d79d8c1e91fe390d48e5c"/>
-      <w:bookmarkStart w:id="37" w:name="_Toc243948403"/>
+      <w:bookmarkStart w:id="37" w:name="_Toc244091193"/>
       <w:bookmarkEnd w:id="34"/>
       <w:r>
         <w:t>HU-T.12 — Política de contraseñas, verificación de correo y OAuth seguro</w:t>
@@ -14261,7 +14163,7 @@
         <w:pStyle w:val="Ttulo2"/>
       </w:pPr>
       <w:bookmarkStart w:id="38" w:name="_2303defb5da6c78860aeae9d161d0fa18f76502"/>
-      <w:bookmarkStart w:id="39" w:name="_Toc243948404"/>
+      <w:bookmarkStart w:id="39" w:name="_Toc244091194"/>
       <w:bookmarkEnd w:id="36"/>
       <w:r>
         <w:t>HU-T.13 — Endurecer rate limiting y reducir enumeración/fuga de información</w:t>
@@ -14461,10 +14363,7 @@
         <w:t>(v2.0)</w:t>
       </w:r>
       <w:r>
-        <w:t xml:space="preserve"> </w:t>
-      </w:r>
-      <w:r>
-        <w:t>Sobre un mismo documento o correo, tras 5 intentos fallidos no se bloquea la cuenta: se exige superar el CAPTCHA, que el inicio de sesión solo muestra desde ese momento. Así nadie puede dejar sin acceso a otro usuario fallando a propósito con su documento o correo, y como se cuenta por lo escrito, exista o no la cuenta, pedirlo no la revela.</w:t>
+        <w:t xml:space="preserve"> Sobre un mismo documento o correo, tras 5 intentos fallidos no se bloquea la cuenta: se exige superar el CAPTCHA, que el inicio de sesión solo muestra desde ese momento. Así nadie puede dejar sin acceso a otro usuario fallando a propósito con su documento o correo, y como se cuenta por lo escrito, exista o no la cuenta, pedirlo no la revela.</w:t>
       </w:r>
     </w:p>
     <w:p>
@@ -14563,7 +14462,7 @@
         <w:pStyle w:val="Ttulo2"/>
       </w:pPr>
       <w:bookmarkStart w:id="40" w:name="_37cade07514fa6d0623cee7537c5f68cab00cfd"/>
-      <w:bookmarkStart w:id="41" w:name="_Toc243948405"/>
+      <w:bookmarkStart w:id="41" w:name="_Toc244091195"/>
       <w:bookmarkEnd w:id="38"/>
       <w:r>
         <w:t>HU-T.14 — Restablecer la contraseña de un usuario (administrador)</w:t>
@@ -14859,7 +14758,7 @@
         <w:pStyle w:val="Ttulo2"/>
       </w:pPr>
       <w:bookmarkStart w:id="42" w:name="_09522c4444a8bbebdaf4a55b5444d2231a6caff"/>
-      <w:bookmarkStart w:id="43" w:name="_Toc243948406"/>
+      <w:bookmarkStart w:id="43" w:name="_Toc244091196"/>
       <w:bookmarkEnd w:id="40"/>
       <w:r>
         <w:t>HU-T.15 — Aislamiento por clínica y rol super-administrador</w:t>
@@ -15451,7 +15350,7 @@
         <w:pStyle w:val="Ttulo2"/>
       </w:pPr>
       <w:bookmarkStart w:id="44" w:name="_7d4be07c6dc7ad98ff2d7fd7f946e3e6ff8ab78"/>
-      <w:bookmarkStart w:id="45" w:name="_Toc243948407"/>
+      <w:bookmarkStart w:id="45" w:name="_Toc244091197"/>
       <w:bookmarkEnd w:id="42"/>
       <w:r>
         <w:lastRenderedPageBreak/>
@@ -15700,7 +15599,7 @@
         <w:pStyle w:val="Ttulo2"/>
       </w:pPr>
       <w:bookmarkStart w:id="46" w:name="_fde5550409ae8bd107b35d83706fe49d1ac49cf"/>
-      <w:bookmarkStart w:id="47" w:name="_Toc243948408"/>
+      <w:bookmarkStart w:id="47" w:name="_Toc244091198"/>
       <w:bookmarkEnd w:id="44"/>
       <w:r>
         <w:t>HU-T.17 — Una persona con varios roles: elegir el contexto al iniciar sesión</w:t>
@@ -15960,7 +15859,7 @@
         <w:pStyle w:val="Ttulo2"/>
       </w:pPr>
       <w:bookmarkStart w:id="48" w:name="_7d9311428cd5b72468b37f82201f1b810f77c36"/>
-      <w:bookmarkStart w:id="49" w:name="_Toc243948409"/>
+      <w:bookmarkStart w:id="49" w:name="_Toc244091199"/>
       <w:bookmarkEnd w:id="46"/>
       <w:r>
         <w:t>HU-T.18 — Registrarme e iniciar sesión con Google (propietario)</w:t>
@@ -16185,10 +16084,7 @@
         <w:t>(M5)</w:t>
       </w:r>
       <w:r>
-        <w:t xml:space="preserve"> </w:t>
-      </w:r>
-      <w:r>
-        <w:t>Si una clínica me registró y aún no activé mi cuenta, continuar con Google me pide aceptar la política, sin elegir clínica, y la activa sin contraseña (RN-G21).</w:t>
+        <w:t xml:space="preserve"> Si una clínica me registró y aún no activé mi cuenta, continuar con Google me pide aceptar la política, sin elegir clínica, y la activa sin contraseña (RN-G21).</w:t>
       </w:r>
     </w:p>
     <w:p>
@@ -16262,7 +16158,7 @@
         <w:pStyle w:val="Ttulo2"/>
       </w:pPr>
       <w:bookmarkStart w:id="50" w:name="_a6c52dc4bdd2cb00ae48e74db3c3b2920a9b818"/>
-      <w:bookmarkStart w:id="51" w:name="_Toc243948410"/>
+      <w:bookmarkStart w:id="51" w:name="_Toc244091200"/>
       <w:bookmarkEnd w:id="48"/>
       <w:r>
         <w:t>HU-T.19 — Aceptar la política de tratamiento de datos</w:t>
@@ -16431,10 +16327,7 @@
         </w:numPr>
       </w:pPr>
       <w:r>
-        <w:t>El registro con formulario o Google exige aceptación del titular antes de crear la cuenta. Excepción para las cuentas que crea una clínica (personal nuevo y propietario dado de alta por el personal): la cuenta se crea pendiente e inerte (sin contraseña, sin consentimiento y, para el propietario, sin portal); el titular recibe un enlace que vence en 72 horas, acepta la política y crea su contraseña para activarla. La clínica puede reenviar el enlace; el anterior deja de servir. Si vence sin usarse, la cuenta</w:t>
-      </w:r>
-      <w:r>
-        <w:t xml:space="preserve"> pendiente se elimina únicamente si no tiene otros vínculos y, si es de un propietario, tampoco mascotas (sus registros son de la clínica). El personal no acepta en nombre del titular. El super-administrador está exento de aceptación y de su prueba por ser una cuenta operativa de plataforma.</w:t>
+        <w:t>El registro con formulario o Google exige aceptación del titular antes de crear la cuenta. Excepción para las cuentas que crea una clínica (personal nuevo y propietario dado de alta por el personal): la cuenta se crea pendiente e inerte (sin contraseña, sin consentimiento y, para el propietario, sin portal); el titular recibe un enlace que vence en 72 horas, acepta la política y crea su contraseña para activarla. La clínica puede reenviar el enlace; el anterior deja de servir. Si vence sin usarse, la cuenta pendiente se elimina únicamente si no tiene otros vínculos y, si es de un propietario, tampoco mascotas (sus registros son de la clínica). El personal no acepta en nombre del titular. El super-administrador está exento de aceptación y de su prueba por ser una cuenta operativa de plataforma.</w:t>
       </w:r>
     </w:p>
     <w:p>
@@ -16473,10 +16366,7 @@
         <w:t>(M5, decisión del usuario 2026-10-13)</w:t>
       </w:r>
       <w:r>
-        <w:t xml:space="preserve"> </w:t>
-      </w:r>
-      <w:r>
-        <w:t>Si el enlace venció, el propietario pide uno nuevo sin depender de la clínica: «¿Olvidaste tu contraseña?» o el autorregistro con su correo le envían un enlace de activación nuevo, con la misma respuesta en pantalla de siempre (RN-G15), y entrar con Google le pide aceptar la política y activa la cuenta sin contraseña (RN-G21). La prueba guarda su propio medio: activación del propietario por enlace o Google.</w:t>
+        <w:t xml:space="preserve"> Si el enlace venció, el propietario pide uno nuevo sin depender de la clínica: «¿Olvidaste tu contraseña?» o el autorregistro con su correo le envían un enlace de activación nuevo, con la misma respuesta en pantalla de siempre (RN-G15), y entrar con Google le pide aceptar la política y activa la cuenta sin contraseña (RN-G21). La prueba guarda su propio medio: activación del propietario por enlace o Google.</w:t>
       </w:r>
     </w:p>
     <w:p>
@@ -16555,7 +16445,7 @@
         <w:pStyle w:val="Ttulo1"/>
       </w:pPr>
       <w:bookmarkStart w:id="52" w:name="_45e5cddb15e6e85961c4bdd9f114a9e4301e667"/>
-      <w:bookmarkStart w:id="53" w:name="_Toc243948411"/>
+      <w:bookmarkStart w:id="53" w:name="_Toc244091201"/>
       <w:bookmarkEnd w:id="12"/>
       <w:bookmarkEnd w:id="50"/>
       <w:r>
@@ -16577,7 +16467,7 @@
         <w:pStyle w:val="Ttulo2"/>
       </w:pPr>
       <w:bookmarkStart w:id="54" w:name="_3442f1e103117ab35c7be2be07e5b7a86f50900"/>
-      <w:bookmarkStart w:id="55" w:name="_Toc243948412"/>
+      <w:bookmarkStart w:id="55" w:name="_Toc244091202"/>
       <w:r>
         <w:t>HU-1.1 — Registrar mascota</w:t>
       </w:r>
@@ -16813,10 +16703,7 @@
         <w:t>(v2.0)</w:t>
       </w:r>
       <w:r>
-        <w:t xml:space="preserve"> </w:t>
-      </w:r>
-      <w:r>
-        <w:t>Si el propietario ya tiene mascotas en la plataforma, antes de registrar se ofrece vincular la existente (HU-1.5) para no duplicar la ficha.</w:t>
+        <w:t xml:space="preserve"> Si el propietario ya tiene mascotas en la plataforma, antes de registrar se ofrece vincular la existente (HU-1.5) para no duplicar la ficha.</w:t>
       </w:r>
     </w:p>
     <w:p>
@@ -16849,7 +16736,7 @@
         <w:pStyle w:val="Ttulo2"/>
       </w:pPr>
       <w:bookmarkStart w:id="56" w:name="_cac8078226ab7384debc291829d99266c4c98c9"/>
-      <w:bookmarkStart w:id="57" w:name="_Toc243948413"/>
+      <w:bookmarkStart w:id="57" w:name="_Toc244091203"/>
       <w:bookmarkEnd w:id="54"/>
       <w:r>
         <w:t>HU-1.2 — Registrar propietario</w:t>
@@ -17067,10 +16954,7 @@
         <w:t>(M5)</w:t>
       </w:r>
       <w:r>
-        <w:t xml:space="preserve"> </w:t>
-      </w:r>
-      <w:r>
-        <w:t>Un propietario nuevo queda pendiente hasta que él mismo acepte la política y cree su contraseña desde el enlace de activación (HU-T.19); el personal no acepta por él.</w:t>
+        <w:t xml:space="preserve"> Un propietario nuevo queda pendiente hasta que él mismo acepte la política y cree su contraseña desde el enlace de activación (HU-T.19); el personal no acepta por él.</w:t>
       </w:r>
     </w:p>
     <w:p>
@@ -17115,7 +16999,7 @@
         <w:pStyle w:val="Ttulo2"/>
       </w:pPr>
       <w:bookmarkStart w:id="58" w:name="_2775e78a99e9a6c8110a18962d2d3ffe08eb791"/>
-      <w:bookmarkStart w:id="59" w:name="_Toc243948414"/>
+      <w:bookmarkStart w:id="59" w:name="_Toc244091204"/>
       <w:bookmarkEnd w:id="56"/>
       <w:r>
         <w:lastRenderedPageBreak/>
@@ -17348,7 +17232,7 @@
         <w:pStyle w:val="Ttulo2"/>
       </w:pPr>
       <w:bookmarkStart w:id="60" w:name="_a48b917e447c9bb421319764b87fa8fbfffc6ce"/>
-      <w:bookmarkStart w:id="61" w:name="_Toc243948415"/>
+      <w:bookmarkStart w:id="61" w:name="_Toc244091205"/>
       <w:bookmarkEnd w:id="58"/>
       <w:r>
         <w:t>HU-1.4 — Editar y desactivar mascota</w:t>
@@ -17611,7 +17495,7 @@
         <w:pStyle w:val="Ttulo2"/>
       </w:pPr>
       <w:bookmarkStart w:id="62" w:name="_c56dbdf70effe4fdddd03cc982164bf6dfa15fd"/>
-      <w:bookmarkStart w:id="63" w:name="_Toc243948416"/>
+      <w:bookmarkStart w:id="63" w:name="_Toc244091206"/>
       <w:bookmarkEnd w:id="60"/>
       <w:r>
         <w:t>HU-1.5 — Vincular una mascota existente a la clínica</w:t>
@@ -17800,10 +17684,7 @@
         <w:t>(M5)</w:t>
       </w:r>
       <w:r>
-        <w:t xml:space="preserve"> </w:t>
-      </w:r>
-      <w:r>
-        <w:t>Al propietario lo busco por documento o correo completos (búsqueda exacta en toda la plataforma, RN-111) o por nombre, con coincidencia parcial solo entre los clientes con vínculo activo de esta clínica. Ya elegido, se ve en un solo bloque, su tarjeta.</w:t>
+        <w:t xml:space="preserve"> Al propietario lo busco por documento o correo completos (búsqueda exacta en toda la plataforma, RN-111) o por nombre, con coincidencia parcial solo entre los clientes con vínculo activo de esta clínica. Ya elegido, se ve en un solo bloque, su tarjeta.</w:t>
       </w:r>
     </w:p>
     <w:p>
@@ -17882,7 +17763,7 @@
         <w:pStyle w:val="Ttulo1"/>
       </w:pPr>
       <w:bookmarkStart w:id="64" w:name="_8ada1076fc69f75adb455b52b48149b634e12c1"/>
-      <w:bookmarkStart w:id="65" w:name="_Toc243948417"/>
+      <w:bookmarkStart w:id="65" w:name="_Toc244091207"/>
       <w:bookmarkEnd w:id="52"/>
       <w:bookmarkEnd w:id="62"/>
       <w:r>
@@ -17904,7 +17785,7 @@
         <w:pStyle w:val="Ttulo2"/>
       </w:pPr>
       <w:bookmarkStart w:id="66" w:name="_d0fbc850c25121b5bb6429938908d9d6324f20c"/>
-      <w:bookmarkStart w:id="67" w:name="_Toc243948418"/>
+      <w:bookmarkStart w:id="67" w:name="_Toc244091208"/>
       <w:r>
         <w:t>HU-2.1 — Registrar consulta clínica</w:t>
       </w:r>
@@ -18167,10 +18048,7 @@
         <w:t>Reglas de negocio:</w:t>
       </w:r>
       <w:r>
-        <w:t xml:space="preserve"> </w:t>
-      </w:r>
-      <w:r>
-        <w:t xml:space="preserve">RN-201, RN-202, RN-203, RN-112, RN-113 · </w:t>
+        <w:t xml:space="preserve"> RN-201, RN-202, RN-203, RN-112, RN-113 · </w:t>
       </w:r>
       <w:r>
         <w:rPr>
@@ -18188,7 +18066,7 @@
         <w:pStyle w:val="Ttulo2"/>
       </w:pPr>
       <w:bookmarkStart w:id="68" w:name="_7a453a6eb6ed88e1bfb6e10d4e89e02e93370e4"/>
-      <w:bookmarkStart w:id="69" w:name="_Toc243948419"/>
+      <w:bookmarkStart w:id="69" w:name="_Toc244091209"/>
       <w:bookmarkEnd w:id="66"/>
       <w:r>
         <w:t>HU-2.2 — Atención clínica sin cita (urgencias)</w:t>
@@ -18487,7 +18365,7 @@
         <w:pStyle w:val="Ttulo2"/>
       </w:pPr>
       <w:bookmarkStart w:id="70" w:name="_277d15ee6375124a0d7497cd947f0496d653294"/>
-      <w:bookmarkStart w:id="71" w:name="_Toc243948420"/>
+      <w:bookmarkStart w:id="71" w:name="_Toc244091210"/>
       <w:bookmarkEnd w:id="68"/>
       <w:r>
         <w:t>HU-2.3 — Adjuntar archivos clínicos</w:t>
@@ -18823,7 +18701,7 @@
         <w:pStyle w:val="Ttulo2"/>
       </w:pPr>
       <w:bookmarkStart w:id="72" w:name="_1b98c978e60977db39fc2418db7fe5e3ddc3001"/>
-      <w:bookmarkStart w:id="73" w:name="_Toc243948421"/>
+      <w:bookmarkStart w:id="73" w:name="_Toc244091211"/>
       <w:bookmarkEnd w:id="70"/>
       <w:r>
         <w:t>HU-2.4 — Registrar tratamiento</w:t>
@@ -19049,10 +18927,7 @@
         <w:t>Reglas de negocio:</w:t>
       </w:r>
       <w:r>
-        <w:t xml:space="preserve"> </w:t>
-      </w:r>
-      <w:r>
-        <w:t xml:space="preserve">RN-205 · </w:t>
+        <w:t xml:space="preserve"> RN-205 · </w:t>
       </w:r>
       <w:r>
         <w:rPr>
@@ -19070,7 +18945,7 @@
         <w:pStyle w:val="Ttulo2"/>
       </w:pPr>
       <w:bookmarkStart w:id="74" w:name="_9717672e9e73feeffef28eb38b12c038cdd7bd2"/>
-      <w:bookmarkStart w:id="75" w:name="_Toc243948422"/>
+      <w:bookmarkStart w:id="75" w:name="_Toc244091212"/>
       <w:bookmarkEnd w:id="72"/>
       <w:r>
         <w:t>HU-2.5 — Ver historial clínico completo</w:t>
@@ -19333,7 +19208,7 @@
         <w:pStyle w:val="Ttulo2"/>
       </w:pPr>
       <w:bookmarkStart w:id="76" w:name="_fdc1478d352073634e6bd92f17796cead004715"/>
-      <w:bookmarkStart w:id="77" w:name="_Toc243948423"/>
+      <w:bookmarkStart w:id="77" w:name="_Toc244091213"/>
       <w:bookmarkEnd w:id="74"/>
       <w:r>
         <w:t>HU-2.6 — Atomicidad y feedback de adjuntos en el registro de consulta</w:t>
@@ -19615,7 +19490,7 @@
         <w:pStyle w:val="Ttulo2"/>
       </w:pPr>
       <w:bookmarkStart w:id="78" w:name="_101f0dcf34d14c70ec0f17a5f1393f5d9e5e380"/>
-      <w:bookmarkStart w:id="79" w:name="_Toc243948424"/>
+      <w:bookmarkStart w:id="79" w:name="_Toc244091214"/>
       <w:bookmarkEnd w:id="76"/>
       <w:r>
         <w:t>HU-2.7 — Validación y control de acceso en registros clínicos y de mascota</w:t>
@@ -19895,7 +19770,7 @@
         <w:pStyle w:val="Ttulo2"/>
       </w:pPr>
       <w:bookmarkStart w:id="80" w:name="_004e46896b85bf56df5905f1e03a53c4af0a844"/>
-      <w:bookmarkStart w:id="81" w:name="_Toc243948425"/>
+      <w:bookmarkStart w:id="81" w:name="_Toc244091215"/>
       <w:bookmarkEnd w:id="78"/>
       <w:r>
         <w:t>HU-2.8 — Sugerencia de diagnósticos probables por síntomas</w:t>
@@ -20156,7 +20031,7 @@
         <w:pStyle w:val="Ttulo2"/>
       </w:pPr>
       <w:bookmarkStart w:id="82" w:name="_dc4885bd67732a434e9ba082721bf6df1e25b78"/>
-      <w:bookmarkStart w:id="83" w:name="_Toc243948426"/>
+      <w:bookmarkStart w:id="83" w:name="_Toc244091216"/>
       <w:bookmarkEnd w:id="80"/>
       <w:r>
         <w:t>HU-2.9 — Alertas de toxicidad e interacción al prescribir</w:t>
@@ -20436,7 +20311,7 @@
         <w:pStyle w:val="Ttulo2"/>
       </w:pPr>
       <w:bookmarkStart w:id="84" w:name="_39e4f7d80042c39922c0142f6da447f46643fcd"/>
-      <w:bookmarkStart w:id="85" w:name="_Toc243948427"/>
+      <w:bookmarkStart w:id="85" w:name="_Toc244091217"/>
       <w:bookmarkEnd w:id="82"/>
       <w:r>
         <w:t>HU-2.10 — Ver la historia compartida de la mascota (multi-clínica)</w:t>
@@ -20699,7 +20574,7 @@
         <w:pStyle w:val="Ttulo2"/>
       </w:pPr>
       <w:bookmarkStart w:id="86" w:name="_ddbeb8d4984f7e7207ef7f02c5c92f4dcdce30d"/>
-      <w:bookmarkStart w:id="87" w:name="_Toc243948428"/>
+      <w:bookmarkStart w:id="87" w:name="_Toc244091218"/>
       <w:bookmarkEnd w:id="84"/>
       <w:r>
         <w:t>HU-2.11 — Calcular el nivel de triage a partir de los síntomas</w:t>
@@ -20955,13 +20830,7 @@
         </w:numPr>
       </w:pPr>
       <w:r>
-        <w:t xml:space="preserve">Las señales de alarma universales dan </w:t>
-      </w:r>
-      <w:r>
-        <w:t>🔴</w:t>
-      </w:r>
-      <w:r>
-        <w:t xml:space="preserve"> en cualquier especie.</w:t>
+        <w:t>Las señales de alarma universales dan 🔴 en cualquier especie.</w:t>
       </w:r>
     </w:p>
     <w:p>
@@ -20973,19 +20842,7 @@
         </w:numPr>
       </w:pPr>
       <w:r>
-        <w:t xml:space="preserve">Sin cobertura específica, con «Otro / no sé» o sin regla aplicable a las marcas, el caso queda en </w:t>
-      </w:r>
-      <w:r>
-        <w:t>🟡</w:t>
-      </w:r>
-      <w:r>
-        <w:t xml:space="preserve"> con revisión del personal; las alarmas universales siguen dando </w:t>
-      </w:r>
-      <w:r>
-        <w:t>🔴</w:t>
-      </w:r>
-      <w:r>
-        <w:t>.</w:t>
+        <w:t>Sin cobertura específica, con «Otro / no sé» o sin regla aplicable a las marcas, el caso queda en 🟡 con revisión del personal; las alarmas universales siguen dando 🔴.</w:t>
       </w:r>
     </w:p>
     <w:p>
@@ -21062,7 +20919,7 @@
         <w:pStyle w:val="Ttulo2"/>
       </w:pPr>
       <w:bookmarkStart w:id="88" w:name="_492240b15c6ebc6fbe3f7fd23583d697b838ee5"/>
-      <w:bookmarkStart w:id="89" w:name="_Toc243948429"/>
+      <w:bookmarkStart w:id="89" w:name="_Toc244091219"/>
       <w:bookmarkEnd w:id="86"/>
       <w:r>
         <w:t>HU-2.12 — Explorar el mapa del conocimiento clínico</w:t>
@@ -21291,7 +21148,7 @@
         </w:numPr>
       </w:pPr>
       <w:r>
-        <w:t>Mostrar versión, cobertura y validación pendiente, con estados legibles ante conjunto vacío o fallo del CDN.</w:t>
+        <w:t>Mostrar versión, cobertura y validación pendiente, con estados legibles ante conjunto vacío o fallo de la biblioteca 3D local o de WebGL.</w:t>
       </w:r>
     </w:p>
     <w:p>
@@ -21334,7 +21191,7 @@
         <w:pStyle w:val="Ttulo1"/>
       </w:pPr>
       <w:bookmarkStart w:id="90" w:name="_d55aebc9deeb1682a62a02ae225cde94fe0baf3"/>
-      <w:bookmarkStart w:id="91" w:name="_Toc243948430"/>
+      <w:bookmarkStart w:id="91" w:name="_Toc244091220"/>
       <w:bookmarkEnd w:id="64"/>
       <w:bookmarkEnd w:id="88"/>
       <w:r>
@@ -21356,7 +21213,7 @@
         <w:pStyle w:val="Ttulo2"/>
       </w:pPr>
       <w:bookmarkStart w:id="92" w:name="_73783a222ff535845613407f8c2c5de0df62c29"/>
-      <w:bookmarkStart w:id="93" w:name="_Toc243948431"/>
+      <w:bookmarkStart w:id="93" w:name="_Toc244091221"/>
       <w:r>
         <w:t>HU-3.1 — Registrar vacunación</w:t>
       </w:r>
@@ -21599,7 +21456,7 @@
         <w:pStyle w:val="Ttulo2"/>
       </w:pPr>
       <w:bookmarkStart w:id="94" w:name="_6075047063f4930391208048315650ed427ae6c"/>
-      <w:bookmarkStart w:id="95" w:name="_Toc243948432"/>
+      <w:bookmarkStart w:id="95" w:name="_Toc244091222"/>
       <w:bookmarkEnd w:id="92"/>
       <w:r>
         <w:t>HU-3.2 — Enviar recordatorio por correo</w:t>
@@ -21855,7 +21712,7 @@
         <w:pStyle w:val="Ttulo2"/>
       </w:pPr>
       <w:bookmarkStart w:id="96" w:name="_781661fe2d15deb5f4d895541dced4f16e579af"/>
-      <w:bookmarkStart w:id="97" w:name="_Toc243948433"/>
+      <w:bookmarkStart w:id="97" w:name="_Toc244091223"/>
       <w:bookmarkEnd w:id="94"/>
       <w:r>
         <w:t>HU-3.3 — Enviar recordatorio por WhatsApp</w:t>
@@ -22112,7 +21969,7 @@
         <w:pStyle w:val="Ttulo2"/>
       </w:pPr>
       <w:bookmarkStart w:id="98" w:name="_8afd4fd6adaa7aec672b37965973c4a0b1b5483"/>
-      <w:bookmarkStart w:id="99" w:name="_Toc243948434"/>
+      <w:bookmarkStart w:id="99" w:name="_Toc244091224"/>
       <w:bookmarkEnd w:id="96"/>
       <w:r>
         <w:t>HU-3.4 — Registrar desparasitación</w:t>
@@ -22356,7 +22213,7 @@
         <w:pStyle w:val="Ttulo2"/>
       </w:pPr>
       <w:bookmarkStart w:id="100" w:name="_69b92288d624f1c737d99fa43d727735c1c78ac"/>
-      <w:bookmarkStart w:id="101" w:name="_Toc243948435"/>
+      <w:bookmarkStart w:id="101" w:name="_Toc244091225"/>
       <w:bookmarkEnd w:id="98"/>
       <w:r>
         <w:t>HU-3.5 — Panel de vacunaciones pendientes</w:t>
@@ -22634,7 +22491,7 @@
         <w:pStyle w:val="Ttulo2"/>
       </w:pPr>
       <w:bookmarkStart w:id="102" w:name="_83b2b6ee9ef84433e407efb3456acc0bf8c705f"/>
-      <w:bookmarkStart w:id="103" w:name="_Toc243948436"/>
+      <w:bookmarkStart w:id="103" w:name="_Toc244091226"/>
       <w:bookmarkEnd w:id="100"/>
       <w:r>
         <w:lastRenderedPageBreak/>
@@ -22904,14 +22761,7 @@
           <w:i/>
           <w:iCs/>
         </w:rPr>
-        <w:t xml:space="preserve"> </w:t>
-      </w:r>
-      <w:r>
-        <w:rPr>
-          <w:i/>
-          <w:iCs/>
-        </w:rPr>
-        <w:t>y la revisión de duplicados lo encontraba, así que nunca se reintentaba. Ahora el primer aviso cubre del día 7 al 2 y el último, el día anterior y el mismo día (</w:t>
+        <w:t xml:space="preserve"> y la revisión de duplicados lo encontraba, así que nunca se reintentaba. Ahora el primer aviso cubre del día 7 al 2 y el último, el día anterior y el mismo día (</w:t>
       </w:r>
       <w:r>
         <w:rPr>
@@ -22979,7 +22829,7 @@
         <w:pStyle w:val="Ttulo1"/>
       </w:pPr>
       <w:bookmarkStart w:id="104" w:name="_0bc479c0be240e26431ebdd296a7a53444b2628"/>
-      <w:bookmarkStart w:id="105" w:name="_Toc243948437"/>
+      <w:bookmarkStart w:id="105" w:name="_Toc244091227"/>
       <w:bookmarkEnd w:id="90"/>
       <w:bookmarkEnd w:id="102"/>
       <w:r>
@@ -23001,7 +22851,7 @@
         <w:pStyle w:val="Ttulo2"/>
       </w:pPr>
       <w:bookmarkStart w:id="106" w:name="_83a9ef67ed8a24f8f8fb200a3c30fdc3bf36c17"/>
-      <w:bookmarkStart w:id="107" w:name="_Toc243948438"/>
+      <w:bookmarkStart w:id="107" w:name="_Toc244091228"/>
       <w:r>
         <w:t>HU-4.1 — Agendar cita</w:t>
       </w:r>
@@ -23292,7 +23142,7 @@
         <w:pStyle w:val="Ttulo2"/>
       </w:pPr>
       <w:bookmarkStart w:id="108" w:name="_102fb6dec5375a39a698cb955a51646f9817d25"/>
-      <w:bookmarkStart w:id="109" w:name="_Toc243948439"/>
+      <w:bookmarkStart w:id="109" w:name="_Toc244091229"/>
       <w:bookmarkEnd w:id="106"/>
       <w:r>
         <w:t>HU-4.2 — Cancelar o reprogramar cita</w:t>
@@ -23549,7 +23399,7 @@
         <w:pStyle w:val="Ttulo2"/>
       </w:pPr>
       <w:bookmarkStart w:id="110" w:name="_bc90a9ef9035fcbf5d83826a75a2a7caba95288"/>
-      <w:bookmarkStart w:id="111" w:name="_Toc243948440"/>
+      <w:bookmarkStart w:id="111" w:name="_Toc244091230"/>
       <w:bookmarkEnd w:id="108"/>
       <w:r>
         <w:t>HU-4.3 — Marcar cita como completada</w:t>
@@ -23930,7 +23780,7 @@
         <w:pStyle w:val="Ttulo2"/>
       </w:pPr>
       <w:bookmarkStart w:id="112" w:name="_0ab1d1688e3b6d42f481962b5abe908ca5f185e"/>
-      <w:bookmarkStart w:id="113" w:name="_Toc243948441"/>
+      <w:bookmarkStart w:id="113" w:name="_Toc244091231"/>
       <w:bookmarkEnd w:id="110"/>
       <w:r>
         <w:t>HU-4.4 — Confirmación automática de cita por correo</w:t>
@@ -24174,7 +24024,7 @@
         <w:pStyle w:val="Ttulo2"/>
       </w:pPr>
       <w:bookmarkStart w:id="114" w:name="_391b83d5c01b20c64bec4d1baa2ded83b27b3cc"/>
-      <w:bookmarkStart w:id="115" w:name="_Toc243948442"/>
+      <w:bookmarkStart w:id="115" w:name="_Toc244091232"/>
       <w:bookmarkEnd w:id="112"/>
       <w:r>
         <w:t>HU-4.5 — Registrar hora real de atención y gestionar retrasos</w:t>
@@ -24394,10 +24244,7 @@
         <w:t>Reglas de negocio:</w:t>
       </w:r>
       <w:r>
-        <w:t xml:space="preserve"> </w:t>
-      </w:r>
-      <w:r>
-        <w:t xml:space="preserve">RN-401, RN-412 · </w:t>
+        <w:t xml:space="preserve"> RN-401, RN-412 · </w:t>
       </w:r>
       <w:r>
         <w:rPr>
@@ -24481,7 +24328,7 @@
         <w:pStyle w:val="Ttulo2"/>
       </w:pPr>
       <w:bookmarkStart w:id="116" w:name="_fd2845ac88e46c3520f61b9b4ded26b35f37534"/>
-      <w:bookmarkStart w:id="117" w:name="_Toc243948443"/>
+      <w:bookmarkStart w:id="117" w:name="_Toc244091233"/>
       <w:bookmarkEnd w:id="114"/>
       <w:r>
         <w:lastRenderedPageBreak/>
@@ -24756,7 +24603,7 @@
         <w:pStyle w:val="Ttulo2"/>
       </w:pPr>
       <w:bookmarkStart w:id="118" w:name="_4786f5b438d23c36e067f350ad8ed0097d027c2"/>
-      <w:bookmarkStart w:id="119" w:name="_Toc243948444"/>
+      <w:bookmarkStart w:id="119" w:name="_Toc244091234"/>
       <w:bookmarkEnd w:id="116"/>
       <w:r>
         <w:t>HU-4.7 — Estado "no asistió" y ausentismo</w:t>
@@ -25025,14 +24872,7 @@
           <w:i/>
           <w:iCs/>
         </w:rPr>
-        <w:t xml:space="preserve"> </w:t>
-      </w:r>
-      <w:r>
-        <w:rPr>
-          <w:i/>
-          <w:iCs/>
-        </w:rPr>
-        <w:t>(migración 09), el botón «No asistió» del calendario y la liberación del espacio en toda la lógica de disponibilidad. Falta un reporte propio de la tasa de ausentismo: por ahora las inasistencias solo se ven en la gráfica «Mis citas» del panel del veterinario (últimos 30 días).</w:t>
+        <w:t xml:space="preserve"> (migración 09), el botón «No asistió» del calendario y la liberación del espacio en toda la lógica de disponibilidad. Falta un reporte propio de la tasa de ausentismo: por ahora las inasistencias solo se ven en la gráfica «Mis citas» del panel del veterinario (últimos 30 días).</w:t>
       </w:r>
     </w:p>
     <w:p>
@@ -25069,14 +24909,7 @@
           <w:i/>
           <w:iCs/>
         </w:rPr>
-        <w:t xml:space="preserve"> </w:t>
-      </w:r>
-      <w:r>
-        <w:rPr>
-          <w:i/>
-          <w:iCs/>
-        </w:rPr>
-        <w:t>y la liberación del espacio ya existen desde v1.9.0 y se conservan al migrar la agenda en v2.0; HU-4.19 depende solo de esa base operativa.</w:t>
+        <w:t xml:space="preserve"> y la liberación del espacio ya existen desde v1.9.0 y se conservan al migrar la agenda en v2.0; HU-4.19 depende solo de esa base operativa.</w:t>
       </w:r>
       <w:r>
         <w:t xml:space="preserve"> </w:t>
@@ -25117,7 +24950,7 @@
         <w:pStyle w:val="Ttulo2"/>
       </w:pPr>
       <w:bookmarkStart w:id="120" w:name="_0d930997ffa83b9b36b150e5e50b933f66b264d"/>
-      <w:bookmarkStart w:id="121" w:name="_Toc243948445"/>
+      <w:bookmarkStart w:id="121" w:name="_Toc244091235"/>
       <w:bookmarkEnd w:id="118"/>
       <w:r>
         <w:t>HU-4.8 — Bloqueos de agenda del veterinario y días no laborables</w:t>
@@ -25391,7 +25224,7 @@
         <w:pStyle w:val="Ttulo2"/>
       </w:pPr>
       <w:bookmarkStart w:id="122" w:name="_592e3b26ee2d82de9a78960621790aca76cbe41"/>
-      <w:bookmarkStart w:id="123" w:name="_Toc243948446"/>
+      <w:bookmarkStart w:id="123" w:name="_Toc244091236"/>
       <w:bookmarkEnd w:id="120"/>
       <w:r>
         <w:t>HU-4.9 — Endurecer la validación de disponibilidad</w:t>
@@ -25714,7 +25547,7 @@
         <w:pStyle w:val="Ttulo2"/>
       </w:pPr>
       <w:bookmarkStart w:id="124" w:name="_53bf433c324c03bf220d8f1ea57572094c24d19"/>
-      <w:bookmarkStart w:id="125" w:name="_Toc243948447"/>
+      <w:bookmarkStart w:id="125" w:name="_Toc244091237"/>
       <w:bookmarkEnd w:id="122"/>
       <w:r>
         <w:t>HU-4.10 — Confirmar asistencia a la cita desde el recordatorio</w:t>
@@ -25996,7 +25829,7 @@
         <w:pStyle w:val="Ttulo2"/>
       </w:pPr>
       <w:bookmarkStart w:id="126" w:name="_bc4a4c08f4864e57db7a13372e3c901c5711bb9"/>
-      <w:bookmarkStart w:id="127" w:name="_Toc243948448"/>
+      <w:bookmarkStart w:id="127" w:name="_Toc244091238"/>
       <w:bookmarkEnd w:id="124"/>
       <w:r>
         <w:t>HU-4.11 — Configurar el horario recurrente del veterinario</w:t>
@@ -26257,7 +26090,7 @@
         <w:pStyle w:val="Ttulo2"/>
       </w:pPr>
       <w:bookmarkStart w:id="128" w:name="_3a9da54e9b682c781ba4f8ec9fb08eb1ae51469"/>
-      <w:bookmarkStart w:id="129" w:name="_Toc243948449"/>
+      <w:bookmarkStart w:id="129" w:name="_Toc244091239"/>
       <w:bookmarkEnd w:id="126"/>
       <w:r>
         <w:t>HU-4.12 — Registrar ausencia del veterinario y gestionar cobertura</w:t>
@@ -26484,10 +26317,7 @@
         <w:t>asigna</w:t>
       </w:r>
       <w:r>
-        <w:t xml:space="preserve"> </w:t>
-      </w:r>
-      <w:r>
-        <w:t>esas citas (sin veto: si tiene espacio y nada se lo impide, las toma).</w:t>
+        <w:t xml:space="preserve"> esas citas (sin veto: si tiene espacio y nada se lo impide, las toma).</w:t>
       </w:r>
     </w:p>
     <w:p>
@@ -26558,10 +26388,7 @@
         <w:t>Requisitos:</w:t>
       </w:r>
       <w:r>
-        <w:t xml:space="preserve"> RF-4.9 ·</w:t>
-      </w:r>
-      <w:r>
-        <w:t xml:space="preserve"> </w:t>
+        <w:t xml:space="preserve"> RF-4.9 · </w:t>
       </w:r>
       <w:r>
         <w:rPr>
@@ -26579,7 +26406,7 @@
         <w:pStyle w:val="Ttulo2"/>
       </w:pPr>
       <w:bookmarkStart w:id="130" w:name="_d5e60343e26d4758074a6efaed07b69cd6c3551"/>
-      <w:bookmarkStart w:id="131" w:name="_Toc243948450"/>
+      <w:bookmarkStart w:id="131" w:name="_Toc244091240"/>
       <w:bookmarkEnd w:id="128"/>
       <w:r>
         <w:lastRenderedPageBreak/>
@@ -26783,31 +26610,7 @@
         <w:t>Grafo I</w:t>
       </w:r>
       <w:r>
-        <w:t xml:space="preserve"> calcula el nivel de triage (</w:t>
-      </w:r>
-      <w:r>
-        <w:t>🔴</w:t>
-      </w:r>
-      <w:r>
-        <w:t xml:space="preserve"> rojo, </w:t>
-      </w:r>
-      <w:r>
-        <w:t>🟠</w:t>
-      </w:r>
-      <w:r>
-        <w:t xml:space="preserve"> naranja, </w:t>
-      </w:r>
-      <w:r>
-        <w:t>🟡</w:t>
-      </w:r>
-      <w:r>
-        <w:t xml:space="preserve"> amarillo, </w:t>
-      </w:r>
-      <w:r>
-        <w:t>🟢</w:t>
-      </w:r>
-      <w:r>
-        <w:t xml:space="preserve"> verde); el propietario no lo elige.</w:t>
+        <w:t xml:space="preserve"> calcula el nivel de triage (🔴 rojo, 🟠 naranja, 🟡 amarillo, 🟢 verde); el propietario no lo elige.</w:t>
       </w:r>
     </w:p>
     <w:p>
@@ -26819,13 +26622,7 @@
         </w:numPr>
       </w:pPr>
       <w:r>
-        <w:t xml:space="preserve">El nivel se calcula según HU-2.11. Si es </w:t>
-      </w:r>
-      <w:r>
-        <w:t>🔴</w:t>
-      </w:r>
-      <w:r>
-        <w:t>, no se verifica el límite del plan (RN-420); en los demás niveles se verifica antes de reservar (HU-0.4).</w:t>
+        <w:t>El nivel se calcula según HU-2.11. Si es 🔴, no se verifica el límite del plan (RN-420); en los demás niveles se verifica antes de reservar (HU-0.4).</w:t>
       </w:r>
     </w:p>
     <w:p>
@@ -26837,10 +26634,7 @@
         </w:numPr>
       </w:pPr>
       <w:r>
-        <w:t>🔴</w:t>
-      </w:r>
-      <w:r>
-        <w:t xml:space="preserve"> </w:t>
+        <w:t xml:space="preserve">🔴 </w:t>
       </w:r>
       <w:r>
         <w:rPr>
@@ -26850,10 +26644,7 @@
         <w:t>Rojo (crítico):</w:t>
       </w:r>
       <w:r>
-        <w:t xml:space="preserve"> </w:t>
-      </w:r>
-      <w:r>
-        <w:t>no se agenda en línea; se avisa y se deriva a atención de urgencia (HU-4.15).</w:t>
+        <w:t xml:space="preserve"> no se agenda en línea; se avisa y se deriva a atención de urgencia (HU-4.15).</w:t>
       </w:r>
     </w:p>
     <w:p>
@@ -26865,10 +26656,7 @@
         </w:numPr>
       </w:pPr>
       <w:r>
-        <w:t>🟠</w:t>
-      </w:r>
-      <w:r>
-        <w:t xml:space="preserve"> </w:t>
+        <w:t xml:space="preserve">🟠 </w:t>
       </w:r>
       <w:r>
         <w:rPr>
@@ -26900,10 +26688,7 @@
         </w:numPr>
       </w:pPr>
       <w:r>
-        <w:t>🟡</w:t>
-      </w:r>
-      <w:r>
-        <w:t xml:space="preserve"> </w:t>
+        <w:t xml:space="preserve">🟡 </w:t>
       </w:r>
       <w:r>
         <w:rPr>
@@ -26925,10 +26710,7 @@
         </w:numPr>
       </w:pPr>
       <w:r>
-        <w:t>🟢</w:t>
-      </w:r>
-      <w:r>
-        <w:t xml:space="preserve"> </w:t>
+        <w:t xml:space="preserve">🟢 </w:t>
       </w:r>
       <w:r>
         <w:rPr>
@@ -26938,10 +26720,7 @@
         <w:t>Verde (no urgente):</w:t>
       </w:r>
       <w:r>
-        <w:t xml:space="preserve"> </w:t>
-      </w:r>
-      <w:r>
-        <w:t>el actor elige entre los espacios disponibles; si no hay, se ofrece cambiar de fecha o rango.</w:t>
+        <w:t xml:space="preserve"> el actor elige entre los espacios disponibles; si no hay, se ofrece cambiar de fecha o rango.</w:t>
       </w:r>
     </w:p>
     <w:p>
@@ -27009,10 +26788,7 @@
         <w:t>Dependencias:</w:t>
       </w:r>
       <w:r>
-        <w:t xml:space="preserve"> </w:t>
-      </w:r>
-      <w:r>
-        <w:t>HU-4.1, HU-4.11, HU-2.8</w:t>
+        <w:t xml:space="preserve"> HU-4.1, HU-4.11, HU-2.8</w:t>
       </w:r>
     </w:p>
     <w:p>
@@ -27020,7 +26796,7 @@
         <w:pStyle w:val="Ttulo2"/>
       </w:pPr>
       <w:bookmarkStart w:id="132" w:name="_d4adac7448e74c17e6bb33bf496ee79d1222807"/>
-      <w:bookmarkStart w:id="133" w:name="_Toc243948451"/>
+      <w:bookmarkStart w:id="133" w:name="_Toc244091241"/>
       <w:bookmarkEnd w:id="130"/>
       <w:r>
         <w:t>HU-4.14 — Reajuste de agenda en vivo (efecto cascada)</w:t>
@@ -27260,10 +27036,7 @@
         <w:t>horario disponible</w:t>
       </w:r>
       <w:r>
-        <w:t xml:space="preserve"> </w:t>
-      </w:r>
-      <w:r>
-        <w:t>del veterinario, el Grafo II busca reasignarla a otro veterinario con disponibilidad.</w:t>
+        <w:t xml:space="preserve"> del veterinario, el Grafo II busca reasignarla a otro veterinario con disponibilidad.</w:t>
       </w:r>
     </w:p>
     <w:p>
@@ -27362,7 +27135,7 @@
         <w:pStyle w:val="Ttulo2"/>
       </w:pPr>
       <w:bookmarkStart w:id="134" w:name="_91e1c705d28c1a221b008d52046353792175d0f"/>
-      <w:bookmarkStart w:id="135" w:name="_Toc243948452"/>
+      <w:bookmarkStart w:id="135" w:name="_Toc244091242"/>
       <w:bookmarkEnd w:id="132"/>
       <w:r>
         <w:t>HU-4.15 — Atender una urgencia (triage rojo o llegada directa)</w:t>
@@ -27602,10 +27375,7 @@
         <w:t>rojo</w:t>
       </w:r>
       <w:r>
-        <w:t xml:space="preserve"> </w:t>
-      </w:r>
-      <w:r>
-        <w:t>o cuando llega una urgencia directa a la clínica; se notifica a la clínica y se marca prioridad máxima.</w:t>
+        <w:t xml:space="preserve"> o cuando llega una urgencia directa a la clínica; se notifica a la clínica y se marca prioridad máxima.</w:t>
       </w:r>
     </w:p>
     <w:p>
@@ -27651,10 +27421,7 @@
         <w:t>pausable</w:t>
       </w:r>
       <w:r>
-        <w:t xml:space="preserve"> </w:t>
-      </w:r>
-      <w:r>
-        <w:t>según su tipo de cita, y se avisa el corrimiento a los afectados. La cita pausada se retoma al terminar la urgencia, antes que las siguientes.</w:t>
+        <w:t xml:space="preserve"> según su tipo de cita, y se avisa el corrimiento a los afectados. La cita pausada se retoma al terminar la urgencia, antes que las siguientes.</w:t>
       </w:r>
     </w:p>
     <w:p>
@@ -27732,10 +27499,7 @@
         <w:t>ficha provisional de emergencia</w:t>
       </w:r>
       <w:r>
-        <w:t xml:space="preserve"> </w:t>
-      </w:r>
-      <w:r>
-        <w:t>vinculada a la clínica, con los datos disponibles del animal y un ingreso con los datos disponibles de quien lo trae. La ficha queda «por completar», sin carnet público activo y sin crear una cuenta de usuario ni atribuirle la propiedad al acompañante; el límite del plan no bloquea este ingreso rojo.</w:t>
+        <w:t xml:space="preserve"> vinculada a la clínica, con los datos disponibles del animal y un ingreso con los datos disponibles de quien lo trae. La ficha queda «por completar», sin carnet público activo y sin crear una cuenta de usuario ni atribuirle la propiedad al acompañante; el límite del plan no bloquea este ingreso rojo.</w:t>
       </w:r>
     </w:p>
     <w:p>
@@ -27815,7 +27579,7 @@
         <w:pStyle w:val="Ttulo2"/>
       </w:pPr>
       <w:bookmarkStart w:id="136" w:name="_c78d8424c335bf78fd48b1955b4f1a67eda143f"/>
-      <w:bookmarkStart w:id="137" w:name="_Toc243948453"/>
+      <w:bookmarkStart w:id="137" w:name="_Toc244091243"/>
       <w:bookmarkEnd w:id="134"/>
       <w:r>
         <w:t>HU-4.16 — Sugerir veterinario al agendar</w:t>
@@ -28039,7 +27803,7 @@
         <w:pStyle w:val="Ttulo2"/>
       </w:pPr>
       <w:bookmarkStart w:id="138" w:name="_d95563cf58dd7b4419944c1578610bfcd0b1db0"/>
-      <w:bookmarkStart w:id="139" w:name="_Toc243948454"/>
+      <w:bookmarkStart w:id="139" w:name="_Toc244091244"/>
       <w:bookmarkEnd w:id="136"/>
       <w:r>
         <w:t>HU-4.17 — Recalcular el triage cuando cambian los síntomas</w:t>
@@ -28220,13 +27984,7 @@
         </w:numPr>
       </w:pPr>
       <w:r>
-        <w:t xml:space="preserve">El nivel se recalcula (HU-2.11). Si sube, la cita se reubica según el nuevo nivel (o se deriva a urgencia si es </w:t>
-      </w:r>
-      <w:r>
-        <w:t>🔴</w:t>
-      </w:r>
-      <w:r>
-        <w:t>) y se notifica al propietario y al veterinario.</w:t>
+        <w:t>El nivel se recalcula (HU-2.11). Si sube, la cita se reubica según el nuevo nivel (o se deriva a urgencia si es 🔴) y se notifica al propietario y al veterinario.</w:t>
       </w:r>
     </w:p>
     <w:p>
@@ -28265,10 +28023,7 @@
         <w:t>Reglas de negocio:</w:t>
       </w:r>
       <w:r>
-        <w:t xml:space="preserve"> </w:t>
-      </w:r>
-      <w:r>
-        <w:t xml:space="preserve">RN-423, RN-411 · </w:t>
+        <w:t xml:space="preserve"> RN-423, RN-411 · </w:t>
       </w:r>
       <w:r>
         <w:rPr>
@@ -28296,7 +28051,7 @@
         <w:pStyle w:val="Ttulo2"/>
       </w:pPr>
       <w:bookmarkStart w:id="140" w:name="_8b0a1409d398bf3e63485141aa804db028749ca"/>
-      <w:bookmarkStart w:id="141" w:name="_Toc243948455"/>
+      <w:bookmarkStart w:id="141" w:name="_Toc244091245"/>
       <w:bookmarkEnd w:id="138"/>
       <w:r>
         <w:t>HU-4.18 — Ajustar el nivel de triage (veterinario)</w:t>
@@ -28557,7 +28312,7 @@
         <w:pStyle w:val="Ttulo2"/>
       </w:pPr>
       <w:bookmarkStart w:id="142" w:name="_cf2722ce0434310059a1401a7a9236f9f75ab69"/>
-      <w:bookmarkStart w:id="143" w:name="_Toc243948456"/>
+      <w:bookmarkStart w:id="143" w:name="_Toc244091246"/>
       <w:bookmarkEnd w:id="140"/>
       <w:r>
         <w:t>HU-4.19 — Manejar la llegada tarde del propietario</w:t>
@@ -28832,7 +28587,7 @@
         <w:pStyle w:val="Ttulo1"/>
       </w:pPr>
       <w:bookmarkStart w:id="144" w:name="_448b6637f95054bfc4854cb12826ea84d2acba0"/>
-      <w:bookmarkStart w:id="145" w:name="_Toc243948457"/>
+      <w:bookmarkStart w:id="145" w:name="_Toc244091247"/>
       <w:bookmarkEnd w:id="104"/>
       <w:bookmarkEnd w:id="142"/>
       <w:r>
@@ -28854,7 +28609,7 @@
         <w:pStyle w:val="Ttulo2"/>
       </w:pPr>
       <w:bookmarkStart w:id="146" w:name="_af054ffcebd6910222ee7d6c1d020875947335e"/>
-      <w:bookmarkStart w:id="147" w:name="_Toc243948458"/>
+      <w:bookmarkStart w:id="147" w:name="_Toc244091248"/>
       <w:r>
         <w:t>HU-5.1 — Portal del propietario</w:t>
       </w:r>
@@ -29161,10 +28916,7 @@
         <w:t>Nota:</w:t>
       </w:r>
       <w:r>
-        <w:t xml:space="preserve"> </w:t>
-      </w:r>
-      <w:r>
-        <w:t>el portal mostraba un banner fijo de «Médicos calificados las 24 horas del día», que no correspondía al horario configurado en HU-7.1. Se reemplazó por el horario real.</w:t>
+        <w:t xml:space="preserve"> el portal mostraba un banner fijo de «Médicos calificados las 24 horas del día», que no correspondía al horario configurado en HU-7.1. Se reemplazó por el horario real.</w:t>
       </w:r>
     </w:p>
     <w:p>
@@ -29197,7 +28949,7 @@
         <w:pStyle w:val="Ttulo2"/>
       </w:pPr>
       <w:bookmarkStart w:id="148" w:name="_6b1c61431b8f8f0fcc4ce60077071b912ba2b45"/>
-      <w:bookmarkStart w:id="149" w:name="_Toc243948459"/>
+      <w:bookmarkStart w:id="149" w:name="_Toc244091249"/>
       <w:bookmarkEnd w:id="146"/>
       <w:r>
         <w:t>HU-5.2 — Auto-registro de propietario</w:t>
@@ -29466,7 +29218,7 @@
         <w:pStyle w:val="Ttulo2"/>
       </w:pPr>
       <w:bookmarkStart w:id="150" w:name="_f4d063018be410b507969fa4c62074124f833cf"/>
-      <w:bookmarkStart w:id="151" w:name="_Toc243948460"/>
+      <w:bookmarkStart w:id="151" w:name="_Toc244091250"/>
       <w:bookmarkEnd w:id="148"/>
       <w:r>
         <w:t>HU-5.3 — Agendar cita desde el portal</w:t>
@@ -29741,7 +29493,7 @@
         <w:pStyle w:val="Ttulo2"/>
       </w:pPr>
       <w:bookmarkStart w:id="152" w:name="_c64202596780354c08c0a149dc974449db886cf"/>
-      <w:bookmarkStart w:id="153" w:name="_Toc243948461"/>
+      <w:bookmarkStart w:id="153" w:name="_Toc244091251"/>
       <w:bookmarkEnd w:id="150"/>
       <w:r>
         <w:t>HU-5.4 — Editar mi mascota desde el portal</w:t>
@@ -29979,7 +29731,7 @@
         <w:pStyle w:val="Ttulo2"/>
       </w:pPr>
       <w:bookmarkStart w:id="154" w:name="_cf91e7705c2cc7ff174f786bca87f4ab32c164a"/>
-      <w:bookmarkStart w:id="155" w:name="_Toc243948462"/>
+      <w:bookmarkStart w:id="155" w:name="_Toc244091252"/>
       <w:bookmarkEnd w:id="152"/>
       <w:r>
         <w:lastRenderedPageBreak/>
@@ -30225,7 +29977,7 @@
         <w:pStyle w:val="Ttulo2"/>
       </w:pPr>
       <w:bookmarkStart w:id="156" w:name="_f8ebe18ba7612da84cbeb32e6cdfcf569929127"/>
-      <w:bookmarkStart w:id="157" w:name="_Toc243948463"/>
+      <w:bookmarkStart w:id="157" w:name="_Toc244091253"/>
       <w:bookmarkEnd w:id="154"/>
       <w:r>
         <w:t>HU-5.6 — Cancelar o reprogramar mi cita desde el portal</w:t>
@@ -30526,7 +30278,7 @@
         <w:pStyle w:val="Ttulo2"/>
       </w:pPr>
       <w:bookmarkStart w:id="158" w:name="_63b2ff8270a3dc0cb21378739f70e0c16a27def"/>
-      <w:bookmarkStart w:id="159" w:name="_Toc243948464"/>
+      <w:bookmarkStart w:id="159" w:name="_Toc244091254"/>
       <w:bookmarkEnd w:id="156"/>
       <w:r>
         <w:lastRenderedPageBreak/>
@@ -30787,7 +30539,7 @@
         <w:pStyle w:val="Ttulo2"/>
       </w:pPr>
       <w:bookmarkStart w:id="160" w:name="_f59be5ab49da54ec24749683e30fb79075b9c3a"/>
-      <w:bookmarkStart w:id="161" w:name="_Toc243948465"/>
+      <w:bookmarkStart w:id="161" w:name="_Toc244091255"/>
       <w:bookmarkEnd w:id="158"/>
       <w:r>
         <w:t>HU-5.8 — Registrar al propietario como identidad global</w:t>
@@ -31008,10 +30760,7 @@
         <w:t>solo</w:t>
       </w:r>
       <w:r>
-        <w:t xml:space="preserve"> </w:t>
-      </w:r>
-      <w:r>
-        <w:t>a esa clínica; nunca queda vinculado a clínicas que no eligió. Para sumar otra clínica la elige él mismo desde su portal (HU-5.13).</w:t>
+        <w:t xml:space="preserve"> a esa clínica; nunca queda vinculado a clínicas que no eligió. Para sumar otra clínica la elige él mismo desde su portal (HU-5.13).</w:t>
       </w:r>
     </w:p>
     <w:p>
@@ -31110,10 +30859,7 @@
         <w:t>(M5)</w:t>
       </w:r>
       <w:r>
-        <w:t xml:space="preserve"> </w:t>
-      </w:r>
-      <w:r>
-        <w:t>En las tres vías, el correo del propietario no puede ser de un servicio de correo temporal (RE-0.1.5): el aviso sale junto al campo y el servidor lo rechaza.</w:t>
+        <w:t xml:space="preserve"> En las tres vías, el correo del propietario no puede ser de un servicio de correo temporal (RE-0.1.5): el aviso sale junto al campo y el servidor lo rechaza.</w:t>
       </w:r>
     </w:p>
     <w:p>
@@ -31175,7 +30921,7 @@
         <w:pStyle w:val="Ttulo2"/>
       </w:pPr>
       <w:bookmarkStart w:id="162" w:name="_06eaf3b49483b1eeebe1b8e79573cd5c749be44"/>
-      <w:bookmarkStart w:id="163" w:name="_Toc243948466"/>
+      <w:bookmarkStart w:id="163" w:name="_Toc244091256"/>
       <w:bookmarkEnd w:id="160"/>
       <w:r>
         <w:t>HU-5.9 — Iniciar sesión en el portal multi-clínica</w:t>
@@ -31454,7 +31200,7 @@
         <w:pStyle w:val="Ttulo2"/>
       </w:pPr>
       <w:bookmarkStart w:id="164" w:name="_73bf9bf1ab817b39687e744da8c8402ea9619af"/>
-      <w:bookmarkStart w:id="165" w:name="_Toc243948467"/>
+      <w:bookmarkStart w:id="165" w:name="_Toc244091257"/>
       <w:bookmarkEnd w:id="162"/>
       <w:r>
         <w:t>HU-5.10 — Carnet digital de la mascota con QR de emergencia</w:t>
@@ -31687,10 +31433,7 @@
         <w:t>Reglas de negocio:</w:t>
       </w:r>
       <w:r>
-        <w:t xml:space="preserve"> </w:t>
-      </w:r>
-      <w:r>
-        <w:t xml:space="preserve">RN-110, RN-502, RN-503 · </w:t>
+        <w:t xml:space="preserve"> RN-110, RN-502, RN-503 · </w:t>
       </w:r>
       <w:r>
         <w:rPr>
@@ -31718,7 +31461,7 @@
         <w:pStyle w:val="Ttulo2"/>
       </w:pPr>
       <w:bookmarkStart w:id="166" w:name="_809064a587886d0547b1788a26db9d9152af23a"/>
-      <w:bookmarkStart w:id="167" w:name="_Toc243948468"/>
+      <w:bookmarkStart w:id="167" w:name="_Toc244091258"/>
       <w:bookmarkEnd w:id="164"/>
       <w:r>
         <w:t>HU-5.11 — Acceder al carnet por QR en modo solo lectura</w:t>
@@ -31990,7 +31733,7 @@
         <w:pStyle w:val="Ttulo2"/>
       </w:pPr>
       <w:bookmarkStart w:id="168" w:name="_eaa2b9dcd4e772acfdb8cc2e14fe1584fe792e7"/>
-      <w:bookmarkStart w:id="169" w:name="_Toc243948469"/>
+      <w:bookmarkStart w:id="169" w:name="_Toc244091259"/>
       <w:bookmarkEnd w:id="166"/>
       <w:r>
         <w:t>HU-5.12 — Autorizar a una clínica a ver la historia de otras clínicas</w:t>
@@ -32223,10 +31966,7 @@
         <w:t>Reglas de negocio:</w:t>
       </w:r>
       <w:r>
-        <w:t xml:space="preserve"> </w:t>
-      </w:r>
-      <w:r>
-        <w:t xml:space="preserve">RN-113, RN-115, RN-G07 · </w:t>
+        <w:t xml:space="preserve"> RN-113, RN-115, RN-G07 · </w:t>
       </w:r>
       <w:r>
         <w:rPr>
@@ -32254,7 +31994,7 @@
         <w:pStyle w:val="Ttulo2"/>
       </w:pPr>
       <w:bookmarkStart w:id="170" w:name="_9c4353686bd45e1d5b28007e4eeecf1db3be371"/>
-      <w:bookmarkStart w:id="171" w:name="_Toc243948470"/>
+      <w:bookmarkStart w:id="171" w:name="_Toc244091260"/>
       <w:bookmarkEnd w:id="168"/>
       <w:r>
         <w:t>HU-5.13 — Vincularme o desvincularme de una clínica</w:t>
@@ -32514,7 +32254,7 @@
         <w:pStyle w:val="Ttulo2"/>
       </w:pPr>
       <w:bookmarkStart w:id="172" w:name="_faf9cae68ace52a6134b8c807ad8be34010091b"/>
-      <w:bookmarkStart w:id="173" w:name="_Toc243948471"/>
+      <w:bookmarkStart w:id="173" w:name="_Toc244091261"/>
       <w:bookmarkEnd w:id="170"/>
       <w:r>
         <w:t>HU-5.14 — Eliminar mi cuenta (derecho de supresión)</w:t>
@@ -32775,7 +32515,7 @@
         <w:pStyle w:val="Ttulo1"/>
       </w:pPr>
       <w:bookmarkStart w:id="174" w:name="_415d3e183ea3663701acfe1e73f6e8038e4bbef"/>
-      <w:bookmarkStart w:id="175" w:name="_Toc243948472"/>
+      <w:bookmarkStart w:id="175" w:name="_Toc244091262"/>
       <w:bookmarkEnd w:id="144"/>
       <w:bookmarkEnd w:id="172"/>
       <w:r>
@@ -32797,7 +32537,7 @@
         <w:pStyle w:val="Ttulo2"/>
       </w:pPr>
       <w:bookmarkStart w:id="176" w:name="_1b876ecfd0adf71d503b9129568b658f81872f0"/>
-      <w:bookmarkStart w:id="177" w:name="_Toc243948473"/>
+      <w:bookmarkStart w:id="177" w:name="_Toc244091263"/>
       <w:r>
         <w:t>HU-6.1 — Dashboard principal y panel de pendientes</w:t>
       </w:r>
@@ -33170,20 +32910,13 @@
           <w:i/>
           <w:iCs/>
         </w:rPr>
-        <w:t xml:space="preserve"> </w:t>
+        <w:t xml:space="preserve"> y se retiró el módulo «Consultas médicas». El </w:t>
       </w:r>
       <w:r>
         <w:rPr>
           <w:i/>
           <w:iCs/>
         </w:rPr>
-        <w:t xml:space="preserve">y se retiró el módulo «Consultas médicas». El </w:t>
-      </w:r>
-      <w:r>
-        <w:rPr>
-          <w:i/>
-          <w:iCs/>
-        </w:rPr>
         <w:lastRenderedPageBreak/>
         <w:t>historial de cada mascota sigue en Pacientes y en Atención, y la atención sin cita se registra como llegada en la agenda.</w:t>
       </w:r>
@@ -33193,7 +32926,7 @@
         <w:pStyle w:val="Ttulo2"/>
       </w:pPr>
       <w:bookmarkStart w:id="178" w:name="_97322cabf772225fd1bfe897dee158000aa0394"/>
-      <w:bookmarkStart w:id="179" w:name="_Toc243948474"/>
+      <w:bookmarkStart w:id="179" w:name="_Toc244091264"/>
       <w:bookmarkEnd w:id="176"/>
       <w:r>
         <w:t>HU-6.2 — Panel de operación del administrador</w:t>
@@ -33458,7 +33191,7 @@
         </w:numPr>
       </w:pPr>
       <w:r>
-        <w:t>La agenda del día tiene una columna por veterinario activo, incluso sin citas, con sus citas y su estado, los huecos libres reales, el almuerzo, las ausencias y su porcentaje de ocupación.</w:t>
+        <w:t>La agenda del día muestra cada veterinario activo, incluso sin citas, con sus citas y su estado, los huecos libres reales, el almuerzo, las ausencias y su porcentaje de ocupación. En escritorio y tableta conserva las columnas; en celular se elige un veterinario para ver solo su agenda, sin selector cuando hay uno solo (decisión del dueño, 2026-10-27).</w:t>
       </w:r>
     </w:p>
     <w:p>
@@ -33558,7 +33291,7 @@
           <w:i/>
           <w:iCs/>
         </w:rPr>
-        <w:t xml:space="preserve">. La lista filtrable de citas de hoy pasó a Gestión de citas. Por RN-401 el administrador no crea citas, así que «Hoy en la clínica» no tiene el botón «Agendar» del mockup. «En espera» son las citas de hoy con la llegada </w:t>
+        <w:t xml:space="preserve">. La lista filtrable de citas de hoy pasó a Gestión de citas. Por RN-401 el administrador no crea citas, así que «Hoy en la clínica» </w:t>
       </w:r>
       <w:r>
         <w:rPr>
@@ -33566,7 +33299,7 @@
           <w:iCs/>
         </w:rPr>
         <w:lastRenderedPageBreak/>
-        <w:t>registrada que aún no empiezan, más las llegadas sin reserva en espera presencial; «urgencias», los casos rojos de hoy, atendidos o en cola. La minigráfica de «Este mes» muestra atendidas y no asistidas por mes (RE-6.2.4).</w:t>
+        <w:t>no tiene el botón «Agendar» del mockup. «En espera» son las citas de hoy con la llegada registrada que aún no empiezan, más las llegadas sin reserva en espera presencial; «urgencias», los casos rojos de hoy, atendidos o en cola. La minigráfica de «Este mes» muestra atendidas y no asistidas por mes (RE-6.2.4).</w:t>
       </w:r>
     </w:p>
     <w:p>
@@ -33574,7 +33307,7 @@
         <w:pStyle w:val="Ttulo2"/>
       </w:pPr>
       <w:bookmarkStart w:id="180" w:name="_6ce76d48cd12ce7662f89ac490d75c386fc18ba"/>
-      <w:bookmarkStart w:id="181" w:name="_Toc243948475"/>
+      <w:bookmarkStart w:id="181" w:name="_Toc244091265"/>
       <w:bookmarkEnd w:id="178"/>
       <w:r>
         <w:t>HU-6.3 — Generar reportes en PDF</w:t>
@@ -33860,7 +33593,7 @@
         <w:pStyle w:val="Ttulo2"/>
       </w:pPr>
       <w:bookmarkStart w:id="182" w:name="_132f0b1bfae1ac6054dc51db54a45dff43ec797"/>
-      <w:bookmarkStart w:id="183" w:name="_Toc243948476"/>
+      <w:bookmarkStart w:id="183" w:name="_Toc244091266"/>
       <w:bookmarkEnd w:id="180"/>
       <w:r>
         <w:t>HU-6.4 — Ver estadísticas y gráficas del sistema</w:t>
@@ -34117,9 +33850,10 @@
         <w:pStyle w:val="Ttulo2"/>
       </w:pPr>
       <w:bookmarkStart w:id="184" w:name="_159c41a8740d691e56d865baa1d2a17f58680f5"/>
-      <w:bookmarkStart w:id="185" w:name="_Toc243948477"/>
+      <w:bookmarkStart w:id="185" w:name="_Toc244091267"/>
       <w:bookmarkEnd w:id="182"/>
       <w:r>
+        <w:lastRenderedPageBreak/>
         <w:t>HU-6.5 — Exportar reportes a Excel/CSV</w:t>
       </w:r>
       <w:bookmarkEnd w:id="185"/>
@@ -34262,7 +33996,6 @@
         <w:pStyle w:val="Textodebloque"/>
       </w:pPr>
       <w:r>
-        <w:lastRenderedPageBreak/>
         <w:t>Como administrador o veterinario, quiero exportar los reportes también a Excel/CSV además de PDF para analizarlos fuera del sistema.</w:t>
       </w:r>
     </w:p>
@@ -34356,7 +34089,7 @@
         <w:pStyle w:val="Ttulo1"/>
       </w:pPr>
       <w:bookmarkStart w:id="186" w:name="_88abf5b53e5603b94c73c4f577271d31a73cc35"/>
-      <w:bookmarkStart w:id="187" w:name="_Toc243948478"/>
+      <w:bookmarkStart w:id="187" w:name="_Toc244091268"/>
       <w:bookmarkEnd w:id="174"/>
       <w:bookmarkEnd w:id="184"/>
       <w:r>
@@ -34378,7 +34111,7 @@
         <w:pStyle w:val="Ttulo2"/>
       </w:pPr>
       <w:bookmarkStart w:id="188" w:name="_003ad6784c61069e91989793d8255e8d4cb519d"/>
-      <w:bookmarkStart w:id="189" w:name="_Toc243948479"/>
+      <w:bookmarkStart w:id="189" w:name="_Toc244091269"/>
       <w:r>
         <w:t>HU-7.1 — Configurar los horarios de atención de la clínica</w:t>
       </w:r>
@@ -34657,7 +34390,7 @@
         <w:pStyle w:val="Ttulo2"/>
       </w:pPr>
       <w:bookmarkStart w:id="190" w:name="_42539d8b8201701c75c37499984fbffa69d6e4d"/>
-      <w:bookmarkStart w:id="191" w:name="_Toc243948480"/>
+      <w:bookmarkStart w:id="191" w:name="_Toc244091270"/>
       <w:bookmarkEnd w:id="188"/>
       <w:r>
         <w:t>HU-7.2 — Gestionar los catálogos del sistema</w:t>
@@ -34845,10 +34578,7 @@
         <w:t>(v2.0)</w:t>
       </w:r>
       <w:r>
-        <w:t xml:space="preserve"> </w:t>
-      </w:r>
-      <w:r>
-        <w:t>Las especies, razas y colores ya son catálogos globales precargados; si falta una raza, se conserva el texto indicado como «por confirmar». En v2.1 el super-administrador gestiona esos catálogos y la clínica puede proponer la raza faltante.</w:t>
+        <w:t xml:space="preserve"> Las especies, razas y colores ya son catálogos globales precargados; si falta una raza, se conserva el texto indicado como «por confirmar». En v2.1 el super-administrador gestiona esos catálogos y la clínica puede proponer la raza faltante.</w:t>
       </w:r>
     </w:p>
     <w:p>
@@ -34938,7 +34668,7 @@
         <w:pStyle w:val="Ttulo2"/>
       </w:pPr>
       <w:bookmarkStart w:id="192" w:name="_a0aee2f406b049ed83cfe391a77b0db14b5bfdf"/>
-      <w:bookmarkStart w:id="193" w:name="_Toc243948481"/>
+      <w:bookmarkStart w:id="193" w:name="_Toc244091271"/>
       <w:bookmarkEnd w:id="190"/>
       <w:r>
         <w:t>HU-7.3 — Gestionar los veterinarios y sus especialidades</w:t>
@@ -35207,7 +34937,7 @@
         <w:pStyle w:val="Ttulo2"/>
       </w:pPr>
       <w:bookmarkStart w:id="194" w:name="_a0688e3f345f7bf587dcedb8b562b8964a6cacc"/>
-      <w:bookmarkStart w:id="195" w:name="_Toc243948482"/>
+      <w:bookmarkStart w:id="195" w:name="_Toc244091272"/>
       <w:bookmarkEnd w:id="192"/>
       <w:r>
         <w:t>HU-7.4 — Personalizar la clínica: marca y tipos de cita</w:t>
@@ -35471,10 +35201,7 @@
         <w:t>Reglas de negocio:</w:t>
       </w:r>
       <w:r>
-        <w:t xml:space="preserve"> </w:t>
-      </w:r>
-      <w:r>
-        <w:t xml:space="preserve">RN-009, RN-415, RN-421, RN-701, RN-427 · </w:t>
+        <w:t xml:space="preserve"> RN-009, RN-415, RN-421, RN-701, RN-427 · </w:t>
       </w:r>
       <w:r>
         <w:rPr>
@@ -35502,7 +35229,7 @@
         <w:pStyle w:val="Ttulo2"/>
       </w:pPr>
       <w:bookmarkStart w:id="196" w:name="_7004fcdc7c25449422304e35d609c3113b471f6"/>
-      <w:bookmarkStart w:id="197" w:name="_Toc243948483"/>
+      <w:bookmarkStart w:id="197" w:name="_Toc244091273"/>
       <w:bookmarkEnd w:id="194"/>
       <w:r>
         <w:t>HU-7.5 — Parámetros del sistema configurables</w:t>
@@ -35769,7 +35496,7 @@
         <w:pStyle w:val="Ttulo1"/>
       </w:pPr>
       <w:bookmarkStart w:id="198" w:name="_99f8c38fc90f872e869cb5a42176a81ce60716e"/>
-      <w:bookmarkStart w:id="199" w:name="_Toc243948484"/>
+      <w:bookmarkStart w:id="199" w:name="_Toc244091274"/>
       <w:bookmarkEnd w:id="186"/>
       <w:bookmarkEnd w:id="196"/>
       <w:r>
@@ -35798,7 +35525,7 @@
         <w:pStyle w:val="Ttulo2"/>
       </w:pPr>
       <w:bookmarkStart w:id="200" w:name="_6b93d7ad964c8104bb83fc9231a04e4fc4e5a57"/>
-      <w:bookmarkStart w:id="201" w:name="_Toc243948485"/>
+      <w:bookmarkStart w:id="201" w:name="_Toc244091275"/>
       <w:r>
         <w:t>HU-8.1 — Calificar al veterinario tras una consulta atendida</w:t>
       </w:r>
@@ -36103,7 +35830,7 @@
         <w:pStyle w:val="Ttulo2"/>
       </w:pPr>
       <w:bookmarkStart w:id="202" w:name="_6de705a3e3f0ae827b0b0206b40472100ec5dc2"/>
-      <w:bookmarkStart w:id="203" w:name="_Toc243948486"/>
+      <w:bookmarkStart w:id="203" w:name="_Toc244091276"/>
       <w:bookmarkEnd w:id="200"/>
       <w:r>
         <w:t>HU-8.2 — Perfil público del veterinario</w:t>
@@ -36349,7 +36076,7 @@
         <w:pStyle w:val="Ttulo2"/>
       </w:pPr>
       <w:bookmarkStart w:id="204" w:name="_8d0438a4c21826cdef43f79f40a5abd8a052054"/>
-      <w:bookmarkStart w:id="205" w:name="_Toc243948487"/>
+      <w:bookmarkStart w:id="205" w:name="_Toc244091277"/>
       <w:bookmarkEnd w:id="202"/>
       <w:r>
         <w:lastRenderedPageBreak/>
@@ -36595,7 +36322,7 @@
         <w:pStyle w:val="Ttulo2"/>
       </w:pPr>
       <w:bookmarkStart w:id="206" w:name="_9d375ff686aceee42a269dcad0f742f5e2f3757"/>
-      <w:bookmarkStart w:id="207" w:name="_Toc243948488"/>
+      <w:bookmarkStart w:id="207" w:name="_Toc244091278"/>
       <w:bookmarkEnd w:id="204"/>
       <w:r>
         <w:t>HU-8.4 — Tiempos de envío de recordatorios configurables</w:t>
@@ -36819,7 +36546,7 @@
         <w:pStyle w:val="Ttulo2"/>
       </w:pPr>
       <w:bookmarkStart w:id="208" w:name="_09d49d8f9ce2d4331632fad53df16df04e0463f"/>
-      <w:bookmarkStart w:id="209" w:name="_Toc243948489"/>
+      <w:bookmarkStart w:id="209" w:name="_Toc244091279"/>
       <w:bookmarkEnd w:id="206"/>
       <w:r>
         <w:t>HU-8.5 — Bitácora de correos y notificaciones</w:t>
@@ -37043,7 +36770,7 @@
         <w:pStyle w:val="Ttulo1"/>
       </w:pPr>
       <w:bookmarkStart w:id="210" w:name="_739f4e5454618e53e20de4c2474955375ba75c3"/>
-      <w:bookmarkStart w:id="211" w:name="_Toc243948490"/>
+      <w:bookmarkStart w:id="211" w:name="_Toc244091280"/>
       <w:bookmarkEnd w:id="198"/>
       <w:bookmarkEnd w:id="208"/>
       <w:r>
@@ -37065,7 +36792,7 @@
         <w:pStyle w:val="Ttulo2"/>
       </w:pPr>
       <w:bookmarkStart w:id="212" w:name="_062138411ab05c870ba796ff3d39feef69a18f5"/>
-      <w:bookmarkStart w:id="213" w:name="_Toc243948491"/>
+      <w:bookmarkStart w:id="213" w:name="_Toc244091281"/>
       <w:r>
         <w:t>HU-9.1 — Página pública y políticas legales</w:t>
       </w:r>
@@ -37290,7 +37017,7 @@
         <w:pStyle w:val="Ttulo1"/>
       </w:pPr>
       <w:bookmarkStart w:id="214" w:name="_6e6ded5804ca164f89e595fd787218d3285fdda"/>
-      <w:bookmarkStart w:id="215" w:name="_Toc243948492"/>
+      <w:bookmarkStart w:id="215" w:name="_Toc244091282"/>
       <w:bookmarkEnd w:id="210"/>
       <w:bookmarkEnd w:id="212"/>
       <w:r>
@@ -37340,7 +37067,7 @@
         <w:pStyle w:val="Ttulo2"/>
       </w:pPr>
       <w:bookmarkStart w:id="216" w:name="_84c91a7718df0375d71f3af5025108c0495eae8"/>
-      <w:bookmarkStart w:id="217" w:name="_Toc243948493"/>
+      <w:bookmarkStart w:id="217" w:name="_Toc244091283"/>
       <w:r>
         <w:t>Entrega v2.0 — imprescindible para la presentación (29 historias; 159 puntos estimados y HU-2.12 por estimar)</w:t>
       </w:r>
@@ -38888,7 +38615,7 @@
         <w:pStyle w:val="Ttulo2"/>
       </w:pPr>
       <w:bookmarkStart w:id="218" w:name="_4726c838c4287a7aa8f67a2e091a84cc61b2bb0"/>
-      <w:bookmarkStart w:id="219" w:name="_Toc243948494"/>
+      <w:bookmarkStart w:id="219" w:name="_Toc244091284"/>
       <w:bookmarkEnd w:id="216"/>
       <w:r>
         <w:t>Entrega v2.1 — completa el alcance (16 historias; estimación de HU-0.5 pendiente)</w:t>
@@ -39839,7 +39566,7 @@
         <w:pStyle w:val="Ttulo2"/>
       </w:pPr>
       <w:bookmarkStart w:id="220" w:name="_18e859a36e2a2c7f781eaf2084ffc20b263712e"/>
-      <w:bookmarkStart w:id="221" w:name="_Toc243948495"/>
+      <w:bookmarkStart w:id="221" w:name="_Toc244091285"/>
       <w:bookmarkEnd w:id="218"/>
       <w:r>
         <w:t>Historias diferidas que absorbe la v2</w:t>
@@ -40190,7 +39917,7 @@
         <w:pStyle w:val="Ttulo1"/>
       </w:pPr>
       <w:bookmarkStart w:id="222" w:name="_2bd3782f46f42f4ba497da64d292df25adf2039"/>
-      <w:bookmarkStart w:id="223" w:name="_Toc243948496"/>
+      <w:bookmarkStart w:id="223" w:name="_Toc244091286"/>
       <w:bookmarkEnd w:id="214"/>
       <w:bookmarkEnd w:id="220"/>
       <w:r>
@@ -44980,7 +44707,7 @@
         <w:pStyle w:val="Ttulo1"/>
       </w:pPr>
       <w:bookmarkStart w:id="224" w:name="_628434b2c6f40c9643f3958509c62867ee6f47b"/>
-      <w:bookmarkStart w:id="225" w:name="_Toc243948497"/>
+      <w:bookmarkStart w:id="225" w:name="_Toc244091287"/>
       <w:bookmarkEnd w:id="222"/>
       <w:r>
         <w:lastRenderedPageBreak/>
@@ -50545,7 +50272,7 @@
               <w:noProof/>
             </w:rPr>
             <w:drawing>
-              <wp:inline distT="0" distB="0" distL="0" distR="0" wp14:anchorId="400BCDDA" wp14:editId="400BCDDB">
+              <wp:inline distT="0" distB="0" distL="0" distR="0" wp14:anchorId="5A49B961" wp14:editId="5A49B962">
                 <wp:extent cx="324000" cy="324000"/>
                 <wp:effectExtent l="0" t="0" r="0" b="0"/>
                 <wp:docPr id="9001" name="Logo Zooki"/>
@@ -50712,7 +50439,7 @@
   <w:abstractNum w:abstractNumId="0" w15:restartNumberingAfterBreak="0">
     <w:nsid w:val="0000A991"/>
     <w:multiLevelType w:val="multilevel"/>
-    <w:tmpl w:val="2C0C2DA6"/>
+    <w:tmpl w:val="1BA606FC"/>
     <w:lvl w:ilvl="0">
       <w:numFmt w:val="bullet"/>
       <w:lvlText w:val=""/>
@@ -50813,295 +50540,295 @@
       </w:rPr>
     </w:lvl>
   </w:abstractNum>
-  <w:num w:numId="1" w16cid:durableId="167260593">
+  <w:num w:numId="1" w16cid:durableId="498498826">
     <w:abstractNumId w:val="0"/>
   </w:num>
-  <w:num w:numId="2" w16cid:durableId="363872788">
+  <w:num w:numId="2" w16cid:durableId="868298378">
     <w:abstractNumId w:val="0"/>
   </w:num>
-  <w:num w:numId="3" w16cid:durableId="299725678">
+  <w:num w:numId="3" w16cid:durableId="1954360355">
     <w:abstractNumId w:val="0"/>
   </w:num>
-  <w:num w:numId="4" w16cid:durableId="1027104736">
+  <w:num w:numId="4" w16cid:durableId="653139925">
     <w:abstractNumId w:val="0"/>
   </w:num>
-  <w:num w:numId="5" w16cid:durableId="669598813">
+  <w:num w:numId="5" w16cid:durableId="1217163265">
     <w:abstractNumId w:val="0"/>
   </w:num>
-  <w:num w:numId="6" w16cid:durableId="294608661">
+  <w:num w:numId="6" w16cid:durableId="614412654">
     <w:abstractNumId w:val="0"/>
   </w:num>
-  <w:num w:numId="7" w16cid:durableId="143014283">
+  <w:num w:numId="7" w16cid:durableId="2096900820">
     <w:abstractNumId w:val="0"/>
   </w:num>
-  <w:num w:numId="8" w16cid:durableId="421267331">
+  <w:num w:numId="8" w16cid:durableId="1453742451">
     <w:abstractNumId w:val="0"/>
   </w:num>
-  <w:num w:numId="9" w16cid:durableId="718819394">
+  <w:num w:numId="9" w16cid:durableId="184948983">
     <w:abstractNumId w:val="0"/>
   </w:num>
-  <w:num w:numId="10" w16cid:durableId="1843470143">
+  <w:num w:numId="10" w16cid:durableId="722942999">
     <w:abstractNumId w:val="0"/>
   </w:num>
-  <w:num w:numId="11" w16cid:durableId="194781104">
+  <w:num w:numId="11" w16cid:durableId="1701661658">
     <w:abstractNumId w:val="0"/>
   </w:num>
-  <w:num w:numId="12" w16cid:durableId="497423935">
+  <w:num w:numId="12" w16cid:durableId="19162314">
     <w:abstractNumId w:val="0"/>
   </w:num>
-  <w:num w:numId="13" w16cid:durableId="2066367121">
+  <w:num w:numId="13" w16cid:durableId="97338257">
     <w:abstractNumId w:val="0"/>
   </w:num>
-  <w:num w:numId="14" w16cid:durableId="214317487">
+  <w:num w:numId="14" w16cid:durableId="2020958285">
     <w:abstractNumId w:val="0"/>
   </w:num>
-  <w:num w:numId="15" w16cid:durableId="1905866941">
+  <w:num w:numId="15" w16cid:durableId="819152049">
     <w:abstractNumId w:val="0"/>
   </w:num>
-  <w:num w:numId="16" w16cid:durableId="101270309">
+  <w:num w:numId="16" w16cid:durableId="121853803">
     <w:abstractNumId w:val="0"/>
   </w:num>
-  <w:num w:numId="17" w16cid:durableId="1978677599">
+  <w:num w:numId="17" w16cid:durableId="1099984612">
     <w:abstractNumId w:val="0"/>
   </w:num>
-  <w:num w:numId="18" w16cid:durableId="2016374375">
+  <w:num w:numId="18" w16cid:durableId="1570845492">
     <w:abstractNumId w:val="0"/>
   </w:num>
-  <w:num w:numId="19" w16cid:durableId="1693650807">
+  <w:num w:numId="19" w16cid:durableId="1778601644">
     <w:abstractNumId w:val="0"/>
   </w:num>
-  <w:num w:numId="20" w16cid:durableId="924190974">
+  <w:num w:numId="20" w16cid:durableId="1640649662">
     <w:abstractNumId w:val="0"/>
   </w:num>
-  <w:num w:numId="21" w16cid:durableId="867570102">
+  <w:num w:numId="21" w16cid:durableId="1281106439">
     <w:abstractNumId w:val="0"/>
   </w:num>
-  <w:num w:numId="22" w16cid:durableId="281691376">
+  <w:num w:numId="22" w16cid:durableId="2014721488">
     <w:abstractNumId w:val="0"/>
   </w:num>
-  <w:num w:numId="23" w16cid:durableId="320277751">
+  <w:num w:numId="23" w16cid:durableId="685060029">
     <w:abstractNumId w:val="0"/>
   </w:num>
-  <w:num w:numId="24" w16cid:durableId="2092965008">
+  <w:num w:numId="24" w16cid:durableId="301272442">
     <w:abstractNumId w:val="0"/>
   </w:num>
-  <w:num w:numId="25" w16cid:durableId="145098770">
+  <w:num w:numId="25" w16cid:durableId="1778283441">
     <w:abstractNumId w:val="0"/>
   </w:num>
-  <w:num w:numId="26" w16cid:durableId="1905405491">
+  <w:num w:numId="26" w16cid:durableId="86973465">
     <w:abstractNumId w:val="0"/>
   </w:num>
-  <w:num w:numId="27" w16cid:durableId="1548450428">
+  <w:num w:numId="27" w16cid:durableId="933590948">
     <w:abstractNumId w:val="0"/>
   </w:num>
-  <w:num w:numId="28" w16cid:durableId="135613117">
+  <w:num w:numId="28" w16cid:durableId="461268910">
     <w:abstractNumId w:val="0"/>
   </w:num>
-  <w:num w:numId="29" w16cid:durableId="1623337650">
+  <w:num w:numId="29" w16cid:durableId="1147475018">
     <w:abstractNumId w:val="0"/>
   </w:num>
-  <w:num w:numId="30" w16cid:durableId="2012096571">
+  <w:num w:numId="30" w16cid:durableId="73481895">
     <w:abstractNumId w:val="0"/>
   </w:num>
-  <w:num w:numId="31" w16cid:durableId="2059359055">
+  <w:num w:numId="31" w16cid:durableId="195050100">
     <w:abstractNumId w:val="0"/>
   </w:num>
-  <w:num w:numId="32" w16cid:durableId="1083070483">
+  <w:num w:numId="32" w16cid:durableId="338123858">
     <w:abstractNumId w:val="0"/>
   </w:num>
-  <w:num w:numId="33" w16cid:durableId="851648032">
+  <w:num w:numId="33" w16cid:durableId="1877350041">
     <w:abstractNumId w:val="0"/>
   </w:num>
-  <w:num w:numId="34" w16cid:durableId="1536963675">
+  <w:num w:numId="34" w16cid:durableId="1250042289">
     <w:abstractNumId w:val="0"/>
   </w:num>
-  <w:num w:numId="35" w16cid:durableId="272979991">
+  <w:num w:numId="35" w16cid:durableId="249048769">
     <w:abstractNumId w:val="0"/>
   </w:num>
-  <w:num w:numId="36" w16cid:durableId="1794709778">
+  <w:num w:numId="36" w16cid:durableId="254556561">
     <w:abstractNumId w:val="0"/>
   </w:num>
-  <w:num w:numId="37" w16cid:durableId="1241060643">
+  <w:num w:numId="37" w16cid:durableId="1909614606">
     <w:abstractNumId w:val="0"/>
   </w:num>
-  <w:num w:numId="38" w16cid:durableId="1779182610">
+  <w:num w:numId="38" w16cid:durableId="983780614">
     <w:abstractNumId w:val="0"/>
   </w:num>
-  <w:num w:numId="39" w16cid:durableId="247885451">
+  <w:num w:numId="39" w16cid:durableId="1513376313">
     <w:abstractNumId w:val="0"/>
   </w:num>
-  <w:num w:numId="40" w16cid:durableId="378094478">
+  <w:num w:numId="40" w16cid:durableId="247737101">
     <w:abstractNumId w:val="0"/>
   </w:num>
-  <w:num w:numId="41" w16cid:durableId="1926497163">
+  <w:num w:numId="41" w16cid:durableId="626467299">
     <w:abstractNumId w:val="0"/>
   </w:num>
-  <w:num w:numId="42" w16cid:durableId="695616596">
+  <w:num w:numId="42" w16cid:durableId="1788710">
     <w:abstractNumId w:val="0"/>
   </w:num>
-  <w:num w:numId="43" w16cid:durableId="247230606">
+  <w:num w:numId="43" w16cid:durableId="923493936">
     <w:abstractNumId w:val="0"/>
   </w:num>
-  <w:num w:numId="44" w16cid:durableId="210651058">
+  <w:num w:numId="44" w16cid:durableId="185682512">
     <w:abstractNumId w:val="0"/>
   </w:num>
-  <w:num w:numId="45" w16cid:durableId="775952325">
+  <w:num w:numId="45" w16cid:durableId="2088915236">
     <w:abstractNumId w:val="0"/>
   </w:num>
-  <w:num w:numId="46" w16cid:durableId="1327320848">
+  <w:num w:numId="46" w16cid:durableId="115410174">
     <w:abstractNumId w:val="0"/>
   </w:num>
-  <w:num w:numId="47" w16cid:durableId="606424356">
+  <w:num w:numId="47" w16cid:durableId="730687998">
     <w:abstractNumId w:val="0"/>
   </w:num>
-  <w:num w:numId="48" w16cid:durableId="1153254067">
+  <w:num w:numId="48" w16cid:durableId="1389301383">
     <w:abstractNumId w:val="0"/>
   </w:num>
-  <w:num w:numId="49" w16cid:durableId="1262179118">
+  <w:num w:numId="49" w16cid:durableId="1138492530">
     <w:abstractNumId w:val="0"/>
   </w:num>
-  <w:num w:numId="50" w16cid:durableId="1496726131">
+  <w:num w:numId="50" w16cid:durableId="201603016">
     <w:abstractNumId w:val="0"/>
   </w:num>
-  <w:num w:numId="51" w16cid:durableId="1898125672">
+  <w:num w:numId="51" w16cid:durableId="25256075">
     <w:abstractNumId w:val="0"/>
   </w:num>
-  <w:num w:numId="52" w16cid:durableId="1649213959">
+  <w:num w:numId="52" w16cid:durableId="1714186911">
     <w:abstractNumId w:val="0"/>
   </w:num>
-  <w:num w:numId="53" w16cid:durableId="1956791427">
+  <w:num w:numId="53" w16cid:durableId="2143112173">
     <w:abstractNumId w:val="0"/>
   </w:num>
-  <w:num w:numId="54" w16cid:durableId="1104231472">
+  <w:num w:numId="54" w16cid:durableId="2023899995">
     <w:abstractNumId w:val="0"/>
   </w:num>
-  <w:num w:numId="55" w16cid:durableId="111285034">
+  <w:num w:numId="55" w16cid:durableId="436682706">
     <w:abstractNumId w:val="0"/>
   </w:num>
-  <w:num w:numId="56" w16cid:durableId="831020714">
+  <w:num w:numId="56" w16cid:durableId="2113671201">
     <w:abstractNumId w:val="0"/>
   </w:num>
-  <w:num w:numId="57" w16cid:durableId="1891918222">
+  <w:num w:numId="57" w16cid:durableId="2031297779">
     <w:abstractNumId w:val="0"/>
   </w:num>
-  <w:num w:numId="58" w16cid:durableId="1321229924">
+  <w:num w:numId="58" w16cid:durableId="1847670852">
     <w:abstractNumId w:val="0"/>
   </w:num>
-  <w:num w:numId="59" w16cid:durableId="454181706">
+  <w:num w:numId="59" w16cid:durableId="313919184">
     <w:abstractNumId w:val="0"/>
   </w:num>
-  <w:num w:numId="60" w16cid:durableId="109469832">
+  <w:num w:numId="60" w16cid:durableId="1870950932">
     <w:abstractNumId w:val="0"/>
   </w:num>
-  <w:num w:numId="61" w16cid:durableId="2040162078">
+  <w:num w:numId="61" w16cid:durableId="1869948328">
     <w:abstractNumId w:val="0"/>
   </w:num>
-  <w:num w:numId="62" w16cid:durableId="1933778591">
+  <w:num w:numId="62" w16cid:durableId="1068380027">
     <w:abstractNumId w:val="0"/>
   </w:num>
-  <w:num w:numId="63" w16cid:durableId="1102259850">
+  <w:num w:numId="63" w16cid:durableId="57559015">
     <w:abstractNumId w:val="0"/>
   </w:num>
-  <w:num w:numId="64" w16cid:durableId="310603442">
+  <w:num w:numId="64" w16cid:durableId="150289728">
     <w:abstractNumId w:val="0"/>
   </w:num>
-  <w:num w:numId="65" w16cid:durableId="393546773">
+  <w:num w:numId="65" w16cid:durableId="316231892">
     <w:abstractNumId w:val="0"/>
   </w:num>
-  <w:num w:numId="66" w16cid:durableId="1467352205">
+  <w:num w:numId="66" w16cid:durableId="962033926">
     <w:abstractNumId w:val="0"/>
   </w:num>
-  <w:num w:numId="67" w16cid:durableId="691151797">
+  <w:num w:numId="67" w16cid:durableId="1470509881">
     <w:abstractNumId w:val="0"/>
   </w:num>
-  <w:num w:numId="68" w16cid:durableId="1173253039">
+  <w:num w:numId="68" w16cid:durableId="1731999649">
     <w:abstractNumId w:val="0"/>
   </w:num>
-  <w:num w:numId="69" w16cid:durableId="17393281">
+  <w:num w:numId="69" w16cid:durableId="2118479067">
     <w:abstractNumId w:val="0"/>
   </w:num>
-  <w:num w:numId="70" w16cid:durableId="1373073600">
+  <w:num w:numId="70" w16cid:durableId="416707936">
     <w:abstractNumId w:val="0"/>
   </w:num>
-  <w:num w:numId="71" w16cid:durableId="427967597">
+  <w:num w:numId="71" w16cid:durableId="459735964">
     <w:abstractNumId w:val="0"/>
   </w:num>
-  <w:num w:numId="72" w16cid:durableId="968703532">
+  <w:num w:numId="72" w16cid:durableId="1744526744">
     <w:abstractNumId w:val="0"/>
   </w:num>
-  <w:num w:numId="73" w16cid:durableId="1744765222">
+  <w:num w:numId="73" w16cid:durableId="1396471049">
     <w:abstractNumId w:val="0"/>
   </w:num>
-  <w:num w:numId="74" w16cid:durableId="870915507">
+  <w:num w:numId="74" w16cid:durableId="499738484">
     <w:abstractNumId w:val="0"/>
   </w:num>
-  <w:num w:numId="75" w16cid:durableId="1039086276">
+  <w:num w:numId="75" w16cid:durableId="1104493658">
     <w:abstractNumId w:val="0"/>
   </w:num>
-  <w:num w:numId="76" w16cid:durableId="1321157264">
+  <w:num w:numId="76" w16cid:durableId="676007908">
     <w:abstractNumId w:val="0"/>
   </w:num>
-  <w:num w:numId="77" w16cid:durableId="2087721780">
+  <w:num w:numId="77" w16cid:durableId="1365863614">
     <w:abstractNumId w:val="0"/>
   </w:num>
-  <w:num w:numId="78" w16cid:durableId="1348211264">
+  <w:num w:numId="78" w16cid:durableId="48118728">
     <w:abstractNumId w:val="0"/>
   </w:num>
-  <w:num w:numId="79" w16cid:durableId="688063629">
+  <w:num w:numId="79" w16cid:durableId="1688173691">
     <w:abstractNumId w:val="0"/>
   </w:num>
-  <w:num w:numId="80" w16cid:durableId="653683817">
+  <w:num w:numId="80" w16cid:durableId="124665902">
     <w:abstractNumId w:val="0"/>
   </w:num>
-  <w:num w:numId="81" w16cid:durableId="964696310">
+  <w:num w:numId="81" w16cid:durableId="2029328876">
     <w:abstractNumId w:val="0"/>
   </w:num>
-  <w:num w:numId="82" w16cid:durableId="1964114597">
+  <w:num w:numId="82" w16cid:durableId="1754162431">
     <w:abstractNumId w:val="0"/>
   </w:num>
-  <w:num w:numId="83" w16cid:durableId="546839552">
+  <w:num w:numId="83" w16cid:durableId="18089598">
     <w:abstractNumId w:val="0"/>
   </w:num>
-  <w:num w:numId="84" w16cid:durableId="116069540">
+  <w:num w:numId="84" w16cid:durableId="930889735">
     <w:abstractNumId w:val="0"/>
   </w:num>
-  <w:num w:numId="85" w16cid:durableId="354506256">
+  <w:num w:numId="85" w16cid:durableId="256642258">
     <w:abstractNumId w:val="0"/>
   </w:num>
-  <w:num w:numId="86" w16cid:durableId="2108885484">
+  <w:num w:numId="86" w16cid:durableId="1212810354">
     <w:abstractNumId w:val="0"/>
   </w:num>
-  <w:num w:numId="87" w16cid:durableId="1432823816">
+  <w:num w:numId="87" w16cid:durableId="1287395701">
     <w:abstractNumId w:val="0"/>
   </w:num>
-  <w:num w:numId="88" w16cid:durableId="1629433762">
+  <w:num w:numId="88" w16cid:durableId="489518083">
     <w:abstractNumId w:val="0"/>
   </w:num>
-  <w:num w:numId="89" w16cid:durableId="770398942">
+  <w:num w:numId="89" w16cid:durableId="710955856">
     <w:abstractNumId w:val="0"/>
   </w:num>
-  <w:num w:numId="90" w16cid:durableId="135222091">
+  <w:num w:numId="90" w16cid:durableId="620957423">
     <w:abstractNumId w:val="0"/>
   </w:num>
-  <w:num w:numId="91" w16cid:durableId="259919958">
+  <w:num w:numId="91" w16cid:durableId="986006972">
     <w:abstractNumId w:val="0"/>
   </w:num>
-  <w:num w:numId="92" w16cid:durableId="1394432444">
+  <w:num w:numId="92" w16cid:durableId="600572025">
     <w:abstractNumId w:val="0"/>
   </w:num>
-  <w:num w:numId="93" w16cid:durableId="1955138902">
+  <w:num w:numId="93" w16cid:durableId="1852448123">
     <w:abstractNumId w:val="0"/>
   </w:num>
-  <w:num w:numId="94" w16cid:durableId="1879276669">
+  <w:num w:numId="94" w16cid:durableId="284120385">
     <w:abstractNumId w:val="0"/>
   </w:num>
-  <w:num w:numId="95" w16cid:durableId="1575966680">
+  <w:num w:numId="95" w16cid:durableId="1061487361">
     <w:abstractNumId w:val="0"/>
   </w:num>
-  <w:num w:numId="96" w16cid:durableId="1172723574">
+  <w:num w:numId="96" w16cid:durableId="1448743188">
     <w:abstractNumId w:val="0"/>
   </w:num>
-  <w:num w:numId="97" w16cid:durableId="322469162">
+  <w:num w:numId="97" w16cid:durableId="510334971">
     <w:abstractNumId w:val="0"/>
   </w:num>
   <w:numIdMacAtCleanup w:val="97"/>
@@ -52493,7 +52220,7 @@
     <w:autoRedefine/>
     <w:uiPriority w:val="39"/>
     <w:unhideWhenUsed/>
-    <w:rsid w:val="006D75C8"/>
+    <w:rsid w:val="00401222"/>
     <w:pPr>
       <w:spacing w:after="100" w:line="278" w:lineRule="auto"/>
       <w:ind w:left="480"/>
@@ -52512,7 +52239,7 @@
     <w:autoRedefine/>
     <w:uiPriority w:val="39"/>
     <w:unhideWhenUsed/>
-    <w:rsid w:val="006D75C8"/>
+    <w:rsid w:val="00401222"/>
     <w:pPr>
       <w:spacing w:after="100" w:line="278" w:lineRule="auto"/>
       <w:ind w:left="720"/>
@@ -52531,7 +52258,7 @@
     <w:autoRedefine/>
     <w:uiPriority w:val="39"/>
     <w:unhideWhenUsed/>
-    <w:rsid w:val="006D75C8"/>
+    <w:rsid w:val="00401222"/>
     <w:pPr>
       <w:spacing w:after="100" w:line="278" w:lineRule="auto"/>
       <w:ind w:left="960"/>
@@ -52550,7 +52277,7 @@
     <w:autoRedefine/>
     <w:uiPriority w:val="39"/>
     <w:unhideWhenUsed/>
-    <w:rsid w:val="006D75C8"/>
+    <w:rsid w:val="00401222"/>
     <w:pPr>
       <w:spacing w:after="100" w:line="278" w:lineRule="auto"/>
       <w:ind w:left="1200"/>
@@ -52569,7 +52296,7 @@
     <w:autoRedefine/>
     <w:uiPriority w:val="39"/>
     <w:unhideWhenUsed/>
-    <w:rsid w:val="006D75C8"/>
+    <w:rsid w:val="00401222"/>
     <w:pPr>
       <w:spacing w:after="100" w:line="278" w:lineRule="auto"/>
       <w:ind w:left="1440"/>
@@ -52588,7 +52315,7 @@
     <w:autoRedefine/>
     <w:uiPriority w:val="39"/>
     <w:unhideWhenUsed/>
-    <w:rsid w:val="006D75C8"/>
+    <w:rsid w:val="00401222"/>
     <w:pPr>
       <w:spacing w:after="100" w:line="278" w:lineRule="auto"/>
       <w:ind w:left="1680"/>
@@ -52607,7 +52334,7 @@
     <w:autoRedefine/>
     <w:uiPriority w:val="39"/>
     <w:unhideWhenUsed/>
-    <w:rsid w:val="006D75C8"/>
+    <w:rsid w:val="00401222"/>
     <w:pPr>
       <w:spacing w:after="100" w:line="278" w:lineRule="auto"/>
       <w:ind w:left="1920"/>
@@ -52625,7 +52352,7 @@
     <w:uiPriority w:val="99"/>
     <w:semiHidden/>
     <w:unhideWhenUsed/>
-    <w:rsid w:val="006D75C8"/>
+    <w:rsid w:val="00401222"/>
     <w:rPr>
       <w:color w:val="605E5C"/>
       <w:shd w:val="clear" w:color="auto" w:fill="E1DFDD"/>

</xml_diff>

<commit_message>
feat(agenda): triage provisional y vacunacion desde registros (HU-4.13, RE-2.11.3, RN-418, RN-419)
</commit_message>
<xml_diff>
--- a/public/docs/descargas/hu.docx
+++ b/public/docs/descargas/hu.docx
@@ -93,7 +93,7 @@
           <w:noProof/>
         </w:rPr>
         <w:drawing>
-          <wp:inline distT="0" distB="0" distL="0" distR="0" wp14:anchorId="5A49B955" wp14:editId="5A49B956">
+          <wp:inline distT="0" distB="0" distL="0" distR="0" wp14:anchorId="735D7AD2" wp14:editId="735D7AD3">
             <wp:extent cx="395999" cy="405503"/>
             <wp:effectExtent l="0" t="0" r="0" b="0"/>
             <wp:docPr id="10" name="Picture"/>
@@ -229,7 +229,7 @@
               <w:pStyle w:val="Celda"/>
             </w:pPr>
             <w:r>
-              <w:t>28/10/2026</w:t>
+              <w:t>29/10/2026</w:t>
             </w:r>
           </w:p>
         </w:tc>
@@ -409,7 +409,7 @@
       <w:r>
         <w:fldChar w:fldCharType="separate"/>
       </w:r>
-      <w:hyperlink w:anchor="_Toc244091175" w:history="1">
+      <w:hyperlink w:anchor="_Toc244199584" w:history="1">
         <w:r>
           <w:rPr>
             <w:rStyle w:val="Hipervnculo"/>
@@ -445,7 +445,7 @@
             <w:noProof/>
             <w:webHidden/>
           </w:rPr>
-          <w:instrText xml:space="preserve"> PAGEREF _Toc244091175 \h </w:instrText>
+          <w:instrText xml:space="preserve"> PAGEREF _Toc244199584 \h </w:instrText>
         </w:r>
         <w:r>
           <w:rPr>
@@ -488,7 +488,7 @@
           <w14:ligatures w14:val="standardContextual"/>
         </w:rPr>
       </w:pPr>
-      <w:hyperlink w:anchor="_Toc244091176" w:history="1">
+      <w:hyperlink w:anchor="_Toc244199585" w:history="1">
         <w:r>
           <w:rPr>
             <w:rStyle w:val="Hipervnculo"/>
@@ -515,7 +515,7 @@
             <w:noProof/>
             <w:webHidden/>
           </w:rPr>
-          <w:instrText xml:space="preserve"> PAGEREF _Toc244091176 \h </w:instrText>
+          <w:instrText xml:space="preserve"> PAGEREF _Toc244199585 \h </w:instrText>
         </w:r>
         <w:r>
           <w:rPr>
@@ -558,7 +558,7 @@
           <w14:ligatures w14:val="standardContextual"/>
         </w:rPr>
       </w:pPr>
-      <w:hyperlink w:anchor="_Toc244091177" w:history="1">
+      <w:hyperlink w:anchor="_Toc244199586" w:history="1">
         <w:r>
           <w:rPr>
             <w:rStyle w:val="Hipervnculo"/>
@@ -585,7 +585,7 @@
             <w:noProof/>
             <w:webHidden/>
           </w:rPr>
-          <w:instrText xml:space="preserve"> PAGEREF _Toc244091177 \h </w:instrText>
+          <w:instrText xml:space="preserve"> PAGEREF _Toc244199586 \h </w:instrText>
         </w:r>
         <w:r>
           <w:rPr>
@@ -628,7 +628,7 @@
           <w14:ligatures w14:val="standardContextual"/>
         </w:rPr>
       </w:pPr>
-      <w:hyperlink w:anchor="_Toc244091178" w:history="1">
+      <w:hyperlink w:anchor="_Toc244199587" w:history="1">
         <w:r>
           <w:rPr>
             <w:rStyle w:val="Hipervnculo"/>
@@ -655,7 +655,7 @@
             <w:noProof/>
             <w:webHidden/>
           </w:rPr>
-          <w:instrText xml:space="preserve"> PAGEREF _Toc244091178 \h </w:instrText>
+          <w:instrText xml:space="preserve"> PAGEREF _Toc244199587 \h </w:instrText>
         </w:r>
         <w:r>
           <w:rPr>
@@ -698,7 +698,7 @@
           <w14:ligatures w14:val="standardContextual"/>
         </w:rPr>
       </w:pPr>
-      <w:hyperlink w:anchor="_Toc244091179" w:history="1">
+      <w:hyperlink w:anchor="_Toc244199588" w:history="1">
         <w:r>
           <w:rPr>
             <w:rStyle w:val="Hipervnculo"/>
@@ -725,7 +725,7 @@
             <w:noProof/>
             <w:webHidden/>
           </w:rPr>
-          <w:instrText xml:space="preserve"> PAGEREF _Toc244091179 \h </w:instrText>
+          <w:instrText xml:space="preserve"> PAGEREF _Toc244199588 \h </w:instrText>
         </w:r>
         <w:r>
           <w:rPr>
@@ -768,7 +768,7 @@
           <w14:ligatures w14:val="standardContextual"/>
         </w:rPr>
       </w:pPr>
-      <w:hyperlink w:anchor="_Toc244091180" w:history="1">
+      <w:hyperlink w:anchor="_Toc244199589" w:history="1">
         <w:r>
           <w:rPr>
             <w:rStyle w:val="Hipervnculo"/>
@@ -795,7 +795,7 @@
             <w:noProof/>
             <w:webHidden/>
           </w:rPr>
-          <w:instrText xml:space="preserve"> PAGEREF _Toc244091180 \h </w:instrText>
+          <w:instrText xml:space="preserve"> PAGEREF _Toc244199589 \h </w:instrText>
         </w:r>
         <w:r>
           <w:rPr>
@@ -841,7 +841,7 @@
           <w14:ligatures w14:val="standardContextual"/>
         </w:rPr>
       </w:pPr>
-      <w:hyperlink w:anchor="_Toc244091181" w:history="1">
+      <w:hyperlink w:anchor="_Toc244199590" w:history="1">
         <w:r>
           <w:rPr>
             <w:rStyle w:val="Hipervnculo"/>
@@ -868,7 +868,7 @@
             <w:noProof/>
             <w:webHidden/>
           </w:rPr>
-          <w:instrText xml:space="preserve"> PAGEREF _Toc244091181 \h </w:instrText>
+          <w:instrText xml:space="preserve"> PAGEREF _Toc244199590 \h </w:instrText>
         </w:r>
         <w:r>
           <w:rPr>
@@ -911,7 +911,7 @@
           <w14:ligatures w14:val="standardContextual"/>
         </w:rPr>
       </w:pPr>
-      <w:hyperlink w:anchor="_Toc244091182" w:history="1">
+      <w:hyperlink w:anchor="_Toc244199591" w:history="1">
         <w:r>
           <w:rPr>
             <w:rStyle w:val="Hipervnculo"/>
@@ -938,7 +938,7 @@
             <w:noProof/>
             <w:webHidden/>
           </w:rPr>
-          <w:instrText xml:space="preserve"> PAGEREF _Toc244091182 \h </w:instrText>
+          <w:instrText xml:space="preserve"> PAGEREF _Toc244199591 \h </w:instrText>
         </w:r>
         <w:r>
           <w:rPr>
@@ -981,7 +981,7 @@
           <w14:ligatures w14:val="standardContextual"/>
         </w:rPr>
       </w:pPr>
-      <w:hyperlink w:anchor="_Toc244091183" w:history="1">
+      <w:hyperlink w:anchor="_Toc244199592" w:history="1">
         <w:r>
           <w:rPr>
             <w:rStyle w:val="Hipervnculo"/>
@@ -1008,7 +1008,7 @@
             <w:noProof/>
             <w:webHidden/>
           </w:rPr>
-          <w:instrText xml:space="preserve"> PAGEREF _Toc244091183 \h </w:instrText>
+          <w:instrText xml:space="preserve"> PAGEREF _Toc244199592 \h </w:instrText>
         </w:r>
         <w:r>
           <w:rPr>
@@ -1051,7 +1051,7 @@
           <w14:ligatures w14:val="standardContextual"/>
         </w:rPr>
       </w:pPr>
-      <w:hyperlink w:anchor="_Toc244091184" w:history="1">
+      <w:hyperlink w:anchor="_Toc244199593" w:history="1">
         <w:r>
           <w:rPr>
             <w:rStyle w:val="Hipervnculo"/>
@@ -1078,7 +1078,7 @@
             <w:noProof/>
             <w:webHidden/>
           </w:rPr>
-          <w:instrText xml:space="preserve"> PAGEREF _Toc244091184 \h </w:instrText>
+          <w:instrText xml:space="preserve"> PAGEREF _Toc244199593 \h </w:instrText>
         </w:r>
         <w:r>
           <w:rPr>
@@ -1121,7 +1121,7 @@
           <w14:ligatures w14:val="standardContextual"/>
         </w:rPr>
       </w:pPr>
-      <w:hyperlink w:anchor="_Toc244091185" w:history="1">
+      <w:hyperlink w:anchor="_Toc244199594" w:history="1">
         <w:r>
           <w:rPr>
             <w:rStyle w:val="Hipervnculo"/>
@@ -1148,7 +1148,7 @@
             <w:noProof/>
             <w:webHidden/>
           </w:rPr>
-          <w:instrText xml:space="preserve"> PAGEREF _Toc244091185 \h </w:instrText>
+          <w:instrText xml:space="preserve"> PAGEREF _Toc244199594 \h </w:instrText>
         </w:r>
         <w:r>
           <w:rPr>
@@ -1191,7 +1191,7 @@
           <w14:ligatures w14:val="standardContextual"/>
         </w:rPr>
       </w:pPr>
-      <w:hyperlink w:anchor="_Toc244091186" w:history="1">
+      <w:hyperlink w:anchor="_Toc244199595" w:history="1">
         <w:r>
           <w:rPr>
             <w:rStyle w:val="Hipervnculo"/>
@@ -1218,7 +1218,7 @@
             <w:noProof/>
             <w:webHidden/>
           </w:rPr>
-          <w:instrText xml:space="preserve"> PAGEREF _Toc244091186 \h </w:instrText>
+          <w:instrText xml:space="preserve"> PAGEREF _Toc244199595 \h </w:instrText>
         </w:r>
         <w:r>
           <w:rPr>
@@ -1261,7 +1261,7 @@
           <w14:ligatures w14:val="standardContextual"/>
         </w:rPr>
       </w:pPr>
-      <w:hyperlink w:anchor="_Toc244091187" w:history="1">
+      <w:hyperlink w:anchor="_Toc244199596" w:history="1">
         <w:r>
           <w:rPr>
             <w:rStyle w:val="Hipervnculo"/>
@@ -1288,7 +1288,7 @@
             <w:noProof/>
             <w:webHidden/>
           </w:rPr>
-          <w:instrText xml:space="preserve"> PAGEREF _Toc244091187 \h </w:instrText>
+          <w:instrText xml:space="preserve"> PAGEREF _Toc244199596 \h </w:instrText>
         </w:r>
         <w:r>
           <w:rPr>
@@ -1331,7 +1331,7 @@
           <w14:ligatures w14:val="standardContextual"/>
         </w:rPr>
       </w:pPr>
-      <w:hyperlink w:anchor="_Toc244091188" w:history="1">
+      <w:hyperlink w:anchor="_Toc244199597" w:history="1">
         <w:r>
           <w:rPr>
             <w:rStyle w:val="Hipervnculo"/>
@@ -1358,7 +1358,7 @@
             <w:noProof/>
             <w:webHidden/>
           </w:rPr>
-          <w:instrText xml:space="preserve"> PAGEREF _Toc244091188 \h </w:instrText>
+          <w:instrText xml:space="preserve"> PAGEREF _Toc244199597 \h </w:instrText>
         </w:r>
         <w:r>
           <w:rPr>
@@ -1401,7 +1401,7 @@
           <w14:ligatures w14:val="standardContextual"/>
         </w:rPr>
       </w:pPr>
-      <w:hyperlink w:anchor="_Toc244091189" w:history="1">
+      <w:hyperlink w:anchor="_Toc244199598" w:history="1">
         <w:r>
           <w:rPr>
             <w:rStyle w:val="Hipervnculo"/>
@@ -1428,7 +1428,7 @@
             <w:noProof/>
             <w:webHidden/>
           </w:rPr>
-          <w:instrText xml:space="preserve"> PAGEREF _Toc244091189 \h </w:instrText>
+          <w:instrText xml:space="preserve"> PAGEREF _Toc244199598 \h </w:instrText>
         </w:r>
         <w:r>
           <w:rPr>
@@ -1471,7 +1471,7 @@
           <w14:ligatures w14:val="standardContextual"/>
         </w:rPr>
       </w:pPr>
-      <w:hyperlink w:anchor="_Toc244091190" w:history="1">
+      <w:hyperlink w:anchor="_Toc244199599" w:history="1">
         <w:r>
           <w:rPr>
             <w:rStyle w:val="Hipervnculo"/>
@@ -1498,7 +1498,7 @@
             <w:noProof/>
             <w:webHidden/>
           </w:rPr>
-          <w:instrText xml:space="preserve"> PAGEREF _Toc244091190 \h </w:instrText>
+          <w:instrText xml:space="preserve"> PAGEREF _Toc244199599 \h </w:instrText>
         </w:r>
         <w:r>
           <w:rPr>
@@ -1541,7 +1541,7 @@
           <w14:ligatures w14:val="standardContextual"/>
         </w:rPr>
       </w:pPr>
-      <w:hyperlink w:anchor="_Toc244091191" w:history="1">
+      <w:hyperlink w:anchor="_Toc244199600" w:history="1">
         <w:r>
           <w:rPr>
             <w:rStyle w:val="Hipervnculo"/>
@@ -1568,7 +1568,7 @@
             <w:noProof/>
             <w:webHidden/>
           </w:rPr>
-          <w:instrText xml:space="preserve"> PAGEREF _Toc244091191 \h </w:instrText>
+          <w:instrText xml:space="preserve"> PAGEREF _Toc244199600 \h </w:instrText>
         </w:r>
         <w:r>
           <w:rPr>
@@ -1611,7 +1611,7 @@
           <w14:ligatures w14:val="standardContextual"/>
         </w:rPr>
       </w:pPr>
-      <w:hyperlink w:anchor="_Toc244091192" w:history="1">
+      <w:hyperlink w:anchor="_Toc244199601" w:history="1">
         <w:r>
           <w:rPr>
             <w:rStyle w:val="Hipervnculo"/>
@@ -1638,7 +1638,7 @@
             <w:noProof/>
             <w:webHidden/>
           </w:rPr>
-          <w:instrText xml:space="preserve"> PAGEREF _Toc244091192 \h </w:instrText>
+          <w:instrText xml:space="preserve"> PAGEREF _Toc244199601 \h </w:instrText>
         </w:r>
         <w:r>
           <w:rPr>
@@ -1681,7 +1681,7 @@
           <w14:ligatures w14:val="standardContextual"/>
         </w:rPr>
       </w:pPr>
-      <w:hyperlink w:anchor="_Toc244091193" w:history="1">
+      <w:hyperlink w:anchor="_Toc244199602" w:history="1">
         <w:r>
           <w:rPr>
             <w:rStyle w:val="Hipervnculo"/>
@@ -1708,7 +1708,7 @@
             <w:noProof/>
             <w:webHidden/>
           </w:rPr>
-          <w:instrText xml:space="preserve"> PAGEREF _Toc244091193 \h </w:instrText>
+          <w:instrText xml:space="preserve"> PAGEREF _Toc244199602 \h </w:instrText>
         </w:r>
         <w:r>
           <w:rPr>
@@ -1751,7 +1751,7 @@
           <w14:ligatures w14:val="standardContextual"/>
         </w:rPr>
       </w:pPr>
-      <w:hyperlink w:anchor="_Toc244091194" w:history="1">
+      <w:hyperlink w:anchor="_Toc244199603" w:history="1">
         <w:r>
           <w:rPr>
             <w:rStyle w:val="Hipervnculo"/>
@@ -1778,7 +1778,7 @@
             <w:noProof/>
             <w:webHidden/>
           </w:rPr>
-          <w:instrText xml:space="preserve"> PAGEREF _Toc244091194 \h </w:instrText>
+          <w:instrText xml:space="preserve"> PAGEREF _Toc244199603 \h </w:instrText>
         </w:r>
         <w:r>
           <w:rPr>
@@ -1821,7 +1821,7 @@
           <w14:ligatures w14:val="standardContextual"/>
         </w:rPr>
       </w:pPr>
-      <w:hyperlink w:anchor="_Toc244091195" w:history="1">
+      <w:hyperlink w:anchor="_Toc244199604" w:history="1">
         <w:r>
           <w:rPr>
             <w:rStyle w:val="Hipervnculo"/>
@@ -1848,7 +1848,7 @@
             <w:noProof/>
             <w:webHidden/>
           </w:rPr>
-          <w:instrText xml:space="preserve"> PAGEREF _Toc244091195 \h </w:instrText>
+          <w:instrText xml:space="preserve"> PAGEREF _Toc244199604 \h </w:instrText>
         </w:r>
         <w:r>
           <w:rPr>
@@ -1891,7 +1891,7 @@
           <w14:ligatures w14:val="standardContextual"/>
         </w:rPr>
       </w:pPr>
-      <w:hyperlink w:anchor="_Toc244091196" w:history="1">
+      <w:hyperlink w:anchor="_Toc244199605" w:history="1">
         <w:r>
           <w:rPr>
             <w:rStyle w:val="Hipervnculo"/>
@@ -1918,7 +1918,7 @@
             <w:noProof/>
             <w:webHidden/>
           </w:rPr>
-          <w:instrText xml:space="preserve"> PAGEREF _Toc244091196 \h </w:instrText>
+          <w:instrText xml:space="preserve"> PAGEREF _Toc244199605 \h </w:instrText>
         </w:r>
         <w:r>
           <w:rPr>
@@ -1961,7 +1961,7 @@
           <w14:ligatures w14:val="standardContextual"/>
         </w:rPr>
       </w:pPr>
-      <w:hyperlink w:anchor="_Toc244091197" w:history="1">
+      <w:hyperlink w:anchor="_Toc244199606" w:history="1">
         <w:r>
           <w:rPr>
             <w:rStyle w:val="Hipervnculo"/>
@@ -1988,7 +1988,7 @@
             <w:noProof/>
             <w:webHidden/>
           </w:rPr>
-          <w:instrText xml:space="preserve"> PAGEREF _Toc244091197 \h </w:instrText>
+          <w:instrText xml:space="preserve"> PAGEREF _Toc244199606 \h </w:instrText>
         </w:r>
         <w:r>
           <w:rPr>
@@ -2031,7 +2031,7 @@
           <w14:ligatures w14:val="standardContextual"/>
         </w:rPr>
       </w:pPr>
-      <w:hyperlink w:anchor="_Toc244091198" w:history="1">
+      <w:hyperlink w:anchor="_Toc244199607" w:history="1">
         <w:r>
           <w:rPr>
             <w:rStyle w:val="Hipervnculo"/>
@@ -2058,7 +2058,7 @@
             <w:noProof/>
             <w:webHidden/>
           </w:rPr>
-          <w:instrText xml:space="preserve"> PAGEREF _Toc244091198 \h </w:instrText>
+          <w:instrText xml:space="preserve"> PAGEREF _Toc244199607 \h </w:instrText>
         </w:r>
         <w:r>
           <w:rPr>
@@ -2101,7 +2101,7 @@
           <w14:ligatures w14:val="standardContextual"/>
         </w:rPr>
       </w:pPr>
-      <w:hyperlink w:anchor="_Toc244091199" w:history="1">
+      <w:hyperlink w:anchor="_Toc244199608" w:history="1">
         <w:r>
           <w:rPr>
             <w:rStyle w:val="Hipervnculo"/>
@@ -2128,7 +2128,7 @@
             <w:noProof/>
             <w:webHidden/>
           </w:rPr>
-          <w:instrText xml:space="preserve"> PAGEREF _Toc244091199 \h </w:instrText>
+          <w:instrText xml:space="preserve"> PAGEREF _Toc244199608 \h </w:instrText>
         </w:r>
         <w:r>
           <w:rPr>
@@ -2171,7 +2171,7 @@
           <w14:ligatures w14:val="standardContextual"/>
         </w:rPr>
       </w:pPr>
-      <w:hyperlink w:anchor="_Toc244091200" w:history="1">
+      <w:hyperlink w:anchor="_Toc244199609" w:history="1">
         <w:r>
           <w:rPr>
             <w:rStyle w:val="Hipervnculo"/>
@@ -2198,7 +2198,7 @@
             <w:noProof/>
             <w:webHidden/>
           </w:rPr>
-          <w:instrText xml:space="preserve"> PAGEREF _Toc244091200 \h </w:instrText>
+          <w:instrText xml:space="preserve"> PAGEREF _Toc244199609 \h </w:instrText>
         </w:r>
         <w:r>
           <w:rPr>
@@ -2244,7 +2244,7 @@
           <w14:ligatures w14:val="standardContextual"/>
         </w:rPr>
       </w:pPr>
-      <w:hyperlink w:anchor="_Toc244091201" w:history="1">
+      <w:hyperlink w:anchor="_Toc244199610" w:history="1">
         <w:r>
           <w:rPr>
             <w:rStyle w:val="Hipervnculo"/>
@@ -2271,7 +2271,7 @@
             <w:noProof/>
             <w:webHidden/>
           </w:rPr>
-          <w:instrText xml:space="preserve"> PAGEREF _Toc244091201 \h </w:instrText>
+          <w:instrText xml:space="preserve"> PAGEREF _Toc244199610 \h </w:instrText>
         </w:r>
         <w:r>
           <w:rPr>
@@ -2314,7 +2314,7 @@
           <w14:ligatures w14:val="standardContextual"/>
         </w:rPr>
       </w:pPr>
-      <w:hyperlink w:anchor="_Toc244091202" w:history="1">
+      <w:hyperlink w:anchor="_Toc244199611" w:history="1">
         <w:r>
           <w:rPr>
             <w:rStyle w:val="Hipervnculo"/>
@@ -2341,7 +2341,7 @@
             <w:noProof/>
             <w:webHidden/>
           </w:rPr>
-          <w:instrText xml:space="preserve"> PAGEREF _Toc244091202 \h </w:instrText>
+          <w:instrText xml:space="preserve"> PAGEREF _Toc244199611 \h </w:instrText>
         </w:r>
         <w:r>
           <w:rPr>
@@ -2384,7 +2384,7 @@
           <w14:ligatures w14:val="standardContextual"/>
         </w:rPr>
       </w:pPr>
-      <w:hyperlink w:anchor="_Toc244091203" w:history="1">
+      <w:hyperlink w:anchor="_Toc244199612" w:history="1">
         <w:r>
           <w:rPr>
             <w:rStyle w:val="Hipervnculo"/>
@@ -2411,7 +2411,7 @@
             <w:noProof/>
             <w:webHidden/>
           </w:rPr>
-          <w:instrText xml:space="preserve"> PAGEREF _Toc244091203 \h </w:instrText>
+          <w:instrText xml:space="preserve"> PAGEREF _Toc244199612 \h </w:instrText>
         </w:r>
         <w:r>
           <w:rPr>
@@ -2454,7 +2454,7 @@
           <w14:ligatures w14:val="standardContextual"/>
         </w:rPr>
       </w:pPr>
-      <w:hyperlink w:anchor="_Toc244091204" w:history="1">
+      <w:hyperlink w:anchor="_Toc244199613" w:history="1">
         <w:r>
           <w:rPr>
             <w:rStyle w:val="Hipervnculo"/>
@@ -2481,7 +2481,7 @@
             <w:noProof/>
             <w:webHidden/>
           </w:rPr>
-          <w:instrText xml:space="preserve"> PAGEREF _Toc244091204 \h </w:instrText>
+          <w:instrText xml:space="preserve"> PAGEREF _Toc244199613 \h </w:instrText>
         </w:r>
         <w:r>
           <w:rPr>
@@ -2524,7 +2524,7 @@
           <w14:ligatures w14:val="standardContextual"/>
         </w:rPr>
       </w:pPr>
-      <w:hyperlink w:anchor="_Toc244091205" w:history="1">
+      <w:hyperlink w:anchor="_Toc244199614" w:history="1">
         <w:r>
           <w:rPr>
             <w:rStyle w:val="Hipervnculo"/>
@@ -2551,7 +2551,7 @@
             <w:noProof/>
             <w:webHidden/>
           </w:rPr>
-          <w:instrText xml:space="preserve"> PAGEREF _Toc244091205 \h </w:instrText>
+          <w:instrText xml:space="preserve"> PAGEREF _Toc244199614 \h </w:instrText>
         </w:r>
         <w:r>
           <w:rPr>
@@ -2594,7 +2594,7 @@
           <w14:ligatures w14:val="standardContextual"/>
         </w:rPr>
       </w:pPr>
-      <w:hyperlink w:anchor="_Toc244091206" w:history="1">
+      <w:hyperlink w:anchor="_Toc244199615" w:history="1">
         <w:r>
           <w:rPr>
             <w:rStyle w:val="Hipervnculo"/>
@@ -2621,7 +2621,7 @@
             <w:noProof/>
             <w:webHidden/>
           </w:rPr>
-          <w:instrText xml:space="preserve"> PAGEREF _Toc244091206 \h </w:instrText>
+          <w:instrText xml:space="preserve"> PAGEREF _Toc244199615 \h </w:instrText>
         </w:r>
         <w:r>
           <w:rPr>
@@ -2667,7 +2667,7 @@
           <w14:ligatures w14:val="standardContextual"/>
         </w:rPr>
       </w:pPr>
-      <w:hyperlink w:anchor="_Toc244091207" w:history="1">
+      <w:hyperlink w:anchor="_Toc244199616" w:history="1">
         <w:r>
           <w:rPr>
             <w:rStyle w:val="Hipervnculo"/>
@@ -2694,7 +2694,7 @@
             <w:noProof/>
             <w:webHidden/>
           </w:rPr>
-          <w:instrText xml:space="preserve"> PAGEREF _Toc244091207 \h </w:instrText>
+          <w:instrText xml:space="preserve"> PAGEREF _Toc244199616 \h </w:instrText>
         </w:r>
         <w:r>
           <w:rPr>
@@ -2737,7 +2737,7 @@
           <w14:ligatures w14:val="standardContextual"/>
         </w:rPr>
       </w:pPr>
-      <w:hyperlink w:anchor="_Toc244091208" w:history="1">
+      <w:hyperlink w:anchor="_Toc244199617" w:history="1">
         <w:r>
           <w:rPr>
             <w:rStyle w:val="Hipervnculo"/>
@@ -2764,7 +2764,7 @@
             <w:noProof/>
             <w:webHidden/>
           </w:rPr>
-          <w:instrText xml:space="preserve"> PAGEREF _Toc244091208 \h </w:instrText>
+          <w:instrText xml:space="preserve"> PAGEREF _Toc244199617 \h </w:instrText>
         </w:r>
         <w:r>
           <w:rPr>
@@ -2807,7 +2807,7 @@
           <w14:ligatures w14:val="standardContextual"/>
         </w:rPr>
       </w:pPr>
-      <w:hyperlink w:anchor="_Toc244091209" w:history="1">
+      <w:hyperlink w:anchor="_Toc244199618" w:history="1">
         <w:r>
           <w:rPr>
             <w:rStyle w:val="Hipervnculo"/>
@@ -2834,7 +2834,7 @@
             <w:noProof/>
             <w:webHidden/>
           </w:rPr>
-          <w:instrText xml:space="preserve"> PAGEREF _Toc244091209 \h </w:instrText>
+          <w:instrText xml:space="preserve"> PAGEREF _Toc244199618 \h </w:instrText>
         </w:r>
         <w:r>
           <w:rPr>
@@ -2877,7 +2877,7 @@
           <w14:ligatures w14:val="standardContextual"/>
         </w:rPr>
       </w:pPr>
-      <w:hyperlink w:anchor="_Toc244091210" w:history="1">
+      <w:hyperlink w:anchor="_Toc244199619" w:history="1">
         <w:r>
           <w:rPr>
             <w:rStyle w:val="Hipervnculo"/>
@@ -2904,7 +2904,7 @@
             <w:noProof/>
             <w:webHidden/>
           </w:rPr>
-          <w:instrText xml:space="preserve"> PAGEREF _Toc244091210 \h </w:instrText>
+          <w:instrText xml:space="preserve"> PAGEREF _Toc244199619 \h </w:instrText>
         </w:r>
         <w:r>
           <w:rPr>
@@ -2947,7 +2947,7 @@
           <w14:ligatures w14:val="standardContextual"/>
         </w:rPr>
       </w:pPr>
-      <w:hyperlink w:anchor="_Toc244091211" w:history="1">
+      <w:hyperlink w:anchor="_Toc244199620" w:history="1">
         <w:r>
           <w:rPr>
             <w:rStyle w:val="Hipervnculo"/>
@@ -2974,7 +2974,7 @@
             <w:noProof/>
             <w:webHidden/>
           </w:rPr>
-          <w:instrText xml:space="preserve"> PAGEREF _Toc244091211 \h </w:instrText>
+          <w:instrText xml:space="preserve"> PAGEREF _Toc244199620 \h </w:instrText>
         </w:r>
         <w:r>
           <w:rPr>
@@ -3017,7 +3017,7 @@
           <w14:ligatures w14:val="standardContextual"/>
         </w:rPr>
       </w:pPr>
-      <w:hyperlink w:anchor="_Toc244091212" w:history="1">
+      <w:hyperlink w:anchor="_Toc244199621" w:history="1">
         <w:r>
           <w:rPr>
             <w:rStyle w:val="Hipervnculo"/>
@@ -3044,7 +3044,7 @@
             <w:noProof/>
             <w:webHidden/>
           </w:rPr>
-          <w:instrText xml:space="preserve"> PAGEREF _Toc244091212 \h </w:instrText>
+          <w:instrText xml:space="preserve"> PAGEREF _Toc244199621 \h </w:instrText>
         </w:r>
         <w:r>
           <w:rPr>
@@ -3087,7 +3087,7 @@
           <w14:ligatures w14:val="standardContextual"/>
         </w:rPr>
       </w:pPr>
-      <w:hyperlink w:anchor="_Toc244091213" w:history="1">
+      <w:hyperlink w:anchor="_Toc244199622" w:history="1">
         <w:r>
           <w:rPr>
             <w:rStyle w:val="Hipervnculo"/>
@@ -3114,7 +3114,7 @@
             <w:noProof/>
             <w:webHidden/>
           </w:rPr>
-          <w:instrText xml:space="preserve"> PAGEREF _Toc244091213 \h </w:instrText>
+          <w:instrText xml:space="preserve"> PAGEREF _Toc244199622 \h </w:instrText>
         </w:r>
         <w:r>
           <w:rPr>
@@ -3157,7 +3157,7 @@
           <w14:ligatures w14:val="standardContextual"/>
         </w:rPr>
       </w:pPr>
-      <w:hyperlink w:anchor="_Toc244091214" w:history="1">
+      <w:hyperlink w:anchor="_Toc244199623" w:history="1">
         <w:r>
           <w:rPr>
             <w:rStyle w:val="Hipervnculo"/>
@@ -3184,7 +3184,7 @@
             <w:noProof/>
             <w:webHidden/>
           </w:rPr>
-          <w:instrText xml:space="preserve"> PAGEREF _Toc244091214 \h </w:instrText>
+          <w:instrText xml:space="preserve"> PAGEREF _Toc244199623 \h </w:instrText>
         </w:r>
         <w:r>
           <w:rPr>
@@ -3227,7 +3227,7 @@
           <w14:ligatures w14:val="standardContextual"/>
         </w:rPr>
       </w:pPr>
-      <w:hyperlink w:anchor="_Toc244091215" w:history="1">
+      <w:hyperlink w:anchor="_Toc244199624" w:history="1">
         <w:r>
           <w:rPr>
             <w:rStyle w:val="Hipervnculo"/>
@@ -3254,7 +3254,7 @@
             <w:noProof/>
             <w:webHidden/>
           </w:rPr>
-          <w:instrText xml:space="preserve"> PAGEREF _Toc244091215 \h </w:instrText>
+          <w:instrText xml:space="preserve"> PAGEREF _Toc244199624 \h </w:instrText>
         </w:r>
         <w:r>
           <w:rPr>
@@ -3297,7 +3297,7 @@
           <w14:ligatures w14:val="standardContextual"/>
         </w:rPr>
       </w:pPr>
-      <w:hyperlink w:anchor="_Toc244091216" w:history="1">
+      <w:hyperlink w:anchor="_Toc244199625" w:history="1">
         <w:r>
           <w:rPr>
             <w:rStyle w:val="Hipervnculo"/>
@@ -3324,7 +3324,7 @@
             <w:noProof/>
             <w:webHidden/>
           </w:rPr>
-          <w:instrText xml:space="preserve"> PAGEREF _Toc244091216 \h </w:instrText>
+          <w:instrText xml:space="preserve"> PAGEREF _Toc244199625 \h </w:instrText>
         </w:r>
         <w:r>
           <w:rPr>
@@ -3367,7 +3367,7 @@
           <w14:ligatures w14:val="standardContextual"/>
         </w:rPr>
       </w:pPr>
-      <w:hyperlink w:anchor="_Toc244091217" w:history="1">
+      <w:hyperlink w:anchor="_Toc244199626" w:history="1">
         <w:r>
           <w:rPr>
             <w:rStyle w:val="Hipervnculo"/>
@@ -3394,7 +3394,7 @@
             <w:noProof/>
             <w:webHidden/>
           </w:rPr>
-          <w:instrText xml:space="preserve"> PAGEREF _Toc244091217 \h </w:instrText>
+          <w:instrText xml:space="preserve"> PAGEREF _Toc244199626 \h </w:instrText>
         </w:r>
         <w:r>
           <w:rPr>
@@ -3437,7 +3437,7 @@
           <w14:ligatures w14:val="standardContextual"/>
         </w:rPr>
       </w:pPr>
-      <w:hyperlink w:anchor="_Toc244091218" w:history="1">
+      <w:hyperlink w:anchor="_Toc244199627" w:history="1">
         <w:r>
           <w:rPr>
             <w:rStyle w:val="Hipervnculo"/>
@@ -3464,7 +3464,7 @@
             <w:noProof/>
             <w:webHidden/>
           </w:rPr>
-          <w:instrText xml:space="preserve"> PAGEREF _Toc244091218 \h </w:instrText>
+          <w:instrText xml:space="preserve"> PAGEREF _Toc244199627 \h </w:instrText>
         </w:r>
         <w:r>
           <w:rPr>
@@ -3507,7 +3507,7 @@
           <w14:ligatures w14:val="standardContextual"/>
         </w:rPr>
       </w:pPr>
-      <w:hyperlink w:anchor="_Toc244091219" w:history="1">
+      <w:hyperlink w:anchor="_Toc244199628" w:history="1">
         <w:r>
           <w:rPr>
             <w:rStyle w:val="Hipervnculo"/>
@@ -3534,7 +3534,7 @@
             <w:noProof/>
             <w:webHidden/>
           </w:rPr>
-          <w:instrText xml:space="preserve"> PAGEREF _Toc244091219 \h </w:instrText>
+          <w:instrText xml:space="preserve"> PAGEREF _Toc244199628 \h </w:instrText>
         </w:r>
         <w:r>
           <w:rPr>
@@ -3580,7 +3580,7 @@
           <w14:ligatures w14:val="standardContextual"/>
         </w:rPr>
       </w:pPr>
-      <w:hyperlink w:anchor="_Toc244091220" w:history="1">
+      <w:hyperlink w:anchor="_Toc244199629" w:history="1">
         <w:r>
           <w:rPr>
             <w:rStyle w:val="Hipervnculo"/>
@@ -3607,7 +3607,7 @@
             <w:noProof/>
             <w:webHidden/>
           </w:rPr>
-          <w:instrText xml:space="preserve"> PAGEREF _Toc244091220 \h </w:instrText>
+          <w:instrText xml:space="preserve"> PAGEREF _Toc244199629 \h </w:instrText>
         </w:r>
         <w:r>
           <w:rPr>
@@ -3650,7 +3650,7 @@
           <w14:ligatures w14:val="standardContextual"/>
         </w:rPr>
       </w:pPr>
-      <w:hyperlink w:anchor="_Toc244091221" w:history="1">
+      <w:hyperlink w:anchor="_Toc244199630" w:history="1">
         <w:r>
           <w:rPr>
             <w:rStyle w:val="Hipervnculo"/>
@@ -3677,7 +3677,7 @@
             <w:noProof/>
             <w:webHidden/>
           </w:rPr>
-          <w:instrText xml:space="preserve"> PAGEREF _Toc244091221 \h </w:instrText>
+          <w:instrText xml:space="preserve"> PAGEREF _Toc244199630 \h </w:instrText>
         </w:r>
         <w:r>
           <w:rPr>
@@ -3720,7 +3720,7 @@
           <w14:ligatures w14:val="standardContextual"/>
         </w:rPr>
       </w:pPr>
-      <w:hyperlink w:anchor="_Toc244091222" w:history="1">
+      <w:hyperlink w:anchor="_Toc244199631" w:history="1">
         <w:r>
           <w:rPr>
             <w:rStyle w:val="Hipervnculo"/>
@@ -3747,7 +3747,7 @@
             <w:noProof/>
             <w:webHidden/>
           </w:rPr>
-          <w:instrText xml:space="preserve"> PAGEREF _Toc244091222 \h </w:instrText>
+          <w:instrText xml:space="preserve"> PAGEREF _Toc244199631 \h </w:instrText>
         </w:r>
         <w:r>
           <w:rPr>
@@ -3790,7 +3790,7 @@
           <w14:ligatures w14:val="standardContextual"/>
         </w:rPr>
       </w:pPr>
-      <w:hyperlink w:anchor="_Toc244091223" w:history="1">
+      <w:hyperlink w:anchor="_Toc244199632" w:history="1">
         <w:r>
           <w:rPr>
             <w:rStyle w:val="Hipervnculo"/>
@@ -3817,7 +3817,7 @@
             <w:noProof/>
             <w:webHidden/>
           </w:rPr>
-          <w:instrText xml:space="preserve"> PAGEREF _Toc244091223 \h </w:instrText>
+          <w:instrText xml:space="preserve"> PAGEREF _Toc244199632 \h </w:instrText>
         </w:r>
         <w:r>
           <w:rPr>
@@ -3860,7 +3860,7 @@
           <w14:ligatures w14:val="standardContextual"/>
         </w:rPr>
       </w:pPr>
-      <w:hyperlink w:anchor="_Toc244091224" w:history="1">
+      <w:hyperlink w:anchor="_Toc244199633" w:history="1">
         <w:r>
           <w:rPr>
             <w:rStyle w:val="Hipervnculo"/>
@@ -3887,7 +3887,7 @@
             <w:noProof/>
             <w:webHidden/>
           </w:rPr>
-          <w:instrText xml:space="preserve"> PAGEREF _Toc244091224 \h </w:instrText>
+          <w:instrText xml:space="preserve"> PAGEREF _Toc244199633 \h </w:instrText>
         </w:r>
         <w:r>
           <w:rPr>
@@ -3930,7 +3930,7 @@
           <w14:ligatures w14:val="standardContextual"/>
         </w:rPr>
       </w:pPr>
-      <w:hyperlink w:anchor="_Toc244091225" w:history="1">
+      <w:hyperlink w:anchor="_Toc244199634" w:history="1">
         <w:r>
           <w:rPr>
             <w:rStyle w:val="Hipervnculo"/>
@@ -3957,7 +3957,7 @@
             <w:noProof/>
             <w:webHidden/>
           </w:rPr>
-          <w:instrText xml:space="preserve"> PAGEREF _Toc244091225 \h </w:instrText>
+          <w:instrText xml:space="preserve"> PAGEREF _Toc244199634 \h </w:instrText>
         </w:r>
         <w:r>
           <w:rPr>
@@ -4000,7 +4000,7 @@
           <w14:ligatures w14:val="standardContextual"/>
         </w:rPr>
       </w:pPr>
-      <w:hyperlink w:anchor="_Toc244091226" w:history="1">
+      <w:hyperlink w:anchor="_Toc244199635" w:history="1">
         <w:r>
           <w:rPr>
             <w:rStyle w:val="Hipervnculo"/>
@@ -4027,7 +4027,7 @@
             <w:noProof/>
             <w:webHidden/>
           </w:rPr>
-          <w:instrText xml:space="preserve"> PAGEREF _Toc244091226 \h </w:instrText>
+          <w:instrText xml:space="preserve"> PAGEREF _Toc244199635 \h </w:instrText>
         </w:r>
         <w:r>
           <w:rPr>
@@ -4073,7 +4073,7 @@
           <w14:ligatures w14:val="standardContextual"/>
         </w:rPr>
       </w:pPr>
-      <w:hyperlink w:anchor="_Toc244091227" w:history="1">
+      <w:hyperlink w:anchor="_Toc244199636" w:history="1">
         <w:r>
           <w:rPr>
             <w:rStyle w:val="Hipervnculo"/>
@@ -4100,7 +4100,7 @@
             <w:noProof/>
             <w:webHidden/>
           </w:rPr>
-          <w:instrText xml:space="preserve"> PAGEREF _Toc244091227 \h </w:instrText>
+          <w:instrText xml:space="preserve"> PAGEREF _Toc244199636 \h </w:instrText>
         </w:r>
         <w:r>
           <w:rPr>
@@ -4143,7 +4143,7 @@
           <w14:ligatures w14:val="standardContextual"/>
         </w:rPr>
       </w:pPr>
-      <w:hyperlink w:anchor="_Toc244091228" w:history="1">
+      <w:hyperlink w:anchor="_Toc244199637" w:history="1">
         <w:r>
           <w:rPr>
             <w:rStyle w:val="Hipervnculo"/>
@@ -4170,7 +4170,7 @@
             <w:noProof/>
             <w:webHidden/>
           </w:rPr>
-          <w:instrText xml:space="preserve"> PAGEREF _Toc244091228 \h </w:instrText>
+          <w:instrText xml:space="preserve"> PAGEREF _Toc244199637 \h </w:instrText>
         </w:r>
         <w:r>
           <w:rPr>
@@ -4213,7 +4213,7 @@
           <w14:ligatures w14:val="standardContextual"/>
         </w:rPr>
       </w:pPr>
-      <w:hyperlink w:anchor="_Toc244091229" w:history="1">
+      <w:hyperlink w:anchor="_Toc244199638" w:history="1">
         <w:r>
           <w:rPr>
             <w:rStyle w:val="Hipervnculo"/>
@@ -4240,7 +4240,7 @@
             <w:noProof/>
             <w:webHidden/>
           </w:rPr>
-          <w:instrText xml:space="preserve"> PAGEREF _Toc244091229 \h </w:instrText>
+          <w:instrText xml:space="preserve"> PAGEREF _Toc244199638 \h </w:instrText>
         </w:r>
         <w:r>
           <w:rPr>
@@ -4283,7 +4283,7 @@
           <w14:ligatures w14:val="standardContextual"/>
         </w:rPr>
       </w:pPr>
-      <w:hyperlink w:anchor="_Toc244091230" w:history="1">
+      <w:hyperlink w:anchor="_Toc244199639" w:history="1">
         <w:r>
           <w:rPr>
             <w:rStyle w:val="Hipervnculo"/>
@@ -4310,7 +4310,7 @@
             <w:noProof/>
             <w:webHidden/>
           </w:rPr>
-          <w:instrText xml:space="preserve"> PAGEREF _Toc244091230 \h </w:instrText>
+          <w:instrText xml:space="preserve"> PAGEREF _Toc244199639 \h </w:instrText>
         </w:r>
         <w:r>
           <w:rPr>
@@ -4353,7 +4353,7 @@
           <w14:ligatures w14:val="standardContextual"/>
         </w:rPr>
       </w:pPr>
-      <w:hyperlink w:anchor="_Toc244091231" w:history="1">
+      <w:hyperlink w:anchor="_Toc244199640" w:history="1">
         <w:r>
           <w:rPr>
             <w:rStyle w:val="Hipervnculo"/>
@@ -4380,7 +4380,7 @@
             <w:noProof/>
             <w:webHidden/>
           </w:rPr>
-          <w:instrText xml:space="preserve"> PAGEREF _Toc244091231 \h </w:instrText>
+          <w:instrText xml:space="preserve"> PAGEREF _Toc244199640 \h </w:instrText>
         </w:r>
         <w:r>
           <w:rPr>
@@ -4423,7 +4423,7 @@
           <w14:ligatures w14:val="standardContextual"/>
         </w:rPr>
       </w:pPr>
-      <w:hyperlink w:anchor="_Toc244091232" w:history="1">
+      <w:hyperlink w:anchor="_Toc244199641" w:history="1">
         <w:r>
           <w:rPr>
             <w:rStyle w:val="Hipervnculo"/>
@@ -4450,7 +4450,7 @@
             <w:noProof/>
             <w:webHidden/>
           </w:rPr>
-          <w:instrText xml:space="preserve"> PAGEREF _Toc244091232 \h </w:instrText>
+          <w:instrText xml:space="preserve"> PAGEREF _Toc244199641 \h </w:instrText>
         </w:r>
         <w:r>
           <w:rPr>
@@ -4493,7 +4493,7 @@
           <w14:ligatures w14:val="standardContextual"/>
         </w:rPr>
       </w:pPr>
-      <w:hyperlink w:anchor="_Toc244091233" w:history="1">
+      <w:hyperlink w:anchor="_Toc244199642" w:history="1">
         <w:r>
           <w:rPr>
             <w:rStyle w:val="Hipervnculo"/>
@@ -4520,7 +4520,7 @@
             <w:noProof/>
             <w:webHidden/>
           </w:rPr>
-          <w:instrText xml:space="preserve"> PAGEREF _Toc244091233 \h </w:instrText>
+          <w:instrText xml:space="preserve"> PAGEREF _Toc244199642 \h </w:instrText>
         </w:r>
         <w:r>
           <w:rPr>
@@ -4563,7 +4563,7 @@
           <w14:ligatures w14:val="standardContextual"/>
         </w:rPr>
       </w:pPr>
-      <w:hyperlink w:anchor="_Toc244091234" w:history="1">
+      <w:hyperlink w:anchor="_Toc244199643" w:history="1">
         <w:r>
           <w:rPr>
             <w:rStyle w:val="Hipervnculo"/>
@@ -4590,7 +4590,7 @@
             <w:noProof/>
             <w:webHidden/>
           </w:rPr>
-          <w:instrText xml:space="preserve"> PAGEREF _Toc244091234 \h </w:instrText>
+          <w:instrText xml:space="preserve"> PAGEREF _Toc244199643 \h </w:instrText>
         </w:r>
         <w:r>
           <w:rPr>
@@ -4633,7 +4633,7 @@
           <w14:ligatures w14:val="standardContextual"/>
         </w:rPr>
       </w:pPr>
-      <w:hyperlink w:anchor="_Toc244091235" w:history="1">
+      <w:hyperlink w:anchor="_Toc244199644" w:history="1">
         <w:r>
           <w:rPr>
             <w:rStyle w:val="Hipervnculo"/>
@@ -4660,7 +4660,7 @@
             <w:noProof/>
             <w:webHidden/>
           </w:rPr>
-          <w:instrText xml:space="preserve"> PAGEREF _Toc244091235 \h </w:instrText>
+          <w:instrText xml:space="preserve"> PAGEREF _Toc244199644 \h </w:instrText>
         </w:r>
         <w:r>
           <w:rPr>
@@ -4703,7 +4703,7 @@
           <w14:ligatures w14:val="standardContextual"/>
         </w:rPr>
       </w:pPr>
-      <w:hyperlink w:anchor="_Toc244091236" w:history="1">
+      <w:hyperlink w:anchor="_Toc244199645" w:history="1">
         <w:r>
           <w:rPr>
             <w:rStyle w:val="Hipervnculo"/>
@@ -4730,7 +4730,7 @@
             <w:noProof/>
             <w:webHidden/>
           </w:rPr>
-          <w:instrText xml:space="preserve"> PAGEREF _Toc244091236 \h </w:instrText>
+          <w:instrText xml:space="preserve"> PAGEREF _Toc244199645 \h </w:instrText>
         </w:r>
         <w:r>
           <w:rPr>
@@ -4773,7 +4773,7 @@
           <w14:ligatures w14:val="standardContextual"/>
         </w:rPr>
       </w:pPr>
-      <w:hyperlink w:anchor="_Toc244091237" w:history="1">
+      <w:hyperlink w:anchor="_Toc244199646" w:history="1">
         <w:r>
           <w:rPr>
             <w:rStyle w:val="Hipervnculo"/>
@@ -4800,7 +4800,7 @@
             <w:noProof/>
             <w:webHidden/>
           </w:rPr>
-          <w:instrText xml:space="preserve"> PAGEREF _Toc244091237 \h </w:instrText>
+          <w:instrText xml:space="preserve"> PAGEREF _Toc244199646 \h </w:instrText>
         </w:r>
         <w:r>
           <w:rPr>
@@ -4843,7 +4843,7 @@
           <w14:ligatures w14:val="standardContextual"/>
         </w:rPr>
       </w:pPr>
-      <w:hyperlink w:anchor="_Toc244091238" w:history="1">
+      <w:hyperlink w:anchor="_Toc244199647" w:history="1">
         <w:r>
           <w:rPr>
             <w:rStyle w:val="Hipervnculo"/>
@@ -4870,7 +4870,7 @@
             <w:noProof/>
             <w:webHidden/>
           </w:rPr>
-          <w:instrText xml:space="preserve"> PAGEREF _Toc244091238 \h </w:instrText>
+          <w:instrText xml:space="preserve"> PAGEREF _Toc244199647 \h </w:instrText>
         </w:r>
         <w:r>
           <w:rPr>
@@ -4913,7 +4913,7 @@
           <w14:ligatures w14:val="standardContextual"/>
         </w:rPr>
       </w:pPr>
-      <w:hyperlink w:anchor="_Toc244091239" w:history="1">
+      <w:hyperlink w:anchor="_Toc244199648" w:history="1">
         <w:r>
           <w:rPr>
             <w:rStyle w:val="Hipervnculo"/>
@@ -4940,7 +4940,7 @@
             <w:noProof/>
             <w:webHidden/>
           </w:rPr>
-          <w:instrText xml:space="preserve"> PAGEREF _Toc244091239 \h </w:instrText>
+          <w:instrText xml:space="preserve"> PAGEREF _Toc244199648 \h </w:instrText>
         </w:r>
         <w:r>
           <w:rPr>
@@ -4983,7 +4983,7 @@
           <w14:ligatures w14:val="standardContextual"/>
         </w:rPr>
       </w:pPr>
-      <w:hyperlink w:anchor="_Toc244091240" w:history="1">
+      <w:hyperlink w:anchor="_Toc244199649" w:history="1">
         <w:r>
           <w:rPr>
             <w:rStyle w:val="Hipervnculo"/>
@@ -5010,7 +5010,7 @@
             <w:noProof/>
             <w:webHidden/>
           </w:rPr>
-          <w:instrText xml:space="preserve"> PAGEREF _Toc244091240 \h </w:instrText>
+          <w:instrText xml:space="preserve"> PAGEREF _Toc244199649 \h </w:instrText>
         </w:r>
         <w:r>
           <w:rPr>
@@ -5053,7 +5053,7 @@
           <w14:ligatures w14:val="standardContextual"/>
         </w:rPr>
       </w:pPr>
-      <w:hyperlink w:anchor="_Toc244091241" w:history="1">
+      <w:hyperlink w:anchor="_Toc244199650" w:history="1">
         <w:r>
           <w:rPr>
             <w:rStyle w:val="Hipervnculo"/>
@@ -5080,7 +5080,7 @@
             <w:noProof/>
             <w:webHidden/>
           </w:rPr>
-          <w:instrText xml:space="preserve"> PAGEREF _Toc244091241 \h </w:instrText>
+          <w:instrText xml:space="preserve"> PAGEREF _Toc244199650 \h </w:instrText>
         </w:r>
         <w:r>
           <w:rPr>
@@ -5100,7 +5100,7 @@
             <w:noProof/>
             <w:webHidden/>
           </w:rPr>
-          <w:t>44</w:t>
+          <w:t>45</w:t>
         </w:r>
         <w:r>
           <w:rPr>
@@ -5123,7 +5123,7 @@
           <w14:ligatures w14:val="standardContextual"/>
         </w:rPr>
       </w:pPr>
-      <w:hyperlink w:anchor="_Toc244091242" w:history="1">
+      <w:hyperlink w:anchor="_Toc244199651" w:history="1">
         <w:r>
           <w:rPr>
             <w:rStyle w:val="Hipervnculo"/>
@@ -5150,7 +5150,7 @@
             <w:noProof/>
             <w:webHidden/>
           </w:rPr>
-          <w:instrText xml:space="preserve"> PAGEREF _Toc244091242 \h </w:instrText>
+          <w:instrText xml:space="preserve"> PAGEREF _Toc244199651 \h </w:instrText>
         </w:r>
         <w:r>
           <w:rPr>
@@ -5193,7 +5193,7 @@
           <w14:ligatures w14:val="standardContextual"/>
         </w:rPr>
       </w:pPr>
-      <w:hyperlink w:anchor="_Toc244091243" w:history="1">
+      <w:hyperlink w:anchor="_Toc244199652" w:history="1">
         <w:r>
           <w:rPr>
             <w:rStyle w:val="Hipervnculo"/>
@@ -5220,7 +5220,7 @@
             <w:noProof/>
             <w:webHidden/>
           </w:rPr>
-          <w:instrText xml:space="preserve"> PAGEREF _Toc244091243 \h </w:instrText>
+          <w:instrText xml:space="preserve"> PAGEREF _Toc244199652 \h </w:instrText>
         </w:r>
         <w:r>
           <w:rPr>
@@ -5263,7 +5263,7 @@
           <w14:ligatures w14:val="standardContextual"/>
         </w:rPr>
       </w:pPr>
-      <w:hyperlink w:anchor="_Toc244091244" w:history="1">
+      <w:hyperlink w:anchor="_Toc244199653" w:history="1">
         <w:r>
           <w:rPr>
             <w:rStyle w:val="Hipervnculo"/>
@@ -5290,7 +5290,7 @@
             <w:noProof/>
             <w:webHidden/>
           </w:rPr>
-          <w:instrText xml:space="preserve"> PAGEREF _Toc244091244 \h </w:instrText>
+          <w:instrText xml:space="preserve"> PAGEREF _Toc244199653 \h </w:instrText>
         </w:r>
         <w:r>
           <w:rPr>
@@ -5333,7 +5333,7 @@
           <w14:ligatures w14:val="standardContextual"/>
         </w:rPr>
       </w:pPr>
-      <w:hyperlink w:anchor="_Toc244091245" w:history="1">
+      <w:hyperlink w:anchor="_Toc244199654" w:history="1">
         <w:r>
           <w:rPr>
             <w:rStyle w:val="Hipervnculo"/>
@@ -5360,7 +5360,7 @@
             <w:noProof/>
             <w:webHidden/>
           </w:rPr>
-          <w:instrText xml:space="preserve"> PAGEREF _Toc244091245 \h </w:instrText>
+          <w:instrText xml:space="preserve"> PAGEREF _Toc244199654 \h </w:instrText>
         </w:r>
         <w:r>
           <w:rPr>
@@ -5380,7 +5380,7 @@
             <w:noProof/>
             <w:webHidden/>
           </w:rPr>
-          <w:t>47</w:t>
+          <w:t>48</w:t>
         </w:r>
         <w:r>
           <w:rPr>
@@ -5403,7 +5403,7 @@
           <w14:ligatures w14:val="standardContextual"/>
         </w:rPr>
       </w:pPr>
-      <w:hyperlink w:anchor="_Toc244091246" w:history="1">
+      <w:hyperlink w:anchor="_Toc244199655" w:history="1">
         <w:r>
           <w:rPr>
             <w:rStyle w:val="Hipervnculo"/>
@@ -5430,7 +5430,7 @@
             <w:noProof/>
             <w:webHidden/>
           </w:rPr>
-          <w:instrText xml:space="preserve"> PAGEREF _Toc244091246 \h </w:instrText>
+          <w:instrText xml:space="preserve"> PAGEREF _Toc244199655 \h </w:instrText>
         </w:r>
         <w:r>
           <w:rPr>
@@ -5476,7 +5476,7 @@
           <w14:ligatures w14:val="standardContextual"/>
         </w:rPr>
       </w:pPr>
-      <w:hyperlink w:anchor="_Toc244091247" w:history="1">
+      <w:hyperlink w:anchor="_Toc244199656" w:history="1">
         <w:r>
           <w:rPr>
             <w:rStyle w:val="Hipervnculo"/>
@@ -5503,7 +5503,7 @@
             <w:noProof/>
             <w:webHidden/>
           </w:rPr>
-          <w:instrText xml:space="preserve"> PAGEREF _Toc244091247 \h </w:instrText>
+          <w:instrText xml:space="preserve"> PAGEREF _Toc244199656 \h </w:instrText>
         </w:r>
         <w:r>
           <w:rPr>
@@ -5546,7 +5546,7 @@
           <w14:ligatures w14:val="standardContextual"/>
         </w:rPr>
       </w:pPr>
-      <w:hyperlink w:anchor="_Toc244091248" w:history="1">
+      <w:hyperlink w:anchor="_Toc244199657" w:history="1">
         <w:r>
           <w:rPr>
             <w:rStyle w:val="Hipervnculo"/>
@@ -5573,7 +5573,7 @@
             <w:noProof/>
             <w:webHidden/>
           </w:rPr>
-          <w:instrText xml:space="preserve"> PAGEREF _Toc244091248 \h </w:instrText>
+          <w:instrText xml:space="preserve"> PAGEREF _Toc244199657 \h </w:instrText>
         </w:r>
         <w:r>
           <w:rPr>
@@ -5616,7 +5616,7 @@
           <w14:ligatures w14:val="standardContextual"/>
         </w:rPr>
       </w:pPr>
-      <w:hyperlink w:anchor="_Toc244091249" w:history="1">
+      <w:hyperlink w:anchor="_Toc244199658" w:history="1">
         <w:r>
           <w:rPr>
             <w:rStyle w:val="Hipervnculo"/>
@@ -5643,7 +5643,7 @@
             <w:noProof/>
             <w:webHidden/>
           </w:rPr>
-          <w:instrText xml:space="preserve"> PAGEREF _Toc244091249 \h </w:instrText>
+          <w:instrText xml:space="preserve"> PAGEREF _Toc244199658 \h </w:instrText>
         </w:r>
         <w:r>
           <w:rPr>
@@ -5686,7 +5686,7 @@
           <w14:ligatures w14:val="standardContextual"/>
         </w:rPr>
       </w:pPr>
-      <w:hyperlink w:anchor="_Toc244091250" w:history="1">
+      <w:hyperlink w:anchor="_Toc244199659" w:history="1">
         <w:r>
           <w:rPr>
             <w:rStyle w:val="Hipervnculo"/>
@@ -5713,7 +5713,7 @@
             <w:noProof/>
             <w:webHidden/>
           </w:rPr>
-          <w:instrText xml:space="preserve"> PAGEREF _Toc244091250 \h </w:instrText>
+          <w:instrText xml:space="preserve"> PAGEREF _Toc244199659 \h </w:instrText>
         </w:r>
         <w:r>
           <w:rPr>
@@ -5756,7 +5756,7 @@
           <w14:ligatures w14:val="standardContextual"/>
         </w:rPr>
       </w:pPr>
-      <w:hyperlink w:anchor="_Toc244091251" w:history="1">
+      <w:hyperlink w:anchor="_Toc244199660" w:history="1">
         <w:r>
           <w:rPr>
             <w:rStyle w:val="Hipervnculo"/>
@@ -5783,7 +5783,7 @@
             <w:noProof/>
             <w:webHidden/>
           </w:rPr>
-          <w:instrText xml:space="preserve"> PAGEREF _Toc244091251 \h </w:instrText>
+          <w:instrText xml:space="preserve"> PAGEREF _Toc244199660 \h </w:instrText>
         </w:r>
         <w:r>
           <w:rPr>
@@ -5826,7 +5826,7 @@
           <w14:ligatures w14:val="standardContextual"/>
         </w:rPr>
       </w:pPr>
-      <w:hyperlink w:anchor="_Toc244091252" w:history="1">
+      <w:hyperlink w:anchor="_Toc244199661" w:history="1">
         <w:r>
           <w:rPr>
             <w:rStyle w:val="Hipervnculo"/>
@@ -5853,7 +5853,7 @@
             <w:noProof/>
             <w:webHidden/>
           </w:rPr>
-          <w:instrText xml:space="preserve"> PAGEREF _Toc244091252 \h </w:instrText>
+          <w:instrText xml:space="preserve"> PAGEREF _Toc244199661 \h </w:instrText>
         </w:r>
         <w:r>
           <w:rPr>
@@ -5896,7 +5896,7 @@
           <w14:ligatures w14:val="standardContextual"/>
         </w:rPr>
       </w:pPr>
-      <w:hyperlink w:anchor="_Toc244091253" w:history="1">
+      <w:hyperlink w:anchor="_Toc244199662" w:history="1">
         <w:r>
           <w:rPr>
             <w:rStyle w:val="Hipervnculo"/>
@@ -5923,7 +5923,7 @@
             <w:noProof/>
             <w:webHidden/>
           </w:rPr>
-          <w:instrText xml:space="preserve"> PAGEREF _Toc244091253 \h </w:instrText>
+          <w:instrText xml:space="preserve"> PAGEREF _Toc244199662 \h </w:instrText>
         </w:r>
         <w:r>
           <w:rPr>
@@ -5966,7 +5966,7 @@
           <w14:ligatures w14:val="standardContextual"/>
         </w:rPr>
       </w:pPr>
-      <w:hyperlink w:anchor="_Toc244091254" w:history="1">
+      <w:hyperlink w:anchor="_Toc244199663" w:history="1">
         <w:r>
           <w:rPr>
             <w:rStyle w:val="Hipervnculo"/>
@@ -5993,7 +5993,7 @@
             <w:noProof/>
             <w:webHidden/>
           </w:rPr>
-          <w:instrText xml:space="preserve"> PAGEREF _Toc244091254 \h </w:instrText>
+          <w:instrText xml:space="preserve"> PAGEREF _Toc244199663 \h </w:instrText>
         </w:r>
         <w:r>
           <w:rPr>
@@ -6036,7 +6036,7 @@
           <w14:ligatures w14:val="standardContextual"/>
         </w:rPr>
       </w:pPr>
-      <w:hyperlink w:anchor="_Toc244091255" w:history="1">
+      <w:hyperlink w:anchor="_Toc244199664" w:history="1">
         <w:r>
           <w:rPr>
             <w:rStyle w:val="Hipervnculo"/>
@@ -6063,7 +6063,7 @@
             <w:noProof/>
             <w:webHidden/>
           </w:rPr>
-          <w:instrText xml:space="preserve"> PAGEREF _Toc244091255 \h </w:instrText>
+          <w:instrText xml:space="preserve"> PAGEREF _Toc244199664 \h </w:instrText>
         </w:r>
         <w:r>
           <w:rPr>
@@ -6106,7 +6106,7 @@
           <w14:ligatures w14:val="standardContextual"/>
         </w:rPr>
       </w:pPr>
-      <w:hyperlink w:anchor="_Toc244091256" w:history="1">
+      <w:hyperlink w:anchor="_Toc244199665" w:history="1">
         <w:r>
           <w:rPr>
             <w:rStyle w:val="Hipervnculo"/>
@@ -6133,7 +6133,7 @@
             <w:noProof/>
             <w:webHidden/>
           </w:rPr>
-          <w:instrText xml:space="preserve"> PAGEREF _Toc244091256 \h </w:instrText>
+          <w:instrText xml:space="preserve"> PAGEREF _Toc244199665 \h </w:instrText>
         </w:r>
         <w:r>
           <w:rPr>
@@ -6176,7 +6176,7 @@
           <w14:ligatures w14:val="standardContextual"/>
         </w:rPr>
       </w:pPr>
-      <w:hyperlink w:anchor="_Toc244091257" w:history="1">
+      <w:hyperlink w:anchor="_Toc244199666" w:history="1">
         <w:r>
           <w:rPr>
             <w:rStyle w:val="Hipervnculo"/>
@@ -6203,7 +6203,7 @@
             <w:noProof/>
             <w:webHidden/>
           </w:rPr>
-          <w:instrText xml:space="preserve"> PAGEREF _Toc244091257 \h </w:instrText>
+          <w:instrText xml:space="preserve"> PAGEREF _Toc244199666 \h </w:instrText>
         </w:r>
         <w:r>
           <w:rPr>
@@ -6246,7 +6246,7 @@
           <w14:ligatures w14:val="standardContextual"/>
         </w:rPr>
       </w:pPr>
-      <w:hyperlink w:anchor="_Toc244091258" w:history="1">
+      <w:hyperlink w:anchor="_Toc244199667" w:history="1">
         <w:r>
           <w:rPr>
             <w:rStyle w:val="Hipervnculo"/>
@@ -6273,7 +6273,7 @@
             <w:noProof/>
             <w:webHidden/>
           </w:rPr>
-          <w:instrText xml:space="preserve"> PAGEREF _Toc244091258 \h </w:instrText>
+          <w:instrText xml:space="preserve"> PAGEREF _Toc244199667 \h </w:instrText>
         </w:r>
         <w:r>
           <w:rPr>
@@ -6316,7 +6316,7 @@
           <w14:ligatures w14:val="standardContextual"/>
         </w:rPr>
       </w:pPr>
-      <w:hyperlink w:anchor="_Toc244091259" w:history="1">
+      <w:hyperlink w:anchor="_Toc244199668" w:history="1">
         <w:r>
           <w:rPr>
             <w:rStyle w:val="Hipervnculo"/>
@@ -6343,7 +6343,7 @@
             <w:noProof/>
             <w:webHidden/>
           </w:rPr>
-          <w:instrText xml:space="preserve"> PAGEREF _Toc244091259 \h </w:instrText>
+          <w:instrText xml:space="preserve"> PAGEREF _Toc244199668 \h </w:instrText>
         </w:r>
         <w:r>
           <w:rPr>
@@ -6386,7 +6386,7 @@
           <w14:ligatures w14:val="standardContextual"/>
         </w:rPr>
       </w:pPr>
-      <w:hyperlink w:anchor="_Toc244091260" w:history="1">
+      <w:hyperlink w:anchor="_Toc244199669" w:history="1">
         <w:r>
           <w:rPr>
             <w:rStyle w:val="Hipervnculo"/>
@@ -6413,7 +6413,7 @@
             <w:noProof/>
             <w:webHidden/>
           </w:rPr>
-          <w:instrText xml:space="preserve"> PAGEREF _Toc244091260 \h </w:instrText>
+          <w:instrText xml:space="preserve"> PAGEREF _Toc244199669 \h </w:instrText>
         </w:r>
         <w:r>
           <w:rPr>
@@ -6456,7 +6456,7 @@
           <w14:ligatures w14:val="standardContextual"/>
         </w:rPr>
       </w:pPr>
-      <w:hyperlink w:anchor="_Toc244091261" w:history="1">
+      <w:hyperlink w:anchor="_Toc244199670" w:history="1">
         <w:r>
           <w:rPr>
             <w:rStyle w:val="Hipervnculo"/>
@@ -6483,7 +6483,7 @@
             <w:noProof/>
             <w:webHidden/>
           </w:rPr>
-          <w:instrText xml:space="preserve"> PAGEREF _Toc244091261 \h </w:instrText>
+          <w:instrText xml:space="preserve"> PAGEREF _Toc244199670 \h </w:instrText>
         </w:r>
         <w:r>
           <w:rPr>
@@ -6529,7 +6529,7 @@
           <w14:ligatures w14:val="standardContextual"/>
         </w:rPr>
       </w:pPr>
-      <w:hyperlink w:anchor="_Toc244091262" w:history="1">
+      <w:hyperlink w:anchor="_Toc244199671" w:history="1">
         <w:r>
           <w:rPr>
             <w:rStyle w:val="Hipervnculo"/>
@@ -6556,7 +6556,7 @@
             <w:noProof/>
             <w:webHidden/>
           </w:rPr>
-          <w:instrText xml:space="preserve"> PAGEREF _Toc244091262 \h </w:instrText>
+          <w:instrText xml:space="preserve"> PAGEREF _Toc244199671 \h </w:instrText>
         </w:r>
         <w:r>
           <w:rPr>
@@ -6599,7 +6599,7 @@
           <w14:ligatures w14:val="standardContextual"/>
         </w:rPr>
       </w:pPr>
-      <w:hyperlink w:anchor="_Toc244091263" w:history="1">
+      <w:hyperlink w:anchor="_Toc244199672" w:history="1">
         <w:r>
           <w:rPr>
             <w:rStyle w:val="Hipervnculo"/>
@@ -6626,7 +6626,7 @@
             <w:noProof/>
             <w:webHidden/>
           </w:rPr>
-          <w:instrText xml:space="preserve"> PAGEREF _Toc244091263 \h </w:instrText>
+          <w:instrText xml:space="preserve"> PAGEREF _Toc244199672 \h </w:instrText>
         </w:r>
         <w:r>
           <w:rPr>
@@ -6669,7 +6669,7 @@
           <w14:ligatures w14:val="standardContextual"/>
         </w:rPr>
       </w:pPr>
-      <w:hyperlink w:anchor="_Toc244091264" w:history="1">
+      <w:hyperlink w:anchor="_Toc244199673" w:history="1">
         <w:r>
           <w:rPr>
             <w:rStyle w:val="Hipervnculo"/>
@@ -6696,7 +6696,7 @@
             <w:noProof/>
             <w:webHidden/>
           </w:rPr>
-          <w:instrText xml:space="preserve"> PAGEREF _Toc244091264 \h </w:instrText>
+          <w:instrText xml:space="preserve"> PAGEREF _Toc244199673 \h </w:instrText>
         </w:r>
         <w:r>
           <w:rPr>
@@ -6739,7 +6739,7 @@
           <w14:ligatures w14:val="standardContextual"/>
         </w:rPr>
       </w:pPr>
-      <w:hyperlink w:anchor="_Toc244091265" w:history="1">
+      <w:hyperlink w:anchor="_Toc244199674" w:history="1">
         <w:r>
           <w:rPr>
             <w:rStyle w:val="Hipervnculo"/>
@@ -6766,7 +6766,7 @@
             <w:noProof/>
             <w:webHidden/>
           </w:rPr>
-          <w:instrText xml:space="preserve"> PAGEREF _Toc244091265 \h </w:instrText>
+          <w:instrText xml:space="preserve"> PAGEREF _Toc244199674 \h </w:instrText>
         </w:r>
         <w:r>
           <w:rPr>
@@ -6809,7 +6809,7 @@
           <w14:ligatures w14:val="standardContextual"/>
         </w:rPr>
       </w:pPr>
-      <w:hyperlink w:anchor="_Toc244091266" w:history="1">
+      <w:hyperlink w:anchor="_Toc244199675" w:history="1">
         <w:r>
           <w:rPr>
             <w:rStyle w:val="Hipervnculo"/>
@@ -6836,7 +6836,7 @@
             <w:noProof/>
             <w:webHidden/>
           </w:rPr>
-          <w:instrText xml:space="preserve"> PAGEREF _Toc244091266 \h </w:instrText>
+          <w:instrText xml:space="preserve"> PAGEREF _Toc244199675 \h </w:instrText>
         </w:r>
         <w:r>
           <w:rPr>
@@ -6879,7 +6879,7 @@
           <w14:ligatures w14:val="standardContextual"/>
         </w:rPr>
       </w:pPr>
-      <w:hyperlink w:anchor="_Toc244091267" w:history="1">
+      <w:hyperlink w:anchor="_Toc244199676" w:history="1">
         <w:r>
           <w:rPr>
             <w:rStyle w:val="Hipervnculo"/>
@@ -6906,7 +6906,7 @@
             <w:noProof/>
             <w:webHidden/>
           </w:rPr>
-          <w:instrText xml:space="preserve"> PAGEREF _Toc244091267 \h </w:instrText>
+          <w:instrText xml:space="preserve"> PAGEREF _Toc244199676 \h </w:instrText>
         </w:r>
         <w:r>
           <w:rPr>
@@ -6952,7 +6952,7 @@
           <w14:ligatures w14:val="standardContextual"/>
         </w:rPr>
       </w:pPr>
-      <w:hyperlink w:anchor="_Toc244091268" w:history="1">
+      <w:hyperlink w:anchor="_Toc244199677" w:history="1">
         <w:r>
           <w:rPr>
             <w:rStyle w:val="Hipervnculo"/>
@@ -6979,7 +6979,7 @@
             <w:noProof/>
             <w:webHidden/>
           </w:rPr>
-          <w:instrText xml:space="preserve"> PAGEREF _Toc244091268 \h </w:instrText>
+          <w:instrText xml:space="preserve"> PAGEREF _Toc244199677 \h </w:instrText>
         </w:r>
         <w:r>
           <w:rPr>
@@ -7022,7 +7022,7 @@
           <w14:ligatures w14:val="standardContextual"/>
         </w:rPr>
       </w:pPr>
-      <w:hyperlink w:anchor="_Toc244091269" w:history="1">
+      <w:hyperlink w:anchor="_Toc244199678" w:history="1">
         <w:r>
           <w:rPr>
             <w:rStyle w:val="Hipervnculo"/>
@@ -7049,7 +7049,7 @@
             <w:noProof/>
             <w:webHidden/>
           </w:rPr>
-          <w:instrText xml:space="preserve"> PAGEREF _Toc244091269 \h </w:instrText>
+          <w:instrText xml:space="preserve"> PAGEREF _Toc244199678 \h </w:instrText>
         </w:r>
         <w:r>
           <w:rPr>
@@ -7092,7 +7092,7 @@
           <w14:ligatures w14:val="standardContextual"/>
         </w:rPr>
       </w:pPr>
-      <w:hyperlink w:anchor="_Toc244091270" w:history="1">
+      <w:hyperlink w:anchor="_Toc244199679" w:history="1">
         <w:r>
           <w:rPr>
             <w:rStyle w:val="Hipervnculo"/>
@@ -7119,7 +7119,7 @@
             <w:noProof/>
             <w:webHidden/>
           </w:rPr>
-          <w:instrText xml:space="preserve"> PAGEREF _Toc244091270 \h </w:instrText>
+          <w:instrText xml:space="preserve"> PAGEREF _Toc244199679 \h </w:instrText>
         </w:r>
         <w:r>
           <w:rPr>
@@ -7162,7 +7162,7 @@
           <w14:ligatures w14:val="standardContextual"/>
         </w:rPr>
       </w:pPr>
-      <w:hyperlink w:anchor="_Toc244091271" w:history="1">
+      <w:hyperlink w:anchor="_Toc244199680" w:history="1">
         <w:r>
           <w:rPr>
             <w:rStyle w:val="Hipervnculo"/>
@@ -7189,7 +7189,7 @@
             <w:noProof/>
             <w:webHidden/>
           </w:rPr>
-          <w:instrText xml:space="preserve"> PAGEREF _Toc244091271 \h </w:instrText>
+          <w:instrText xml:space="preserve"> PAGEREF _Toc244199680 \h </w:instrText>
         </w:r>
         <w:r>
           <w:rPr>
@@ -7232,7 +7232,7 @@
           <w14:ligatures w14:val="standardContextual"/>
         </w:rPr>
       </w:pPr>
-      <w:hyperlink w:anchor="_Toc244091272" w:history="1">
+      <w:hyperlink w:anchor="_Toc244199681" w:history="1">
         <w:r>
           <w:rPr>
             <w:rStyle w:val="Hipervnculo"/>
@@ -7259,7 +7259,7 @@
             <w:noProof/>
             <w:webHidden/>
           </w:rPr>
-          <w:instrText xml:space="preserve"> PAGEREF _Toc244091272 \h </w:instrText>
+          <w:instrText xml:space="preserve"> PAGEREF _Toc244199681 \h </w:instrText>
         </w:r>
         <w:r>
           <w:rPr>
@@ -7302,7 +7302,7 @@
           <w14:ligatures w14:val="standardContextual"/>
         </w:rPr>
       </w:pPr>
-      <w:hyperlink w:anchor="_Toc244091273" w:history="1">
+      <w:hyperlink w:anchor="_Toc244199682" w:history="1">
         <w:r>
           <w:rPr>
             <w:rStyle w:val="Hipervnculo"/>
@@ -7329,7 +7329,7 @@
             <w:noProof/>
             <w:webHidden/>
           </w:rPr>
-          <w:instrText xml:space="preserve"> PAGEREF _Toc244091273 \h </w:instrText>
+          <w:instrText xml:space="preserve"> PAGEREF _Toc244199682 \h </w:instrText>
         </w:r>
         <w:r>
           <w:rPr>
@@ -7375,7 +7375,7 @@
           <w14:ligatures w14:val="standardContextual"/>
         </w:rPr>
       </w:pPr>
-      <w:hyperlink w:anchor="_Toc244091274" w:history="1">
+      <w:hyperlink w:anchor="_Toc244199683" w:history="1">
         <w:r>
           <w:rPr>
             <w:rStyle w:val="Hipervnculo"/>
@@ -7411,7 +7411,7 @@
             <w:noProof/>
             <w:webHidden/>
           </w:rPr>
-          <w:instrText xml:space="preserve"> PAGEREF _Toc244091274 \h </w:instrText>
+          <w:instrText xml:space="preserve"> PAGEREF _Toc244199683 \h </w:instrText>
         </w:r>
         <w:r>
           <w:rPr>
@@ -7454,7 +7454,7 @@
           <w14:ligatures w14:val="standardContextual"/>
         </w:rPr>
       </w:pPr>
-      <w:hyperlink w:anchor="_Toc244091275" w:history="1">
+      <w:hyperlink w:anchor="_Toc244199684" w:history="1">
         <w:r>
           <w:rPr>
             <w:rStyle w:val="Hipervnculo"/>
@@ -7481,7 +7481,7 @@
             <w:noProof/>
             <w:webHidden/>
           </w:rPr>
-          <w:instrText xml:space="preserve"> PAGEREF _Toc244091275 \h </w:instrText>
+          <w:instrText xml:space="preserve"> PAGEREF _Toc244199684 \h </w:instrText>
         </w:r>
         <w:r>
           <w:rPr>
@@ -7524,7 +7524,7 @@
           <w14:ligatures w14:val="standardContextual"/>
         </w:rPr>
       </w:pPr>
-      <w:hyperlink w:anchor="_Toc244091276" w:history="1">
+      <w:hyperlink w:anchor="_Toc244199685" w:history="1">
         <w:r>
           <w:rPr>
             <w:rStyle w:val="Hipervnculo"/>
@@ -7551,7 +7551,7 @@
             <w:noProof/>
             <w:webHidden/>
           </w:rPr>
-          <w:instrText xml:space="preserve"> PAGEREF _Toc244091276 \h </w:instrText>
+          <w:instrText xml:space="preserve"> PAGEREF _Toc244199685 \h </w:instrText>
         </w:r>
         <w:r>
           <w:rPr>
@@ -7594,7 +7594,7 @@
           <w14:ligatures w14:val="standardContextual"/>
         </w:rPr>
       </w:pPr>
-      <w:hyperlink w:anchor="_Toc244091277" w:history="1">
+      <w:hyperlink w:anchor="_Toc244199686" w:history="1">
         <w:r>
           <w:rPr>
             <w:rStyle w:val="Hipervnculo"/>
@@ -7621,7 +7621,7 @@
             <w:noProof/>
             <w:webHidden/>
           </w:rPr>
-          <w:instrText xml:space="preserve"> PAGEREF _Toc244091277 \h </w:instrText>
+          <w:instrText xml:space="preserve"> PAGEREF _Toc244199686 \h </w:instrText>
         </w:r>
         <w:r>
           <w:rPr>
@@ -7664,7 +7664,7 @@
           <w14:ligatures w14:val="standardContextual"/>
         </w:rPr>
       </w:pPr>
-      <w:hyperlink w:anchor="_Toc244091278" w:history="1">
+      <w:hyperlink w:anchor="_Toc244199687" w:history="1">
         <w:r>
           <w:rPr>
             <w:rStyle w:val="Hipervnculo"/>
@@ -7691,7 +7691,7 @@
             <w:noProof/>
             <w:webHidden/>
           </w:rPr>
-          <w:instrText xml:space="preserve"> PAGEREF _Toc244091278 \h </w:instrText>
+          <w:instrText xml:space="preserve"> PAGEREF _Toc244199687 \h </w:instrText>
         </w:r>
         <w:r>
           <w:rPr>
@@ -7734,7 +7734,7 @@
           <w14:ligatures w14:val="standardContextual"/>
         </w:rPr>
       </w:pPr>
-      <w:hyperlink w:anchor="_Toc244091279" w:history="1">
+      <w:hyperlink w:anchor="_Toc244199688" w:history="1">
         <w:r>
           <w:rPr>
             <w:rStyle w:val="Hipervnculo"/>
@@ -7761,7 +7761,7 @@
             <w:noProof/>
             <w:webHidden/>
           </w:rPr>
-          <w:instrText xml:space="preserve"> PAGEREF _Toc244091279 \h </w:instrText>
+          <w:instrText xml:space="preserve"> PAGEREF _Toc244199688 \h </w:instrText>
         </w:r>
         <w:r>
           <w:rPr>
@@ -7807,7 +7807,7 @@
           <w14:ligatures w14:val="standardContextual"/>
         </w:rPr>
       </w:pPr>
-      <w:hyperlink w:anchor="_Toc244091280" w:history="1">
+      <w:hyperlink w:anchor="_Toc244199689" w:history="1">
         <w:r>
           <w:rPr>
             <w:rStyle w:val="Hipervnculo"/>
@@ -7834,7 +7834,7 @@
             <w:noProof/>
             <w:webHidden/>
           </w:rPr>
-          <w:instrText xml:space="preserve"> PAGEREF _Toc244091280 \h </w:instrText>
+          <w:instrText xml:space="preserve"> PAGEREF _Toc244199689 \h </w:instrText>
         </w:r>
         <w:r>
           <w:rPr>
@@ -7877,7 +7877,7 @@
           <w14:ligatures w14:val="standardContextual"/>
         </w:rPr>
       </w:pPr>
-      <w:hyperlink w:anchor="_Toc244091281" w:history="1">
+      <w:hyperlink w:anchor="_Toc244199690" w:history="1">
         <w:r>
           <w:rPr>
             <w:rStyle w:val="Hipervnculo"/>
@@ -7904,7 +7904,7 @@
             <w:noProof/>
             <w:webHidden/>
           </w:rPr>
-          <w:instrText xml:space="preserve"> PAGEREF _Toc244091281 \h </w:instrText>
+          <w:instrText xml:space="preserve"> PAGEREF _Toc244199690 \h </w:instrText>
         </w:r>
         <w:r>
           <w:rPr>
@@ -7950,7 +7950,7 @@
           <w14:ligatures w14:val="standardContextual"/>
         </w:rPr>
       </w:pPr>
-      <w:hyperlink w:anchor="_Toc244091282" w:history="1">
+      <w:hyperlink w:anchor="_Toc244199691" w:history="1">
         <w:r>
           <w:rPr>
             <w:rStyle w:val="Hipervnculo"/>
@@ -7977,7 +7977,7 @@
             <w:noProof/>
             <w:webHidden/>
           </w:rPr>
-          <w:instrText xml:space="preserve"> PAGEREF _Toc244091282 \h </w:instrText>
+          <w:instrText xml:space="preserve"> PAGEREF _Toc244199691 \h </w:instrText>
         </w:r>
         <w:r>
           <w:rPr>
@@ -8020,7 +8020,7 @@
           <w14:ligatures w14:val="standardContextual"/>
         </w:rPr>
       </w:pPr>
-      <w:hyperlink w:anchor="_Toc244091283" w:history="1">
+      <w:hyperlink w:anchor="_Toc244199692" w:history="1">
         <w:r>
           <w:rPr>
             <w:rStyle w:val="Hipervnculo"/>
@@ -8047,7 +8047,7 @@
             <w:noProof/>
             <w:webHidden/>
           </w:rPr>
-          <w:instrText xml:space="preserve"> PAGEREF _Toc244091283 \h </w:instrText>
+          <w:instrText xml:space="preserve"> PAGEREF _Toc244199692 \h </w:instrText>
         </w:r>
         <w:r>
           <w:rPr>
@@ -8090,7 +8090,7 @@
           <w14:ligatures w14:val="standardContextual"/>
         </w:rPr>
       </w:pPr>
-      <w:hyperlink w:anchor="_Toc244091284" w:history="1">
+      <w:hyperlink w:anchor="_Toc244199693" w:history="1">
         <w:r>
           <w:rPr>
             <w:rStyle w:val="Hipervnculo"/>
@@ -8117,7 +8117,7 @@
             <w:noProof/>
             <w:webHidden/>
           </w:rPr>
-          <w:instrText xml:space="preserve"> PAGEREF _Toc244091284 \h </w:instrText>
+          <w:instrText xml:space="preserve"> PAGEREF _Toc244199693 \h </w:instrText>
         </w:r>
         <w:r>
           <w:rPr>
@@ -8160,7 +8160,7 @@
           <w14:ligatures w14:val="standardContextual"/>
         </w:rPr>
       </w:pPr>
-      <w:hyperlink w:anchor="_Toc244091285" w:history="1">
+      <w:hyperlink w:anchor="_Toc244199694" w:history="1">
         <w:r>
           <w:rPr>
             <w:rStyle w:val="Hipervnculo"/>
@@ -8187,7 +8187,7 @@
             <w:noProof/>
             <w:webHidden/>
           </w:rPr>
-          <w:instrText xml:space="preserve"> PAGEREF _Toc244091285 \h </w:instrText>
+          <w:instrText xml:space="preserve"> PAGEREF _Toc244199694 \h </w:instrText>
         </w:r>
         <w:r>
           <w:rPr>
@@ -8233,7 +8233,7 @@
           <w14:ligatures w14:val="standardContextual"/>
         </w:rPr>
       </w:pPr>
-      <w:hyperlink w:anchor="_Toc244091286" w:history="1">
+      <w:hyperlink w:anchor="_Toc244199695" w:history="1">
         <w:r>
           <w:rPr>
             <w:rStyle w:val="Hipervnculo"/>
@@ -8260,7 +8260,7 @@
             <w:noProof/>
             <w:webHidden/>
           </w:rPr>
-          <w:instrText xml:space="preserve"> PAGEREF _Toc244091286 \h </w:instrText>
+          <w:instrText xml:space="preserve"> PAGEREF _Toc244199695 \h </w:instrText>
         </w:r>
         <w:r>
           <w:rPr>
@@ -8306,7 +8306,7 @@
           <w14:ligatures w14:val="standardContextual"/>
         </w:rPr>
       </w:pPr>
-      <w:hyperlink w:anchor="_Toc244091287" w:history="1">
+      <w:hyperlink w:anchor="_Toc244199696" w:history="1">
         <w:r>
           <w:rPr>
             <w:rStyle w:val="Hipervnculo"/>
@@ -8333,7 +8333,7 @@
             <w:noProof/>
             <w:webHidden/>
           </w:rPr>
-          <w:instrText xml:space="preserve"> PAGEREF _Toc244091287 \h </w:instrText>
+          <w:instrText xml:space="preserve"> PAGEREF _Toc244199696 \h </w:instrText>
         </w:r>
         <w:r>
           <w:rPr>
@@ -8946,7 +8946,7 @@
         <w:pStyle w:val="Ttulo1"/>
       </w:pPr>
       <w:bookmarkStart w:id="0" w:name="_ad9e25c8626cd57ecdce5548ccf29c0d11fa207"/>
-      <w:bookmarkStart w:id="1" w:name="_Toc244091175"/>
+      <w:bookmarkStart w:id="1" w:name="_Toc244199584"/>
       <w:r>
         <w:lastRenderedPageBreak/>
         <w:t xml:space="preserve">Módulo 0 — Plataforma: clínicas, planes y suscripción </w:t>
@@ -8973,7 +8973,7 @@
         <w:pStyle w:val="Ttulo2"/>
       </w:pPr>
       <w:bookmarkStart w:id="2" w:name="_1eb36715c186f58cce98281b1b189d20510db73"/>
-      <w:bookmarkStart w:id="3" w:name="_Toc244091176"/>
+      <w:bookmarkStart w:id="3" w:name="_Toc244199585"/>
       <w:r>
         <w:t>HU-0.1 — Registrar una clínica (self-service)</w:t>
       </w:r>
@@ -9256,7 +9256,7 @@
         <w:pStyle w:val="Ttulo2"/>
       </w:pPr>
       <w:bookmarkStart w:id="4" w:name="_802afc2bac434eff8b2fd18354a2e26d7a1818b"/>
-      <w:bookmarkStart w:id="5" w:name="_Toc244091177"/>
+      <w:bookmarkStart w:id="5" w:name="_Toc244199586"/>
       <w:bookmarkEnd w:id="2"/>
       <w:r>
         <w:lastRenderedPageBreak/>
@@ -9548,7 +9548,7 @@
         <w:pStyle w:val="Ttulo2"/>
       </w:pPr>
       <w:bookmarkStart w:id="6" w:name="_bb7346f7e0c84a0526cc1b09dcf7185b4de9ba6"/>
-      <w:bookmarkStart w:id="7" w:name="_Toc244091178"/>
+      <w:bookmarkStart w:id="7" w:name="_Toc244199587"/>
       <w:bookmarkEnd w:id="4"/>
       <w:r>
         <w:t>HU-0.3 — Panel del super-administrador</w:t>
@@ -9920,7 +9920,7 @@
         <w:pStyle w:val="Ttulo2"/>
       </w:pPr>
       <w:bookmarkStart w:id="8" w:name="_81995397ba8e62ea0a492c5a03eed8bb24e762a"/>
-      <w:bookmarkStart w:id="9" w:name="_Toc244091179"/>
+      <w:bookmarkStart w:id="9" w:name="_Toc244199588"/>
       <w:bookmarkEnd w:id="6"/>
       <w:r>
         <w:t>HU-0.4 — Control de límites del plan (freemium)</w:t>
@@ -10271,7 +10271,7 @@
         <w:pStyle w:val="Ttulo2"/>
       </w:pPr>
       <w:bookmarkStart w:id="10" w:name="_7e8f3608e8fc52636cb9cbad9cf55731ae6c539"/>
-      <w:bookmarkStart w:id="11" w:name="_Toc244091180"/>
+      <w:bookmarkStart w:id="11" w:name="_Toc244199589"/>
       <w:bookmarkEnd w:id="8"/>
       <w:r>
         <w:t>HU-0.5 — Suscripción, pagos y congelación por mora</w:t>
@@ -10612,7 +10612,7 @@
         <w:pStyle w:val="Ttulo1"/>
       </w:pPr>
       <w:bookmarkStart w:id="12" w:name="_3f52c9db5995a4dc1e731f6d8cd57f262bab040"/>
-      <w:bookmarkStart w:id="13" w:name="_Toc244091181"/>
+      <w:bookmarkStart w:id="13" w:name="_Toc244199590"/>
       <w:bookmarkEnd w:id="0"/>
       <w:bookmarkEnd w:id="10"/>
       <w:r>
@@ -10634,7 +10634,7 @@
         <w:pStyle w:val="Ttulo2"/>
       </w:pPr>
       <w:bookmarkStart w:id="14" w:name="_76f4ca07816b696a7e21234a3fd245066d4202e"/>
-      <w:bookmarkStart w:id="15" w:name="_Toc244091182"/>
+      <w:bookmarkStart w:id="15" w:name="_Toc244199591"/>
       <w:r>
         <w:t>HU-T.1 — Iniciar sesión y autenticación</w:t>
       </w:r>
@@ -10889,7 +10889,7 @@
         <w:pStyle w:val="Ttulo2"/>
       </w:pPr>
       <w:bookmarkStart w:id="16" w:name="_08f5c8e95117bf9bc16117a780f642084f0c149"/>
-      <w:bookmarkStart w:id="17" w:name="_Toc244091183"/>
+      <w:bookmarkStart w:id="17" w:name="_Toc244199592"/>
       <w:bookmarkEnd w:id="14"/>
       <w:r>
         <w:t>HU-T.2 — Cambiar mi contraseña</w:t>
@@ -11165,7 +11165,7 @@
         <w:pStyle w:val="Ttulo2"/>
       </w:pPr>
       <w:bookmarkStart w:id="18" w:name="_44f513b1e95bac8cbf132f88a3649b6be2902d9"/>
-      <w:bookmarkStart w:id="19" w:name="_Toc244091184"/>
+      <w:bookmarkStart w:id="19" w:name="_Toc244199593"/>
       <w:bookmarkEnd w:id="16"/>
       <w:r>
         <w:lastRenderedPageBreak/>
@@ -11404,7 +11404,7 @@
         <w:pStyle w:val="Ttulo2"/>
       </w:pPr>
       <w:bookmarkStart w:id="20" w:name="_1eded849c0926854c498005f8a93458b9d7a2d8"/>
-      <w:bookmarkStart w:id="21" w:name="_Toc244091185"/>
+      <w:bookmarkStart w:id="21" w:name="_Toc244199594"/>
       <w:bookmarkEnd w:id="18"/>
       <w:r>
         <w:t>HU-T.4 — Cerrar sesión</w:t>
@@ -11630,7 +11630,7 @@
         <w:pStyle w:val="Ttulo2"/>
       </w:pPr>
       <w:bookmarkStart w:id="22" w:name="_def34846ffbe39a85a6bd6a22079f6d076a01a9"/>
-      <w:bookmarkStart w:id="23" w:name="_Toc244091186"/>
+      <w:bookmarkStart w:id="23" w:name="_Toc244199595"/>
       <w:bookmarkEnd w:id="20"/>
       <w:r>
         <w:t>HU-T.5 — Ver y actualizar mi perfil y datos de contacto</w:t>
@@ -12041,7 +12041,7 @@
         <w:pStyle w:val="Ttulo2"/>
       </w:pPr>
       <w:bookmarkStart w:id="24" w:name="_37603926653c908321bb7c7e9ea1991584cc3b8"/>
-      <w:bookmarkStart w:id="25" w:name="_Toc244091187"/>
+      <w:bookmarkStart w:id="25" w:name="_Toc244199596"/>
       <w:bookmarkEnd w:id="22"/>
       <w:r>
         <w:t>HU-T.6 — Gestionar mis notificaciones internas</w:t>
@@ -12319,7 +12319,7 @@
         <w:pStyle w:val="Ttulo2"/>
       </w:pPr>
       <w:bookmarkStart w:id="26" w:name="_5605fb9a7931d45a4bf5dc8e3e653d18c531f06"/>
-      <w:bookmarkStart w:id="27" w:name="_Toc244091188"/>
+      <w:bookmarkStart w:id="27" w:name="_Toc244199597"/>
       <w:bookmarkEnd w:id="24"/>
       <w:r>
         <w:t>HU-T.7 — Gestión de usuarios del sistema</w:t>
@@ -12606,7 +12606,7 @@
         <w:pStyle w:val="Ttulo2"/>
       </w:pPr>
       <w:bookmarkStart w:id="28" w:name="_cca84937acbaa5cdc69c436564f31a3800184ab"/>
-      <w:bookmarkStart w:id="29" w:name="_Toc244091189"/>
+      <w:bookmarkStart w:id="29" w:name="_Toc244199598"/>
       <w:bookmarkEnd w:id="26"/>
       <w:r>
         <w:t>HU-T.8 — Logs de auditoría y seguridad</w:t>
@@ -12851,7 +12851,7 @@
         <w:pStyle w:val="Ttulo2"/>
       </w:pPr>
       <w:bookmarkStart w:id="30" w:name="_cb462f816148050ba0d7aac8f53a2b5b0cb7780"/>
-      <w:bookmarkStart w:id="31" w:name="_Toc244091190"/>
+      <w:bookmarkStart w:id="31" w:name="_Toc244199599"/>
       <w:bookmarkEnd w:id="28"/>
       <w:r>
         <w:t>HU-T.9 — Backup automático de la base de datos</w:t>
@@ -13314,7 +13314,7 @@
         <w:pStyle w:val="Ttulo2"/>
       </w:pPr>
       <w:bookmarkStart w:id="32" w:name="_276f5e9a65ab31ebb82d9356073ee60ffcf6855"/>
-      <w:bookmarkStart w:id="33" w:name="_Toc244091191"/>
+      <w:bookmarkStart w:id="33" w:name="_Toc244199600"/>
       <w:bookmarkEnd w:id="30"/>
       <w:r>
         <w:t>HU-T.10 — Autorización central por rol (RBAC real)</w:t>
@@ -13592,7 +13592,7 @@
         <w:pStyle w:val="Ttulo2"/>
       </w:pPr>
       <w:bookmarkStart w:id="34" w:name="_3b0d05aa899aefedfcf439319a22bd7df135017"/>
-      <w:bookmarkStart w:id="35" w:name="_Toc244091192"/>
+      <w:bookmarkStart w:id="35" w:name="_Toc244199601"/>
       <w:bookmarkEnd w:id="32"/>
       <w:r>
         <w:t>HU-T.11 — Corregir escalada de privilegios y proteger al último administrador</w:t>
@@ -13842,7 +13842,7 @@
         <w:pStyle w:val="Ttulo2"/>
       </w:pPr>
       <w:bookmarkStart w:id="36" w:name="_5106da541d290f3488d79d8c1e91fe390d48e5c"/>
-      <w:bookmarkStart w:id="37" w:name="_Toc244091193"/>
+      <w:bookmarkStart w:id="37" w:name="_Toc244199602"/>
       <w:bookmarkEnd w:id="34"/>
       <w:r>
         <w:t>HU-T.12 — Política de contraseñas, verificación de correo y OAuth seguro</w:t>
@@ -14163,7 +14163,7 @@
         <w:pStyle w:val="Ttulo2"/>
       </w:pPr>
       <w:bookmarkStart w:id="38" w:name="_2303defb5da6c78860aeae9d161d0fa18f76502"/>
-      <w:bookmarkStart w:id="39" w:name="_Toc244091194"/>
+      <w:bookmarkStart w:id="39" w:name="_Toc244199603"/>
       <w:bookmarkEnd w:id="36"/>
       <w:r>
         <w:t>HU-T.13 — Endurecer rate limiting y reducir enumeración/fuga de información</w:t>
@@ -14462,7 +14462,7 @@
         <w:pStyle w:val="Ttulo2"/>
       </w:pPr>
       <w:bookmarkStart w:id="40" w:name="_37cade07514fa6d0623cee7537c5f68cab00cfd"/>
-      <w:bookmarkStart w:id="41" w:name="_Toc244091195"/>
+      <w:bookmarkStart w:id="41" w:name="_Toc244199604"/>
       <w:bookmarkEnd w:id="38"/>
       <w:r>
         <w:t>HU-T.14 — Restablecer la contraseña de un usuario (administrador)</w:t>
@@ -14758,7 +14758,7 @@
         <w:pStyle w:val="Ttulo2"/>
       </w:pPr>
       <w:bookmarkStart w:id="42" w:name="_09522c4444a8bbebdaf4a55b5444d2231a6caff"/>
-      <w:bookmarkStart w:id="43" w:name="_Toc244091196"/>
+      <w:bookmarkStart w:id="43" w:name="_Toc244199605"/>
       <w:bookmarkEnd w:id="40"/>
       <w:r>
         <w:t>HU-T.15 — Aislamiento por clínica y rol super-administrador</w:t>
@@ -15350,7 +15350,7 @@
         <w:pStyle w:val="Ttulo2"/>
       </w:pPr>
       <w:bookmarkStart w:id="44" w:name="_7d4be07c6dc7ad98ff2d7fd7f946e3e6ff8ab78"/>
-      <w:bookmarkStart w:id="45" w:name="_Toc244091197"/>
+      <w:bookmarkStart w:id="45" w:name="_Toc244199606"/>
       <w:bookmarkEnd w:id="42"/>
       <w:r>
         <w:lastRenderedPageBreak/>
@@ -15599,7 +15599,7 @@
         <w:pStyle w:val="Ttulo2"/>
       </w:pPr>
       <w:bookmarkStart w:id="46" w:name="_fde5550409ae8bd107b35d83706fe49d1ac49cf"/>
-      <w:bookmarkStart w:id="47" w:name="_Toc244091198"/>
+      <w:bookmarkStart w:id="47" w:name="_Toc244199607"/>
       <w:bookmarkEnd w:id="44"/>
       <w:r>
         <w:t>HU-T.17 — Una persona con varios roles: elegir el contexto al iniciar sesión</w:t>
@@ -15859,7 +15859,7 @@
         <w:pStyle w:val="Ttulo2"/>
       </w:pPr>
       <w:bookmarkStart w:id="48" w:name="_7d9311428cd5b72468b37f82201f1b810f77c36"/>
-      <w:bookmarkStart w:id="49" w:name="_Toc244091199"/>
+      <w:bookmarkStart w:id="49" w:name="_Toc244199608"/>
       <w:bookmarkEnd w:id="46"/>
       <w:r>
         <w:t>HU-T.18 — Registrarme e iniciar sesión con Google (propietario)</w:t>
@@ -16158,7 +16158,7 @@
         <w:pStyle w:val="Ttulo2"/>
       </w:pPr>
       <w:bookmarkStart w:id="50" w:name="_a6c52dc4bdd2cb00ae48e74db3c3b2920a9b818"/>
-      <w:bookmarkStart w:id="51" w:name="_Toc244091200"/>
+      <w:bookmarkStart w:id="51" w:name="_Toc244199609"/>
       <w:bookmarkEnd w:id="48"/>
       <w:r>
         <w:t>HU-T.19 — Aceptar la política de tratamiento de datos</w:t>
@@ -16445,7 +16445,7 @@
         <w:pStyle w:val="Ttulo1"/>
       </w:pPr>
       <w:bookmarkStart w:id="52" w:name="_45e5cddb15e6e85961c4bdd9f114a9e4301e667"/>
-      <w:bookmarkStart w:id="53" w:name="_Toc244091201"/>
+      <w:bookmarkStart w:id="53" w:name="_Toc244199610"/>
       <w:bookmarkEnd w:id="12"/>
       <w:bookmarkEnd w:id="50"/>
       <w:r>
@@ -16467,7 +16467,7 @@
         <w:pStyle w:val="Ttulo2"/>
       </w:pPr>
       <w:bookmarkStart w:id="54" w:name="_3442f1e103117ab35c7be2be07e5b7a86f50900"/>
-      <w:bookmarkStart w:id="55" w:name="_Toc244091202"/>
+      <w:bookmarkStart w:id="55" w:name="_Toc244199611"/>
       <w:r>
         <w:t>HU-1.1 — Registrar mascota</w:t>
       </w:r>
@@ -16736,7 +16736,7 @@
         <w:pStyle w:val="Ttulo2"/>
       </w:pPr>
       <w:bookmarkStart w:id="56" w:name="_cac8078226ab7384debc291829d99266c4c98c9"/>
-      <w:bookmarkStart w:id="57" w:name="_Toc244091203"/>
+      <w:bookmarkStart w:id="57" w:name="_Toc244199612"/>
       <w:bookmarkEnd w:id="54"/>
       <w:r>
         <w:t>HU-1.2 — Registrar propietario</w:t>
@@ -16999,7 +16999,7 @@
         <w:pStyle w:val="Ttulo2"/>
       </w:pPr>
       <w:bookmarkStart w:id="58" w:name="_2775e78a99e9a6c8110a18962d2d3ffe08eb791"/>
-      <w:bookmarkStart w:id="59" w:name="_Toc244091204"/>
+      <w:bookmarkStart w:id="59" w:name="_Toc244199613"/>
       <w:bookmarkEnd w:id="56"/>
       <w:r>
         <w:lastRenderedPageBreak/>
@@ -17232,7 +17232,7 @@
         <w:pStyle w:val="Ttulo2"/>
       </w:pPr>
       <w:bookmarkStart w:id="60" w:name="_a48b917e447c9bb421319764b87fa8fbfffc6ce"/>
-      <w:bookmarkStart w:id="61" w:name="_Toc244091205"/>
+      <w:bookmarkStart w:id="61" w:name="_Toc244199614"/>
       <w:bookmarkEnd w:id="58"/>
       <w:r>
         <w:t>HU-1.4 — Editar y desactivar mascota</w:t>
@@ -17495,7 +17495,7 @@
         <w:pStyle w:val="Ttulo2"/>
       </w:pPr>
       <w:bookmarkStart w:id="62" w:name="_c56dbdf70effe4fdddd03cc982164bf6dfa15fd"/>
-      <w:bookmarkStart w:id="63" w:name="_Toc244091206"/>
+      <w:bookmarkStart w:id="63" w:name="_Toc244199615"/>
       <w:bookmarkEnd w:id="60"/>
       <w:r>
         <w:t>HU-1.5 — Vincular una mascota existente a la clínica</w:t>
@@ -17763,7 +17763,7 @@
         <w:pStyle w:val="Ttulo1"/>
       </w:pPr>
       <w:bookmarkStart w:id="64" w:name="_8ada1076fc69f75adb455b52b48149b634e12c1"/>
-      <w:bookmarkStart w:id="65" w:name="_Toc244091207"/>
+      <w:bookmarkStart w:id="65" w:name="_Toc244199616"/>
       <w:bookmarkEnd w:id="52"/>
       <w:bookmarkEnd w:id="62"/>
       <w:r>
@@ -17785,7 +17785,7 @@
         <w:pStyle w:val="Ttulo2"/>
       </w:pPr>
       <w:bookmarkStart w:id="66" w:name="_d0fbc850c25121b5bb6429938908d9d6324f20c"/>
-      <w:bookmarkStart w:id="67" w:name="_Toc244091208"/>
+      <w:bookmarkStart w:id="67" w:name="_Toc244199617"/>
       <w:r>
         <w:t>HU-2.1 — Registrar consulta clínica</w:t>
       </w:r>
@@ -18066,7 +18066,7 @@
         <w:pStyle w:val="Ttulo2"/>
       </w:pPr>
       <w:bookmarkStart w:id="68" w:name="_7a453a6eb6ed88e1bfb6e10d4e89e02e93370e4"/>
-      <w:bookmarkStart w:id="69" w:name="_Toc244091209"/>
+      <w:bookmarkStart w:id="69" w:name="_Toc244199618"/>
       <w:bookmarkEnd w:id="66"/>
       <w:r>
         <w:t>HU-2.2 — Atención clínica sin cita (urgencias)</w:t>
@@ -18365,7 +18365,7 @@
         <w:pStyle w:val="Ttulo2"/>
       </w:pPr>
       <w:bookmarkStart w:id="70" w:name="_277d15ee6375124a0d7497cd947f0496d653294"/>
-      <w:bookmarkStart w:id="71" w:name="_Toc244091210"/>
+      <w:bookmarkStart w:id="71" w:name="_Toc244199619"/>
       <w:bookmarkEnd w:id="68"/>
       <w:r>
         <w:t>HU-2.3 — Adjuntar archivos clínicos</w:t>
@@ -18701,7 +18701,7 @@
         <w:pStyle w:val="Ttulo2"/>
       </w:pPr>
       <w:bookmarkStart w:id="72" w:name="_1b98c978e60977db39fc2418db7fe5e3ddc3001"/>
-      <w:bookmarkStart w:id="73" w:name="_Toc244091211"/>
+      <w:bookmarkStart w:id="73" w:name="_Toc244199620"/>
       <w:bookmarkEnd w:id="70"/>
       <w:r>
         <w:t>HU-2.4 — Registrar tratamiento</w:t>
@@ -18945,7 +18945,7 @@
         <w:pStyle w:val="Ttulo2"/>
       </w:pPr>
       <w:bookmarkStart w:id="74" w:name="_9717672e9e73feeffef28eb38b12c038cdd7bd2"/>
-      <w:bookmarkStart w:id="75" w:name="_Toc244091212"/>
+      <w:bookmarkStart w:id="75" w:name="_Toc244199621"/>
       <w:bookmarkEnd w:id="72"/>
       <w:r>
         <w:t>HU-2.5 — Ver historial clínico completo</w:t>
@@ -19208,7 +19208,7 @@
         <w:pStyle w:val="Ttulo2"/>
       </w:pPr>
       <w:bookmarkStart w:id="76" w:name="_fdc1478d352073634e6bd92f17796cead004715"/>
-      <w:bookmarkStart w:id="77" w:name="_Toc244091213"/>
+      <w:bookmarkStart w:id="77" w:name="_Toc244199622"/>
       <w:bookmarkEnd w:id="74"/>
       <w:r>
         <w:t>HU-2.6 — Atomicidad y feedback de adjuntos en el registro de consulta</w:t>
@@ -19490,7 +19490,7 @@
         <w:pStyle w:val="Ttulo2"/>
       </w:pPr>
       <w:bookmarkStart w:id="78" w:name="_101f0dcf34d14c70ec0f17a5f1393f5d9e5e380"/>
-      <w:bookmarkStart w:id="79" w:name="_Toc244091214"/>
+      <w:bookmarkStart w:id="79" w:name="_Toc244199623"/>
       <w:bookmarkEnd w:id="76"/>
       <w:r>
         <w:t>HU-2.7 — Validación y control de acceso en registros clínicos y de mascota</w:t>
@@ -19770,7 +19770,7 @@
         <w:pStyle w:val="Ttulo2"/>
       </w:pPr>
       <w:bookmarkStart w:id="80" w:name="_004e46896b85bf56df5905f1e03a53c4af0a844"/>
-      <w:bookmarkStart w:id="81" w:name="_Toc244091215"/>
+      <w:bookmarkStart w:id="81" w:name="_Toc244199624"/>
       <w:bookmarkEnd w:id="78"/>
       <w:r>
         <w:t>HU-2.8 — Sugerencia de diagnósticos probables por síntomas</w:t>
@@ -20031,7 +20031,7 @@
         <w:pStyle w:val="Ttulo2"/>
       </w:pPr>
       <w:bookmarkStart w:id="82" w:name="_dc4885bd67732a434e9ba082721bf6df1e25b78"/>
-      <w:bookmarkStart w:id="83" w:name="_Toc244091216"/>
+      <w:bookmarkStart w:id="83" w:name="_Toc244199625"/>
       <w:bookmarkEnd w:id="80"/>
       <w:r>
         <w:t>HU-2.9 — Alertas de toxicidad e interacción al prescribir</w:t>
@@ -20311,7 +20311,7 @@
         <w:pStyle w:val="Ttulo2"/>
       </w:pPr>
       <w:bookmarkStart w:id="84" w:name="_39e4f7d80042c39922c0142f6da447f46643fcd"/>
-      <w:bookmarkStart w:id="85" w:name="_Toc244091217"/>
+      <w:bookmarkStart w:id="85" w:name="_Toc244199626"/>
       <w:bookmarkEnd w:id="82"/>
       <w:r>
         <w:t>HU-2.10 — Ver la historia compartida de la mascota (multi-clínica)</w:t>
@@ -20574,7 +20574,7 @@
         <w:pStyle w:val="Ttulo2"/>
       </w:pPr>
       <w:bookmarkStart w:id="86" w:name="_ddbeb8d4984f7e7207ef7f02c5c92f4dcdce30d"/>
-      <w:bookmarkStart w:id="87" w:name="_Toc244091218"/>
+      <w:bookmarkStart w:id="87" w:name="_Toc244199627"/>
       <w:bookmarkEnd w:id="84"/>
       <w:r>
         <w:t>HU-2.11 — Calcular el nivel de triage a partir de los síntomas</w:t>
@@ -20758,7 +20758,7 @@
         </w:numPr>
       </w:pPr>
       <w:r>
-        <w:t>Todo resultado con revisión humana se resuelve por veterinario antes de horario reservable; confirma nivel o ajusta con motivo. Cambios de entrada/contexto/versión invalidan la resolución. Rojo conserva aviso y derivación inmediata.</w:t>
+        <w:t>Un resultado con revisión, incluida la inmediata, conserva nivel provisional y permite reservar; el veterinario recibe el aviso y confirma o ajusta con motivo, incluso después de reservar (RN-418/RN-419). Cambios de entrada/contexto/versión invalidan la resolución. Rojo conserva aviso y derivación inmediata sin horarios.</w:t>
       </w:r>
     </w:p>
     <w:p>
@@ -20818,7 +20818,7 @@
         </w:numPr>
       </w:pPr>
       <w:r>
-        <w:t>Las combinaciones escalan, y la raza, la edad, el estado, el historial (incluidas alergias de otras clínicas) y el tiempo modifican el nivel.</w:t>
+        <w:t>Las combinaciones escalan, y la raza, la edad, el estado, el historial (incluidas alergias de otras clínicas) y el tiempo modifican el nivel. Sin vacunación declarada, se usan las vacunas de esa mascota en cualquier clínica: alguna próxima dosis vencida implica «incompleta»; al menos una vacuna y ninguna vencida, «completa»; sin registros, sin dato. Lo declarado manda (RN-416/RN-113).</w:t>
       </w:r>
     </w:p>
     <w:p>
@@ -20842,6 +20842,7 @@
         </w:numPr>
       </w:pPr>
       <w:r>
+        <w:lastRenderedPageBreak/>
         <w:t>Sin cobertura específica, con «Otro / no sé» o sin regla aplicable a las marcas, el caso queda en 🟡 con revisión del personal; las alarmas universales siguen dando 🔴.</w:t>
       </w:r>
     </w:p>
@@ -20866,7 +20867,6 @@
         </w:numPr>
       </w:pPr>
       <w:r>
-        <w:lastRenderedPageBreak/>
         <w:t>Los casos de la batería de triage (</w:t>
       </w:r>
       <w:r>
@@ -20891,7 +20891,7 @@
         <w:t>Reglas de negocio:</w:t>
       </w:r>
       <w:r>
-        <w:t xml:space="preserve"> RN-411, RN-416, RN-417, RN-418, RN-424, RN-425, RN-209 · </w:t>
+        <w:t xml:space="preserve"> RN-411, RN-416, RN-417, RN-418, RN-424, RN-425, RN-209, RN-113 · </w:t>
       </w:r>
       <w:r>
         <w:rPr>
@@ -20919,7 +20919,7 @@
         <w:pStyle w:val="Ttulo2"/>
       </w:pPr>
       <w:bookmarkStart w:id="88" w:name="_492240b15c6ebc6fbe3f7fd23583d697b838ee5"/>
-      <w:bookmarkStart w:id="89" w:name="_Toc244091219"/>
+      <w:bookmarkStart w:id="89" w:name="_Toc244199628"/>
       <w:bookmarkEnd w:id="86"/>
       <w:r>
         <w:t>HU-2.12 — Explorar el mapa del conocimiento clínico</w:t>
@@ -21191,7 +21191,7 @@
         <w:pStyle w:val="Ttulo1"/>
       </w:pPr>
       <w:bookmarkStart w:id="90" w:name="_d55aebc9deeb1682a62a02ae225cde94fe0baf3"/>
-      <w:bookmarkStart w:id="91" w:name="_Toc244091220"/>
+      <w:bookmarkStart w:id="91" w:name="_Toc244199629"/>
       <w:bookmarkEnd w:id="64"/>
       <w:bookmarkEnd w:id="88"/>
       <w:r>
@@ -21213,7 +21213,7 @@
         <w:pStyle w:val="Ttulo2"/>
       </w:pPr>
       <w:bookmarkStart w:id="92" w:name="_73783a222ff535845613407f8c2c5de0df62c29"/>
-      <w:bookmarkStart w:id="93" w:name="_Toc244091221"/>
+      <w:bookmarkStart w:id="93" w:name="_Toc244199630"/>
       <w:r>
         <w:t>HU-3.1 — Registrar vacunación</w:t>
       </w:r>
@@ -21456,7 +21456,7 @@
         <w:pStyle w:val="Ttulo2"/>
       </w:pPr>
       <w:bookmarkStart w:id="94" w:name="_6075047063f4930391208048315650ed427ae6c"/>
-      <w:bookmarkStart w:id="95" w:name="_Toc244091222"/>
+      <w:bookmarkStart w:id="95" w:name="_Toc244199631"/>
       <w:bookmarkEnd w:id="92"/>
       <w:r>
         <w:t>HU-3.2 — Enviar recordatorio por correo</w:t>
@@ -21712,7 +21712,7 @@
         <w:pStyle w:val="Ttulo2"/>
       </w:pPr>
       <w:bookmarkStart w:id="96" w:name="_781661fe2d15deb5f4d895541dced4f16e579af"/>
-      <w:bookmarkStart w:id="97" w:name="_Toc244091223"/>
+      <w:bookmarkStart w:id="97" w:name="_Toc244199632"/>
       <w:bookmarkEnd w:id="94"/>
       <w:r>
         <w:t>HU-3.3 — Enviar recordatorio por WhatsApp</w:t>
@@ -21969,7 +21969,7 @@
         <w:pStyle w:val="Ttulo2"/>
       </w:pPr>
       <w:bookmarkStart w:id="98" w:name="_8afd4fd6adaa7aec672b37965973c4a0b1b5483"/>
-      <w:bookmarkStart w:id="99" w:name="_Toc244091224"/>
+      <w:bookmarkStart w:id="99" w:name="_Toc244199633"/>
       <w:bookmarkEnd w:id="96"/>
       <w:r>
         <w:t>HU-3.4 — Registrar desparasitación</w:t>
@@ -22213,7 +22213,7 @@
         <w:pStyle w:val="Ttulo2"/>
       </w:pPr>
       <w:bookmarkStart w:id="100" w:name="_69b92288d624f1c737d99fa43d727735c1c78ac"/>
-      <w:bookmarkStart w:id="101" w:name="_Toc244091225"/>
+      <w:bookmarkStart w:id="101" w:name="_Toc244199634"/>
       <w:bookmarkEnd w:id="98"/>
       <w:r>
         <w:t>HU-3.5 — Panel de vacunaciones pendientes</w:t>
@@ -22491,7 +22491,7 @@
         <w:pStyle w:val="Ttulo2"/>
       </w:pPr>
       <w:bookmarkStart w:id="102" w:name="_83b2b6ee9ef84433e407efb3456acc0bf8c705f"/>
-      <w:bookmarkStart w:id="103" w:name="_Toc244091226"/>
+      <w:bookmarkStart w:id="103" w:name="_Toc244199635"/>
       <w:bookmarkEnd w:id="100"/>
       <w:r>
         <w:lastRenderedPageBreak/>
@@ -22829,7 +22829,7 @@
         <w:pStyle w:val="Ttulo1"/>
       </w:pPr>
       <w:bookmarkStart w:id="104" w:name="_0bc479c0be240e26431ebdd296a7a53444b2628"/>
-      <w:bookmarkStart w:id="105" w:name="_Toc244091227"/>
+      <w:bookmarkStart w:id="105" w:name="_Toc244199636"/>
       <w:bookmarkEnd w:id="90"/>
       <w:bookmarkEnd w:id="102"/>
       <w:r>
@@ -22851,7 +22851,7 @@
         <w:pStyle w:val="Ttulo2"/>
       </w:pPr>
       <w:bookmarkStart w:id="106" w:name="_83a9ef67ed8a24f8f8fb200a3c30fdc3bf36c17"/>
-      <w:bookmarkStart w:id="107" w:name="_Toc244091228"/>
+      <w:bookmarkStart w:id="107" w:name="_Toc244199637"/>
       <w:r>
         <w:t>HU-4.1 — Agendar cita</w:t>
       </w:r>
@@ -23142,7 +23142,7 @@
         <w:pStyle w:val="Ttulo2"/>
       </w:pPr>
       <w:bookmarkStart w:id="108" w:name="_102fb6dec5375a39a698cb955a51646f9817d25"/>
-      <w:bookmarkStart w:id="109" w:name="_Toc244091229"/>
+      <w:bookmarkStart w:id="109" w:name="_Toc244199638"/>
       <w:bookmarkEnd w:id="106"/>
       <w:r>
         <w:t>HU-4.2 — Cancelar o reprogramar cita</w:t>
@@ -23399,7 +23399,7 @@
         <w:pStyle w:val="Ttulo2"/>
       </w:pPr>
       <w:bookmarkStart w:id="110" w:name="_bc90a9ef9035fcbf5d83826a75a2a7caba95288"/>
-      <w:bookmarkStart w:id="111" w:name="_Toc244091230"/>
+      <w:bookmarkStart w:id="111" w:name="_Toc244199639"/>
       <w:bookmarkEnd w:id="108"/>
       <w:r>
         <w:t>HU-4.3 — Marcar cita como completada</w:t>
@@ -23780,7 +23780,7 @@
         <w:pStyle w:val="Ttulo2"/>
       </w:pPr>
       <w:bookmarkStart w:id="112" w:name="_0ab1d1688e3b6d42f481962b5abe908ca5f185e"/>
-      <w:bookmarkStart w:id="113" w:name="_Toc244091231"/>
+      <w:bookmarkStart w:id="113" w:name="_Toc244199640"/>
       <w:bookmarkEnd w:id="110"/>
       <w:r>
         <w:t>HU-4.4 — Confirmación automática de cita por correo</w:t>
@@ -24024,7 +24024,7 @@
         <w:pStyle w:val="Ttulo2"/>
       </w:pPr>
       <w:bookmarkStart w:id="114" w:name="_391b83d5c01b20c64bec4d1baa2ded83b27b3cc"/>
-      <w:bookmarkStart w:id="115" w:name="_Toc244091232"/>
+      <w:bookmarkStart w:id="115" w:name="_Toc244199641"/>
       <w:bookmarkEnd w:id="112"/>
       <w:r>
         <w:t>HU-4.5 — Registrar hora real de atención y gestionar retrasos</w:t>
@@ -24328,7 +24328,7 @@
         <w:pStyle w:val="Ttulo2"/>
       </w:pPr>
       <w:bookmarkStart w:id="116" w:name="_fd2845ac88e46c3520f61b9b4ded26b35f37534"/>
-      <w:bookmarkStart w:id="117" w:name="_Toc244091233"/>
+      <w:bookmarkStart w:id="117" w:name="_Toc244199642"/>
       <w:bookmarkEnd w:id="114"/>
       <w:r>
         <w:lastRenderedPageBreak/>
@@ -24603,7 +24603,7 @@
         <w:pStyle w:val="Ttulo2"/>
       </w:pPr>
       <w:bookmarkStart w:id="118" w:name="_4786f5b438d23c36e067f350ad8ed0097d027c2"/>
-      <w:bookmarkStart w:id="119" w:name="_Toc244091234"/>
+      <w:bookmarkStart w:id="119" w:name="_Toc244199643"/>
       <w:bookmarkEnd w:id="116"/>
       <w:r>
         <w:t>HU-4.7 — Estado "no asistió" y ausentismo</w:t>
@@ -24950,7 +24950,7 @@
         <w:pStyle w:val="Ttulo2"/>
       </w:pPr>
       <w:bookmarkStart w:id="120" w:name="_0d930997ffa83b9b36b150e5e50b933f66b264d"/>
-      <w:bookmarkStart w:id="121" w:name="_Toc244091235"/>
+      <w:bookmarkStart w:id="121" w:name="_Toc244199644"/>
       <w:bookmarkEnd w:id="118"/>
       <w:r>
         <w:t>HU-4.8 — Bloqueos de agenda del veterinario y días no laborables</w:t>
@@ -25224,7 +25224,7 @@
         <w:pStyle w:val="Ttulo2"/>
       </w:pPr>
       <w:bookmarkStart w:id="122" w:name="_592e3b26ee2d82de9a78960621790aca76cbe41"/>
-      <w:bookmarkStart w:id="123" w:name="_Toc244091236"/>
+      <w:bookmarkStart w:id="123" w:name="_Toc244199645"/>
       <w:bookmarkEnd w:id="120"/>
       <w:r>
         <w:t>HU-4.9 — Endurecer la validación de disponibilidad</w:t>
@@ -25547,7 +25547,7 @@
         <w:pStyle w:val="Ttulo2"/>
       </w:pPr>
       <w:bookmarkStart w:id="124" w:name="_53bf433c324c03bf220d8f1ea57572094c24d19"/>
-      <w:bookmarkStart w:id="125" w:name="_Toc244091237"/>
+      <w:bookmarkStart w:id="125" w:name="_Toc244199646"/>
       <w:bookmarkEnd w:id="122"/>
       <w:r>
         <w:t>HU-4.10 — Confirmar asistencia a la cita desde el recordatorio</w:t>
@@ -25829,7 +25829,7 @@
         <w:pStyle w:val="Ttulo2"/>
       </w:pPr>
       <w:bookmarkStart w:id="126" w:name="_bc4a4c08f4864e57db7a13372e3c901c5711bb9"/>
-      <w:bookmarkStart w:id="127" w:name="_Toc244091238"/>
+      <w:bookmarkStart w:id="127" w:name="_Toc244199647"/>
       <w:bookmarkEnd w:id="124"/>
       <w:r>
         <w:t>HU-4.11 — Configurar el horario recurrente del veterinario</w:t>
@@ -26090,7 +26090,7 @@
         <w:pStyle w:val="Ttulo2"/>
       </w:pPr>
       <w:bookmarkStart w:id="128" w:name="_3a9da54e9b682c781ba4f8ec9fb08eb1ae51469"/>
-      <w:bookmarkStart w:id="129" w:name="_Toc244091239"/>
+      <w:bookmarkStart w:id="129" w:name="_Toc244199648"/>
       <w:bookmarkEnd w:id="126"/>
       <w:r>
         <w:t>HU-4.12 — Registrar ausencia del veterinario y gestionar cobertura</w:t>
@@ -26406,7 +26406,7 @@
         <w:pStyle w:val="Ttulo2"/>
       </w:pPr>
       <w:bookmarkStart w:id="130" w:name="_d5e60343e26d4758074a6efaed07b69cd6c3551"/>
-      <w:bookmarkStart w:id="131" w:name="_Toc244091240"/>
+      <w:bookmarkStart w:id="131" w:name="_Toc244199649"/>
       <w:bookmarkEnd w:id="128"/>
       <w:r>
         <w:lastRenderedPageBreak/>
@@ -26576,7 +26576,7 @@
         </w:numPr>
       </w:pPr>
       <w:r>
-        <w:t>Todo resultado con revisión se resuelve antes de ofrecer/guardar horario; rojo se deriva inmediatamente sin acreditar presencia física.</w:t>
+        <w:t>La revisión, incluida la inmediata, no bloquea ofrecer ni guardar horario según el nivel provisional (RN-418). El aviso REVISION_TRIAGE llega al veterinario, marcado inmediato si corresponde; rojo se deriva inmediatamente sin horario ni presencia física acreditada. Tras reservar, el nivel confirmado o ajustado con motivo y auditoría pasa a la cita (RN-419); rojo entra a Urgencias, naranja respeta RN-422 y si baja conserva el espacio (RN-423).</w:t>
       </w:r>
     </w:p>
     <w:p>
@@ -26768,7 +26768,7 @@
         <w:t>Reglas de negocio:</w:t>
       </w:r>
       <w:r>
-        <w:t xml:space="preserve"> RN-411, RN-415, RN-401, RN-402, RN-420, RN-422 · </w:t>
+        <w:t xml:space="preserve"> RN-411, RN-415, RN-401, RN-402, RN-418, RN-419, RN-420, RN-422, RN-423 · </w:t>
       </w:r>
       <w:r>
         <w:rPr>
@@ -26796,9 +26796,10 @@
         <w:pStyle w:val="Ttulo2"/>
       </w:pPr>
       <w:bookmarkStart w:id="132" w:name="_d4adac7448e74c17e6bb33bf496ee79d1222807"/>
-      <w:bookmarkStart w:id="133" w:name="_Toc244091241"/>
+      <w:bookmarkStart w:id="133" w:name="_Toc244199650"/>
       <w:bookmarkEnd w:id="130"/>
       <w:r>
+        <w:lastRenderedPageBreak/>
         <w:t>HU-4.14 — Reajuste de agenda en vivo (efecto cascada)</w:t>
       </w:r>
       <w:bookmarkEnd w:id="133"/>
@@ -26953,7 +26954,6 @@
           <w:b/>
           <w:bCs/>
         </w:rPr>
-        <w:lastRenderedPageBreak/>
         <w:t>Criterios de aceptación:</w:t>
       </w:r>
     </w:p>
@@ -27135,7 +27135,7 @@
         <w:pStyle w:val="Ttulo2"/>
       </w:pPr>
       <w:bookmarkStart w:id="134" w:name="_91e1c705d28c1a221b008d52046353792175d0f"/>
-      <w:bookmarkStart w:id="135" w:name="_Toc244091242"/>
+      <w:bookmarkStart w:id="135" w:name="_Toc244199651"/>
       <w:bookmarkEnd w:id="132"/>
       <w:r>
         <w:t>HU-4.15 — Atender una urgencia (triage rojo o llegada directa)</w:t>
@@ -27280,6 +27280,7 @@
         <w:pStyle w:val="Textodebloque"/>
       </w:pPr>
       <w:r>
+        <w:lastRenderedPageBreak/>
         <w:t>Como veterinario, quiero atender de inmediato un caso crítico aunque no tenga cita para no perder tiempo en una emergencia.</w:t>
       </w:r>
     </w:p>
@@ -27316,7 +27317,6 @@
         </w:numPr>
       </w:pPr>
       <w:r>
-        <w:lastRenderedPageBreak/>
         <w:t>Entre rojos presentes rige llegada física/ID; cambio clínico por vet con motivo/auditoría. Ante otro rojo con una atención pausada decide el vet, sin interrupciones anidadas automáticas.</w:t>
       </w:r>
     </w:p>
@@ -27499,7 +27499,11 @@
         <w:t>ficha provisional de emergencia</w:t>
       </w:r>
       <w:r>
-        <w:t xml:space="preserve"> vinculada a la clínica, con los datos disponibles del animal y un ingreso con los datos disponibles de quien lo trae. La ficha queda «por completar», sin carnet público activo y sin crear una cuenta de usuario ni atribuirle la propiedad al acompañante; el límite del plan no bloquea este ingreso rojo.</w:t>
+        <w:t xml:space="preserve"> vinculada a la clínica, con los datos disponibles del animal y un ingreso con los datos disponibles de quien lo trae. La ficha </w:t>
+      </w:r>
+      <w:r>
+        <w:lastRenderedPageBreak/>
+        <w:t>queda «por completar», sin carnet público activo y sin crear una cuenta de usuario ni atribuirle la propiedad al acompañante; el límite del plan no bloquea este ingreso rojo.</w:t>
       </w:r>
     </w:p>
     <w:p>
@@ -27523,7 +27527,6 @@
         </w:numPr>
       </w:pPr>
       <w:r>
-        <w:lastRenderedPageBreak/>
         <w:t>La atención continúa por el flujo de consulta clínica vía el módulo de Atención/Urgencias (HU-2.2).</w:t>
       </w:r>
     </w:p>
@@ -27579,7 +27582,7 @@
         <w:pStyle w:val="Ttulo2"/>
       </w:pPr>
       <w:bookmarkStart w:id="136" w:name="_c78d8424c335bf78fd48b1955b4f1a67eda143f"/>
-      <w:bookmarkStart w:id="137" w:name="_Toc244091243"/>
+      <w:bookmarkStart w:id="137" w:name="_Toc244199652"/>
       <w:bookmarkEnd w:id="134"/>
       <w:r>
         <w:t>HU-4.16 — Sugerir veterinario al agendar</w:t>
@@ -27803,7 +27806,7 @@
         <w:pStyle w:val="Ttulo2"/>
       </w:pPr>
       <w:bookmarkStart w:id="138" w:name="_d95563cf58dd7b4419944c1578610bfcd0b1db0"/>
-      <w:bookmarkStart w:id="139" w:name="_Toc244091244"/>
+      <w:bookmarkStart w:id="139" w:name="_Toc244199653"/>
       <w:bookmarkEnd w:id="136"/>
       <w:r>
         <w:t>HU-4.17 — Recalcular el triage cuando cambian los síntomas</w:t>
@@ -28051,9 +28054,10 @@
         <w:pStyle w:val="Ttulo2"/>
       </w:pPr>
       <w:bookmarkStart w:id="140" w:name="_8b0a1409d398bf3e63485141aa804db028749ca"/>
-      <w:bookmarkStart w:id="141" w:name="_Toc244091245"/>
+      <w:bookmarkStart w:id="141" w:name="_Toc244199654"/>
       <w:bookmarkEnd w:id="138"/>
       <w:r>
+        <w:lastRenderedPageBreak/>
         <w:t>HU-4.18 — Ajustar el nivel de triage (veterinario)</w:t>
       </w:r>
       <w:bookmarkEnd w:id="141"/>
@@ -28208,7 +28212,6 @@
           <w:b/>
           <w:bCs/>
         </w:rPr>
-        <w:lastRenderedPageBreak/>
         <w:t>Criterios de aceptación:</w:t>
       </w:r>
     </w:p>
@@ -28312,7 +28315,7 @@
         <w:pStyle w:val="Ttulo2"/>
       </w:pPr>
       <w:bookmarkStart w:id="142" w:name="_cf2722ce0434310059a1401a7a9236f9f75ab69"/>
-      <w:bookmarkStart w:id="143" w:name="_Toc244091246"/>
+      <w:bookmarkStart w:id="143" w:name="_Toc244199655"/>
       <w:bookmarkEnd w:id="140"/>
       <w:r>
         <w:t>HU-4.19 — Manejar la llegada tarde del propietario</w:t>
@@ -28587,7 +28590,7 @@
         <w:pStyle w:val="Ttulo1"/>
       </w:pPr>
       <w:bookmarkStart w:id="144" w:name="_448b6637f95054bfc4854cb12826ea84d2acba0"/>
-      <w:bookmarkStart w:id="145" w:name="_Toc244091247"/>
+      <w:bookmarkStart w:id="145" w:name="_Toc244199656"/>
       <w:bookmarkEnd w:id="104"/>
       <w:bookmarkEnd w:id="142"/>
       <w:r>
@@ -28609,7 +28612,7 @@
         <w:pStyle w:val="Ttulo2"/>
       </w:pPr>
       <w:bookmarkStart w:id="146" w:name="_af054ffcebd6910222ee7d6c1d020875947335e"/>
-      <w:bookmarkStart w:id="147" w:name="_Toc244091248"/>
+      <w:bookmarkStart w:id="147" w:name="_Toc244199657"/>
       <w:r>
         <w:t>HU-5.1 — Portal del propietario</w:t>
       </w:r>
@@ -28949,7 +28952,7 @@
         <w:pStyle w:val="Ttulo2"/>
       </w:pPr>
       <w:bookmarkStart w:id="148" w:name="_6b1c61431b8f8f0fcc4ce60077071b912ba2b45"/>
-      <w:bookmarkStart w:id="149" w:name="_Toc244091249"/>
+      <w:bookmarkStart w:id="149" w:name="_Toc244199658"/>
       <w:bookmarkEnd w:id="146"/>
       <w:r>
         <w:t>HU-5.2 — Auto-registro de propietario</w:t>
@@ -29218,7 +29221,7 @@
         <w:pStyle w:val="Ttulo2"/>
       </w:pPr>
       <w:bookmarkStart w:id="150" w:name="_f4d063018be410b507969fa4c62074124f833cf"/>
-      <w:bookmarkStart w:id="151" w:name="_Toc244091250"/>
+      <w:bookmarkStart w:id="151" w:name="_Toc244199659"/>
       <w:bookmarkEnd w:id="148"/>
       <w:r>
         <w:t>HU-5.3 — Agendar cita desde el portal</w:t>
@@ -29493,7 +29496,7 @@
         <w:pStyle w:val="Ttulo2"/>
       </w:pPr>
       <w:bookmarkStart w:id="152" w:name="_c64202596780354c08c0a149dc974449db886cf"/>
-      <w:bookmarkStart w:id="153" w:name="_Toc244091251"/>
+      <w:bookmarkStart w:id="153" w:name="_Toc244199660"/>
       <w:bookmarkEnd w:id="150"/>
       <w:r>
         <w:t>HU-5.4 — Editar mi mascota desde el portal</w:t>
@@ -29731,7 +29734,7 @@
         <w:pStyle w:val="Ttulo2"/>
       </w:pPr>
       <w:bookmarkStart w:id="154" w:name="_cf91e7705c2cc7ff174f786bca87f4ab32c164a"/>
-      <w:bookmarkStart w:id="155" w:name="_Toc244091252"/>
+      <w:bookmarkStart w:id="155" w:name="_Toc244199661"/>
       <w:bookmarkEnd w:id="152"/>
       <w:r>
         <w:lastRenderedPageBreak/>
@@ -29977,7 +29980,7 @@
         <w:pStyle w:val="Ttulo2"/>
       </w:pPr>
       <w:bookmarkStart w:id="156" w:name="_f8ebe18ba7612da84cbeb32e6cdfcf569929127"/>
-      <w:bookmarkStart w:id="157" w:name="_Toc244091253"/>
+      <w:bookmarkStart w:id="157" w:name="_Toc244199662"/>
       <w:bookmarkEnd w:id="154"/>
       <w:r>
         <w:t>HU-5.6 — Cancelar o reprogramar mi cita desde el portal</w:t>
@@ -30278,7 +30281,7 @@
         <w:pStyle w:val="Ttulo2"/>
       </w:pPr>
       <w:bookmarkStart w:id="158" w:name="_63b2ff8270a3dc0cb21378739f70e0c16a27def"/>
-      <w:bookmarkStart w:id="159" w:name="_Toc244091254"/>
+      <w:bookmarkStart w:id="159" w:name="_Toc244199663"/>
       <w:bookmarkEnd w:id="156"/>
       <w:r>
         <w:lastRenderedPageBreak/>
@@ -30539,7 +30542,7 @@
         <w:pStyle w:val="Ttulo2"/>
       </w:pPr>
       <w:bookmarkStart w:id="160" w:name="_f59be5ab49da54ec24749683e30fb79075b9c3a"/>
-      <w:bookmarkStart w:id="161" w:name="_Toc244091255"/>
+      <w:bookmarkStart w:id="161" w:name="_Toc244199664"/>
       <w:bookmarkEnd w:id="158"/>
       <w:r>
         <w:t>HU-5.8 — Registrar al propietario como identidad global</w:t>
@@ -30921,7 +30924,7 @@
         <w:pStyle w:val="Ttulo2"/>
       </w:pPr>
       <w:bookmarkStart w:id="162" w:name="_06eaf3b49483b1eeebe1b8e79573cd5c749be44"/>
-      <w:bookmarkStart w:id="163" w:name="_Toc244091256"/>
+      <w:bookmarkStart w:id="163" w:name="_Toc244199665"/>
       <w:bookmarkEnd w:id="160"/>
       <w:r>
         <w:t>HU-5.9 — Iniciar sesión en el portal multi-clínica</w:t>
@@ -31200,7 +31203,7 @@
         <w:pStyle w:val="Ttulo2"/>
       </w:pPr>
       <w:bookmarkStart w:id="164" w:name="_73bf9bf1ab817b39687e744da8c8402ea9619af"/>
-      <w:bookmarkStart w:id="165" w:name="_Toc244091257"/>
+      <w:bookmarkStart w:id="165" w:name="_Toc244199666"/>
       <w:bookmarkEnd w:id="162"/>
       <w:r>
         <w:t>HU-5.10 — Carnet digital de la mascota con QR de emergencia</w:t>
@@ -31461,7 +31464,7 @@
         <w:pStyle w:val="Ttulo2"/>
       </w:pPr>
       <w:bookmarkStart w:id="166" w:name="_809064a587886d0547b1788a26db9d9152af23a"/>
-      <w:bookmarkStart w:id="167" w:name="_Toc244091258"/>
+      <w:bookmarkStart w:id="167" w:name="_Toc244199667"/>
       <w:bookmarkEnd w:id="164"/>
       <w:r>
         <w:t>HU-5.11 — Acceder al carnet por QR en modo solo lectura</w:t>
@@ -31733,7 +31736,7 @@
         <w:pStyle w:val="Ttulo2"/>
       </w:pPr>
       <w:bookmarkStart w:id="168" w:name="_eaa2b9dcd4e772acfdb8cc2e14fe1584fe792e7"/>
-      <w:bookmarkStart w:id="169" w:name="_Toc244091259"/>
+      <w:bookmarkStart w:id="169" w:name="_Toc244199668"/>
       <w:bookmarkEnd w:id="166"/>
       <w:r>
         <w:t>HU-5.12 — Autorizar a una clínica a ver la historia de otras clínicas</w:t>
@@ -31994,7 +31997,7 @@
         <w:pStyle w:val="Ttulo2"/>
       </w:pPr>
       <w:bookmarkStart w:id="170" w:name="_9c4353686bd45e1d5b28007e4eeecf1db3be371"/>
-      <w:bookmarkStart w:id="171" w:name="_Toc244091260"/>
+      <w:bookmarkStart w:id="171" w:name="_Toc244199669"/>
       <w:bookmarkEnd w:id="168"/>
       <w:r>
         <w:t>HU-5.13 — Vincularme o desvincularme de una clínica</w:t>
@@ -32254,7 +32257,7 @@
         <w:pStyle w:val="Ttulo2"/>
       </w:pPr>
       <w:bookmarkStart w:id="172" w:name="_faf9cae68ace52a6134b8c807ad8be34010091b"/>
-      <w:bookmarkStart w:id="173" w:name="_Toc244091261"/>
+      <w:bookmarkStart w:id="173" w:name="_Toc244199670"/>
       <w:bookmarkEnd w:id="170"/>
       <w:r>
         <w:t>HU-5.14 — Eliminar mi cuenta (derecho de supresión)</w:t>
@@ -32515,7 +32518,7 @@
         <w:pStyle w:val="Ttulo1"/>
       </w:pPr>
       <w:bookmarkStart w:id="174" w:name="_415d3e183ea3663701acfe1e73f6e8038e4bbef"/>
-      <w:bookmarkStart w:id="175" w:name="_Toc244091262"/>
+      <w:bookmarkStart w:id="175" w:name="_Toc244199671"/>
       <w:bookmarkEnd w:id="144"/>
       <w:bookmarkEnd w:id="172"/>
       <w:r>
@@ -32537,7 +32540,7 @@
         <w:pStyle w:val="Ttulo2"/>
       </w:pPr>
       <w:bookmarkStart w:id="176" w:name="_1b876ecfd0adf71d503b9129568b658f81872f0"/>
-      <w:bookmarkStart w:id="177" w:name="_Toc244091263"/>
+      <w:bookmarkStart w:id="177" w:name="_Toc244199672"/>
       <w:r>
         <w:t>HU-6.1 — Dashboard principal y panel de pendientes</w:t>
       </w:r>
@@ -32926,7 +32929,7 @@
         <w:pStyle w:val="Ttulo2"/>
       </w:pPr>
       <w:bookmarkStart w:id="178" w:name="_97322cabf772225fd1bfe897dee158000aa0394"/>
-      <w:bookmarkStart w:id="179" w:name="_Toc244091264"/>
+      <w:bookmarkStart w:id="179" w:name="_Toc244199673"/>
       <w:bookmarkEnd w:id="176"/>
       <w:r>
         <w:t>HU-6.2 — Panel de operación del administrador</w:t>
@@ -33307,7 +33310,7 @@
         <w:pStyle w:val="Ttulo2"/>
       </w:pPr>
       <w:bookmarkStart w:id="180" w:name="_6ce76d48cd12ce7662f89ac490d75c386fc18ba"/>
-      <w:bookmarkStart w:id="181" w:name="_Toc244091265"/>
+      <w:bookmarkStart w:id="181" w:name="_Toc244199674"/>
       <w:bookmarkEnd w:id="178"/>
       <w:r>
         <w:t>HU-6.3 — Generar reportes en PDF</w:t>
@@ -33593,7 +33596,7 @@
         <w:pStyle w:val="Ttulo2"/>
       </w:pPr>
       <w:bookmarkStart w:id="182" w:name="_132f0b1bfae1ac6054dc51db54a45dff43ec797"/>
-      <w:bookmarkStart w:id="183" w:name="_Toc244091266"/>
+      <w:bookmarkStart w:id="183" w:name="_Toc244199675"/>
       <w:bookmarkEnd w:id="180"/>
       <w:r>
         <w:t>HU-6.4 — Ver estadísticas y gráficas del sistema</w:t>
@@ -33850,7 +33853,7 @@
         <w:pStyle w:val="Ttulo2"/>
       </w:pPr>
       <w:bookmarkStart w:id="184" w:name="_159c41a8740d691e56d865baa1d2a17f58680f5"/>
-      <w:bookmarkStart w:id="185" w:name="_Toc244091267"/>
+      <w:bookmarkStart w:id="185" w:name="_Toc244199676"/>
       <w:bookmarkEnd w:id="182"/>
       <w:r>
         <w:lastRenderedPageBreak/>
@@ -34089,7 +34092,7 @@
         <w:pStyle w:val="Ttulo1"/>
       </w:pPr>
       <w:bookmarkStart w:id="186" w:name="_88abf5b53e5603b94c73c4f577271d31a73cc35"/>
-      <w:bookmarkStart w:id="187" w:name="_Toc244091268"/>
+      <w:bookmarkStart w:id="187" w:name="_Toc244199677"/>
       <w:bookmarkEnd w:id="174"/>
       <w:bookmarkEnd w:id="184"/>
       <w:r>
@@ -34111,7 +34114,7 @@
         <w:pStyle w:val="Ttulo2"/>
       </w:pPr>
       <w:bookmarkStart w:id="188" w:name="_003ad6784c61069e91989793d8255e8d4cb519d"/>
-      <w:bookmarkStart w:id="189" w:name="_Toc244091269"/>
+      <w:bookmarkStart w:id="189" w:name="_Toc244199678"/>
       <w:r>
         <w:t>HU-7.1 — Configurar los horarios de atención de la clínica</w:t>
       </w:r>
@@ -34390,7 +34393,7 @@
         <w:pStyle w:val="Ttulo2"/>
       </w:pPr>
       <w:bookmarkStart w:id="190" w:name="_42539d8b8201701c75c37499984fbffa69d6e4d"/>
-      <w:bookmarkStart w:id="191" w:name="_Toc244091270"/>
+      <w:bookmarkStart w:id="191" w:name="_Toc244199679"/>
       <w:bookmarkEnd w:id="188"/>
       <w:r>
         <w:t>HU-7.2 — Gestionar los catálogos del sistema</w:t>
@@ -34668,7 +34671,7 @@
         <w:pStyle w:val="Ttulo2"/>
       </w:pPr>
       <w:bookmarkStart w:id="192" w:name="_a0aee2f406b049ed83cfe391a77b0db14b5bfdf"/>
-      <w:bookmarkStart w:id="193" w:name="_Toc244091271"/>
+      <w:bookmarkStart w:id="193" w:name="_Toc244199680"/>
       <w:bookmarkEnd w:id="190"/>
       <w:r>
         <w:t>HU-7.3 — Gestionar los veterinarios y sus especialidades</w:t>
@@ -34937,7 +34940,7 @@
         <w:pStyle w:val="Ttulo2"/>
       </w:pPr>
       <w:bookmarkStart w:id="194" w:name="_a0688e3f345f7bf587dcedb8b562b8964a6cacc"/>
-      <w:bookmarkStart w:id="195" w:name="_Toc244091272"/>
+      <w:bookmarkStart w:id="195" w:name="_Toc244199681"/>
       <w:bookmarkEnd w:id="192"/>
       <w:r>
         <w:t>HU-7.4 — Personalizar la clínica: marca y tipos de cita</w:t>
@@ -35229,7 +35232,7 @@
         <w:pStyle w:val="Ttulo2"/>
       </w:pPr>
       <w:bookmarkStart w:id="196" w:name="_7004fcdc7c25449422304e35d609c3113b471f6"/>
-      <w:bookmarkStart w:id="197" w:name="_Toc244091273"/>
+      <w:bookmarkStart w:id="197" w:name="_Toc244199682"/>
       <w:bookmarkEnd w:id="194"/>
       <w:r>
         <w:t>HU-7.5 — Parámetros del sistema configurables</w:t>
@@ -35496,7 +35499,7 @@
         <w:pStyle w:val="Ttulo1"/>
       </w:pPr>
       <w:bookmarkStart w:id="198" w:name="_99f8c38fc90f872e869cb5a42176a81ce60716e"/>
-      <w:bookmarkStart w:id="199" w:name="_Toc244091274"/>
+      <w:bookmarkStart w:id="199" w:name="_Toc244199683"/>
       <w:bookmarkEnd w:id="186"/>
       <w:bookmarkEnd w:id="196"/>
       <w:r>
@@ -35525,7 +35528,7 @@
         <w:pStyle w:val="Ttulo2"/>
       </w:pPr>
       <w:bookmarkStart w:id="200" w:name="_6b93d7ad964c8104bb83fc9231a04e4fc4e5a57"/>
-      <w:bookmarkStart w:id="201" w:name="_Toc244091275"/>
+      <w:bookmarkStart w:id="201" w:name="_Toc244199684"/>
       <w:r>
         <w:t>HU-8.1 — Calificar al veterinario tras una consulta atendida</w:t>
       </w:r>
@@ -35830,7 +35833,7 @@
         <w:pStyle w:val="Ttulo2"/>
       </w:pPr>
       <w:bookmarkStart w:id="202" w:name="_6de705a3e3f0ae827b0b0206b40472100ec5dc2"/>
-      <w:bookmarkStart w:id="203" w:name="_Toc244091276"/>
+      <w:bookmarkStart w:id="203" w:name="_Toc244199685"/>
       <w:bookmarkEnd w:id="200"/>
       <w:r>
         <w:t>HU-8.2 — Perfil público del veterinario</w:t>
@@ -36076,7 +36079,7 @@
         <w:pStyle w:val="Ttulo2"/>
       </w:pPr>
       <w:bookmarkStart w:id="204" w:name="_8d0438a4c21826cdef43f79f40a5abd8a052054"/>
-      <w:bookmarkStart w:id="205" w:name="_Toc244091277"/>
+      <w:bookmarkStart w:id="205" w:name="_Toc244199686"/>
       <w:bookmarkEnd w:id="202"/>
       <w:r>
         <w:lastRenderedPageBreak/>
@@ -36322,7 +36325,7 @@
         <w:pStyle w:val="Ttulo2"/>
       </w:pPr>
       <w:bookmarkStart w:id="206" w:name="_9d375ff686aceee42a269dcad0f742f5e2f3757"/>
-      <w:bookmarkStart w:id="207" w:name="_Toc244091278"/>
+      <w:bookmarkStart w:id="207" w:name="_Toc244199687"/>
       <w:bookmarkEnd w:id="204"/>
       <w:r>
         <w:t>HU-8.4 — Tiempos de envío de recordatorios configurables</w:t>
@@ -36546,7 +36549,7 @@
         <w:pStyle w:val="Ttulo2"/>
       </w:pPr>
       <w:bookmarkStart w:id="208" w:name="_09d49d8f9ce2d4331632fad53df16df04e0463f"/>
-      <w:bookmarkStart w:id="209" w:name="_Toc244091279"/>
+      <w:bookmarkStart w:id="209" w:name="_Toc244199688"/>
       <w:bookmarkEnd w:id="206"/>
       <w:r>
         <w:t>HU-8.5 — Bitácora de correos y notificaciones</w:t>
@@ -36770,7 +36773,7 @@
         <w:pStyle w:val="Ttulo1"/>
       </w:pPr>
       <w:bookmarkStart w:id="210" w:name="_739f4e5454618e53e20de4c2474955375ba75c3"/>
-      <w:bookmarkStart w:id="211" w:name="_Toc244091280"/>
+      <w:bookmarkStart w:id="211" w:name="_Toc244199689"/>
       <w:bookmarkEnd w:id="198"/>
       <w:bookmarkEnd w:id="208"/>
       <w:r>
@@ -36792,7 +36795,7 @@
         <w:pStyle w:val="Ttulo2"/>
       </w:pPr>
       <w:bookmarkStart w:id="212" w:name="_062138411ab05c870ba796ff3d39feef69a18f5"/>
-      <w:bookmarkStart w:id="213" w:name="_Toc244091281"/>
+      <w:bookmarkStart w:id="213" w:name="_Toc244199690"/>
       <w:r>
         <w:t>HU-9.1 — Página pública y políticas legales</w:t>
       </w:r>
@@ -37017,7 +37020,7 @@
         <w:pStyle w:val="Ttulo1"/>
       </w:pPr>
       <w:bookmarkStart w:id="214" w:name="_6e6ded5804ca164f89e595fd787218d3285fdda"/>
-      <w:bookmarkStart w:id="215" w:name="_Toc244091282"/>
+      <w:bookmarkStart w:id="215" w:name="_Toc244199691"/>
       <w:bookmarkEnd w:id="210"/>
       <w:bookmarkEnd w:id="212"/>
       <w:r>
@@ -37067,7 +37070,7 @@
         <w:pStyle w:val="Ttulo2"/>
       </w:pPr>
       <w:bookmarkStart w:id="216" w:name="_84c91a7718df0375d71f3af5025108c0495eae8"/>
-      <w:bookmarkStart w:id="217" w:name="_Toc244091283"/>
+      <w:bookmarkStart w:id="217" w:name="_Toc244199692"/>
       <w:r>
         <w:t>Entrega v2.0 — imprescindible para la presentación (29 historias; 159 puntos estimados y HU-2.12 por estimar)</w:t>
       </w:r>
@@ -38615,7 +38618,7 @@
         <w:pStyle w:val="Ttulo2"/>
       </w:pPr>
       <w:bookmarkStart w:id="218" w:name="_4726c838c4287a7aa8f67a2e091a84cc61b2bb0"/>
-      <w:bookmarkStart w:id="219" w:name="_Toc244091284"/>
+      <w:bookmarkStart w:id="219" w:name="_Toc244199693"/>
       <w:bookmarkEnd w:id="216"/>
       <w:r>
         <w:t>Entrega v2.1 — completa el alcance (16 historias; estimación de HU-0.5 pendiente)</w:t>
@@ -39566,7 +39569,7 @@
         <w:pStyle w:val="Ttulo2"/>
       </w:pPr>
       <w:bookmarkStart w:id="220" w:name="_18e859a36e2a2c7f781eaf2084ffc20b263712e"/>
-      <w:bookmarkStart w:id="221" w:name="_Toc244091285"/>
+      <w:bookmarkStart w:id="221" w:name="_Toc244199694"/>
       <w:bookmarkEnd w:id="218"/>
       <w:r>
         <w:t>Historias diferidas que absorbe la v2</w:t>
@@ -39917,7 +39920,7 @@
         <w:pStyle w:val="Ttulo1"/>
       </w:pPr>
       <w:bookmarkStart w:id="222" w:name="_2bd3782f46f42f4ba497da64d292df25adf2039"/>
-      <w:bookmarkStart w:id="223" w:name="_Toc244091286"/>
+      <w:bookmarkStart w:id="223" w:name="_Toc244199695"/>
       <w:bookmarkEnd w:id="214"/>
       <w:bookmarkEnd w:id="220"/>
       <w:r>
@@ -42104,7 +42107,7 @@
               <w:pStyle w:val="Celda"/>
             </w:pPr>
             <w:r>
-              <w:t>HU-2.1, HU-2.5, HU-2.9, HU-2.10, HU-5.12</w:t>
+              <w:t>HU-2.1, HU-2.5, HU-2.9, HU-2.10, HU-2.11, HU-5.12</w:t>
             </w:r>
           </w:p>
         </w:tc>
@@ -43585,7 +43588,7 @@
               <w:pStyle w:val="Celda"/>
             </w:pPr>
             <w:r>
-              <w:t>HU-2.11</w:t>
+              <w:t>HU-2.11, HU-4.13</w:t>
             </w:r>
           </w:p>
         </w:tc>
@@ -43623,7 +43626,7 @@
               <w:pStyle w:val="Celda"/>
             </w:pPr>
             <w:r>
-              <w:t>HU-4.18</w:t>
+              <w:t>HU-4.13, HU-4.18</w:t>
             </w:r>
           </w:p>
         </w:tc>
@@ -43771,7 +43774,7 @@
               <w:pStyle w:val="Celda"/>
             </w:pPr>
             <w:r>
-              <w:t>HU-4.17</w:t>
+              <w:t>HU-4.13, HU-4.17</w:t>
             </w:r>
           </w:p>
         </w:tc>
@@ -44707,7 +44710,7 @@
         <w:pStyle w:val="Ttulo1"/>
       </w:pPr>
       <w:bookmarkStart w:id="224" w:name="_628434b2c6f40c9643f3958509c62867ee6f47b"/>
-      <w:bookmarkStart w:id="225" w:name="_Toc244091287"/>
+      <w:bookmarkStart w:id="225" w:name="_Toc244199696"/>
       <w:bookmarkEnd w:id="222"/>
       <w:r>
         <w:lastRenderedPageBreak/>
@@ -50272,7 +50275,7 @@
               <w:noProof/>
             </w:rPr>
             <w:drawing>
-              <wp:inline distT="0" distB="0" distL="0" distR="0" wp14:anchorId="5A49B961" wp14:editId="5A49B962">
+              <wp:inline distT="0" distB="0" distL="0" distR="0" wp14:anchorId="735D7ADE" wp14:editId="735D7ADF">
                 <wp:extent cx="324000" cy="324000"/>
                 <wp:effectExtent l="0" t="0" r="0" b="0"/>
                 <wp:docPr id="9001" name="Logo Zooki"/>
@@ -50439,7 +50442,7 @@
   <w:abstractNum w:abstractNumId="0" w15:restartNumberingAfterBreak="0">
     <w:nsid w:val="0000A991"/>
     <w:multiLevelType w:val="multilevel"/>
-    <w:tmpl w:val="1BA606FC"/>
+    <w:tmpl w:val="6A1E7AE8"/>
     <w:lvl w:ilvl="0">
       <w:numFmt w:val="bullet"/>
       <w:lvlText w:val=""/>
@@ -50540,295 +50543,295 @@
       </w:rPr>
     </w:lvl>
   </w:abstractNum>
-  <w:num w:numId="1" w16cid:durableId="498498826">
+  <w:num w:numId="1" w16cid:durableId="82261948">
     <w:abstractNumId w:val="0"/>
   </w:num>
-  <w:num w:numId="2" w16cid:durableId="868298378">
+  <w:num w:numId="2" w16cid:durableId="138234233">
     <w:abstractNumId w:val="0"/>
   </w:num>
-  <w:num w:numId="3" w16cid:durableId="1954360355">
+  <w:num w:numId="3" w16cid:durableId="942885520">
     <w:abstractNumId w:val="0"/>
   </w:num>
-  <w:num w:numId="4" w16cid:durableId="653139925">
+  <w:num w:numId="4" w16cid:durableId="2049525009">
     <w:abstractNumId w:val="0"/>
   </w:num>
-  <w:num w:numId="5" w16cid:durableId="1217163265">
+  <w:num w:numId="5" w16cid:durableId="765812432">
     <w:abstractNumId w:val="0"/>
   </w:num>
-  <w:num w:numId="6" w16cid:durableId="614412654">
+  <w:num w:numId="6" w16cid:durableId="1551072699">
     <w:abstractNumId w:val="0"/>
   </w:num>
-  <w:num w:numId="7" w16cid:durableId="2096900820">
+  <w:num w:numId="7" w16cid:durableId="1162893388">
     <w:abstractNumId w:val="0"/>
   </w:num>
-  <w:num w:numId="8" w16cid:durableId="1453742451">
+  <w:num w:numId="8" w16cid:durableId="932780460">
     <w:abstractNumId w:val="0"/>
   </w:num>
-  <w:num w:numId="9" w16cid:durableId="184948983">
+  <w:num w:numId="9" w16cid:durableId="1336569375">
     <w:abstractNumId w:val="0"/>
   </w:num>
-  <w:num w:numId="10" w16cid:durableId="722942999">
+  <w:num w:numId="10" w16cid:durableId="1629820595">
     <w:abstractNumId w:val="0"/>
   </w:num>
-  <w:num w:numId="11" w16cid:durableId="1701661658">
+  <w:num w:numId="11" w16cid:durableId="432676967">
     <w:abstractNumId w:val="0"/>
   </w:num>
-  <w:num w:numId="12" w16cid:durableId="19162314">
+  <w:num w:numId="12" w16cid:durableId="1849831281">
     <w:abstractNumId w:val="0"/>
   </w:num>
-  <w:num w:numId="13" w16cid:durableId="97338257">
+  <w:num w:numId="13" w16cid:durableId="1654217779">
     <w:abstractNumId w:val="0"/>
   </w:num>
-  <w:num w:numId="14" w16cid:durableId="2020958285">
+  <w:num w:numId="14" w16cid:durableId="654145886">
     <w:abstractNumId w:val="0"/>
   </w:num>
-  <w:num w:numId="15" w16cid:durableId="819152049">
+  <w:num w:numId="15" w16cid:durableId="1990745651">
     <w:abstractNumId w:val="0"/>
   </w:num>
-  <w:num w:numId="16" w16cid:durableId="121853803">
+  <w:num w:numId="16" w16cid:durableId="185943634">
     <w:abstractNumId w:val="0"/>
   </w:num>
-  <w:num w:numId="17" w16cid:durableId="1099984612">
+  <w:num w:numId="17" w16cid:durableId="828523902">
     <w:abstractNumId w:val="0"/>
   </w:num>
-  <w:num w:numId="18" w16cid:durableId="1570845492">
+  <w:num w:numId="18" w16cid:durableId="199977804">
     <w:abstractNumId w:val="0"/>
   </w:num>
-  <w:num w:numId="19" w16cid:durableId="1778601644">
+  <w:num w:numId="19" w16cid:durableId="1288507948">
     <w:abstractNumId w:val="0"/>
   </w:num>
-  <w:num w:numId="20" w16cid:durableId="1640649662">
+  <w:num w:numId="20" w16cid:durableId="784619149">
     <w:abstractNumId w:val="0"/>
   </w:num>
-  <w:num w:numId="21" w16cid:durableId="1281106439">
+  <w:num w:numId="21" w16cid:durableId="628784957">
     <w:abstractNumId w:val="0"/>
   </w:num>
-  <w:num w:numId="22" w16cid:durableId="2014721488">
+  <w:num w:numId="22" w16cid:durableId="287592339">
     <w:abstractNumId w:val="0"/>
   </w:num>
-  <w:num w:numId="23" w16cid:durableId="685060029">
+  <w:num w:numId="23" w16cid:durableId="1032268800">
     <w:abstractNumId w:val="0"/>
   </w:num>
-  <w:num w:numId="24" w16cid:durableId="301272442">
+  <w:num w:numId="24" w16cid:durableId="883911115">
     <w:abstractNumId w:val="0"/>
   </w:num>
-  <w:num w:numId="25" w16cid:durableId="1778283441">
+  <w:num w:numId="25" w16cid:durableId="1912275599">
     <w:abstractNumId w:val="0"/>
   </w:num>
-  <w:num w:numId="26" w16cid:durableId="86973465">
+  <w:num w:numId="26" w16cid:durableId="1967589282">
     <w:abstractNumId w:val="0"/>
   </w:num>
-  <w:num w:numId="27" w16cid:durableId="933590948">
+  <w:num w:numId="27" w16cid:durableId="1236016608">
     <w:abstractNumId w:val="0"/>
   </w:num>
-  <w:num w:numId="28" w16cid:durableId="461268910">
+  <w:num w:numId="28" w16cid:durableId="1648581935">
     <w:abstractNumId w:val="0"/>
   </w:num>
-  <w:num w:numId="29" w16cid:durableId="1147475018">
+  <w:num w:numId="29" w16cid:durableId="888347910">
     <w:abstractNumId w:val="0"/>
   </w:num>
-  <w:num w:numId="30" w16cid:durableId="73481895">
+  <w:num w:numId="30" w16cid:durableId="1428695633">
     <w:abstractNumId w:val="0"/>
   </w:num>
-  <w:num w:numId="31" w16cid:durableId="195050100">
+  <w:num w:numId="31" w16cid:durableId="2045324879">
     <w:abstractNumId w:val="0"/>
   </w:num>
-  <w:num w:numId="32" w16cid:durableId="338123858">
+  <w:num w:numId="32" w16cid:durableId="452015133">
     <w:abstractNumId w:val="0"/>
   </w:num>
-  <w:num w:numId="33" w16cid:durableId="1877350041">
+  <w:num w:numId="33" w16cid:durableId="1641299458">
     <w:abstractNumId w:val="0"/>
   </w:num>
-  <w:num w:numId="34" w16cid:durableId="1250042289">
+  <w:num w:numId="34" w16cid:durableId="1485511886">
     <w:abstractNumId w:val="0"/>
   </w:num>
-  <w:num w:numId="35" w16cid:durableId="249048769">
+  <w:num w:numId="35" w16cid:durableId="1581212433">
     <w:abstractNumId w:val="0"/>
   </w:num>
-  <w:num w:numId="36" w16cid:durableId="254556561">
+  <w:num w:numId="36" w16cid:durableId="1008559305">
     <w:abstractNumId w:val="0"/>
   </w:num>
-  <w:num w:numId="37" w16cid:durableId="1909614606">
+  <w:num w:numId="37" w16cid:durableId="321736404">
     <w:abstractNumId w:val="0"/>
   </w:num>
-  <w:num w:numId="38" w16cid:durableId="983780614">
+  <w:num w:numId="38" w16cid:durableId="167406488">
     <w:abstractNumId w:val="0"/>
   </w:num>
-  <w:num w:numId="39" w16cid:durableId="1513376313">
+  <w:num w:numId="39" w16cid:durableId="340161691">
     <w:abstractNumId w:val="0"/>
   </w:num>
-  <w:num w:numId="40" w16cid:durableId="247737101">
+  <w:num w:numId="40" w16cid:durableId="884566669">
     <w:abstractNumId w:val="0"/>
   </w:num>
-  <w:num w:numId="41" w16cid:durableId="626467299">
+  <w:num w:numId="41" w16cid:durableId="885801949">
     <w:abstractNumId w:val="0"/>
   </w:num>
-  <w:num w:numId="42" w16cid:durableId="1788710">
+  <w:num w:numId="42" w16cid:durableId="1431857712">
     <w:abstractNumId w:val="0"/>
   </w:num>
-  <w:num w:numId="43" w16cid:durableId="923493936">
+  <w:num w:numId="43" w16cid:durableId="47414709">
     <w:abstractNumId w:val="0"/>
   </w:num>
-  <w:num w:numId="44" w16cid:durableId="185682512">
+  <w:num w:numId="44" w16cid:durableId="923298375">
     <w:abstractNumId w:val="0"/>
   </w:num>
-  <w:num w:numId="45" w16cid:durableId="2088915236">
+  <w:num w:numId="45" w16cid:durableId="2105686763">
     <w:abstractNumId w:val="0"/>
   </w:num>
-  <w:num w:numId="46" w16cid:durableId="115410174">
+  <w:num w:numId="46" w16cid:durableId="1108886722">
     <w:abstractNumId w:val="0"/>
   </w:num>
-  <w:num w:numId="47" w16cid:durableId="730687998">
+  <w:num w:numId="47" w16cid:durableId="2009743345">
     <w:abstractNumId w:val="0"/>
   </w:num>
-  <w:num w:numId="48" w16cid:durableId="1389301383">
+  <w:num w:numId="48" w16cid:durableId="321465709">
     <w:abstractNumId w:val="0"/>
   </w:num>
-  <w:num w:numId="49" w16cid:durableId="1138492530">
+  <w:num w:numId="49" w16cid:durableId="423653873">
     <w:abstractNumId w:val="0"/>
   </w:num>
-  <w:num w:numId="50" w16cid:durableId="201603016">
+  <w:num w:numId="50" w16cid:durableId="890456767">
     <w:abstractNumId w:val="0"/>
   </w:num>
-  <w:num w:numId="51" w16cid:durableId="25256075">
+  <w:num w:numId="51" w16cid:durableId="680163134">
     <w:abstractNumId w:val="0"/>
   </w:num>
-  <w:num w:numId="52" w16cid:durableId="1714186911">
+  <w:num w:numId="52" w16cid:durableId="995106063">
     <w:abstractNumId w:val="0"/>
   </w:num>
-  <w:num w:numId="53" w16cid:durableId="2143112173">
+  <w:num w:numId="53" w16cid:durableId="1625501143">
     <w:abstractNumId w:val="0"/>
   </w:num>
-  <w:num w:numId="54" w16cid:durableId="2023899995">
+  <w:num w:numId="54" w16cid:durableId="1630744660">
     <w:abstractNumId w:val="0"/>
   </w:num>
-  <w:num w:numId="55" w16cid:durableId="436682706">
+  <w:num w:numId="55" w16cid:durableId="1424567394">
     <w:abstractNumId w:val="0"/>
   </w:num>
-  <w:num w:numId="56" w16cid:durableId="2113671201">
+  <w:num w:numId="56" w16cid:durableId="657003452">
     <w:abstractNumId w:val="0"/>
   </w:num>
-  <w:num w:numId="57" w16cid:durableId="2031297779">
+  <w:num w:numId="57" w16cid:durableId="1436514703">
     <w:abstractNumId w:val="0"/>
   </w:num>
-  <w:num w:numId="58" w16cid:durableId="1847670852">
+  <w:num w:numId="58" w16cid:durableId="1568956394">
     <w:abstractNumId w:val="0"/>
   </w:num>
-  <w:num w:numId="59" w16cid:durableId="313919184">
+  <w:num w:numId="59" w16cid:durableId="2074044234">
     <w:abstractNumId w:val="0"/>
   </w:num>
-  <w:num w:numId="60" w16cid:durableId="1870950932">
+  <w:num w:numId="60" w16cid:durableId="569970846">
     <w:abstractNumId w:val="0"/>
   </w:num>
-  <w:num w:numId="61" w16cid:durableId="1869948328">
+  <w:num w:numId="61" w16cid:durableId="1013723650">
     <w:abstractNumId w:val="0"/>
   </w:num>
-  <w:num w:numId="62" w16cid:durableId="1068380027">
+  <w:num w:numId="62" w16cid:durableId="1618098272">
     <w:abstractNumId w:val="0"/>
   </w:num>
-  <w:num w:numId="63" w16cid:durableId="57559015">
+  <w:num w:numId="63" w16cid:durableId="2003855204">
     <w:abstractNumId w:val="0"/>
   </w:num>
-  <w:num w:numId="64" w16cid:durableId="150289728">
+  <w:num w:numId="64" w16cid:durableId="734551270">
     <w:abstractNumId w:val="0"/>
   </w:num>
-  <w:num w:numId="65" w16cid:durableId="316231892">
+  <w:num w:numId="65" w16cid:durableId="157617119">
     <w:abstractNumId w:val="0"/>
   </w:num>
-  <w:num w:numId="66" w16cid:durableId="962033926">
+  <w:num w:numId="66" w16cid:durableId="289677356">
     <w:abstractNumId w:val="0"/>
   </w:num>
-  <w:num w:numId="67" w16cid:durableId="1470509881">
+  <w:num w:numId="67" w16cid:durableId="15928053">
     <w:abstractNumId w:val="0"/>
   </w:num>
-  <w:num w:numId="68" w16cid:durableId="1731999649">
+  <w:num w:numId="68" w16cid:durableId="1056860176">
     <w:abstractNumId w:val="0"/>
   </w:num>
-  <w:num w:numId="69" w16cid:durableId="2118479067">
+  <w:num w:numId="69" w16cid:durableId="620377511">
     <w:abstractNumId w:val="0"/>
   </w:num>
-  <w:num w:numId="70" w16cid:durableId="416707936">
+  <w:num w:numId="70" w16cid:durableId="787118009">
     <w:abstractNumId w:val="0"/>
   </w:num>
-  <w:num w:numId="71" w16cid:durableId="459735964">
+  <w:num w:numId="71" w16cid:durableId="2005936441">
     <w:abstractNumId w:val="0"/>
   </w:num>
-  <w:num w:numId="72" w16cid:durableId="1744526744">
+  <w:num w:numId="72" w16cid:durableId="1491209877">
     <w:abstractNumId w:val="0"/>
   </w:num>
-  <w:num w:numId="73" w16cid:durableId="1396471049">
+  <w:num w:numId="73" w16cid:durableId="380060496">
     <w:abstractNumId w:val="0"/>
   </w:num>
-  <w:num w:numId="74" w16cid:durableId="499738484">
+  <w:num w:numId="74" w16cid:durableId="1192691707">
     <w:abstractNumId w:val="0"/>
   </w:num>
-  <w:num w:numId="75" w16cid:durableId="1104493658">
+  <w:num w:numId="75" w16cid:durableId="529875167">
     <w:abstractNumId w:val="0"/>
   </w:num>
-  <w:num w:numId="76" w16cid:durableId="676007908">
+  <w:num w:numId="76" w16cid:durableId="269123156">
     <w:abstractNumId w:val="0"/>
   </w:num>
-  <w:num w:numId="77" w16cid:durableId="1365863614">
+  <w:num w:numId="77" w16cid:durableId="1992558516">
     <w:abstractNumId w:val="0"/>
   </w:num>
-  <w:num w:numId="78" w16cid:durableId="48118728">
+  <w:num w:numId="78" w16cid:durableId="223680157">
     <w:abstractNumId w:val="0"/>
   </w:num>
-  <w:num w:numId="79" w16cid:durableId="1688173691">
+  <w:num w:numId="79" w16cid:durableId="1070542100">
     <w:abstractNumId w:val="0"/>
   </w:num>
-  <w:num w:numId="80" w16cid:durableId="124665902">
+  <w:num w:numId="80" w16cid:durableId="824786361">
     <w:abstractNumId w:val="0"/>
   </w:num>
-  <w:num w:numId="81" w16cid:durableId="2029328876">
+  <w:num w:numId="81" w16cid:durableId="1926762640">
     <w:abstractNumId w:val="0"/>
   </w:num>
-  <w:num w:numId="82" w16cid:durableId="1754162431">
+  <w:num w:numId="82" w16cid:durableId="216858830">
     <w:abstractNumId w:val="0"/>
   </w:num>
-  <w:num w:numId="83" w16cid:durableId="18089598">
+  <w:num w:numId="83" w16cid:durableId="1634553901">
     <w:abstractNumId w:val="0"/>
   </w:num>
-  <w:num w:numId="84" w16cid:durableId="930889735">
+  <w:num w:numId="84" w16cid:durableId="973876721">
     <w:abstractNumId w:val="0"/>
   </w:num>
-  <w:num w:numId="85" w16cid:durableId="256642258">
+  <w:num w:numId="85" w16cid:durableId="1352991025">
     <w:abstractNumId w:val="0"/>
   </w:num>
-  <w:num w:numId="86" w16cid:durableId="1212810354">
+  <w:num w:numId="86" w16cid:durableId="1735543163">
     <w:abstractNumId w:val="0"/>
   </w:num>
-  <w:num w:numId="87" w16cid:durableId="1287395701">
+  <w:num w:numId="87" w16cid:durableId="658507307">
     <w:abstractNumId w:val="0"/>
   </w:num>
-  <w:num w:numId="88" w16cid:durableId="489518083">
+  <w:num w:numId="88" w16cid:durableId="1456830187">
     <w:abstractNumId w:val="0"/>
   </w:num>
-  <w:num w:numId="89" w16cid:durableId="710955856">
+  <w:num w:numId="89" w16cid:durableId="1390691536">
     <w:abstractNumId w:val="0"/>
   </w:num>
-  <w:num w:numId="90" w16cid:durableId="620957423">
+  <w:num w:numId="90" w16cid:durableId="350647584">
     <w:abstractNumId w:val="0"/>
   </w:num>
-  <w:num w:numId="91" w16cid:durableId="986006972">
+  <w:num w:numId="91" w16cid:durableId="583297021">
     <w:abstractNumId w:val="0"/>
   </w:num>
-  <w:num w:numId="92" w16cid:durableId="600572025">
+  <w:num w:numId="92" w16cid:durableId="1352537747">
     <w:abstractNumId w:val="0"/>
   </w:num>
-  <w:num w:numId="93" w16cid:durableId="1852448123">
+  <w:num w:numId="93" w16cid:durableId="1221477451">
     <w:abstractNumId w:val="0"/>
   </w:num>
-  <w:num w:numId="94" w16cid:durableId="284120385">
+  <w:num w:numId="94" w16cid:durableId="927227865">
     <w:abstractNumId w:val="0"/>
   </w:num>
-  <w:num w:numId="95" w16cid:durableId="1061487361">
+  <w:num w:numId="95" w16cid:durableId="1169097598">
     <w:abstractNumId w:val="0"/>
   </w:num>
-  <w:num w:numId="96" w16cid:durableId="1448743188">
+  <w:num w:numId="96" w16cid:durableId="142627573">
     <w:abstractNumId w:val="0"/>
   </w:num>
-  <w:num w:numId="97" w16cid:durableId="510334971">
+  <w:num w:numId="97" w16cid:durableId="1355303473">
     <w:abstractNumId w:val="0"/>
   </w:num>
   <w:numIdMacAtCleanup w:val="97"/>
@@ -52220,7 +52223,7 @@
     <w:autoRedefine/>
     <w:uiPriority w:val="39"/>
     <w:unhideWhenUsed/>
-    <w:rsid w:val="00401222"/>
+    <w:rsid w:val="006A617E"/>
     <w:pPr>
       <w:spacing w:after="100" w:line="278" w:lineRule="auto"/>
       <w:ind w:left="480"/>
@@ -52239,7 +52242,7 @@
     <w:autoRedefine/>
     <w:uiPriority w:val="39"/>
     <w:unhideWhenUsed/>
-    <w:rsid w:val="00401222"/>
+    <w:rsid w:val="006A617E"/>
     <w:pPr>
       <w:spacing w:after="100" w:line="278" w:lineRule="auto"/>
       <w:ind w:left="720"/>
@@ -52258,7 +52261,7 @@
     <w:autoRedefine/>
     <w:uiPriority w:val="39"/>
     <w:unhideWhenUsed/>
-    <w:rsid w:val="00401222"/>
+    <w:rsid w:val="006A617E"/>
     <w:pPr>
       <w:spacing w:after="100" w:line="278" w:lineRule="auto"/>
       <w:ind w:left="960"/>
@@ -52277,7 +52280,7 @@
     <w:autoRedefine/>
     <w:uiPriority w:val="39"/>
     <w:unhideWhenUsed/>
-    <w:rsid w:val="00401222"/>
+    <w:rsid w:val="006A617E"/>
     <w:pPr>
       <w:spacing w:after="100" w:line="278" w:lineRule="auto"/>
       <w:ind w:left="1200"/>
@@ -52296,7 +52299,7 @@
     <w:autoRedefine/>
     <w:uiPriority w:val="39"/>
     <w:unhideWhenUsed/>
-    <w:rsid w:val="00401222"/>
+    <w:rsid w:val="006A617E"/>
     <w:pPr>
       <w:spacing w:after="100" w:line="278" w:lineRule="auto"/>
       <w:ind w:left="1440"/>
@@ -52315,7 +52318,7 @@
     <w:autoRedefine/>
     <w:uiPriority w:val="39"/>
     <w:unhideWhenUsed/>
-    <w:rsid w:val="00401222"/>
+    <w:rsid w:val="006A617E"/>
     <w:pPr>
       <w:spacing w:after="100" w:line="278" w:lineRule="auto"/>
       <w:ind w:left="1680"/>
@@ -52334,7 +52337,7 @@
     <w:autoRedefine/>
     <w:uiPriority w:val="39"/>
     <w:unhideWhenUsed/>
-    <w:rsid w:val="00401222"/>
+    <w:rsid w:val="006A617E"/>
     <w:pPr>
       <w:spacing w:after="100" w:line="278" w:lineRule="auto"/>
       <w:ind w:left="1920"/>
@@ -52352,7 +52355,7 @@
     <w:uiPriority w:val="99"/>
     <w:semiHidden/>
     <w:unhideWhenUsed/>
-    <w:rsid w:val="00401222"/>
+    <w:rsid w:val="006A617E"/>
     <w:rPr>
       <w:color w:val="605E5C"/>
       <w:shd w:val="clear" w:color="auto" w:fill="E1DFDD"/>

</xml_diff>

<commit_message>
feat(consulta): tratamientos y plan sugeridos al elegir el diagnostico (HU-2.8, HU-2.9, RE-2.8.4, RN-212)
</commit_message>
<xml_diff>
--- a/public/docs/descargas/hu.docx
+++ b/public/docs/descargas/hu.docx
@@ -93,7 +93,7 @@
           <w:noProof/>
         </w:rPr>
         <w:drawing>
-          <wp:inline distT="0" distB="0" distL="0" distR="0" wp14:anchorId="3D2F7D70" wp14:editId="3D2F7D71">
+          <wp:inline distT="0" distB="0" distL="0" distR="0" wp14:anchorId="57711CC2" wp14:editId="57711CC3">
             <wp:extent cx="395999" cy="405503"/>
             <wp:effectExtent l="0" t="0" r="0" b="0"/>
             <wp:docPr id="10" name="Picture"/>
@@ -229,7 +229,7 @@
               <w:pStyle w:val="Celda"/>
             </w:pPr>
             <w:r>
-              <w:t>29/10/2026</w:t>
+              <w:t>30/10/2026</w:t>
             </w:r>
           </w:p>
         </w:tc>
@@ -409,7 +409,7 @@
       <w:r>
         <w:fldChar w:fldCharType="separate"/>
       </w:r>
-      <w:hyperlink w:anchor="_Toc244208834" w:history="1">
+      <w:hyperlink w:anchor="_Toc244249286" w:history="1">
         <w:r>
           <w:rPr>
             <w:rStyle w:val="Hipervnculo"/>
@@ -445,7 +445,7 @@
             <w:noProof/>
             <w:webHidden/>
           </w:rPr>
-          <w:instrText xml:space="preserve"> PAGEREF _Toc244208834 \h </w:instrText>
+          <w:instrText xml:space="preserve"> PAGEREF _Toc244249286 \h </w:instrText>
         </w:r>
         <w:r>
           <w:rPr>
@@ -488,7 +488,7 @@
           <w14:ligatures w14:val="standardContextual"/>
         </w:rPr>
       </w:pPr>
-      <w:hyperlink w:anchor="_Toc244208835" w:history="1">
+      <w:hyperlink w:anchor="_Toc244249287" w:history="1">
         <w:r>
           <w:rPr>
             <w:rStyle w:val="Hipervnculo"/>
@@ -515,7 +515,7 @@
             <w:noProof/>
             <w:webHidden/>
           </w:rPr>
-          <w:instrText xml:space="preserve"> PAGEREF _Toc244208835 \h </w:instrText>
+          <w:instrText xml:space="preserve"> PAGEREF _Toc244249287 \h </w:instrText>
         </w:r>
         <w:r>
           <w:rPr>
@@ -558,7 +558,7 @@
           <w14:ligatures w14:val="standardContextual"/>
         </w:rPr>
       </w:pPr>
-      <w:hyperlink w:anchor="_Toc244208836" w:history="1">
+      <w:hyperlink w:anchor="_Toc244249288" w:history="1">
         <w:r>
           <w:rPr>
             <w:rStyle w:val="Hipervnculo"/>
@@ -585,7 +585,7 @@
             <w:noProof/>
             <w:webHidden/>
           </w:rPr>
-          <w:instrText xml:space="preserve"> PAGEREF _Toc244208836 \h </w:instrText>
+          <w:instrText xml:space="preserve"> PAGEREF _Toc244249288 \h </w:instrText>
         </w:r>
         <w:r>
           <w:rPr>
@@ -628,7 +628,7 @@
           <w14:ligatures w14:val="standardContextual"/>
         </w:rPr>
       </w:pPr>
-      <w:hyperlink w:anchor="_Toc244208837" w:history="1">
+      <w:hyperlink w:anchor="_Toc244249289" w:history="1">
         <w:r>
           <w:rPr>
             <w:rStyle w:val="Hipervnculo"/>
@@ -655,7 +655,7 @@
             <w:noProof/>
             <w:webHidden/>
           </w:rPr>
-          <w:instrText xml:space="preserve"> PAGEREF _Toc244208837 \h </w:instrText>
+          <w:instrText xml:space="preserve"> PAGEREF _Toc244249289 \h </w:instrText>
         </w:r>
         <w:r>
           <w:rPr>
@@ -698,7 +698,7 @@
           <w14:ligatures w14:val="standardContextual"/>
         </w:rPr>
       </w:pPr>
-      <w:hyperlink w:anchor="_Toc244208838" w:history="1">
+      <w:hyperlink w:anchor="_Toc244249290" w:history="1">
         <w:r>
           <w:rPr>
             <w:rStyle w:val="Hipervnculo"/>
@@ -725,7 +725,7 @@
             <w:noProof/>
             <w:webHidden/>
           </w:rPr>
-          <w:instrText xml:space="preserve"> PAGEREF _Toc244208838 \h </w:instrText>
+          <w:instrText xml:space="preserve"> PAGEREF _Toc244249290 \h </w:instrText>
         </w:r>
         <w:r>
           <w:rPr>
@@ -768,7 +768,7 @@
           <w14:ligatures w14:val="standardContextual"/>
         </w:rPr>
       </w:pPr>
-      <w:hyperlink w:anchor="_Toc244208839" w:history="1">
+      <w:hyperlink w:anchor="_Toc244249291" w:history="1">
         <w:r>
           <w:rPr>
             <w:rStyle w:val="Hipervnculo"/>
@@ -795,7 +795,7 @@
             <w:noProof/>
             <w:webHidden/>
           </w:rPr>
-          <w:instrText xml:space="preserve"> PAGEREF _Toc244208839 \h </w:instrText>
+          <w:instrText xml:space="preserve"> PAGEREF _Toc244249291 \h </w:instrText>
         </w:r>
         <w:r>
           <w:rPr>
@@ -841,7 +841,7 @@
           <w14:ligatures w14:val="standardContextual"/>
         </w:rPr>
       </w:pPr>
-      <w:hyperlink w:anchor="_Toc244208840" w:history="1">
+      <w:hyperlink w:anchor="_Toc244249292" w:history="1">
         <w:r>
           <w:rPr>
             <w:rStyle w:val="Hipervnculo"/>
@@ -868,7 +868,7 @@
             <w:noProof/>
             <w:webHidden/>
           </w:rPr>
-          <w:instrText xml:space="preserve"> PAGEREF _Toc244208840 \h </w:instrText>
+          <w:instrText xml:space="preserve"> PAGEREF _Toc244249292 \h </w:instrText>
         </w:r>
         <w:r>
           <w:rPr>
@@ -911,7 +911,7 @@
           <w14:ligatures w14:val="standardContextual"/>
         </w:rPr>
       </w:pPr>
-      <w:hyperlink w:anchor="_Toc244208841" w:history="1">
+      <w:hyperlink w:anchor="_Toc244249293" w:history="1">
         <w:r>
           <w:rPr>
             <w:rStyle w:val="Hipervnculo"/>
@@ -938,7 +938,7 @@
             <w:noProof/>
             <w:webHidden/>
           </w:rPr>
-          <w:instrText xml:space="preserve"> PAGEREF _Toc244208841 \h </w:instrText>
+          <w:instrText xml:space="preserve"> PAGEREF _Toc244249293 \h </w:instrText>
         </w:r>
         <w:r>
           <w:rPr>
@@ -981,7 +981,7 @@
           <w14:ligatures w14:val="standardContextual"/>
         </w:rPr>
       </w:pPr>
-      <w:hyperlink w:anchor="_Toc244208842" w:history="1">
+      <w:hyperlink w:anchor="_Toc244249294" w:history="1">
         <w:r>
           <w:rPr>
             <w:rStyle w:val="Hipervnculo"/>
@@ -1008,7 +1008,7 @@
             <w:noProof/>
             <w:webHidden/>
           </w:rPr>
-          <w:instrText xml:space="preserve"> PAGEREF _Toc244208842 \h </w:instrText>
+          <w:instrText xml:space="preserve"> PAGEREF _Toc244249294 \h </w:instrText>
         </w:r>
         <w:r>
           <w:rPr>
@@ -1051,7 +1051,7 @@
           <w14:ligatures w14:val="standardContextual"/>
         </w:rPr>
       </w:pPr>
-      <w:hyperlink w:anchor="_Toc244208843" w:history="1">
+      <w:hyperlink w:anchor="_Toc244249295" w:history="1">
         <w:r>
           <w:rPr>
             <w:rStyle w:val="Hipervnculo"/>
@@ -1078,7 +1078,7 @@
             <w:noProof/>
             <w:webHidden/>
           </w:rPr>
-          <w:instrText xml:space="preserve"> PAGEREF _Toc244208843 \h </w:instrText>
+          <w:instrText xml:space="preserve"> PAGEREF _Toc244249295 \h </w:instrText>
         </w:r>
         <w:r>
           <w:rPr>
@@ -1121,7 +1121,7 @@
           <w14:ligatures w14:val="standardContextual"/>
         </w:rPr>
       </w:pPr>
-      <w:hyperlink w:anchor="_Toc244208844" w:history="1">
+      <w:hyperlink w:anchor="_Toc244249296" w:history="1">
         <w:r>
           <w:rPr>
             <w:rStyle w:val="Hipervnculo"/>
@@ -1148,7 +1148,7 @@
             <w:noProof/>
             <w:webHidden/>
           </w:rPr>
-          <w:instrText xml:space="preserve"> PAGEREF _Toc244208844 \h </w:instrText>
+          <w:instrText xml:space="preserve"> PAGEREF _Toc244249296 \h </w:instrText>
         </w:r>
         <w:r>
           <w:rPr>
@@ -1191,7 +1191,7 @@
           <w14:ligatures w14:val="standardContextual"/>
         </w:rPr>
       </w:pPr>
-      <w:hyperlink w:anchor="_Toc244208845" w:history="1">
+      <w:hyperlink w:anchor="_Toc244249297" w:history="1">
         <w:r>
           <w:rPr>
             <w:rStyle w:val="Hipervnculo"/>
@@ -1218,7 +1218,7 @@
             <w:noProof/>
             <w:webHidden/>
           </w:rPr>
-          <w:instrText xml:space="preserve"> PAGEREF _Toc244208845 \h </w:instrText>
+          <w:instrText xml:space="preserve"> PAGEREF _Toc244249297 \h </w:instrText>
         </w:r>
         <w:r>
           <w:rPr>
@@ -1261,7 +1261,7 @@
           <w14:ligatures w14:val="standardContextual"/>
         </w:rPr>
       </w:pPr>
-      <w:hyperlink w:anchor="_Toc244208846" w:history="1">
+      <w:hyperlink w:anchor="_Toc244249298" w:history="1">
         <w:r>
           <w:rPr>
             <w:rStyle w:val="Hipervnculo"/>
@@ -1288,7 +1288,7 @@
             <w:noProof/>
             <w:webHidden/>
           </w:rPr>
-          <w:instrText xml:space="preserve"> PAGEREF _Toc244208846 \h </w:instrText>
+          <w:instrText xml:space="preserve"> PAGEREF _Toc244249298 \h </w:instrText>
         </w:r>
         <w:r>
           <w:rPr>
@@ -1331,7 +1331,7 @@
           <w14:ligatures w14:val="standardContextual"/>
         </w:rPr>
       </w:pPr>
-      <w:hyperlink w:anchor="_Toc244208847" w:history="1">
+      <w:hyperlink w:anchor="_Toc244249299" w:history="1">
         <w:r>
           <w:rPr>
             <w:rStyle w:val="Hipervnculo"/>
@@ -1358,7 +1358,7 @@
             <w:noProof/>
             <w:webHidden/>
           </w:rPr>
-          <w:instrText xml:space="preserve"> PAGEREF _Toc244208847 \h </w:instrText>
+          <w:instrText xml:space="preserve"> PAGEREF _Toc244249299 \h </w:instrText>
         </w:r>
         <w:r>
           <w:rPr>
@@ -1401,7 +1401,7 @@
           <w14:ligatures w14:val="standardContextual"/>
         </w:rPr>
       </w:pPr>
-      <w:hyperlink w:anchor="_Toc244208848" w:history="1">
+      <w:hyperlink w:anchor="_Toc244249300" w:history="1">
         <w:r>
           <w:rPr>
             <w:rStyle w:val="Hipervnculo"/>
@@ -1428,7 +1428,7 @@
             <w:noProof/>
             <w:webHidden/>
           </w:rPr>
-          <w:instrText xml:space="preserve"> PAGEREF _Toc244208848 \h </w:instrText>
+          <w:instrText xml:space="preserve"> PAGEREF _Toc244249300 \h </w:instrText>
         </w:r>
         <w:r>
           <w:rPr>
@@ -1471,7 +1471,7 @@
           <w14:ligatures w14:val="standardContextual"/>
         </w:rPr>
       </w:pPr>
-      <w:hyperlink w:anchor="_Toc244208849" w:history="1">
+      <w:hyperlink w:anchor="_Toc244249301" w:history="1">
         <w:r>
           <w:rPr>
             <w:rStyle w:val="Hipervnculo"/>
@@ -1498,7 +1498,7 @@
             <w:noProof/>
             <w:webHidden/>
           </w:rPr>
-          <w:instrText xml:space="preserve"> PAGEREF _Toc244208849 \h </w:instrText>
+          <w:instrText xml:space="preserve"> PAGEREF _Toc244249301 \h </w:instrText>
         </w:r>
         <w:r>
           <w:rPr>
@@ -1541,7 +1541,7 @@
           <w14:ligatures w14:val="standardContextual"/>
         </w:rPr>
       </w:pPr>
-      <w:hyperlink w:anchor="_Toc244208850" w:history="1">
+      <w:hyperlink w:anchor="_Toc244249302" w:history="1">
         <w:r>
           <w:rPr>
             <w:rStyle w:val="Hipervnculo"/>
@@ -1568,7 +1568,7 @@
             <w:noProof/>
             <w:webHidden/>
           </w:rPr>
-          <w:instrText xml:space="preserve"> PAGEREF _Toc244208850 \h </w:instrText>
+          <w:instrText xml:space="preserve"> PAGEREF _Toc244249302 \h </w:instrText>
         </w:r>
         <w:r>
           <w:rPr>
@@ -1611,7 +1611,7 @@
           <w14:ligatures w14:val="standardContextual"/>
         </w:rPr>
       </w:pPr>
-      <w:hyperlink w:anchor="_Toc244208851" w:history="1">
+      <w:hyperlink w:anchor="_Toc244249303" w:history="1">
         <w:r>
           <w:rPr>
             <w:rStyle w:val="Hipervnculo"/>
@@ -1638,7 +1638,7 @@
             <w:noProof/>
             <w:webHidden/>
           </w:rPr>
-          <w:instrText xml:space="preserve"> PAGEREF _Toc244208851 \h </w:instrText>
+          <w:instrText xml:space="preserve"> PAGEREF _Toc244249303 \h </w:instrText>
         </w:r>
         <w:r>
           <w:rPr>
@@ -1681,7 +1681,7 @@
           <w14:ligatures w14:val="standardContextual"/>
         </w:rPr>
       </w:pPr>
-      <w:hyperlink w:anchor="_Toc244208852" w:history="1">
+      <w:hyperlink w:anchor="_Toc244249304" w:history="1">
         <w:r>
           <w:rPr>
             <w:rStyle w:val="Hipervnculo"/>
@@ -1708,7 +1708,7 @@
             <w:noProof/>
             <w:webHidden/>
           </w:rPr>
-          <w:instrText xml:space="preserve"> PAGEREF _Toc244208852 \h </w:instrText>
+          <w:instrText xml:space="preserve"> PAGEREF _Toc244249304 \h </w:instrText>
         </w:r>
         <w:r>
           <w:rPr>
@@ -1751,7 +1751,7 @@
           <w14:ligatures w14:val="standardContextual"/>
         </w:rPr>
       </w:pPr>
-      <w:hyperlink w:anchor="_Toc244208853" w:history="1">
+      <w:hyperlink w:anchor="_Toc244249305" w:history="1">
         <w:r>
           <w:rPr>
             <w:rStyle w:val="Hipervnculo"/>
@@ -1778,7 +1778,7 @@
             <w:noProof/>
             <w:webHidden/>
           </w:rPr>
-          <w:instrText xml:space="preserve"> PAGEREF _Toc244208853 \h </w:instrText>
+          <w:instrText xml:space="preserve"> PAGEREF _Toc244249305 \h </w:instrText>
         </w:r>
         <w:r>
           <w:rPr>
@@ -1821,7 +1821,7 @@
           <w14:ligatures w14:val="standardContextual"/>
         </w:rPr>
       </w:pPr>
-      <w:hyperlink w:anchor="_Toc244208854" w:history="1">
+      <w:hyperlink w:anchor="_Toc244249306" w:history="1">
         <w:r>
           <w:rPr>
             <w:rStyle w:val="Hipervnculo"/>
@@ -1848,7 +1848,7 @@
             <w:noProof/>
             <w:webHidden/>
           </w:rPr>
-          <w:instrText xml:space="preserve"> PAGEREF _Toc244208854 \h </w:instrText>
+          <w:instrText xml:space="preserve"> PAGEREF _Toc244249306 \h </w:instrText>
         </w:r>
         <w:r>
           <w:rPr>
@@ -1891,7 +1891,7 @@
           <w14:ligatures w14:val="standardContextual"/>
         </w:rPr>
       </w:pPr>
-      <w:hyperlink w:anchor="_Toc244208855" w:history="1">
+      <w:hyperlink w:anchor="_Toc244249307" w:history="1">
         <w:r>
           <w:rPr>
             <w:rStyle w:val="Hipervnculo"/>
@@ -1918,7 +1918,7 @@
             <w:noProof/>
             <w:webHidden/>
           </w:rPr>
-          <w:instrText xml:space="preserve"> PAGEREF _Toc244208855 \h </w:instrText>
+          <w:instrText xml:space="preserve"> PAGEREF _Toc244249307 \h </w:instrText>
         </w:r>
         <w:r>
           <w:rPr>
@@ -1961,7 +1961,7 @@
           <w14:ligatures w14:val="standardContextual"/>
         </w:rPr>
       </w:pPr>
-      <w:hyperlink w:anchor="_Toc244208856" w:history="1">
+      <w:hyperlink w:anchor="_Toc244249308" w:history="1">
         <w:r>
           <w:rPr>
             <w:rStyle w:val="Hipervnculo"/>
@@ -1988,7 +1988,7 @@
             <w:noProof/>
             <w:webHidden/>
           </w:rPr>
-          <w:instrText xml:space="preserve"> PAGEREF _Toc244208856 \h </w:instrText>
+          <w:instrText xml:space="preserve"> PAGEREF _Toc244249308 \h </w:instrText>
         </w:r>
         <w:r>
           <w:rPr>
@@ -2031,7 +2031,7 @@
           <w14:ligatures w14:val="standardContextual"/>
         </w:rPr>
       </w:pPr>
-      <w:hyperlink w:anchor="_Toc244208857" w:history="1">
+      <w:hyperlink w:anchor="_Toc244249309" w:history="1">
         <w:r>
           <w:rPr>
             <w:rStyle w:val="Hipervnculo"/>
@@ -2058,7 +2058,7 @@
             <w:noProof/>
             <w:webHidden/>
           </w:rPr>
-          <w:instrText xml:space="preserve"> PAGEREF _Toc244208857 \h </w:instrText>
+          <w:instrText xml:space="preserve"> PAGEREF _Toc244249309 \h </w:instrText>
         </w:r>
         <w:r>
           <w:rPr>
@@ -2101,7 +2101,7 @@
           <w14:ligatures w14:val="standardContextual"/>
         </w:rPr>
       </w:pPr>
-      <w:hyperlink w:anchor="_Toc244208858" w:history="1">
+      <w:hyperlink w:anchor="_Toc244249310" w:history="1">
         <w:r>
           <w:rPr>
             <w:rStyle w:val="Hipervnculo"/>
@@ -2128,7 +2128,7 @@
             <w:noProof/>
             <w:webHidden/>
           </w:rPr>
-          <w:instrText xml:space="preserve"> PAGEREF _Toc244208858 \h </w:instrText>
+          <w:instrText xml:space="preserve"> PAGEREF _Toc244249310 \h </w:instrText>
         </w:r>
         <w:r>
           <w:rPr>
@@ -2171,7 +2171,7 @@
           <w14:ligatures w14:val="standardContextual"/>
         </w:rPr>
       </w:pPr>
-      <w:hyperlink w:anchor="_Toc244208859" w:history="1">
+      <w:hyperlink w:anchor="_Toc244249311" w:history="1">
         <w:r>
           <w:rPr>
             <w:rStyle w:val="Hipervnculo"/>
@@ -2198,7 +2198,7 @@
             <w:noProof/>
             <w:webHidden/>
           </w:rPr>
-          <w:instrText xml:space="preserve"> PAGEREF _Toc244208859 \h </w:instrText>
+          <w:instrText xml:space="preserve"> PAGEREF _Toc244249311 \h </w:instrText>
         </w:r>
         <w:r>
           <w:rPr>
@@ -2244,7 +2244,7 @@
           <w14:ligatures w14:val="standardContextual"/>
         </w:rPr>
       </w:pPr>
-      <w:hyperlink w:anchor="_Toc244208860" w:history="1">
+      <w:hyperlink w:anchor="_Toc244249312" w:history="1">
         <w:r>
           <w:rPr>
             <w:rStyle w:val="Hipervnculo"/>
@@ -2271,7 +2271,7 @@
             <w:noProof/>
             <w:webHidden/>
           </w:rPr>
-          <w:instrText xml:space="preserve"> PAGEREF _Toc244208860 \h </w:instrText>
+          <w:instrText xml:space="preserve"> PAGEREF _Toc244249312 \h </w:instrText>
         </w:r>
         <w:r>
           <w:rPr>
@@ -2314,7 +2314,7 @@
           <w14:ligatures w14:val="standardContextual"/>
         </w:rPr>
       </w:pPr>
-      <w:hyperlink w:anchor="_Toc244208861" w:history="1">
+      <w:hyperlink w:anchor="_Toc244249313" w:history="1">
         <w:r>
           <w:rPr>
             <w:rStyle w:val="Hipervnculo"/>
@@ -2341,7 +2341,7 @@
             <w:noProof/>
             <w:webHidden/>
           </w:rPr>
-          <w:instrText xml:space="preserve"> PAGEREF _Toc244208861 \h </w:instrText>
+          <w:instrText xml:space="preserve"> PAGEREF _Toc244249313 \h </w:instrText>
         </w:r>
         <w:r>
           <w:rPr>
@@ -2384,7 +2384,7 @@
           <w14:ligatures w14:val="standardContextual"/>
         </w:rPr>
       </w:pPr>
-      <w:hyperlink w:anchor="_Toc244208862" w:history="1">
+      <w:hyperlink w:anchor="_Toc244249314" w:history="1">
         <w:r>
           <w:rPr>
             <w:rStyle w:val="Hipervnculo"/>
@@ -2411,7 +2411,7 @@
             <w:noProof/>
             <w:webHidden/>
           </w:rPr>
-          <w:instrText xml:space="preserve"> PAGEREF _Toc244208862 \h </w:instrText>
+          <w:instrText xml:space="preserve"> PAGEREF _Toc244249314 \h </w:instrText>
         </w:r>
         <w:r>
           <w:rPr>
@@ -2454,7 +2454,7 @@
           <w14:ligatures w14:val="standardContextual"/>
         </w:rPr>
       </w:pPr>
-      <w:hyperlink w:anchor="_Toc244208863" w:history="1">
+      <w:hyperlink w:anchor="_Toc244249315" w:history="1">
         <w:r>
           <w:rPr>
             <w:rStyle w:val="Hipervnculo"/>
@@ -2481,7 +2481,7 @@
             <w:noProof/>
             <w:webHidden/>
           </w:rPr>
-          <w:instrText xml:space="preserve"> PAGEREF _Toc244208863 \h </w:instrText>
+          <w:instrText xml:space="preserve"> PAGEREF _Toc244249315 \h </w:instrText>
         </w:r>
         <w:r>
           <w:rPr>
@@ -2524,7 +2524,7 @@
           <w14:ligatures w14:val="standardContextual"/>
         </w:rPr>
       </w:pPr>
-      <w:hyperlink w:anchor="_Toc244208864" w:history="1">
+      <w:hyperlink w:anchor="_Toc244249316" w:history="1">
         <w:r>
           <w:rPr>
             <w:rStyle w:val="Hipervnculo"/>
@@ -2551,7 +2551,7 @@
             <w:noProof/>
             <w:webHidden/>
           </w:rPr>
-          <w:instrText xml:space="preserve"> PAGEREF _Toc244208864 \h </w:instrText>
+          <w:instrText xml:space="preserve"> PAGEREF _Toc244249316 \h </w:instrText>
         </w:r>
         <w:r>
           <w:rPr>
@@ -2594,7 +2594,7 @@
           <w14:ligatures w14:val="standardContextual"/>
         </w:rPr>
       </w:pPr>
-      <w:hyperlink w:anchor="_Toc244208865" w:history="1">
+      <w:hyperlink w:anchor="_Toc244249317" w:history="1">
         <w:r>
           <w:rPr>
             <w:rStyle w:val="Hipervnculo"/>
@@ -2621,7 +2621,7 @@
             <w:noProof/>
             <w:webHidden/>
           </w:rPr>
-          <w:instrText xml:space="preserve"> PAGEREF _Toc244208865 \h </w:instrText>
+          <w:instrText xml:space="preserve"> PAGEREF _Toc244249317 \h </w:instrText>
         </w:r>
         <w:r>
           <w:rPr>
@@ -2667,7 +2667,7 @@
           <w14:ligatures w14:val="standardContextual"/>
         </w:rPr>
       </w:pPr>
-      <w:hyperlink w:anchor="_Toc244208866" w:history="1">
+      <w:hyperlink w:anchor="_Toc244249318" w:history="1">
         <w:r>
           <w:rPr>
             <w:rStyle w:val="Hipervnculo"/>
@@ -2694,7 +2694,7 @@
             <w:noProof/>
             <w:webHidden/>
           </w:rPr>
-          <w:instrText xml:space="preserve"> PAGEREF _Toc244208866 \h </w:instrText>
+          <w:instrText xml:space="preserve"> PAGEREF _Toc244249318 \h </w:instrText>
         </w:r>
         <w:r>
           <w:rPr>
@@ -2737,7 +2737,7 @@
           <w14:ligatures w14:val="standardContextual"/>
         </w:rPr>
       </w:pPr>
-      <w:hyperlink w:anchor="_Toc244208867" w:history="1">
+      <w:hyperlink w:anchor="_Toc244249319" w:history="1">
         <w:r>
           <w:rPr>
             <w:rStyle w:val="Hipervnculo"/>
@@ -2764,7 +2764,7 @@
             <w:noProof/>
             <w:webHidden/>
           </w:rPr>
-          <w:instrText xml:space="preserve"> PAGEREF _Toc244208867 \h </w:instrText>
+          <w:instrText xml:space="preserve"> PAGEREF _Toc244249319 \h </w:instrText>
         </w:r>
         <w:r>
           <w:rPr>
@@ -2807,7 +2807,7 @@
           <w14:ligatures w14:val="standardContextual"/>
         </w:rPr>
       </w:pPr>
-      <w:hyperlink w:anchor="_Toc244208868" w:history="1">
+      <w:hyperlink w:anchor="_Toc244249320" w:history="1">
         <w:r>
           <w:rPr>
             <w:rStyle w:val="Hipervnculo"/>
@@ -2834,7 +2834,7 @@
             <w:noProof/>
             <w:webHidden/>
           </w:rPr>
-          <w:instrText xml:space="preserve"> PAGEREF _Toc244208868 \h </w:instrText>
+          <w:instrText xml:space="preserve"> PAGEREF _Toc244249320 \h </w:instrText>
         </w:r>
         <w:r>
           <w:rPr>
@@ -2877,7 +2877,7 @@
           <w14:ligatures w14:val="standardContextual"/>
         </w:rPr>
       </w:pPr>
-      <w:hyperlink w:anchor="_Toc244208869" w:history="1">
+      <w:hyperlink w:anchor="_Toc244249321" w:history="1">
         <w:r>
           <w:rPr>
             <w:rStyle w:val="Hipervnculo"/>
@@ -2904,7 +2904,7 @@
             <w:noProof/>
             <w:webHidden/>
           </w:rPr>
-          <w:instrText xml:space="preserve"> PAGEREF _Toc244208869 \h </w:instrText>
+          <w:instrText xml:space="preserve"> PAGEREF _Toc244249321 \h </w:instrText>
         </w:r>
         <w:r>
           <w:rPr>
@@ -2947,7 +2947,7 @@
           <w14:ligatures w14:val="standardContextual"/>
         </w:rPr>
       </w:pPr>
-      <w:hyperlink w:anchor="_Toc244208870" w:history="1">
+      <w:hyperlink w:anchor="_Toc244249322" w:history="1">
         <w:r>
           <w:rPr>
             <w:rStyle w:val="Hipervnculo"/>
@@ -2974,7 +2974,7 @@
             <w:noProof/>
             <w:webHidden/>
           </w:rPr>
-          <w:instrText xml:space="preserve"> PAGEREF _Toc244208870 \h </w:instrText>
+          <w:instrText xml:space="preserve"> PAGEREF _Toc244249322 \h </w:instrText>
         </w:r>
         <w:r>
           <w:rPr>
@@ -3017,7 +3017,7 @@
           <w14:ligatures w14:val="standardContextual"/>
         </w:rPr>
       </w:pPr>
-      <w:hyperlink w:anchor="_Toc244208871" w:history="1">
+      <w:hyperlink w:anchor="_Toc244249323" w:history="1">
         <w:r>
           <w:rPr>
             <w:rStyle w:val="Hipervnculo"/>
@@ -3044,7 +3044,7 @@
             <w:noProof/>
             <w:webHidden/>
           </w:rPr>
-          <w:instrText xml:space="preserve"> PAGEREF _Toc244208871 \h </w:instrText>
+          <w:instrText xml:space="preserve"> PAGEREF _Toc244249323 \h </w:instrText>
         </w:r>
         <w:r>
           <w:rPr>
@@ -3087,7 +3087,7 @@
           <w14:ligatures w14:val="standardContextual"/>
         </w:rPr>
       </w:pPr>
-      <w:hyperlink w:anchor="_Toc244208872" w:history="1">
+      <w:hyperlink w:anchor="_Toc244249324" w:history="1">
         <w:r>
           <w:rPr>
             <w:rStyle w:val="Hipervnculo"/>
@@ -3114,7 +3114,7 @@
             <w:noProof/>
             <w:webHidden/>
           </w:rPr>
-          <w:instrText xml:space="preserve"> PAGEREF _Toc244208872 \h </w:instrText>
+          <w:instrText xml:space="preserve"> PAGEREF _Toc244249324 \h </w:instrText>
         </w:r>
         <w:r>
           <w:rPr>
@@ -3157,7 +3157,7 @@
           <w14:ligatures w14:val="standardContextual"/>
         </w:rPr>
       </w:pPr>
-      <w:hyperlink w:anchor="_Toc244208873" w:history="1">
+      <w:hyperlink w:anchor="_Toc244249325" w:history="1">
         <w:r>
           <w:rPr>
             <w:rStyle w:val="Hipervnculo"/>
@@ -3184,7 +3184,7 @@
             <w:noProof/>
             <w:webHidden/>
           </w:rPr>
-          <w:instrText xml:space="preserve"> PAGEREF _Toc244208873 \h </w:instrText>
+          <w:instrText xml:space="preserve"> PAGEREF _Toc244249325 \h </w:instrText>
         </w:r>
         <w:r>
           <w:rPr>
@@ -3227,7 +3227,7 @@
           <w14:ligatures w14:val="standardContextual"/>
         </w:rPr>
       </w:pPr>
-      <w:hyperlink w:anchor="_Toc244208874" w:history="1">
+      <w:hyperlink w:anchor="_Toc244249326" w:history="1">
         <w:r>
           <w:rPr>
             <w:rStyle w:val="Hipervnculo"/>
@@ -3254,7 +3254,7 @@
             <w:noProof/>
             <w:webHidden/>
           </w:rPr>
-          <w:instrText xml:space="preserve"> PAGEREF _Toc244208874 \h </w:instrText>
+          <w:instrText xml:space="preserve"> PAGEREF _Toc244249326 \h </w:instrText>
         </w:r>
         <w:r>
           <w:rPr>
@@ -3297,7 +3297,7 @@
           <w14:ligatures w14:val="standardContextual"/>
         </w:rPr>
       </w:pPr>
-      <w:hyperlink w:anchor="_Toc244208875" w:history="1">
+      <w:hyperlink w:anchor="_Toc244249327" w:history="1">
         <w:r>
           <w:rPr>
             <w:rStyle w:val="Hipervnculo"/>
@@ -3324,7 +3324,7 @@
             <w:noProof/>
             <w:webHidden/>
           </w:rPr>
-          <w:instrText xml:space="preserve"> PAGEREF _Toc244208875 \h </w:instrText>
+          <w:instrText xml:space="preserve"> PAGEREF _Toc244249327 \h </w:instrText>
         </w:r>
         <w:r>
           <w:rPr>
@@ -3367,7 +3367,7 @@
           <w14:ligatures w14:val="standardContextual"/>
         </w:rPr>
       </w:pPr>
-      <w:hyperlink w:anchor="_Toc244208876" w:history="1">
+      <w:hyperlink w:anchor="_Toc244249328" w:history="1">
         <w:r>
           <w:rPr>
             <w:rStyle w:val="Hipervnculo"/>
@@ -3394,7 +3394,7 @@
             <w:noProof/>
             <w:webHidden/>
           </w:rPr>
-          <w:instrText xml:space="preserve"> PAGEREF _Toc244208876 \h </w:instrText>
+          <w:instrText xml:space="preserve"> PAGEREF _Toc244249328 \h </w:instrText>
         </w:r>
         <w:r>
           <w:rPr>
@@ -3437,7 +3437,7 @@
           <w14:ligatures w14:val="standardContextual"/>
         </w:rPr>
       </w:pPr>
-      <w:hyperlink w:anchor="_Toc244208877" w:history="1">
+      <w:hyperlink w:anchor="_Toc244249329" w:history="1">
         <w:r>
           <w:rPr>
             <w:rStyle w:val="Hipervnculo"/>
@@ -3464,7 +3464,7 @@
             <w:noProof/>
             <w:webHidden/>
           </w:rPr>
-          <w:instrText xml:space="preserve"> PAGEREF _Toc244208877 \h </w:instrText>
+          <w:instrText xml:space="preserve"> PAGEREF _Toc244249329 \h </w:instrText>
         </w:r>
         <w:r>
           <w:rPr>
@@ -3507,7 +3507,7 @@
           <w14:ligatures w14:val="standardContextual"/>
         </w:rPr>
       </w:pPr>
-      <w:hyperlink w:anchor="_Toc244208878" w:history="1">
+      <w:hyperlink w:anchor="_Toc244249330" w:history="1">
         <w:r>
           <w:rPr>
             <w:rStyle w:val="Hipervnculo"/>
@@ -3534,7 +3534,7 @@
             <w:noProof/>
             <w:webHidden/>
           </w:rPr>
-          <w:instrText xml:space="preserve"> PAGEREF _Toc244208878 \h </w:instrText>
+          <w:instrText xml:space="preserve"> PAGEREF _Toc244249330 \h </w:instrText>
         </w:r>
         <w:r>
           <w:rPr>
@@ -3580,7 +3580,7 @@
           <w14:ligatures w14:val="standardContextual"/>
         </w:rPr>
       </w:pPr>
-      <w:hyperlink w:anchor="_Toc244208879" w:history="1">
+      <w:hyperlink w:anchor="_Toc244249331" w:history="1">
         <w:r>
           <w:rPr>
             <w:rStyle w:val="Hipervnculo"/>
@@ -3607,7 +3607,7 @@
             <w:noProof/>
             <w:webHidden/>
           </w:rPr>
-          <w:instrText xml:space="preserve"> PAGEREF _Toc244208879 \h </w:instrText>
+          <w:instrText xml:space="preserve"> PAGEREF _Toc244249331 \h </w:instrText>
         </w:r>
         <w:r>
           <w:rPr>
@@ -3650,7 +3650,7 @@
           <w14:ligatures w14:val="standardContextual"/>
         </w:rPr>
       </w:pPr>
-      <w:hyperlink w:anchor="_Toc244208880" w:history="1">
+      <w:hyperlink w:anchor="_Toc244249332" w:history="1">
         <w:r>
           <w:rPr>
             <w:rStyle w:val="Hipervnculo"/>
@@ -3677,7 +3677,7 @@
             <w:noProof/>
             <w:webHidden/>
           </w:rPr>
-          <w:instrText xml:space="preserve"> PAGEREF _Toc244208880 \h </w:instrText>
+          <w:instrText xml:space="preserve"> PAGEREF _Toc244249332 \h </w:instrText>
         </w:r>
         <w:r>
           <w:rPr>
@@ -3720,7 +3720,7 @@
           <w14:ligatures w14:val="standardContextual"/>
         </w:rPr>
       </w:pPr>
-      <w:hyperlink w:anchor="_Toc244208881" w:history="1">
+      <w:hyperlink w:anchor="_Toc244249333" w:history="1">
         <w:r>
           <w:rPr>
             <w:rStyle w:val="Hipervnculo"/>
@@ -3747,7 +3747,7 @@
             <w:noProof/>
             <w:webHidden/>
           </w:rPr>
-          <w:instrText xml:space="preserve"> PAGEREF _Toc244208881 \h </w:instrText>
+          <w:instrText xml:space="preserve"> PAGEREF _Toc244249333 \h </w:instrText>
         </w:r>
         <w:r>
           <w:rPr>
@@ -3790,7 +3790,7 @@
           <w14:ligatures w14:val="standardContextual"/>
         </w:rPr>
       </w:pPr>
-      <w:hyperlink w:anchor="_Toc244208882" w:history="1">
+      <w:hyperlink w:anchor="_Toc244249334" w:history="1">
         <w:r>
           <w:rPr>
             <w:rStyle w:val="Hipervnculo"/>
@@ -3817,7 +3817,7 @@
             <w:noProof/>
             <w:webHidden/>
           </w:rPr>
-          <w:instrText xml:space="preserve"> PAGEREF _Toc244208882 \h </w:instrText>
+          <w:instrText xml:space="preserve"> PAGEREF _Toc244249334 \h </w:instrText>
         </w:r>
         <w:r>
           <w:rPr>
@@ -3860,7 +3860,7 @@
           <w14:ligatures w14:val="standardContextual"/>
         </w:rPr>
       </w:pPr>
-      <w:hyperlink w:anchor="_Toc244208883" w:history="1">
+      <w:hyperlink w:anchor="_Toc244249335" w:history="1">
         <w:r>
           <w:rPr>
             <w:rStyle w:val="Hipervnculo"/>
@@ -3887,7 +3887,7 @@
             <w:noProof/>
             <w:webHidden/>
           </w:rPr>
-          <w:instrText xml:space="preserve"> PAGEREF _Toc244208883 \h </w:instrText>
+          <w:instrText xml:space="preserve"> PAGEREF _Toc244249335 \h </w:instrText>
         </w:r>
         <w:r>
           <w:rPr>
@@ -3930,7 +3930,7 @@
           <w14:ligatures w14:val="standardContextual"/>
         </w:rPr>
       </w:pPr>
-      <w:hyperlink w:anchor="_Toc244208884" w:history="1">
+      <w:hyperlink w:anchor="_Toc244249336" w:history="1">
         <w:r>
           <w:rPr>
             <w:rStyle w:val="Hipervnculo"/>
@@ -3957,7 +3957,7 @@
             <w:noProof/>
             <w:webHidden/>
           </w:rPr>
-          <w:instrText xml:space="preserve"> PAGEREF _Toc244208884 \h </w:instrText>
+          <w:instrText xml:space="preserve"> PAGEREF _Toc244249336 \h </w:instrText>
         </w:r>
         <w:r>
           <w:rPr>
@@ -4000,7 +4000,7 @@
           <w14:ligatures w14:val="standardContextual"/>
         </w:rPr>
       </w:pPr>
-      <w:hyperlink w:anchor="_Toc244208885" w:history="1">
+      <w:hyperlink w:anchor="_Toc244249337" w:history="1">
         <w:r>
           <w:rPr>
             <w:rStyle w:val="Hipervnculo"/>
@@ -4027,7 +4027,7 @@
             <w:noProof/>
             <w:webHidden/>
           </w:rPr>
-          <w:instrText xml:space="preserve"> PAGEREF _Toc244208885 \h </w:instrText>
+          <w:instrText xml:space="preserve"> PAGEREF _Toc244249337 \h </w:instrText>
         </w:r>
         <w:r>
           <w:rPr>
@@ -4073,7 +4073,7 @@
           <w14:ligatures w14:val="standardContextual"/>
         </w:rPr>
       </w:pPr>
-      <w:hyperlink w:anchor="_Toc244208886" w:history="1">
+      <w:hyperlink w:anchor="_Toc244249338" w:history="1">
         <w:r>
           <w:rPr>
             <w:rStyle w:val="Hipervnculo"/>
@@ -4100,7 +4100,7 @@
             <w:noProof/>
             <w:webHidden/>
           </w:rPr>
-          <w:instrText xml:space="preserve"> PAGEREF _Toc244208886 \h </w:instrText>
+          <w:instrText xml:space="preserve"> PAGEREF _Toc244249338 \h </w:instrText>
         </w:r>
         <w:r>
           <w:rPr>
@@ -4143,7 +4143,7 @@
           <w14:ligatures w14:val="standardContextual"/>
         </w:rPr>
       </w:pPr>
-      <w:hyperlink w:anchor="_Toc244208887" w:history="1">
+      <w:hyperlink w:anchor="_Toc244249339" w:history="1">
         <w:r>
           <w:rPr>
             <w:rStyle w:val="Hipervnculo"/>
@@ -4170,7 +4170,7 @@
             <w:noProof/>
             <w:webHidden/>
           </w:rPr>
-          <w:instrText xml:space="preserve"> PAGEREF _Toc244208887 \h </w:instrText>
+          <w:instrText xml:space="preserve"> PAGEREF _Toc244249339 \h </w:instrText>
         </w:r>
         <w:r>
           <w:rPr>
@@ -4213,7 +4213,7 @@
           <w14:ligatures w14:val="standardContextual"/>
         </w:rPr>
       </w:pPr>
-      <w:hyperlink w:anchor="_Toc244208888" w:history="1">
+      <w:hyperlink w:anchor="_Toc244249340" w:history="1">
         <w:r>
           <w:rPr>
             <w:rStyle w:val="Hipervnculo"/>
@@ -4240,7 +4240,7 @@
             <w:noProof/>
             <w:webHidden/>
           </w:rPr>
-          <w:instrText xml:space="preserve"> PAGEREF _Toc244208888 \h </w:instrText>
+          <w:instrText xml:space="preserve"> PAGEREF _Toc244249340 \h </w:instrText>
         </w:r>
         <w:r>
           <w:rPr>
@@ -4283,7 +4283,7 @@
           <w14:ligatures w14:val="standardContextual"/>
         </w:rPr>
       </w:pPr>
-      <w:hyperlink w:anchor="_Toc244208889" w:history="1">
+      <w:hyperlink w:anchor="_Toc244249341" w:history="1">
         <w:r>
           <w:rPr>
             <w:rStyle w:val="Hipervnculo"/>
@@ -4310,7 +4310,7 @@
             <w:noProof/>
             <w:webHidden/>
           </w:rPr>
-          <w:instrText xml:space="preserve"> PAGEREF _Toc244208889 \h </w:instrText>
+          <w:instrText xml:space="preserve"> PAGEREF _Toc244249341 \h </w:instrText>
         </w:r>
         <w:r>
           <w:rPr>
@@ -4353,7 +4353,7 @@
           <w14:ligatures w14:val="standardContextual"/>
         </w:rPr>
       </w:pPr>
-      <w:hyperlink w:anchor="_Toc244208890" w:history="1">
+      <w:hyperlink w:anchor="_Toc244249342" w:history="1">
         <w:r>
           <w:rPr>
             <w:rStyle w:val="Hipervnculo"/>
@@ -4380,7 +4380,7 @@
             <w:noProof/>
             <w:webHidden/>
           </w:rPr>
-          <w:instrText xml:space="preserve"> PAGEREF _Toc244208890 \h </w:instrText>
+          <w:instrText xml:space="preserve"> PAGEREF _Toc244249342 \h </w:instrText>
         </w:r>
         <w:r>
           <w:rPr>
@@ -4423,7 +4423,7 @@
           <w14:ligatures w14:val="standardContextual"/>
         </w:rPr>
       </w:pPr>
-      <w:hyperlink w:anchor="_Toc244208891" w:history="1">
+      <w:hyperlink w:anchor="_Toc244249343" w:history="1">
         <w:r>
           <w:rPr>
             <w:rStyle w:val="Hipervnculo"/>
@@ -4450,7 +4450,7 @@
             <w:noProof/>
             <w:webHidden/>
           </w:rPr>
-          <w:instrText xml:space="preserve"> PAGEREF _Toc244208891 \h </w:instrText>
+          <w:instrText xml:space="preserve"> PAGEREF _Toc244249343 \h </w:instrText>
         </w:r>
         <w:r>
           <w:rPr>
@@ -4493,7 +4493,7 @@
           <w14:ligatures w14:val="standardContextual"/>
         </w:rPr>
       </w:pPr>
-      <w:hyperlink w:anchor="_Toc244208892" w:history="1">
+      <w:hyperlink w:anchor="_Toc244249344" w:history="1">
         <w:r>
           <w:rPr>
             <w:rStyle w:val="Hipervnculo"/>
@@ -4520,7 +4520,7 @@
             <w:noProof/>
             <w:webHidden/>
           </w:rPr>
-          <w:instrText xml:space="preserve"> PAGEREF _Toc244208892 \h </w:instrText>
+          <w:instrText xml:space="preserve"> PAGEREF _Toc244249344 \h </w:instrText>
         </w:r>
         <w:r>
           <w:rPr>
@@ -4563,7 +4563,7 @@
           <w14:ligatures w14:val="standardContextual"/>
         </w:rPr>
       </w:pPr>
-      <w:hyperlink w:anchor="_Toc244208893" w:history="1">
+      <w:hyperlink w:anchor="_Toc244249345" w:history="1">
         <w:r>
           <w:rPr>
             <w:rStyle w:val="Hipervnculo"/>
@@ -4590,7 +4590,7 @@
             <w:noProof/>
             <w:webHidden/>
           </w:rPr>
-          <w:instrText xml:space="preserve"> PAGEREF _Toc244208893 \h </w:instrText>
+          <w:instrText xml:space="preserve"> PAGEREF _Toc244249345 \h </w:instrText>
         </w:r>
         <w:r>
           <w:rPr>
@@ -4633,7 +4633,7 @@
           <w14:ligatures w14:val="standardContextual"/>
         </w:rPr>
       </w:pPr>
-      <w:hyperlink w:anchor="_Toc244208894" w:history="1">
+      <w:hyperlink w:anchor="_Toc244249346" w:history="1">
         <w:r>
           <w:rPr>
             <w:rStyle w:val="Hipervnculo"/>
@@ -4660,7 +4660,7 @@
             <w:noProof/>
             <w:webHidden/>
           </w:rPr>
-          <w:instrText xml:space="preserve"> PAGEREF _Toc244208894 \h </w:instrText>
+          <w:instrText xml:space="preserve"> PAGEREF _Toc244249346 \h </w:instrText>
         </w:r>
         <w:r>
           <w:rPr>
@@ -4703,7 +4703,7 @@
           <w14:ligatures w14:val="standardContextual"/>
         </w:rPr>
       </w:pPr>
-      <w:hyperlink w:anchor="_Toc244208895" w:history="1">
+      <w:hyperlink w:anchor="_Toc244249347" w:history="1">
         <w:r>
           <w:rPr>
             <w:rStyle w:val="Hipervnculo"/>
@@ -4730,7 +4730,7 @@
             <w:noProof/>
             <w:webHidden/>
           </w:rPr>
-          <w:instrText xml:space="preserve"> PAGEREF _Toc244208895 \h </w:instrText>
+          <w:instrText xml:space="preserve"> PAGEREF _Toc244249347 \h </w:instrText>
         </w:r>
         <w:r>
           <w:rPr>
@@ -4773,7 +4773,7 @@
           <w14:ligatures w14:val="standardContextual"/>
         </w:rPr>
       </w:pPr>
-      <w:hyperlink w:anchor="_Toc244208896" w:history="1">
+      <w:hyperlink w:anchor="_Toc244249348" w:history="1">
         <w:r>
           <w:rPr>
             <w:rStyle w:val="Hipervnculo"/>
@@ -4800,7 +4800,7 @@
             <w:noProof/>
             <w:webHidden/>
           </w:rPr>
-          <w:instrText xml:space="preserve"> PAGEREF _Toc244208896 \h </w:instrText>
+          <w:instrText xml:space="preserve"> PAGEREF _Toc244249348 \h </w:instrText>
         </w:r>
         <w:r>
           <w:rPr>
@@ -4843,7 +4843,7 @@
           <w14:ligatures w14:val="standardContextual"/>
         </w:rPr>
       </w:pPr>
-      <w:hyperlink w:anchor="_Toc244208897" w:history="1">
+      <w:hyperlink w:anchor="_Toc244249349" w:history="1">
         <w:r>
           <w:rPr>
             <w:rStyle w:val="Hipervnculo"/>
@@ -4870,7 +4870,7 @@
             <w:noProof/>
             <w:webHidden/>
           </w:rPr>
-          <w:instrText xml:space="preserve"> PAGEREF _Toc244208897 \h </w:instrText>
+          <w:instrText xml:space="preserve"> PAGEREF _Toc244249349 \h </w:instrText>
         </w:r>
         <w:r>
           <w:rPr>
@@ -4913,7 +4913,7 @@
           <w14:ligatures w14:val="standardContextual"/>
         </w:rPr>
       </w:pPr>
-      <w:hyperlink w:anchor="_Toc244208898" w:history="1">
+      <w:hyperlink w:anchor="_Toc244249350" w:history="1">
         <w:r>
           <w:rPr>
             <w:rStyle w:val="Hipervnculo"/>
@@ -4940,7 +4940,7 @@
             <w:noProof/>
             <w:webHidden/>
           </w:rPr>
-          <w:instrText xml:space="preserve"> PAGEREF _Toc244208898 \h </w:instrText>
+          <w:instrText xml:space="preserve"> PAGEREF _Toc244249350 \h </w:instrText>
         </w:r>
         <w:r>
           <w:rPr>
@@ -4983,7 +4983,7 @@
           <w14:ligatures w14:val="standardContextual"/>
         </w:rPr>
       </w:pPr>
-      <w:hyperlink w:anchor="_Toc244208899" w:history="1">
+      <w:hyperlink w:anchor="_Toc244249351" w:history="1">
         <w:r>
           <w:rPr>
             <w:rStyle w:val="Hipervnculo"/>
@@ -5010,7 +5010,7 @@
             <w:noProof/>
             <w:webHidden/>
           </w:rPr>
-          <w:instrText xml:space="preserve"> PAGEREF _Toc244208899 \h </w:instrText>
+          <w:instrText xml:space="preserve"> PAGEREF _Toc244249351 \h </w:instrText>
         </w:r>
         <w:r>
           <w:rPr>
@@ -5053,7 +5053,7 @@
           <w14:ligatures w14:val="standardContextual"/>
         </w:rPr>
       </w:pPr>
-      <w:hyperlink w:anchor="_Toc244208900" w:history="1">
+      <w:hyperlink w:anchor="_Toc244249352" w:history="1">
         <w:r>
           <w:rPr>
             <w:rStyle w:val="Hipervnculo"/>
@@ -5080,7 +5080,7 @@
             <w:noProof/>
             <w:webHidden/>
           </w:rPr>
-          <w:instrText xml:space="preserve"> PAGEREF _Toc244208900 \h </w:instrText>
+          <w:instrText xml:space="preserve"> PAGEREF _Toc244249352 \h </w:instrText>
         </w:r>
         <w:r>
           <w:rPr>
@@ -5123,7 +5123,7 @@
           <w14:ligatures w14:val="standardContextual"/>
         </w:rPr>
       </w:pPr>
-      <w:hyperlink w:anchor="_Toc244208901" w:history="1">
+      <w:hyperlink w:anchor="_Toc244249353" w:history="1">
         <w:r>
           <w:rPr>
             <w:rStyle w:val="Hipervnculo"/>
@@ -5150,7 +5150,7 @@
             <w:noProof/>
             <w:webHidden/>
           </w:rPr>
-          <w:instrText xml:space="preserve"> PAGEREF _Toc244208901 \h </w:instrText>
+          <w:instrText xml:space="preserve"> PAGEREF _Toc244249353 \h </w:instrText>
         </w:r>
         <w:r>
           <w:rPr>
@@ -5193,7 +5193,7 @@
           <w14:ligatures w14:val="standardContextual"/>
         </w:rPr>
       </w:pPr>
-      <w:hyperlink w:anchor="_Toc244208902" w:history="1">
+      <w:hyperlink w:anchor="_Toc244249354" w:history="1">
         <w:r>
           <w:rPr>
             <w:rStyle w:val="Hipervnculo"/>
@@ -5220,7 +5220,7 @@
             <w:noProof/>
             <w:webHidden/>
           </w:rPr>
-          <w:instrText xml:space="preserve"> PAGEREF _Toc244208902 \h </w:instrText>
+          <w:instrText xml:space="preserve"> PAGEREF _Toc244249354 \h </w:instrText>
         </w:r>
         <w:r>
           <w:rPr>
@@ -5263,7 +5263,7 @@
           <w14:ligatures w14:val="standardContextual"/>
         </w:rPr>
       </w:pPr>
-      <w:hyperlink w:anchor="_Toc244208903" w:history="1">
+      <w:hyperlink w:anchor="_Toc244249355" w:history="1">
         <w:r>
           <w:rPr>
             <w:rStyle w:val="Hipervnculo"/>
@@ -5290,7 +5290,7 @@
             <w:noProof/>
             <w:webHidden/>
           </w:rPr>
-          <w:instrText xml:space="preserve"> PAGEREF _Toc244208903 \h </w:instrText>
+          <w:instrText xml:space="preserve"> PAGEREF _Toc244249355 \h </w:instrText>
         </w:r>
         <w:r>
           <w:rPr>
@@ -5333,7 +5333,7 @@
           <w14:ligatures w14:val="standardContextual"/>
         </w:rPr>
       </w:pPr>
-      <w:hyperlink w:anchor="_Toc244208904" w:history="1">
+      <w:hyperlink w:anchor="_Toc244249356" w:history="1">
         <w:r>
           <w:rPr>
             <w:rStyle w:val="Hipervnculo"/>
@@ -5360,7 +5360,7 @@
             <w:noProof/>
             <w:webHidden/>
           </w:rPr>
-          <w:instrText xml:space="preserve"> PAGEREF _Toc244208904 \h </w:instrText>
+          <w:instrText xml:space="preserve"> PAGEREF _Toc244249356 \h </w:instrText>
         </w:r>
         <w:r>
           <w:rPr>
@@ -5403,7 +5403,7 @@
           <w14:ligatures w14:val="standardContextual"/>
         </w:rPr>
       </w:pPr>
-      <w:hyperlink w:anchor="_Toc244208905" w:history="1">
+      <w:hyperlink w:anchor="_Toc244249357" w:history="1">
         <w:r>
           <w:rPr>
             <w:rStyle w:val="Hipervnculo"/>
@@ -5430,7 +5430,7 @@
             <w:noProof/>
             <w:webHidden/>
           </w:rPr>
-          <w:instrText xml:space="preserve"> PAGEREF _Toc244208905 \h </w:instrText>
+          <w:instrText xml:space="preserve"> PAGEREF _Toc244249357 \h </w:instrText>
         </w:r>
         <w:r>
           <w:rPr>
@@ -5476,7 +5476,7 @@
           <w14:ligatures w14:val="standardContextual"/>
         </w:rPr>
       </w:pPr>
-      <w:hyperlink w:anchor="_Toc244208906" w:history="1">
+      <w:hyperlink w:anchor="_Toc244249358" w:history="1">
         <w:r>
           <w:rPr>
             <w:rStyle w:val="Hipervnculo"/>
@@ -5503,7 +5503,7 @@
             <w:noProof/>
             <w:webHidden/>
           </w:rPr>
-          <w:instrText xml:space="preserve"> PAGEREF _Toc244208906 \h </w:instrText>
+          <w:instrText xml:space="preserve"> PAGEREF _Toc244249358 \h </w:instrText>
         </w:r>
         <w:r>
           <w:rPr>
@@ -5546,7 +5546,7 @@
           <w14:ligatures w14:val="standardContextual"/>
         </w:rPr>
       </w:pPr>
-      <w:hyperlink w:anchor="_Toc244208907" w:history="1">
+      <w:hyperlink w:anchor="_Toc244249359" w:history="1">
         <w:r>
           <w:rPr>
             <w:rStyle w:val="Hipervnculo"/>
@@ -5573,7 +5573,7 @@
             <w:noProof/>
             <w:webHidden/>
           </w:rPr>
-          <w:instrText xml:space="preserve"> PAGEREF _Toc244208907 \h </w:instrText>
+          <w:instrText xml:space="preserve"> PAGEREF _Toc244249359 \h </w:instrText>
         </w:r>
         <w:r>
           <w:rPr>
@@ -5616,7 +5616,7 @@
           <w14:ligatures w14:val="standardContextual"/>
         </w:rPr>
       </w:pPr>
-      <w:hyperlink w:anchor="_Toc244208908" w:history="1">
+      <w:hyperlink w:anchor="_Toc244249360" w:history="1">
         <w:r>
           <w:rPr>
             <w:rStyle w:val="Hipervnculo"/>
@@ -5643,7 +5643,7 @@
             <w:noProof/>
             <w:webHidden/>
           </w:rPr>
-          <w:instrText xml:space="preserve"> PAGEREF _Toc244208908 \h </w:instrText>
+          <w:instrText xml:space="preserve"> PAGEREF _Toc244249360 \h </w:instrText>
         </w:r>
         <w:r>
           <w:rPr>
@@ -5686,7 +5686,7 @@
           <w14:ligatures w14:val="standardContextual"/>
         </w:rPr>
       </w:pPr>
-      <w:hyperlink w:anchor="_Toc244208909" w:history="1">
+      <w:hyperlink w:anchor="_Toc244249361" w:history="1">
         <w:r>
           <w:rPr>
             <w:rStyle w:val="Hipervnculo"/>
@@ -5713,7 +5713,7 @@
             <w:noProof/>
             <w:webHidden/>
           </w:rPr>
-          <w:instrText xml:space="preserve"> PAGEREF _Toc244208909 \h </w:instrText>
+          <w:instrText xml:space="preserve"> PAGEREF _Toc244249361 \h </w:instrText>
         </w:r>
         <w:r>
           <w:rPr>
@@ -5756,7 +5756,7 @@
           <w14:ligatures w14:val="standardContextual"/>
         </w:rPr>
       </w:pPr>
-      <w:hyperlink w:anchor="_Toc244208910" w:history="1">
+      <w:hyperlink w:anchor="_Toc244249362" w:history="1">
         <w:r>
           <w:rPr>
             <w:rStyle w:val="Hipervnculo"/>
@@ -5783,7 +5783,7 @@
             <w:noProof/>
             <w:webHidden/>
           </w:rPr>
-          <w:instrText xml:space="preserve"> PAGEREF _Toc244208910 \h </w:instrText>
+          <w:instrText xml:space="preserve"> PAGEREF _Toc244249362 \h </w:instrText>
         </w:r>
         <w:r>
           <w:rPr>
@@ -5826,7 +5826,7 @@
           <w14:ligatures w14:val="standardContextual"/>
         </w:rPr>
       </w:pPr>
-      <w:hyperlink w:anchor="_Toc244208911" w:history="1">
+      <w:hyperlink w:anchor="_Toc244249363" w:history="1">
         <w:r>
           <w:rPr>
             <w:rStyle w:val="Hipervnculo"/>
@@ -5853,7 +5853,7 @@
             <w:noProof/>
             <w:webHidden/>
           </w:rPr>
-          <w:instrText xml:space="preserve"> PAGEREF _Toc244208911 \h </w:instrText>
+          <w:instrText xml:space="preserve"> PAGEREF _Toc244249363 \h </w:instrText>
         </w:r>
         <w:r>
           <w:rPr>
@@ -5896,7 +5896,7 @@
           <w14:ligatures w14:val="standardContextual"/>
         </w:rPr>
       </w:pPr>
-      <w:hyperlink w:anchor="_Toc244208912" w:history="1">
+      <w:hyperlink w:anchor="_Toc244249364" w:history="1">
         <w:r>
           <w:rPr>
             <w:rStyle w:val="Hipervnculo"/>
@@ -5923,7 +5923,7 @@
             <w:noProof/>
             <w:webHidden/>
           </w:rPr>
-          <w:instrText xml:space="preserve"> PAGEREF _Toc244208912 \h </w:instrText>
+          <w:instrText xml:space="preserve"> PAGEREF _Toc244249364 \h </w:instrText>
         </w:r>
         <w:r>
           <w:rPr>
@@ -5966,7 +5966,7 @@
           <w14:ligatures w14:val="standardContextual"/>
         </w:rPr>
       </w:pPr>
-      <w:hyperlink w:anchor="_Toc244208913" w:history="1">
+      <w:hyperlink w:anchor="_Toc244249365" w:history="1">
         <w:r>
           <w:rPr>
             <w:rStyle w:val="Hipervnculo"/>
@@ -5993,7 +5993,7 @@
             <w:noProof/>
             <w:webHidden/>
           </w:rPr>
-          <w:instrText xml:space="preserve"> PAGEREF _Toc244208913 \h </w:instrText>
+          <w:instrText xml:space="preserve"> PAGEREF _Toc244249365 \h </w:instrText>
         </w:r>
         <w:r>
           <w:rPr>
@@ -6036,7 +6036,7 @@
           <w14:ligatures w14:val="standardContextual"/>
         </w:rPr>
       </w:pPr>
-      <w:hyperlink w:anchor="_Toc244208914" w:history="1">
+      <w:hyperlink w:anchor="_Toc244249366" w:history="1">
         <w:r>
           <w:rPr>
             <w:rStyle w:val="Hipervnculo"/>
@@ -6063,7 +6063,7 @@
             <w:noProof/>
             <w:webHidden/>
           </w:rPr>
-          <w:instrText xml:space="preserve"> PAGEREF _Toc244208914 \h </w:instrText>
+          <w:instrText xml:space="preserve"> PAGEREF _Toc244249366 \h </w:instrText>
         </w:r>
         <w:r>
           <w:rPr>
@@ -6106,7 +6106,7 @@
           <w14:ligatures w14:val="standardContextual"/>
         </w:rPr>
       </w:pPr>
-      <w:hyperlink w:anchor="_Toc244208915" w:history="1">
+      <w:hyperlink w:anchor="_Toc244249367" w:history="1">
         <w:r>
           <w:rPr>
             <w:rStyle w:val="Hipervnculo"/>
@@ -6133,7 +6133,7 @@
             <w:noProof/>
             <w:webHidden/>
           </w:rPr>
-          <w:instrText xml:space="preserve"> PAGEREF _Toc244208915 \h </w:instrText>
+          <w:instrText xml:space="preserve"> PAGEREF _Toc244249367 \h </w:instrText>
         </w:r>
         <w:r>
           <w:rPr>
@@ -6176,7 +6176,7 @@
           <w14:ligatures w14:val="standardContextual"/>
         </w:rPr>
       </w:pPr>
-      <w:hyperlink w:anchor="_Toc244208916" w:history="1">
+      <w:hyperlink w:anchor="_Toc244249368" w:history="1">
         <w:r>
           <w:rPr>
             <w:rStyle w:val="Hipervnculo"/>
@@ -6203,7 +6203,7 @@
             <w:noProof/>
             <w:webHidden/>
           </w:rPr>
-          <w:instrText xml:space="preserve"> PAGEREF _Toc244208916 \h </w:instrText>
+          <w:instrText xml:space="preserve"> PAGEREF _Toc244249368 \h </w:instrText>
         </w:r>
         <w:r>
           <w:rPr>
@@ -6246,7 +6246,7 @@
           <w14:ligatures w14:val="standardContextual"/>
         </w:rPr>
       </w:pPr>
-      <w:hyperlink w:anchor="_Toc244208917" w:history="1">
+      <w:hyperlink w:anchor="_Toc244249369" w:history="1">
         <w:r>
           <w:rPr>
             <w:rStyle w:val="Hipervnculo"/>
@@ -6273,7 +6273,7 @@
             <w:noProof/>
             <w:webHidden/>
           </w:rPr>
-          <w:instrText xml:space="preserve"> PAGEREF _Toc244208917 \h </w:instrText>
+          <w:instrText xml:space="preserve"> PAGEREF _Toc244249369 \h </w:instrText>
         </w:r>
         <w:r>
           <w:rPr>
@@ -6316,7 +6316,7 @@
           <w14:ligatures w14:val="standardContextual"/>
         </w:rPr>
       </w:pPr>
-      <w:hyperlink w:anchor="_Toc244208918" w:history="1">
+      <w:hyperlink w:anchor="_Toc244249370" w:history="1">
         <w:r>
           <w:rPr>
             <w:rStyle w:val="Hipervnculo"/>
@@ -6343,7 +6343,7 @@
             <w:noProof/>
             <w:webHidden/>
           </w:rPr>
-          <w:instrText xml:space="preserve"> PAGEREF _Toc244208918 \h </w:instrText>
+          <w:instrText xml:space="preserve"> PAGEREF _Toc244249370 \h </w:instrText>
         </w:r>
         <w:r>
           <w:rPr>
@@ -6386,7 +6386,7 @@
           <w14:ligatures w14:val="standardContextual"/>
         </w:rPr>
       </w:pPr>
-      <w:hyperlink w:anchor="_Toc244208919" w:history="1">
+      <w:hyperlink w:anchor="_Toc244249371" w:history="1">
         <w:r>
           <w:rPr>
             <w:rStyle w:val="Hipervnculo"/>
@@ -6413,7 +6413,7 @@
             <w:noProof/>
             <w:webHidden/>
           </w:rPr>
-          <w:instrText xml:space="preserve"> PAGEREF _Toc244208919 \h </w:instrText>
+          <w:instrText xml:space="preserve"> PAGEREF _Toc244249371 \h </w:instrText>
         </w:r>
         <w:r>
           <w:rPr>
@@ -6456,7 +6456,7 @@
           <w14:ligatures w14:val="standardContextual"/>
         </w:rPr>
       </w:pPr>
-      <w:hyperlink w:anchor="_Toc244208920" w:history="1">
+      <w:hyperlink w:anchor="_Toc244249372" w:history="1">
         <w:r>
           <w:rPr>
             <w:rStyle w:val="Hipervnculo"/>
@@ -6483,7 +6483,7 @@
             <w:noProof/>
             <w:webHidden/>
           </w:rPr>
-          <w:instrText xml:space="preserve"> PAGEREF _Toc244208920 \h </w:instrText>
+          <w:instrText xml:space="preserve"> PAGEREF _Toc244249372 \h </w:instrText>
         </w:r>
         <w:r>
           <w:rPr>
@@ -6529,7 +6529,7 @@
           <w14:ligatures w14:val="standardContextual"/>
         </w:rPr>
       </w:pPr>
-      <w:hyperlink w:anchor="_Toc244208921" w:history="1">
+      <w:hyperlink w:anchor="_Toc244249373" w:history="1">
         <w:r>
           <w:rPr>
             <w:rStyle w:val="Hipervnculo"/>
@@ -6556,7 +6556,7 @@
             <w:noProof/>
             <w:webHidden/>
           </w:rPr>
-          <w:instrText xml:space="preserve"> PAGEREF _Toc244208921 \h </w:instrText>
+          <w:instrText xml:space="preserve"> PAGEREF _Toc244249373 \h </w:instrText>
         </w:r>
         <w:r>
           <w:rPr>
@@ -6599,7 +6599,7 @@
           <w14:ligatures w14:val="standardContextual"/>
         </w:rPr>
       </w:pPr>
-      <w:hyperlink w:anchor="_Toc244208922" w:history="1">
+      <w:hyperlink w:anchor="_Toc244249374" w:history="1">
         <w:r>
           <w:rPr>
             <w:rStyle w:val="Hipervnculo"/>
@@ -6626,7 +6626,7 @@
             <w:noProof/>
             <w:webHidden/>
           </w:rPr>
-          <w:instrText xml:space="preserve"> PAGEREF _Toc244208922 \h </w:instrText>
+          <w:instrText xml:space="preserve"> PAGEREF _Toc244249374 \h </w:instrText>
         </w:r>
         <w:r>
           <w:rPr>
@@ -6669,7 +6669,7 @@
           <w14:ligatures w14:val="standardContextual"/>
         </w:rPr>
       </w:pPr>
-      <w:hyperlink w:anchor="_Toc244208923" w:history="1">
+      <w:hyperlink w:anchor="_Toc244249375" w:history="1">
         <w:r>
           <w:rPr>
             <w:rStyle w:val="Hipervnculo"/>
@@ -6696,7 +6696,7 @@
             <w:noProof/>
             <w:webHidden/>
           </w:rPr>
-          <w:instrText xml:space="preserve"> PAGEREF _Toc244208923 \h </w:instrText>
+          <w:instrText xml:space="preserve"> PAGEREF _Toc244249375 \h </w:instrText>
         </w:r>
         <w:r>
           <w:rPr>
@@ -6739,7 +6739,7 @@
           <w14:ligatures w14:val="standardContextual"/>
         </w:rPr>
       </w:pPr>
-      <w:hyperlink w:anchor="_Toc244208924" w:history="1">
+      <w:hyperlink w:anchor="_Toc244249376" w:history="1">
         <w:r>
           <w:rPr>
             <w:rStyle w:val="Hipervnculo"/>
@@ -6766,7 +6766,7 @@
             <w:noProof/>
             <w:webHidden/>
           </w:rPr>
-          <w:instrText xml:space="preserve"> PAGEREF _Toc244208924 \h </w:instrText>
+          <w:instrText xml:space="preserve"> PAGEREF _Toc244249376 \h </w:instrText>
         </w:r>
         <w:r>
           <w:rPr>
@@ -6809,7 +6809,7 @@
           <w14:ligatures w14:val="standardContextual"/>
         </w:rPr>
       </w:pPr>
-      <w:hyperlink w:anchor="_Toc244208925" w:history="1">
+      <w:hyperlink w:anchor="_Toc244249377" w:history="1">
         <w:r>
           <w:rPr>
             <w:rStyle w:val="Hipervnculo"/>
@@ -6836,7 +6836,7 @@
             <w:noProof/>
             <w:webHidden/>
           </w:rPr>
-          <w:instrText xml:space="preserve"> PAGEREF _Toc244208925 \h </w:instrText>
+          <w:instrText xml:space="preserve"> PAGEREF _Toc244249377 \h </w:instrText>
         </w:r>
         <w:r>
           <w:rPr>
@@ -6879,7 +6879,7 @@
           <w14:ligatures w14:val="standardContextual"/>
         </w:rPr>
       </w:pPr>
-      <w:hyperlink w:anchor="_Toc244208926" w:history="1">
+      <w:hyperlink w:anchor="_Toc244249378" w:history="1">
         <w:r>
           <w:rPr>
             <w:rStyle w:val="Hipervnculo"/>
@@ -6906,7 +6906,7 @@
             <w:noProof/>
             <w:webHidden/>
           </w:rPr>
-          <w:instrText xml:space="preserve"> PAGEREF _Toc244208926 \h </w:instrText>
+          <w:instrText xml:space="preserve"> PAGEREF _Toc244249378 \h </w:instrText>
         </w:r>
         <w:r>
           <w:rPr>
@@ -6952,7 +6952,7 @@
           <w14:ligatures w14:val="standardContextual"/>
         </w:rPr>
       </w:pPr>
-      <w:hyperlink w:anchor="_Toc244208927" w:history="1">
+      <w:hyperlink w:anchor="_Toc244249379" w:history="1">
         <w:r>
           <w:rPr>
             <w:rStyle w:val="Hipervnculo"/>
@@ -6979,7 +6979,7 @@
             <w:noProof/>
             <w:webHidden/>
           </w:rPr>
-          <w:instrText xml:space="preserve"> PAGEREF _Toc244208927 \h </w:instrText>
+          <w:instrText xml:space="preserve"> PAGEREF _Toc244249379 \h </w:instrText>
         </w:r>
         <w:r>
           <w:rPr>
@@ -7022,7 +7022,7 @@
           <w14:ligatures w14:val="standardContextual"/>
         </w:rPr>
       </w:pPr>
-      <w:hyperlink w:anchor="_Toc244208928" w:history="1">
+      <w:hyperlink w:anchor="_Toc244249380" w:history="1">
         <w:r>
           <w:rPr>
             <w:rStyle w:val="Hipervnculo"/>
@@ -7049,7 +7049,7 @@
             <w:noProof/>
             <w:webHidden/>
           </w:rPr>
-          <w:instrText xml:space="preserve"> PAGEREF _Toc244208928 \h </w:instrText>
+          <w:instrText xml:space="preserve"> PAGEREF _Toc244249380 \h </w:instrText>
         </w:r>
         <w:r>
           <w:rPr>
@@ -7092,7 +7092,7 @@
           <w14:ligatures w14:val="standardContextual"/>
         </w:rPr>
       </w:pPr>
-      <w:hyperlink w:anchor="_Toc244208929" w:history="1">
+      <w:hyperlink w:anchor="_Toc244249381" w:history="1">
         <w:r>
           <w:rPr>
             <w:rStyle w:val="Hipervnculo"/>
@@ -7119,7 +7119,7 @@
             <w:noProof/>
             <w:webHidden/>
           </w:rPr>
-          <w:instrText xml:space="preserve"> PAGEREF _Toc244208929 \h </w:instrText>
+          <w:instrText xml:space="preserve"> PAGEREF _Toc244249381 \h </w:instrText>
         </w:r>
         <w:r>
           <w:rPr>
@@ -7162,7 +7162,7 @@
           <w14:ligatures w14:val="standardContextual"/>
         </w:rPr>
       </w:pPr>
-      <w:hyperlink w:anchor="_Toc244208930" w:history="1">
+      <w:hyperlink w:anchor="_Toc244249382" w:history="1">
         <w:r>
           <w:rPr>
             <w:rStyle w:val="Hipervnculo"/>
@@ -7189,7 +7189,7 @@
             <w:noProof/>
             <w:webHidden/>
           </w:rPr>
-          <w:instrText xml:space="preserve"> PAGEREF _Toc244208930 \h </w:instrText>
+          <w:instrText xml:space="preserve"> PAGEREF _Toc244249382 \h </w:instrText>
         </w:r>
         <w:r>
           <w:rPr>
@@ -7232,7 +7232,7 @@
           <w14:ligatures w14:val="standardContextual"/>
         </w:rPr>
       </w:pPr>
-      <w:hyperlink w:anchor="_Toc244208931" w:history="1">
+      <w:hyperlink w:anchor="_Toc244249383" w:history="1">
         <w:r>
           <w:rPr>
             <w:rStyle w:val="Hipervnculo"/>
@@ -7259,7 +7259,7 @@
             <w:noProof/>
             <w:webHidden/>
           </w:rPr>
-          <w:instrText xml:space="preserve"> PAGEREF _Toc244208931 \h </w:instrText>
+          <w:instrText xml:space="preserve"> PAGEREF _Toc244249383 \h </w:instrText>
         </w:r>
         <w:r>
           <w:rPr>
@@ -7302,7 +7302,7 @@
           <w14:ligatures w14:val="standardContextual"/>
         </w:rPr>
       </w:pPr>
-      <w:hyperlink w:anchor="_Toc244208932" w:history="1">
+      <w:hyperlink w:anchor="_Toc244249384" w:history="1">
         <w:r>
           <w:rPr>
             <w:rStyle w:val="Hipervnculo"/>
@@ -7329,7 +7329,7 @@
             <w:noProof/>
             <w:webHidden/>
           </w:rPr>
-          <w:instrText xml:space="preserve"> PAGEREF _Toc244208932 \h </w:instrText>
+          <w:instrText xml:space="preserve"> PAGEREF _Toc244249384 \h </w:instrText>
         </w:r>
         <w:r>
           <w:rPr>
@@ -7375,7 +7375,7 @@
           <w14:ligatures w14:val="standardContextual"/>
         </w:rPr>
       </w:pPr>
-      <w:hyperlink w:anchor="_Toc244208933" w:history="1">
+      <w:hyperlink w:anchor="_Toc244249385" w:history="1">
         <w:r>
           <w:rPr>
             <w:rStyle w:val="Hipervnculo"/>
@@ -7411,7 +7411,7 @@
             <w:noProof/>
             <w:webHidden/>
           </w:rPr>
-          <w:instrText xml:space="preserve"> PAGEREF _Toc244208933 \h </w:instrText>
+          <w:instrText xml:space="preserve"> PAGEREF _Toc244249385 \h </w:instrText>
         </w:r>
         <w:r>
           <w:rPr>
@@ -7454,7 +7454,7 @@
           <w14:ligatures w14:val="standardContextual"/>
         </w:rPr>
       </w:pPr>
-      <w:hyperlink w:anchor="_Toc244208934" w:history="1">
+      <w:hyperlink w:anchor="_Toc244249386" w:history="1">
         <w:r>
           <w:rPr>
             <w:rStyle w:val="Hipervnculo"/>
@@ -7481,7 +7481,7 @@
             <w:noProof/>
             <w:webHidden/>
           </w:rPr>
-          <w:instrText xml:space="preserve"> PAGEREF _Toc244208934 \h </w:instrText>
+          <w:instrText xml:space="preserve"> PAGEREF _Toc244249386 \h </w:instrText>
         </w:r>
         <w:r>
           <w:rPr>
@@ -7524,7 +7524,7 @@
           <w14:ligatures w14:val="standardContextual"/>
         </w:rPr>
       </w:pPr>
-      <w:hyperlink w:anchor="_Toc244208935" w:history="1">
+      <w:hyperlink w:anchor="_Toc244249387" w:history="1">
         <w:r>
           <w:rPr>
             <w:rStyle w:val="Hipervnculo"/>
@@ -7551,7 +7551,7 @@
             <w:noProof/>
             <w:webHidden/>
           </w:rPr>
-          <w:instrText xml:space="preserve"> PAGEREF _Toc244208935 \h </w:instrText>
+          <w:instrText xml:space="preserve"> PAGEREF _Toc244249387 \h </w:instrText>
         </w:r>
         <w:r>
           <w:rPr>
@@ -7594,7 +7594,7 @@
           <w14:ligatures w14:val="standardContextual"/>
         </w:rPr>
       </w:pPr>
-      <w:hyperlink w:anchor="_Toc244208936" w:history="1">
+      <w:hyperlink w:anchor="_Toc244249388" w:history="1">
         <w:r>
           <w:rPr>
             <w:rStyle w:val="Hipervnculo"/>
@@ -7621,7 +7621,7 @@
             <w:noProof/>
             <w:webHidden/>
           </w:rPr>
-          <w:instrText xml:space="preserve"> PAGEREF _Toc244208936 \h </w:instrText>
+          <w:instrText xml:space="preserve"> PAGEREF _Toc244249388 \h </w:instrText>
         </w:r>
         <w:r>
           <w:rPr>
@@ -7664,7 +7664,7 @@
           <w14:ligatures w14:val="standardContextual"/>
         </w:rPr>
       </w:pPr>
-      <w:hyperlink w:anchor="_Toc244208937" w:history="1">
+      <w:hyperlink w:anchor="_Toc244249389" w:history="1">
         <w:r>
           <w:rPr>
             <w:rStyle w:val="Hipervnculo"/>
@@ -7691,7 +7691,7 @@
             <w:noProof/>
             <w:webHidden/>
           </w:rPr>
-          <w:instrText xml:space="preserve"> PAGEREF _Toc244208937 \h </w:instrText>
+          <w:instrText xml:space="preserve"> PAGEREF _Toc244249389 \h </w:instrText>
         </w:r>
         <w:r>
           <w:rPr>
@@ -7734,7 +7734,7 @@
           <w14:ligatures w14:val="standardContextual"/>
         </w:rPr>
       </w:pPr>
-      <w:hyperlink w:anchor="_Toc244208938" w:history="1">
+      <w:hyperlink w:anchor="_Toc244249390" w:history="1">
         <w:r>
           <w:rPr>
             <w:rStyle w:val="Hipervnculo"/>
@@ -7761,7 +7761,7 @@
             <w:noProof/>
             <w:webHidden/>
           </w:rPr>
-          <w:instrText xml:space="preserve"> PAGEREF _Toc244208938 \h </w:instrText>
+          <w:instrText xml:space="preserve"> PAGEREF _Toc244249390 \h </w:instrText>
         </w:r>
         <w:r>
           <w:rPr>
@@ -7807,7 +7807,7 @@
           <w14:ligatures w14:val="standardContextual"/>
         </w:rPr>
       </w:pPr>
-      <w:hyperlink w:anchor="_Toc244208939" w:history="1">
+      <w:hyperlink w:anchor="_Toc244249391" w:history="1">
         <w:r>
           <w:rPr>
             <w:rStyle w:val="Hipervnculo"/>
@@ -7834,7 +7834,7 @@
             <w:noProof/>
             <w:webHidden/>
           </w:rPr>
-          <w:instrText xml:space="preserve"> PAGEREF _Toc244208939 \h </w:instrText>
+          <w:instrText xml:space="preserve"> PAGEREF _Toc244249391 \h </w:instrText>
         </w:r>
         <w:r>
           <w:rPr>
@@ -7877,7 +7877,7 @@
           <w14:ligatures w14:val="standardContextual"/>
         </w:rPr>
       </w:pPr>
-      <w:hyperlink w:anchor="_Toc244208940" w:history="1">
+      <w:hyperlink w:anchor="_Toc244249392" w:history="1">
         <w:r>
           <w:rPr>
             <w:rStyle w:val="Hipervnculo"/>
@@ -7904,7 +7904,7 @@
             <w:noProof/>
             <w:webHidden/>
           </w:rPr>
-          <w:instrText xml:space="preserve"> PAGEREF _Toc244208940 \h </w:instrText>
+          <w:instrText xml:space="preserve"> PAGEREF _Toc244249392 \h </w:instrText>
         </w:r>
         <w:r>
           <w:rPr>
@@ -7950,7 +7950,7 @@
           <w14:ligatures w14:val="standardContextual"/>
         </w:rPr>
       </w:pPr>
-      <w:hyperlink w:anchor="_Toc244208941" w:history="1">
+      <w:hyperlink w:anchor="_Toc244249393" w:history="1">
         <w:r>
           <w:rPr>
             <w:rStyle w:val="Hipervnculo"/>
@@ -7977,7 +7977,7 @@
             <w:noProof/>
             <w:webHidden/>
           </w:rPr>
-          <w:instrText xml:space="preserve"> PAGEREF _Toc244208941 \h </w:instrText>
+          <w:instrText xml:space="preserve"> PAGEREF _Toc244249393 \h </w:instrText>
         </w:r>
         <w:r>
           <w:rPr>
@@ -8020,7 +8020,7 @@
           <w14:ligatures w14:val="standardContextual"/>
         </w:rPr>
       </w:pPr>
-      <w:hyperlink w:anchor="_Toc244208942" w:history="1">
+      <w:hyperlink w:anchor="_Toc244249394" w:history="1">
         <w:r>
           <w:rPr>
             <w:rStyle w:val="Hipervnculo"/>
@@ -8047,7 +8047,7 @@
             <w:noProof/>
             <w:webHidden/>
           </w:rPr>
-          <w:instrText xml:space="preserve"> PAGEREF _Toc244208942 \h </w:instrText>
+          <w:instrText xml:space="preserve"> PAGEREF _Toc244249394 \h </w:instrText>
         </w:r>
         <w:r>
           <w:rPr>
@@ -8090,7 +8090,7 @@
           <w14:ligatures w14:val="standardContextual"/>
         </w:rPr>
       </w:pPr>
-      <w:hyperlink w:anchor="_Toc244208943" w:history="1">
+      <w:hyperlink w:anchor="_Toc244249395" w:history="1">
         <w:r>
           <w:rPr>
             <w:rStyle w:val="Hipervnculo"/>
@@ -8117,7 +8117,7 @@
             <w:noProof/>
             <w:webHidden/>
           </w:rPr>
-          <w:instrText xml:space="preserve"> PAGEREF _Toc244208943 \h </w:instrText>
+          <w:instrText xml:space="preserve"> PAGEREF _Toc244249395 \h </w:instrText>
         </w:r>
         <w:r>
           <w:rPr>
@@ -8160,7 +8160,7 @@
           <w14:ligatures w14:val="standardContextual"/>
         </w:rPr>
       </w:pPr>
-      <w:hyperlink w:anchor="_Toc244208944" w:history="1">
+      <w:hyperlink w:anchor="_Toc244249396" w:history="1">
         <w:r>
           <w:rPr>
             <w:rStyle w:val="Hipervnculo"/>
@@ -8187,7 +8187,7 @@
             <w:noProof/>
             <w:webHidden/>
           </w:rPr>
-          <w:instrText xml:space="preserve"> PAGEREF _Toc244208944 \h </w:instrText>
+          <w:instrText xml:space="preserve"> PAGEREF _Toc244249396 \h </w:instrText>
         </w:r>
         <w:r>
           <w:rPr>
@@ -8233,7 +8233,7 @@
           <w14:ligatures w14:val="standardContextual"/>
         </w:rPr>
       </w:pPr>
-      <w:hyperlink w:anchor="_Toc244208945" w:history="1">
+      <w:hyperlink w:anchor="_Toc244249397" w:history="1">
         <w:r>
           <w:rPr>
             <w:rStyle w:val="Hipervnculo"/>
@@ -8260,7 +8260,7 @@
             <w:noProof/>
             <w:webHidden/>
           </w:rPr>
-          <w:instrText xml:space="preserve"> PAGEREF _Toc244208945 \h </w:instrText>
+          <w:instrText xml:space="preserve"> PAGEREF _Toc244249397 \h </w:instrText>
         </w:r>
         <w:r>
           <w:rPr>
@@ -8306,7 +8306,7 @@
           <w14:ligatures w14:val="standardContextual"/>
         </w:rPr>
       </w:pPr>
-      <w:hyperlink w:anchor="_Toc244208946" w:history="1">
+      <w:hyperlink w:anchor="_Toc244249398" w:history="1">
         <w:r>
           <w:rPr>
             <w:rStyle w:val="Hipervnculo"/>
@@ -8333,7 +8333,7 @@
             <w:noProof/>
             <w:webHidden/>
           </w:rPr>
-          <w:instrText xml:space="preserve"> PAGEREF _Toc244208946 \h </w:instrText>
+          <w:instrText xml:space="preserve"> PAGEREF _Toc244249398 \h </w:instrText>
         </w:r>
         <w:r>
           <w:rPr>
@@ -9018,7 +9018,7 @@
         <w:pStyle w:val="Ttulo1"/>
       </w:pPr>
       <w:bookmarkStart w:id="0" w:name="_ad9e25c8626cd57ecdce5548ccf29c0d11fa207"/>
-      <w:bookmarkStart w:id="1" w:name="_Toc244208834"/>
+      <w:bookmarkStart w:id="1" w:name="_Toc244249286"/>
       <w:r>
         <w:lastRenderedPageBreak/>
         <w:t xml:space="preserve">Módulo 0 — Plataforma: clínicas, planes y suscripción </w:t>
@@ -9045,7 +9045,7 @@
         <w:pStyle w:val="Ttulo2"/>
       </w:pPr>
       <w:bookmarkStart w:id="2" w:name="_1eb36715c186f58cce98281b1b189d20510db73"/>
-      <w:bookmarkStart w:id="3" w:name="_Toc244208835"/>
+      <w:bookmarkStart w:id="3" w:name="_Toc244249287"/>
       <w:r>
         <w:t>HU-0.1 — Registrar una clínica (self-service)</w:t>
       </w:r>
@@ -9331,7 +9331,7 @@
         <w:pStyle w:val="Ttulo2"/>
       </w:pPr>
       <w:bookmarkStart w:id="4" w:name="_802afc2bac434eff8b2fd18354a2e26d7a1818b"/>
-      <w:bookmarkStart w:id="5" w:name="_Toc244208836"/>
+      <w:bookmarkStart w:id="5" w:name="_Toc244249288"/>
       <w:bookmarkEnd w:id="2"/>
       <w:r>
         <w:lastRenderedPageBreak/>
@@ -9623,7 +9623,7 @@
         <w:pStyle w:val="Ttulo2"/>
       </w:pPr>
       <w:bookmarkStart w:id="6" w:name="_bb7346f7e0c84a0526cc1b09dcf7185b4de9ba6"/>
-      <w:bookmarkStart w:id="7" w:name="_Toc244208837"/>
+      <w:bookmarkStart w:id="7" w:name="_Toc244249289"/>
       <w:bookmarkEnd w:id="4"/>
       <w:r>
         <w:t>HU-0.3 — Panel del super-administrador</w:t>
@@ -9998,7 +9998,7 @@
         <w:pStyle w:val="Ttulo2"/>
       </w:pPr>
       <w:bookmarkStart w:id="8" w:name="_81995397ba8e62ea0a492c5a03eed8bb24e762a"/>
-      <w:bookmarkStart w:id="9" w:name="_Toc244208838"/>
+      <w:bookmarkStart w:id="9" w:name="_Toc244249290"/>
       <w:bookmarkEnd w:id="6"/>
       <w:r>
         <w:t>HU-0.4 — Control de límites del plan (freemium)</w:t>
@@ -10358,7 +10358,7 @@
         <w:pStyle w:val="Ttulo2"/>
       </w:pPr>
       <w:bookmarkStart w:id="10" w:name="_7e8f3608e8fc52636cb9cbad9cf55731ae6c539"/>
-      <w:bookmarkStart w:id="11" w:name="_Toc244208839"/>
+      <w:bookmarkStart w:id="11" w:name="_Toc244249291"/>
       <w:bookmarkEnd w:id="8"/>
       <w:r>
         <w:t>HU-0.5 — Suscripción, pagos y congelación por mora</w:t>
@@ -10705,7 +10705,7 @@
         <w:pStyle w:val="Ttulo1"/>
       </w:pPr>
       <w:bookmarkStart w:id="12" w:name="_3f52c9db5995a4dc1e731f6d8cd57f262bab040"/>
-      <w:bookmarkStart w:id="13" w:name="_Toc244208840"/>
+      <w:bookmarkStart w:id="13" w:name="_Toc244249292"/>
       <w:bookmarkEnd w:id="0"/>
       <w:bookmarkEnd w:id="10"/>
       <w:r>
@@ -10727,7 +10727,7 @@
         <w:pStyle w:val="Ttulo2"/>
       </w:pPr>
       <w:bookmarkStart w:id="14" w:name="_76f4ca07816b696a7e21234a3fd245066d4202e"/>
-      <w:bookmarkStart w:id="15" w:name="_Toc244208841"/>
+      <w:bookmarkStart w:id="15" w:name="_Toc244249293"/>
       <w:r>
         <w:t>HU-T.1 — Iniciar sesión y autenticación</w:t>
       </w:r>
@@ -10982,7 +10982,7 @@
         <w:pStyle w:val="Ttulo2"/>
       </w:pPr>
       <w:bookmarkStart w:id="16" w:name="_08f5c8e95117bf9bc16117a780f642084f0c149"/>
-      <w:bookmarkStart w:id="17" w:name="_Toc244208842"/>
+      <w:bookmarkStart w:id="17" w:name="_Toc244249294"/>
       <w:bookmarkEnd w:id="14"/>
       <w:r>
         <w:t>HU-T.2 — Cambiar mi contraseña</w:t>
@@ -11258,7 +11258,7 @@
         <w:pStyle w:val="Ttulo2"/>
       </w:pPr>
       <w:bookmarkStart w:id="18" w:name="_44f513b1e95bac8cbf132f88a3649b6be2902d9"/>
-      <w:bookmarkStart w:id="19" w:name="_Toc244208843"/>
+      <w:bookmarkStart w:id="19" w:name="_Toc244249295"/>
       <w:bookmarkEnd w:id="16"/>
       <w:r>
         <w:lastRenderedPageBreak/>
@@ -11497,7 +11497,7 @@
         <w:pStyle w:val="Ttulo2"/>
       </w:pPr>
       <w:bookmarkStart w:id="20" w:name="_1eded849c0926854c498005f8a93458b9d7a2d8"/>
-      <w:bookmarkStart w:id="21" w:name="_Toc244208844"/>
+      <w:bookmarkStart w:id="21" w:name="_Toc244249296"/>
       <w:bookmarkEnd w:id="18"/>
       <w:r>
         <w:t>HU-T.4 — Cerrar sesión</w:t>
@@ -11723,7 +11723,7 @@
         <w:pStyle w:val="Ttulo2"/>
       </w:pPr>
       <w:bookmarkStart w:id="22" w:name="_def34846ffbe39a85a6bd6a22079f6d076a01a9"/>
-      <w:bookmarkStart w:id="23" w:name="_Toc244208845"/>
+      <w:bookmarkStart w:id="23" w:name="_Toc244249297"/>
       <w:bookmarkEnd w:id="20"/>
       <w:r>
         <w:t>HU-T.5 — Ver y actualizar mi perfil y datos de contacto</w:t>
@@ -12147,7 +12147,7 @@
         <w:pStyle w:val="Ttulo2"/>
       </w:pPr>
       <w:bookmarkStart w:id="24" w:name="_37603926653c908321bb7c7e9ea1991584cc3b8"/>
-      <w:bookmarkStart w:id="25" w:name="_Toc244208846"/>
+      <w:bookmarkStart w:id="25" w:name="_Toc244249298"/>
       <w:bookmarkEnd w:id="22"/>
       <w:r>
         <w:t>HU-T.6 — Gestionar mis notificaciones internas</w:t>
@@ -12425,7 +12425,7 @@
         <w:pStyle w:val="Ttulo2"/>
       </w:pPr>
       <w:bookmarkStart w:id="26" w:name="_5605fb9a7931d45a4bf5dc8e3e653d18c531f06"/>
-      <w:bookmarkStart w:id="27" w:name="_Toc244208847"/>
+      <w:bookmarkStart w:id="27" w:name="_Toc244249299"/>
       <w:bookmarkEnd w:id="24"/>
       <w:r>
         <w:t>HU-T.7 — Gestión de usuarios del sistema</w:t>
@@ -12712,7 +12712,7 @@
         <w:pStyle w:val="Ttulo2"/>
       </w:pPr>
       <w:bookmarkStart w:id="28" w:name="_cca84937acbaa5cdc69c436564f31a3800184ab"/>
-      <w:bookmarkStart w:id="29" w:name="_Toc244208848"/>
+      <w:bookmarkStart w:id="29" w:name="_Toc244249300"/>
       <w:bookmarkEnd w:id="26"/>
       <w:r>
         <w:t>HU-T.8 — Logs de auditoría y seguridad</w:t>
@@ -12957,7 +12957,7 @@
         <w:pStyle w:val="Ttulo2"/>
       </w:pPr>
       <w:bookmarkStart w:id="30" w:name="_cb462f816148050ba0d7aac8f53a2b5b0cb7780"/>
-      <w:bookmarkStart w:id="31" w:name="_Toc244208849"/>
+      <w:bookmarkStart w:id="31" w:name="_Toc244249301"/>
       <w:bookmarkEnd w:id="28"/>
       <w:r>
         <w:t>HU-T.9 — Backup automático de la base de datos</w:t>
@@ -13427,7 +13427,7 @@
         <w:pStyle w:val="Ttulo2"/>
       </w:pPr>
       <w:bookmarkStart w:id="32" w:name="_276f5e9a65ab31ebb82d9356073ee60ffcf6855"/>
-      <w:bookmarkStart w:id="33" w:name="_Toc244208850"/>
+      <w:bookmarkStart w:id="33" w:name="_Toc244249302"/>
       <w:bookmarkEnd w:id="30"/>
       <w:r>
         <w:t>HU-T.10 — Autorización central por rol (RBAC real)</w:t>
@@ -13705,7 +13705,7 @@
         <w:pStyle w:val="Ttulo2"/>
       </w:pPr>
       <w:bookmarkStart w:id="34" w:name="_3b0d05aa899aefedfcf439319a22bd7df135017"/>
-      <w:bookmarkStart w:id="35" w:name="_Toc244208851"/>
+      <w:bookmarkStart w:id="35" w:name="_Toc244249303"/>
       <w:bookmarkEnd w:id="32"/>
       <w:r>
         <w:t>HU-T.11 — Corregir escalada de privilegios y proteger al último administrador</w:t>
@@ -13955,7 +13955,7 @@
         <w:pStyle w:val="Ttulo2"/>
       </w:pPr>
       <w:bookmarkStart w:id="36" w:name="_5106da541d290f3488d79d8c1e91fe390d48e5c"/>
-      <w:bookmarkStart w:id="37" w:name="_Toc244208852"/>
+      <w:bookmarkStart w:id="37" w:name="_Toc244249304"/>
       <w:bookmarkEnd w:id="34"/>
       <w:r>
         <w:t>HU-T.12 — Política de contraseñas, verificación de correo y OAuth seguro</w:t>
@@ -14276,7 +14276,7 @@
         <w:pStyle w:val="Ttulo2"/>
       </w:pPr>
       <w:bookmarkStart w:id="38" w:name="_2303defb5da6c78860aeae9d161d0fa18f76502"/>
-      <w:bookmarkStart w:id="39" w:name="_Toc244208853"/>
+      <w:bookmarkStart w:id="39" w:name="_Toc244249305"/>
       <w:bookmarkEnd w:id="36"/>
       <w:r>
         <w:t>HU-T.13 — Endurecer rate limiting y reducir enumeración/fuga de información</w:t>
@@ -14578,7 +14578,7 @@
         <w:pStyle w:val="Ttulo2"/>
       </w:pPr>
       <w:bookmarkStart w:id="40" w:name="_37cade07514fa6d0623cee7537c5f68cab00cfd"/>
-      <w:bookmarkStart w:id="41" w:name="_Toc244208854"/>
+      <w:bookmarkStart w:id="41" w:name="_Toc244249306"/>
       <w:bookmarkEnd w:id="38"/>
       <w:r>
         <w:t>HU-T.14 — Restablecer la contraseña de un usuario (administrador)</w:t>
@@ -14874,7 +14874,7 @@
         <w:pStyle w:val="Ttulo2"/>
       </w:pPr>
       <w:bookmarkStart w:id="42" w:name="_09522c4444a8bbebdaf4a55b5444d2231a6caff"/>
-      <w:bookmarkStart w:id="43" w:name="_Toc244208855"/>
+      <w:bookmarkStart w:id="43" w:name="_Toc244249307"/>
       <w:bookmarkEnd w:id="40"/>
       <w:r>
         <w:t>HU-T.15 — Aislamiento por clínica y rol super-administrador</w:t>
@@ -15466,7 +15466,7 @@
         <w:pStyle w:val="Ttulo2"/>
       </w:pPr>
       <w:bookmarkStart w:id="44" w:name="_7d4be07c6dc7ad98ff2d7fd7f946e3e6ff8ab78"/>
-      <w:bookmarkStart w:id="45" w:name="_Toc244208856"/>
+      <w:bookmarkStart w:id="45" w:name="_Toc244249308"/>
       <w:bookmarkEnd w:id="42"/>
       <w:r>
         <w:lastRenderedPageBreak/>
@@ -15715,7 +15715,7 @@
         <w:pStyle w:val="Ttulo2"/>
       </w:pPr>
       <w:bookmarkStart w:id="46" w:name="_fde5550409ae8bd107b35d83706fe49d1ac49cf"/>
-      <w:bookmarkStart w:id="47" w:name="_Toc244208857"/>
+      <w:bookmarkStart w:id="47" w:name="_Toc244249309"/>
       <w:bookmarkEnd w:id="44"/>
       <w:r>
         <w:t>HU-T.17 — Una persona con varios roles: elegir el contexto al iniciar sesión</w:t>
@@ -15975,7 +15975,7 @@
         <w:pStyle w:val="Ttulo2"/>
       </w:pPr>
       <w:bookmarkStart w:id="48" w:name="_7d9311428cd5b72468b37f82201f1b810f77c36"/>
-      <w:bookmarkStart w:id="49" w:name="_Toc244208858"/>
+      <w:bookmarkStart w:id="49" w:name="_Toc244249310"/>
       <w:bookmarkEnd w:id="46"/>
       <w:r>
         <w:t>HU-T.18 — Registrarme e iniciar sesión con Google (propietario)</w:t>
@@ -16277,7 +16277,7 @@
         <w:pStyle w:val="Ttulo2"/>
       </w:pPr>
       <w:bookmarkStart w:id="50" w:name="_a6c52dc4bdd2cb00ae48e74db3c3b2920a9b818"/>
-      <w:bookmarkStart w:id="51" w:name="_Toc244208859"/>
+      <w:bookmarkStart w:id="51" w:name="_Toc244249311"/>
       <w:bookmarkEnd w:id="48"/>
       <w:r>
         <w:t>HU-T.19 — Aceptar la política de tratamiento de datos</w:t>
@@ -16570,7 +16570,7 @@
         <w:pStyle w:val="Ttulo1"/>
       </w:pPr>
       <w:bookmarkStart w:id="52" w:name="_45e5cddb15e6e85961c4bdd9f114a9e4301e667"/>
-      <w:bookmarkStart w:id="53" w:name="_Toc244208860"/>
+      <w:bookmarkStart w:id="53" w:name="_Toc244249312"/>
       <w:bookmarkEnd w:id="12"/>
       <w:bookmarkEnd w:id="50"/>
       <w:r>
@@ -16592,7 +16592,7 @@
         <w:pStyle w:val="Ttulo2"/>
       </w:pPr>
       <w:bookmarkStart w:id="54" w:name="_3442f1e103117ab35c7be2be07e5b7a86f50900"/>
-      <w:bookmarkStart w:id="55" w:name="_Toc244208861"/>
+      <w:bookmarkStart w:id="55" w:name="_Toc244249313"/>
       <w:r>
         <w:t>HU-1.1 — Registrar mascota</w:t>
       </w:r>
@@ -16883,7 +16883,7 @@
         <w:pStyle w:val="Ttulo2"/>
       </w:pPr>
       <w:bookmarkStart w:id="56" w:name="_cac8078226ab7384debc291829d99266c4c98c9"/>
-      <w:bookmarkStart w:id="57" w:name="_Toc244208862"/>
+      <w:bookmarkStart w:id="57" w:name="_Toc244249314"/>
       <w:bookmarkEnd w:id="54"/>
       <w:r>
         <w:t>HU-1.2 — Registrar propietario</w:t>
@@ -17150,7 +17150,7 @@
         <w:pStyle w:val="Ttulo2"/>
       </w:pPr>
       <w:bookmarkStart w:id="58" w:name="_2775e78a99e9a6c8110a18962d2d3ffe08eb791"/>
-      <w:bookmarkStart w:id="59" w:name="_Toc244208863"/>
+      <w:bookmarkStart w:id="59" w:name="_Toc244249315"/>
       <w:bookmarkEnd w:id="56"/>
       <w:r>
         <w:t>HU-1.3 — Buscar paciente</w:t>
@@ -17382,7 +17382,7 @@
         <w:pStyle w:val="Ttulo2"/>
       </w:pPr>
       <w:bookmarkStart w:id="60" w:name="_a48b917e447c9bb421319764b87fa8fbfffc6ce"/>
-      <w:bookmarkStart w:id="61" w:name="_Toc244208864"/>
+      <w:bookmarkStart w:id="61" w:name="_Toc244249316"/>
       <w:bookmarkEnd w:id="58"/>
       <w:r>
         <w:t>HU-1.4 — Editar y desactivar mascota</w:t>
@@ -17648,7 +17648,7 @@
         <w:pStyle w:val="Ttulo2"/>
       </w:pPr>
       <w:bookmarkStart w:id="62" w:name="_c56dbdf70effe4fdddd03cc982164bf6dfa15fd"/>
-      <w:bookmarkStart w:id="63" w:name="_Toc244208865"/>
+      <w:bookmarkStart w:id="63" w:name="_Toc244249317"/>
       <w:bookmarkEnd w:id="60"/>
       <w:r>
         <w:t>HU-1.5 — Vincular una mascota existente a la clínica</w:t>
@@ -17916,7 +17916,7 @@
         <w:pStyle w:val="Ttulo1"/>
       </w:pPr>
       <w:bookmarkStart w:id="64" w:name="_8ada1076fc69f75adb455b52b48149b634e12c1"/>
-      <w:bookmarkStart w:id="65" w:name="_Toc244208866"/>
+      <w:bookmarkStart w:id="65" w:name="_Toc244249318"/>
       <w:bookmarkEnd w:id="52"/>
       <w:bookmarkEnd w:id="62"/>
       <w:r>
@@ -17938,7 +17938,7 @@
         <w:pStyle w:val="Ttulo2"/>
       </w:pPr>
       <w:bookmarkStart w:id="66" w:name="_d0fbc850c25121b5bb6429938908d9d6324f20c"/>
-      <w:bookmarkStart w:id="67" w:name="_Toc244208867"/>
+      <w:bookmarkStart w:id="67" w:name="_Toc244249319"/>
       <w:r>
         <w:t>HU-2.1 — Registrar consulta clínica</w:t>
       </w:r>
@@ -18219,7 +18219,7 @@
         <w:pStyle w:val="Ttulo2"/>
       </w:pPr>
       <w:bookmarkStart w:id="68" w:name="_7a453a6eb6ed88e1bfb6e10d4e89e02e93370e4"/>
-      <w:bookmarkStart w:id="69" w:name="_Toc244208868"/>
+      <w:bookmarkStart w:id="69" w:name="_Toc244249320"/>
       <w:bookmarkEnd w:id="66"/>
       <w:r>
         <w:t>HU-2.2 — Atención clínica sin cita (urgencias)</w:t>
@@ -18518,7 +18518,7 @@
         <w:pStyle w:val="Ttulo2"/>
       </w:pPr>
       <w:bookmarkStart w:id="70" w:name="_277d15ee6375124a0d7497cd947f0496d653294"/>
-      <w:bookmarkStart w:id="71" w:name="_Toc244208869"/>
+      <w:bookmarkStart w:id="71" w:name="_Toc244249321"/>
       <w:bookmarkEnd w:id="68"/>
       <w:r>
         <w:t>HU-2.3 — Adjuntar archivos clínicos</w:t>
@@ -18854,7 +18854,7 @@
         <w:pStyle w:val="Ttulo2"/>
       </w:pPr>
       <w:bookmarkStart w:id="72" w:name="_1b98c978e60977db39fc2418db7fe5e3ddc3001"/>
-      <w:bookmarkStart w:id="73" w:name="_Toc244208870"/>
+      <w:bookmarkStart w:id="73" w:name="_Toc244249322"/>
       <w:bookmarkEnd w:id="70"/>
       <w:r>
         <w:t>HU-2.4 — Registrar tratamiento</w:t>
@@ -19101,7 +19101,7 @@
         <w:pStyle w:val="Ttulo2"/>
       </w:pPr>
       <w:bookmarkStart w:id="74" w:name="_9717672e9e73feeffef28eb38b12c038cdd7bd2"/>
-      <w:bookmarkStart w:id="75" w:name="_Toc244208871"/>
+      <w:bookmarkStart w:id="75" w:name="_Toc244249323"/>
       <w:bookmarkEnd w:id="72"/>
       <w:r>
         <w:t>HU-2.5 — Ver historial clínico completo</w:t>
@@ -19364,7 +19364,7 @@
         <w:pStyle w:val="Ttulo2"/>
       </w:pPr>
       <w:bookmarkStart w:id="76" w:name="_fdc1478d352073634e6bd92f17796cead004715"/>
-      <w:bookmarkStart w:id="77" w:name="_Toc244208872"/>
+      <w:bookmarkStart w:id="77" w:name="_Toc244249324"/>
       <w:bookmarkEnd w:id="74"/>
       <w:r>
         <w:t>HU-2.6 — Atomicidad y feedback de adjuntos en el registro de consulta</w:t>
@@ -19646,7 +19646,7 @@
         <w:pStyle w:val="Ttulo2"/>
       </w:pPr>
       <w:bookmarkStart w:id="78" w:name="_101f0dcf34d14c70ec0f17a5f1393f5d9e5e380"/>
-      <w:bookmarkStart w:id="79" w:name="_Toc244208873"/>
+      <w:bookmarkStart w:id="79" w:name="_Toc244249325"/>
       <w:bookmarkEnd w:id="76"/>
       <w:r>
         <w:t>HU-2.7 — Validación y control de acceso en registros clínicos y de mascota</w:t>
@@ -19926,7 +19926,7 @@
         <w:pStyle w:val="Ttulo2"/>
       </w:pPr>
       <w:bookmarkStart w:id="80" w:name="_004e46896b85bf56df5905f1e03a53c4af0a844"/>
-      <w:bookmarkStart w:id="81" w:name="_Toc244208874"/>
+      <w:bookmarkStart w:id="81" w:name="_Toc244249326"/>
       <w:bookmarkEnd w:id="78"/>
       <w:r>
         <w:t>HU-2.8 — Sugerencia de diagnósticos probables por síntomas</w:t>
@@ -20107,7 +20107,11 @@
         </w:numPr>
       </w:pPr>
       <w:r>
-        <w:t>Los diagnósticos se muestran rankeados; el veterinario puede aceptarlos o escribir el suyo.</w:t>
+        <w:t xml:space="preserve">Los diagnósticos se muestran rankeados; el veterinario puede aceptarlos o escribir el suyo. Usar agrega como sugerencia editable el plan disponible y las pautas aplicables, sin borrar </w:t>
+      </w:r>
+      <w:r>
+        <w:lastRenderedPageBreak/>
+        <w:t>ni duplicar; indica qué se llenó y permite Deshacer solo lo agregado. Cada fila pide verificar la dosis; al cambiar peso solo recalcula dosis aún no editadas (decisión del dueño, 2026-10-29).</w:t>
       </w:r>
     </w:p>
     <w:p>
@@ -20119,7 +20123,6 @@
         </w:numPr>
       </w:pPr>
       <w:r>
-        <w:lastRenderedPageBreak/>
         <w:t>Si el grafo no encuentra coincidencias, el veterinario escribe el diagnóstico libremente; el diagnóstico es obligatorio para continuar (RN-202).</w:t>
       </w:r>
     </w:p>
@@ -20187,7 +20190,7 @@
         <w:pStyle w:val="Ttulo2"/>
       </w:pPr>
       <w:bookmarkStart w:id="82" w:name="_dc4885bd67732a434e9ba082721bf6df1e25b78"/>
-      <w:bookmarkStart w:id="83" w:name="_Toc244208875"/>
+      <w:bookmarkStart w:id="83" w:name="_Toc244249327"/>
       <w:bookmarkEnd w:id="80"/>
       <w:r>
         <w:t>HU-2.9 — Alertas de toxicidad e interacción al prescribir</w:t>
@@ -20412,7 +20415,7 @@
         </w:numPr>
       </w:pPr>
       <w:r>
-        <w:t>El soporte es de apoyo (RN-209): no receta por sí solo; la decisión final es del veterinario.</w:t>
+        <w:t>El soporte es de apoyo (RN-209): no receta por sí solo; la decisión final es del veterinario. Las pautas sugeridas excluyen bloqueos y marcan advertencias, también al completar desde un diagnóstico; se validan igual que una fila manual y solo se consultan con vínculo activo.</w:t>
       </w:r>
     </w:p>
     <w:p>
@@ -20467,7 +20470,7 @@
         <w:pStyle w:val="Ttulo2"/>
       </w:pPr>
       <w:bookmarkStart w:id="84" w:name="_39e4f7d80042c39922c0142f6da447f46643fcd"/>
-      <w:bookmarkStart w:id="85" w:name="_Toc244208876"/>
+      <w:bookmarkStart w:id="85" w:name="_Toc244249328"/>
       <w:bookmarkEnd w:id="82"/>
       <w:r>
         <w:t>HU-2.10 — Ver la historia compartida de la mascota (multi-clínica)</w:t>
@@ -20612,6 +20615,7 @@
         <w:pStyle w:val="Textodebloque"/>
       </w:pPr>
       <w:r>
+        <w:lastRenderedPageBreak/>
         <w:t>Como veterinario, quiero ver lo que otras clínicas registraron de la mascota, según lo que el propietario autorizó, para no repetir vacunas ni pasar por alto una alergia.</w:t>
       </w:r>
     </w:p>
@@ -20643,15 +20647,7 @@
           <w:i/>
           <w:iCs/>
         </w:rPr>
-        <w:t xml:space="preserve">M5 cerró </w:t>
-      </w:r>
-      <w:r>
-        <w:rPr>
-          <w:i/>
-          <w:iCs/>
-        </w:rPr>
-        <w:lastRenderedPageBreak/>
-        <w:t>datos básicos, vacunas y desparasitaciones; M2 completa las alergias y alertas en ficha, portal e impresión. Su presentación en el carnet sigue para el final de la v2.0.</w:t>
+        <w:t>M5 cerró datos básicos, vacunas y desparasitaciones; M2 completa las alergias y alertas en ficha, portal e impresión. Su presentación en el carnet sigue para el final de la v2.0.</w:t>
       </w:r>
     </w:p>
     <w:p>
@@ -20730,7 +20726,7 @@
         <w:pStyle w:val="Ttulo2"/>
       </w:pPr>
       <w:bookmarkStart w:id="86" w:name="_ddbeb8d4984f7e7207ef7f02c5c92f4dcdce30d"/>
-      <w:bookmarkStart w:id="87" w:name="_Toc244208877"/>
+      <w:bookmarkStart w:id="87" w:name="_Toc244249329"/>
       <w:bookmarkEnd w:id="84"/>
       <w:r>
         <w:t>HU-2.11 — Calcular el nivel de triage a partir de los síntomas</w:t>
@@ -20890,7 +20886,10 @@
         <w:t>Alcance entregado en M2:</w:t>
       </w:r>
       <w:r>
-        <w:t xml:space="preserve"> motor, buscador y batería automatizada de 26 casos; captura en Agendar, derivación de urgencias, aislamiento y ajuste del veterinario pendientes de M4.</w:t>
+        <w:t xml:space="preserve"> </w:t>
+      </w:r>
+      <w:r>
+        <w:t>motor, buscador y batería automatizada de 26 casos; captura en Agendar, derivación de urgencias, aislamiento y ajuste del veterinario pendientes de M4.</w:t>
       </w:r>
     </w:p>
     <w:p>
@@ -20974,7 +20973,11 @@
         </w:numPr>
       </w:pPr>
       <w:r>
-        <w:t>Las combinaciones escalan, y la raza, la edad, el estado, el historial (incluidas alergias de otras clínicas) y el tiempo modifican el nivel. Sin vacunación declarada, se usan las vacunas de esa mascota en cualquier clínica: alguna próxima dosis vencida implica «incompleta»; al menos una vacuna y ninguna vencida, «completa»; sin registros, sin dato. Lo declarado manda (RN-416/RN-113).</w:t>
+        <w:t xml:space="preserve">Las combinaciones escalan, y la raza, la edad, el estado, el historial (incluidas alergias de otras clínicas) y el tiempo modifican el nivel. Sin vacunación declarada, se usan las vacunas de esa mascota en cualquier clínica: alguna próxima dosis vencida implica «incompleta»; al </w:t>
+      </w:r>
+      <w:r>
+        <w:lastRenderedPageBreak/>
+        <w:t>menos una vacuna y ninguna vencida, «completa»; sin registros, sin dato. Lo declarado manda (RN-416/RN-113).</w:t>
       </w:r>
     </w:p>
     <w:p>
@@ -21004,7 +21007,6 @@
         </w:numPr>
       </w:pPr>
       <w:r>
-        <w:lastRenderedPageBreak/>
         <w:t xml:space="preserve">Sin cobertura específica, con «Otro / no sé» o sin regla aplicable a las marcas, el caso queda en </w:t>
       </w:r>
       <w:r>
@@ -21093,7 +21095,7 @@
         <w:pStyle w:val="Ttulo2"/>
       </w:pPr>
       <w:bookmarkStart w:id="88" w:name="_492240b15c6ebc6fbe3f7fd23583d697b838ee5"/>
-      <w:bookmarkStart w:id="89" w:name="_Toc244208878"/>
+      <w:bookmarkStart w:id="89" w:name="_Toc244249330"/>
       <w:bookmarkEnd w:id="86"/>
       <w:r>
         <w:t>HU-2.12 — Explorar el mapa del conocimiento clínico</w:t>
@@ -21365,7 +21367,7 @@
         <w:pStyle w:val="Ttulo1"/>
       </w:pPr>
       <w:bookmarkStart w:id="90" w:name="_d55aebc9deeb1682a62a02ae225cde94fe0baf3"/>
-      <w:bookmarkStart w:id="91" w:name="_Toc244208879"/>
+      <w:bookmarkStart w:id="91" w:name="_Toc244249331"/>
       <w:bookmarkEnd w:id="64"/>
       <w:bookmarkEnd w:id="88"/>
       <w:r>
@@ -21387,7 +21389,7 @@
         <w:pStyle w:val="Ttulo2"/>
       </w:pPr>
       <w:bookmarkStart w:id="92" w:name="_73783a222ff535845613407f8c2c5de0df62c29"/>
-      <w:bookmarkStart w:id="93" w:name="_Toc244208880"/>
+      <w:bookmarkStart w:id="93" w:name="_Toc244249332"/>
       <w:r>
         <w:t>HU-3.1 — Registrar vacunación</w:t>
       </w:r>
@@ -21630,7 +21632,7 @@
         <w:pStyle w:val="Ttulo2"/>
       </w:pPr>
       <w:bookmarkStart w:id="94" w:name="_6075047063f4930391208048315650ed427ae6c"/>
-      <w:bookmarkStart w:id="95" w:name="_Toc244208881"/>
+      <w:bookmarkStart w:id="95" w:name="_Toc244249333"/>
       <w:bookmarkEnd w:id="92"/>
       <w:r>
         <w:t>HU-3.2 — Enviar recordatorio por correo</w:t>
@@ -21886,7 +21888,7 @@
         <w:pStyle w:val="Ttulo2"/>
       </w:pPr>
       <w:bookmarkStart w:id="96" w:name="_781661fe2d15deb5f4d895541dced4f16e579af"/>
-      <w:bookmarkStart w:id="97" w:name="_Toc244208882"/>
+      <w:bookmarkStart w:id="97" w:name="_Toc244249334"/>
       <w:bookmarkEnd w:id="94"/>
       <w:r>
         <w:t>HU-3.3 — Enviar recordatorio por WhatsApp</w:t>
@@ -22143,7 +22145,7 @@
         <w:pStyle w:val="Ttulo2"/>
       </w:pPr>
       <w:bookmarkStart w:id="98" w:name="_8afd4fd6adaa7aec672b37965973c4a0b1b5483"/>
-      <w:bookmarkStart w:id="99" w:name="_Toc244208883"/>
+      <w:bookmarkStart w:id="99" w:name="_Toc244249335"/>
       <w:bookmarkEnd w:id="96"/>
       <w:r>
         <w:t>HU-3.4 — Registrar desparasitación</w:t>
@@ -22387,7 +22389,7 @@
         <w:pStyle w:val="Ttulo2"/>
       </w:pPr>
       <w:bookmarkStart w:id="100" w:name="_69b92288d624f1c737d99fa43d727735c1c78ac"/>
-      <w:bookmarkStart w:id="101" w:name="_Toc244208884"/>
+      <w:bookmarkStart w:id="101" w:name="_Toc244249336"/>
       <w:bookmarkEnd w:id="98"/>
       <w:r>
         <w:t>HU-3.5 — Panel de vacunaciones pendientes</w:t>
@@ -22665,7 +22667,7 @@
         <w:pStyle w:val="Ttulo2"/>
       </w:pPr>
       <w:bookmarkStart w:id="102" w:name="_83b2b6ee9ef84433e407efb3456acc0bf8c705f"/>
-      <w:bookmarkStart w:id="103" w:name="_Toc244208885"/>
+      <w:bookmarkStart w:id="103" w:name="_Toc244249337"/>
       <w:bookmarkEnd w:id="100"/>
       <w:r>
         <w:lastRenderedPageBreak/>
@@ -23010,7 +23012,7 @@
         <w:pStyle w:val="Ttulo1"/>
       </w:pPr>
       <w:bookmarkStart w:id="104" w:name="_0bc479c0be240e26431ebdd296a7a53444b2628"/>
-      <w:bookmarkStart w:id="105" w:name="_Toc244208886"/>
+      <w:bookmarkStart w:id="105" w:name="_Toc244249338"/>
       <w:bookmarkEnd w:id="90"/>
       <w:bookmarkEnd w:id="102"/>
       <w:r>
@@ -23032,7 +23034,7 @@
         <w:pStyle w:val="Ttulo2"/>
       </w:pPr>
       <w:bookmarkStart w:id="106" w:name="_83a9ef67ed8a24f8f8fb200a3c30fdc3bf36c17"/>
-      <w:bookmarkStart w:id="107" w:name="_Toc244208887"/>
+      <w:bookmarkStart w:id="107" w:name="_Toc244249339"/>
       <w:r>
         <w:t>HU-4.1 — Agendar cita</w:t>
       </w:r>
@@ -23335,7 +23337,7 @@
         <w:pStyle w:val="Ttulo2"/>
       </w:pPr>
       <w:bookmarkStart w:id="108" w:name="_102fb6dec5375a39a698cb955a51646f9817d25"/>
-      <w:bookmarkStart w:id="109" w:name="_Toc244208888"/>
+      <w:bookmarkStart w:id="109" w:name="_Toc244249340"/>
       <w:bookmarkEnd w:id="106"/>
       <w:r>
         <w:t>HU-4.2 — Cancelar o reprogramar cita</w:t>
@@ -23604,7 +23606,7 @@
         <w:pStyle w:val="Ttulo2"/>
       </w:pPr>
       <w:bookmarkStart w:id="110" w:name="_bc90a9ef9035fcbf5d83826a75a2a7caba95288"/>
-      <w:bookmarkStart w:id="111" w:name="_Toc244208889"/>
+      <w:bookmarkStart w:id="111" w:name="_Toc244249341"/>
       <w:bookmarkEnd w:id="108"/>
       <w:r>
         <w:t>HU-4.3 — Marcar cita como completada</w:t>
@@ -23978,7 +23980,7 @@
         <w:pStyle w:val="Ttulo2"/>
       </w:pPr>
       <w:bookmarkStart w:id="112" w:name="_0ab1d1688e3b6d42f481962b5abe908ca5f185e"/>
-      <w:bookmarkStart w:id="113" w:name="_Toc244208890"/>
+      <w:bookmarkStart w:id="113" w:name="_Toc244249342"/>
       <w:bookmarkEnd w:id="110"/>
       <w:r>
         <w:t>HU-4.4 — Confirmación automática de cita por correo</w:t>
@@ -24222,7 +24224,7 @@
         <w:pStyle w:val="Ttulo2"/>
       </w:pPr>
       <w:bookmarkStart w:id="114" w:name="_391b83d5c01b20c64bec4d1baa2ded83b27b3cc"/>
-      <w:bookmarkStart w:id="115" w:name="_Toc244208891"/>
+      <w:bookmarkStart w:id="115" w:name="_Toc244249343"/>
       <w:bookmarkEnd w:id="112"/>
       <w:r>
         <w:t>HU-4.5 — Registrar hora real de atención y gestionar retrasos</w:t>
@@ -24546,7 +24548,7 @@
         <w:pStyle w:val="Ttulo2"/>
       </w:pPr>
       <w:bookmarkStart w:id="116" w:name="_fd2845ac88e46c3520f61b9b4ded26b35f37534"/>
-      <w:bookmarkStart w:id="117" w:name="_Toc244208892"/>
+      <w:bookmarkStart w:id="117" w:name="_Toc244249344"/>
       <w:bookmarkEnd w:id="114"/>
       <w:r>
         <w:t>HU-4.6 — Buffer configurable entre citas</w:t>
@@ -24820,7 +24822,7 @@
         <w:pStyle w:val="Ttulo2"/>
       </w:pPr>
       <w:bookmarkStart w:id="118" w:name="_4786f5b438d23c36e067f350ad8ed0097d027c2"/>
-      <w:bookmarkStart w:id="119" w:name="_Toc244208893"/>
+      <w:bookmarkStart w:id="119" w:name="_Toc244249345"/>
       <w:bookmarkEnd w:id="116"/>
       <w:r>
         <w:t>HU-4.7 — Estado "no asistió" y ausentismo</w:t>
@@ -25174,7 +25176,7 @@
         <w:pStyle w:val="Ttulo2"/>
       </w:pPr>
       <w:bookmarkStart w:id="120" w:name="_0d930997ffa83b9b36b150e5e50b933f66b264d"/>
-      <w:bookmarkStart w:id="121" w:name="_Toc244208894"/>
+      <w:bookmarkStart w:id="121" w:name="_Toc244249346"/>
       <w:bookmarkEnd w:id="118"/>
       <w:r>
         <w:t>HU-4.8 — Bloqueos de agenda del veterinario y días no laborables</w:t>
@@ -25460,7 +25462,7 @@
         <w:pStyle w:val="Ttulo2"/>
       </w:pPr>
       <w:bookmarkStart w:id="122" w:name="_592e3b26ee2d82de9a78960621790aca76cbe41"/>
-      <w:bookmarkStart w:id="123" w:name="_Toc244208895"/>
+      <w:bookmarkStart w:id="123" w:name="_Toc244249347"/>
       <w:bookmarkEnd w:id="120"/>
       <w:r>
         <w:t>HU-4.9 — Endurecer la validación de disponibilidad</w:t>
@@ -25780,7 +25782,7 @@
         <w:pStyle w:val="Ttulo2"/>
       </w:pPr>
       <w:bookmarkStart w:id="124" w:name="_53bf433c324c03bf220d8f1ea57572094c24d19"/>
-      <w:bookmarkStart w:id="125" w:name="_Toc244208896"/>
+      <w:bookmarkStart w:id="125" w:name="_Toc244249348"/>
       <w:bookmarkEnd w:id="122"/>
       <w:r>
         <w:t>HU-4.10 — Confirmar asistencia a la cita desde el recordatorio</w:t>
@@ -26063,7 +26065,7 @@
         <w:pStyle w:val="Ttulo2"/>
       </w:pPr>
       <w:bookmarkStart w:id="126" w:name="_bc4a4c08f4864e57db7a13372e3c901c5711bb9"/>
-      <w:bookmarkStart w:id="127" w:name="_Toc244208897"/>
+      <w:bookmarkStart w:id="127" w:name="_Toc244249349"/>
       <w:bookmarkEnd w:id="124"/>
       <w:r>
         <w:t>HU-4.11 — Configurar el horario recurrente del veterinario</w:t>
@@ -26335,7 +26337,7 @@
         <w:pStyle w:val="Ttulo2"/>
       </w:pPr>
       <w:bookmarkStart w:id="128" w:name="_3a9da54e9b682c781ba4f8ec9fb08eb1ae51469"/>
-      <w:bookmarkStart w:id="129" w:name="_Toc244208898"/>
+      <w:bookmarkStart w:id="129" w:name="_Toc244249350"/>
       <w:bookmarkEnd w:id="126"/>
       <w:r>
         <w:t>HU-4.12 — Registrar ausencia del veterinario y gestionar cobertura</w:t>
@@ -26658,7 +26660,7 @@
         <w:pStyle w:val="Ttulo2"/>
       </w:pPr>
       <w:bookmarkStart w:id="130" w:name="_d5e60343e26d4758074a6efaed07b69cd6c3551"/>
-      <w:bookmarkStart w:id="131" w:name="_Toc244208899"/>
+      <w:bookmarkStart w:id="131" w:name="_Toc244249351"/>
       <w:bookmarkEnd w:id="128"/>
       <w:r>
         <w:t>HU-4.13 — Agendar cita con triage de 4 niveles</w:t>
@@ -27086,7 +27088,7 @@
         <w:pStyle w:val="Ttulo2"/>
       </w:pPr>
       <w:bookmarkStart w:id="132" w:name="_d4adac7448e74c17e6bb33bf496ee79d1222807"/>
-      <w:bookmarkStart w:id="133" w:name="_Toc244208900"/>
+      <w:bookmarkStart w:id="133" w:name="_Toc244249352"/>
       <w:bookmarkEnd w:id="130"/>
       <w:r>
         <w:t>HU-4.14 — Reajuste de agenda en vivo (efecto cascada)</w:t>
@@ -27428,7 +27430,7 @@
         <w:pStyle w:val="Ttulo2"/>
       </w:pPr>
       <w:bookmarkStart w:id="134" w:name="_91e1c705d28c1a221b008d52046353792175d0f"/>
-      <w:bookmarkStart w:id="135" w:name="_Toc244208901"/>
+      <w:bookmarkStart w:id="135" w:name="_Toc244249353"/>
       <w:bookmarkEnd w:id="132"/>
       <w:r>
         <w:t>HU-4.15 — Atender una urgencia (triage rojo o llegada directa)</w:t>
@@ -27892,7 +27894,7 @@
         <w:pStyle w:val="Ttulo2"/>
       </w:pPr>
       <w:bookmarkStart w:id="136" w:name="_c78d8424c335bf78fd48b1955b4f1a67eda143f"/>
-      <w:bookmarkStart w:id="137" w:name="_Toc244208902"/>
+      <w:bookmarkStart w:id="137" w:name="_Toc244249354"/>
       <w:bookmarkEnd w:id="134"/>
       <w:r>
         <w:t>HU-4.16 — Sugerir veterinario al agendar</w:t>
@@ -28117,7 +28119,7 @@
         <w:pStyle w:val="Ttulo2"/>
       </w:pPr>
       <w:bookmarkStart w:id="138" w:name="_d95563cf58dd7b4419944c1578610bfcd0b1db0"/>
-      <w:bookmarkStart w:id="139" w:name="_Toc244208903"/>
+      <w:bookmarkStart w:id="139" w:name="_Toc244249355"/>
       <w:bookmarkEnd w:id="136"/>
       <w:r>
         <w:t>HU-4.17 — Recalcular el triage cuando cambian los síntomas</w:t>
@@ -28374,7 +28376,7 @@
         <w:pStyle w:val="Ttulo2"/>
       </w:pPr>
       <w:bookmarkStart w:id="140" w:name="_8b0a1409d398bf3e63485141aa804db028749ca"/>
-      <w:bookmarkStart w:id="141" w:name="_Toc244208904"/>
+      <w:bookmarkStart w:id="141" w:name="_Toc244249356"/>
       <w:bookmarkEnd w:id="138"/>
       <w:r>
         <w:t>HU-4.18 — Ajustar el nivel de triage (veterinario)</w:t>
@@ -28634,7 +28636,7 @@
         <w:pStyle w:val="Ttulo2"/>
       </w:pPr>
       <w:bookmarkStart w:id="142" w:name="_cf2722ce0434310059a1401a7a9236f9f75ab69"/>
-      <w:bookmarkStart w:id="143" w:name="_Toc244208905"/>
+      <w:bookmarkStart w:id="143" w:name="_Toc244249357"/>
       <w:bookmarkEnd w:id="140"/>
       <w:r>
         <w:lastRenderedPageBreak/>
@@ -28910,7 +28912,7 @@
         <w:pStyle w:val="Ttulo1"/>
       </w:pPr>
       <w:bookmarkStart w:id="144" w:name="_448b6637f95054bfc4854cb12826ea84d2acba0"/>
-      <w:bookmarkStart w:id="145" w:name="_Toc244208906"/>
+      <w:bookmarkStart w:id="145" w:name="_Toc244249358"/>
       <w:bookmarkEnd w:id="104"/>
       <w:bookmarkEnd w:id="142"/>
       <w:r>
@@ -28932,7 +28934,7 @@
         <w:pStyle w:val="Ttulo2"/>
       </w:pPr>
       <w:bookmarkStart w:id="146" w:name="_af054ffcebd6910222ee7d6c1d020875947335e"/>
-      <w:bookmarkStart w:id="147" w:name="_Toc244208907"/>
+      <w:bookmarkStart w:id="147" w:name="_Toc244249359"/>
       <w:r>
         <w:t>HU-5.1 — Portal del propietario</w:t>
       </w:r>
@@ -29275,7 +29277,7 @@
         <w:pStyle w:val="Ttulo2"/>
       </w:pPr>
       <w:bookmarkStart w:id="148" w:name="_6b1c61431b8f8f0fcc4ce60077071b912ba2b45"/>
-      <w:bookmarkStart w:id="149" w:name="_Toc244208908"/>
+      <w:bookmarkStart w:id="149" w:name="_Toc244249360"/>
       <w:bookmarkEnd w:id="146"/>
       <w:r>
         <w:t>HU-5.2 — Auto-registro de propietario</w:t>
@@ -29544,7 +29546,7 @@
         <w:pStyle w:val="Ttulo2"/>
       </w:pPr>
       <w:bookmarkStart w:id="150" w:name="_f4d063018be410b507969fa4c62074124f833cf"/>
-      <w:bookmarkStart w:id="151" w:name="_Toc244208909"/>
+      <w:bookmarkStart w:id="151" w:name="_Toc244249361"/>
       <w:bookmarkEnd w:id="148"/>
       <w:r>
         <w:t>HU-5.3 — Agendar cita desde el portal</w:t>
@@ -29819,7 +29821,7 @@
         <w:pStyle w:val="Ttulo2"/>
       </w:pPr>
       <w:bookmarkStart w:id="152" w:name="_c64202596780354c08c0a149dc974449db886cf"/>
-      <w:bookmarkStart w:id="153" w:name="_Toc244208910"/>
+      <w:bookmarkStart w:id="153" w:name="_Toc244249362"/>
       <w:bookmarkEnd w:id="150"/>
       <w:r>
         <w:t>HU-5.4 — Editar mi mascota desde el portal</w:t>
@@ -30057,7 +30059,7 @@
         <w:pStyle w:val="Ttulo2"/>
       </w:pPr>
       <w:bookmarkStart w:id="154" w:name="_cf91e7705c2cc7ff174f786bca87f4ab32c164a"/>
-      <w:bookmarkStart w:id="155" w:name="_Toc244208911"/>
+      <w:bookmarkStart w:id="155" w:name="_Toc244249363"/>
       <w:bookmarkEnd w:id="152"/>
       <w:r>
         <w:lastRenderedPageBreak/>
@@ -30303,7 +30305,7 @@
         <w:pStyle w:val="Ttulo2"/>
       </w:pPr>
       <w:bookmarkStart w:id="156" w:name="_f8ebe18ba7612da84cbeb32e6cdfcf569929127"/>
-      <w:bookmarkStart w:id="157" w:name="_Toc244208912"/>
+      <w:bookmarkStart w:id="157" w:name="_Toc244249364"/>
       <w:bookmarkEnd w:id="154"/>
       <w:r>
         <w:t>HU-5.6 — Cancelar o reprogramar mi cita desde el portal</w:t>
@@ -30604,7 +30606,7 @@
         <w:pStyle w:val="Ttulo2"/>
       </w:pPr>
       <w:bookmarkStart w:id="158" w:name="_63b2ff8270a3dc0cb21378739f70e0c16a27def"/>
-      <w:bookmarkStart w:id="159" w:name="_Toc244208913"/>
+      <w:bookmarkStart w:id="159" w:name="_Toc244249365"/>
       <w:bookmarkEnd w:id="156"/>
       <w:r>
         <w:lastRenderedPageBreak/>
@@ -30865,7 +30867,7 @@
         <w:pStyle w:val="Ttulo2"/>
       </w:pPr>
       <w:bookmarkStart w:id="160" w:name="_f59be5ab49da54ec24749683e30fb79075b9c3a"/>
-      <w:bookmarkStart w:id="161" w:name="_Toc244208914"/>
+      <w:bookmarkStart w:id="161" w:name="_Toc244249366"/>
       <w:bookmarkEnd w:id="158"/>
       <w:r>
         <w:t>HU-5.8 — Registrar al propietario como identidad global</w:t>
@@ -31253,7 +31255,7 @@
         <w:pStyle w:val="Ttulo2"/>
       </w:pPr>
       <w:bookmarkStart w:id="162" w:name="_06eaf3b49483b1eeebe1b8e79573cd5c749be44"/>
-      <w:bookmarkStart w:id="163" w:name="_Toc244208915"/>
+      <w:bookmarkStart w:id="163" w:name="_Toc244249367"/>
       <w:bookmarkEnd w:id="160"/>
       <w:r>
         <w:t>HU-5.9 — Iniciar sesión en el portal multi-clínica</w:t>
@@ -31532,7 +31534,7 @@
         <w:pStyle w:val="Ttulo2"/>
       </w:pPr>
       <w:bookmarkStart w:id="164" w:name="_73bf9bf1ab817b39687e744da8c8402ea9619af"/>
-      <w:bookmarkStart w:id="165" w:name="_Toc244208916"/>
+      <w:bookmarkStart w:id="165" w:name="_Toc244249368"/>
       <w:bookmarkEnd w:id="162"/>
       <w:r>
         <w:t>HU-5.10 — Carnet digital de la mascota con QR de emergencia</w:t>
@@ -31796,7 +31798,7 @@
         <w:pStyle w:val="Ttulo2"/>
       </w:pPr>
       <w:bookmarkStart w:id="166" w:name="_809064a587886d0547b1788a26db9d9152af23a"/>
-      <w:bookmarkStart w:id="167" w:name="_Toc244208917"/>
+      <w:bookmarkStart w:id="167" w:name="_Toc244249369"/>
       <w:bookmarkEnd w:id="164"/>
       <w:r>
         <w:t>HU-5.11 — Acceder al carnet por QR en modo solo lectura</w:t>
@@ -32068,7 +32070,7 @@
         <w:pStyle w:val="Ttulo2"/>
       </w:pPr>
       <w:bookmarkStart w:id="168" w:name="_eaa2b9dcd4e772acfdb8cc2e14fe1584fe792e7"/>
-      <w:bookmarkStart w:id="169" w:name="_Toc244208918"/>
+      <w:bookmarkStart w:id="169" w:name="_Toc244249370"/>
       <w:bookmarkEnd w:id="166"/>
       <w:r>
         <w:t>HU-5.12 — Autorizar a una clínica a ver la historia de otras clínicas</w:t>
@@ -32332,7 +32334,7 @@
         <w:pStyle w:val="Ttulo2"/>
       </w:pPr>
       <w:bookmarkStart w:id="170" w:name="_9c4353686bd45e1d5b28007e4eeecf1db3be371"/>
-      <w:bookmarkStart w:id="171" w:name="_Toc244208919"/>
+      <w:bookmarkStart w:id="171" w:name="_Toc244249371"/>
       <w:bookmarkEnd w:id="168"/>
       <w:r>
         <w:t>HU-5.13 — Vincularme o desvincularme de una clínica</w:t>
@@ -32604,7 +32606,7 @@
         <w:pStyle w:val="Ttulo2"/>
       </w:pPr>
       <w:bookmarkStart w:id="172" w:name="_faf9cae68ace52a6134b8c807ad8be34010091b"/>
-      <w:bookmarkStart w:id="173" w:name="_Toc244208920"/>
+      <w:bookmarkStart w:id="173" w:name="_Toc244249372"/>
       <w:bookmarkEnd w:id="170"/>
       <w:r>
         <w:t>HU-5.14 — Eliminar mi cuenta (derecho de supresión)</w:t>
@@ -32865,7 +32867,7 @@
         <w:pStyle w:val="Ttulo1"/>
       </w:pPr>
       <w:bookmarkStart w:id="174" w:name="_415d3e183ea3663701acfe1e73f6e8038e4bbef"/>
-      <w:bookmarkStart w:id="175" w:name="_Toc244208921"/>
+      <w:bookmarkStart w:id="175" w:name="_Toc244249373"/>
       <w:bookmarkEnd w:id="144"/>
       <w:bookmarkEnd w:id="172"/>
       <w:r>
@@ -32887,7 +32889,7 @@
         <w:pStyle w:val="Ttulo2"/>
       </w:pPr>
       <w:bookmarkStart w:id="176" w:name="_1b876ecfd0adf71d503b9129568b658f81872f0"/>
-      <w:bookmarkStart w:id="177" w:name="_Toc244208922"/>
+      <w:bookmarkStart w:id="177" w:name="_Toc244249374"/>
       <w:r>
         <w:t>HU-6.1 — Dashboard principal y panel de pendientes</w:t>
       </w:r>
@@ -33283,7 +33285,7 @@
         <w:pStyle w:val="Ttulo2"/>
       </w:pPr>
       <w:bookmarkStart w:id="178" w:name="_97322cabf772225fd1bfe897dee158000aa0394"/>
-      <w:bookmarkStart w:id="179" w:name="_Toc244208923"/>
+      <w:bookmarkStart w:id="179" w:name="_Toc244249375"/>
       <w:bookmarkEnd w:id="176"/>
       <w:r>
         <w:t>HU-6.2 — Panel de operación del administrador</w:t>
@@ -33664,7 +33666,7 @@
         <w:pStyle w:val="Ttulo2"/>
       </w:pPr>
       <w:bookmarkStart w:id="180" w:name="_6ce76d48cd12ce7662f89ac490d75c386fc18ba"/>
-      <w:bookmarkStart w:id="181" w:name="_Toc244208924"/>
+      <w:bookmarkStart w:id="181" w:name="_Toc244249376"/>
       <w:bookmarkEnd w:id="178"/>
       <w:r>
         <w:t>HU-6.3 — Generar reportes en PDF</w:t>
@@ -33950,7 +33952,7 @@
         <w:pStyle w:val="Ttulo2"/>
       </w:pPr>
       <w:bookmarkStart w:id="182" w:name="_132f0b1bfae1ac6054dc51db54a45dff43ec797"/>
-      <w:bookmarkStart w:id="183" w:name="_Toc244208925"/>
+      <w:bookmarkStart w:id="183" w:name="_Toc244249377"/>
       <w:bookmarkEnd w:id="180"/>
       <w:r>
         <w:t>HU-6.4 — Ver estadísticas y gráficas del sistema</w:t>
@@ -34207,7 +34209,7 @@
         <w:pStyle w:val="Ttulo2"/>
       </w:pPr>
       <w:bookmarkStart w:id="184" w:name="_159c41a8740d691e56d865baa1d2a17f58680f5"/>
-      <w:bookmarkStart w:id="185" w:name="_Toc244208926"/>
+      <w:bookmarkStart w:id="185" w:name="_Toc244249378"/>
       <w:bookmarkEnd w:id="182"/>
       <w:r>
         <w:lastRenderedPageBreak/>
@@ -34446,7 +34448,7 @@
         <w:pStyle w:val="Ttulo1"/>
       </w:pPr>
       <w:bookmarkStart w:id="186" w:name="_88abf5b53e5603b94c73c4f577271d31a73cc35"/>
-      <w:bookmarkStart w:id="187" w:name="_Toc244208927"/>
+      <w:bookmarkStart w:id="187" w:name="_Toc244249379"/>
       <w:bookmarkEnd w:id="174"/>
       <w:bookmarkEnd w:id="184"/>
       <w:r>
@@ -34468,7 +34470,7 @@
         <w:pStyle w:val="Ttulo2"/>
       </w:pPr>
       <w:bookmarkStart w:id="188" w:name="_003ad6784c61069e91989793d8255e8d4cb519d"/>
-      <w:bookmarkStart w:id="189" w:name="_Toc244208928"/>
+      <w:bookmarkStart w:id="189" w:name="_Toc244249380"/>
       <w:r>
         <w:t>HU-7.1 — Configurar los horarios de atención de la clínica</w:t>
       </w:r>
@@ -34747,7 +34749,7 @@
         <w:pStyle w:val="Ttulo2"/>
       </w:pPr>
       <w:bookmarkStart w:id="190" w:name="_42539d8b8201701c75c37499984fbffa69d6e4d"/>
-      <w:bookmarkStart w:id="191" w:name="_Toc244208929"/>
+      <w:bookmarkStart w:id="191" w:name="_Toc244249381"/>
       <w:bookmarkEnd w:id="188"/>
       <w:r>
         <w:t>HU-7.2 — Gestionar los catálogos del sistema</w:t>
@@ -35028,7 +35030,7 @@
         <w:pStyle w:val="Ttulo2"/>
       </w:pPr>
       <w:bookmarkStart w:id="192" w:name="_a0aee2f406b049ed83cfe391a77b0db14b5bfdf"/>
-      <w:bookmarkStart w:id="193" w:name="_Toc244208930"/>
+      <w:bookmarkStart w:id="193" w:name="_Toc244249382"/>
       <w:bookmarkEnd w:id="190"/>
       <w:r>
         <w:t>HU-7.3 — Gestionar los veterinarios y sus especialidades</w:t>
@@ -35297,7 +35299,7 @@
         <w:pStyle w:val="Ttulo2"/>
       </w:pPr>
       <w:bookmarkStart w:id="194" w:name="_a0688e3f345f7bf587dcedb8b562b8964a6cacc"/>
-      <w:bookmarkStart w:id="195" w:name="_Toc244208931"/>
+      <w:bookmarkStart w:id="195" w:name="_Toc244249383"/>
       <w:bookmarkEnd w:id="192"/>
       <w:r>
         <w:t>HU-7.4 — Personalizar la clínica: marca y tipos de cita</w:t>
@@ -35604,7 +35606,7 @@
         <w:pStyle w:val="Ttulo2"/>
       </w:pPr>
       <w:bookmarkStart w:id="196" w:name="_7004fcdc7c25449422304e35d609c3113b471f6"/>
-      <w:bookmarkStart w:id="197" w:name="_Toc244208932"/>
+      <w:bookmarkStart w:id="197" w:name="_Toc244249384"/>
       <w:bookmarkEnd w:id="194"/>
       <w:r>
         <w:t>HU-7.5 — Parámetros del sistema configurables</w:t>
@@ -35886,7 +35888,7 @@
         <w:pStyle w:val="Ttulo1"/>
       </w:pPr>
       <w:bookmarkStart w:id="198" w:name="_99f8c38fc90f872e869cb5a42176a81ce60716e"/>
-      <w:bookmarkStart w:id="199" w:name="_Toc244208933"/>
+      <w:bookmarkStart w:id="199" w:name="_Toc244249385"/>
       <w:bookmarkEnd w:id="186"/>
       <w:bookmarkEnd w:id="196"/>
       <w:r>
@@ -35915,7 +35917,7 @@
         <w:pStyle w:val="Ttulo2"/>
       </w:pPr>
       <w:bookmarkStart w:id="200" w:name="_6b93d7ad964c8104bb83fc9231a04e4fc4e5a57"/>
-      <w:bookmarkStart w:id="201" w:name="_Toc244208934"/>
+      <w:bookmarkStart w:id="201" w:name="_Toc244249386"/>
       <w:r>
         <w:t>HU-8.1 — Calificar al veterinario tras una consulta atendida</w:t>
       </w:r>
@@ -36220,7 +36222,7 @@
         <w:pStyle w:val="Ttulo2"/>
       </w:pPr>
       <w:bookmarkStart w:id="202" w:name="_6de705a3e3f0ae827b0b0206b40472100ec5dc2"/>
-      <w:bookmarkStart w:id="203" w:name="_Toc244208935"/>
+      <w:bookmarkStart w:id="203" w:name="_Toc244249387"/>
       <w:bookmarkEnd w:id="200"/>
       <w:r>
         <w:t>HU-8.2 — Perfil público del veterinario</w:t>
@@ -36466,7 +36468,7 @@
         <w:pStyle w:val="Ttulo2"/>
       </w:pPr>
       <w:bookmarkStart w:id="204" w:name="_8d0438a4c21826cdef43f79f40a5abd8a052054"/>
-      <w:bookmarkStart w:id="205" w:name="_Toc244208936"/>
+      <w:bookmarkStart w:id="205" w:name="_Toc244249388"/>
       <w:bookmarkEnd w:id="202"/>
       <w:r>
         <w:lastRenderedPageBreak/>
@@ -36712,7 +36714,7 @@
         <w:pStyle w:val="Ttulo2"/>
       </w:pPr>
       <w:bookmarkStart w:id="206" w:name="_9d375ff686aceee42a269dcad0f742f5e2f3757"/>
-      <w:bookmarkStart w:id="207" w:name="_Toc244208937"/>
+      <w:bookmarkStart w:id="207" w:name="_Toc244249389"/>
       <w:bookmarkEnd w:id="204"/>
       <w:r>
         <w:t>HU-8.4 — Tiempos de envío de recordatorios configurables</w:t>
@@ -36936,7 +36938,7 @@
         <w:pStyle w:val="Ttulo2"/>
       </w:pPr>
       <w:bookmarkStart w:id="208" w:name="_09d49d8f9ce2d4331632fad53df16df04e0463f"/>
-      <w:bookmarkStart w:id="209" w:name="_Toc244208938"/>
+      <w:bookmarkStart w:id="209" w:name="_Toc244249390"/>
       <w:bookmarkEnd w:id="206"/>
       <w:r>
         <w:t>HU-8.5 — Bitácora de correos y notificaciones</w:t>
@@ -37160,7 +37162,7 @@
         <w:pStyle w:val="Ttulo1"/>
       </w:pPr>
       <w:bookmarkStart w:id="210" w:name="_739f4e5454618e53e20de4c2474955375ba75c3"/>
-      <w:bookmarkStart w:id="211" w:name="_Toc244208939"/>
+      <w:bookmarkStart w:id="211" w:name="_Toc244249391"/>
       <w:bookmarkEnd w:id="198"/>
       <w:bookmarkEnd w:id="208"/>
       <w:r>
@@ -37182,7 +37184,7 @@
         <w:pStyle w:val="Ttulo2"/>
       </w:pPr>
       <w:bookmarkStart w:id="212" w:name="_062138411ab05c870ba796ff3d39feef69a18f5"/>
-      <w:bookmarkStart w:id="213" w:name="_Toc244208940"/>
+      <w:bookmarkStart w:id="213" w:name="_Toc244249392"/>
       <w:r>
         <w:t>HU-9.1 — Página pública y políticas legales</w:t>
       </w:r>
@@ -37407,7 +37409,7 @@
         <w:pStyle w:val="Ttulo1"/>
       </w:pPr>
       <w:bookmarkStart w:id="214" w:name="_6e6ded5804ca164f89e595fd787218d3285fdda"/>
-      <w:bookmarkStart w:id="215" w:name="_Toc244208941"/>
+      <w:bookmarkStart w:id="215" w:name="_Toc244249393"/>
       <w:bookmarkEnd w:id="210"/>
       <w:bookmarkEnd w:id="212"/>
       <w:r>
@@ -37457,7 +37459,7 @@
         <w:pStyle w:val="Ttulo2"/>
       </w:pPr>
       <w:bookmarkStart w:id="216" w:name="_84c91a7718df0375d71f3af5025108c0495eae8"/>
-      <w:bookmarkStart w:id="217" w:name="_Toc244208942"/>
+      <w:bookmarkStart w:id="217" w:name="_Toc244249394"/>
       <w:r>
         <w:t>Entrega v2.0 — imprescindible para la presentación (29 historias; 159 puntos estimados y HU-2.12 por estimar)</w:t>
       </w:r>
@@ -39005,7 +39007,7 @@
         <w:pStyle w:val="Ttulo2"/>
       </w:pPr>
       <w:bookmarkStart w:id="218" w:name="_4726c838c4287a7aa8f67a2e091a84cc61b2bb0"/>
-      <w:bookmarkStart w:id="219" w:name="_Toc244208943"/>
+      <w:bookmarkStart w:id="219" w:name="_Toc244249395"/>
       <w:bookmarkEnd w:id="216"/>
       <w:r>
         <w:t>Entrega v2.1 — completa el alcance (16 historias; estimación de HU-0.5 pendiente)</w:t>
@@ -39956,7 +39958,7 @@
         <w:pStyle w:val="Ttulo2"/>
       </w:pPr>
       <w:bookmarkStart w:id="220" w:name="_18e859a36e2a2c7f781eaf2084ffc20b263712e"/>
-      <w:bookmarkStart w:id="221" w:name="_Toc244208944"/>
+      <w:bookmarkStart w:id="221" w:name="_Toc244249396"/>
       <w:bookmarkEnd w:id="218"/>
       <w:r>
         <w:t>Historias diferidas que absorbe la v2</w:t>
@@ -40307,7 +40309,7 @@
         <w:pStyle w:val="Ttulo1"/>
       </w:pPr>
       <w:bookmarkStart w:id="222" w:name="_2bd3782f46f42f4ba497da64d292df25adf2039"/>
-      <w:bookmarkStart w:id="223" w:name="_Toc244208945"/>
+      <w:bookmarkStart w:id="223" w:name="_Toc244249397"/>
       <w:bookmarkEnd w:id="214"/>
       <w:bookmarkEnd w:id="220"/>
       <w:r>
@@ -45134,7 +45136,7 @@
         <w:pStyle w:val="Ttulo1"/>
       </w:pPr>
       <w:bookmarkStart w:id="224" w:name="_628434b2c6f40c9643f3958509c62867ee6f47b"/>
-      <w:bookmarkStart w:id="225" w:name="_Toc244208946"/>
+      <w:bookmarkStart w:id="225" w:name="_Toc244249398"/>
       <w:bookmarkEnd w:id="222"/>
       <w:r>
         <w:lastRenderedPageBreak/>
@@ -50699,7 +50701,7 @@
               <w:noProof/>
             </w:rPr>
             <w:drawing>
-              <wp:inline distT="0" distB="0" distL="0" distR="0" wp14:anchorId="3D2F7D7C" wp14:editId="3D2F7D7D">
+              <wp:inline distT="0" distB="0" distL="0" distR="0" wp14:anchorId="57711CCE" wp14:editId="57711CCF">
                 <wp:extent cx="324000" cy="324000"/>
                 <wp:effectExtent l="0" t="0" r="0" b="0"/>
                 <wp:docPr id="9001" name="Logo Zooki"/>
@@ -50866,7 +50868,7 @@
   <w:abstractNum w:abstractNumId="0" w15:restartNumberingAfterBreak="0">
     <w:nsid w:val="0000A991"/>
     <w:multiLevelType w:val="multilevel"/>
-    <w:tmpl w:val="539E61BA"/>
+    <w:tmpl w:val="B1E8BE7A"/>
     <w:lvl w:ilvl="0">
       <w:numFmt w:val="bullet"/>
       <w:lvlText w:val=""/>
@@ -50967,295 +50969,295 @@
       </w:rPr>
     </w:lvl>
   </w:abstractNum>
-  <w:num w:numId="1" w16cid:durableId="1621033859">
+  <w:num w:numId="1" w16cid:durableId="839350272">
     <w:abstractNumId w:val="0"/>
   </w:num>
-  <w:num w:numId="2" w16cid:durableId="1205824207">
+  <w:num w:numId="2" w16cid:durableId="169417575">
     <w:abstractNumId w:val="0"/>
   </w:num>
-  <w:num w:numId="3" w16cid:durableId="219294027">
+  <w:num w:numId="3" w16cid:durableId="902326938">
     <w:abstractNumId w:val="0"/>
   </w:num>
-  <w:num w:numId="4" w16cid:durableId="1408380952">
+  <w:num w:numId="4" w16cid:durableId="819005878">
     <w:abstractNumId w:val="0"/>
   </w:num>
-  <w:num w:numId="5" w16cid:durableId="1364358390">
+  <w:num w:numId="5" w16cid:durableId="301155177">
     <w:abstractNumId w:val="0"/>
   </w:num>
-  <w:num w:numId="6" w16cid:durableId="1264998170">
+  <w:num w:numId="6" w16cid:durableId="1854958035">
     <w:abstractNumId w:val="0"/>
   </w:num>
-  <w:num w:numId="7" w16cid:durableId="983967724">
+  <w:num w:numId="7" w16cid:durableId="402719935">
     <w:abstractNumId w:val="0"/>
   </w:num>
-  <w:num w:numId="8" w16cid:durableId="102574092">
+  <w:num w:numId="8" w16cid:durableId="1835487786">
     <w:abstractNumId w:val="0"/>
   </w:num>
-  <w:num w:numId="9" w16cid:durableId="1250194099">
+  <w:num w:numId="9" w16cid:durableId="1705212533">
     <w:abstractNumId w:val="0"/>
   </w:num>
-  <w:num w:numId="10" w16cid:durableId="1857964713">
+  <w:num w:numId="10" w16cid:durableId="95945505">
     <w:abstractNumId w:val="0"/>
   </w:num>
-  <w:num w:numId="11" w16cid:durableId="2028865880">
+  <w:num w:numId="11" w16cid:durableId="1814133095">
     <w:abstractNumId w:val="0"/>
   </w:num>
-  <w:num w:numId="12" w16cid:durableId="1239555436">
+  <w:num w:numId="12" w16cid:durableId="626857091">
     <w:abstractNumId w:val="0"/>
   </w:num>
-  <w:num w:numId="13" w16cid:durableId="1867862615">
+  <w:num w:numId="13" w16cid:durableId="1034574878">
     <w:abstractNumId w:val="0"/>
   </w:num>
-  <w:num w:numId="14" w16cid:durableId="73205398">
+  <w:num w:numId="14" w16cid:durableId="1903559767">
     <w:abstractNumId w:val="0"/>
   </w:num>
-  <w:num w:numId="15" w16cid:durableId="639918555">
+  <w:num w:numId="15" w16cid:durableId="1778257109">
     <w:abstractNumId w:val="0"/>
   </w:num>
-  <w:num w:numId="16" w16cid:durableId="1490437304">
+  <w:num w:numId="16" w16cid:durableId="13266533">
     <w:abstractNumId w:val="0"/>
   </w:num>
-  <w:num w:numId="17" w16cid:durableId="1810709909">
+  <w:num w:numId="17" w16cid:durableId="1307541215">
     <w:abstractNumId w:val="0"/>
   </w:num>
-  <w:num w:numId="18" w16cid:durableId="2055037201">
+  <w:num w:numId="18" w16cid:durableId="70737779">
     <w:abstractNumId w:val="0"/>
   </w:num>
-  <w:num w:numId="19" w16cid:durableId="1584291591">
+  <w:num w:numId="19" w16cid:durableId="1510481785">
     <w:abstractNumId w:val="0"/>
   </w:num>
-  <w:num w:numId="20" w16cid:durableId="219637802">
+  <w:num w:numId="20" w16cid:durableId="1875338262">
     <w:abstractNumId w:val="0"/>
   </w:num>
-  <w:num w:numId="21" w16cid:durableId="947660615">
+  <w:num w:numId="21" w16cid:durableId="469708490">
     <w:abstractNumId w:val="0"/>
   </w:num>
-  <w:num w:numId="22" w16cid:durableId="783617588">
+  <w:num w:numId="22" w16cid:durableId="1974941116">
     <w:abstractNumId w:val="0"/>
   </w:num>
-  <w:num w:numId="23" w16cid:durableId="228736796">
+  <w:num w:numId="23" w16cid:durableId="455374506">
     <w:abstractNumId w:val="0"/>
   </w:num>
-  <w:num w:numId="24" w16cid:durableId="1382635317">
+  <w:num w:numId="24" w16cid:durableId="1986816790">
     <w:abstractNumId w:val="0"/>
   </w:num>
-  <w:num w:numId="25" w16cid:durableId="718211546">
+  <w:num w:numId="25" w16cid:durableId="1632401591">
     <w:abstractNumId w:val="0"/>
   </w:num>
-  <w:num w:numId="26" w16cid:durableId="938946485">
+  <w:num w:numId="26" w16cid:durableId="1594969014">
     <w:abstractNumId w:val="0"/>
   </w:num>
-  <w:num w:numId="27" w16cid:durableId="1678923182">
+  <w:num w:numId="27" w16cid:durableId="2121341366">
     <w:abstractNumId w:val="0"/>
   </w:num>
-  <w:num w:numId="28" w16cid:durableId="1770857805">
+  <w:num w:numId="28" w16cid:durableId="1774011693">
     <w:abstractNumId w:val="0"/>
   </w:num>
-  <w:num w:numId="29" w16cid:durableId="803621868">
+  <w:num w:numId="29" w16cid:durableId="2064713582">
     <w:abstractNumId w:val="0"/>
   </w:num>
-  <w:num w:numId="30" w16cid:durableId="1031608691">
+  <w:num w:numId="30" w16cid:durableId="1747796942">
     <w:abstractNumId w:val="0"/>
   </w:num>
-  <w:num w:numId="31" w16cid:durableId="1300569959">
+  <w:num w:numId="31" w16cid:durableId="1308440255">
     <w:abstractNumId w:val="0"/>
   </w:num>
-  <w:num w:numId="32" w16cid:durableId="584265327">
+  <w:num w:numId="32" w16cid:durableId="2015716449">
     <w:abstractNumId w:val="0"/>
   </w:num>
-  <w:num w:numId="33" w16cid:durableId="1355768287">
+  <w:num w:numId="33" w16cid:durableId="1467118390">
     <w:abstractNumId w:val="0"/>
   </w:num>
-  <w:num w:numId="34" w16cid:durableId="1665816795">
+  <w:num w:numId="34" w16cid:durableId="414742468">
     <w:abstractNumId w:val="0"/>
   </w:num>
-  <w:num w:numId="35" w16cid:durableId="594482553">
+  <w:num w:numId="35" w16cid:durableId="611404522">
     <w:abstractNumId w:val="0"/>
   </w:num>
-  <w:num w:numId="36" w16cid:durableId="815335535">
+  <w:num w:numId="36" w16cid:durableId="1275016055">
     <w:abstractNumId w:val="0"/>
   </w:num>
-  <w:num w:numId="37" w16cid:durableId="51540137">
+  <w:num w:numId="37" w16cid:durableId="4481518">
     <w:abstractNumId w:val="0"/>
   </w:num>
-  <w:num w:numId="38" w16cid:durableId="60107031">
+  <w:num w:numId="38" w16cid:durableId="1816683499">
     <w:abstractNumId w:val="0"/>
   </w:num>
-  <w:num w:numId="39" w16cid:durableId="1675766999">
+  <w:num w:numId="39" w16cid:durableId="676687478">
     <w:abstractNumId w:val="0"/>
   </w:num>
-  <w:num w:numId="40" w16cid:durableId="863514191">
+  <w:num w:numId="40" w16cid:durableId="741409022">
     <w:abstractNumId w:val="0"/>
   </w:num>
-  <w:num w:numId="41" w16cid:durableId="1936091416">
+  <w:num w:numId="41" w16cid:durableId="1099906833">
     <w:abstractNumId w:val="0"/>
   </w:num>
-  <w:num w:numId="42" w16cid:durableId="405030527">
+  <w:num w:numId="42" w16cid:durableId="280958959">
     <w:abstractNumId w:val="0"/>
   </w:num>
-  <w:num w:numId="43" w16cid:durableId="272790801">
+  <w:num w:numId="43" w16cid:durableId="1909413077">
     <w:abstractNumId w:val="0"/>
   </w:num>
-  <w:num w:numId="44" w16cid:durableId="590241576">
+  <w:num w:numId="44" w16cid:durableId="2008285855">
     <w:abstractNumId w:val="0"/>
   </w:num>
-  <w:num w:numId="45" w16cid:durableId="520507393">
+  <w:num w:numId="45" w16cid:durableId="1665934612">
     <w:abstractNumId w:val="0"/>
   </w:num>
-  <w:num w:numId="46" w16cid:durableId="1928539363">
+  <w:num w:numId="46" w16cid:durableId="836772112">
     <w:abstractNumId w:val="0"/>
   </w:num>
-  <w:num w:numId="47" w16cid:durableId="204684049">
+  <w:num w:numId="47" w16cid:durableId="818960403">
     <w:abstractNumId w:val="0"/>
   </w:num>
-  <w:num w:numId="48" w16cid:durableId="313684112">
+  <w:num w:numId="48" w16cid:durableId="1197816365">
     <w:abstractNumId w:val="0"/>
   </w:num>
-  <w:num w:numId="49" w16cid:durableId="1471556052">
+  <w:num w:numId="49" w16cid:durableId="199250859">
     <w:abstractNumId w:val="0"/>
   </w:num>
-  <w:num w:numId="50" w16cid:durableId="963118951">
+  <w:num w:numId="50" w16cid:durableId="864899966">
     <w:abstractNumId w:val="0"/>
   </w:num>
-  <w:num w:numId="51" w16cid:durableId="1836140167">
+  <w:num w:numId="51" w16cid:durableId="950821472">
     <w:abstractNumId w:val="0"/>
   </w:num>
-  <w:num w:numId="52" w16cid:durableId="1286279219">
+  <w:num w:numId="52" w16cid:durableId="1082482020">
     <w:abstractNumId w:val="0"/>
   </w:num>
-  <w:num w:numId="53" w16cid:durableId="606624980">
+  <w:num w:numId="53" w16cid:durableId="59135200">
     <w:abstractNumId w:val="0"/>
   </w:num>
-  <w:num w:numId="54" w16cid:durableId="1078940684">
+  <w:num w:numId="54" w16cid:durableId="1924685067">
     <w:abstractNumId w:val="0"/>
   </w:num>
-  <w:num w:numId="55" w16cid:durableId="664632228">
+  <w:num w:numId="55" w16cid:durableId="766000325">
     <w:abstractNumId w:val="0"/>
   </w:num>
-  <w:num w:numId="56" w16cid:durableId="271860595">
+  <w:num w:numId="56" w16cid:durableId="154880705">
     <w:abstractNumId w:val="0"/>
   </w:num>
-  <w:num w:numId="57" w16cid:durableId="523205794">
+  <w:num w:numId="57" w16cid:durableId="1835757783">
     <w:abstractNumId w:val="0"/>
   </w:num>
-  <w:num w:numId="58" w16cid:durableId="616062702">
+  <w:num w:numId="58" w16cid:durableId="2066566060">
     <w:abstractNumId w:val="0"/>
   </w:num>
-  <w:num w:numId="59" w16cid:durableId="484855181">
+  <w:num w:numId="59" w16cid:durableId="1277561929">
     <w:abstractNumId w:val="0"/>
   </w:num>
-  <w:num w:numId="60" w16cid:durableId="1147553343">
+  <w:num w:numId="60" w16cid:durableId="685600389">
     <w:abstractNumId w:val="0"/>
   </w:num>
-  <w:num w:numId="61" w16cid:durableId="996156042">
+  <w:num w:numId="61" w16cid:durableId="884951327">
     <w:abstractNumId w:val="0"/>
   </w:num>
-  <w:num w:numId="62" w16cid:durableId="1905945097">
+  <w:num w:numId="62" w16cid:durableId="1396735915">
     <w:abstractNumId w:val="0"/>
   </w:num>
-  <w:num w:numId="63" w16cid:durableId="1382436074">
+  <w:num w:numId="63" w16cid:durableId="618992918">
     <w:abstractNumId w:val="0"/>
   </w:num>
-  <w:num w:numId="64" w16cid:durableId="665979681">
+  <w:num w:numId="64" w16cid:durableId="1045957029">
     <w:abstractNumId w:val="0"/>
   </w:num>
-  <w:num w:numId="65" w16cid:durableId="426315433">
+  <w:num w:numId="65" w16cid:durableId="784542314">
     <w:abstractNumId w:val="0"/>
   </w:num>
-  <w:num w:numId="66" w16cid:durableId="1662076660">
+  <w:num w:numId="66" w16cid:durableId="1711103903">
     <w:abstractNumId w:val="0"/>
   </w:num>
-  <w:num w:numId="67" w16cid:durableId="1552811864">
+  <w:num w:numId="67" w16cid:durableId="1020009598">
     <w:abstractNumId w:val="0"/>
   </w:num>
-  <w:num w:numId="68" w16cid:durableId="1741633553">
+  <w:num w:numId="68" w16cid:durableId="1682580953">
     <w:abstractNumId w:val="0"/>
   </w:num>
-  <w:num w:numId="69" w16cid:durableId="1942756448">
+  <w:num w:numId="69" w16cid:durableId="1873567583">
     <w:abstractNumId w:val="0"/>
   </w:num>
-  <w:num w:numId="70" w16cid:durableId="1916432219">
+  <w:num w:numId="70" w16cid:durableId="1296325843">
     <w:abstractNumId w:val="0"/>
   </w:num>
-  <w:num w:numId="71" w16cid:durableId="1586647091">
+  <w:num w:numId="71" w16cid:durableId="1031149815">
     <w:abstractNumId w:val="0"/>
   </w:num>
-  <w:num w:numId="72" w16cid:durableId="2118215532">
+  <w:num w:numId="72" w16cid:durableId="1472166219">
     <w:abstractNumId w:val="0"/>
   </w:num>
-  <w:num w:numId="73" w16cid:durableId="153497089">
+  <w:num w:numId="73" w16cid:durableId="1592349606">
     <w:abstractNumId w:val="0"/>
   </w:num>
-  <w:num w:numId="74" w16cid:durableId="438450174">
+  <w:num w:numId="74" w16cid:durableId="426316098">
     <w:abstractNumId w:val="0"/>
   </w:num>
-  <w:num w:numId="75" w16cid:durableId="111100903">
+  <w:num w:numId="75" w16cid:durableId="1983802099">
     <w:abstractNumId w:val="0"/>
   </w:num>
-  <w:num w:numId="76" w16cid:durableId="873539421">
+  <w:num w:numId="76" w16cid:durableId="1788038370">
     <w:abstractNumId w:val="0"/>
   </w:num>
-  <w:num w:numId="77" w16cid:durableId="1365792788">
+  <w:num w:numId="77" w16cid:durableId="1250382375">
     <w:abstractNumId w:val="0"/>
   </w:num>
-  <w:num w:numId="78" w16cid:durableId="1536650111">
+  <w:num w:numId="78" w16cid:durableId="1568689269">
     <w:abstractNumId w:val="0"/>
   </w:num>
-  <w:num w:numId="79" w16cid:durableId="222907272">
+  <w:num w:numId="79" w16cid:durableId="551355672">
     <w:abstractNumId w:val="0"/>
   </w:num>
-  <w:num w:numId="80" w16cid:durableId="172647781">
+  <w:num w:numId="80" w16cid:durableId="880483594">
     <w:abstractNumId w:val="0"/>
   </w:num>
-  <w:num w:numId="81" w16cid:durableId="37552852">
+  <w:num w:numId="81" w16cid:durableId="516119172">
     <w:abstractNumId w:val="0"/>
   </w:num>
-  <w:num w:numId="82" w16cid:durableId="1937516784">
+  <w:num w:numId="82" w16cid:durableId="449084098">
     <w:abstractNumId w:val="0"/>
   </w:num>
-  <w:num w:numId="83" w16cid:durableId="514344341">
+  <w:num w:numId="83" w16cid:durableId="1587031540">
     <w:abstractNumId w:val="0"/>
   </w:num>
-  <w:num w:numId="84" w16cid:durableId="245765958">
+  <w:num w:numId="84" w16cid:durableId="1721827509">
     <w:abstractNumId w:val="0"/>
   </w:num>
-  <w:num w:numId="85" w16cid:durableId="484201180">
+  <w:num w:numId="85" w16cid:durableId="1520855136">
     <w:abstractNumId w:val="0"/>
   </w:num>
-  <w:num w:numId="86" w16cid:durableId="167866681">
+  <w:num w:numId="86" w16cid:durableId="1127091012">
     <w:abstractNumId w:val="0"/>
   </w:num>
-  <w:num w:numId="87" w16cid:durableId="209846643">
+  <w:num w:numId="87" w16cid:durableId="2065175335">
     <w:abstractNumId w:val="0"/>
   </w:num>
-  <w:num w:numId="88" w16cid:durableId="2083141521">
+  <w:num w:numId="88" w16cid:durableId="336152770">
     <w:abstractNumId w:val="0"/>
   </w:num>
-  <w:num w:numId="89" w16cid:durableId="1987590890">
+  <w:num w:numId="89" w16cid:durableId="1421679725">
     <w:abstractNumId w:val="0"/>
   </w:num>
-  <w:num w:numId="90" w16cid:durableId="1257665190">
+  <w:num w:numId="90" w16cid:durableId="700205043">
     <w:abstractNumId w:val="0"/>
   </w:num>
-  <w:num w:numId="91" w16cid:durableId="2009554831">
+  <w:num w:numId="91" w16cid:durableId="1299608172">
     <w:abstractNumId w:val="0"/>
   </w:num>
-  <w:num w:numId="92" w16cid:durableId="853109895">
+  <w:num w:numId="92" w16cid:durableId="2079554345">
     <w:abstractNumId w:val="0"/>
   </w:num>
-  <w:num w:numId="93" w16cid:durableId="1065563281">
+  <w:num w:numId="93" w16cid:durableId="1128277688">
     <w:abstractNumId w:val="0"/>
   </w:num>
-  <w:num w:numId="94" w16cid:durableId="2057466536">
+  <w:num w:numId="94" w16cid:durableId="1707213298">
     <w:abstractNumId w:val="0"/>
   </w:num>
-  <w:num w:numId="95" w16cid:durableId="1952129932">
+  <w:num w:numId="95" w16cid:durableId="735787351">
     <w:abstractNumId w:val="0"/>
   </w:num>
-  <w:num w:numId="96" w16cid:durableId="1510829182">
+  <w:num w:numId="96" w16cid:durableId="413672419">
     <w:abstractNumId w:val="0"/>
   </w:num>
-  <w:num w:numId="97" w16cid:durableId="1319992138">
+  <w:num w:numId="97" w16cid:durableId="2089421473">
     <w:abstractNumId w:val="0"/>
   </w:num>
   <w:numIdMacAtCleanup w:val="97"/>
@@ -52647,7 +52649,7 @@
     <w:autoRedefine/>
     <w:uiPriority w:val="39"/>
     <w:unhideWhenUsed/>
-    <w:rsid w:val="004E5F9D"/>
+    <w:rsid w:val="00F90649"/>
     <w:pPr>
       <w:spacing w:after="100" w:line="278" w:lineRule="auto"/>
       <w:ind w:left="480"/>
@@ -52666,7 +52668,7 @@
     <w:autoRedefine/>
     <w:uiPriority w:val="39"/>
     <w:unhideWhenUsed/>
-    <w:rsid w:val="004E5F9D"/>
+    <w:rsid w:val="00F90649"/>
     <w:pPr>
       <w:spacing w:after="100" w:line="278" w:lineRule="auto"/>
       <w:ind w:left="720"/>
@@ -52685,7 +52687,7 @@
     <w:autoRedefine/>
     <w:uiPriority w:val="39"/>
     <w:unhideWhenUsed/>
-    <w:rsid w:val="004E5F9D"/>
+    <w:rsid w:val="00F90649"/>
     <w:pPr>
       <w:spacing w:after="100" w:line="278" w:lineRule="auto"/>
       <w:ind w:left="960"/>
@@ -52704,7 +52706,7 @@
     <w:autoRedefine/>
     <w:uiPriority w:val="39"/>
     <w:unhideWhenUsed/>
-    <w:rsid w:val="004E5F9D"/>
+    <w:rsid w:val="00F90649"/>
     <w:pPr>
       <w:spacing w:after="100" w:line="278" w:lineRule="auto"/>
       <w:ind w:left="1200"/>
@@ -52723,7 +52725,7 @@
     <w:autoRedefine/>
     <w:uiPriority w:val="39"/>
     <w:unhideWhenUsed/>
-    <w:rsid w:val="004E5F9D"/>
+    <w:rsid w:val="00F90649"/>
     <w:pPr>
       <w:spacing w:after="100" w:line="278" w:lineRule="auto"/>
       <w:ind w:left="1440"/>
@@ -52742,7 +52744,7 @@
     <w:autoRedefine/>
     <w:uiPriority w:val="39"/>
     <w:unhideWhenUsed/>
-    <w:rsid w:val="004E5F9D"/>
+    <w:rsid w:val="00F90649"/>
     <w:pPr>
       <w:spacing w:after="100" w:line="278" w:lineRule="auto"/>
       <w:ind w:left="1680"/>
@@ -52761,7 +52763,7 @@
     <w:autoRedefine/>
     <w:uiPriority w:val="39"/>
     <w:unhideWhenUsed/>
-    <w:rsid w:val="004E5F9D"/>
+    <w:rsid w:val="00F90649"/>
     <w:pPr>
       <w:spacing w:after="100" w:line="278" w:lineRule="auto"/>
       <w:ind w:left="1920"/>
@@ -52779,7 +52781,7 @@
     <w:uiPriority w:val="99"/>
     <w:semiHidden/>
     <w:unhideWhenUsed/>
-    <w:rsid w:val="004E5F9D"/>
+    <w:rsid w:val="00F90649"/>
     <w:rPr>
       <w:color w:val="605E5C"/>
       <w:shd w:val="clear" w:color="auto" w:fill="E1DFDD"/>

</xml_diff>